<commit_message>
docs(be-26): record the F03 verification and accept D-17/D-19/D-20
./mvnw -B -ntp verify is green after the BE-25 regression fix (0adc256):
174 tests run (sum of the per-class lines; the Surefire summary
under-counts @Nested classes), 0 failures, 0 errors, 2 skipped by
design. BE-23..BE-26 and the F03 DoD are ticked. The user accepted the
default options of D-17, D-19 and D-20. The learning gate is replaced by
the user's new way of working (the agent explains, the knowledge file
holds it), with the reason in tasks.md.

The provider-contract spec now says a connector may declare a display
name. The knowledge guide gains three test lessons from F03; its Word
copy is regenerated (docs check clean, pages rendered and inspected).

Co-Authored-By: Claude Opus 5.5 (1M context) <noreply@anthropic.com>
</commit_message>
<xml_diff>
--- a/docs/knowledge/phase-0-backend-foundation.docx
+++ b/docs/knowledge/phase-0-backend-foundation.docx
@@ -6316,6 +6316,146 @@
       </w:r>
     </w:p>
     <w:p>
+      <w:r>
+        <w:t xml:space="preserve">Ba bài học có thật từ F03:</w:t>
+      </w:r>
+    </w:p>
+    <w:p>
+      <w:pPr>
+        <w:pStyle w:val="ListParagraph"/>
+        <w:numPr>
+          <w:ilvl w:val="0"/>
+          <w:numId w:val="1"/>
+        </w:numPr>
+      </w:pPr>
+      <w:r>
+        <w:rPr>
+          <w:rFonts w:ascii="Consolas" w:eastAsia="Consolas" w:hAnsi="Consolas" w:cs="Consolas"/>
+          <w:b/>
+          <w:bCs/>
+        </w:rPr>
+        <w:t xml:space="preserve">@WebMvcTest</w:t>
+      </w:r>
+      <w:r>
+        <w:rPr>
+          <w:b/>
+          <w:bCs/>
+        </w:rPr>
+        <w:t xml:space="preserve"> luôn ghi rõ controller</w:t>
+      </w:r>
+      <w:r>
+        <w:t xml:space="preserve">, ví dụ </w:t>
+      </w:r>
+      <w:r>
+        <w:rPr>
+          <w:rFonts w:ascii="Consolas" w:eastAsia="Consolas" w:hAnsi="Consolas" w:cs="Consolas"/>
+        </w:rPr>
+        <w:t xml:space="preserve">@WebMvcTest(ProvidersController.class)</w:t>
+      </w:r>
+      <w:r>
+        <w:t xml:space="preserve">. Viết trần </w:t>
+      </w:r>
+      <w:r>
+        <w:rPr>
+          <w:rFonts w:ascii="Consolas" w:eastAsia="Consolas" w:hAnsi="Consolas" w:cs="Consolas"/>
+        </w:rPr>
+        <w:t xml:space="preserve">@WebMvcTest</w:t>
+      </w:r>
+      <w:r>
+        <w:t xml:space="preserve"> thì Spring nạp </w:t>
+      </w:r>
+      <w:r>
+        <w:rPr>
+          <w:b/>
+          <w:bCs/>
+        </w:rPr>
+        <w:t xml:space="preserve">mọi</w:t>
+      </w:r>
+      <w:r>
+        <w:t xml:space="preserve"> controller. Ở BE-25, </w:t>
+      </w:r>
+      <w:r>
+        <w:rPr>
+          <w:rFonts w:ascii="Consolas" w:eastAsia="Consolas" w:hAnsi="Consolas" w:cs="Consolas"/>
+        </w:rPr>
+        <w:t xml:space="preserve">ProvidersController</w:t>
+      </w:r>
+      <w:r>
+        <w:t xml:space="preserve"> cần </w:t>
+      </w:r>
+      <w:r>
+        <w:rPr>
+          <w:rFonts w:ascii="Consolas" w:eastAsia="Consolas" w:hAnsi="Consolas" w:cs="Consolas"/>
+        </w:rPr>
+        <w:t xml:space="preserve">ProviderRegistry</w:t>
+      </w:r>
+      <w:r>
+        <w:t xml:space="preserve">, mà bean này không có trong web slice, nên 18 test cũ của F01 đỏ dù không ai đụng vào chúng.</w:t>
+      </w:r>
+    </w:p>
+    <w:p>
+      <w:pPr>
+        <w:pStyle w:val="ListParagraph"/>
+        <w:numPr>
+          <w:ilvl w:val="0"/>
+          <w:numId w:val="1"/>
+        </w:numPr>
+      </w:pPr>
+      <w:r>
+        <w:rPr>
+          <w:b/>
+          <w:bCs/>
+        </w:rPr>
+        <w:t xml:space="preserve">Chạy cả bộ test trước khi nói "xanh".</w:t>
+      </w:r>
+      <w:r>
+        <w:t xml:space="preserve"> Chạy một phần chỉ chứng minh phần đó. Lỗi ở trên nằm trong test cũ, nên lệnh chỉ chạy test mới không thấy được.</w:t>
+      </w:r>
+    </w:p>
+    <w:p>
+      <w:pPr>
+        <w:pStyle w:val="ListParagraph"/>
+        <w:numPr>
+          <w:ilvl w:val="0"/>
+          <w:numId w:val="1"/>
+        </w:numPr>
+      </w:pPr>
+      <w:r>
+        <w:rPr>
+          <w:b/>
+          <w:bCs/>
+        </w:rPr>
+        <w:t xml:space="preserve">Đếm test khi có </w:t>
+      </w:r>
+      <w:r>
+        <w:rPr>
+          <w:rFonts w:ascii="Consolas" w:eastAsia="Consolas" w:hAnsi="Consolas" w:cs="Consolas"/>
+          <w:b/>
+          <w:bCs/>
+        </w:rPr>
+        <w:t xml:space="preserve">@Nested</w:t>
+      </w:r>
+      <w:r>
+        <w:rPr>
+          <w:b/>
+          <w:bCs/>
+        </w:rPr>
+        <w:t xml:space="preserve">:</w:t>
+      </w:r>
+      <w:r>
+        <w:t xml:space="preserve"> dòng tổng của Surefire có thể đếm thiếu (F03: ghi 172, thực tế 174). Muốn con số chính xác thì cộng các dòng </w:t>
+      </w:r>
+      <w:r>
+        <w:rPr>
+          <w:rFonts w:ascii="Consolas" w:eastAsia="Consolas" w:hAnsi="Consolas" w:cs="Consolas"/>
+        </w:rPr>
+        <w:t xml:space="preserve">Tests run</w:t>
+      </w:r>
+      <w:r>
+        <w:t xml:space="preserve"> theo từng lớp.</w:t>
+      </w:r>
+    </w:p>
+    <w:p>
       <w:pPr>
         <w:pBdr>
           <w:bottom w:val="single" w:sz="4" w:space="0" w:color="auto"/>

</xml_diff>

<commit_message>
docs(knowledge): add the F02 part (BE-09..BE-12) to the Phase 0 guide
Sections 13 to 19 explain what F02 has built so far and the techniques
behind it: the identity module and CurrentUser, JPA entities and
repositories, the account state machine, AES-256-GCM credential
encryption with key rotation, the new test techniques and a self-check.
The Word copy is regenerated and its pages were inspected. CLAUDE.md now
says to update the guide after every task and to keep emoji out of it,
because the Word export loses all regular text when it meets one.

Co-Authored-By: Claude Opus 5.5 (1M context) <noreply@anthropic.com>
</commit_message>
<xml_diff>
--- a/docs/knowledge/phase-0-backend-foundation.docx
+++ b/docs/knowledge/phase-0-backend-foundation.docx
@@ -97,7 +97,7 @@
         <w:t xml:space="preserve">Phạm vi:</w:t>
       </w:r>
       <w:r>
-        <w:t xml:space="preserve"> F01 Project Foundation và F03 Provider Contract. F02 Connected Accounts sẽ được bổ sung vào file này khi làm.</w:t>
+        <w:t xml:space="preserve"> F01 Project Foundation và F03 Provider Contract (mục 0–12); F02 Connected Accounts (mục 13–19, đang làm: xong BE-09…BE-12).</w:t>
         <w:br/>
       </w:r>
       <w:r>
@@ -6872,7 +6872,3278 @@
         <w:pStyle w:val="Heading2"/>
       </w:pPr>
       <w:r>
-        <w:t xml:space="preserve">Bổ sung khi làm F02</w:t>
+        <w:t xml:space="preserve">13. F02 — Bức tranh: người dùng Sino và tài khoản provider</w:t>
+      </w:r>
+    </w:p>
+    <w:p>
+      <w:r>
+        <w:t xml:space="preserve">F02 lưu các tài khoản bạn kết nối vào Sino. Có hai khái niệm "tài khoản" khác nhau, nằm ở hai module khác nhau:</w:t>
+      </w:r>
+    </w:p>
+    <w:p>
+      <w:pPr>
+        <w:shd w:val="clear" w:color="auto" w:fill="F2F3F5"/>
+        <w:ind w:left="0"/>
+      </w:pPr>
+      <w:r>
+        <w:rPr>
+          <w:rFonts w:ascii="Consolas" w:eastAsia="Consolas" w:hAnsi="Consolas" w:cs="Consolas"/>
+          <w:sz w:val="19"/>
+          <w:szCs w:val="19"/>
+        </w:rPr>
+        <w:t xml:space="preserve">app_user  (module identity)</w:t>
+        <w:br/>
+        <w:t xml:space="preserve">  "bạn" - người dùng Sino: email, tên hiển thị</w:t>
+        <w:br/>
+        <w:t xml:space="preserve">     |</w:t>
+        <w:br/>
+        <w:t xml:space="preserve">     |  một user có nhiều account</w:t>
+        <w:br/>
+        <w:t xml:space="preserve">     v</w:t>
+        <w:br/>
+        <w:t xml:space="preserve">connected_account  (module account)</w:t>
+        <w:br/>
+        <w:t xml:space="preserve">  "Gmail cá nhân", "Gmail công việc"</w:t>
+        <w:br/>
+        <w:t xml:space="preserve">  provider, ID bên provider, trạng thái</w:t>
+        <w:br/>
+        <w:t xml:space="preserve">     |</w:t>
+        <w:br/>
+        <w:t xml:space="preserve">     |  mỗi account có một credential</w:t>
+        <w:br/>
+        <w:t xml:space="preserve">     v</w:t>
+        <w:br/>
+        <w:t xml:space="preserve">account_credential  (BE-13)</w:t>
+        <w:br/>
+        <w:t xml:space="preserve">  token đã mã hóa: access/refresh token, ID khóa</w:t>
+      </w:r>
+    </w:p>
+    <w:tbl>
+      <w:tblPr>
+        <w:tblW w:w="9360" w:type="dxa"/>
+        <w:tblBorders>
+          <w:top w:val="single" w:sz="4" w:space="0" w:color="auto"/>
+          <w:left w:val="single" w:sz="4" w:space="0" w:color="auto"/>
+          <w:bottom w:val="single" w:sz="4" w:space="0" w:color="auto"/>
+          <w:right w:val="single" w:sz="4" w:space="0" w:color="auto"/>
+          <w:insideH w:val="single" w:sz="4" w:space="0" w:color="auto"/>
+          <w:insideV w:val="single" w:sz="4" w:space="0" w:color="auto"/>
+        </w:tblBorders>
+        <w:tblLayout w:type="fixed"/>
+      </w:tblPr>
+      <w:tblGrid>
+        <w:gridCol w:w="3120"/>
+        <w:gridCol w:w="3120"/>
+        <w:gridCol w:w="3120"/>
+      </w:tblGrid>
+      <w:tr>
+        <w:tc>
+          <w:tcPr>
+            <w:tcW w:w="3120" w:type="dxa"/>
+            <w:shd w:val="clear" w:color="auto" w:fill="F2F2F2"/>
+          </w:tcPr>
+          <w:p>
+            <w:r>
+              <w:t xml:space="preserve">Task</w:t>
+            </w:r>
+          </w:p>
+        </w:tc>
+        <w:tc>
+          <w:tcPr>
+            <w:tcW w:w="3120" w:type="dxa"/>
+            <w:shd w:val="clear" w:color="auto" w:fill="F2F2F2"/>
+          </w:tcPr>
+          <w:p>
+            <w:r>
+              <w:t xml:space="preserve">Đã làm</w:t>
+            </w:r>
+          </w:p>
+        </w:tc>
+        <w:tc>
+          <w:tcPr>
+            <w:tcW w:w="3120" w:type="dxa"/>
+            <w:shd w:val="clear" w:color="auto" w:fill="F2F2F2"/>
+          </w:tcPr>
+          <w:p>
+            <w:r>
+              <w:t xml:space="preserve">Trạng thái</w:t>
+            </w:r>
+          </w:p>
+        </w:tc>
+      </w:tr>
+      <w:tr>
+        <w:tc>
+          <w:tcPr>
+            <w:tcW w:w="3120" w:type="dxa"/>
+          </w:tcPr>
+          <w:p>
+            <w:r>
+              <w:t xml:space="preserve">BE-09</w:t>
+            </w:r>
+          </w:p>
+        </w:tc>
+        <w:tc>
+          <w:tcPr>
+            <w:tcW w:w="3120" w:type="dxa"/>
+          </w:tcPr>
+          <w:p>
+            <w:r>
+              <w:t xml:space="preserve">Module </w:t>
+            </w:r>
+            <w:r>
+              <w:rPr>
+                <w:rFonts w:ascii="Consolas" w:eastAsia="Consolas" w:hAnsi="Consolas" w:cs="Consolas"/>
+              </w:rPr>
+              <w:t xml:space="preserve">identity</w:t>
+            </w:r>
+            <w:r>
+              <w:t xml:space="preserve">: bảng </w:t>
+            </w:r>
+            <w:r>
+              <w:rPr>
+                <w:rFonts w:ascii="Consolas" w:eastAsia="Consolas" w:hAnsi="Consolas" w:cs="Consolas"/>
+              </w:rPr>
+              <w:t xml:space="preserve">app_user</w:t>
+            </w:r>
+            <w:r>
+              <w:t xml:space="preserve">, tạo owner lúc khởi động, </w:t>
+            </w:r>
+            <w:r>
+              <w:rPr>
+                <w:rFonts w:ascii="Consolas" w:eastAsia="Consolas" w:hAnsi="Consolas" w:cs="Consolas"/>
+              </w:rPr>
+              <w:t xml:space="preserve">CurrentUser</w:t>
+            </w:r>
+          </w:p>
+        </w:tc>
+        <w:tc>
+          <w:tcPr>
+            <w:tcW w:w="3120" w:type="dxa"/>
+          </w:tcPr>
+          <w:p>
+            <w:r>
+              <w:t xml:space="preserve">xong</w:t>
+            </w:r>
+          </w:p>
+        </w:tc>
+      </w:tr>
+      <w:tr>
+        <w:tc>
+          <w:tcPr>
+            <w:tcW w:w="3120" w:type="dxa"/>
+          </w:tcPr>
+          <w:p>
+            <w:r>
+              <w:t xml:space="preserve">BE-10</w:t>
+            </w:r>
+          </w:p>
+        </w:tc>
+        <w:tc>
+          <w:tcPr>
+            <w:tcW w:w="3120" w:type="dxa"/>
+          </w:tcPr>
+          <w:p>
+            <w:r>
+              <w:t xml:space="preserve">Aggregate </w:t>
+            </w:r>
+            <w:r>
+              <w:rPr>
+                <w:rFonts w:ascii="Consolas" w:eastAsia="Consolas" w:hAnsi="Consolas" w:cs="Consolas"/>
+              </w:rPr>
+              <w:t xml:space="preserve">ConnectedAccount</w:t>
+            </w:r>
+            <w:r>
+              <w:t xml:space="preserve"> và máy trạng thái</w:t>
+            </w:r>
+          </w:p>
+        </w:tc>
+        <w:tc>
+          <w:tcPr>
+            <w:tcW w:w="3120" w:type="dxa"/>
+          </w:tcPr>
+          <w:p>
+            <w:r>
+              <w:t xml:space="preserve">xong</w:t>
+            </w:r>
+          </w:p>
+        </w:tc>
+      </w:tr>
+      <w:tr>
+        <w:tc>
+          <w:tcPr>
+            <w:tcW w:w="3120" w:type="dxa"/>
+          </w:tcPr>
+          <w:p>
+            <w:r>
+              <w:t xml:space="preserve">BE-11</w:t>
+            </w:r>
+          </w:p>
+        </w:tc>
+        <w:tc>
+          <w:tcPr>
+            <w:tcW w:w="3120" w:type="dxa"/>
+          </w:tcPr>
+          <w:p>
+            <w:r>
+              <w:t xml:space="preserve">Bảng </w:t>
+            </w:r>
+            <w:r>
+              <w:rPr>
+                <w:rFonts w:ascii="Consolas" w:eastAsia="Consolas" w:hAnsi="Consolas" w:cs="Consolas"/>
+              </w:rPr>
+              <w:t xml:space="preserve">connected_account</w:t>
+            </w:r>
+            <w:r>
+              <w:t xml:space="preserve">, ánh xạ JPA, repository</w:t>
+            </w:r>
+          </w:p>
+        </w:tc>
+        <w:tc>
+          <w:tcPr>
+            <w:tcW w:w="3120" w:type="dxa"/>
+          </w:tcPr>
+          <w:p>
+            <w:r>
+              <w:t xml:space="preserve">xong</w:t>
+            </w:r>
+          </w:p>
+        </w:tc>
+      </w:tr>
+      <w:tr>
+        <w:tc>
+          <w:tcPr>
+            <w:tcW w:w="3120" w:type="dxa"/>
+          </w:tcPr>
+          <w:p>
+            <w:r>
+              <w:t xml:space="preserve">BE-12</w:t>
+            </w:r>
+          </w:p>
+        </w:tc>
+        <w:tc>
+          <w:tcPr>
+            <w:tcW w:w="3120" w:type="dxa"/>
+          </w:tcPr>
+          <w:p>
+            <w:r>
+              <w:t xml:space="preserve">Mã hóa credential AES-256-GCM, kiểm tra khóa lúc khởi động, review bảo mật</w:t>
+            </w:r>
+          </w:p>
+        </w:tc>
+        <w:tc>
+          <w:tcPr>
+            <w:tcW w:w="3120" w:type="dxa"/>
+          </w:tcPr>
+          <w:p>
+            <w:r>
+              <w:t xml:space="preserve">xong</w:t>
+            </w:r>
+          </w:p>
+        </w:tc>
+      </w:tr>
+      <w:tr>
+        <w:tc>
+          <w:tcPr>
+            <w:tcW w:w="3120" w:type="dxa"/>
+          </w:tcPr>
+          <w:p>
+            <w:r>
+              <w:t xml:space="preserve">BE-13…BE-18</w:t>
+            </w:r>
+          </w:p>
+        </w:tc>
+        <w:tc>
+          <w:tcPr>
+            <w:tcW w:w="3120" w:type="dxa"/>
+          </w:tcPr>
+          <w:p>
+            <w:r>
+              <w:t xml:space="preserve">Lưu credential, use case đăng ký, REST API, xóa, nghiệm thu</w:t>
+            </w:r>
+          </w:p>
+        </w:tc>
+        <w:tc>
+          <w:tcPr>
+            <w:tcW w:w="3120" w:type="dxa"/>
+          </w:tcPr>
+          <w:p>
+            <w:r>
+              <w:t xml:space="preserve">chưa làm</w:t>
+            </w:r>
+          </w:p>
+        </w:tc>
+      </w:tr>
+    </w:tbl>
+    <w:p>
+      <w:r>
+        <w:t xml:space="preserve">Quyết định đã chốt: </w:t>
+      </w:r>
+      <w:r>
+        <w:rPr>
+          <w:b/>
+          <w:bCs/>
+        </w:rPr>
+        <w:t xml:space="preserve">D-10 = A</w:t>
+      </w:r>
+      <w:r>
+        <w:t xml:space="preserve"> (module </w:t>
+      </w:r>
+      <w:r>
+        <w:rPr>
+          <w:rFonts w:ascii="Consolas" w:eastAsia="Consolas" w:hAnsi="Consolas" w:cs="Consolas"/>
+        </w:rPr>
+        <w:t xml:space="preserve">identity</w:t>
+      </w:r>
+      <w:r>
+        <w:t xml:space="preserve"> riêng), </w:t>
+      </w:r>
+      <w:r>
+        <w:rPr>
+          <w:b/>
+          <w:bCs/>
+        </w:rPr>
+        <w:t xml:space="preserve">D-11 = A</w:t>
+      </w:r>
+      <w:r>
+        <w:t xml:space="preserve"> (AES-256-GCM bằng thư viện có sẵn của JDK, khóa có ID), </w:t>
+      </w:r>
+      <w:r>
+        <w:rPr>
+          <w:b/>
+          <w:bCs/>
+        </w:rPr>
+        <w:t xml:space="preserve">D-12 = A</w:t>
+      </w:r>
+      <w:r>
+        <w:t xml:space="preserve"> (5 trạng thái, không lưu </w:t>
+      </w:r>
+      <w:r>
+        <w:rPr>
+          <w:rFonts w:ascii="Consolas" w:eastAsia="Consolas" w:hAnsi="Consolas" w:cs="Consolas"/>
+        </w:rPr>
+        <w:t xml:space="preserve">SYNCING</w:t>
+      </w:r>
+      <w:r>
+        <w:t xml:space="preserve">). Lần đầu áp dụng D-08 (UUIDv7) và D-09 (enum lưu chữ + </w:t>
+      </w:r>
+      <w:r>
+        <w:rPr>
+          <w:rFonts w:ascii="Consolas" w:eastAsia="Consolas" w:hAnsi="Consolas" w:cs="Consolas"/>
+        </w:rPr>
+        <w:t xml:space="preserve">CHECK</w:t>
+      </w:r>
+      <w:r>
+        <w:t xml:space="preserve">).</w:t>
+      </w:r>
+    </w:p>
+    <w:p>
+      <w:pPr>
+        <w:pBdr>
+          <w:bottom w:val="single" w:sz="4" w:space="0" w:color="auto"/>
+        </w:pBdr>
+        <w:ind w:left="0"/>
+      </w:pPr>
+    </w:p>
+    <w:p>
+      <w:pPr>
+        <w:pStyle w:val="Heading2"/>
+      </w:pPr>
+      <w:r>
+        <w:t xml:space="preserve">14. Module </w:t>
+      </w:r>
+      <w:r>
+        <w:rPr>
+          <w:rFonts w:ascii="Consolas" w:eastAsia="Consolas" w:hAnsi="Consolas" w:cs="Consolas"/>
+        </w:rPr>
+        <w:t xml:space="preserve">identity</w:t>
+      </w:r>
+      <w:r>
+        <w:t xml:space="preserve">: owner và người dùng hiện tại (BE-09)</w:t>
+      </w:r>
+    </w:p>
+    <w:p>
+      <w:pPr>
+        <w:pStyle w:val="Heading3"/>
+      </w:pPr>
+      <w:r>
+        <w:t xml:space="preserve">14.1 Vì sao có module riêng (D-10)</w:t>
+      </w:r>
+    </w:p>
+    <w:p>
+      <w:pPr>
+        <w:pStyle w:val="ListParagraph"/>
+        <w:numPr>
+          <w:ilvl w:val="0"/>
+          <w:numId w:val="1"/>
+        </w:numPr>
+      </w:pPr>
+      <w:r>
+        <w:rPr>
+          <w:b/>
+          <w:bCs/>
+        </w:rPr>
+        <w:t xml:space="preserve">Ở đâu:</w:t>
+      </w:r>
+      <w:r>
+        <w:t xml:space="preserve"> </w:t>
+      </w:r>
+      <w:r>
+        <w:rPr>
+          <w:rFonts w:ascii="Consolas" w:eastAsia="Consolas" w:hAnsi="Consolas" w:cs="Consolas"/>
+        </w:rPr>
+        <w:t xml:space="preserve">src/main/java/dev/sino/identity/</w:t>
+      </w:r>
+      <w:r>
+        <w:t xml:space="preserve">.</w:t>
+      </w:r>
+    </w:p>
+    <w:p>
+      <w:pPr>
+        <w:pStyle w:val="ListParagraph"/>
+        <w:numPr>
+          <w:ilvl w:val="0"/>
+          <w:numId w:val="1"/>
+        </w:numPr>
+      </w:pPr>
+      <w:r>
+        <w:rPr>
+          <w:b/>
+          <w:bCs/>
+        </w:rPr>
+        <w:t xml:space="preserve">Vì sao:</w:t>
+      </w:r>
+      <w:r>
+        <w:t xml:space="preserve"> "người dùng Sino" khác "tài khoản Gmail". Khi có đăng nhập thật cho nhiều người (D-22), mọi thứ về đăng nhập vào </w:t>
+      </w:r>
+      <w:r>
+        <w:rPr>
+          <w:rFonts w:ascii="Consolas" w:eastAsia="Consolas" w:hAnsi="Consolas" w:cs="Consolas"/>
+        </w:rPr>
+        <w:t xml:space="preserve">identity</w:t>
+      </w:r>
+      <w:r>
+        <w:t xml:space="preserve">; module </w:t>
+      </w:r>
+      <w:r>
+        <w:rPr>
+          <w:rFonts w:ascii="Consolas" w:eastAsia="Consolas" w:hAnsi="Consolas" w:cs="Consolas"/>
+        </w:rPr>
+        <w:t xml:space="preserve">account</w:t>
+      </w:r>
+      <w:r>
+        <w:t xml:space="preserve"> chỉ biết </w:t>
+      </w:r>
+      <w:r>
+        <w:rPr>
+          <w:rFonts w:ascii="Consolas" w:eastAsia="Consolas" w:hAnsi="Consolas" w:cs="Consolas"/>
+        </w:rPr>
+        <w:t xml:space="preserve">ownerId</w:t>
+      </w:r>
+      <w:r>
+        <w:t xml:space="preserve"> (một UUID) nên không phải sửa.</w:t>
+      </w:r>
+    </w:p>
+    <w:p>
+      <w:pPr>
+        <w:pStyle w:val="Heading3"/>
+      </w:pPr>
+      <w:r>
+        <w:t xml:space="preserve">14.2 Tạo owner lúc khởi động: </w:t>
+      </w:r>
+      <w:r>
+        <w:rPr>
+          <w:rFonts w:ascii="Consolas" w:eastAsia="Consolas" w:hAnsi="Consolas" w:cs="Consolas"/>
+        </w:rPr>
+        <w:t xml:space="preserve">ApplicationRunner</w:t>
+      </w:r>
+    </w:p>
+    <w:p>
+      <w:pPr>
+        <w:pStyle w:val="ListParagraph"/>
+        <w:numPr>
+          <w:ilvl w:val="0"/>
+          <w:numId w:val="1"/>
+        </w:numPr>
+      </w:pPr>
+      <w:r>
+        <w:rPr>
+          <w:b/>
+          <w:bCs/>
+        </w:rPr>
+        <w:t xml:space="preserve">Ở đâu:</w:t>
+      </w:r>
+      <w:r>
+        <w:t xml:space="preserve"> </w:t>
+      </w:r>
+      <w:r>
+        <w:rPr>
+          <w:rFonts w:ascii="Consolas" w:eastAsia="Consolas" w:hAnsi="Consolas" w:cs="Consolas"/>
+        </w:rPr>
+        <w:t xml:space="preserve">identity/application/OwnerProvisioner.java</w:t>
+      </w:r>
+      <w:r>
+        <w:t xml:space="preserve">.</w:t>
+      </w:r>
+    </w:p>
+    <w:p>
+      <w:pPr>
+        <w:pStyle w:val="ListParagraph"/>
+        <w:numPr>
+          <w:ilvl w:val="0"/>
+          <w:numId w:val="1"/>
+        </w:numPr>
+      </w:pPr>
+      <w:r>
+        <w:rPr>
+          <w:b/>
+          <w:bCs/>
+        </w:rPr>
+        <w:t xml:space="preserve">Là gì:</w:t>
+      </w:r>
+      <w:r>
+        <w:t xml:space="preserve"> class </w:t>
+      </w:r>
+      <w:r>
+        <w:rPr>
+          <w:rFonts w:ascii="Consolas" w:eastAsia="Consolas" w:hAnsi="Consolas" w:cs="Consolas"/>
+        </w:rPr>
+        <w:t xml:space="preserve">implements ApplicationRunner</w:t>
+      </w:r>
+      <w:r>
+        <w:t xml:space="preserve">; Spring gọi method </w:t>
+      </w:r>
+      <w:r>
+        <w:rPr>
+          <w:rFonts w:ascii="Consolas" w:eastAsia="Consolas" w:hAnsi="Consolas" w:cs="Consolas"/>
+        </w:rPr>
+        <w:t xml:space="preserve">run(...)</w:t>
+      </w:r>
+      <w:r>
+        <w:t xml:space="preserve"> </w:t>
+      </w:r>
+      <w:r>
+        <w:rPr>
+          <w:b/>
+          <w:bCs/>
+        </w:rPr>
+        <w:t xml:space="preserve">một lần</w:t>
+      </w:r>
+      <w:r>
+        <w:t xml:space="preserve">, ngay sau khi khởi động xong.</w:t>
+      </w:r>
+    </w:p>
+    <w:p>
+      <w:pPr>
+        <w:pStyle w:val="ListParagraph"/>
+        <w:numPr>
+          <w:ilvl w:val="0"/>
+          <w:numId w:val="1"/>
+        </w:numPr>
+      </w:pPr>
+      <w:r>
+        <w:rPr>
+          <w:b/>
+          <w:bCs/>
+        </w:rPr>
+        <w:t xml:space="preserve">Vì sao dùng nó:</w:t>
+      </w:r>
+      <w:r>
+        <w:t xml:space="preserve"> lúc runner chạy, Flyway đã tạo xong bảng </w:t>
+      </w:r>
+      <w:r>
+        <w:rPr>
+          <w:rFonts w:ascii="Consolas" w:eastAsia="Consolas" w:hAnsi="Consolas" w:cs="Consolas"/>
+        </w:rPr>
+        <w:t xml:space="preserve">app_user</w:t>
+      </w:r>
+      <w:r>
+        <w:t xml:space="preserve">, nên ghi vào bảng là an toàn. Runner ném lỗi thì app dừng (fail-fast).</w:t>
+      </w:r>
+    </w:p>
+    <w:p>
+      <w:pPr>
+        <w:pStyle w:val="ListParagraph"/>
+        <w:numPr>
+          <w:ilvl w:val="0"/>
+          <w:numId w:val="1"/>
+        </w:numPr>
+      </w:pPr>
+      <w:r>
+        <w:rPr>
+          <w:b/>
+          <w:bCs/>
+        </w:rPr>
+        <w:t xml:space="preserve">Upsert theo email:</w:t>
+      </w:r>
+      <w:r>
+        <w:t xml:space="preserve"> tìm owner theo email; chưa có thì tạo, có rồi thì cập nhật tên. Chạy bao nhiêu lần cũng chỉ có một dòng (idempotent). Đổi </w:t>
+      </w:r>
+      <w:r>
+        <w:rPr>
+          <w:b/>
+          <w:bCs/>
+        </w:rPr>
+        <w:t xml:space="preserve">email</w:t>
+      </w:r>
+      <w:r>
+        <w:t xml:space="preserve"> thì thành owner mới.</w:t>
+      </w:r>
+    </w:p>
+    <w:p>
+      <w:pPr>
+        <w:pStyle w:val="ListParagraph"/>
+        <w:numPr>
+          <w:ilvl w:val="0"/>
+          <w:numId w:val="1"/>
+        </w:numPr>
+      </w:pPr>
+      <w:r>
+        <w:rPr>
+          <w:b/>
+          <w:bCs/>
+        </w:rPr>
+        <w:t xml:space="preserve">Bẫy </w:t>
+      </w:r>
+      <w:r>
+        <w:rPr>
+          <w:rFonts w:ascii="Consolas" w:eastAsia="Consolas" w:hAnsi="Consolas" w:cs="Consolas"/>
+          <w:b/>
+          <w:bCs/>
+        </w:rPr>
+        <w:t xml:space="preserve">@Transactional</w:t>
+      </w:r>
+      <w:r>
+        <w:rPr>
+          <w:b/>
+          <w:bCs/>
+        </w:rPr>
+        <w:t xml:space="preserve">:</w:t>
+      </w:r>
+      <w:r>
+        <w:t xml:space="preserve"> annotation chỉ có tác dụng khi method được gọi </w:t>
+      </w:r>
+      <w:r>
+        <w:rPr>
+          <w:b/>
+          <w:bCs/>
+        </w:rPr>
+        <w:t xml:space="preserve">qua bean Spring</w:t>
+      </w:r>
+      <w:r>
+        <w:t xml:space="preserve"> (Spring bọc bean trong một "proxy" mở và đóng transaction). Tự </w:t>
+      </w:r>
+      <w:r>
+        <w:rPr>
+          <w:rFonts w:ascii="Consolas" w:eastAsia="Consolas" w:hAnsi="Consolas" w:cs="Consolas"/>
+        </w:rPr>
+        <w:t xml:space="preserve">new OwnerProvisioner(...)</w:t>
+      </w:r>
+      <w:r>
+        <w:t xml:space="preserve"> rồi gọi thì không có transaction.</w:t>
+      </w:r>
+    </w:p>
+    <w:p>
+      <w:pPr>
+        <w:pStyle w:val="Heading3"/>
+      </w:pPr>
+      <w:r>
+        <w:t xml:space="preserve">14.3 </w:t>
+      </w:r>
+      <w:r>
+        <w:rPr>
+          <w:rFonts w:ascii="Consolas" w:eastAsia="Consolas" w:hAnsi="Consolas" w:cs="Consolas"/>
+        </w:rPr>
+        <w:t xml:space="preserve">CurrentUser</w:t>
+      </w:r>
+      <w:r>
+        <w:t xml:space="preserve">: "ai đang gọi API?"</w:t>
+      </w:r>
+    </w:p>
+    <w:p>
+      <w:pPr>
+        <w:pStyle w:val="ListParagraph"/>
+        <w:numPr>
+          <w:ilvl w:val="0"/>
+          <w:numId w:val="1"/>
+        </w:numPr>
+      </w:pPr>
+      <w:r>
+        <w:rPr>
+          <w:b/>
+          <w:bCs/>
+        </w:rPr>
+        <w:t xml:space="preserve">Ở đâu:</w:t>
+      </w:r>
+      <w:r>
+        <w:t xml:space="preserve"> </w:t>
+      </w:r>
+      <w:r>
+        <w:rPr>
+          <w:rFonts w:ascii="Consolas" w:eastAsia="Consolas" w:hAnsi="Consolas" w:cs="Consolas"/>
+        </w:rPr>
+        <w:t xml:space="preserve">identity/CurrentUser.java</w:t>
+      </w:r>
+      <w:r>
+        <w:t xml:space="preserve"> (public), </w:t>
+      </w:r>
+      <w:r>
+        <w:rPr>
+          <w:rFonts w:ascii="Consolas" w:eastAsia="Consolas" w:hAnsi="Consolas" w:cs="Consolas"/>
+        </w:rPr>
+        <w:t xml:space="preserve">identity/application/OwnerCurrentUser.java</w:t>
+      </w:r>
+      <w:r>
+        <w:t xml:space="preserve"> (cài đặt).</w:t>
+      </w:r>
+    </w:p>
+    <w:p>
+      <w:pPr>
+        <w:pStyle w:val="ListParagraph"/>
+        <w:numPr>
+          <w:ilvl w:val="0"/>
+          <w:numId w:val="1"/>
+        </w:numPr>
+      </w:pPr>
+      <w:r>
+        <w:rPr>
+          <w:b/>
+          <w:bCs/>
+        </w:rPr>
+        <w:t xml:space="preserve">Để làm gì:</w:t>
+      </w:r>
+      <w:r>
+        <w:t xml:space="preserve"> code nghiệp vụ hỏi </w:t>
+      </w:r>
+      <w:r>
+        <w:rPr>
+          <w:rFonts w:ascii="Consolas" w:eastAsia="Consolas" w:hAnsi="Consolas" w:cs="Consolas"/>
+        </w:rPr>
+        <w:t xml:space="preserve">currentUser.requireOwnerId()</w:t>
+      </w:r>
+      <w:r>
+        <w:t xml:space="preserve"> thay vì tự đọc Spring Security. Ở MVP, mọi người đã đăng nhập (HTTP Basic) đều là owner.</w:t>
+      </w:r>
+    </w:p>
+    <w:p>
+      <w:pPr>
+        <w:pStyle w:val="ListParagraph"/>
+        <w:numPr>
+          <w:ilvl w:val="0"/>
+          <w:numId w:val="1"/>
+        </w:numPr>
+      </w:pPr>
+      <w:r>
+        <w:rPr>
+          <w:b/>
+          <w:bCs/>
+        </w:rPr>
+        <w:t xml:space="preserve">Chi tiết:</w:t>
+      </w:r>
+      <w:r>
+        <w:t xml:space="preserve"> đọc </w:t>
+      </w:r>
+      <w:r>
+        <w:rPr>
+          <w:rFonts w:ascii="Consolas" w:eastAsia="Consolas" w:hAnsi="Consolas" w:cs="Consolas"/>
+        </w:rPr>
+        <w:t xml:space="preserve">SecurityContextHolder</w:t>
+      </w:r>
+      <w:r>
+        <w:t xml:space="preserve">, nơi Spring Security để thông tin người đang đăng nhập. Khách vô danh (</w:t>
+      </w:r>
+      <w:r>
+        <w:rPr>
+          <w:rFonts w:ascii="Consolas" w:eastAsia="Consolas" w:hAnsi="Consolas" w:cs="Consolas"/>
+        </w:rPr>
+        <w:t xml:space="preserve">AnonymousAuthenticationToken</w:t>
+      </w:r>
+      <w:r>
+        <w:t xml:space="preserve">) bị từ chối. ID owner tra DB </w:t>
+      </w:r>
+      <w:r>
+        <w:rPr>
+          <w:b/>
+          <w:bCs/>
+        </w:rPr>
+        <w:t xml:space="preserve">một lần</w:t>
+      </w:r>
+      <w:r>
+        <w:t xml:space="preserve"> rồi giữ trong field </w:t>
+      </w:r>
+      <w:r>
+        <w:rPr>
+          <w:rFonts w:ascii="Consolas" w:eastAsia="Consolas" w:hAnsi="Consolas" w:cs="Consolas"/>
+        </w:rPr>
+        <w:t xml:space="preserve">volatile</w:t>
+      </w:r>
+      <w:r>
+        <w:t xml:space="preserve"> (an toàn khi nhiều luồng cùng đọc).</w:t>
+      </w:r>
+    </w:p>
+    <w:p>
+      <w:pPr>
+        <w:pStyle w:val="Heading3"/>
+      </w:pPr>
+      <w:r>
+        <w:t xml:space="preserve">14.4 Cấu hình bắt buộc</w:t>
+      </w:r>
+    </w:p>
+    <w:p>
+      <w:pPr>
+        <w:pStyle w:val="ListParagraph"/>
+        <w:numPr>
+          <w:ilvl w:val="0"/>
+          <w:numId w:val="1"/>
+        </w:numPr>
+      </w:pPr>
+      <w:r>
+        <w:rPr>
+          <w:rFonts w:ascii="Consolas" w:eastAsia="Consolas" w:hAnsi="Consolas" w:cs="Consolas"/>
+        </w:rPr>
+        <w:t xml:space="preserve">SINO_OWNER_EMAIL</w:t>
+      </w:r>
+      <w:r>
+        <w:t xml:space="preserve">, </w:t>
+      </w:r>
+      <w:r>
+        <w:rPr>
+          <w:rFonts w:ascii="Consolas" w:eastAsia="Consolas" w:hAnsi="Consolas" w:cs="Consolas"/>
+        </w:rPr>
+        <w:t xml:space="preserve">SINO_OWNER_DISPLAY_NAME</w:t>
+      </w:r>
+      <w:r>
+        <w:t xml:space="preserve"> vào record </w:t>
+      </w:r>
+      <w:r>
+        <w:rPr>
+          <w:rFonts w:ascii="Consolas" w:eastAsia="Consolas" w:hAnsi="Consolas" w:cs="Consolas"/>
+        </w:rPr>
+        <w:t xml:space="preserve">OwnerProperties</w:t>
+      </w:r>
+      <w:r>
+        <w:t xml:space="preserve"> có </w:t>
+      </w:r>
+      <w:r>
+        <w:rPr>
+          <w:rFonts w:ascii="Consolas" w:eastAsia="Consolas" w:hAnsi="Consolas" w:cs="Consolas"/>
+        </w:rPr>
+        <w:t xml:space="preserve">@NotBlank</w:t>
+      </w:r>
+      <w:r>
+        <w:t xml:space="preserve">, </w:t>
+      </w:r>
+      <w:r>
+        <w:rPr>
+          <w:rFonts w:ascii="Consolas" w:eastAsia="Consolas" w:hAnsi="Consolas" w:cs="Consolas"/>
+        </w:rPr>
+        <w:t xml:space="preserve">@Email</w:t>
+      </w:r>
+      <w:r>
+        <w:t xml:space="preserve">. Thiếu thì app không start. Compact constructor của record trim và đổi email về chữ thường </w:t>
+      </w:r>
+      <w:r>
+        <w:rPr>
+          <w:b/>
+          <w:bCs/>
+        </w:rPr>
+        <w:t xml:space="preserve">trước</w:t>
+      </w:r>
+      <w:r>
+        <w:t xml:space="preserve"> khi kiểm tra.</w:t>
+      </w:r>
+    </w:p>
+    <w:p>
+      <w:pPr>
+        <w:pBdr>
+          <w:bottom w:val="single" w:sz="4" w:space="0" w:color="auto"/>
+        </w:pBdr>
+        <w:ind w:left="0"/>
+      </w:pPr>
+    </w:p>
+    <w:p>
+      <w:pPr>
+        <w:pStyle w:val="Heading2"/>
+      </w:pPr>
+      <w:r>
+        <w:t xml:space="preserve">15. JPA entity và repository (BE-09, BE-11)</w:t>
+      </w:r>
+    </w:p>
+    <w:p>
+      <w:pPr>
+        <w:pStyle w:val="Heading3"/>
+      </w:pPr>
+      <w:r>
+        <w:t xml:space="preserve">15.1 Entity</w:t>
+      </w:r>
+    </w:p>
+    <w:p>
+      <w:pPr>
+        <w:pStyle w:val="ListParagraph"/>
+        <w:numPr>
+          <w:ilvl w:val="0"/>
+          <w:numId w:val="1"/>
+        </w:numPr>
+      </w:pPr>
+      <w:r>
+        <w:rPr>
+          <w:b/>
+          <w:bCs/>
+        </w:rPr>
+        <w:t xml:space="preserve">Ở đâu:</w:t>
+      </w:r>
+      <w:r>
+        <w:t xml:space="preserve"> </w:t>
+      </w:r>
+      <w:r>
+        <w:rPr>
+          <w:rFonts w:ascii="Consolas" w:eastAsia="Consolas" w:hAnsi="Consolas" w:cs="Consolas"/>
+        </w:rPr>
+        <w:t xml:space="preserve">identity/infrastructure/AppUser.java</w:t>
+      </w:r>
+      <w:r>
+        <w:t xml:space="preserve">, </w:t>
+      </w:r>
+      <w:r>
+        <w:rPr>
+          <w:rFonts w:ascii="Consolas" w:eastAsia="Consolas" w:hAnsi="Consolas" w:cs="Consolas"/>
+        </w:rPr>
+        <w:t xml:space="preserve">account/domain/ConnectedAccount.java</w:t>
+      </w:r>
+      <w:r>
+        <w:t xml:space="preserve">.</w:t>
+      </w:r>
+    </w:p>
+    <w:p>
+      <w:pPr>
+        <w:pStyle w:val="ListParagraph"/>
+        <w:numPr>
+          <w:ilvl w:val="0"/>
+          <w:numId w:val="1"/>
+        </w:numPr>
+      </w:pPr>
+      <w:r>
+        <w:rPr>
+          <w:b/>
+          <w:bCs/>
+        </w:rPr>
+        <w:t xml:space="preserve">Các annotation:</w:t>
+      </w:r>
+    </w:p>
+    <w:p>
+      <w:pPr>
+        <w:pStyle w:val="ListParagraph"/>
+        <w:numPr>
+          <w:ilvl w:val="1"/>
+          <w:numId w:val="1"/>
+        </w:numPr>
+      </w:pPr>
+      <w:r>
+        <w:rPr>
+          <w:rFonts w:ascii="Consolas" w:eastAsia="Consolas" w:hAnsi="Consolas" w:cs="Consolas"/>
+        </w:rPr>
+        <w:t xml:space="preserve">@Entity</w:t>
+      </w:r>
+      <w:r>
+        <w:t xml:space="preserve"> + </w:t>
+      </w:r>
+      <w:r>
+        <w:rPr>
+          <w:rFonts w:ascii="Consolas" w:eastAsia="Consolas" w:hAnsi="Consolas" w:cs="Consolas"/>
+        </w:rPr>
+        <w:t xml:space="preserve">@Table(name = "...")</w:t>
+      </w:r>
+      <w:r>
+        <w:t xml:space="preserve">: class ứng với bảng nào.</w:t>
+      </w:r>
+    </w:p>
+    <w:p>
+      <w:pPr>
+        <w:pStyle w:val="ListParagraph"/>
+        <w:numPr>
+          <w:ilvl w:val="1"/>
+          <w:numId w:val="1"/>
+        </w:numPr>
+      </w:pPr>
+      <w:r>
+        <w:rPr>
+          <w:rFonts w:ascii="Consolas" w:eastAsia="Consolas" w:hAnsi="Consolas" w:cs="Consolas"/>
+        </w:rPr>
+        <w:t xml:space="preserve">@Id</w:t>
+      </w:r>
+      <w:r>
+        <w:t xml:space="preserve"> + </w:t>
+      </w:r>
+      <w:r>
+        <w:rPr>
+          <w:rFonts w:ascii="Consolas" w:eastAsia="Consolas" w:hAnsi="Consolas" w:cs="Consolas"/>
+        </w:rPr>
+        <w:t xml:space="preserve">@UuidGenerator(style = VERSION_7)</w:t>
+      </w:r>
+      <w:r>
+        <w:t xml:space="preserve">: Hibernate tự sinh UUIDv7 khi lưu lần đầu. UUIDv7 bắt đầu bằng thời gian nên tăng dần, index của PostgreSQL chèn vào cuối thay vì rải lung tung (D-08).</w:t>
+      </w:r>
+    </w:p>
+    <w:p>
+      <w:pPr>
+        <w:pStyle w:val="ListParagraph"/>
+        <w:numPr>
+          <w:ilvl w:val="1"/>
+          <w:numId w:val="1"/>
+        </w:numPr>
+      </w:pPr>
+      <w:r>
+        <w:rPr>
+          <w:rFonts w:ascii="Consolas" w:eastAsia="Consolas" w:hAnsi="Consolas" w:cs="Consolas"/>
+        </w:rPr>
+        <w:t xml:space="preserve">@Column(name = "user_id")</w:t>
+      </w:r>
+      <w:r>
+        <w:t xml:space="preserve">: tên field Java khác tên cột thì ghi rõ. </w:t>
+      </w:r>
+      <w:r>
+        <w:rPr>
+          <w:rFonts w:ascii="Consolas" w:eastAsia="Consolas" w:hAnsi="Consolas" w:cs="Consolas"/>
+        </w:rPr>
+        <w:t xml:space="preserve">updatable = false</w:t>
+      </w:r>
+      <w:r>
+        <w:t xml:space="preserve">: cột không bao giờ bị </w:t>
+      </w:r>
+      <w:r>
+        <w:rPr>
+          <w:rFonts w:ascii="Consolas" w:eastAsia="Consolas" w:hAnsi="Consolas" w:cs="Consolas"/>
+        </w:rPr>
+        <w:t xml:space="preserve">UPDATE</w:t>
+      </w:r>
+      <w:r>
+        <w:t xml:space="preserve">.</w:t>
+      </w:r>
+    </w:p>
+    <w:p>
+      <w:pPr>
+        <w:pStyle w:val="ListParagraph"/>
+        <w:numPr>
+          <w:ilvl w:val="1"/>
+          <w:numId w:val="1"/>
+        </w:numPr>
+      </w:pPr>
+      <w:r>
+        <w:rPr>
+          <w:rFonts w:ascii="Consolas" w:eastAsia="Consolas" w:hAnsi="Consolas" w:cs="Consolas"/>
+        </w:rPr>
+        <w:t xml:space="preserve">@Enumerated(EnumType.STRING)</w:t>
+      </w:r>
+      <w:r>
+        <w:t xml:space="preserve">: lưu </w:t>
+      </w:r>
+      <w:r>
+        <w:rPr>
+          <w:rFonts w:ascii="Consolas" w:eastAsia="Consolas" w:hAnsi="Consolas" w:cs="Consolas"/>
+        </w:rPr>
+        <w:t xml:space="preserve">"CONNECTED"</w:t>
+      </w:r>
+      <w:r>
+        <w:t xml:space="preserve">, không lưu số thứ tự. Lưu số thì chèn thêm giá trị vào giữa enum là dữ liệu cũ sai nghĩa. DB có thêm </w:t>
+      </w:r>
+      <w:r>
+        <w:rPr>
+          <w:rFonts w:ascii="Consolas" w:eastAsia="Consolas" w:hAnsi="Consolas" w:cs="Consolas"/>
+        </w:rPr>
+        <w:t xml:space="preserve">CHECK (status IN (...))</w:t>
+      </w:r>
+      <w:r>
+        <w:t xml:space="preserve"> (D-09).</w:t>
+      </w:r>
+    </w:p>
+    <w:p>
+      <w:pPr>
+        <w:pStyle w:val="ListParagraph"/>
+        <w:numPr>
+          <w:ilvl w:val="1"/>
+          <w:numId w:val="1"/>
+        </w:numPr>
+      </w:pPr>
+      <w:r>
+        <w:rPr>
+          <w:rFonts w:ascii="Consolas" w:eastAsia="Consolas" w:hAnsi="Consolas" w:cs="Consolas"/>
+        </w:rPr>
+        <w:t xml:space="preserve">@PrePersist</w:t>
+      </w:r>
+      <w:r>
+        <w:t xml:space="preserve"> / </w:t>
+      </w:r>
+      <w:r>
+        <w:rPr>
+          <w:rFonts w:ascii="Consolas" w:eastAsia="Consolas" w:hAnsi="Consolas" w:cs="Consolas"/>
+        </w:rPr>
+        <w:t xml:space="preserve">@PreUpdate</w:t>
+      </w:r>
+      <w:r>
+        <w:t xml:space="preserve">: Hibernate gọi ngay trước </w:t>
+      </w:r>
+      <w:r>
+        <w:rPr>
+          <w:rFonts w:ascii="Consolas" w:eastAsia="Consolas" w:hAnsi="Consolas" w:cs="Consolas"/>
+        </w:rPr>
+        <w:t xml:space="preserve">INSERT</w:t>
+      </w:r>
+      <w:r>
+        <w:t xml:space="preserve"> / </w:t>
+      </w:r>
+      <w:r>
+        <w:rPr>
+          <w:rFonts w:ascii="Consolas" w:eastAsia="Consolas" w:hAnsi="Consolas" w:cs="Consolas"/>
+        </w:rPr>
+        <w:t xml:space="preserve">UPDATE</w:t>
+      </w:r>
+      <w:r>
+        <w:t xml:space="preserve"> để điền </w:t>
+      </w:r>
+      <w:r>
+        <w:rPr>
+          <w:rFonts w:ascii="Consolas" w:eastAsia="Consolas" w:hAnsi="Consolas" w:cs="Consolas"/>
+        </w:rPr>
+        <w:t xml:space="preserve">created_at</w:t>
+      </w:r>
+      <w:r>
+        <w:t xml:space="preserve">, </w:t>
+      </w:r>
+      <w:r>
+        <w:rPr>
+          <w:rFonts w:ascii="Consolas" w:eastAsia="Consolas" w:hAnsi="Consolas" w:cs="Consolas"/>
+        </w:rPr>
+        <w:t xml:space="preserve">updated_at</w:t>
+      </w:r>
+      <w:r>
+        <w:t xml:space="preserve">.</w:t>
+      </w:r>
+    </w:p>
+    <w:p>
+      <w:pPr>
+        <w:pStyle w:val="ListParagraph"/>
+        <w:numPr>
+          <w:ilvl w:val="1"/>
+          <w:numId w:val="1"/>
+        </w:numPr>
+      </w:pPr>
+      <w:r>
+        <w:t xml:space="preserve">Constructor rỗng </w:t>
+      </w:r>
+      <w:r>
+        <w:rPr>
+          <w:rFonts w:ascii="Consolas" w:eastAsia="Consolas" w:hAnsi="Consolas" w:cs="Consolas"/>
+        </w:rPr>
+        <w:t xml:space="preserve">protected</w:t>
+      </w:r>
+      <w:r>
+        <w:t xml:space="preserve">: JPA cần nó để tạo object bằng reflection; </w:t>
+      </w:r>
+      <w:r>
+        <w:rPr>
+          <w:rFonts w:ascii="Consolas" w:eastAsia="Consolas" w:hAnsi="Consolas" w:cs="Consolas"/>
+        </w:rPr>
+        <w:t xml:space="preserve">protected</w:t>
+      </w:r>
+      <w:r>
+        <w:t xml:space="preserve"> để code của mình không dùng nhầm.</w:t>
+      </w:r>
+    </w:p>
+    <w:p>
+      <w:pPr>
+        <w:pStyle w:val="ListParagraph"/>
+        <w:numPr>
+          <w:ilvl w:val="0"/>
+          <w:numId w:val="1"/>
+        </w:numPr>
+      </w:pPr>
+      <w:r>
+        <w:rPr>
+          <w:b/>
+          <w:bCs/>
+        </w:rPr>
+        <w:t xml:space="preserve">Không có setter:</w:t>
+      </w:r>
+      <w:r>
+        <w:t xml:space="preserve"> muốn đổi dữ liệu phải gọi hành động có tên (</w:t>
+      </w:r>
+      <w:r>
+        <w:rPr>
+          <w:rFonts w:ascii="Consolas" w:eastAsia="Consolas" w:hAnsi="Consolas" w:cs="Consolas"/>
+        </w:rPr>
+        <w:t xml:space="preserve">rename</w:t>
+      </w:r>
+      <w:r>
+        <w:t xml:space="preserve">, </w:t>
+      </w:r>
+      <w:r>
+        <w:rPr>
+          <w:rFonts w:ascii="Consolas" w:eastAsia="Consolas" w:hAnsi="Consolas" w:cs="Consolas"/>
+        </w:rPr>
+        <w:t xml:space="preserve">disable</w:t>
+      </w:r>
+      <w:r>
+        <w:t xml:space="preserve">…).</w:t>
+      </w:r>
+    </w:p>
+    <w:p>
+      <w:pPr>
+        <w:pStyle w:val="Heading3"/>
+      </w:pPr>
+      <w:r>
+        <w:t xml:space="preserve">15.2 Map thẳng lên aggregate (lựa chọn của BE-11)</w:t>
+      </w:r>
+    </w:p>
+    <w:p>
+      <w:pPr>
+        <w:pStyle w:val="ListParagraph"/>
+        <w:numPr>
+          <w:ilvl w:val="0"/>
+          <w:numId w:val="1"/>
+        </w:numPr>
+      </w:pPr>
+      <w:r>
+        <w:rPr>
+          <w:rFonts w:ascii="Consolas" w:eastAsia="Consolas" w:hAnsi="Consolas" w:cs="Consolas"/>
+        </w:rPr>
+        <w:t xml:space="preserve">ConnectedAccount</w:t>
+      </w:r>
+      <w:r>
+        <w:t xml:space="preserve"> vừa là domain vừa là entity: một model, không cần class mapper. Cái giá là domain biết annotation JPA; ở quy mô này, đơn giản thắng.</w:t>
+      </w:r>
+    </w:p>
+    <w:p>
+      <w:pPr>
+        <w:pStyle w:val="Heading3"/>
+      </w:pPr>
+      <w:r>
+        <w:t xml:space="preserve">15.3 </w:t>
+      </w:r>
+      <w:r>
+        <w:rPr>
+          <w:rFonts w:ascii="Consolas" w:eastAsia="Consolas" w:hAnsi="Consolas" w:cs="Consolas"/>
+        </w:rPr>
+        <w:t xml:space="preserve">AttributeConverter</w:t>
+      </w:r>
+    </w:p>
+    <w:p>
+      <w:pPr>
+        <w:pStyle w:val="ListParagraph"/>
+        <w:numPr>
+          <w:ilvl w:val="0"/>
+          <w:numId w:val="1"/>
+        </w:numPr>
+      </w:pPr>
+      <w:r>
+        <w:rPr>
+          <w:b/>
+          <w:bCs/>
+        </w:rPr>
+        <w:t xml:space="preserve">Ở đâu:</w:t>
+      </w:r>
+      <w:r>
+        <w:t xml:space="preserve"> </w:t>
+      </w:r>
+      <w:r>
+        <w:rPr>
+          <w:rFonts w:ascii="Consolas" w:eastAsia="Consolas" w:hAnsi="Consolas" w:cs="Consolas"/>
+        </w:rPr>
+        <w:t xml:space="preserve">account/infrastructure/ProviderTypeConverter.java</w:t>
+      </w:r>
+      <w:r>
+        <w:t xml:space="preserve">.</w:t>
+      </w:r>
+    </w:p>
+    <w:p>
+      <w:pPr>
+        <w:pStyle w:val="ListParagraph"/>
+        <w:numPr>
+          <w:ilvl w:val="0"/>
+          <w:numId w:val="1"/>
+        </w:numPr>
+      </w:pPr>
+      <w:r>
+        <w:rPr>
+          <w:b/>
+          <w:bCs/>
+        </w:rPr>
+        <w:t xml:space="preserve">Là gì:</w:t>
+      </w:r>
+      <w:r>
+        <w:t xml:space="preserve"> dạy Hibernate cách lưu một kiểu nó không biết, ở đây </w:t>
+      </w:r>
+      <w:r>
+        <w:rPr>
+          <w:rFonts w:ascii="Consolas" w:eastAsia="Consolas" w:hAnsi="Consolas" w:cs="Consolas"/>
+        </w:rPr>
+        <w:t xml:space="preserve">ProviderType</w:t>
+      </w:r>
+      <w:r>
+        <w:t xml:space="preserve"> ↔ chuỗi </w:t>
+      </w:r>
+      <w:r>
+        <w:rPr>
+          <w:rFonts w:ascii="Consolas" w:eastAsia="Consolas" w:hAnsi="Consolas" w:cs="Consolas"/>
+        </w:rPr>
+        <w:t xml:space="preserve">"gmail"</w:t>
+      </w:r>
+      <w:r>
+        <w:t xml:space="preserve">.</w:t>
+      </w:r>
+    </w:p>
+    <w:p>
+      <w:pPr>
+        <w:pStyle w:val="ListParagraph"/>
+        <w:numPr>
+          <w:ilvl w:val="0"/>
+          <w:numId w:val="1"/>
+        </w:numPr>
+      </w:pPr>
+      <w:r>
+        <w:rPr>
+          <w:rFonts w:ascii="Consolas" w:eastAsia="Consolas" w:hAnsi="Consolas" w:cs="Consolas"/>
+          <w:b/>
+          <w:bCs/>
+        </w:rPr>
+        <w:t xml:space="preserve">autoApply = true</w:t>
+      </w:r>
+      <w:r>
+        <w:rPr>
+          <w:b/>
+          <w:bCs/>
+        </w:rPr>
+        <w:t xml:space="preserve">:</w:t>
+      </w:r>
+      <w:r>
+        <w:t xml:space="preserve"> tự áp cho mọi field kiểu </w:t>
+      </w:r>
+      <w:r>
+        <w:rPr>
+          <w:rFonts w:ascii="Consolas" w:eastAsia="Consolas" w:hAnsi="Consolas" w:cs="Consolas"/>
+        </w:rPr>
+        <w:t xml:space="preserve">ProviderType</w:t>
+      </w:r>
+      <w:r>
+        <w:t xml:space="preserve">, nên domain không phải nhắc tới class hạ tầng này.</w:t>
+      </w:r>
+    </w:p>
+    <w:p>
+      <w:pPr>
+        <w:pStyle w:val="Heading3"/>
+      </w:pPr>
+      <w:r>
+        <w:t xml:space="preserve">15.4 </w:t>
+      </w:r>
+      <w:r>
+        <w:rPr>
+          <w:rFonts w:ascii="Consolas" w:eastAsia="Consolas" w:hAnsi="Consolas" w:cs="Consolas"/>
+        </w:rPr>
+        <w:t xml:space="preserve">@Version</w:t>
+      </w:r>
+      <w:r>
+        <w:t xml:space="preserve"> — optimistic locking</w:t>
+      </w:r>
+    </w:p>
+    <w:p>
+      <w:pPr>
+        <w:pStyle w:val="ListParagraph"/>
+        <w:numPr>
+          <w:ilvl w:val="0"/>
+          <w:numId w:val="1"/>
+        </w:numPr>
+      </w:pPr>
+      <w:r>
+        <w:t xml:space="preserve">Mỗi lần </w:t>
+      </w:r>
+      <w:r>
+        <w:rPr>
+          <w:rFonts w:ascii="Consolas" w:eastAsia="Consolas" w:hAnsi="Consolas" w:cs="Consolas"/>
+        </w:rPr>
+        <w:t xml:space="preserve">UPDATE</w:t>
+      </w:r>
+      <w:r>
+        <w:t xml:space="preserve">, Hibernate tăng </w:t>
+      </w:r>
+      <w:r>
+        <w:rPr>
+          <w:rFonts w:ascii="Consolas" w:eastAsia="Consolas" w:hAnsi="Consolas" w:cs="Consolas"/>
+        </w:rPr>
+        <w:t xml:space="preserve">version</w:t>
+      </w:r>
+      <w:r>
+        <w:t xml:space="preserve"> và chỉ ghi khi DB vẫn đúng version nó đã đọc. Hai request cùng sửa một account: request chậm hơn bị từ chối, thay vì âm thầm ghi đè.</w:t>
+      </w:r>
+    </w:p>
+    <w:p>
+      <w:pPr>
+        <w:pStyle w:val="ListParagraph"/>
+        <w:numPr>
+          <w:ilvl w:val="0"/>
+          <w:numId w:val="1"/>
+        </w:numPr>
+      </w:pPr>
+      <w:r>
+        <w:rPr>
+          <w:b/>
+          <w:bCs/>
+        </w:rPr>
+        <w:t xml:space="preserve">Bẫy:</w:t>
+      </w:r>
+      <w:r>
+        <w:t xml:space="preserve"> import </w:t>
+      </w:r>
+      <w:r>
+        <w:rPr>
+          <w:rFonts w:ascii="Consolas" w:eastAsia="Consolas" w:hAnsi="Consolas" w:cs="Consolas"/>
+        </w:rPr>
+        <w:t xml:space="preserve">jakarta.persistence.Version</w:t>
+      </w:r>
+      <w:r>
+        <w:t xml:space="preserve">, </w:t>
+      </w:r>
+      <w:r>
+        <w:rPr>
+          <w:b/>
+          <w:bCs/>
+        </w:rPr>
+        <w:t xml:space="preserve">không phải</w:t>
+      </w:r>
+      <w:r>
+        <w:t xml:space="preserve"> </w:t>
+      </w:r>
+      <w:r>
+        <w:rPr>
+          <w:rFonts w:ascii="Consolas" w:eastAsia="Consolas" w:hAnsi="Consolas" w:cs="Consolas"/>
+        </w:rPr>
+        <w:t xml:space="preserve">org.springframework.data.annotation.Version</w:t>
+      </w:r>
+      <w:r>
+        <w:t xml:space="preserve">.</w:t>
+      </w:r>
+    </w:p>
+    <w:p>
+      <w:pPr>
+        <w:pStyle w:val="Heading3"/>
+      </w:pPr>
+      <w:r>
+        <w:t xml:space="preserve">15.5 Repository</w:t>
+      </w:r>
+    </w:p>
+    <w:p>
+      <w:pPr>
+        <w:pStyle w:val="ListParagraph"/>
+        <w:numPr>
+          <w:ilvl w:val="0"/>
+          <w:numId w:val="1"/>
+        </w:numPr>
+      </w:pPr>
+      <w:r>
+        <w:rPr>
+          <w:b/>
+          <w:bCs/>
+        </w:rPr>
+        <w:t xml:space="preserve">Ở đâu:</w:t>
+      </w:r>
+      <w:r>
+        <w:t xml:space="preserve"> </w:t>
+      </w:r>
+      <w:r>
+        <w:rPr>
+          <w:rFonts w:ascii="Consolas" w:eastAsia="Consolas" w:hAnsi="Consolas" w:cs="Consolas"/>
+        </w:rPr>
+        <w:t xml:space="preserve">AppUserRepository</w:t>
+      </w:r>
+      <w:r>
+        <w:t xml:space="preserve">, </w:t>
+      </w:r>
+      <w:r>
+        <w:rPr>
+          <w:rFonts w:ascii="Consolas" w:eastAsia="Consolas" w:hAnsi="Consolas" w:cs="Consolas"/>
+        </w:rPr>
+        <w:t xml:space="preserve">ConnectedAccountRepository</w:t>
+      </w:r>
+      <w:r>
+        <w:t xml:space="preserve">.</w:t>
+      </w:r>
+    </w:p>
+    <w:p>
+      <w:pPr>
+        <w:pStyle w:val="ListParagraph"/>
+        <w:numPr>
+          <w:ilvl w:val="0"/>
+          <w:numId w:val="1"/>
+        </w:numPr>
+      </w:pPr>
+      <w:r>
+        <w:t xml:space="preserve">Chỉ là interface </w:t>
+      </w:r>
+      <w:r>
+        <w:rPr>
+          <w:rFonts w:ascii="Consolas" w:eastAsia="Consolas" w:hAnsi="Consolas" w:cs="Consolas"/>
+        </w:rPr>
+        <w:t xml:space="preserve">extends JpaRepository&lt;Entity, KieuId&gt;</w:t>
+      </w:r>
+      <w:r>
+        <w:t xml:space="preserve">; Spring tự sinh phần cài đặt.</w:t>
+      </w:r>
+    </w:p>
+    <w:p>
+      <w:pPr>
+        <w:pStyle w:val="ListParagraph"/>
+        <w:numPr>
+          <w:ilvl w:val="0"/>
+          <w:numId w:val="1"/>
+        </w:numPr>
+      </w:pPr>
+      <w:r>
+        <w:rPr>
+          <w:b/>
+          <w:bCs/>
+        </w:rPr>
+        <w:t xml:space="preserve">Tên method là câu truy vấn:</w:t>
+      </w:r>
+      <w:r>
+        <w:t xml:space="preserve"> </w:t>
+      </w:r>
+      <w:r>
+        <w:rPr>
+          <w:rFonts w:ascii="Consolas" w:eastAsia="Consolas" w:hAnsi="Consolas" w:cs="Consolas"/>
+        </w:rPr>
+        <w:t xml:space="preserve">findByOwnerIdOrderByCreatedAtAscIdAsc</w:t>
+      </w:r>
+      <w:r>
+        <w:t xml:space="preserve"> = </w:t>
+      </w:r>
+      <w:r>
+        <w:rPr>
+          <w:rFonts w:ascii="Consolas" w:eastAsia="Consolas" w:hAnsi="Consolas" w:cs="Consolas"/>
+        </w:rPr>
+        <w:t xml:space="preserve">WHERE user_id = ? ORDER BY created_at, id</w:t>
+      </w:r>
+      <w:r>
+        <w:t xml:space="preserve">. Tên dùng </w:t>
+      </w:r>
+      <w:r>
+        <w:rPr>
+          <w:b/>
+          <w:bCs/>
+        </w:rPr>
+        <w:t xml:space="preserve">field Java</w:t>
+      </w:r>
+      <w:r>
+        <w:t xml:space="preserve">, không dùng tên cột.</w:t>
+      </w:r>
+    </w:p>
+    <w:p>
+      <w:pPr>
+        <w:pStyle w:val="ListParagraph"/>
+        <w:numPr>
+          <w:ilvl w:val="0"/>
+          <w:numId w:val="1"/>
+        </w:numPr>
+      </w:pPr>
+      <w:r>
+        <w:rPr>
+          <w:rFonts w:ascii="Consolas" w:eastAsia="Consolas" w:hAnsi="Consolas" w:cs="Consolas"/>
+        </w:rPr>
+        <w:t xml:space="preserve">@Query("select u.id from AppUser u where u.email = :email")</w:t>
+      </w:r>
+      <w:r>
+        <w:t xml:space="preserve">: viết JPQL (truy vấn theo entity) khi chỉ cần một cột.</w:t>
+      </w:r>
+    </w:p>
+    <w:p>
+      <w:pPr>
+        <w:pStyle w:val="Heading3"/>
+      </w:pPr>
+      <w:r>
+        <w:t xml:space="preserve">15.6 Ràng buộc ở database là lớp bảo vệ cuối</w:t>
+      </w:r>
+    </w:p>
+    <w:p>
+      <w:pPr>
+        <w:pStyle w:val="ListParagraph"/>
+        <w:numPr>
+          <w:ilvl w:val="0"/>
+          <w:numId w:val="1"/>
+        </w:numPr>
+      </w:pPr>
+      <w:r>
+        <w:rPr>
+          <w:rFonts w:ascii="Consolas" w:eastAsia="Consolas" w:hAnsi="Consolas" w:cs="Consolas"/>
+        </w:rPr>
+        <w:t xml:space="preserve">UNIQUE (user_id, provider, external_account_id)</w:t>
+      </w:r>
+      <w:r>
+        <w:t xml:space="preserve">: dù code tìm trước rồi mới tạo, hai request đến cùng lúc vẫn có thể cùng "không thấy" rồi cùng tạo. Chỉ DB chặn được chắc chắn.</w:t>
+      </w:r>
+    </w:p>
+    <w:p>
+      <w:pPr>
+        <w:pStyle w:val="ListParagraph"/>
+        <w:numPr>
+          <w:ilvl w:val="0"/>
+          <w:numId w:val="1"/>
+        </w:numPr>
+      </w:pPr>
+      <w:r>
+        <w:rPr>
+          <w:rFonts w:ascii="Consolas" w:eastAsia="Consolas" w:hAnsi="Consolas" w:cs="Consolas"/>
+        </w:rPr>
+        <w:t xml:space="preserve">FOREIGN KEY ... REFERENCES app_user</w:t>
+      </w:r>
+      <w:r>
+        <w:t xml:space="preserve">: account phải thuộc một user có thật.</w:t>
+      </w:r>
+    </w:p>
+    <w:p>
+      <w:pPr>
+        <w:pBdr>
+          <w:bottom w:val="single" w:sz="4" w:space="0" w:color="auto"/>
+        </w:pBdr>
+        <w:ind w:left="0"/>
+      </w:pPr>
+    </w:p>
+    <w:p>
+      <w:pPr>
+        <w:pStyle w:val="Heading2"/>
+      </w:pPr>
+      <w:r>
+        <w:t xml:space="preserve">16. Aggregate và máy trạng thái (BE-10)</w:t>
+      </w:r>
+    </w:p>
+    <w:p>
+      <w:pPr>
+        <w:pStyle w:val="Heading3"/>
+      </w:pPr>
+      <w:r>
+        <w:t xml:space="preserve">16.1 "Tell, don't ask"</w:t>
+      </w:r>
+    </w:p>
+    <w:p>
+      <w:pPr>
+        <w:pStyle w:val="ListParagraph"/>
+        <w:numPr>
+          <w:ilvl w:val="0"/>
+          <w:numId w:val="1"/>
+        </w:numPr>
+      </w:pPr>
+      <w:r>
+        <w:rPr>
+          <w:b/>
+          <w:bCs/>
+        </w:rPr>
+        <w:t xml:space="preserve">Ở đâu:</w:t>
+      </w:r>
+      <w:r>
+        <w:t xml:space="preserve"> </w:t>
+      </w:r>
+      <w:r>
+        <w:rPr>
+          <w:rFonts w:ascii="Consolas" w:eastAsia="Consolas" w:hAnsi="Consolas" w:cs="Consolas"/>
+        </w:rPr>
+        <w:t xml:space="preserve">account/domain/ConnectedAccount.java</w:t>
+      </w:r>
+      <w:r>
+        <w:t xml:space="preserve">.</w:t>
+      </w:r>
+    </w:p>
+    <w:p>
+      <w:pPr>
+        <w:pStyle w:val="ListParagraph"/>
+        <w:numPr>
+          <w:ilvl w:val="0"/>
+          <w:numId w:val="1"/>
+        </w:numPr>
+      </w:pPr>
+      <w:r>
+        <w:t xml:space="preserve">Không có </w:t>
+      </w:r>
+      <w:r>
+        <w:rPr>
+          <w:rFonts w:ascii="Consolas" w:eastAsia="Consolas" w:hAnsi="Consolas" w:cs="Consolas"/>
+        </w:rPr>
+        <w:t xml:space="preserve">setStatus</w:t>
+      </w:r>
+      <w:r>
+        <w:t xml:space="preserve">. Bên ngoài </w:t>
+      </w:r>
+      <w:r>
+        <w:rPr>
+          <w:b/>
+          <w:bCs/>
+        </w:rPr>
+        <w:t xml:space="preserve">ra lệnh</w:t>
+      </w:r>
+      <w:r>
+        <w:t xml:space="preserve"> (</w:t>
+      </w:r>
+      <w:r>
+        <w:rPr>
+          <w:rFonts w:ascii="Consolas" w:eastAsia="Consolas" w:hAnsi="Consolas" w:cs="Consolas"/>
+        </w:rPr>
+        <w:t xml:space="preserve">disable()</w:t>
+      </w:r>
+      <w:r>
+        <w:t xml:space="preserve">, </w:t>
+      </w:r>
+      <w:r>
+        <w:rPr>
+          <w:rFonts w:ascii="Consolas" w:eastAsia="Consolas" w:hAnsi="Consolas" w:cs="Consolas"/>
+        </w:rPr>
+        <w:t xml:space="preserve">markAuthExpired()</w:t>
+      </w:r>
+      <w:r>
+        <w:t xml:space="preserve">), aggregate tự quyết có đổi hay không. Luật nằm một chỗ; không service nào có thể quên luật.</w:t>
+      </w:r>
+    </w:p>
+    <w:p>
+      <w:pPr>
+        <w:pStyle w:val="Heading3"/>
+      </w:pPr>
+      <w:r>
+        <w:t xml:space="preserve">16.2 Máy trạng thái viết gọn</w:t>
+      </w:r>
+    </w:p>
+    <w:p>
+      <w:pPr>
+        <w:pStyle w:val="ListParagraph"/>
+        <w:numPr>
+          <w:ilvl w:val="0"/>
+          <w:numId w:val="1"/>
+        </w:numPr>
+      </w:pPr>
+      <w:r>
+        <w:t xml:space="preserve">Mỗi hành động khai báo "đích đến" và "được đi từ đâu":</w:t>
+      </w:r>
+    </w:p>
+    <w:p>
+      <w:pPr>
+        <w:shd w:val="clear" w:color="auto" w:fill="F2F3F5"/>
+        <w:ind w:left="360"/>
+      </w:pPr>
+      <w:r>
+        <w:rPr>
+          <w:rFonts w:ascii="Consolas" w:eastAsia="Consolas" w:hAnsi="Consolas" w:cs="Consolas"/>
+          <w:sz w:val="19"/>
+          <w:szCs w:val="19"/>
+        </w:rPr>
+        <w:t xml:space="preserve">public Optional&lt;StatusChange&gt; markAuthExpired() {</w:t>
+        <w:br/>
+        <w:t xml:space="preserve">    return moveTo(AUTH_EXPIRED, EnumSet.of(CONNECTED, DEGRADED, ERROR));</w:t>
+        <w:br/>
+        <w:t xml:space="preserve">}</w:t>
+      </w:r>
+    </w:p>
+    <w:p>
+      <w:pPr>
+        <w:pStyle w:val="ListParagraph"/>
+        <w:numPr>
+          <w:ilvl w:val="0"/>
+          <w:numId w:val="1"/>
+        </w:numPr>
+      </w:pPr>
+      <w:r>
+        <w:t xml:space="preserve">Trạng thái hiện tại không nằm trong tập cho phép thì không làm gì và trả </w:t>
+      </w:r>
+      <w:r>
+        <w:rPr>
+          <w:rFonts w:ascii="Consolas" w:eastAsia="Consolas" w:hAnsi="Consolas" w:cs="Consolas"/>
+        </w:rPr>
+        <w:t xml:space="preserve">Optional.empty()</w:t>
+      </w:r>
+      <w:r>
+        <w:t xml:space="preserve">. Vì vậy </w:t>
+      </w:r>
+      <w:r>
+        <w:rPr>
+          <w:rFonts w:ascii="Consolas" w:eastAsia="Consolas" w:hAnsi="Consolas" w:cs="Consolas"/>
+        </w:rPr>
+        <w:t xml:space="preserve">DISABLED</w:t>
+      </w:r>
+      <w:r>
+        <w:t xml:space="preserve"> (người dùng tắt) không bao giờ bị hệ thống tự đổi, và </w:t>
+      </w:r>
+      <w:r>
+        <w:rPr>
+          <w:rFonts w:ascii="Consolas" w:eastAsia="Consolas" w:hAnsi="Consolas" w:cs="Consolas"/>
+        </w:rPr>
+        <w:t xml:space="preserve">AUTH_EXPIRED</w:t>
+      </w:r>
+      <w:r>
+        <w:t xml:space="preserve"> chỉ reconnect mới gỡ.</w:t>
+      </w:r>
+    </w:p>
+    <w:p>
+      <w:pPr>
+        <w:pStyle w:val="ListParagraph"/>
+        <w:numPr>
+          <w:ilvl w:val="0"/>
+          <w:numId w:val="1"/>
+        </w:numPr>
+      </w:pPr>
+      <w:r>
+        <w:t xml:space="preserve">Trả </w:t>
+      </w:r>
+      <w:r>
+        <w:rPr>
+          <w:rFonts w:ascii="Consolas" w:eastAsia="Consolas" w:hAnsi="Consolas" w:cs="Consolas"/>
+        </w:rPr>
+        <w:t xml:space="preserve">Optional&lt;StatusChange&gt;</w:t>
+      </w:r>
+      <w:r>
+        <w:t xml:space="preserve"> thay vì tự tạo event: service có ID và đồng hồ nên service tạo event </w:t>
+      </w:r>
+      <w:r>
+        <w:rPr>
+          <w:rFonts w:ascii="Consolas" w:eastAsia="Consolas" w:hAnsi="Consolas" w:cs="Consolas"/>
+        </w:rPr>
+        <w:t xml:space="preserve">AccountStatusChanged</w:t>
+      </w:r>
+      <w:r>
+        <w:t xml:space="preserve">; domain giữ là Java thuần.</w:t>
+      </w:r>
+    </w:p>
+    <w:p>
+      <w:pPr>
+        <w:pStyle w:val="Heading3"/>
+      </w:pPr>
+      <w:r>
+        <w:t xml:space="preserve">16.3 Bảng trong tài liệu = bảng trong test</w:t>
+      </w:r>
+    </w:p>
+    <w:p>
+      <w:pPr>
+        <w:pStyle w:val="ListParagraph"/>
+        <w:numPr>
+          <w:ilvl w:val="0"/>
+          <w:numId w:val="1"/>
+        </w:numPr>
+      </w:pPr>
+      <w:r>
+        <w:t xml:space="preserve">35 ô của bảng chuyển trạng thái (design F02) được chép nguyên vào </w:t>
+      </w:r>
+      <w:r>
+        <w:rPr>
+          <w:rFonts w:ascii="Consolas" w:eastAsia="Consolas" w:hAnsi="Consolas" w:cs="Consolas"/>
+        </w:rPr>
+        <w:t xml:space="preserve">@CsvSource</w:t>
+      </w:r>
+      <w:r>
+        <w:t xml:space="preserve">; </w:t>
+      </w:r>
+      <w:r>
+        <w:rPr>
+          <w:rFonts w:ascii="Consolas" w:eastAsia="Consolas" w:hAnsi="Consolas" w:cs="Consolas"/>
+        </w:rPr>
+        <w:t xml:space="preserve">@ParameterizedTest</w:t>
+      </w:r>
+      <w:r>
+        <w:t xml:space="preserve"> chạy mỗi ô thành một test. Sửa luật mà quên sửa bảng thì test đỏ.</w:t>
+      </w:r>
+    </w:p>
+    <w:p>
+      <w:pPr>
+        <w:pStyle w:val="Heading3"/>
+      </w:pPr>
+      <w:r>
+        <w:t xml:space="preserve">16.4 Bẫy emoji: </w:t>
+      </w:r>
+      <w:r>
+        <w:rPr>
+          <w:rFonts w:ascii="Consolas" w:eastAsia="Consolas" w:hAnsi="Consolas" w:cs="Consolas"/>
+        </w:rPr>
+        <w:t xml:space="preserve">char</w:t>
+      </w:r>
+      <w:r>
+        <w:t xml:space="preserve"> khác "ký tự"</w:t>
+      </w:r>
+    </w:p>
+    <w:p>
+      <w:pPr>
+        <w:pStyle w:val="ListParagraph"/>
+        <w:numPr>
+          <w:ilvl w:val="0"/>
+          <w:numId w:val="1"/>
+        </w:numPr>
+      </w:pPr>
+      <w:r>
+        <w:t xml:space="preserve">Java lưu chuỗi theo UTF-16: một emoji (ví dụ hình mặt cười) chiếm </w:t>
+      </w:r>
+      <w:r>
+        <w:rPr>
+          <w:b/>
+          <w:bCs/>
+        </w:rPr>
+        <w:t xml:space="preserve">2</w:t>
+      </w:r>
+      <w:r>
+        <w:t xml:space="preserve"> </w:t>
+      </w:r>
+      <w:r>
+        <w:rPr>
+          <w:rFonts w:ascii="Consolas" w:eastAsia="Consolas" w:hAnsi="Consolas" w:cs="Consolas"/>
+        </w:rPr>
+        <w:t xml:space="preserve">char</w:t>
+      </w:r>
+      <w:r>
+        <w:t xml:space="preserve">. Hằng </w:t>
+      </w:r>
+      <w:r>
+        <w:rPr>
+          <w:rFonts w:ascii="Consolas" w:eastAsia="Consolas" w:hAnsi="Consolas" w:cs="Consolas"/>
+        </w:rPr>
+        <w:t xml:space="preserve">EMOJI</w:t>
+      </w:r>
+      <w:r>
+        <w:t xml:space="preserve"> trong </w:t>
+      </w:r>
+      <w:r>
+        <w:rPr>
+          <w:rFonts w:ascii="Consolas" w:eastAsia="Consolas" w:hAnsi="Consolas" w:cs="Consolas"/>
+        </w:rPr>
+        <w:t xml:space="preserve">ConnectedAccountTests</w:t>
+      </w:r>
+      <w:r>
+        <w:t xml:space="preserve"> chứa đúng một emoji, và </w:t>
+      </w:r>
+      <w:r>
+        <w:rPr>
+          <w:rFonts w:ascii="Consolas" w:eastAsia="Consolas" w:hAnsi="Consolas" w:cs="Consolas"/>
+        </w:rPr>
+        <w:t xml:space="preserve">EMOJI.length() == 2</w:t>
+      </w:r>
+      <w:r>
+        <w:t xml:space="preserve">. PostgreSQL thì đếm </w:t>
+      </w:r>
+      <w:r>
+        <w:rPr>
+          <w:rFonts w:ascii="Consolas" w:eastAsia="Consolas" w:hAnsi="Consolas" w:cs="Consolas"/>
+        </w:rPr>
+        <w:t xml:space="preserve">varchar(100)</w:t>
+      </w:r>
+      <w:r>
+        <w:t xml:space="preserve"> theo ký tự thật (code point), nên emoji đó chỉ là 1 ký tự.</w:t>
+      </w:r>
+    </w:p>
+    <w:p>
+      <w:pPr>
+        <w:pStyle w:val="ListParagraph"/>
+        <w:numPr>
+          <w:ilvl w:val="0"/>
+          <w:numId w:val="1"/>
+        </w:numPr>
+      </w:pPr>
+      <w:r>
+        <w:t xml:space="preserve">Vì vậy dùng </w:t>
+      </w:r>
+      <w:r>
+        <w:rPr>
+          <w:rFonts w:ascii="Consolas" w:eastAsia="Consolas" w:hAnsi="Consolas" w:cs="Consolas"/>
+        </w:rPr>
+        <w:t xml:space="preserve">codePointCount</w:t>
+      </w:r>
+      <w:r>
+        <w:t xml:space="preserve"> để đếm và </w:t>
+      </w:r>
+      <w:r>
+        <w:rPr>
+          <w:rFonts w:ascii="Consolas" w:eastAsia="Consolas" w:hAnsi="Consolas" w:cs="Consolas"/>
+        </w:rPr>
+        <w:t xml:space="preserve">offsetByCodePoints</w:t>
+      </w:r>
+      <w:r>
+        <w:t xml:space="preserve"> để cắt; </w:t>
+      </w:r>
+      <w:r>
+        <w:rPr>
+          <w:rFonts w:ascii="Consolas" w:eastAsia="Consolas" w:hAnsi="Consolas" w:cs="Consolas"/>
+        </w:rPr>
+        <w:t xml:space="preserve">substring</w:t>
+      </w:r>
+      <w:r>
+        <w:t xml:space="preserve"> thường có thể chặt đôi emoji thành ký tự hỏng.</w:t>
+      </w:r>
+    </w:p>
+    <w:p>
+      <w:pPr>
+        <w:pBdr>
+          <w:bottom w:val="single" w:sz="4" w:space="0" w:color="auto"/>
+        </w:pBdr>
+        <w:ind w:left="0"/>
+      </w:pPr>
+    </w:p>
+    <w:p>
+      <w:pPr>
+        <w:pStyle w:val="Heading2"/>
+      </w:pPr>
+      <w:r>
+        <w:t xml:space="preserve">17. Mã hóa credential (BE-12, D-11)</w:t>
+      </w:r>
+    </w:p>
+    <w:p>
+      <w:pPr>
+        <w:pStyle w:val="Heading3"/>
+      </w:pPr>
+      <w:r>
+        <w:t xml:space="preserve">17.1 Vì sao</w:t>
+      </w:r>
+    </w:p>
+    <w:p>
+      <w:pPr>
+        <w:pStyle w:val="ListParagraph"/>
+        <w:numPr>
+          <w:ilvl w:val="0"/>
+          <w:numId w:val="1"/>
+        </w:numPr>
+      </w:pPr>
+      <w:r>
+        <w:t xml:space="preserve">Token Gmail là chìa khóa vào hộp thư. Nếu lưu dạng chữ, một bản backup DB bị lộ là lộ mọi hộp thư. Vì vậy token được </w:t>
+      </w:r>
+      <w:r>
+        <w:rPr>
+          <w:b/>
+          <w:bCs/>
+        </w:rPr>
+        <w:t xml:space="preserve">mã hóa trong app trước khi ghi DB</w:t>
+      </w:r>
+      <w:r>
+        <w:t xml:space="preserve">, còn </w:t>
+      </w:r>
+      <w:r>
+        <w:rPr>
+          <w:b/>
+          <w:bCs/>
+        </w:rPr>
+        <w:t xml:space="preserve">khóa nằm ngoài DB</w:t>
+      </w:r>
+      <w:r>
+        <w:t xml:space="preserve"> (biến môi trường).</w:t>
+      </w:r>
+    </w:p>
+    <w:p>
+      <w:pPr>
+        <w:pStyle w:val="Heading3"/>
+      </w:pPr>
+      <w:r>
+        <w:t xml:space="preserve">17.2 AES-256-GCM, giải thích từng phần</w:t>
+      </w:r>
+    </w:p>
+    <w:p>
+      <w:pPr>
+        <w:pStyle w:val="ListParagraph"/>
+        <w:numPr>
+          <w:ilvl w:val="0"/>
+          <w:numId w:val="1"/>
+        </w:numPr>
+      </w:pPr>
+      <w:r>
+        <w:rPr>
+          <w:b/>
+          <w:bCs/>
+        </w:rPr>
+        <w:t xml:space="preserve">Ở đâu:</w:t>
+      </w:r>
+      <w:r>
+        <w:t xml:space="preserve"> </w:t>
+      </w:r>
+      <w:r>
+        <w:rPr>
+          <w:rFonts w:ascii="Consolas" w:eastAsia="Consolas" w:hAnsi="Consolas" w:cs="Consolas"/>
+        </w:rPr>
+        <w:t xml:space="preserve">account/infrastructure/crypto/CredentialCipher.java</w:t>
+      </w:r>
+      <w:r>
+        <w:t xml:space="preserve">.</w:t>
+      </w:r>
+    </w:p>
+    <w:p>
+      <w:pPr>
+        <w:pStyle w:val="ListParagraph"/>
+        <w:numPr>
+          <w:ilvl w:val="0"/>
+          <w:numId w:val="1"/>
+        </w:numPr>
+      </w:pPr>
+      <w:r>
+        <w:rPr>
+          <w:b/>
+          <w:bCs/>
+        </w:rPr>
+        <w:t xml:space="preserve">AES-256:</w:t>
+      </w:r>
+      <w:r>
+        <w:t xml:space="preserve"> mã hóa đối xứng: một khóa 32 byte (256 bit) dùng cho cả mã hóa và giải mã.</w:t>
+      </w:r>
+    </w:p>
+    <w:p>
+      <w:pPr>
+        <w:pStyle w:val="ListParagraph"/>
+        <w:numPr>
+          <w:ilvl w:val="0"/>
+          <w:numId w:val="1"/>
+        </w:numPr>
+      </w:pPr>
+      <w:r>
+        <w:rPr>
+          <w:b/>
+          <w:bCs/>
+        </w:rPr>
+        <w:t xml:space="preserve">GCM:</w:t>
+      </w:r>
+      <w:r>
+        <w:t xml:space="preserve"> chế độ "mã hóa có xác thực". Ngoài việc giấu nội dung, nó gắn thêm một </w:t>
+      </w:r>
+      <w:r>
+        <w:rPr>
+          <w:b/>
+          <w:bCs/>
+        </w:rPr>
+        <w:t xml:space="preserve">con dấu (tag 128 bit)</w:t>
+      </w:r>
+      <w:r>
+        <w:t xml:space="preserve">. Sửa dù một byte thì giải mã báo lỗi, không bao giờ trả dữ liệu sai.</w:t>
+      </w:r>
+    </w:p>
+    <w:p>
+      <w:pPr>
+        <w:pStyle w:val="ListParagraph"/>
+        <w:numPr>
+          <w:ilvl w:val="0"/>
+          <w:numId w:val="1"/>
+        </w:numPr>
+      </w:pPr>
+      <w:r>
+        <w:rPr>
+          <w:b/>
+          <w:bCs/>
+        </w:rPr>
+        <w:t xml:space="preserve">IV 12 byte, ngẫu nhiên, mới cho mỗi lần:</w:t>
+      </w:r>
+      <w:r>
+        <w:t xml:space="preserve"> cùng token mã hóa hai lần ra hai kết quả khác nhau. </w:t>
+      </w:r>
+      <w:r>
+        <w:rPr>
+          <w:b/>
+          <w:bCs/>
+        </w:rPr>
+        <w:t xml:space="preserve">Không bao giờ dùng lại IV với cùng khóa:</w:t>
+      </w:r>
+      <w:r>
+        <w:t xml:space="preserve"> với GCM, lặp IV làm lộ dữ liệu và cho phép giả mạo con dấu. Kiểm tra ngược đã chứng minh test bắt được lỗi này: cho IV cố định thì test "hai lần phải khác nhau" đỏ.</w:t>
+      </w:r>
+    </w:p>
+    <w:p>
+      <w:pPr>
+        <w:pStyle w:val="ListParagraph"/>
+        <w:numPr>
+          <w:ilvl w:val="0"/>
+          <w:numId w:val="1"/>
+        </w:numPr>
+      </w:pPr>
+      <w:r>
+        <w:rPr>
+          <w:b/>
+          <w:bCs/>
+        </w:rPr>
+        <w:t xml:space="preserve">AAD (associated data) = </w:t>
+      </w:r>
+      <w:r>
+        <w:rPr>
+          <w:rFonts w:ascii="Consolas" w:eastAsia="Consolas" w:hAnsi="Consolas" w:cs="Consolas"/>
+          <w:b/>
+          <w:bCs/>
+        </w:rPr>
+        <w:t xml:space="preserve">sino:account_credential:v1:&lt;accountId&gt;:&lt;tên cột&gt;</w:t>
+      </w:r>
+      <w:r>
+        <w:rPr>
+          <w:b/>
+          <w:bCs/>
+        </w:rPr>
+        <w:t xml:space="preserve">:</w:t>
+      </w:r>
+      <w:r>
+        <w:t xml:space="preserve"> phần này không được mã hóa nhưng được "đóng dấu" cùng. Chép giá trị mã hóa của account A sang account B, hay từ cột </w:t>
+      </w:r>
+      <w:r>
+        <w:rPr>
+          <w:rFonts w:ascii="Consolas" w:eastAsia="Consolas" w:hAnsi="Consolas" w:cs="Consolas"/>
+        </w:rPr>
+        <w:t xml:space="preserve">access_token</w:t>
+      </w:r>
+      <w:r>
+        <w:t xml:space="preserve"> sang </w:t>
+      </w:r>
+      <w:r>
+        <w:rPr>
+          <w:rFonts w:ascii="Consolas" w:eastAsia="Consolas" w:hAnsi="Consolas" w:cs="Consolas"/>
+        </w:rPr>
+        <w:t xml:space="preserve">refresh_token</w:t>
+      </w:r>
+      <w:r>
+        <w:t xml:space="preserve">, thì giải mã thất bại. Tiền tố </w:t>
+      </w:r>
+      <w:r>
+        <w:rPr>
+          <w:rFonts w:ascii="Consolas" w:eastAsia="Consolas" w:hAnsi="Consolas" w:cs="Consolas"/>
+        </w:rPr>
+        <w:t xml:space="preserve">account_credential:v1</w:t>
+      </w:r>
+      <w:r>
+        <w:t xml:space="preserve"> gắn giá trị với đúng bảng và phiên bản định dạng.</w:t>
+      </w:r>
+    </w:p>
+    <w:p>
+      <w:pPr>
+        <w:pStyle w:val="ListParagraph"/>
+        <w:numPr>
+          <w:ilvl w:val="0"/>
+          <w:numId w:val="1"/>
+        </w:numPr>
+      </w:pPr>
+      <w:r>
+        <w:rPr>
+          <w:b/>
+          <w:bCs/>
+        </w:rPr>
+        <w:t xml:space="preserve">Định dạng lưu:</w:t>
+      </w:r>
+      <w:r>
+        <w:t xml:space="preserve"> </w:t>
+      </w:r>
+      <w:r>
+        <w:rPr>
+          <w:rFonts w:ascii="Consolas" w:eastAsia="Consolas" w:hAnsi="Consolas" w:cs="Consolas"/>
+        </w:rPr>
+        <w:t xml:space="preserve">base64(IV ‖ ciphertext ‖ tag)</w:t>
+      </w:r>
+      <w:r>
+        <w:t xml:space="preserve"> trong cột </w:t>
+      </w:r>
+      <w:r>
+        <w:rPr>
+          <w:rFonts w:ascii="Consolas" w:eastAsia="Consolas" w:hAnsi="Consolas" w:cs="Consolas"/>
+        </w:rPr>
+        <w:t xml:space="preserve">*_enc</w:t>
+      </w:r>
+      <w:r>
+        <w:t xml:space="preserve">; </w:t>
+      </w:r>
+      <w:r>
+        <w:rPr>
+          <w:b/>
+          <w:bCs/>
+        </w:rPr>
+        <w:t xml:space="preserve">ID khóa</w:t>
+      </w:r>
+      <w:r>
+        <w:t xml:space="preserve"> (</w:t>
+      </w:r>
+      <w:r>
+        <w:rPr>
+          <w:rFonts w:ascii="Consolas" w:eastAsia="Consolas" w:hAnsi="Consolas" w:cs="Consolas"/>
+        </w:rPr>
+        <w:t xml:space="preserve">k1</w:t>
+      </w:r>
+      <w:r>
+        <w:t xml:space="preserve">) ở cột riêng.</w:t>
+      </w:r>
+    </w:p>
+    <w:p>
+      <w:pPr>
+        <w:pStyle w:val="ListParagraph"/>
+        <w:numPr>
+          <w:ilvl w:val="0"/>
+          <w:numId w:val="1"/>
+        </w:numPr>
+      </w:pPr>
+      <w:r>
+        <w:rPr>
+          <w:b/>
+          <w:bCs/>
+        </w:rPr>
+        <w:t xml:space="preserve">Các class của JDK:</w:t>
+      </w:r>
+      <w:r>
+        <w:t xml:space="preserve"> </w:t>
+      </w:r>
+      <w:r>
+        <w:rPr>
+          <w:rFonts w:ascii="Consolas" w:eastAsia="Consolas" w:hAnsi="Consolas" w:cs="Consolas"/>
+        </w:rPr>
+        <w:t xml:space="preserve">Cipher.getInstance("AES/GCM/NoPadding")</w:t>
+      </w:r>
+      <w:r>
+        <w:t xml:space="preserve">, </w:t>
+      </w:r>
+      <w:r>
+        <w:rPr>
+          <w:rFonts w:ascii="Consolas" w:eastAsia="Consolas" w:hAnsi="Consolas" w:cs="Consolas"/>
+        </w:rPr>
+        <w:t xml:space="preserve">GCMParameterSpec</w:t>
+      </w:r>
+      <w:r>
+        <w:t xml:space="preserve">, </w:t>
+      </w:r>
+      <w:r>
+        <w:rPr>
+          <w:rFonts w:ascii="Consolas" w:eastAsia="Consolas" w:hAnsi="Consolas" w:cs="Consolas"/>
+        </w:rPr>
+        <w:t xml:space="preserve">SecretKeySpec</w:t>
+      </w:r>
+      <w:r>
+        <w:t xml:space="preserve">, </w:t>
+      </w:r>
+      <w:r>
+        <w:rPr>
+          <w:rFonts w:ascii="Consolas" w:eastAsia="Consolas" w:hAnsi="Consolas" w:cs="Consolas"/>
+        </w:rPr>
+        <w:t xml:space="preserve">SecureRandom</w:t>
+      </w:r>
+      <w:r>
+        <w:t xml:space="preserve">. Không thêm thư viện ngoài.</w:t>
+      </w:r>
+    </w:p>
+    <w:p>
+      <w:pPr>
+        <w:pStyle w:val="ListParagraph"/>
+        <w:numPr>
+          <w:ilvl w:val="0"/>
+          <w:numId w:val="1"/>
+        </w:numPr>
+      </w:pPr>
+      <w:r>
+        <w:rPr>
+          <w:b/>
+          <w:bCs/>
+        </w:rPr>
+        <w:t xml:space="preserve">Thread-safety:</w:t>
+      </w:r>
+      <w:r>
+        <w:t xml:space="preserve"> </w:t>
+      </w:r>
+      <w:r>
+        <w:rPr>
+          <w:rFonts w:ascii="Consolas" w:eastAsia="Consolas" w:hAnsi="Consolas" w:cs="Consolas"/>
+        </w:rPr>
+        <w:t xml:space="preserve">Cipher</w:t>
+      </w:r>
+      <w:r>
+        <w:t xml:space="preserve"> không an toàn khi dùng chung giữa các luồng, nên mỗi lần mã hóa tạo </w:t>
+      </w:r>
+      <w:r>
+        <w:rPr>
+          <w:rFonts w:ascii="Consolas" w:eastAsia="Consolas" w:hAnsi="Consolas" w:cs="Consolas"/>
+        </w:rPr>
+        <w:t xml:space="preserve">Cipher</w:t>
+      </w:r>
+      <w:r>
+        <w:t xml:space="preserve"> mới; </w:t>
+      </w:r>
+      <w:r>
+        <w:rPr>
+          <w:rFonts w:ascii="Consolas" w:eastAsia="Consolas" w:hAnsi="Consolas" w:cs="Consolas"/>
+        </w:rPr>
+        <w:t xml:space="preserve">SecureRandom</w:t>
+      </w:r>
+      <w:r>
+        <w:t xml:space="preserve"> thì dùng chung được.</w:t>
+      </w:r>
+    </w:p>
+    <w:p>
+      <w:pPr>
+        <w:pStyle w:val="Heading3"/>
+      </w:pPr>
+      <w:r>
+        <w:t xml:space="preserve">17.3 Khóa và xoay khóa</w:t>
+      </w:r>
+    </w:p>
+    <w:p>
+      <w:pPr>
+        <w:pStyle w:val="ListParagraph"/>
+        <w:numPr>
+          <w:ilvl w:val="0"/>
+          <w:numId w:val="1"/>
+        </w:numPr>
+      </w:pPr>
+      <w:r>
+        <w:rPr>
+          <w:b/>
+          <w:bCs/>
+        </w:rPr>
+        <w:t xml:space="preserve">Cấu hình:</w:t>
+      </w:r>
+      <w:r>
+        <w:t xml:space="preserve"> </w:t>
+      </w:r>
+      <w:r>
+        <w:rPr>
+          <w:rFonts w:ascii="Consolas" w:eastAsia="Consolas" w:hAnsi="Consolas" w:cs="Consolas"/>
+        </w:rPr>
+        <w:t xml:space="preserve">SINO_CREDENTIAL_ACTIVE_KEY_ID=k1</w:t>
+      </w:r>
+      <w:r>
+        <w:t xml:space="preserve">, </w:t>
+      </w:r>
+      <w:r>
+        <w:rPr>
+          <w:rFonts w:ascii="Consolas" w:eastAsia="Consolas" w:hAnsi="Consolas" w:cs="Consolas"/>
+        </w:rPr>
+        <w:t xml:space="preserve">SINO_CREDENTIAL_KEY_K1=&lt;base64 của 32 byte&gt;</w:t>
+      </w:r>
+      <w:r>
+        <w:t xml:space="preserve">; tạo khóa bằng </w:t>
+      </w:r>
+      <w:r>
+        <w:rPr>
+          <w:rFonts w:ascii="Consolas" w:eastAsia="Consolas" w:hAnsi="Consolas" w:cs="Consolas"/>
+        </w:rPr>
+        <w:t xml:space="preserve">openssl rand -base64 32</w:t>
+      </w:r>
+      <w:r>
+        <w:t xml:space="preserve">.</w:t>
+      </w:r>
+    </w:p>
+    <w:p>
+      <w:pPr>
+        <w:pStyle w:val="ListParagraph"/>
+        <w:numPr>
+          <w:ilvl w:val="0"/>
+          <w:numId w:val="1"/>
+        </w:numPr>
+      </w:pPr>
+      <w:r>
+        <w:rPr>
+          <w:b/>
+          <w:bCs/>
+        </w:rPr>
+        <w:t xml:space="preserve">Kiểm tra lúc khởi động:</w:t>
+      </w:r>
+    </w:p>
+    <w:p>
+      <w:pPr>
+        <w:pStyle w:val="ListParagraph"/>
+        <w:numPr>
+          <w:ilvl w:val="1"/>
+          <w:numId w:val="1"/>
+        </w:numPr>
+      </w:pPr>
+      <w:r>
+        <w:t xml:space="preserve">ID khóa phải khớp </w:t>
+      </w:r>
+      <w:r>
+        <w:rPr>
+          <w:rFonts w:ascii="Consolas" w:eastAsia="Consolas" w:hAnsi="Consolas" w:cs="Consolas"/>
+        </w:rPr>
+        <w:t xml:space="preserve">[a-z0-9_-]{1,32}</w:t>
+      </w:r>
+      <w:r>
+        <w:t xml:space="preserve">, không tự cắt khoảng trắng: </w:t>
+      </w:r>
+      <w:r>
+        <w:rPr>
+          <w:rFonts w:ascii="Consolas" w:eastAsia="Consolas" w:hAnsi="Consolas" w:cs="Consolas"/>
+        </w:rPr>
+        <w:t xml:space="preserve">k1 </w:t>
+      </w:r>
+      <w:r>
+        <w:t xml:space="preserve"> lỡ có dấu cách trong </w:t>
+      </w:r>
+      <w:r>
+        <w:rPr>
+          <w:rFonts w:ascii="Consolas" w:eastAsia="Consolas" w:hAnsi="Consolas" w:cs="Consolas"/>
+        </w:rPr>
+        <w:t xml:space="preserve">.env</w:t>
+      </w:r>
+      <w:r>
+        <w:t xml:space="preserve"> sẽ báo lỗi thay vì âm thầm thành một ID khác.</w:t>
+      </w:r>
+    </w:p>
+    <w:p>
+      <w:pPr>
+        <w:pStyle w:val="ListParagraph"/>
+        <w:numPr>
+          <w:ilvl w:val="1"/>
+          <w:numId w:val="1"/>
+        </w:numPr>
+      </w:pPr>
+      <w:r>
+        <w:t xml:space="preserve">Khóa active phải có, và mọi khóa phải là base64 của đúng 32 byte; sai thì app không start.</w:t>
+      </w:r>
+    </w:p>
+    <w:p>
+      <w:pPr>
+        <w:pStyle w:val="ListParagraph"/>
+        <w:numPr>
+          <w:ilvl w:val="1"/>
+          <w:numId w:val="1"/>
+        </w:numPr>
+      </w:pPr>
+      <w:r>
+        <w:t xml:space="preserve">Thông báo lỗi chỉ nêu </w:t>
+      </w:r>
+      <w:r>
+        <w:rPr>
+          <w:b/>
+          <w:bCs/>
+        </w:rPr>
+        <w:t xml:space="preserve">tên</w:t>
+      </w:r>
+      <w:r>
+        <w:t xml:space="preserve"> cấu hình (</w:t>
+      </w:r>
+      <w:r>
+        <w:rPr>
+          <w:rFonts w:ascii="Consolas" w:eastAsia="Consolas" w:hAnsi="Consolas" w:cs="Consolas"/>
+        </w:rPr>
+        <w:t xml:space="preserve">sino.credentials.encryption.keys.k1</w:t>
+      </w:r>
+      <w:r>
+        <w:t xml:space="preserve">), không bao giờ in giá trị khóa.</w:t>
+      </w:r>
+    </w:p>
+    <w:p>
+      <w:pPr>
+        <w:pStyle w:val="ListParagraph"/>
+        <w:numPr>
+          <w:ilvl w:val="0"/>
+          <w:numId w:val="1"/>
+        </w:numPr>
+      </w:pPr>
+      <w:r>
+        <w:rPr>
+          <w:b/>
+          <w:bCs/>
+        </w:rPr>
+        <w:t xml:space="preserve">Vì sao không dùng </w:t>
+      </w:r>
+      <w:r>
+        <w:rPr>
+          <w:rFonts w:ascii="Consolas" w:eastAsia="Consolas" w:hAnsi="Consolas" w:cs="Consolas"/>
+          <w:b/>
+          <w:bCs/>
+        </w:rPr>
+        <w:t xml:space="preserve">@Size</w:t>
+      </w:r>
+      <w:r>
+        <w:rPr>
+          <w:b/>
+          <w:bCs/>
+        </w:rPr>
+        <w:t xml:space="preserve"> để kiểm khóa:</w:t>
+      </w:r>
+      <w:r>
+        <w:t xml:space="preserve"> thông báo lỗi của Spring Boot in kèm giá trị bị từ chối, tức là in luôn khóa. Vì vậy cipher tự kiểm và tự viết thông báo.</w:t>
+      </w:r>
+    </w:p>
+    <w:p>
+      <w:pPr>
+        <w:pStyle w:val="ListParagraph"/>
+        <w:numPr>
+          <w:ilvl w:val="0"/>
+          <w:numId w:val="1"/>
+        </w:numPr>
+      </w:pPr>
+      <w:r>
+        <w:rPr>
+          <w:b/>
+          <w:bCs/>
+        </w:rPr>
+        <w:t xml:space="preserve">Xoay khóa:</w:t>
+      </w:r>
+      <w:r>
+        <w:t xml:space="preserve"> thêm ô </w:t>
+      </w:r>
+      <w:r>
+        <w:rPr>
+          <w:rFonts w:ascii="Consolas" w:eastAsia="Consolas" w:hAnsi="Consolas" w:cs="Consolas"/>
+        </w:rPr>
+        <w:t xml:space="preserve">k2</w:t>
+      </w:r>
+      <w:r>
+        <w:t xml:space="preserve"> trong </w:t>
+      </w:r>
+      <w:r>
+        <w:rPr>
+          <w:rFonts w:ascii="Consolas" w:eastAsia="Consolas" w:hAnsi="Consolas" w:cs="Consolas"/>
+        </w:rPr>
+        <w:t xml:space="preserve">application.yaml</w:t>
+      </w:r>
+      <w:r>
+        <w:t xml:space="preserve"> và biến </w:t>
+      </w:r>
+      <w:r>
+        <w:rPr>
+          <w:rFonts w:ascii="Consolas" w:eastAsia="Consolas" w:hAnsi="Consolas" w:cs="Consolas"/>
+        </w:rPr>
+        <w:t xml:space="preserve">SINO_CREDENTIAL_KEY_K2</w:t>
+      </w:r>
+      <w:r>
+        <w:t xml:space="preserve">, rồi đặt active = </w:t>
+      </w:r>
+      <w:r>
+        <w:rPr>
+          <w:rFonts w:ascii="Consolas" w:eastAsia="Consolas" w:hAnsi="Consolas" w:cs="Consolas"/>
+        </w:rPr>
+        <w:t xml:space="preserve">k2</w:t>
+      </w:r>
+      <w:r>
+        <w:t xml:space="preserve">. Dữ liệu cũ vẫn đọc được bằng </w:t>
+      </w:r>
+      <w:r>
+        <w:rPr>
+          <w:rFonts w:ascii="Consolas" w:eastAsia="Consolas" w:hAnsi="Consolas" w:cs="Consolas"/>
+        </w:rPr>
+        <w:t xml:space="preserve">k1</w:t>
+      </w:r>
+      <w:r>
+        <w:t xml:space="preserve">, vì ID khóa được lưu cạnh dữ liệu; dữ liệu ghi mới dùng </w:t>
+      </w:r>
+      <w:r>
+        <w:rPr>
+          <w:rFonts w:ascii="Consolas" w:eastAsia="Consolas" w:hAnsi="Consolas" w:cs="Consolas"/>
+        </w:rPr>
+        <w:t xml:space="preserve">k2</w:t>
+      </w:r>
+      <w:r>
+        <w:t xml:space="preserve">. Khi không còn dòng nào dùng </w:t>
+      </w:r>
+      <w:r>
+        <w:rPr>
+          <w:rFonts w:ascii="Consolas" w:eastAsia="Consolas" w:hAnsi="Consolas" w:cs="Consolas"/>
+        </w:rPr>
+        <w:t xml:space="preserve">k1</w:t>
+      </w:r>
+      <w:r>
+        <w:t xml:space="preserve"> thì gỡ </w:t>
+      </w:r>
+      <w:r>
+        <w:rPr>
+          <w:rFonts w:ascii="Consolas" w:eastAsia="Consolas" w:hAnsi="Consolas" w:cs="Consolas"/>
+        </w:rPr>
+        <w:t xml:space="preserve">k1</w:t>
+      </w:r>
+      <w:r>
+        <w:t xml:space="preserve">.</w:t>
+      </w:r>
+    </w:p>
+    <w:p>
+      <w:pPr>
+        <w:pStyle w:val="ListParagraph"/>
+        <w:numPr>
+          <w:ilvl w:val="0"/>
+          <w:numId w:val="1"/>
+        </w:numPr>
+      </w:pPr>
+      <w:r>
+        <w:rPr>
+          <w:b/>
+          <w:bCs/>
+        </w:rPr>
+        <w:t xml:space="preserve">Bẫy:</w:t>
+      </w:r>
+      <w:r>
+        <w:t xml:space="preserve"> mất khóa là mất toàn bộ token (người dùng phải kết nối lại). Backup khóa ở ngoài repo; không bao giờ commit khóa thật.</w:t>
+      </w:r>
+    </w:p>
+    <w:p>
+      <w:pPr>
+        <w:pStyle w:val="Heading3"/>
+      </w:pPr>
+      <w:r>
+        <w:t xml:space="preserve">17.4 Lỗi giải mã</w:t>
+      </w:r>
+    </w:p>
+    <w:p>
+      <w:pPr>
+        <w:pStyle w:val="ListParagraph"/>
+        <w:numPr>
+          <w:ilvl w:val="0"/>
+          <w:numId w:val="1"/>
+        </w:numPr>
+      </w:pPr>
+      <w:r>
+        <w:rPr>
+          <w:rFonts w:ascii="Consolas" w:eastAsia="Consolas" w:hAnsi="Consolas" w:cs="Consolas"/>
+        </w:rPr>
+        <w:t xml:space="preserve">CredentialDecryptionException</w:t>
+      </w:r>
+      <w:r>
+        <w:t xml:space="preserve"> là lỗi phía server (500). Thông báo nêu account, cột và ID khóa để điều tra, </w:t>
+      </w:r>
+      <w:r>
+        <w:rPr>
+          <w:b/>
+          <w:bCs/>
+        </w:rPr>
+        <w:t xml:space="preserve">không bao giờ</w:t>
+      </w:r>
+      <w:r>
+        <w:t xml:space="preserve"> chứa token hay dữ liệu mã hóa.</w:t>
+      </w:r>
+    </w:p>
+    <w:p>
+      <w:pPr>
+        <w:pStyle w:val="Heading3"/>
+      </w:pPr>
+      <w:r>
+        <w:t xml:space="preserve">17.5 Review bảo mật riêng</w:t>
+      </w:r>
+    </w:p>
+    <w:p>
+      <w:pPr>
+        <w:pStyle w:val="ListParagraph"/>
+        <w:numPr>
+          <w:ilvl w:val="0"/>
+          <w:numId w:val="1"/>
+        </w:numPr>
+      </w:pPr>
+      <w:r>
+        <w:t xml:space="preserve">Code mã hóa tự viết nên được một agent reviewer độc lập đọc trước khi commit. Kết quả: không có lỗi nghiêm trọng (CRITICAL/HIGH).</w:t>
+      </w:r>
+    </w:p>
+    <w:p>
+      <w:pPr>
+        <w:pStyle w:val="ListParagraph"/>
+        <w:numPr>
+          <w:ilvl w:val="0"/>
+          <w:numId w:val="1"/>
+        </w:numPr>
+      </w:pPr>
+      <w:r>
+        <w:t xml:space="preserve">Đã sửa theo góp ý: AAD có tiền tố phạm vi và phiên bản; kiểm tra ID khóa; xóa mảng byte của khóa khỏi bộ nhớ sau khi dùng; thêm test ghim độ dài IV và tag, giá trị bị cắt cụt, giá trị bị gắn sai ID khóa.</w:t>
+      </w:r>
+    </w:p>
+    <w:p>
+      <w:pPr>
+        <w:pStyle w:val="ListParagraph"/>
+        <w:numPr>
+          <w:ilvl w:val="0"/>
+          <w:numId w:val="1"/>
+        </w:numPr>
+      </w:pPr>
+      <w:r>
+        <w:t xml:space="preserve">Một điểm chuyển sang BE-13: bảng chỉ có </w:t>
+      </w:r>
+      <w:r>
+        <w:rPr>
+          <w:b/>
+          <w:bCs/>
+        </w:rPr>
+        <w:t xml:space="preserve">một</w:t>
+      </w:r>
+      <w:r>
+        <w:t xml:space="preserve"> ID khóa cho cả dòng. Khi đã xoay khóa, ghi lại access token mà quên refresh token thì refresh token không đọc được nữa. BE-13 phải có quy tắc và test cho trường hợp này.</w:t>
+      </w:r>
+    </w:p>
+    <w:p>
+      <w:pPr>
+        <w:pBdr>
+          <w:bottom w:val="single" w:sz="4" w:space="0" w:color="auto"/>
+        </w:pBdr>
+        <w:ind w:left="0"/>
+      </w:pPr>
+    </w:p>
+    <w:p>
+      <w:pPr>
+        <w:pStyle w:val="Heading2"/>
+      </w:pPr>
+      <w:r>
+        <w:t xml:space="preserve">18. Kỹ thuật test mới trong F02</w:t>
+      </w:r>
+    </w:p>
+    <w:p>
+      <w:pPr>
+        <w:pStyle w:val="ListParagraph"/>
+        <w:numPr>
+          <w:ilvl w:val="0"/>
+          <w:numId w:val="1"/>
+        </w:numPr>
+      </w:pPr>
+      <w:r>
+        <w:rPr>
+          <w:rFonts w:ascii="Consolas" w:eastAsia="Consolas" w:hAnsi="Consolas" w:cs="Consolas"/>
+          <w:b/>
+          <w:bCs/>
+        </w:rPr>
+        <w:t xml:space="preserve">@DataJpaTest</w:t>
+      </w:r>
+      <w:r>
+        <w:rPr>
+          <w:b/>
+          <w:bCs/>
+        </w:rPr>
+        <w:t xml:space="preserve"> + </w:t>
+      </w:r>
+      <w:r>
+        <w:rPr>
+          <w:rFonts w:ascii="Consolas" w:eastAsia="Consolas" w:hAnsi="Consolas" w:cs="Consolas"/>
+          <w:b/>
+          <w:bCs/>
+        </w:rPr>
+        <w:t xml:space="preserve">@AutoConfigureTestDatabase(replace = NONE)</w:t>
+      </w:r>
+      <w:r>
+        <w:rPr>
+          <w:b/>
+          <w:bCs/>
+        </w:rPr>
+        <w:t xml:space="preserve">:</w:t>
+      </w:r>
+      <w:r>
+        <w:t xml:space="preserve"> slice chỉ nạp JPA và Flyway, chạy trên PostgreSQL thật (Testcontainers) để </w:t>
+      </w:r>
+      <w:r>
+        <w:rPr>
+          <w:rFonts w:ascii="Consolas" w:eastAsia="Consolas" w:hAnsi="Consolas" w:cs="Consolas"/>
+        </w:rPr>
+        <w:t xml:space="preserve">CHECK</w:t>
+      </w:r>
+      <w:r>
+        <w:t xml:space="preserve">, </w:t>
+      </w:r>
+      <w:r>
+        <w:rPr>
+          <w:rFonts w:ascii="Consolas" w:eastAsia="Consolas" w:hAnsi="Consolas" w:cs="Consolas"/>
+        </w:rPr>
+        <w:t xml:space="preserve">UNIQUE</w:t>
+      </w:r>
+      <w:r>
+        <w:t xml:space="preserve">, khóa ngoại hoạt động như production. Mỗi test tự rollback.</w:t>
+      </w:r>
+    </w:p>
+    <w:p>
+      <w:pPr>
+        <w:pStyle w:val="ListParagraph"/>
+        <w:numPr>
+          <w:ilvl w:val="0"/>
+          <w:numId w:val="1"/>
+        </w:numPr>
+      </w:pPr>
+      <w:r>
+        <w:rPr>
+          <w:rFonts w:ascii="Consolas" w:eastAsia="Consolas" w:hAnsi="Consolas" w:cs="Consolas"/>
+          <w:b/>
+          <w:bCs/>
+        </w:rPr>
+        <w:t xml:space="preserve">entityManager.clear()</w:t>
+      </w:r>
+      <w:r>
+        <w:rPr>
+          <w:b/>
+          <w:bCs/>
+        </w:rPr>
+        <w:t xml:space="preserve">:</w:t>
+      </w:r>
+      <w:r>
+        <w:t xml:space="preserve"> xóa bộ nhớ đệm của Hibernate để lần đọc sau thật sự đi xuống DB. Không có nó, test chỉ đọc lại object trong bộ nhớ.</w:t>
+      </w:r>
+    </w:p>
+    <w:p>
+      <w:pPr>
+        <w:pStyle w:val="ListParagraph"/>
+        <w:numPr>
+          <w:ilvl w:val="0"/>
+          <w:numId w:val="1"/>
+        </w:numPr>
+      </w:pPr>
+      <w:r>
+        <w:rPr>
+          <w:rFonts w:ascii="Consolas" w:eastAsia="Consolas" w:hAnsi="Consolas" w:cs="Consolas"/>
+          <w:b/>
+          <w:bCs/>
+        </w:rPr>
+        <w:t xml:space="preserve">JdbcTemplate</w:t>
+      </w:r>
+      <w:r>
+        <w:rPr>
+          <w:b/>
+          <w:bCs/>
+        </w:rPr>
+        <w:t xml:space="preserve">:</w:t>
+      </w:r>
+      <w:r>
+        <w:t xml:space="preserve"> chạy SQL thô để nhìn đúng cái nằm trong DB, hoặc để thử ràng buộc mà Java không tạo ra được (ví dụ ghi </w:t>
+      </w:r>
+      <w:r>
+        <w:rPr>
+          <w:rFonts w:ascii="Consolas" w:eastAsia="Consolas" w:hAnsi="Consolas" w:cs="Consolas"/>
+        </w:rPr>
+        <w:t xml:space="preserve">status = 'SYNCING'</w:t>
+      </w:r>
+      <w:r>
+        <w:t xml:space="preserve">).</w:t>
+      </w:r>
+    </w:p>
+    <w:p>
+      <w:pPr>
+        <w:pStyle w:val="ListParagraph"/>
+        <w:numPr>
+          <w:ilvl w:val="0"/>
+          <w:numId w:val="1"/>
+        </w:numPr>
+      </w:pPr>
+      <w:r>
+        <w:rPr>
+          <w:rFonts w:ascii="Consolas" w:eastAsia="Consolas" w:hAnsi="Consolas" w:cs="Consolas"/>
+          <w:b/>
+          <w:bCs/>
+        </w:rPr>
+        <w:t xml:space="preserve">ApplicationContextRunner</w:t>
+      </w:r>
+      <w:r>
+        <w:rPr>
+          <w:b/>
+          <w:bCs/>
+        </w:rPr>
+        <w:t xml:space="preserve"> cho kiểm tra khởi động:</w:t>
+      </w:r>
+      <w:r>
+        <w:t xml:space="preserve"> dựng một context nhỏ với cấu hình sai để chứng minh app </w:t>
+      </w:r>
+      <w:r>
+        <w:rPr>
+          <w:b/>
+          <w:bCs/>
+        </w:rPr>
+        <w:t xml:space="preserve">không</w:t>
+      </w:r>
+      <w:r>
+        <w:t xml:space="preserve"> start và thông báo không lộ secret.</w:t>
+      </w:r>
+    </w:p>
+    <w:p>
+      <w:pPr>
+        <w:pStyle w:val="ListParagraph"/>
+        <w:numPr>
+          <w:ilvl w:val="0"/>
+          <w:numId w:val="1"/>
+        </w:numPr>
+      </w:pPr>
+      <w:r>
+        <w:rPr>
+          <w:b/>
+          <w:bCs/>
+        </w:rPr>
+        <w:t xml:space="preserve">Mockito </w:t>
+      </w:r>
+      <w:r>
+        <w:rPr>
+          <w:rFonts w:ascii="Consolas" w:eastAsia="Consolas" w:hAnsi="Consolas" w:cs="Consolas"/>
+          <w:b/>
+          <w:bCs/>
+        </w:rPr>
+        <w:t xml:space="preserve">mock(...)</w:t>
+      </w:r>
+      <w:r>
+        <w:rPr>
+          <w:b/>
+          <w:bCs/>
+        </w:rPr>
+        <w:t xml:space="preserve"> trong unit test:</w:t>
+      </w:r>
+      <w:r>
+        <w:t xml:space="preserve"> </w:t>
+      </w:r>
+      <w:r>
+        <w:rPr>
+          <w:rFonts w:ascii="Consolas" w:eastAsia="Consolas" w:hAnsi="Consolas" w:cs="Consolas"/>
+        </w:rPr>
+        <w:t xml:space="preserve">OwnerCurrentUserTests</w:t>
+      </w:r>
+      <w:r>
+        <w:t xml:space="preserve"> giả repository để test </w:t>
+      </w:r>
+      <w:r>
+        <w:rPr>
+          <w:rFonts w:ascii="Consolas" w:eastAsia="Consolas" w:hAnsi="Consolas" w:cs="Consolas"/>
+        </w:rPr>
+        <w:t xml:space="preserve">CurrentUser</w:t>
+      </w:r>
+      <w:r>
+        <w:t xml:space="preserve"> mà không cần DB.</w:t>
+      </w:r>
+    </w:p>
+    <w:p>
+      <w:pPr>
+        <w:pStyle w:val="ListParagraph"/>
+        <w:numPr>
+          <w:ilvl w:val="0"/>
+          <w:numId w:val="1"/>
+        </w:numPr>
+      </w:pPr>
+      <w:r>
+        <w:rPr>
+          <w:b/>
+          <w:bCs/>
+        </w:rPr>
+        <w:t xml:space="preserve">Kiểm tra ngược ở mọi task:</w:t>
+      </w:r>
+    </w:p>
+    <w:p>
+      <w:pPr>
+        <w:pStyle w:val="ListParagraph"/>
+        <w:numPr>
+          <w:ilvl w:val="1"/>
+          <w:numId w:val="1"/>
+        </w:numPr>
+      </w:pPr>
+      <w:r>
+        <w:t xml:space="preserve">BE-09: bỏ bước tìm theo email → 2 test idempotent đỏ.</w:t>
+      </w:r>
+    </w:p>
+    <w:p>
+      <w:pPr>
+        <w:pStyle w:val="ListParagraph"/>
+        <w:numPr>
+          <w:ilvl w:val="1"/>
+          <w:numId w:val="1"/>
+        </w:numPr>
+      </w:pPr>
+      <w:r>
+        <w:t xml:space="preserve">BE-10: cho </w:t>
+      </w:r>
+      <w:r>
+        <w:rPr>
+          <w:rFonts w:ascii="Consolas" w:eastAsia="Consolas" w:hAnsi="Consolas" w:cs="Consolas"/>
+        </w:rPr>
+        <w:t xml:space="preserve">markHealthy</w:t>
+      </w:r>
+      <w:r>
+        <w:t xml:space="preserve"> gỡ </w:t>
+      </w:r>
+      <w:r>
+        <w:rPr>
+          <w:rFonts w:ascii="Consolas" w:eastAsia="Consolas" w:hAnsi="Consolas" w:cs="Consolas"/>
+        </w:rPr>
+        <w:t xml:space="preserve">AUTH_EXPIRED</w:t>
+      </w:r>
+      <w:r>
+        <w:t xml:space="preserve"> → đúng ô đó đỏ.</w:t>
+      </w:r>
+    </w:p>
+    <w:p>
+      <w:pPr>
+        <w:pStyle w:val="ListParagraph"/>
+        <w:numPr>
+          <w:ilvl w:val="1"/>
+          <w:numId w:val="1"/>
+        </w:numPr>
+      </w:pPr>
+      <w:r>
+        <w:t xml:space="preserve">BE-12: IV cố định → 1 test đỏ; bỏ AAD → 3 test đỏ; tag 96 bit → 2 test đỏ.</w:t>
+      </w:r>
+    </w:p>
+    <w:p>
+      <w:pPr>
+        <w:pBdr>
+          <w:bottom w:val="single" w:sz="4" w:space="0" w:color="auto"/>
+        </w:pBdr>
+        <w:ind w:left="0"/>
+      </w:pPr>
+    </w:p>
+    <w:p>
+      <w:pPr>
+        <w:pStyle w:val="Heading2"/>
+      </w:pPr>
+      <w:r>
+        <w:t xml:space="preserve">19. Tự kiểm tra F02 (phần đã làm)</w:t>
+      </w:r>
+    </w:p>
+    <w:p>
+      <w:pPr>
+        <w:pStyle w:val="ListParagraph"/>
+        <w:numPr>
+          <w:ilvl w:val="0"/>
+          <w:numId w:val="101"/>
+        </w:numPr>
+      </w:pPr>
+      <w:r>
+        <w:t xml:space="preserve">Vì sao người dùng Sino và tài khoản Gmail nằm ở hai module khác nhau?</w:t>
+      </w:r>
+    </w:p>
+    <w:p>
+      <w:pPr>
+        <w:pStyle w:val="ListParagraph"/>
+        <w:numPr>
+          <w:ilvl w:val="0"/>
+          <w:numId w:val="101"/>
+        </w:numPr>
+      </w:pPr>
+      <w:r>
+        <w:rPr>
+          <w:rFonts w:ascii="Consolas" w:eastAsia="Consolas" w:hAnsi="Consolas" w:cs="Consolas"/>
+        </w:rPr>
+        <w:t xml:space="preserve">ApplicationRunner</w:t>
+      </w:r>
+      <w:r>
+        <w:t xml:space="preserve"> chạy trước hay sau Flyway? Vì sao điều đó quan trọng với việc tạo owner?</w:t>
+      </w:r>
+    </w:p>
+    <w:p>
+      <w:pPr>
+        <w:pStyle w:val="ListParagraph"/>
+        <w:numPr>
+          <w:ilvl w:val="0"/>
+          <w:numId w:val="101"/>
+        </w:numPr>
+      </w:pPr>
+      <w:r>
+        <w:t xml:space="preserve">Đổi </w:t>
+      </w:r>
+      <w:r>
+        <w:rPr>
+          <w:rFonts w:ascii="Consolas" w:eastAsia="Consolas" w:hAnsi="Consolas" w:cs="Consolas"/>
+        </w:rPr>
+        <w:t xml:space="preserve">SINO_OWNER_EMAIL</w:t>
+      </w:r>
+      <w:r>
+        <w:t xml:space="preserve"> thì chuyện gì xảy ra với các account đã kết nối?</w:t>
+      </w:r>
+    </w:p>
+    <w:p>
+      <w:pPr>
+        <w:pStyle w:val="ListParagraph"/>
+        <w:numPr>
+          <w:ilvl w:val="0"/>
+          <w:numId w:val="101"/>
+        </w:numPr>
+      </w:pPr>
+      <w:r>
+        <w:t xml:space="preserve">Vì sao </w:t>
+      </w:r>
+      <w:r>
+        <w:rPr>
+          <w:rFonts w:ascii="Consolas" w:eastAsia="Consolas" w:hAnsi="Consolas" w:cs="Consolas"/>
+        </w:rPr>
+        <w:t xml:space="preserve">ConnectedAccount</w:t>
+      </w:r>
+      <w:r>
+        <w:t xml:space="preserve"> không có </w:t>
+      </w:r>
+      <w:r>
+        <w:rPr>
+          <w:rFonts w:ascii="Consolas" w:eastAsia="Consolas" w:hAnsi="Consolas" w:cs="Consolas"/>
+        </w:rPr>
+        <w:t xml:space="preserve">setStatus</w:t>
+      </w:r>
+      <w:r>
+        <w:t xml:space="preserve">?</w:t>
+      </w:r>
+    </w:p>
+    <w:p>
+      <w:pPr>
+        <w:pStyle w:val="ListParagraph"/>
+        <w:numPr>
+          <w:ilvl w:val="0"/>
+          <w:numId w:val="101"/>
+        </w:numPr>
+      </w:pPr>
+      <w:r>
+        <w:t xml:space="preserve">Vì sao </w:t>
+      </w:r>
+      <w:r>
+        <w:rPr>
+          <w:rFonts w:ascii="Consolas" w:eastAsia="Consolas" w:hAnsi="Consolas" w:cs="Consolas"/>
+        </w:rPr>
+        <w:t xml:space="preserve">AUTH_EXPIRED</w:t>
+      </w:r>
+      <w:r>
+        <w:t xml:space="preserve"> không tự về </w:t>
+      </w:r>
+      <w:r>
+        <w:rPr>
+          <w:rFonts w:ascii="Consolas" w:eastAsia="Consolas" w:hAnsi="Consolas" w:cs="Consolas"/>
+        </w:rPr>
+        <w:t xml:space="preserve">CONNECTED</w:t>
+      </w:r>
+      <w:r>
+        <w:t xml:space="preserve"> khi một lần sync thành công?</w:t>
+      </w:r>
+    </w:p>
+    <w:p>
+      <w:pPr>
+        <w:pStyle w:val="ListParagraph"/>
+        <w:numPr>
+          <w:ilvl w:val="0"/>
+          <w:numId w:val="101"/>
+        </w:numPr>
+      </w:pPr>
+      <w:r>
+        <w:rPr>
+          <w:rFonts w:ascii="Consolas" w:eastAsia="Consolas" w:hAnsi="Consolas" w:cs="Consolas"/>
+        </w:rPr>
+        <w:t xml:space="preserve">@Version</w:t>
+      </w:r>
+      <w:r>
+        <w:t xml:space="preserve"> chặn được tình huống gì?</w:t>
+      </w:r>
+    </w:p>
+    <w:p>
+      <w:pPr>
+        <w:pStyle w:val="ListParagraph"/>
+        <w:numPr>
+          <w:ilvl w:val="0"/>
+          <w:numId w:val="101"/>
+        </w:numPr>
+      </w:pPr>
+      <w:r>
+        <w:t xml:space="preserve">Vì sao vẫn cần </w:t>
+      </w:r>
+      <w:r>
+        <w:rPr>
+          <w:rFonts w:ascii="Consolas" w:eastAsia="Consolas" w:hAnsi="Consolas" w:cs="Consolas"/>
+        </w:rPr>
+        <w:t xml:space="preserve">UNIQUE</w:t>
+      </w:r>
+      <w:r>
+        <w:t xml:space="preserve"> ở DB dù code đã tìm trước rồi mới tạo?</w:t>
+      </w:r>
+    </w:p>
+    <w:p>
+      <w:pPr>
+        <w:pStyle w:val="ListParagraph"/>
+        <w:numPr>
+          <w:ilvl w:val="0"/>
+          <w:numId w:val="101"/>
+        </w:numPr>
+      </w:pPr>
+      <w:r>
+        <w:t xml:space="preserve">IV và AAD trong AES-GCM mỗi cái chống lại điều gì?</w:t>
+      </w:r>
+    </w:p>
+    <w:p>
+      <w:pPr>
+        <w:pStyle w:val="ListParagraph"/>
+        <w:numPr>
+          <w:ilvl w:val="0"/>
+          <w:numId w:val="101"/>
+        </w:numPr>
+      </w:pPr>
+      <w:r>
+        <w:t xml:space="preserve">Đổi khóa mã hóa khi đã có dữ liệu thì làm theo những bước nào?</w:t>
+      </w:r>
+    </w:p>
+    <w:p>
+      <w:pPr>
+        <w:pStyle w:val="ListParagraph"/>
+        <w:numPr>
+          <w:ilvl w:val="0"/>
+          <w:numId w:val="101"/>
+        </w:numPr>
+      </w:pPr>
+      <w:r>
+        <w:t xml:space="preserve">Vì sao không kiểm tra khóa bằng </w:t>
+      </w:r>
+      <w:r>
+        <w:rPr>
+          <w:rFonts w:ascii="Consolas" w:eastAsia="Consolas" w:hAnsi="Consolas" w:cs="Consolas"/>
+        </w:rPr>
+        <w:t xml:space="preserve">@Size</w:t>
+      </w:r>
+      <w:r>
+        <w:t xml:space="preserve"> của Bean Validation?</w:t>
       </w:r>
     </w:p>
     <w:p>
@@ -6881,37 +10152,7 @@
           <w:i/>
           <w:iCs/>
         </w:rPr>
-        <w:t xml:space="preserve">(Chưa làm. Theo design F02, dự kiến có: JPA entity và repository; mã hóa credential (design đề xuất AES-256-GCM, chưa chốt); optimistic locking bằng cột </w:t>
-      </w:r>
-      <w:r>
-        <w:rPr>
-          <w:rFonts w:ascii="Consolas" w:eastAsia="Consolas" w:hAnsi="Consolas" w:cs="Consolas"/>
-          <w:i/>
-          <w:iCs/>
-        </w:rPr>
-        <w:t xml:space="preserve">version</w:t>
-      </w:r>
-      <w:r>
-        <w:rPr>
-          <w:i/>
-          <w:iCs/>
-        </w:rPr>
-        <w:t xml:space="preserve">; event của module </w:t>
-      </w:r>
-      <w:r>
-        <w:rPr>
-          <w:rFonts w:ascii="Consolas" w:eastAsia="Consolas" w:hAnsi="Consolas" w:cs="Consolas"/>
-          <w:i/>
-          <w:iCs/>
-        </w:rPr>
-        <w:t xml:space="preserve">account</w:t>
-      </w:r>
-      <w:r>
-        <w:rPr>
-          <w:i/>
-          <w:iCs/>
-        </w:rPr>
-        <w:t xml:space="preserve"> qua Spring Modulith.)</w:t>
+        <w:t xml:space="preserve">(Phần BE-13…BE-18 — lưu credential, use case đăng ký, REST API, xóa account — sẽ được bổ sung khi làm.)</w:t>
       </w:r>
     </w:p>
     <w:sectPr>
@@ -7040,6 +10281,24 @@
     <w:abstractNumId w:val="1"/>
   </w:num>
   <w:num w:numId="100">
+    <w:abstractNumId w:val="1"/>
+    <w:lvlOverride w:ilvl="0">
+      <w:startOverride w:val="1"/>
+    </w:lvlOverride>
+    <w:lvlOverride w:ilvl="1">
+      <w:startOverride w:val="1"/>
+    </w:lvlOverride>
+    <w:lvlOverride w:ilvl="2">
+      <w:startOverride w:val="1"/>
+    </w:lvlOverride>
+    <w:lvlOverride w:ilvl="3">
+      <w:startOverride w:val="1"/>
+    </w:lvlOverride>
+    <w:lvlOverride w:ilvl="4">
+      <w:startOverride w:val="1"/>
+    </w:lvlOverride>
+  </w:num>
+  <w:num w:numId="101">
     <w:abstractNumId w:val="1"/>
     <w:lvlOverride w:ilvl="0">
       <w:startOverride w:val="1"/>

</xml_diff>

<commit_message>
docs(knowledge): add BE-13 (credential store) to the Phase 0 guide
Section 17.6 explains the account_credential table, the always-rewrite-the-whole-credential rule and the jsonb scopes; the test and self-check sections gain the BE-13 techniques. The Word copy is regenerated and was inspected.

Co-Authored-By: Claude Opus 5.5 (1M context) <noreply@anthropic.com>
</commit_message>
<xml_diff>
--- a/docs/knowledge/phase-0-backend-foundation.docx
+++ b/docs/knowledge/phase-0-backend-foundation.docx
@@ -97,7 +97,7 @@
         <w:t xml:space="preserve">Phạm vi:</w:t>
       </w:r>
       <w:r>
-        <w:t xml:space="preserve"> F01 Project Foundation và F03 Provider Contract (mục 0–12); F02 Connected Accounts (mục 13–19, đang làm: xong BE-09…BE-12).</w:t>
+        <w:t xml:space="preserve"> F01 Project Foundation và F03 Provider Contract (mục 0–12); F02 Connected Accounts (mục 13–19, đang làm: xong BE-09…BE-13).</w:t>
         <w:br/>
       </w:r>
       <w:r>
@@ -7148,7 +7148,7 @@
           </w:tcPr>
           <w:p>
             <w:r>
-              <w:t xml:space="preserve">BE-13…BE-18</w:t>
+              <w:t xml:space="preserve">BE-13</w:t>
             </w:r>
           </w:p>
         </w:tc>
@@ -7158,7 +7158,57 @@
           </w:tcPr>
           <w:p>
             <w:r>
-              <w:t xml:space="preserve">Lưu credential, use case đăng ký, REST API, xóa, nghiệm thu</w:t>
+              <w:t xml:space="preserve">Bảng </w:t>
+            </w:r>
+            <w:r>
+              <w:rPr>
+                <w:rFonts w:ascii="Consolas" w:eastAsia="Consolas" w:hAnsi="Consolas" w:cs="Consolas"/>
+              </w:rPr>
+              <w:t xml:space="preserve">account_credential</w:t>
+            </w:r>
+            <w:r>
+              <w:t xml:space="preserve">, </w:t>
+            </w:r>
+            <w:r>
+              <w:rPr>
+                <w:rFonts w:ascii="Consolas" w:eastAsia="Consolas" w:hAnsi="Consolas" w:cs="Consolas"/>
+              </w:rPr>
+              <w:t xml:space="preserve">CredentialStore</w:t>
+            </w:r>
+            <w:r>
+              <w:t xml:space="preserve"> (mã hóa khi ghi, giải mã khi đọc)</w:t>
+            </w:r>
+          </w:p>
+        </w:tc>
+        <w:tc>
+          <w:tcPr>
+            <w:tcW w:w="3120" w:type="dxa"/>
+          </w:tcPr>
+          <w:p>
+            <w:r>
+              <w:t xml:space="preserve">xong</w:t>
+            </w:r>
+          </w:p>
+        </w:tc>
+      </w:tr>
+      <w:tr>
+        <w:tc>
+          <w:tcPr>
+            <w:tcW w:w="3120" w:type="dxa"/>
+          </w:tcPr>
+          <w:p>
+            <w:r>
+              <w:t xml:space="preserve">BE-14…BE-18</w:t>
+            </w:r>
+          </w:p>
+        </w:tc>
+        <w:tc>
+          <w:tcPr>
+            <w:tcW w:w="3120" w:type="dxa"/>
+          </w:tcPr>
+          <w:p>
+            <w:r>
+              <w:t xml:space="preserve">Use case đăng ký, REST API, xóa, nghiệm thu</w:t>
             </w:r>
           </w:p>
         </w:tc>
@@ -7224,7 +7274,17 @@
         <w:t xml:space="preserve">SYNCING</w:t>
       </w:r>
       <w:r>
-        <w:t xml:space="preserve">). Lần đầu áp dụng D-08 (UUIDv7) và D-09 (enum lưu chữ + </w:t>
+        <w:t xml:space="preserve">), </w:t>
+      </w:r>
+      <w:r>
+        <w:rPr>
+          <w:b/>
+          <w:bCs/>
+        </w:rPr>
+        <w:t xml:space="preserve">D-14</w:t>
+      </w:r>
+      <w:r>
+        <w:t xml:space="preserve"> (thêm 4 cột cho bảng credential), quy tắc "luôn ghi cả credential". Lần đầu áp dụng D-08 (UUIDv7) và D-09 (enum lưu chữ + </w:t>
       </w:r>
       <w:r>
         <w:rPr>
@@ -9634,7 +9694,549 @@
         <w:t xml:space="preserve">một</w:t>
       </w:r>
       <w:r>
-        <w:t xml:space="preserve"> ID khóa cho cả dòng. Khi đã xoay khóa, ghi lại access token mà quên refresh token thì refresh token không đọc được nữa. BE-13 phải có quy tắc và test cho trường hợp này.</w:t>
+        <w:t xml:space="preserve"> ID khóa cho cả dòng. Khi đã xoay khóa, ghi lại access token mà quên refresh token thì refresh token không đọc được nữa. BE-13 giải quyết bằng quy tắc ở mục 17.6.</w:t>
+      </w:r>
+    </w:p>
+    <w:p>
+      <w:pPr>
+        <w:pStyle w:val="Heading3"/>
+      </w:pPr>
+      <w:r>
+        <w:t xml:space="preserve">17.6 Lưu credential: </w:t>
+      </w:r>
+      <w:r>
+        <w:rPr>
+          <w:rFonts w:ascii="Consolas" w:eastAsia="Consolas" w:hAnsi="Consolas" w:cs="Consolas"/>
+        </w:rPr>
+        <w:t xml:space="preserve">CredentialStore</w:t>
+      </w:r>
+      <w:r>
+        <w:t xml:space="preserve"> (BE-13, D-14)</w:t>
+      </w:r>
+    </w:p>
+    <w:p>
+      <w:pPr>
+        <w:pStyle w:val="ListParagraph"/>
+        <w:numPr>
+          <w:ilvl w:val="0"/>
+          <w:numId w:val="1"/>
+        </w:numPr>
+      </w:pPr>
+      <w:r>
+        <w:rPr>
+          <w:b/>
+          <w:bCs/>
+        </w:rPr>
+        <w:t xml:space="preserve">Ở đâu:</w:t>
+      </w:r>
+      <w:r>
+        <w:t xml:space="preserve"> </w:t>
+      </w:r>
+      <w:r>
+        <w:rPr>
+          <w:rFonts w:ascii="Consolas" w:eastAsia="Consolas" w:hAnsi="Consolas" w:cs="Consolas"/>
+        </w:rPr>
+        <w:t xml:space="preserve">account/infrastructure/CredentialStore.java</w:t>
+      </w:r>
+      <w:r>
+        <w:t xml:space="preserve">, entity </w:t>
+      </w:r>
+      <w:r>
+        <w:rPr>
+          <w:rFonts w:ascii="Consolas" w:eastAsia="Consolas" w:hAnsi="Consolas" w:cs="Consolas"/>
+        </w:rPr>
+        <w:t xml:space="preserve">AccountCredential</w:t>
+      </w:r>
+      <w:r>
+        <w:t xml:space="preserve">, migration </w:t>
+      </w:r>
+      <w:r>
+        <w:rPr>
+          <w:rFonts w:ascii="Consolas" w:eastAsia="Consolas" w:hAnsi="Consolas" w:cs="Consolas"/>
+        </w:rPr>
+        <w:t xml:space="preserve">V4__account_create_account_credential.sql</w:t>
+      </w:r>
+      <w:r>
+        <w:t xml:space="preserve">.</w:t>
+      </w:r>
+    </w:p>
+    <w:p>
+      <w:pPr>
+        <w:pStyle w:val="ListParagraph"/>
+        <w:numPr>
+          <w:ilvl w:val="0"/>
+          <w:numId w:val="1"/>
+        </w:numPr>
+      </w:pPr>
+      <w:r>
+        <w:rPr>
+          <w:b/>
+          <w:bCs/>
+        </w:rPr>
+        <w:t xml:space="preserve">Là gì:</w:t>
+      </w:r>
+      <w:r>
+        <w:t xml:space="preserve"> "cửa duy nhất" để ghi và đọc credential:</w:t>
+      </w:r>
+    </w:p>
+    <w:p>
+      <w:pPr>
+        <w:pStyle w:val="ListParagraph"/>
+        <w:numPr>
+          <w:ilvl w:val="1"/>
+          <w:numId w:val="1"/>
+        </w:numPr>
+      </w:pPr>
+      <w:r>
+        <w:rPr>
+          <w:rFonts w:ascii="Consolas" w:eastAsia="Consolas" w:hAnsi="Consolas" w:cs="Consolas"/>
+        </w:rPr>
+        <w:t xml:space="preserve">save(accountId, credential, refreshToken)</w:t>
+      </w:r>
+      <w:r>
+        <w:t xml:space="preserve">: mã hóa rồi ghi.</w:t>
+      </w:r>
+    </w:p>
+    <w:p>
+      <w:pPr>
+        <w:pStyle w:val="ListParagraph"/>
+        <w:numPr>
+          <w:ilvl w:val="1"/>
+          <w:numId w:val="1"/>
+        </w:numPr>
+      </w:pPr>
+      <w:r>
+        <w:rPr>
+          <w:rFonts w:ascii="Consolas" w:eastAsia="Consolas" w:hAnsi="Consolas" w:cs="Consolas"/>
+        </w:rPr>
+        <w:t xml:space="preserve">load(accountId)</w:t>
+      </w:r>
+      <w:r>
+        <w:t xml:space="preserve">: đọc rồi giải mã, trả </w:t>
+      </w:r>
+      <w:r>
+        <w:rPr>
+          <w:rFonts w:ascii="Consolas" w:eastAsia="Consolas" w:hAnsi="Consolas" w:cs="Consolas"/>
+        </w:rPr>
+        <w:t xml:space="preserve">ProviderCredentials</w:t>
+      </w:r>
+      <w:r>
+        <w:t xml:space="preserve"> của F03, chỉ nằm trong bộ nhớ.</w:t>
+      </w:r>
+    </w:p>
+    <w:p>
+      <w:pPr>
+        <w:pStyle w:val="ListParagraph"/>
+        <w:numPr>
+          <w:ilvl w:val="1"/>
+          <w:numId w:val="1"/>
+        </w:numPr>
+      </w:pPr>
+      <w:r>
+        <w:rPr>
+          <w:rFonts w:ascii="Consolas" w:eastAsia="Consolas" w:hAnsi="Consolas" w:cs="Consolas"/>
+        </w:rPr>
+        <w:t xml:space="preserve">delete(accountId)</w:t>
+      </w:r>
+      <w:r>
+        <w:t xml:space="preserve">: xóa.</w:t>
+      </w:r>
+    </w:p>
+    <w:p>
+      <w:pPr>
+        <w:pStyle w:val="ListParagraph"/>
+        <w:numPr>
+          <w:ilvl w:val="0"/>
+          <w:numId w:val="1"/>
+        </w:numPr>
+      </w:pPr>
+      <w:r>
+        <w:rPr>
+          <w:b/>
+          <w:bCs/>
+        </w:rPr>
+        <w:t xml:space="preserve">Bảng </w:t>
+      </w:r>
+      <w:r>
+        <w:rPr>
+          <w:rFonts w:ascii="Consolas" w:eastAsia="Consolas" w:hAnsi="Consolas" w:cs="Consolas"/>
+          <w:b/>
+          <w:bCs/>
+        </w:rPr>
+        <w:t xml:space="preserve">account_credential</w:t>
+      </w:r>
+      <w:r>
+        <w:rPr>
+          <w:b/>
+          <w:bCs/>
+        </w:rPr>
+        <w:t xml:space="preserve">:</w:t>
+      </w:r>
+      <w:r>
+        <w:t xml:space="preserve"> một dòng cho mỗi account (</w:t>
+      </w:r>
+      <w:r>
+        <w:rPr>
+          <w:rFonts w:ascii="Consolas" w:eastAsia="Consolas" w:hAnsi="Consolas" w:cs="Consolas"/>
+        </w:rPr>
+        <w:t xml:space="preserve">UNIQUE (account_id)</w:t>
+      </w:r>
+      <w:r>
+        <w:t xml:space="preserve">). Khóa ngoại tới </w:t>
+      </w:r>
+      <w:r>
+        <w:rPr>
+          <w:rFonts w:ascii="Consolas" w:eastAsia="Consolas" w:hAnsi="Consolas" w:cs="Consolas"/>
+        </w:rPr>
+        <w:t xml:space="preserve">connected_account</w:t>
+      </w:r>
+      <w:r>
+        <w:t xml:space="preserve"> có </w:t>
+      </w:r>
+      <w:r>
+        <w:rPr>
+          <w:rFonts w:ascii="Consolas" w:eastAsia="Consolas" w:hAnsi="Consolas" w:cs="Consolas"/>
+        </w:rPr>
+        <w:t xml:space="preserve">ON DELETE CASCADE</w:t>
+      </w:r>
+      <w:r>
+        <w:t xml:space="preserve">: xóa account thì credential tự biến mất trong cùng câu lệnh. Bốn cột thêm so với tài liệu 02B (D-14):</w:t>
+      </w:r>
+    </w:p>
+    <w:p>
+      <w:pPr>
+        <w:pStyle w:val="ListParagraph"/>
+        <w:numPr>
+          <w:ilvl w:val="1"/>
+          <w:numId w:val="1"/>
+        </w:numPr>
+      </w:pPr>
+      <w:r>
+        <w:rPr>
+          <w:rFonts w:ascii="Consolas" w:eastAsia="Consolas" w:hAnsi="Consolas" w:cs="Consolas"/>
+        </w:rPr>
+        <w:t xml:space="preserve">credential_type</w:t>
+      </w:r>
+      <w:r>
+        <w:t xml:space="preserve">: </w:t>
+      </w:r>
+      <w:r>
+        <w:rPr>
+          <w:rFonts w:ascii="Consolas" w:eastAsia="Consolas" w:hAnsi="Consolas" w:cs="Consolas"/>
+        </w:rPr>
+        <w:t xml:space="preserve">OAUTH2</w:t>
+      </w:r>
+      <w:r>
+        <w:t xml:space="preserve"> (Gmail) hoặc </w:t>
+      </w:r>
+      <w:r>
+        <w:rPr>
+          <w:rFonts w:ascii="Consolas" w:eastAsia="Consolas" w:hAnsi="Consolas" w:cs="Consolas"/>
+        </w:rPr>
+        <w:t xml:space="preserve">TOKEN</w:t>
+      </w:r>
+      <w:r>
+        <w:t xml:space="preserve"> (ví dụ bot Telegram).</w:t>
+      </w:r>
+    </w:p>
+    <w:p>
+      <w:pPr>
+        <w:pStyle w:val="ListParagraph"/>
+        <w:numPr>
+          <w:ilvl w:val="1"/>
+          <w:numId w:val="1"/>
+        </w:numPr>
+      </w:pPr>
+      <w:r>
+        <w:rPr>
+          <w:rFonts w:ascii="Consolas" w:eastAsia="Consolas" w:hAnsi="Consolas" w:cs="Consolas"/>
+        </w:rPr>
+        <w:t xml:space="preserve">encryption_key_id</w:t>
+      </w:r>
+      <w:r>
+        <w:t xml:space="preserve">: khóa đã mã hóa dòng này.</w:t>
+      </w:r>
+    </w:p>
+    <w:p>
+      <w:pPr>
+        <w:pStyle w:val="ListParagraph"/>
+        <w:numPr>
+          <w:ilvl w:val="1"/>
+          <w:numId w:val="1"/>
+        </w:numPr>
+      </w:pPr>
+      <w:r>
+        <w:rPr>
+          <w:rFonts w:ascii="Consolas" w:eastAsia="Consolas" w:hAnsi="Consolas" w:cs="Consolas"/>
+        </w:rPr>
+        <w:t xml:space="preserve">created_at</w:t>
+      </w:r>
+      <w:r>
+        <w:t xml:space="preserve">, </w:t>
+      </w:r>
+      <w:r>
+        <w:rPr>
+          <w:rFonts w:ascii="Consolas" w:eastAsia="Consolas" w:hAnsi="Consolas" w:cs="Consolas"/>
+        </w:rPr>
+        <w:t xml:space="preserve">version</w:t>
+      </w:r>
+      <w:r>
+        <w:t xml:space="preserve">: theo quy ước F01.</w:t>
+      </w:r>
+    </w:p>
+    <w:p>
+      <w:pPr>
+        <w:pStyle w:val="ListParagraph"/>
+        <w:numPr>
+          <w:ilvl w:val="0"/>
+          <w:numId w:val="1"/>
+        </w:numPr>
+      </w:pPr>
+      <w:r>
+        <w:rPr>
+          <w:b/>
+          <w:bCs/>
+        </w:rPr>
+        <w:t xml:space="preserve">Quy tắc "luôn ghi cả credential":</w:t>
+      </w:r>
+      <w:r>
+        <w:t xml:space="preserve"> store </w:t>
+      </w:r>
+      <w:r>
+        <w:rPr>
+          <w:b/>
+          <w:bCs/>
+        </w:rPr>
+        <w:t xml:space="preserve">không có</w:t>
+      </w:r>
+      <w:r>
+        <w:t xml:space="preserve"> hàm sửa riêng một token. Mỗi lần </w:t>
+      </w:r>
+      <w:r>
+        <w:rPr>
+          <w:rFonts w:ascii="Consolas" w:eastAsia="Consolas" w:hAnsi="Consolas" w:cs="Consolas"/>
+        </w:rPr>
+        <w:t xml:space="preserve">save</w:t>
+      </w:r>
+      <w:r>
+        <w:t xml:space="preserve">, mọi trường bí mật được mã hóa lại bằng khóa active, và </w:t>
+      </w:r>
+      <w:r>
+        <w:rPr>
+          <w:rFonts w:ascii="Consolas" w:eastAsia="Consolas" w:hAnsi="Consolas" w:cs="Consolas"/>
+        </w:rPr>
+        <w:t xml:space="preserve">encryption_key_id</w:t>
+      </w:r>
+      <w:r>
+        <w:t xml:space="preserve"> của dòng là khóa đó. Vì vậy sau khi xoay khóa, không thể có chuyện access token dùng </w:t>
+      </w:r>
+      <w:r>
+        <w:rPr>
+          <w:rFonts w:ascii="Consolas" w:eastAsia="Consolas" w:hAnsi="Consolas" w:cs="Consolas"/>
+        </w:rPr>
+        <w:t xml:space="preserve">k2</w:t>
+      </w:r>
+      <w:r>
+        <w:t xml:space="preserve"> mà refresh token còn </w:t>
+      </w:r>
+      <w:r>
+        <w:rPr>
+          <w:rFonts w:ascii="Consolas" w:eastAsia="Consolas" w:hAnsi="Consolas" w:cs="Consolas"/>
+        </w:rPr>
+        <w:t xml:space="preserve">k1</w:t>
+      </w:r>
+      <w:r>
+        <w:t xml:space="preserve">. Entity còn tự kiểm thêm: hai giá trị mã hóa khác khóa sẽ bị từ chối.</w:t>
+      </w:r>
+    </w:p>
+    <w:p>
+      <w:pPr>
+        <w:pStyle w:val="ListParagraph"/>
+        <w:numPr>
+          <w:ilvl w:val="0"/>
+          <w:numId w:val="1"/>
+        </w:numPr>
+      </w:pPr>
+      <w:r>
+        <w:rPr>
+          <w:b/>
+          <w:bCs/>
+        </w:rPr>
+        <w:t xml:space="preserve">Switch trên sealed interface:</w:t>
+      </w:r>
+      <w:r>
+        <w:t xml:space="preserve"> </w:t>
+      </w:r>
+      <w:r>
+        <w:rPr>
+          <w:rFonts w:ascii="Consolas" w:eastAsia="Consolas" w:hAnsi="Consolas" w:cs="Consolas"/>
+        </w:rPr>
+        <w:t xml:space="preserve">OAuth2Credentials</w:t>
+      </w:r>
+      <w:r>
+        <w:t xml:space="preserve"> ứng với </w:t>
+      </w:r>
+      <w:r>
+        <w:rPr>
+          <w:rFonts w:ascii="Consolas" w:eastAsia="Consolas" w:hAnsi="Consolas" w:cs="Consolas"/>
+        </w:rPr>
+        <w:t xml:space="preserve">OAUTH2</w:t>
+      </w:r>
+      <w:r>
+        <w:t xml:space="preserve">, </w:t>
+      </w:r>
+      <w:r>
+        <w:rPr>
+          <w:rFonts w:ascii="Consolas" w:eastAsia="Consolas" w:hAnsi="Consolas" w:cs="Consolas"/>
+        </w:rPr>
+        <w:t xml:space="preserve">TokenCredentials</w:t>
+      </w:r>
+      <w:r>
+        <w:t xml:space="preserve"> ứng với </w:t>
+      </w:r>
+      <w:r>
+        <w:rPr>
+          <w:rFonts w:ascii="Consolas" w:eastAsia="Consolas" w:hAnsi="Consolas" w:cs="Consolas"/>
+        </w:rPr>
+        <w:t xml:space="preserve">TOKEN</w:t>
+      </w:r>
+      <w:r>
+        <w:t xml:space="preserve">. Thêm một loại credential mới mà quên xử lý thì code không biên dịch được.</w:t>
+      </w:r>
+    </w:p>
+    <w:p>
+      <w:pPr>
+        <w:pStyle w:val="ListParagraph"/>
+        <w:numPr>
+          <w:ilvl w:val="0"/>
+          <w:numId w:val="1"/>
+        </w:numPr>
+      </w:pPr>
+      <w:r>
+        <w:rPr>
+          <w:b/>
+          <w:bCs/>
+        </w:rPr>
+        <w:t xml:space="preserve">Cột </w:t>
+      </w:r>
+      <w:r>
+        <w:rPr>
+          <w:rFonts w:ascii="Consolas" w:eastAsia="Consolas" w:hAnsi="Consolas" w:cs="Consolas"/>
+          <w:b/>
+          <w:bCs/>
+        </w:rPr>
+        <w:t xml:space="preserve">jsonb</w:t>
+      </w:r>
+      <w:r>
+        <w:rPr>
+          <w:b/>
+          <w:bCs/>
+        </w:rPr>
+        <w:t xml:space="preserve">:</w:t>
+      </w:r>
+      <w:r>
+        <w:t xml:space="preserve"> </w:t>
+      </w:r>
+      <w:r>
+        <w:rPr>
+          <w:rFonts w:ascii="Consolas" w:eastAsia="Consolas" w:hAnsi="Consolas" w:cs="Consolas"/>
+        </w:rPr>
+        <w:t xml:space="preserve">scopes</w:t>
+      </w:r>
+      <w:r>
+        <w:t xml:space="preserve"> (danh sách quyền Gmail đã cấp) lưu dạng mảng JSON nhờ </w:t>
+      </w:r>
+      <w:r>
+        <w:rPr>
+          <w:rFonts w:ascii="Consolas" w:eastAsia="Consolas" w:hAnsi="Consolas" w:cs="Consolas"/>
+        </w:rPr>
+        <w:t xml:space="preserve">@JdbcTypeCode(SqlTypes.JSON)</w:t>
+      </w:r>
+      <w:r>
+        <w:t xml:space="preserve">; Hibernate 7 tự dùng Jackson để chuyển </w:t>
+      </w:r>
+      <w:r>
+        <w:rPr>
+          <w:rFonts w:ascii="Consolas" w:eastAsia="Consolas" w:hAnsi="Consolas" w:cs="Consolas"/>
+        </w:rPr>
+        <w:t xml:space="preserve">List&lt;String&gt;</w:t>
+      </w:r>
+      <w:r>
+        <w:t xml:space="preserve"> sang JSON.</w:t>
+      </w:r>
+    </w:p>
+    <w:p>
+      <w:pPr>
+        <w:pStyle w:val="ListParagraph"/>
+        <w:numPr>
+          <w:ilvl w:val="0"/>
+          <w:numId w:val="1"/>
+        </w:numPr>
+      </w:pPr>
+      <w:r>
+        <w:rPr>
+          <w:b/>
+          <w:bCs/>
+        </w:rPr>
+        <w:t xml:space="preserve">Phạm vi truy cập:</w:t>
+      </w:r>
+      <w:r>
+        <w:t xml:space="preserve"> entity và repository là package-private; chỉ </w:t>
+      </w:r>
+      <w:r>
+        <w:rPr>
+          <w:rFonts w:ascii="Consolas" w:eastAsia="Consolas" w:hAnsi="Consolas" w:cs="Consolas"/>
+        </w:rPr>
+        <w:t xml:space="preserve">CredentialStore</w:t>
+      </w:r>
+      <w:r>
+        <w:t xml:space="preserve"> là public, và nằm trong package nội bộ </w:t>
+      </w:r>
+      <w:r>
+        <w:rPr>
+          <w:rFonts w:ascii="Consolas" w:eastAsia="Consolas" w:hAnsi="Consolas" w:cs="Consolas"/>
+        </w:rPr>
+        <w:t xml:space="preserve">infrastructure</w:t>
+      </w:r>
+      <w:r>
+        <w:t xml:space="preserve">, nên Spring Modulith chặn mọi module khác dùng nó.</w:t>
+      </w:r>
+    </w:p>
+    <w:p>
+      <w:pPr>
+        <w:pStyle w:val="ListParagraph"/>
+        <w:numPr>
+          <w:ilvl w:val="0"/>
+          <w:numId w:val="1"/>
+        </w:numPr>
+      </w:pPr>
+      <w:r>
+        <w:rPr>
+          <w:b/>
+          <w:bCs/>
+        </w:rPr>
+        <w:t xml:space="preserve">Refresh token:</w:t>
+      </w:r>
+      <w:r>
+        <w:t xml:space="preserve"> </w:t>
+      </w:r>
+      <w:r>
+        <w:rPr>
+          <w:rFonts w:ascii="Consolas" w:eastAsia="Consolas" w:hAnsi="Consolas" w:cs="Consolas"/>
+        </w:rPr>
+        <w:t xml:space="preserve">load</w:t>
+      </w:r>
+      <w:r>
+        <w:t xml:space="preserve"> chưa trả refresh token (F03 cố ý để </w:t>
+      </w:r>
+      <w:r>
+        <w:rPr>
+          <w:rFonts w:ascii="Consolas" w:eastAsia="Consolas" w:hAnsi="Consolas" w:cs="Consolas"/>
+        </w:rPr>
+        <w:t xml:space="preserve">OAuth2Credentials</w:t>
+      </w:r>
+      <w:r>
+        <w:t xml:space="preserve"> không có trường này). F04 sẽ thêm cách đọc nó khi làm luồng refresh, theo đúng quy tắc trên: đọc cả hai, rồi ghi lại cả hai.</w:t>
       </w:r>
     </w:p>
     <w:p>
@@ -9937,6 +10539,91 @@
     </w:p>
     <w:p>
       <w:pPr>
+        <w:pStyle w:val="ListParagraph"/>
+        <w:numPr>
+          <w:ilvl w:val="1"/>
+          <w:numId w:val="1"/>
+        </w:numPr>
+      </w:pPr>
+      <w:r>
+        <w:t xml:space="preserve">BE-13: store "quên" ghi refresh token → test xoay khóa đỏ.</w:t>
+      </w:r>
+    </w:p>
+    <w:p>
+      <w:pPr>
+        <w:pStyle w:val="ListParagraph"/>
+        <w:numPr>
+          <w:ilvl w:val="0"/>
+          <w:numId w:val="1"/>
+        </w:numPr>
+      </w:pPr>
+      <w:r>
+        <w:rPr>
+          <w:rFonts w:ascii="Consolas" w:eastAsia="Consolas" w:hAnsi="Consolas" w:cs="Consolas"/>
+          <w:b/>
+          <w:bCs/>
+        </w:rPr>
+        <w:t xml:space="preserve">row_to_json(c)::text</w:t>
+      </w:r>
+      <w:r>
+        <w:rPr>
+          <w:b/>
+          <w:bCs/>
+        </w:rPr>
+        <w:t xml:space="preserve"> của PostgreSQL:</w:t>
+      </w:r>
+      <w:r>
+        <w:t xml:space="preserve"> biến cả một dòng thành chuỗi JSON để kiểm tra bằng một lệnh rằng </w:t>
+      </w:r>
+      <w:r>
+        <w:rPr>
+          <w:b/>
+          <w:bCs/>
+        </w:rPr>
+        <w:t xml:space="preserve">không cột nào</w:t>
+      </w:r>
+      <w:r>
+        <w:t xml:space="preserve"> chứa token dạng chữ.</w:t>
+      </w:r>
+    </w:p>
+    <w:p>
+      <w:pPr>
+        <w:pStyle w:val="ListParagraph"/>
+        <w:numPr>
+          <w:ilvl w:val="0"/>
+          <w:numId w:val="1"/>
+        </w:numPr>
+      </w:pPr>
+      <w:r>
+        <w:rPr>
+          <w:rFonts w:ascii="Consolas" w:eastAsia="Consolas" w:hAnsi="Consolas" w:cs="Consolas"/>
+          <w:b/>
+          <w:bCs/>
+        </w:rPr>
+        <w:t xml:space="preserve">entityManager.flush()</w:t>
+      </w:r>
+      <w:r>
+        <w:rPr>
+          <w:b/>
+          <w:bCs/>
+        </w:rPr>
+        <w:t xml:space="preserve"> để lộ lỗi:</w:t>
+      </w:r>
+      <w:r>
+        <w:t xml:space="preserve"> trong </w:t>
+      </w:r>
+      <w:r>
+        <w:rPr>
+          <w:rFonts w:ascii="Consolas" w:eastAsia="Consolas" w:hAnsi="Consolas" w:cs="Consolas"/>
+        </w:rPr>
+        <w:t xml:space="preserve">@DataJpaTest</w:t>
+      </w:r>
+      <w:r>
+        <w:t xml:space="preserve">, lệnh ghi chỉ thật sự xuống DB khi flush. Muốn thấy lỗi khóa ngoại thì phải flush ngay trong đoạn code đang chờ lỗi; test còn kiểm tra cả stack trace của lỗi đó không chứa token.</w:t>
+      </w:r>
+    </w:p>
+    <w:p>
+      <w:pPr>
         <w:pBdr>
           <w:bottom w:val="single" w:sz="4" w:space="0" w:color="auto"/>
         </w:pBdr>
@@ -10147,12 +10834,63 @@
       </w:r>
     </w:p>
     <w:p>
+      <w:pPr>
+        <w:pStyle w:val="ListParagraph"/>
+        <w:numPr>
+          <w:ilvl w:val="0"/>
+          <w:numId w:val="101"/>
+        </w:numPr>
+      </w:pPr>
+      <w:r>
+        <w:t xml:space="preserve">Vì sao </w:t>
+      </w:r>
+      <w:r>
+        <w:rPr>
+          <w:rFonts w:ascii="Consolas" w:eastAsia="Consolas" w:hAnsi="Consolas" w:cs="Consolas"/>
+        </w:rPr>
+        <w:t xml:space="preserve">CredentialStore</w:t>
+      </w:r>
+      <w:r>
+        <w:t xml:space="preserve"> không có hàm </w:t>
+      </w:r>
+      <w:r>
+        <w:rPr>
+          <w:rFonts w:ascii="Consolas" w:eastAsia="Consolas" w:hAnsi="Consolas" w:cs="Consolas"/>
+        </w:rPr>
+        <w:t xml:space="preserve">updateAccessToken</w:t>
+      </w:r>
+      <w:r>
+        <w:t xml:space="preserve">?</w:t>
+      </w:r>
+    </w:p>
+    <w:p>
+      <w:pPr>
+        <w:pStyle w:val="ListParagraph"/>
+        <w:numPr>
+          <w:ilvl w:val="0"/>
+          <w:numId w:val="101"/>
+        </w:numPr>
+      </w:pPr>
+      <w:r>
+        <w:t xml:space="preserve">Xóa một </w:t>
+      </w:r>
+      <w:r>
+        <w:rPr>
+          <w:rFonts w:ascii="Consolas" w:eastAsia="Consolas" w:hAnsi="Consolas" w:cs="Consolas"/>
+        </w:rPr>
+        <w:t xml:space="preserve">connected_account</w:t>
+      </w:r>
+      <w:r>
+        <w:t xml:space="preserve"> thì credential của nó đi đâu, và nhờ đâu?</w:t>
+      </w:r>
+    </w:p>
+    <w:p>
       <w:r>
         <w:rPr>
           <w:i/>
           <w:iCs/>
         </w:rPr>
-        <w:t xml:space="preserve">(Phần BE-13…BE-18 — lưu credential, use case đăng ký, REST API, xóa account — sẽ được bổ sung khi làm.)</w:t>
+        <w:t xml:space="preserve">(Phần BE-14…BE-18 — use case đăng ký, REST API, xóa account, nghiệm thu — sẽ được bổ sung khi làm.)</w:t>
       </w:r>
     </w:p>
     <w:sectPr>

</xml_diff>

<commit_message>
docs(knowledge): add BE-14 (account registration) to the Phase 0 guide
New section 18 explains the register use case: where it sits in the
F04 connect flow and why the provider is called outside the transaction,
@Transactional and dirty checking, idempotent reconnect, the provider
check before any write, domain events with ApplicationEventPublisher and
a payload without secrets, and masking toString() in the command. The
test section gains @ApplicationModuleTest, AssertablePublishedEvents and
@MockitoSpyBean; four self-check questions added. The Word copy is
regenerated (docs check clean) and the new pages were inspected.

Co-Authored-By: Claude Opus 5.5 (1M context) <noreply@anthropic.com>
</commit_message>
<xml_diff>
--- a/docs/knowledge/phase-0-backend-foundation.docx
+++ b/docs/knowledge/phase-0-backend-foundation.docx
@@ -97,7 +97,7 @@
         <w:t xml:space="preserve">Phạm vi:</w:t>
       </w:r>
       <w:r>
-        <w:t xml:space="preserve"> F01 Project Foundation và F03 Provider Contract (mục 0–12); F02 Connected Accounts (mục 13–19, đang làm: xong BE-09…BE-13).</w:t>
+        <w:t xml:space="preserve"> F01 Project Foundation và F03 Provider Contract (mục 0–12); F02 Connected Accounts (mục 13–20, đang làm: xong BE-09…BE-14).</w:t>
         <w:br/>
       </w:r>
       <w:r>
@@ -108,7 +108,7 @@
         <w:t xml:space="preserve">Cập nhật:</w:t>
       </w:r>
       <w:r>
-        <w:t xml:space="preserve"> 2026-10-03. Đường dẫn code tính từ </w:t>
+        <w:t xml:space="preserve"> 2026-10-07. Đường dẫn code tính từ </w:t>
       </w:r>
       <w:r>
         <w:rPr>
@@ -7198,7 +7198,7 @@
           </w:tcPr>
           <w:p>
             <w:r>
-              <w:t xml:space="preserve">BE-14…BE-18</w:t>
+              <w:t xml:space="preserve">BE-14</w:t>
             </w:r>
           </w:p>
         </w:tc>
@@ -7208,7 +7208,45 @@
           </w:tcPr>
           <w:p>
             <w:r>
-              <w:t xml:space="preserve">Use case đăng ký, REST API, xóa, nghiệm thu</w:t>
+              <w:t xml:space="preserve">Use case đăng ký kết nối (tạo mới / reconnect) và event </w:t>
+            </w:r>
+            <w:r>
+              <w:rPr>
+                <w:rFonts w:ascii="Consolas" w:eastAsia="Consolas" w:hAnsi="Consolas" w:cs="Consolas"/>
+              </w:rPr>
+              <w:t xml:space="preserve">AccountConnected</w:t>
+            </w:r>
+          </w:p>
+        </w:tc>
+        <w:tc>
+          <w:tcPr>
+            <w:tcW w:w="3120" w:type="dxa"/>
+          </w:tcPr>
+          <w:p>
+            <w:r>
+              <w:t xml:space="preserve">xong</w:t>
+            </w:r>
+          </w:p>
+        </w:tc>
+      </w:tr>
+      <w:tr>
+        <w:tc>
+          <w:tcPr>
+            <w:tcW w:w="3120" w:type="dxa"/>
+          </w:tcPr>
+          <w:p>
+            <w:r>
+              <w:t xml:space="preserve">BE-15…BE-18</w:t>
+            </w:r>
+          </w:p>
+        </w:tc>
+        <w:tc>
+          <w:tcPr>
+            <w:tcW w:w="3120" w:type="dxa"/>
+          </w:tcPr>
+          <w:p>
+            <w:r>
+              <w:t xml:space="preserve">REST API, xóa, nghiệm thu</w:t>
             </w:r>
           </w:p>
         </w:tc>
@@ -10252,55 +10290,40 @@
         <w:pStyle w:val="Heading2"/>
       </w:pPr>
       <w:r>
-        <w:t xml:space="preserve">18. Kỹ thuật test mới trong F02</w:t>
-      </w:r>
-    </w:p>
-    <w:p>
-      <w:pPr>
-        <w:pStyle w:val="ListParagraph"/>
-        <w:numPr>
-          <w:ilvl w:val="0"/>
-          <w:numId w:val="1"/>
-        </w:numPr>
-      </w:pPr>
-      <w:r>
-        <w:rPr>
-          <w:rFonts w:ascii="Consolas" w:eastAsia="Consolas" w:hAnsi="Consolas" w:cs="Consolas"/>
-          <w:b/>
-          <w:bCs/>
-        </w:rPr>
-        <w:t xml:space="preserve">@DataJpaTest</w:t>
-      </w:r>
-      <w:r>
-        <w:rPr>
-          <w:b/>
-          <w:bCs/>
-        </w:rPr>
-        <w:t xml:space="preserve"> + </w:t>
-      </w:r>
-      <w:r>
-        <w:rPr>
-          <w:rFonts w:ascii="Consolas" w:eastAsia="Consolas" w:hAnsi="Consolas" w:cs="Consolas"/>
-          <w:b/>
-          <w:bCs/>
-        </w:rPr>
-        <w:t xml:space="preserve">@AutoConfigureTestDatabase(replace = NONE)</w:t>
-      </w:r>
-      <w:r>
-        <w:rPr>
-          <w:b/>
-          <w:bCs/>
-        </w:rPr>
-        <w:t xml:space="preserve">:</w:t>
-      </w:r>
-      <w:r>
-        <w:t xml:space="preserve"> slice chỉ nạp JPA và Flyway, chạy trên PostgreSQL thật (Testcontainers) để </w:t>
-      </w:r>
-      <w:r>
-        <w:rPr>
-          <w:rFonts w:ascii="Consolas" w:eastAsia="Consolas" w:hAnsi="Consolas" w:cs="Consolas"/>
-        </w:rPr>
-        <w:t xml:space="preserve">CHECK</w:t>
+        <w:t xml:space="preserve">18. Use case đăng ký kết nối (BE-14)</w:t>
+      </w:r>
+    </w:p>
+    <w:p>
+      <w:pPr>
+        <w:pStyle w:val="Heading3"/>
+      </w:pPr>
+      <w:r>
+        <w:t xml:space="preserve">18.1 Nó nằm ở đâu trong luồng kết nối</w:t>
+      </w:r>
+    </w:p>
+    <w:p>
+      <w:pPr>
+        <w:pStyle w:val="ListParagraph"/>
+        <w:numPr>
+          <w:ilvl w:val="0"/>
+          <w:numId w:val="1"/>
+        </w:numPr>
+      </w:pPr>
+      <w:r>
+        <w:rPr>
+          <w:b/>
+          <w:bCs/>
+        </w:rPr>
+        <w:t xml:space="preserve">Ở đâu:</w:t>
+      </w:r>
+      <w:r>
+        <w:t xml:space="preserve"> </w:t>
+      </w:r>
+      <w:r>
+        <w:rPr>
+          <w:rFonts w:ascii="Consolas" w:eastAsia="Consolas" w:hAnsi="Consolas" w:cs="Consolas"/>
+        </w:rPr>
+        <w:t xml:space="preserve">account/application/AccountRegistrationService.java</w:t>
       </w:r>
       <w:r>
         <w:t xml:space="preserve">, </w:t>
@@ -10309,141 +10332,456 @@
         <w:rPr>
           <w:rFonts w:ascii="Consolas" w:eastAsia="Consolas" w:hAnsi="Consolas" w:cs="Consolas"/>
         </w:rPr>
+        <w:t xml:space="preserve">account/application/RegisterAccountCommand.java</w:t>
+      </w:r>
+      <w:r>
+        <w:t xml:space="preserve">, event </w:t>
+      </w:r>
+      <w:r>
+        <w:rPr>
+          <w:rFonts w:ascii="Consolas" w:eastAsia="Consolas" w:hAnsi="Consolas" w:cs="Consolas"/>
+        </w:rPr>
+        <w:t xml:space="preserve">account/AccountConnected.java</w:t>
+      </w:r>
+      <w:r>
+        <w:t xml:space="preserve">.</w:t>
+      </w:r>
+    </w:p>
+    <w:p>
+      <w:pPr>
+        <w:pStyle w:val="ListParagraph"/>
+        <w:numPr>
+          <w:ilvl w:val="0"/>
+          <w:numId w:val="1"/>
+        </w:numPr>
+      </w:pPr>
+      <w:r>
+        <w:rPr>
+          <w:b/>
+          <w:bCs/>
+        </w:rPr>
+        <w:t xml:space="preserve">Là gì:</w:t>
+      </w:r>
+      <w:r>
+        <w:t xml:space="preserve"> "điểm vào" duy nhất để đưa một tài khoản đã được provider xác nhận vào Sino. Luồng kết nối của F04 sẽ gọi nó:</w:t>
+      </w:r>
+    </w:p>
+    <w:p>
+      <w:pPr>
+        <w:shd w:val="clear" w:color="auto" w:fill="F2F3F5"/>
+        <w:ind w:left="0"/>
+      </w:pPr>
+      <w:r>
+        <w:rPr>
+          <w:rFonts w:ascii="Consolas" w:eastAsia="Consolas" w:hAnsi="Consolas" w:cs="Consolas"/>
+          <w:sz w:val="19"/>
+          <w:szCs w:val="19"/>
+        </w:rPr>
+        <w:t xml:space="preserve">F04 (làm sau)                           BE-14 (đã làm)</w:t>
+        <w:br/>
+        <w:t xml:space="preserve">-------------                           --------------</w:t>
+        <w:br/>
+        <w:t xml:space="preserve">người dùng bấm "Kết nối Gmail"</w:t>
+        <w:br/>
+        <w:t xml:space="preserve">  -&gt; Google cho đăng nhập, trả "code"</w:t>
+        <w:br/>
+        <w:t xml:space="preserve">  -&gt; đổi code lấy token     (gọi Google, NGOÀI transaction)</w:t>
+        <w:br/>
+        <w:t xml:space="preserve">  -&gt; lấy profile tài khoản  (gọi Google, NGOÀI transaction)</w:t>
+        <w:br/>
+        <w:t xml:space="preserve">  -&gt; register(command)  -------------&gt;  MỘT transaction:</w:t>
+        <w:br/>
+        <w:t xml:space="preserve">                                          1. kiểm tra provider (registry)</w:t>
+        <w:br/>
+        <w:t xml:space="preserve">                                          2. tìm account theo</w:t>
+        <w:br/>
+        <w:t xml:space="preserve">                                             (owner, provider, externalAccountId)</w:t>
+        <w:br/>
+        <w:t xml:space="preserve">                                          3. chưa có: tạo mới / có rồi: reconnect</w:t>
+        <w:br/>
+        <w:t xml:space="preserve">                                          4. lưu credential (mã hóa)</w:t>
+        <w:br/>
+        <w:t xml:space="preserve">                                          5. publish AccountConnected</w:t>
+        <w:br/>
+        <w:t xml:space="preserve">                                        commit: cả ba thứ cùng được lưu</w:t>
+        <w:br/>
+        <w:t xml:space="preserve">                                        rollback: không còn gì</w:t>
+      </w:r>
+    </w:p>
+    <w:p>
+      <w:pPr>
+        <w:pStyle w:val="ListParagraph"/>
+        <w:numPr>
+          <w:ilvl w:val="0"/>
+          <w:numId w:val="1"/>
+        </w:numPr>
+      </w:pPr>
+      <w:r>
+        <w:rPr>
+          <w:b/>
+          <w:bCs/>
+        </w:rPr>
+        <w:t xml:space="preserve">Vì sao service không gọi provider:</w:t>
+      </w:r>
+      <w:r>
+        <w:t xml:space="preserve"> gọi mạng có thể mất vài giây hoặc treo. Nếu gọi bên trong transaction thì suốt thời gian đó app giữ một kết nối DB và khóa các dòng đang ghi. Vì vậy gọi provider trước, xong mới mở một transaction ngắn chỉ để ghi.</w:t>
+      </w:r>
+    </w:p>
+    <w:p>
+      <w:pPr>
+        <w:pStyle w:val="Heading3"/>
+      </w:pPr>
+      <w:r>
+        <w:t xml:space="preserve">18.2 </w:t>
+      </w:r>
+      <w:r>
+        <w:rPr>
+          <w:rFonts w:ascii="Consolas" w:eastAsia="Consolas" w:hAnsi="Consolas" w:cs="Consolas"/>
+        </w:rPr>
+        <w:t xml:space="preserve">@Transactional</w:t>
+      </w:r>
+      <w:r>
+        <w:t xml:space="preserve">: tất cả hoặc không gì cả</w:t>
+      </w:r>
+    </w:p>
+    <w:p>
+      <w:pPr>
+        <w:pStyle w:val="ListParagraph"/>
+        <w:numPr>
+          <w:ilvl w:val="0"/>
+          <w:numId w:val="1"/>
+        </w:numPr>
+      </w:pPr>
+      <w:r>
+        <w:rPr>
+          <w:b/>
+          <w:bCs/>
+        </w:rPr>
+        <w:t xml:space="preserve">Là gì:</w:t>
+      </w:r>
+      <w:r>
+        <w:t xml:space="preserve"> Spring mở transaction khi vào method, commit khi method trả về bình thường, rollback khi method ném </w:t>
+      </w:r>
+      <w:r>
+        <w:rPr>
+          <w:rFonts w:ascii="Consolas" w:eastAsia="Consolas" w:hAnsi="Consolas" w:cs="Consolas"/>
+        </w:rPr>
+        <w:t xml:space="preserve">RuntimeException</w:t>
+      </w:r>
+      <w:r>
+        <w:t xml:space="preserve">.</w:t>
+      </w:r>
+    </w:p>
+    <w:p>
+      <w:pPr>
+        <w:pStyle w:val="ListParagraph"/>
+        <w:numPr>
+          <w:ilvl w:val="0"/>
+          <w:numId w:val="1"/>
+        </w:numPr>
+      </w:pPr>
+      <w:r>
+        <w:rPr>
+          <w:b/>
+          <w:bCs/>
+        </w:rPr>
+        <w:t xml:space="preserve">Không có nó thì sao:</w:t>
+      </w:r>
+      <w:r>
+        <w:t xml:space="preserve"> </w:t>
+      </w:r>
+      <w:r>
+        <w:rPr>
+          <w:rFonts w:ascii="Consolas" w:eastAsia="Consolas" w:hAnsi="Consolas" w:cs="Consolas"/>
+        </w:rPr>
+        <w:t xml:space="preserve">accounts.save(...)</w:t>
+      </w:r>
+      <w:r>
+        <w:t xml:space="preserve"> tự có transaction riêng nên account được commit ngay; nếu bước lưu credential lỗi thì còn lại một account không có credential. Kiểm tra ngược đã chứng minh: bỏ </w:t>
+      </w:r>
+      <w:r>
+        <w:rPr>
+          <w:rFonts w:ascii="Consolas" w:eastAsia="Consolas" w:hAnsi="Consolas" w:cs="Consolas"/>
+        </w:rPr>
+        <w:t xml:space="preserve">@Transactional</w:t>
+      </w:r>
+      <w:r>
+        <w:t xml:space="preserve"> thì test "lưu credential lỗi" đỏ.</w:t>
+      </w:r>
+    </w:p>
+    <w:p>
+      <w:pPr>
+        <w:pStyle w:val="ListParagraph"/>
+        <w:numPr>
+          <w:ilvl w:val="0"/>
+          <w:numId w:val="1"/>
+        </w:numPr>
+      </w:pPr>
+      <w:r>
+        <w:rPr>
+          <w:b/>
+          <w:bCs/>
+        </w:rPr>
+        <w:t xml:space="preserve">Bẫy thứ hai, cùng lần kiểm tra ngược đó:</w:t>
+      </w:r>
+      <w:r>
+        <w:t xml:space="preserve"> test reconnect cũng đỏ. Lý do: object đọc ra </w:t>
+      </w:r>
+      <w:r>
+        <w:rPr>
+          <w:b/>
+          <w:bCs/>
+        </w:rPr>
+        <w:t xml:space="preserve">trong</w:t>
+      </w:r>
+      <w:r>
+        <w:t xml:space="preserve"> transaction được Hibernate theo dõi ("managed"). Đổi field của nó thì Hibernate tự ghi xuống DB lúc commit ("dirty checking"), không cần gọi </w:t>
+      </w:r>
+      <w:r>
+        <w:rPr>
+          <w:rFonts w:ascii="Consolas" w:eastAsia="Consolas" w:hAnsi="Consolas" w:cs="Consolas"/>
+        </w:rPr>
+        <w:t xml:space="preserve">save</w:t>
+      </w:r>
+      <w:r>
+        <w:t xml:space="preserve">. Ra </w:t>
+      </w:r>
+      <w:r>
+        <w:rPr>
+          <w:b/>
+          <w:bCs/>
+        </w:rPr>
+        <w:t xml:space="preserve">ngoài</w:t>
+      </w:r>
+      <w:r>
+        <w:t xml:space="preserve"> transaction thì không ai theo dõi, nên </w:t>
+      </w:r>
+      <w:r>
+        <w:rPr>
+          <w:rFonts w:ascii="Consolas" w:eastAsia="Consolas" w:hAnsi="Consolas" w:cs="Consolas"/>
+        </w:rPr>
+        <w:t xml:space="preserve">reconnect()</w:t>
+      </w:r>
+      <w:r>
+        <w:t xml:space="preserve"> đổi tên và trạng thái trong bộ nhớ mà không được ghi.</w:t>
+      </w:r>
+    </w:p>
+    <w:p>
+      <w:pPr>
+        <w:pStyle w:val="Heading3"/>
+      </w:pPr>
+      <w:r>
+        <w:t xml:space="preserve">18.3 Idempotent: gọi lại không tạo bản sao</w:t>
+      </w:r>
+    </w:p>
+    <w:p>
+      <w:pPr>
+        <w:pStyle w:val="ListParagraph"/>
+        <w:numPr>
+          <w:ilvl w:val="0"/>
+          <w:numId w:val="1"/>
+        </w:numPr>
+      </w:pPr>
+      <w:r>
+        <w:t xml:space="preserve">Service tìm theo bộ khóa trước. Có rồi thì </w:t>
+      </w:r>
+      <w:r>
+        <w:rPr>
+          <w:rFonts w:ascii="Consolas" w:eastAsia="Consolas" w:hAnsi="Consolas" w:cs="Consolas"/>
+        </w:rPr>
+        <w:t xml:space="preserve">reconnect()</w:t>
+      </w:r>
+      <w:r>
+        <w:t xml:space="preserve">: cập nhật tên và ảnh từ provider, trạng thái về </w:t>
+      </w:r>
+      <w:r>
+        <w:rPr>
+          <w:rFonts w:ascii="Consolas" w:eastAsia="Consolas" w:hAnsi="Consolas" w:cs="Consolas"/>
+        </w:rPr>
+        <w:t xml:space="preserve">CONNECTED</w:t>
+      </w:r>
+      <w:r>
+        <w:t xml:space="preserve"> (kể cả từ </w:t>
+      </w:r>
+      <w:r>
+        <w:rPr>
+          <w:rFonts w:ascii="Consolas" w:eastAsia="Consolas" w:hAnsi="Consolas" w:cs="Consolas"/>
+        </w:rPr>
+        <w:t xml:space="preserve">AUTH_EXPIRED</w:t>
+      </w:r>
+      <w:r>
+        <w:t xml:space="preserve">), thay </w:t>
+      </w:r>
+      <w:r>
+        <w:rPr>
+          <w:b/>
+          <w:bCs/>
+        </w:rPr>
+        <w:t xml:space="preserve">toàn bộ</w:t>
+      </w:r>
+      <w:r>
+        <w:t xml:space="preserve"> credential (quy tắc ở mục 17.6), và event có </w:t>
+      </w:r>
+      <w:r>
+        <w:rPr>
+          <w:rFonts w:ascii="Consolas" w:eastAsia="Consolas" w:hAnsi="Consolas" w:cs="Consolas"/>
+        </w:rPr>
+        <w:t xml:space="preserve">reconnected = true</w:t>
+      </w:r>
+      <w:r>
+        <w:t xml:space="preserve">.</w:t>
+      </w:r>
+    </w:p>
+    <w:p>
+      <w:pPr>
+        <w:pStyle w:val="ListParagraph"/>
+        <w:numPr>
+          <w:ilvl w:val="0"/>
+          <w:numId w:val="1"/>
+        </w:numPr>
+      </w:pPr>
+      <w:r>
+        <w:t xml:space="preserve">Hai request đến cùng lúc vẫn có thể cùng "không thấy" rồi cùng tạo. Khi đó </w:t>
+      </w:r>
+      <w:r>
+        <w:rPr>
+          <w:rFonts w:ascii="Consolas" w:eastAsia="Consolas" w:hAnsi="Consolas" w:cs="Consolas"/>
+        </w:rPr>
         <w:t xml:space="preserve">UNIQUE</w:t>
       </w:r>
       <w:r>
-        <w:t xml:space="preserve">, khóa ngoại hoạt động như production. Mỗi test tự rollback.</w:t>
-      </w:r>
-    </w:p>
-    <w:p>
-      <w:pPr>
-        <w:pStyle w:val="ListParagraph"/>
-        <w:numPr>
-          <w:ilvl w:val="0"/>
-          <w:numId w:val="1"/>
-        </w:numPr>
-      </w:pPr>
-      <w:r>
-        <w:rPr>
-          <w:rFonts w:ascii="Consolas" w:eastAsia="Consolas" w:hAnsi="Consolas" w:cs="Consolas"/>
-          <w:b/>
-          <w:bCs/>
-        </w:rPr>
-        <w:t xml:space="preserve">entityManager.clear()</w:t>
-      </w:r>
-      <w:r>
-        <w:rPr>
-          <w:b/>
-          <w:bCs/>
-        </w:rPr>
-        <w:t xml:space="preserve">:</w:t>
-      </w:r>
-      <w:r>
-        <w:t xml:space="preserve"> xóa bộ nhớ đệm của Hibernate để lần đọc sau thật sự đi xuống DB. Không có nó, test chỉ đọc lại object trong bộ nhớ.</w:t>
-      </w:r>
-    </w:p>
-    <w:p>
-      <w:pPr>
-        <w:pStyle w:val="ListParagraph"/>
-        <w:numPr>
-          <w:ilvl w:val="0"/>
-          <w:numId w:val="1"/>
-        </w:numPr>
-      </w:pPr>
-      <w:r>
-        <w:rPr>
-          <w:rFonts w:ascii="Consolas" w:eastAsia="Consolas" w:hAnsi="Consolas" w:cs="Consolas"/>
-          <w:b/>
-          <w:bCs/>
-        </w:rPr>
-        <w:t xml:space="preserve">JdbcTemplate</w:t>
-      </w:r>
-      <w:r>
-        <w:rPr>
-          <w:b/>
-          <w:bCs/>
-        </w:rPr>
-        <w:t xml:space="preserve">:</w:t>
-      </w:r>
-      <w:r>
-        <w:t xml:space="preserve"> chạy SQL thô để nhìn đúng cái nằm trong DB, hoặc để thử ràng buộc mà Java không tạo ra được (ví dụ ghi </w:t>
-      </w:r>
-      <w:r>
-        <w:rPr>
-          <w:rFonts w:ascii="Consolas" w:eastAsia="Consolas" w:hAnsi="Consolas" w:cs="Consolas"/>
-        </w:rPr>
-        <w:t xml:space="preserve">status = 'SYNCING'</w:t>
-      </w:r>
-      <w:r>
-        <w:t xml:space="preserve">).</w:t>
-      </w:r>
-    </w:p>
-    <w:p>
-      <w:pPr>
-        <w:pStyle w:val="ListParagraph"/>
-        <w:numPr>
-          <w:ilvl w:val="0"/>
-          <w:numId w:val="1"/>
-        </w:numPr>
-      </w:pPr>
-      <w:r>
-        <w:rPr>
-          <w:rFonts w:ascii="Consolas" w:eastAsia="Consolas" w:hAnsi="Consolas" w:cs="Consolas"/>
-          <w:b/>
-          <w:bCs/>
-        </w:rPr>
-        <w:t xml:space="preserve">ApplicationContextRunner</w:t>
-      </w:r>
-      <w:r>
-        <w:rPr>
-          <w:b/>
-          <w:bCs/>
-        </w:rPr>
-        <w:t xml:space="preserve"> cho kiểm tra khởi động:</w:t>
-      </w:r>
-      <w:r>
-        <w:t xml:space="preserve"> dựng một context nhỏ với cấu hình sai để chứng minh app </w:t>
-      </w:r>
-      <w:r>
-        <w:rPr>
-          <w:b/>
-          <w:bCs/>
-        </w:rPr>
-        <w:t xml:space="preserve">không</w:t>
-      </w:r>
-      <w:r>
-        <w:t xml:space="preserve"> start và thông báo không lộ secret.</w:t>
-      </w:r>
-    </w:p>
-    <w:p>
-      <w:pPr>
-        <w:pStyle w:val="ListParagraph"/>
-        <w:numPr>
-          <w:ilvl w:val="0"/>
-          <w:numId w:val="1"/>
-        </w:numPr>
-      </w:pPr>
-      <w:r>
-        <w:rPr>
-          <w:b/>
-          <w:bCs/>
-        </w:rPr>
-        <w:t xml:space="preserve">Mockito </w:t>
-      </w:r>
-      <w:r>
-        <w:rPr>
-          <w:rFonts w:ascii="Consolas" w:eastAsia="Consolas" w:hAnsi="Consolas" w:cs="Consolas"/>
-          <w:b/>
-          <w:bCs/>
-        </w:rPr>
-        <w:t xml:space="preserve">mock(...)</w:t>
-      </w:r>
-      <w:r>
-        <w:rPr>
-          <w:b/>
-          <w:bCs/>
-        </w:rPr>
-        <w:t xml:space="preserve"> trong unit test:</w:t>
+        <w:t xml:space="preserve"> của DB chặn request thứ hai (mục 15.6); request đó báo lỗi, và lần thử lại sẽ thành reconnect.</w:t>
+      </w:r>
+    </w:p>
+    <w:p>
+      <w:pPr>
+        <w:pStyle w:val="Heading3"/>
+      </w:pPr>
+      <w:r>
+        <w:t xml:space="preserve">18.4 Kiểm tra provider trước khi ghi</w:t>
+      </w:r>
+    </w:p>
+    <w:p>
+      <w:pPr>
+        <w:pStyle w:val="ListParagraph"/>
+        <w:numPr>
+          <w:ilvl w:val="0"/>
+          <w:numId w:val="1"/>
+        </w:numPr>
+      </w:pPr>
+      <w:r>
+        <w:rPr>
+          <w:rFonts w:ascii="Consolas" w:eastAsia="Consolas" w:hAnsi="Consolas" w:cs="Consolas"/>
+        </w:rPr>
+        <w:t xml:space="preserve">providers.get(type)</w:t>
+      </w:r>
+      <w:r>
+        <w:t xml:space="preserve"> ném </w:t>
+      </w:r>
+      <w:r>
+        <w:rPr>
+          <w:rFonts w:ascii="Consolas" w:eastAsia="Consolas" w:hAnsi="Consolas" w:cs="Consolas"/>
+        </w:rPr>
+        <w:t xml:space="preserve">SinoException</w:t>
+      </w:r>
+      <w:r>
+        <w:t xml:space="preserve"> mã </w:t>
+      </w:r>
+      <w:r>
+        <w:rPr>
+          <w:rFonts w:ascii="Consolas" w:eastAsia="Consolas" w:hAnsi="Consolas" w:cs="Consolas"/>
+        </w:rPr>
+        <w:t xml:space="preserve">UNKNOWN_PROVIDER</w:t>
+      </w:r>
+      <w:r>
+        <w:t xml:space="preserve"> khi không có connector cho loại đó. Dòng này đứng đầu method để lỗi xảy ra </w:t>
+      </w:r>
+      <w:r>
+        <w:rPr>
+          <w:b/>
+          <w:bCs/>
+        </w:rPr>
+        <w:t xml:space="preserve">trước</w:t>
+      </w:r>
+      <w:r>
+        <w:t xml:space="preserve"> khi ghi bất cứ thứ gì. Giá trị trả về không dùng: ở đây chỉ cần biết provider có hay không.</w:t>
+      </w:r>
+    </w:p>
+    <w:p>
+      <w:pPr>
+        <w:pStyle w:val="Heading3"/>
+      </w:pPr>
+      <w:r>
+        <w:t xml:space="preserve">18.5 Domain event và </w:t>
+      </w:r>
+      <w:r>
+        <w:rPr>
+          <w:rFonts w:ascii="Consolas" w:eastAsia="Consolas" w:hAnsi="Consolas" w:cs="Consolas"/>
+        </w:rPr>
+        <w:t xml:space="preserve">ApplicationEventPublisher</w:t>
+      </w:r>
+    </w:p>
+    <w:p>
+      <w:pPr>
+        <w:pStyle w:val="ListParagraph"/>
+        <w:numPr>
+          <w:ilvl w:val="0"/>
+          <w:numId w:val="1"/>
+        </w:numPr>
+      </w:pPr>
+      <w:r>
+        <w:rPr>
+          <w:b/>
+          <w:bCs/>
+        </w:rPr>
+        <w:t xml:space="preserve">Là gì:</w:t>
+      </w:r>
+      <w:r>
+        <w:t xml:space="preserve"> một thông báo rằng một việc </w:t>
+      </w:r>
+      <w:r>
+        <w:rPr>
+          <w:b/>
+          <w:bCs/>
+        </w:rPr>
+        <w:t xml:space="preserve">đã xảy ra</w:t>
+      </w:r>
+      <w:r>
+        <w:t xml:space="preserve"> (tên ở thì quá khứ: </w:t>
+      </w:r>
+      <w:r>
+        <w:rPr>
+          <w:rFonts w:ascii="Consolas" w:eastAsia="Consolas" w:hAnsi="Consolas" w:cs="Consolas"/>
+        </w:rPr>
+        <w:t xml:space="preserve">AccountConnected</w:t>
+      </w:r>
+      <w:r>
+        <w:t xml:space="preserve">). Module khác nghe để làm việc của mình; ví dụ F07 sẽ bắt đầu đồng bộ lần đầu. Module </w:t>
+      </w:r>
+      <w:r>
+        <w:rPr>
+          <w:rFonts w:ascii="Consolas" w:eastAsia="Consolas" w:hAnsi="Consolas" w:cs="Consolas"/>
+        </w:rPr>
+        <w:t xml:space="preserve">account</w:t>
+      </w:r>
+      <w:r>
+        <w:t xml:space="preserve"> không cần biết ai nghe, nên các module ít phụ thuộc nhau.</w:t>
+      </w:r>
+    </w:p>
+    <w:p>
+      <w:pPr>
+        <w:pStyle w:val="ListParagraph"/>
+        <w:numPr>
+          <w:ilvl w:val="0"/>
+          <w:numId w:val="1"/>
+        </w:numPr>
+      </w:pPr>
+      <w:r>
+        <w:rPr>
+          <w:b/>
+          <w:bCs/>
+        </w:rPr>
+        <w:t xml:space="preserve">Cách gửi:</w:t>
       </w:r>
       <w:r>
         <w:t xml:space="preserve"> </w:t>
@@ -10452,68 +10790,122 @@
         <w:rPr>
           <w:rFonts w:ascii="Consolas" w:eastAsia="Consolas" w:hAnsi="Consolas" w:cs="Consolas"/>
         </w:rPr>
-        <w:t xml:space="preserve">OwnerCurrentUserTests</w:t>
-      </w:r>
-      <w:r>
-        <w:t xml:space="preserve"> giả repository để test </w:t>
-      </w:r>
-      <w:r>
-        <w:rPr>
-          <w:rFonts w:ascii="Consolas" w:eastAsia="Consolas" w:hAnsi="Consolas" w:cs="Consolas"/>
-        </w:rPr>
-        <w:t xml:space="preserve">CurrentUser</w:t>
-      </w:r>
-      <w:r>
-        <w:t xml:space="preserve"> mà không cần DB.</w:t>
-      </w:r>
-    </w:p>
-    <w:p>
-      <w:pPr>
-        <w:pStyle w:val="ListParagraph"/>
-        <w:numPr>
-          <w:ilvl w:val="0"/>
-          <w:numId w:val="1"/>
-        </w:numPr>
-      </w:pPr>
-      <w:r>
-        <w:rPr>
-          <w:b/>
-          <w:bCs/>
-        </w:rPr>
-        <w:t xml:space="preserve">Kiểm tra ngược ở mọi task:</w:t>
-      </w:r>
-    </w:p>
-    <w:p>
-      <w:pPr>
-        <w:pStyle w:val="ListParagraph"/>
-        <w:numPr>
-          <w:ilvl w:val="1"/>
-          <w:numId w:val="1"/>
-        </w:numPr>
-      </w:pPr>
-      <w:r>
-        <w:t xml:space="preserve">BE-09: bỏ bước tìm theo email → 2 test idempotent đỏ.</w:t>
-      </w:r>
-    </w:p>
-    <w:p>
-      <w:pPr>
-        <w:pStyle w:val="ListParagraph"/>
-        <w:numPr>
-          <w:ilvl w:val="1"/>
-          <w:numId w:val="1"/>
-        </w:numPr>
-      </w:pPr>
-      <w:r>
-        <w:t xml:space="preserve">BE-10: cho </w:t>
-      </w:r>
-      <w:r>
-        <w:rPr>
-          <w:rFonts w:ascii="Consolas" w:eastAsia="Consolas" w:hAnsi="Consolas" w:cs="Consolas"/>
-        </w:rPr>
-        <w:t xml:space="preserve">markHealthy</w:t>
-      </w:r>
-      <w:r>
-        <w:t xml:space="preserve"> gỡ </w:t>
+        <w:t xml:space="preserve">events.publishEvent(new AccountConnected(...))</w:t>
+      </w:r>
+      <w:r>
+        <w:t xml:space="preserve">; </w:t>
+      </w:r>
+      <w:r>
+        <w:rPr>
+          <w:rFonts w:ascii="Consolas" w:eastAsia="Consolas" w:hAnsi="Consolas" w:cs="Consolas"/>
+        </w:rPr>
+        <w:t xml:space="preserve">ApplicationEventPublisher</w:t>
+      </w:r>
+      <w:r>
+        <w:t xml:space="preserve"> là bean có sẵn của Spring.</w:t>
+      </w:r>
+    </w:p>
+    <w:p>
+      <w:pPr>
+        <w:pStyle w:val="ListParagraph"/>
+        <w:numPr>
+          <w:ilvl w:val="0"/>
+          <w:numId w:val="1"/>
+        </w:numPr>
+      </w:pPr>
+      <w:r>
+        <w:rPr>
+          <w:b/>
+          <w:bCs/>
+        </w:rPr>
+        <w:t xml:space="preserve">Ở đâu:</w:t>
+      </w:r>
+      <w:r>
+        <w:t xml:space="preserve"> record public ở package gốc </w:t>
+      </w:r>
+      <w:r>
+        <w:rPr>
+          <w:rFonts w:ascii="Consolas" w:eastAsia="Consolas" w:hAnsi="Consolas" w:cs="Consolas"/>
+        </w:rPr>
+        <w:t xml:space="preserve">dev.sino.account</w:t>
+      </w:r>
+      <w:r>
+        <w:t xml:space="preserve">, tức phần API của module, nên Spring Modulith cho module khác dùng.</w:t>
+      </w:r>
+    </w:p>
+    <w:p>
+      <w:pPr>
+        <w:pStyle w:val="ListParagraph"/>
+        <w:numPr>
+          <w:ilvl w:val="0"/>
+          <w:numId w:val="1"/>
+        </w:numPr>
+      </w:pPr>
+      <w:r>
+        <w:rPr>
+          <w:b/>
+          <w:bCs/>
+        </w:rPr>
+        <w:t xml:space="preserve">Payload chỉ có ID, provider, cờ reconnect và thời điểm.</w:t>
+      </w:r>
+      <w:r>
+        <w:t xml:space="preserve"> Không có token, email hay tên: Spring Modulith có thể lưu event vào bảng </w:t>
+      </w:r>
+      <w:r>
+        <w:rPr>
+          <w:rFonts w:ascii="Consolas" w:eastAsia="Consolas" w:hAnsi="Consolas" w:cs="Consolas"/>
+        </w:rPr>
+        <w:t xml:space="preserve">event_publication</w:t>
+      </w:r>
+      <w:r>
+        <w:t xml:space="preserve"> và log có thể in ra, nên mọi thứ trong event coi như có thể bị người khác đọc.</w:t>
+      </w:r>
+    </w:p>
+    <w:p>
+      <w:pPr>
+        <w:pStyle w:val="ListParagraph"/>
+        <w:numPr>
+          <w:ilvl w:val="0"/>
+          <w:numId w:val="1"/>
+        </w:numPr>
+      </w:pPr>
+      <w:r>
+        <w:rPr>
+          <w:b/>
+          <w:bCs/>
+        </w:rPr>
+        <w:t xml:space="preserve">Publish ở bước cuối, bên trong transaction:</w:t>
+      </w:r>
+      <w:r>
+        <w:t xml:space="preserve"> listener loại "chạy sau khi commit" (F07 sẽ dùng </w:t>
+      </w:r>
+      <w:r>
+        <w:rPr>
+          <w:rFonts w:ascii="Consolas" w:eastAsia="Consolas" w:hAnsi="Consolas" w:cs="Consolas"/>
+        </w:rPr>
+        <w:t xml:space="preserve">@ApplicationModuleListener</w:t>
+      </w:r>
+      <w:r>
+        <w:t xml:space="preserve">) chỉ nhận event khi mọi thứ đã được lưu thật. Transaction rollback thì event bị bỏ.</w:t>
+      </w:r>
+    </w:p>
+    <w:p>
+      <w:pPr>
+        <w:pStyle w:val="ListParagraph"/>
+        <w:numPr>
+          <w:ilvl w:val="0"/>
+          <w:numId w:val="1"/>
+        </w:numPr>
+      </w:pPr>
+      <w:r>
+        <w:rPr>
+          <w:b/>
+          <w:bCs/>
+        </w:rPr>
+        <w:t xml:space="preserve">Chưa làm:</w:t>
+      </w:r>
+      <w:r>
+        <w:t xml:space="preserve"> khi reconnect đổi trạng thái thật (ví dụ </w:t>
       </w:r>
       <w:r>
         <w:rPr>
@@ -10522,104 +10914,266 @@
         <w:t xml:space="preserve">AUTH_EXPIRED</w:t>
       </w:r>
       <w:r>
-        <w:t xml:space="preserve"> → đúng ô đó đỏ.</w:t>
-      </w:r>
-    </w:p>
-    <w:p>
-      <w:pPr>
-        <w:pStyle w:val="ListParagraph"/>
-        <w:numPr>
-          <w:ilvl w:val="1"/>
-          <w:numId w:val="1"/>
-        </w:numPr>
-      </w:pPr>
-      <w:r>
-        <w:t xml:space="preserve">BE-12: IV cố định → 1 test đỏ; bỏ AAD → 3 test đỏ; tag 96 bit → 2 test đỏ.</w:t>
-      </w:r>
-    </w:p>
-    <w:p>
-      <w:pPr>
-        <w:pStyle w:val="ListParagraph"/>
-        <w:numPr>
-          <w:ilvl w:val="1"/>
-          <w:numId w:val="1"/>
-        </w:numPr>
-      </w:pPr>
-      <w:r>
-        <w:t xml:space="preserve">BE-13: store "quên" ghi refresh token → test xoay khóa đỏ.</w:t>
-      </w:r>
-    </w:p>
-    <w:p>
-      <w:pPr>
-        <w:pStyle w:val="ListParagraph"/>
-        <w:numPr>
-          <w:ilvl w:val="0"/>
-          <w:numId w:val="1"/>
-        </w:numPr>
-      </w:pPr>
-      <w:r>
-        <w:rPr>
-          <w:rFonts w:ascii="Consolas" w:eastAsia="Consolas" w:hAnsi="Consolas" w:cs="Consolas"/>
-          <w:b/>
-          <w:bCs/>
-        </w:rPr>
-        <w:t xml:space="preserve">row_to_json(c)::text</w:t>
-      </w:r>
-      <w:r>
-        <w:rPr>
-          <w:b/>
-          <w:bCs/>
-        </w:rPr>
-        <w:t xml:space="preserve"> của PostgreSQL:</w:t>
-      </w:r>
-      <w:r>
-        <w:t xml:space="preserve"> biến cả một dòng thành chuỗi JSON để kiểm tra bằng một lệnh rằng </w:t>
-      </w:r>
-      <w:r>
-        <w:rPr>
-          <w:b/>
-          <w:bCs/>
-        </w:rPr>
-        <w:t xml:space="preserve">không cột nào</w:t>
-      </w:r>
-      <w:r>
-        <w:t xml:space="preserve"> chứa token dạng chữ.</w:t>
-      </w:r>
-    </w:p>
-    <w:p>
-      <w:pPr>
-        <w:pStyle w:val="ListParagraph"/>
-        <w:numPr>
-          <w:ilvl w:val="0"/>
-          <w:numId w:val="1"/>
-        </w:numPr>
-      </w:pPr>
-      <w:r>
-        <w:rPr>
-          <w:rFonts w:ascii="Consolas" w:eastAsia="Consolas" w:hAnsi="Consolas" w:cs="Consolas"/>
-          <w:b/>
-          <w:bCs/>
-        </w:rPr>
-        <w:t xml:space="preserve">entityManager.flush()</w:t>
-      </w:r>
-      <w:r>
-        <w:rPr>
-          <w:b/>
-          <w:bCs/>
-        </w:rPr>
-        <w:t xml:space="preserve"> để lộ lỗi:</w:t>
-      </w:r>
-      <w:r>
-        <w:t xml:space="preserve"> trong </w:t>
-      </w:r>
-      <w:r>
-        <w:rPr>
-          <w:rFonts w:ascii="Consolas" w:eastAsia="Consolas" w:hAnsi="Consolas" w:cs="Consolas"/>
-        </w:rPr>
-        <w:t xml:space="preserve">@DataJpaTest</w:t>
-      </w:r>
-      <w:r>
-        <w:t xml:space="preserve">, lệnh ghi chỉ thật sự xuống DB khi flush. Muốn thấy lỗi khóa ngoại thì phải flush ngay trong đoạn code đang chờ lỗi; test còn kiểm tra cả stack trace của lỗi đó không chứa token.</w:t>
+        <w:t xml:space="preserve"> sang </w:t>
+      </w:r>
+      <w:r>
+        <w:rPr>
+          <w:rFonts w:ascii="Consolas" w:eastAsia="Consolas" w:hAnsi="Consolas" w:cs="Consolas"/>
+        </w:rPr>
+        <w:t xml:space="preserve">CONNECTED</w:t>
+      </w:r>
+      <w:r>
+        <w:t xml:space="preserve">), design muốn có thêm event </w:t>
+      </w:r>
+      <w:r>
+        <w:rPr>
+          <w:rFonts w:ascii="Consolas" w:eastAsia="Consolas" w:hAnsi="Consolas" w:cs="Consolas"/>
+        </w:rPr>
+        <w:t xml:space="preserve">AccountStatusChanged</w:t>
+      </w:r>
+      <w:r>
+        <w:t xml:space="preserve">. Việc này dời sang BE-16, nơi event đó được tạo. Lý do: event mang </w:t>
+      </w:r>
+      <w:r>
+        <w:rPr>
+          <w:rFonts w:ascii="Consolas" w:eastAsia="Consolas" w:hAnsi="Consolas" w:cs="Consolas"/>
+        </w:rPr>
+        <w:t xml:space="preserve">from</w:t>
+      </w:r>
+      <w:r>
+        <w:t xml:space="preserve">/</w:t>
+      </w:r>
+      <w:r>
+        <w:rPr>
+          <w:rFonts w:ascii="Consolas" w:eastAsia="Consolas" w:hAnsi="Consolas" w:cs="Consolas"/>
+        </w:rPr>
+        <w:t xml:space="preserve">to</w:t>
+      </w:r>
+      <w:r>
+        <w:t xml:space="preserve"> kiểu </w:t>
+      </w:r>
+      <w:r>
+        <w:rPr>
+          <w:rFonts w:ascii="Consolas" w:eastAsia="Consolas" w:hAnsi="Consolas" w:cs="Consolas"/>
+        </w:rPr>
+        <w:t xml:space="preserve">AccountStatus</w:t>
+      </w:r>
+      <w:r>
+        <w:t xml:space="preserve">, mà </w:t>
+      </w:r>
+      <w:r>
+        <w:rPr>
+          <w:rFonts w:ascii="Consolas" w:eastAsia="Consolas" w:hAnsi="Consolas" w:cs="Consolas"/>
+        </w:rPr>
+        <w:t xml:space="preserve">AccountStatus</w:t>
+      </w:r>
+      <w:r>
+        <w:t xml:space="preserve"> đang nằm trong package nội bộ </w:t>
+      </w:r>
+      <w:r>
+        <w:rPr>
+          <w:rFonts w:ascii="Consolas" w:eastAsia="Consolas" w:hAnsi="Consolas" w:cs="Consolas"/>
+        </w:rPr>
+        <w:t xml:space="preserve">account.domain</w:t>
+      </w:r>
+      <w:r>
+        <w:t xml:space="preserve">; module khác đọc event sẽ vi phạm luật Modulith. Vì vậy chỗ đặt </w:t>
+      </w:r>
+      <w:r>
+        <w:rPr>
+          <w:rFonts w:ascii="Consolas" w:eastAsia="Consolas" w:hAnsi="Consolas" w:cs="Consolas"/>
+        </w:rPr>
+        <w:t xml:space="preserve">AccountStatus</w:t>
+      </w:r>
+      <w:r>
+        <w:t xml:space="preserve"> phải chốt cùng lúc tạo event.</w:t>
+      </w:r>
+    </w:p>
+    <w:p>
+      <w:pPr>
+        <w:pStyle w:val="Heading3"/>
+      </w:pPr>
+      <w:r>
+        <w:t xml:space="preserve">18.6 Command object và che secret trong </w:t>
+      </w:r>
+      <w:r>
+        <w:rPr>
+          <w:rFonts w:ascii="Consolas" w:eastAsia="Consolas" w:hAnsi="Consolas" w:cs="Consolas"/>
+        </w:rPr>
+        <w:t xml:space="preserve">toString()</w:t>
+      </w:r>
+    </w:p>
+    <w:p>
+      <w:pPr>
+        <w:pStyle w:val="ListParagraph"/>
+        <w:numPr>
+          <w:ilvl w:val="0"/>
+          <w:numId w:val="1"/>
+        </w:numPr>
+      </w:pPr>
+      <w:r>
+        <w:rPr>
+          <w:b/>
+          <w:bCs/>
+        </w:rPr>
+        <w:t xml:space="preserve">Là gì:</w:t>
+      </w:r>
+      <w:r>
+        <w:t xml:space="preserve"> </w:t>
+      </w:r>
+      <w:r>
+        <w:rPr>
+          <w:rFonts w:ascii="Consolas" w:eastAsia="Consolas" w:hAnsi="Consolas" w:cs="Consolas"/>
+        </w:rPr>
+        <w:t xml:space="preserve">RegisterAccountCommand</w:t>
+      </w:r>
+      <w:r>
+        <w:t xml:space="preserve"> là một record gom mọi dữ liệu đầu vào. Method nhận một tham số thay vì bảy; sau này thêm trường thì không phải sửa chữ ký của method.</w:t>
+      </w:r>
+    </w:p>
+    <w:p>
+      <w:pPr>
+        <w:pStyle w:val="ListParagraph"/>
+        <w:numPr>
+          <w:ilvl w:val="0"/>
+          <w:numId w:val="1"/>
+        </w:numPr>
+      </w:pPr>
+      <w:r>
+        <w:rPr>
+          <w:b/>
+          <w:bCs/>
+        </w:rPr>
+        <w:t xml:space="preserve">Dùng lại </w:t>
+      </w:r>
+      <w:r>
+        <w:rPr>
+          <w:rFonts w:ascii="Consolas" w:eastAsia="Consolas" w:hAnsi="Consolas" w:cs="Consolas"/>
+          <w:b/>
+          <w:bCs/>
+        </w:rPr>
+        <w:t xml:space="preserve">AccountProfile</w:t>
+      </w:r>
+      <w:r>
+        <w:rPr>
+          <w:b/>
+          <w:bCs/>
+        </w:rPr>
+        <w:t xml:space="preserve"> của F03:</w:t>
+      </w:r>
+      <w:r>
+        <w:t xml:space="preserve"> đây đúng là thứ </w:t>
+      </w:r>
+      <w:r>
+        <w:rPr>
+          <w:rFonts w:ascii="Consolas" w:eastAsia="Consolas" w:hAnsi="Consolas" w:cs="Consolas"/>
+        </w:rPr>
+        <w:t xml:space="preserve">getAccountProfile</w:t>
+      </w:r>
+      <w:r>
+        <w:t xml:space="preserve"> của connector trả về, nên F04 truyền thẳng vào.</w:t>
+      </w:r>
+    </w:p>
+    <w:p>
+      <w:pPr>
+        <w:pStyle w:val="ListParagraph"/>
+        <w:numPr>
+          <w:ilvl w:val="0"/>
+          <w:numId w:val="1"/>
+        </w:numPr>
+      </w:pPr>
+      <w:r>
+        <w:rPr>
+          <w:b/>
+          <w:bCs/>
+        </w:rPr>
+        <w:t xml:space="preserve">Bẫy:</w:t>
+      </w:r>
+      <w:r>
+        <w:t xml:space="preserve"> </w:t>
+      </w:r>
+      <w:r>
+        <w:rPr>
+          <w:rFonts w:ascii="Consolas" w:eastAsia="Consolas" w:hAnsi="Consolas" w:cs="Consolas"/>
+        </w:rPr>
+        <w:t xml:space="preserve">toString()</w:t>
+      </w:r>
+      <w:r>
+        <w:t xml:space="preserve"> tự sinh của record in </w:t>
+      </w:r>
+      <w:r>
+        <w:rPr>
+          <w:b/>
+          <w:bCs/>
+        </w:rPr>
+        <w:t xml:space="preserve">mọi</w:t>
+      </w:r>
+      <w:r>
+        <w:t xml:space="preserve"> field. Command có </w:t>
+      </w:r>
+      <w:r>
+        <w:rPr>
+          <w:rFonts w:ascii="Consolas" w:eastAsia="Consolas" w:hAnsi="Consolas" w:cs="Consolas"/>
+        </w:rPr>
+        <w:t xml:space="preserve">refreshToken</w:t>
+      </w:r>
+      <w:r>
+        <w:t xml:space="preserve">, nên chỉ cần một dòng log in command là token bị lộ. Lúc chạy test RED, kết quả có đúng chuỗi </w:t>
+      </w:r>
+      <w:r>
+        <w:rPr>
+          <w:rFonts w:ascii="Consolas" w:eastAsia="Consolas" w:hAnsi="Consolas" w:cs="Consolas"/>
+        </w:rPr>
+        <w:t xml:space="preserve">refreshToken=1//sample-refresh-token</w:t>
+      </w:r>
+      <w:r>
+        <w:t xml:space="preserve">; bây giờ chỗ đó in </w:t>
+      </w:r>
+      <w:r>
+        <w:rPr>
+          <w:rFonts w:ascii="Consolas" w:eastAsia="Consolas" w:hAnsi="Consolas" w:cs="Consolas"/>
+        </w:rPr>
+        <w:t xml:space="preserve">****</w:t>
+      </w:r>
+      <w:r>
+        <w:t xml:space="preserve">. Access token thì đã được </w:t>
+      </w:r>
+      <w:r>
+        <w:rPr>
+          <w:rFonts w:ascii="Consolas" w:eastAsia="Consolas" w:hAnsi="Consolas" w:cs="Consolas"/>
+        </w:rPr>
+        <w:t xml:space="preserve">OAuth2Credentials.toString()</w:t>
+      </w:r>
+      <w:r>
+        <w:t xml:space="preserve"> che sẵn.</w:t>
+      </w:r>
+    </w:p>
+    <w:p>
+      <w:pPr>
+        <w:pStyle w:val="ListParagraph"/>
+        <w:numPr>
+          <w:ilvl w:val="0"/>
+          <w:numId w:val="1"/>
+        </w:numPr>
+      </w:pPr>
+      <w:r>
+        <w:rPr>
+          <w:b/>
+          <w:bCs/>
+        </w:rPr>
+        <w:t xml:space="preserve">Một chỗ kiểm tra duy nhất:</w:t>
+      </w:r>
+      <w:r>
+        <w:t xml:space="preserve"> quy tắc "refresh token chỉ đi với OAuth2" để </w:t>
+      </w:r>
+      <w:r>
+        <w:rPr>
+          <w:rFonts w:ascii="Consolas" w:eastAsia="Consolas" w:hAnsi="Consolas" w:cs="Consolas"/>
+        </w:rPr>
+        <w:t xml:space="preserve">CredentialStore</w:t>
+      </w:r>
+      <w:r>
+        <w:t xml:space="preserve"> kiểm, không chép thêm vào command. Hai chỗ cùng kiểm một luật thì sớm muộn sẽ lệch nhau.</w:t>
       </w:r>
     </w:p>
     <w:p>
@@ -10635,7 +11189,689 @@
         <w:pStyle w:val="Heading2"/>
       </w:pPr>
       <w:r>
-        <w:t xml:space="preserve">19. Tự kiểm tra F02 (phần đã làm)</w:t>
+        <w:t xml:space="preserve">19. Kỹ thuật test mới trong F02</w:t>
+      </w:r>
+    </w:p>
+    <w:p>
+      <w:pPr>
+        <w:pStyle w:val="ListParagraph"/>
+        <w:numPr>
+          <w:ilvl w:val="0"/>
+          <w:numId w:val="1"/>
+        </w:numPr>
+      </w:pPr>
+      <w:r>
+        <w:rPr>
+          <w:rFonts w:ascii="Consolas" w:eastAsia="Consolas" w:hAnsi="Consolas" w:cs="Consolas"/>
+          <w:b/>
+          <w:bCs/>
+        </w:rPr>
+        <w:t xml:space="preserve">@DataJpaTest</w:t>
+      </w:r>
+      <w:r>
+        <w:rPr>
+          <w:b/>
+          <w:bCs/>
+        </w:rPr>
+        <w:t xml:space="preserve"> + </w:t>
+      </w:r>
+      <w:r>
+        <w:rPr>
+          <w:rFonts w:ascii="Consolas" w:eastAsia="Consolas" w:hAnsi="Consolas" w:cs="Consolas"/>
+          <w:b/>
+          <w:bCs/>
+        </w:rPr>
+        <w:t xml:space="preserve">@AutoConfigureTestDatabase(replace = NONE)</w:t>
+      </w:r>
+      <w:r>
+        <w:rPr>
+          <w:b/>
+          <w:bCs/>
+        </w:rPr>
+        <w:t xml:space="preserve">:</w:t>
+      </w:r>
+      <w:r>
+        <w:t xml:space="preserve"> slice chỉ nạp JPA và Flyway, chạy trên PostgreSQL thật (Testcontainers) để </w:t>
+      </w:r>
+      <w:r>
+        <w:rPr>
+          <w:rFonts w:ascii="Consolas" w:eastAsia="Consolas" w:hAnsi="Consolas" w:cs="Consolas"/>
+        </w:rPr>
+        <w:t xml:space="preserve">CHECK</w:t>
+      </w:r>
+      <w:r>
+        <w:t xml:space="preserve">, </w:t>
+      </w:r>
+      <w:r>
+        <w:rPr>
+          <w:rFonts w:ascii="Consolas" w:eastAsia="Consolas" w:hAnsi="Consolas" w:cs="Consolas"/>
+        </w:rPr>
+        <w:t xml:space="preserve">UNIQUE</w:t>
+      </w:r>
+      <w:r>
+        <w:t xml:space="preserve">, khóa ngoại hoạt động như production. Mỗi test tự rollback.</w:t>
+      </w:r>
+    </w:p>
+    <w:p>
+      <w:pPr>
+        <w:pStyle w:val="ListParagraph"/>
+        <w:numPr>
+          <w:ilvl w:val="0"/>
+          <w:numId w:val="1"/>
+        </w:numPr>
+      </w:pPr>
+      <w:r>
+        <w:rPr>
+          <w:rFonts w:ascii="Consolas" w:eastAsia="Consolas" w:hAnsi="Consolas" w:cs="Consolas"/>
+          <w:b/>
+          <w:bCs/>
+        </w:rPr>
+        <w:t xml:space="preserve">entityManager.clear()</w:t>
+      </w:r>
+      <w:r>
+        <w:rPr>
+          <w:b/>
+          <w:bCs/>
+        </w:rPr>
+        <w:t xml:space="preserve">:</w:t>
+      </w:r>
+      <w:r>
+        <w:t xml:space="preserve"> xóa bộ nhớ đệm của Hibernate để lần đọc sau thật sự đi xuống DB. Không có nó, test chỉ đọc lại object trong bộ nhớ.</w:t>
+      </w:r>
+    </w:p>
+    <w:p>
+      <w:pPr>
+        <w:pStyle w:val="ListParagraph"/>
+        <w:numPr>
+          <w:ilvl w:val="0"/>
+          <w:numId w:val="1"/>
+        </w:numPr>
+      </w:pPr>
+      <w:r>
+        <w:rPr>
+          <w:rFonts w:ascii="Consolas" w:eastAsia="Consolas" w:hAnsi="Consolas" w:cs="Consolas"/>
+          <w:b/>
+          <w:bCs/>
+        </w:rPr>
+        <w:t xml:space="preserve">JdbcTemplate</w:t>
+      </w:r>
+      <w:r>
+        <w:rPr>
+          <w:b/>
+          <w:bCs/>
+        </w:rPr>
+        <w:t xml:space="preserve">:</w:t>
+      </w:r>
+      <w:r>
+        <w:t xml:space="preserve"> chạy SQL thô để nhìn đúng cái nằm trong DB, hoặc để thử ràng buộc mà Java không tạo ra được (ví dụ ghi </w:t>
+      </w:r>
+      <w:r>
+        <w:rPr>
+          <w:rFonts w:ascii="Consolas" w:eastAsia="Consolas" w:hAnsi="Consolas" w:cs="Consolas"/>
+        </w:rPr>
+        <w:t xml:space="preserve">status = 'SYNCING'</w:t>
+      </w:r>
+      <w:r>
+        <w:t xml:space="preserve">).</w:t>
+      </w:r>
+    </w:p>
+    <w:p>
+      <w:pPr>
+        <w:pStyle w:val="ListParagraph"/>
+        <w:numPr>
+          <w:ilvl w:val="0"/>
+          <w:numId w:val="1"/>
+        </w:numPr>
+      </w:pPr>
+      <w:r>
+        <w:rPr>
+          <w:rFonts w:ascii="Consolas" w:eastAsia="Consolas" w:hAnsi="Consolas" w:cs="Consolas"/>
+          <w:b/>
+          <w:bCs/>
+        </w:rPr>
+        <w:t xml:space="preserve">ApplicationContextRunner</w:t>
+      </w:r>
+      <w:r>
+        <w:rPr>
+          <w:b/>
+          <w:bCs/>
+        </w:rPr>
+        <w:t xml:space="preserve"> cho kiểm tra khởi động:</w:t>
+      </w:r>
+      <w:r>
+        <w:t xml:space="preserve"> dựng một context nhỏ với cấu hình sai để chứng minh app </w:t>
+      </w:r>
+      <w:r>
+        <w:rPr>
+          <w:b/>
+          <w:bCs/>
+        </w:rPr>
+        <w:t xml:space="preserve">không</w:t>
+      </w:r>
+      <w:r>
+        <w:t xml:space="preserve"> start và thông báo không lộ secret.</w:t>
+      </w:r>
+    </w:p>
+    <w:p>
+      <w:pPr>
+        <w:pStyle w:val="ListParagraph"/>
+        <w:numPr>
+          <w:ilvl w:val="0"/>
+          <w:numId w:val="1"/>
+        </w:numPr>
+      </w:pPr>
+      <w:r>
+        <w:rPr>
+          <w:b/>
+          <w:bCs/>
+        </w:rPr>
+        <w:t xml:space="preserve">Mockito </w:t>
+      </w:r>
+      <w:r>
+        <w:rPr>
+          <w:rFonts w:ascii="Consolas" w:eastAsia="Consolas" w:hAnsi="Consolas" w:cs="Consolas"/>
+          <w:b/>
+          <w:bCs/>
+        </w:rPr>
+        <w:t xml:space="preserve">mock(...)</w:t>
+      </w:r>
+      <w:r>
+        <w:rPr>
+          <w:b/>
+          <w:bCs/>
+        </w:rPr>
+        <w:t xml:space="preserve"> trong unit test:</w:t>
+      </w:r>
+      <w:r>
+        <w:t xml:space="preserve"> </w:t>
+      </w:r>
+      <w:r>
+        <w:rPr>
+          <w:rFonts w:ascii="Consolas" w:eastAsia="Consolas" w:hAnsi="Consolas" w:cs="Consolas"/>
+        </w:rPr>
+        <w:t xml:space="preserve">OwnerCurrentUserTests</w:t>
+      </w:r>
+      <w:r>
+        <w:t xml:space="preserve"> giả repository để test </w:t>
+      </w:r>
+      <w:r>
+        <w:rPr>
+          <w:rFonts w:ascii="Consolas" w:eastAsia="Consolas" w:hAnsi="Consolas" w:cs="Consolas"/>
+        </w:rPr>
+        <w:t xml:space="preserve">CurrentUser</w:t>
+      </w:r>
+      <w:r>
+        <w:t xml:space="preserve"> mà không cần DB.</w:t>
+      </w:r>
+    </w:p>
+    <w:p>
+      <w:pPr>
+        <w:pStyle w:val="ListParagraph"/>
+        <w:numPr>
+          <w:ilvl w:val="0"/>
+          <w:numId w:val="1"/>
+        </w:numPr>
+      </w:pPr>
+      <w:r>
+        <w:rPr>
+          <w:b/>
+          <w:bCs/>
+        </w:rPr>
+        <w:t xml:space="preserve">Kiểm tra ngược ở mọi task:</w:t>
+      </w:r>
+    </w:p>
+    <w:p>
+      <w:pPr>
+        <w:pStyle w:val="ListParagraph"/>
+        <w:numPr>
+          <w:ilvl w:val="1"/>
+          <w:numId w:val="1"/>
+        </w:numPr>
+      </w:pPr>
+      <w:r>
+        <w:t xml:space="preserve">BE-09: bỏ bước tìm theo email → 2 test idempotent đỏ.</w:t>
+      </w:r>
+    </w:p>
+    <w:p>
+      <w:pPr>
+        <w:pStyle w:val="ListParagraph"/>
+        <w:numPr>
+          <w:ilvl w:val="1"/>
+          <w:numId w:val="1"/>
+        </w:numPr>
+      </w:pPr>
+      <w:r>
+        <w:t xml:space="preserve">BE-10: cho </w:t>
+      </w:r>
+      <w:r>
+        <w:rPr>
+          <w:rFonts w:ascii="Consolas" w:eastAsia="Consolas" w:hAnsi="Consolas" w:cs="Consolas"/>
+        </w:rPr>
+        <w:t xml:space="preserve">markHealthy</w:t>
+      </w:r>
+      <w:r>
+        <w:t xml:space="preserve"> gỡ </w:t>
+      </w:r>
+      <w:r>
+        <w:rPr>
+          <w:rFonts w:ascii="Consolas" w:eastAsia="Consolas" w:hAnsi="Consolas" w:cs="Consolas"/>
+        </w:rPr>
+        <w:t xml:space="preserve">AUTH_EXPIRED</w:t>
+      </w:r>
+      <w:r>
+        <w:t xml:space="preserve"> → đúng ô đó đỏ.</w:t>
+      </w:r>
+    </w:p>
+    <w:p>
+      <w:pPr>
+        <w:pStyle w:val="ListParagraph"/>
+        <w:numPr>
+          <w:ilvl w:val="1"/>
+          <w:numId w:val="1"/>
+        </w:numPr>
+      </w:pPr>
+      <w:r>
+        <w:t xml:space="preserve">BE-12: IV cố định → 1 test đỏ; bỏ AAD → 3 test đỏ; tag 96 bit → 2 test đỏ.</w:t>
+      </w:r>
+    </w:p>
+    <w:p>
+      <w:pPr>
+        <w:pStyle w:val="ListParagraph"/>
+        <w:numPr>
+          <w:ilvl w:val="1"/>
+          <w:numId w:val="1"/>
+        </w:numPr>
+      </w:pPr>
+      <w:r>
+        <w:t xml:space="preserve">BE-13: store "quên" ghi refresh token → test xoay khóa đỏ.</w:t>
+      </w:r>
+    </w:p>
+    <w:p>
+      <w:pPr>
+        <w:pStyle w:val="ListParagraph"/>
+        <w:numPr>
+          <w:ilvl w:val="1"/>
+          <w:numId w:val="1"/>
+        </w:numPr>
+      </w:pPr>
+      <w:r>
+        <w:t xml:space="preserve">BE-14: bỏ </w:t>
+      </w:r>
+      <w:r>
+        <w:rPr>
+          <w:rFonts w:ascii="Consolas" w:eastAsia="Consolas" w:hAnsi="Consolas" w:cs="Consolas"/>
+        </w:rPr>
+        <w:t xml:space="preserve">@Transactional</w:t>
+      </w:r>
+      <w:r>
+        <w:t xml:space="preserve"> → test rollback và test reconnect đỏ; không tìm account cũ → test reconnect đỏ (lỗi </w:t>
+      </w:r>
+      <w:r>
+        <w:rPr>
+          <w:rFonts w:ascii="Consolas" w:eastAsia="Consolas" w:hAnsi="Consolas" w:cs="Consolas"/>
+        </w:rPr>
+        <w:t xml:space="preserve">UNIQUE</w:t>
+      </w:r>
+      <w:r>
+        <w:t xml:space="preserve">); bỏ kiểm tra provider → test provider lạ đỏ; </w:t>
+      </w:r>
+      <w:r>
+        <w:rPr>
+          <w:rFonts w:ascii="Consolas" w:eastAsia="Consolas" w:hAnsi="Consolas" w:cs="Consolas"/>
+        </w:rPr>
+        <w:t xml:space="preserve">reconnected</w:t>
+      </w:r>
+      <w:r>
+        <w:t xml:space="preserve"> luôn </w:t>
+      </w:r>
+      <w:r>
+        <w:rPr>
+          <w:rFonts w:ascii="Consolas" w:eastAsia="Consolas" w:hAnsi="Consolas" w:cs="Consolas"/>
+        </w:rPr>
+        <w:t xml:space="preserve">false</w:t>
+      </w:r>
+      <w:r>
+        <w:t xml:space="preserve"> → test reconnect đỏ; publish trước khi lưu credential → test rollback đỏ; thêm một trường vào event → test payload đỏ.</w:t>
+      </w:r>
+    </w:p>
+    <w:p>
+      <w:pPr>
+        <w:pStyle w:val="ListParagraph"/>
+        <w:numPr>
+          <w:ilvl w:val="0"/>
+          <w:numId w:val="1"/>
+        </w:numPr>
+      </w:pPr>
+      <w:r>
+        <w:rPr>
+          <w:rFonts w:ascii="Consolas" w:eastAsia="Consolas" w:hAnsi="Consolas" w:cs="Consolas"/>
+          <w:b/>
+          <w:bCs/>
+        </w:rPr>
+        <w:t xml:space="preserve">@ApplicationModuleTest(mode = DIRECT_DEPENDENCIES)</w:t>
+      </w:r>
+      <w:r>
+        <w:rPr>
+          <w:b/>
+          <w:bCs/>
+        </w:rPr>
+        <w:t xml:space="preserve"> (Spring Modulith, BE-14):</w:t>
+      </w:r>
+      <w:r>
+        <w:t xml:space="preserve"> chỉ khởi động module </w:t>
+      </w:r>
+      <w:r>
+        <w:rPr>
+          <w:rFonts w:ascii="Consolas" w:eastAsia="Consolas" w:hAnsi="Consolas" w:cs="Consolas"/>
+        </w:rPr>
+        <w:t xml:space="preserve">account</w:t>
+      </w:r>
+      <w:r>
+        <w:t xml:space="preserve"> cộng các module nó dùng trực tiếp (</w:t>
+      </w:r>
+      <w:r>
+        <w:rPr>
+          <w:rFonts w:ascii="Consolas" w:eastAsia="Consolas" w:hAnsi="Consolas" w:cs="Consolas"/>
+        </w:rPr>
+        <w:t xml:space="preserve">provider</w:t>
+      </w:r>
+      <w:r>
+        <w:t xml:space="preserve">), không phải cả ứng dụng. Module </w:t>
+      </w:r>
+      <w:r>
+        <w:rPr>
+          <w:rFonts w:ascii="Consolas" w:eastAsia="Consolas" w:hAnsi="Consolas" w:cs="Consolas"/>
+        </w:rPr>
+        <w:t xml:space="preserve">identity</w:t>
+      </w:r>
+      <w:r>
+        <w:t xml:space="preserve"> không được nạp, nên test tự chèn owner vào </w:t>
+      </w:r>
+      <w:r>
+        <w:rPr>
+          <w:rFonts w:ascii="Consolas" w:eastAsia="Consolas" w:hAnsi="Consolas" w:cs="Consolas"/>
+        </w:rPr>
+        <w:t xml:space="preserve">app_user</w:t>
+      </w:r>
+      <w:r>
+        <w:t xml:space="preserve"> bằng </w:t>
+      </w:r>
+      <w:r>
+        <w:rPr>
+          <w:rFonts w:ascii="Consolas" w:eastAsia="Consolas" w:hAnsi="Consolas" w:cs="Consolas"/>
+        </w:rPr>
+        <w:t xml:space="preserve">JdbcTemplate</w:t>
+      </w:r>
+      <w:r>
+        <w:t xml:space="preserve">.</w:t>
+      </w:r>
+    </w:p>
+    <w:p>
+      <w:pPr>
+        <w:pStyle w:val="ListParagraph"/>
+        <w:numPr>
+          <w:ilvl w:val="0"/>
+          <w:numId w:val="1"/>
+        </w:numPr>
+      </w:pPr>
+      <w:r>
+        <w:rPr>
+          <w:b/>
+          <w:bCs/>
+        </w:rPr>
+        <w:t xml:space="preserve">Test không có </w:t>
+      </w:r>
+      <w:r>
+        <w:rPr>
+          <w:rFonts w:ascii="Consolas" w:eastAsia="Consolas" w:hAnsi="Consolas" w:cs="Consolas"/>
+          <w:b/>
+          <w:bCs/>
+        </w:rPr>
+        <w:t xml:space="preserve">@Transactional</w:t>
+      </w:r>
+      <w:r>
+        <w:rPr>
+          <w:b/>
+          <w:bCs/>
+        </w:rPr>
+        <w:t xml:space="preserve">:</w:t>
+      </w:r>
+      <w:r>
+        <w:t xml:space="preserve"> để service tự commit hoặc rollback như khi chạy thật. Cái giá là dữ liệu ở lại sau mỗi test, nên </w:t>
+      </w:r>
+      <w:r>
+        <w:rPr>
+          <w:rFonts w:ascii="Consolas" w:eastAsia="Consolas" w:hAnsi="Consolas" w:cs="Consolas"/>
+        </w:rPr>
+        <w:t xml:space="preserve">@BeforeEach</w:t>
+      </w:r>
+      <w:r>
+        <w:t xml:space="preserve"> tự dọn bảng bằng </w:t>
+      </w:r>
+      <w:r>
+        <w:rPr>
+          <w:rFonts w:ascii="Consolas" w:eastAsia="Consolas" w:hAnsi="Consolas" w:cs="Consolas"/>
+        </w:rPr>
+        <w:t xml:space="preserve">JdbcTestUtils.deleteFromTables</w:t>
+      </w:r>
+      <w:r>
+        <w:t xml:space="preserve">.</w:t>
+      </w:r>
+    </w:p>
+    <w:p>
+      <w:pPr>
+        <w:pStyle w:val="ListParagraph"/>
+        <w:numPr>
+          <w:ilvl w:val="0"/>
+          <w:numId w:val="1"/>
+        </w:numPr>
+      </w:pPr>
+      <w:r>
+        <w:rPr>
+          <w:rFonts w:ascii="Consolas" w:eastAsia="Consolas" w:hAnsi="Consolas" w:cs="Consolas"/>
+          <w:b/>
+          <w:bCs/>
+        </w:rPr>
+        <w:t xml:space="preserve">AssertablePublishedEvents</w:t>
+      </w:r>
+      <w:r>
+        <w:rPr>
+          <w:b/>
+          <w:bCs/>
+        </w:rPr>
+        <w:t xml:space="preserve"> làm tham số của method test:</w:t>
+      </w:r>
+      <w:r>
+        <w:t xml:space="preserve"> Spring Modulith ghi lại mọi event được publish trong test đó; </w:t>
+      </w:r>
+      <w:r>
+        <w:rPr>
+          <w:rFonts w:ascii="Consolas" w:eastAsia="Consolas" w:hAnsi="Consolas" w:cs="Consolas"/>
+        </w:rPr>
+        <w:t xml:space="preserve">events.ofType(AccountConnected.class)</w:t>
+      </w:r>
+      <w:r>
+        <w:t xml:space="preserve"> lấy ra để kiểm tra số lượng và nội dung.</w:t>
+      </w:r>
+    </w:p>
+    <w:p>
+      <w:pPr>
+        <w:pStyle w:val="ListParagraph"/>
+        <w:numPr>
+          <w:ilvl w:val="0"/>
+          <w:numId w:val="1"/>
+        </w:numPr>
+      </w:pPr>
+      <w:r>
+        <w:rPr>
+          <w:rFonts w:ascii="Consolas" w:eastAsia="Consolas" w:hAnsi="Consolas" w:cs="Consolas"/>
+          <w:b/>
+          <w:bCs/>
+        </w:rPr>
+        <w:t xml:space="preserve">@MockitoSpyBean</w:t>
+      </w:r>
+      <w:r>
+        <w:rPr>
+          <w:b/>
+          <w:bCs/>
+        </w:rPr>
+        <w:t xml:space="preserve">:</w:t>
+      </w:r>
+      <w:r>
+        <w:t xml:space="preserve"> bọc bean thật. Bình thường nó chạy code thật; riêng một test bảo nó ném lỗi bằng </w:t>
+      </w:r>
+      <w:r>
+        <w:rPr>
+          <w:rFonts w:ascii="Consolas" w:eastAsia="Consolas" w:hAnsi="Consolas" w:cs="Consolas"/>
+        </w:rPr>
+        <w:t xml:space="preserve">doThrow(...).when(credentials).save(any(), any(), any())</w:t>
+      </w:r>
+      <w:r>
+        <w:t xml:space="preserve">, để giả lập "lưu credential thất bại" mà không sửa code production. Assertion vẫn kiểm tra DB thật, không kiểm tra mock.</w:t>
+      </w:r>
+    </w:p>
+    <w:p>
+      <w:pPr>
+        <w:pStyle w:val="ListParagraph"/>
+        <w:numPr>
+          <w:ilvl w:val="0"/>
+          <w:numId w:val="1"/>
+        </w:numPr>
+      </w:pPr>
+      <w:r>
+        <w:rPr>
+          <w:b/>
+          <w:bCs/>
+        </w:rPr>
+        <w:t xml:space="preserve">Bean riêng cho test:</w:t>
+      </w:r>
+      <w:r>
+        <w:t xml:space="preserve"> một class </w:t>
+      </w:r>
+      <w:r>
+        <w:rPr>
+          <w:rFonts w:ascii="Consolas" w:eastAsia="Consolas" w:hAnsi="Consolas" w:cs="Consolas"/>
+        </w:rPr>
+        <w:t xml:space="preserve">@TestConfiguration</w:t>
+      </w:r>
+      <w:r>
+        <w:t xml:space="preserve"> lồng trong class test tạo </w:t>
+      </w:r>
+      <w:r>
+        <w:rPr>
+          <w:rFonts w:ascii="Consolas" w:eastAsia="Consolas" w:hAnsi="Consolas" w:cs="Consolas"/>
+        </w:rPr>
+        <w:t xml:space="preserve">FakeMessageProvider</w:t>
+      </w:r>
+      <w:r>
+        <w:t xml:space="preserve"> loại </w:t>
+      </w:r>
+      <w:r>
+        <w:rPr>
+          <w:rFonts w:ascii="Consolas" w:eastAsia="Consolas" w:hAnsi="Consolas" w:cs="Consolas"/>
+        </w:rPr>
+        <w:t xml:space="preserve">fake</w:t>
+      </w:r>
+      <w:r>
+        <w:t xml:space="preserve"> làm bean, để </w:t>
+      </w:r>
+      <w:r>
+        <w:rPr>
+          <w:rFonts w:ascii="Consolas" w:eastAsia="Consolas" w:hAnsi="Consolas" w:cs="Consolas"/>
+        </w:rPr>
+        <w:t xml:space="preserve">ProviderRegistry</w:t>
+      </w:r>
+      <w:r>
+        <w:t xml:space="preserve"> thấy provider này.</w:t>
+      </w:r>
+    </w:p>
+    <w:p>
+      <w:pPr>
+        <w:pStyle w:val="ListParagraph"/>
+        <w:numPr>
+          <w:ilvl w:val="0"/>
+          <w:numId w:val="1"/>
+        </w:numPr>
+      </w:pPr>
+      <w:r>
+        <w:rPr>
+          <w:rFonts w:ascii="Consolas" w:eastAsia="Consolas" w:hAnsi="Consolas" w:cs="Consolas"/>
+          <w:b/>
+          <w:bCs/>
+        </w:rPr>
+        <w:t xml:space="preserve">row_to_json(c)::text</w:t>
+      </w:r>
+      <w:r>
+        <w:rPr>
+          <w:b/>
+          <w:bCs/>
+        </w:rPr>
+        <w:t xml:space="preserve"> của PostgreSQL:</w:t>
+      </w:r>
+      <w:r>
+        <w:t xml:space="preserve"> biến cả một dòng thành chuỗi JSON để kiểm tra bằng một lệnh rằng </w:t>
+      </w:r>
+      <w:r>
+        <w:rPr>
+          <w:b/>
+          <w:bCs/>
+        </w:rPr>
+        <w:t xml:space="preserve">không cột nào</w:t>
+      </w:r>
+      <w:r>
+        <w:t xml:space="preserve"> chứa token dạng chữ.</w:t>
+      </w:r>
+    </w:p>
+    <w:p>
+      <w:pPr>
+        <w:pStyle w:val="ListParagraph"/>
+        <w:numPr>
+          <w:ilvl w:val="0"/>
+          <w:numId w:val="1"/>
+        </w:numPr>
+      </w:pPr>
+      <w:r>
+        <w:rPr>
+          <w:rFonts w:ascii="Consolas" w:eastAsia="Consolas" w:hAnsi="Consolas" w:cs="Consolas"/>
+          <w:b/>
+          <w:bCs/>
+        </w:rPr>
+        <w:t xml:space="preserve">entityManager.flush()</w:t>
+      </w:r>
+      <w:r>
+        <w:rPr>
+          <w:b/>
+          <w:bCs/>
+        </w:rPr>
+        <w:t xml:space="preserve"> để lộ lỗi:</w:t>
+      </w:r>
+      <w:r>
+        <w:t xml:space="preserve"> trong </w:t>
+      </w:r>
+      <w:r>
+        <w:rPr>
+          <w:rFonts w:ascii="Consolas" w:eastAsia="Consolas" w:hAnsi="Consolas" w:cs="Consolas"/>
+        </w:rPr>
+        <w:t xml:space="preserve">@DataJpaTest</w:t>
+      </w:r>
+      <w:r>
+        <w:t xml:space="preserve">, lệnh ghi chỉ thật sự xuống DB khi flush. Muốn thấy lỗi khóa ngoại thì phải flush ngay trong đoạn code đang chờ lỗi; test còn kiểm tra cả stack trace của lỗi đó không chứa token.</w:t>
+      </w:r>
+    </w:p>
+    <w:p>
+      <w:pPr>
+        <w:pBdr>
+          <w:bottom w:val="single" w:sz="4" w:space="0" w:color="auto"/>
+        </w:pBdr>
+        <w:ind w:left="0"/>
+      </w:pPr>
+    </w:p>
+    <w:p>
+      <w:pPr>
+        <w:pStyle w:val="Heading2"/>
+      </w:pPr>
+      <w:r>
+        <w:t xml:space="preserve">20. Tự kiểm tra F02 (phần đã làm)</w:t>
       </w:r>
     </w:p>
     <w:p>
@@ -10882,6 +12118,99 @@
       </w:r>
       <w:r>
         <w:t xml:space="preserve"> thì credential của nó đi đâu, và nhờ đâu?</w:t>
+      </w:r>
+    </w:p>
+    <w:p>
+      <w:pPr>
+        <w:pStyle w:val="ListParagraph"/>
+        <w:numPr>
+          <w:ilvl w:val="0"/>
+          <w:numId w:val="101"/>
+        </w:numPr>
+      </w:pPr>
+      <w:r>
+        <w:t xml:space="preserve">Vì sao service đăng ký không gọi Google bên trong transaction?</w:t>
+      </w:r>
+    </w:p>
+    <w:p>
+      <w:pPr>
+        <w:pStyle w:val="ListParagraph"/>
+        <w:numPr>
+          <w:ilvl w:val="0"/>
+          <w:numId w:val="101"/>
+        </w:numPr>
+      </w:pPr>
+      <w:r>
+        <w:t xml:space="preserve">Bỏ </w:t>
+      </w:r>
+      <w:r>
+        <w:rPr>
+          <w:rFonts w:ascii="Consolas" w:eastAsia="Consolas" w:hAnsi="Consolas" w:cs="Consolas"/>
+        </w:rPr>
+        <w:t xml:space="preserve">@Transactional</w:t>
+      </w:r>
+      <w:r>
+        <w:t xml:space="preserve"> khỏi </w:t>
+      </w:r>
+      <w:r>
+        <w:rPr>
+          <w:rFonts w:ascii="Consolas" w:eastAsia="Consolas" w:hAnsi="Consolas" w:cs="Consolas"/>
+        </w:rPr>
+        <w:t xml:space="preserve">register</w:t>
+      </w:r>
+      <w:r>
+        <w:t xml:space="preserve"> thì hai lỗi nào xuất hiện, và vì sao lỗi thứ hai liên quan đến "dirty checking"?</w:t>
+      </w:r>
+    </w:p>
+    <w:p>
+      <w:pPr>
+        <w:pStyle w:val="ListParagraph"/>
+        <w:numPr>
+          <w:ilvl w:val="0"/>
+          <w:numId w:val="101"/>
+        </w:numPr>
+      </w:pPr>
+      <w:r>
+        <w:t xml:space="preserve">Vì sao event </w:t>
+      </w:r>
+      <w:r>
+        <w:rPr>
+          <w:rFonts w:ascii="Consolas" w:eastAsia="Consolas" w:hAnsi="Consolas" w:cs="Consolas"/>
+        </w:rPr>
+        <w:t xml:space="preserve">AccountConnected</w:t>
+      </w:r>
+      <w:r>
+        <w:t xml:space="preserve"> không chứa email hay tên account?</w:t>
+      </w:r>
+    </w:p>
+    <w:p>
+      <w:pPr>
+        <w:pStyle w:val="ListParagraph"/>
+        <w:numPr>
+          <w:ilvl w:val="0"/>
+          <w:numId w:val="101"/>
+        </w:numPr>
+      </w:pPr>
+      <w:r>
+        <w:t xml:space="preserve">Vì sao </w:t>
+      </w:r>
+      <w:r>
+        <w:rPr>
+          <w:rFonts w:ascii="Consolas" w:eastAsia="Consolas" w:hAnsi="Consolas" w:cs="Consolas"/>
+        </w:rPr>
+        <w:t xml:space="preserve">RegisterAccountCommand</w:t>
+      </w:r>
+      <w:r>
+        <w:t xml:space="preserve"> phải tự viết </w:t>
+      </w:r>
+      <w:r>
+        <w:rPr>
+          <w:rFonts w:ascii="Consolas" w:eastAsia="Consolas" w:hAnsi="Consolas" w:cs="Consolas"/>
+        </w:rPr>
+        <w:t xml:space="preserve">toString()</w:t>
+      </w:r>
+      <w:r>
+        <w:t xml:space="preserve">?</w:t>
       </w:r>
     </w:p>
     <w:p>
@@ -10890,7 +12219,7 @@
           <w:i/>
           <w:iCs/>
         </w:rPr>
-        <w:t xml:space="preserve">(Phần BE-14…BE-18 — use case đăng ký, REST API, xóa account, nghiệm thu — sẽ được bổ sung khi làm.)</w:t>
+        <w:t xml:space="preserve">(Phần BE-15…BE-18 — REST API, xóa account, nghiệm thu — sẽ được bổ sung khi làm.)</w:t>
       </w:r>
     </w:p>
     <w:sectPr>

</xml_diff>

<commit_message>
docs(knowledge): add BE-15 (account read API) to the Phase 0 guide
New section 19 follows a GET /api/accounts/{id} request through the
layers and explains the owner filter in every query signature, 404
rather than 403 for another user's account, the explicit DTO with a
pinned field set, ProviderRegistry.find for a removed connector and
read-only transactions. The test section gains the full-stack MockMvc
test and pinned timestamps; four self-check questions added. The Word
copy is regenerated (docs check clean) and the new pages were inspected.

Since BE-15 the account module also uses identity and common, so the
BE-14 module test now boots them too: its Javadoc and the guide no
longer say "provider" only.

Co-Authored-By: Claude Opus 5.5 (1M context) <noreply@anthropic.com>
</commit_message>
<xml_diff>
--- a/docs/knowledge/phase-0-backend-foundation.docx
+++ b/docs/knowledge/phase-0-backend-foundation.docx
@@ -97,7 +97,7 @@
         <w:t xml:space="preserve">Phạm vi:</w:t>
       </w:r>
       <w:r>
-        <w:t xml:space="preserve"> F01 Project Foundation và F03 Provider Contract (mục 0–12); F02 Connected Accounts (mục 13–20, đang làm: xong BE-09…BE-14).</w:t>
+        <w:t xml:space="preserve"> F01 Project Foundation và F03 Provider Contract (mục 0–12); F02 Connected Accounts (mục 13–21, đang làm: xong BE-09…BE-15).</w:t>
         <w:br/>
       </w:r>
       <w:r>
@@ -7236,7 +7236,7 @@
           </w:tcPr>
           <w:p>
             <w:r>
-              <w:t xml:space="preserve">BE-15…BE-18</w:t>
+              <w:t xml:space="preserve">BE-15</w:t>
             </w:r>
           </w:p>
         </w:tc>
@@ -7246,7 +7246,54 @@
           </w:tcPr>
           <w:p>
             <w:r>
-              <w:t xml:space="preserve">REST API, xóa, nghiệm thu</w:t>
+              <w:t xml:space="preserve">API đọc: </w:t>
+            </w:r>
+            <w:r>
+              <w:rPr>
+                <w:rFonts w:ascii="Consolas" w:eastAsia="Consolas" w:hAnsi="Consolas" w:cs="Consolas"/>
+              </w:rPr>
+              <w:t xml:space="preserve">GET /api/accounts</w:t>
+            </w:r>
+            <w:r>
+              <w:t xml:space="preserve">, </w:t>
+            </w:r>
+            <w:r>
+              <w:rPr>
+                <w:rFonts w:ascii="Consolas" w:eastAsia="Consolas" w:hAnsi="Consolas" w:cs="Consolas"/>
+              </w:rPr>
+              <w:t xml:space="preserve">GET /api/accounts/{id}</w:t>
+            </w:r>
+          </w:p>
+        </w:tc>
+        <w:tc>
+          <w:tcPr>
+            <w:tcW w:w="3120" w:type="dxa"/>
+          </w:tcPr>
+          <w:p>
+            <w:r>
+              <w:t xml:space="preserve">xong</w:t>
+            </w:r>
+          </w:p>
+        </w:tc>
+      </w:tr>
+      <w:tr>
+        <w:tc>
+          <w:tcPr>
+            <w:tcW w:w="3120" w:type="dxa"/>
+          </w:tcPr>
+          <w:p>
+            <w:r>
+              <w:t xml:space="preserve">BE-16…BE-18</w:t>
+            </w:r>
+          </w:p>
+        </w:tc>
+        <w:tc>
+          <w:tcPr>
+            <w:tcW w:w="3120" w:type="dxa"/>
+          </w:tcPr>
+          <w:p>
+            <w:r>
+              <w:t xml:space="preserve">Sửa account (PATCH), xóa, nghiệm thu</w:t>
             </w:r>
           </w:p>
         </w:tc>
@@ -11189,55 +11236,40 @@
         <w:pStyle w:val="Heading2"/>
       </w:pPr>
       <w:r>
-        <w:t xml:space="preserve">19. Kỹ thuật test mới trong F02</w:t>
-      </w:r>
-    </w:p>
-    <w:p>
-      <w:pPr>
-        <w:pStyle w:val="ListParagraph"/>
-        <w:numPr>
-          <w:ilvl w:val="0"/>
-          <w:numId w:val="1"/>
-        </w:numPr>
-      </w:pPr>
-      <w:r>
-        <w:rPr>
-          <w:rFonts w:ascii="Consolas" w:eastAsia="Consolas" w:hAnsi="Consolas" w:cs="Consolas"/>
-          <w:b/>
-          <w:bCs/>
-        </w:rPr>
-        <w:t xml:space="preserve">@DataJpaTest</w:t>
-      </w:r>
-      <w:r>
-        <w:rPr>
-          <w:b/>
-          <w:bCs/>
-        </w:rPr>
-        <w:t xml:space="preserve"> + </w:t>
-      </w:r>
-      <w:r>
-        <w:rPr>
-          <w:rFonts w:ascii="Consolas" w:eastAsia="Consolas" w:hAnsi="Consolas" w:cs="Consolas"/>
-          <w:b/>
-          <w:bCs/>
-        </w:rPr>
-        <w:t xml:space="preserve">@AutoConfigureTestDatabase(replace = NONE)</w:t>
-      </w:r>
-      <w:r>
-        <w:rPr>
-          <w:b/>
-          <w:bCs/>
-        </w:rPr>
-        <w:t xml:space="preserve">:</w:t>
-      </w:r>
-      <w:r>
-        <w:t xml:space="preserve"> slice chỉ nạp JPA và Flyway, chạy trên PostgreSQL thật (Testcontainers) để </w:t>
-      </w:r>
-      <w:r>
-        <w:rPr>
-          <w:rFonts w:ascii="Consolas" w:eastAsia="Consolas" w:hAnsi="Consolas" w:cs="Consolas"/>
-        </w:rPr>
-        <w:t xml:space="preserve">CHECK</w:t>
+        <w:t xml:space="preserve">19. API đọc account (BE-15)</w:t>
+      </w:r>
+    </w:p>
+    <w:p>
+      <w:pPr>
+        <w:pStyle w:val="Heading3"/>
+      </w:pPr>
+      <w:r>
+        <w:t xml:space="preserve">19.1 Đường đi của một request</w:t>
+      </w:r>
+    </w:p>
+    <w:p>
+      <w:pPr>
+        <w:pStyle w:val="ListParagraph"/>
+        <w:numPr>
+          <w:ilvl w:val="0"/>
+          <w:numId w:val="1"/>
+        </w:numPr>
+      </w:pPr>
+      <w:r>
+        <w:rPr>
+          <w:b/>
+          <w:bCs/>
+        </w:rPr>
+        <w:t xml:space="preserve">Ở đâu:</w:t>
+      </w:r>
+      <w:r>
+        <w:t xml:space="preserve"> </w:t>
+      </w:r>
+      <w:r>
+        <w:rPr>
+          <w:rFonts w:ascii="Consolas" w:eastAsia="Consolas" w:hAnsi="Consolas" w:cs="Consolas"/>
+        </w:rPr>
+        <w:t xml:space="preserve">account/api/AccountsController.java</w:t>
       </w:r>
       <w:r>
         <w:t xml:space="preserve">, </w:t>
@@ -11246,153 +11278,118 @@
         <w:rPr>
           <w:rFonts w:ascii="Consolas" w:eastAsia="Consolas" w:hAnsi="Consolas" w:cs="Consolas"/>
         </w:rPr>
-        <w:t xml:space="preserve">UNIQUE</w:t>
-      </w:r>
-      <w:r>
-        <w:t xml:space="preserve">, khóa ngoại hoạt động như production. Mỗi test tự rollback.</w:t>
-      </w:r>
-    </w:p>
-    <w:p>
-      <w:pPr>
-        <w:pStyle w:val="ListParagraph"/>
-        <w:numPr>
-          <w:ilvl w:val="0"/>
-          <w:numId w:val="1"/>
-        </w:numPr>
-      </w:pPr>
-      <w:r>
-        <w:rPr>
-          <w:rFonts w:ascii="Consolas" w:eastAsia="Consolas" w:hAnsi="Consolas" w:cs="Consolas"/>
-          <w:b/>
-          <w:bCs/>
-        </w:rPr>
-        <w:t xml:space="preserve">entityManager.clear()</w:t>
-      </w:r>
-      <w:r>
-        <w:rPr>
-          <w:b/>
-          <w:bCs/>
-        </w:rPr>
-        <w:t xml:space="preserve">:</w:t>
-      </w:r>
-      <w:r>
-        <w:t xml:space="preserve"> xóa bộ nhớ đệm của Hibernate để lần đọc sau thật sự đi xuống DB. Không có nó, test chỉ đọc lại object trong bộ nhớ.</w:t>
-      </w:r>
-    </w:p>
-    <w:p>
-      <w:pPr>
-        <w:pStyle w:val="ListParagraph"/>
-        <w:numPr>
-          <w:ilvl w:val="0"/>
-          <w:numId w:val="1"/>
-        </w:numPr>
-      </w:pPr>
-      <w:r>
-        <w:rPr>
-          <w:rFonts w:ascii="Consolas" w:eastAsia="Consolas" w:hAnsi="Consolas" w:cs="Consolas"/>
-          <w:b/>
-          <w:bCs/>
-        </w:rPr>
-        <w:t xml:space="preserve">JdbcTemplate</w:t>
-      </w:r>
-      <w:r>
-        <w:rPr>
-          <w:b/>
-          <w:bCs/>
-        </w:rPr>
-        <w:t xml:space="preserve">:</w:t>
-      </w:r>
-      <w:r>
-        <w:t xml:space="preserve"> chạy SQL thô để nhìn đúng cái nằm trong DB, hoặc để thử ràng buộc mà Java không tạo ra được (ví dụ ghi </w:t>
-      </w:r>
-      <w:r>
-        <w:rPr>
-          <w:rFonts w:ascii="Consolas" w:eastAsia="Consolas" w:hAnsi="Consolas" w:cs="Consolas"/>
-        </w:rPr>
-        <w:t xml:space="preserve">status = 'SYNCING'</w:t>
-      </w:r>
-      <w:r>
-        <w:t xml:space="preserve">).</w:t>
-      </w:r>
-    </w:p>
-    <w:p>
-      <w:pPr>
-        <w:pStyle w:val="ListParagraph"/>
-        <w:numPr>
-          <w:ilvl w:val="0"/>
-          <w:numId w:val="1"/>
-        </w:numPr>
-      </w:pPr>
-      <w:r>
-        <w:rPr>
-          <w:rFonts w:ascii="Consolas" w:eastAsia="Consolas" w:hAnsi="Consolas" w:cs="Consolas"/>
-          <w:b/>
-          <w:bCs/>
-        </w:rPr>
-        <w:t xml:space="preserve">ApplicationContextRunner</w:t>
-      </w:r>
-      <w:r>
-        <w:rPr>
-          <w:b/>
-          <w:bCs/>
-        </w:rPr>
-        <w:t xml:space="preserve"> cho kiểm tra khởi động:</w:t>
-      </w:r>
-      <w:r>
-        <w:t xml:space="preserve"> dựng một context nhỏ với cấu hình sai để chứng minh app </w:t>
-      </w:r>
-      <w:r>
-        <w:rPr>
-          <w:b/>
-          <w:bCs/>
-        </w:rPr>
-        <w:t xml:space="preserve">không</w:t>
-      </w:r>
-      <w:r>
-        <w:t xml:space="preserve"> start và thông báo không lộ secret.</w:t>
-      </w:r>
-    </w:p>
-    <w:p>
-      <w:pPr>
-        <w:pStyle w:val="ListParagraph"/>
-        <w:numPr>
-          <w:ilvl w:val="0"/>
-          <w:numId w:val="1"/>
-        </w:numPr>
-      </w:pPr>
-      <w:r>
-        <w:rPr>
-          <w:b/>
-          <w:bCs/>
-        </w:rPr>
-        <w:t xml:space="preserve">Mockito </w:t>
-      </w:r>
-      <w:r>
-        <w:rPr>
-          <w:rFonts w:ascii="Consolas" w:eastAsia="Consolas" w:hAnsi="Consolas" w:cs="Consolas"/>
-          <w:b/>
-          <w:bCs/>
-        </w:rPr>
-        <w:t xml:space="preserve">mock(...)</w:t>
-      </w:r>
-      <w:r>
-        <w:rPr>
-          <w:b/>
-          <w:bCs/>
-        </w:rPr>
-        <w:t xml:space="preserve"> trong unit test:</w:t>
-      </w:r>
-      <w:r>
-        <w:t xml:space="preserve"> </w:t>
-      </w:r>
-      <w:r>
-        <w:rPr>
-          <w:rFonts w:ascii="Consolas" w:eastAsia="Consolas" w:hAnsi="Consolas" w:cs="Consolas"/>
-        </w:rPr>
-        <w:t xml:space="preserve">OwnerCurrentUserTests</w:t>
-      </w:r>
-      <w:r>
-        <w:t xml:space="preserve"> giả repository để test </w:t>
+        <w:t xml:space="preserve">account/api/AccountResponse.java</w:t>
+      </w:r>
+      <w:r>
+        <w:t xml:space="preserve">, </w:t>
+      </w:r>
+      <w:r>
+        <w:rPr>
+          <w:rFonts w:ascii="Consolas" w:eastAsia="Consolas" w:hAnsi="Consolas" w:cs="Consolas"/>
+        </w:rPr>
+        <w:t xml:space="preserve">account/application/AccountQueryService.java</w:t>
+      </w:r>
+      <w:r>
+        <w:t xml:space="preserve">, </w:t>
+      </w:r>
+      <w:r>
+        <w:rPr>
+          <w:rFonts w:ascii="Consolas" w:eastAsia="Consolas" w:hAnsi="Consolas" w:cs="Consolas"/>
+        </w:rPr>
+        <w:t xml:space="preserve">account/application/AccountErrorCode.java</w:t>
+      </w:r>
+      <w:r>
+        <w:t xml:space="preserve">.</w:t>
+      </w:r>
+    </w:p>
+    <w:p>
+      <w:pPr>
+        <w:shd w:val="clear" w:color="auto" w:fill="F2F3F5"/>
+        <w:ind w:left="0"/>
+      </w:pPr>
+      <w:r>
+        <w:rPr>
+          <w:rFonts w:ascii="Consolas" w:eastAsia="Consolas" w:hAnsi="Consolas" w:cs="Consolas"/>
+          <w:sz w:val="19"/>
+          <w:szCs w:val="19"/>
+        </w:rPr>
+        <w:t xml:space="preserve">GET /api/accounts/{id}   (HTTP Basic)</w:t>
+        <w:br/>
+        <w:t xml:space="preserve">  |</w:t>
+        <w:br/>
+        <w:t xml:space="preserve">  v</w:t>
+        <w:br/>
+        <w:t xml:space="preserve">Security filter chain             chưa đăng nhập -&gt; 401 UNAUTHORIZED</w:t>
+        <w:br/>
+        <w:t xml:space="preserve">  |</w:t>
+        <w:br/>
+        <w:t xml:space="preserve">  v</w:t>
+        <w:br/>
+        <w:t xml:space="preserve">AccountsController.get(id)        id không phải UUID -&gt; 400 MALFORMED_REQUEST</w:t>
+        <w:br/>
+        <w:t xml:space="preserve">  |   ownerId = currentUser.requireOwnerId()</w:t>
+        <w:br/>
+        <w:t xml:space="preserve">  v</w:t>
+        <w:br/>
+        <w:t xml:space="preserve">AccountQueryService.get(ownerId, id)        @Transactional(readOnly = true)</w:t>
+        <w:br/>
+        <w:t xml:space="preserve">  |   repository.findByIdAndOwnerId(id, ownerId)</w:t>
+        <w:br/>
+        <w:t xml:space="preserve">  |   không thấy -&gt; SinoException(ACCOUNT_NOT_FOUND) -&gt; 404</w:t>
+        <w:br/>
+        <w:t xml:space="preserve">  v</w:t>
+        <w:br/>
+        <w:t xml:space="preserve">AccountResponse.from(account, capabilities)  -&gt; JSON</w:t>
+      </w:r>
+    </w:p>
+    <w:p>
+      <w:pPr>
+        <w:pStyle w:val="Heading3"/>
+      </w:pPr>
+      <w:r>
+        <w:t xml:space="preserve">19.2 Lọc theo owner ngay trong chữ ký method</w:t>
+      </w:r>
+    </w:p>
+    <w:p>
+      <w:pPr>
+        <w:pStyle w:val="ListParagraph"/>
+        <w:numPr>
+          <w:ilvl w:val="0"/>
+          <w:numId w:val="1"/>
+        </w:numPr>
+      </w:pPr>
+      <w:r>
+        <w:t xml:space="preserve">Mọi method của </w:t>
+      </w:r>
+      <w:r>
+        <w:rPr>
+          <w:rFonts w:ascii="Consolas" w:eastAsia="Consolas" w:hAnsi="Consolas" w:cs="Consolas"/>
+        </w:rPr>
+        <w:t xml:space="preserve">AccountQueryService</w:t>
+      </w:r>
+      <w:r>
+        <w:t xml:space="preserve"> nhận </w:t>
+      </w:r>
+      <w:r>
+        <w:rPr>
+          <w:rFonts w:ascii="Consolas" w:eastAsia="Consolas" w:hAnsi="Consolas" w:cs="Consolas"/>
+        </w:rPr>
+        <w:t xml:space="preserve">ownerId</w:t>
+      </w:r>
+      <w:r>
+        <w:t xml:space="preserve">; không có method "lấy account theo ID" mà không cần owner. Vì vậy không thể quên lọc: thiếu owner thì code không biên dịch.</w:t>
+      </w:r>
+    </w:p>
+    <w:p>
+      <w:pPr>
+        <w:pStyle w:val="ListParagraph"/>
+        <w:numPr>
+          <w:ilvl w:val="0"/>
+          <w:numId w:val="1"/>
+        </w:numPr>
+      </w:pPr>
+      <w:r>
+        <w:t xml:space="preserve">Controller lấy owner từ </w:t>
       </w:r>
       <w:r>
         <w:rPr>
@@ -11401,182 +11398,7 @@
         <w:t xml:space="preserve">CurrentUser</w:t>
       </w:r>
       <w:r>
-        <w:t xml:space="preserve"> mà không cần DB.</w:t>
-      </w:r>
-    </w:p>
-    <w:p>
-      <w:pPr>
-        <w:pStyle w:val="ListParagraph"/>
-        <w:numPr>
-          <w:ilvl w:val="0"/>
-          <w:numId w:val="1"/>
-        </w:numPr>
-      </w:pPr>
-      <w:r>
-        <w:rPr>
-          <w:b/>
-          <w:bCs/>
-        </w:rPr>
-        <w:t xml:space="preserve">Kiểm tra ngược ở mọi task:</w:t>
-      </w:r>
-    </w:p>
-    <w:p>
-      <w:pPr>
-        <w:pStyle w:val="ListParagraph"/>
-        <w:numPr>
-          <w:ilvl w:val="1"/>
-          <w:numId w:val="1"/>
-        </w:numPr>
-      </w:pPr>
-      <w:r>
-        <w:t xml:space="preserve">BE-09: bỏ bước tìm theo email → 2 test idempotent đỏ.</w:t>
-      </w:r>
-    </w:p>
-    <w:p>
-      <w:pPr>
-        <w:pStyle w:val="ListParagraph"/>
-        <w:numPr>
-          <w:ilvl w:val="1"/>
-          <w:numId w:val="1"/>
-        </w:numPr>
-      </w:pPr>
-      <w:r>
-        <w:t xml:space="preserve">BE-10: cho </w:t>
-      </w:r>
-      <w:r>
-        <w:rPr>
-          <w:rFonts w:ascii="Consolas" w:eastAsia="Consolas" w:hAnsi="Consolas" w:cs="Consolas"/>
-        </w:rPr>
-        <w:t xml:space="preserve">markHealthy</w:t>
-      </w:r>
-      <w:r>
-        <w:t xml:space="preserve"> gỡ </w:t>
-      </w:r>
-      <w:r>
-        <w:rPr>
-          <w:rFonts w:ascii="Consolas" w:eastAsia="Consolas" w:hAnsi="Consolas" w:cs="Consolas"/>
-        </w:rPr>
-        <w:t xml:space="preserve">AUTH_EXPIRED</w:t>
-      </w:r>
-      <w:r>
-        <w:t xml:space="preserve"> → đúng ô đó đỏ.</w:t>
-      </w:r>
-    </w:p>
-    <w:p>
-      <w:pPr>
-        <w:pStyle w:val="ListParagraph"/>
-        <w:numPr>
-          <w:ilvl w:val="1"/>
-          <w:numId w:val="1"/>
-        </w:numPr>
-      </w:pPr>
-      <w:r>
-        <w:t xml:space="preserve">BE-12: IV cố định → 1 test đỏ; bỏ AAD → 3 test đỏ; tag 96 bit → 2 test đỏ.</w:t>
-      </w:r>
-    </w:p>
-    <w:p>
-      <w:pPr>
-        <w:pStyle w:val="ListParagraph"/>
-        <w:numPr>
-          <w:ilvl w:val="1"/>
-          <w:numId w:val="1"/>
-        </w:numPr>
-      </w:pPr>
-      <w:r>
-        <w:t xml:space="preserve">BE-13: store "quên" ghi refresh token → test xoay khóa đỏ.</w:t>
-      </w:r>
-    </w:p>
-    <w:p>
-      <w:pPr>
-        <w:pStyle w:val="ListParagraph"/>
-        <w:numPr>
-          <w:ilvl w:val="1"/>
-          <w:numId w:val="1"/>
-        </w:numPr>
-      </w:pPr>
-      <w:r>
-        <w:t xml:space="preserve">BE-14: bỏ </w:t>
-      </w:r>
-      <w:r>
-        <w:rPr>
-          <w:rFonts w:ascii="Consolas" w:eastAsia="Consolas" w:hAnsi="Consolas" w:cs="Consolas"/>
-        </w:rPr>
-        <w:t xml:space="preserve">@Transactional</w:t>
-      </w:r>
-      <w:r>
-        <w:t xml:space="preserve"> → test rollback và test reconnect đỏ; không tìm account cũ → test reconnect đỏ (lỗi </w:t>
-      </w:r>
-      <w:r>
-        <w:rPr>
-          <w:rFonts w:ascii="Consolas" w:eastAsia="Consolas" w:hAnsi="Consolas" w:cs="Consolas"/>
-        </w:rPr>
-        <w:t xml:space="preserve">UNIQUE</w:t>
-      </w:r>
-      <w:r>
-        <w:t xml:space="preserve">); bỏ kiểm tra provider → test provider lạ đỏ; </w:t>
-      </w:r>
-      <w:r>
-        <w:rPr>
-          <w:rFonts w:ascii="Consolas" w:eastAsia="Consolas" w:hAnsi="Consolas" w:cs="Consolas"/>
-        </w:rPr>
-        <w:t xml:space="preserve">reconnected</w:t>
-      </w:r>
-      <w:r>
-        <w:t xml:space="preserve"> luôn </w:t>
-      </w:r>
-      <w:r>
-        <w:rPr>
-          <w:rFonts w:ascii="Consolas" w:eastAsia="Consolas" w:hAnsi="Consolas" w:cs="Consolas"/>
-        </w:rPr>
-        <w:t xml:space="preserve">false</w:t>
-      </w:r>
-      <w:r>
-        <w:t xml:space="preserve"> → test reconnect đỏ; publish trước khi lưu credential → test rollback đỏ; thêm một trường vào event → test payload đỏ.</w:t>
-      </w:r>
-    </w:p>
-    <w:p>
-      <w:pPr>
-        <w:pStyle w:val="ListParagraph"/>
-        <w:numPr>
-          <w:ilvl w:val="0"/>
-          <w:numId w:val="1"/>
-        </w:numPr>
-      </w:pPr>
-      <w:r>
-        <w:rPr>
-          <w:rFonts w:ascii="Consolas" w:eastAsia="Consolas" w:hAnsi="Consolas" w:cs="Consolas"/>
-          <w:b/>
-          <w:bCs/>
-        </w:rPr>
-        <w:t xml:space="preserve">@ApplicationModuleTest(mode = DIRECT_DEPENDENCIES)</w:t>
-      </w:r>
-      <w:r>
-        <w:rPr>
-          <w:b/>
-          <w:bCs/>
-        </w:rPr>
-        <w:t xml:space="preserve"> (Spring Modulith, BE-14):</w:t>
-      </w:r>
-      <w:r>
-        <w:t xml:space="preserve"> chỉ khởi động module </w:t>
-      </w:r>
-      <w:r>
-        <w:rPr>
-          <w:rFonts w:ascii="Consolas" w:eastAsia="Consolas" w:hAnsi="Consolas" w:cs="Consolas"/>
-        </w:rPr>
-        <w:t xml:space="preserve">account</w:t>
-      </w:r>
-      <w:r>
-        <w:t xml:space="preserve"> cộng các module nó dùng trực tiếp (</w:t>
-      </w:r>
-      <w:r>
-        <w:rPr>
-          <w:rFonts w:ascii="Consolas" w:eastAsia="Consolas" w:hAnsi="Consolas" w:cs="Consolas"/>
-        </w:rPr>
-        <w:t xml:space="preserve">provider</w:t>
-      </w:r>
-      <w:r>
-        <w:t xml:space="preserve">), không phải cả ứng dụng. Module </w:t>
+        <w:t xml:space="preserve"> (module </w:t>
       </w:r>
       <w:r>
         <w:rPr>
@@ -11585,22 +11407,85 @@
         <w:t xml:space="preserve">identity</w:t>
       </w:r>
       <w:r>
-        <w:t xml:space="preserve"> không được nạp, nên test tự chèn owner vào </w:t>
-      </w:r>
-      <w:r>
-        <w:rPr>
-          <w:rFonts w:ascii="Consolas" w:eastAsia="Consolas" w:hAnsi="Consolas" w:cs="Consolas"/>
-        </w:rPr>
-        <w:t xml:space="preserve">app_user</w:t>
-      </w:r>
-      <w:r>
-        <w:t xml:space="preserve"> bằng </w:t>
-      </w:r>
-      <w:r>
-        <w:rPr>
-          <w:rFonts w:ascii="Consolas" w:eastAsia="Consolas" w:hAnsi="Consolas" w:cs="Consolas"/>
-        </w:rPr>
-        <w:t xml:space="preserve">JdbcTemplate</w:t>
+        <w:t xml:space="preserve">) rồi truyền xuống. Service không tự đọc Spring Security, nên dễ dùng lại và dễ test.</w:t>
+      </w:r>
+    </w:p>
+    <w:p>
+      <w:pPr>
+        <w:pStyle w:val="ListParagraph"/>
+        <w:numPr>
+          <w:ilvl w:val="0"/>
+          <w:numId w:val="1"/>
+        </w:numPr>
+      </w:pPr>
+      <w:r>
+        <w:t xml:space="preserve">Repository: </w:t>
+      </w:r>
+      <w:r>
+        <w:rPr>
+          <w:rFonts w:ascii="Consolas" w:eastAsia="Consolas" w:hAnsi="Consolas" w:cs="Consolas"/>
+        </w:rPr>
+        <w:t xml:space="preserve">findByIdAndOwnerId(id, ownerId)</w:t>
+      </w:r>
+      <w:r>
+        <w:t xml:space="preserve"> là </w:t>
+      </w:r>
+      <w:r>
+        <w:rPr>
+          <w:rFonts w:ascii="Consolas" w:eastAsia="Consolas" w:hAnsi="Consolas" w:cs="Consolas"/>
+        </w:rPr>
+        <w:t xml:space="preserve">WHERE id = ? AND user_id = ?</w:t>
+      </w:r>
+      <w:r>
+        <w:t xml:space="preserve">, Spring Data tự sinh từ tên method.</w:t>
+      </w:r>
+    </w:p>
+    <w:p>
+      <w:pPr>
+        <w:pStyle w:val="Heading3"/>
+      </w:pPr>
+      <w:r>
+        <w:t xml:space="preserve">19.3 404 chứ không phải 403 cho account của người khác</w:t>
+      </w:r>
+    </w:p>
+    <w:p>
+      <w:pPr>
+        <w:pStyle w:val="ListParagraph"/>
+        <w:numPr>
+          <w:ilvl w:val="0"/>
+          <w:numId w:val="1"/>
+        </w:numPr>
+      </w:pPr>
+      <w:r>
+        <w:t xml:space="preserve">Trả 403 ("bị cấm") tức là xác nhận "ID này có thật, chỉ là không phải của bạn"; người dò ID sẽ biết ID nào tồn tại. Trả 404 với </w:t>
+      </w:r>
+      <w:r>
+        <w:rPr>
+          <w:b/>
+          <w:bCs/>
+        </w:rPr>
+        <w:t xml:space="preserve">cùng</w:t>
+      </w:r>
+      <w:r>
+        <w:t xml:space="preserve"> nội dung (detail cố định "Account not found.") thì không phân biệt được hai trường hợp.</w:t>
+      </w:r>
+    </w:p>
+    <w:p>
+      <w:pPr>
+        <w:pStyle w:val="ListParagraph"/>
+        <w:numPr>
+          <w:ilvl w:val="0"/>
+          <w:numId w:val="1"/>
+        </w:numPr>
+      </w:pPr>
+      <w:r>
+        <w:t xml:space="preserve">Test so nguyên body của hai response: một cho account của người khác, một cho ID không tồn tại. Chỉ được khác đường dẫn trong </w:t>
+      </w:r>
+      <w:r>
+        <w:rPr>
+          <w:rFonts w:ascii="Consolas" w:eastAsia="Consolas" w:hAnsi="Consolas" w:cs="Consolas"/>
+        </w:rPr>
+        <w:t xml:space="preserve">instance</w:t>
       </w:r>
       <w:r>
         <w:t xml:space="preserve">.</w:t>
@@ -11608,51 +11493,187 @@
     </w:p>
     <w:p>
       <w:pPr>
-        <w:pStyle w:val="ListParagraph"/>
-        <w:numPr>
-          <w:ilvl w:val="0"/>
-          <w:numId w:val="1"/>
-        </w:numPr>
-      </w:pPr>
-      <w:r>
-        <w:rPr>
-          <w:b/>
-          <w:bCs/>
-        </w:rPr>
-        <w:t xml:space="preserve">Test không có </w:t>
-      </w:r>
-      <w:r>
-        <w:rPr>
-          <w:rFonts w:ascii="Consolas" w:eastAsia="Consolas" w:hAnsi="Consolas" w:cs="Consolas"/>
-          <w:b/>
-          <w:bCs/>
-        </w:rPr>
-        <w:t xml:space="preserve">@Transactional</w:t>
-      </w:r>
-      <w:r>
-        <w:rPr>
-          <w:b/>
-          <w:bCs/>
-        </w:rPr>
-        <w:t xml:space="preserve">:</w:t>
-      </w:r>
-      <w:r>
-        <w:t xml:space="preserve"> để service tự commit hoặc rollback như khi chạy thật. Cái giá là dữ liệu ở lại sau mỗi test, nên </w:t>
-      </w:r>
-      <w:r>
-        <w:rPr>
-          <w:rFonts w:ascii="Consolas" w:eastAsia="Consolas" w:hAnsi="Consolas" w:cs="Consolas"/>
-        </w:rPr>
-        <w:t xml:space="preserve">@BeforeEach</w:t>
-      </w:r>
-      <w:r>
-        <w:t xml:space="preserve"> tự dọn bảng bằng </w:t>
-      </w:r>
-      <w:r>
-        <w:rPr>
-          <w:rFonts w:ascii="Consolas" w:eastAsia="Consolas" w:hAnsi="Consolas" w:cs="Consolas"/>
-        </w:rPr>
-        <w:t xml:space="preserve">JdbcTestUtils.deleteFromTables</w:t>
+        <w:pStyle w:val="Heading3"/>
+      </w:pPr>
+      <w:r>
+        <w:t xml:space="preserve">19.4 DTO map tường minh</w:t>
+      </w:r>
+    </w:p>
+    <w:p>
+      <w:pPr>
+        <w:pStyle w:val="ListParagraph"/>
+        <w:numPr>
+          <w:ilvl w:val="0"/>
+          <w:numId w:val="1"/>
+        </w:numPr>
+      </w:pPr>
+      <w:r>
+        <w:rPr>
+          <w:rFonts w:ascii="Consolas" w:eastAsia="Consolas" w:hAnsi="Consolas" w:cs="Consolas"/>
+        </w:rPr>
+        <w:t xml:space="preserve">AccountResponse</w:t>
+      </w:r>
+      <w:r>
+        <w:t xml:space="preserve"> là record riêng cho JSON, chép từng trường từ entity. Không trả thẳng entity vì entity có </w:t>
+      </w:r>
+      <w:r>
+        <w:rPr>
+          <w:rFonts w:ascii="Consolas" w:eastAsia="Consolas" w:hAnsi="Consolas" w:cs="Consolas"/>
+        </w:rPr>
+        <w:t xml:space="preserve">ownerId</w:t>
+      </w:r>
+      <w:r>
+        <w:t xml:space="preserve"> và </w:t>
+      </w:r>
+      <w:r>
+        <w:rPr>
+          <w:rFonts w:ascii="Consolas" w:eastAsia="Consolas" w:hAnsi="Consolas" w:cs="Consolas"/>
+        </w:rPr>
+        <w:t xml:space="preserve">version</w:t>
+      </w:r>
+      <w:r>
+        <w:t xml:space="preserve"> không dành cho client, và một trường thêm vào entity sau này (có thể nhạy cảm) sẽ tự lọt ra JSON. Với DTO, muốn trả trường nào thì phải viết ra.</w:t>
+      </w:r>
+    </w:p>
+    <w:p>
+      <w:pPr>
+        <w:pStyle w:val="ListParagraph"/>
+        <w:numPr>
+          <w:ilvl w:val="0"/>
+          <w:numId w:val="1"/>
+        </w:numPr>
+      </w:pPr>
+      <w:r>
+        <w:t xml:space="preserve">Enum thành chuỗi (</w:t>
+      </w:r>
+      <w:r>
+        <w:rPr>
+          <w:rFonts w:ascii="Consolas" w:eastAsia="Consolas" w:hAnsi="Consolas" w:cs="Consolas"/>
+        </w:rPr>
+        <w:t xml:space="preserve">status().name()</w:t>
+      </w:r>
+      <w:r>
+        <w:t xml:space="preserve">). </w:t>
+      </w:r>
+      <w:r>
+        <w:rPr>
+          <w:rFonts w:ascii="Consolas" w:eastAsia="Consolas" w:hAnsi="Consolas" w:cs="Consolas"/>
+        </w:rPr>
+        <w:t xml:space="preserve">Instant</w:t>
+      </w:r>
+      <w:r>
+        <w:t xml:space="preserve"> thành chuỗi ISO-8601 kết thúc bằng </w:t>
+      </w:r>
+      <w:r>
+        <w:rPr>
+          <w:rFonts w:ascii="Consolas" w:eastAsia="Consolas" w:hAnsi="Consolas" w:cs="Consolas"/>
+        </w:rPr>
+        <w:t xml:space="preserve">Z</w:t>
+      </w:r>
+      <w:r>
+        <w:t xml:space="preserve">, theo quy ước JSON của F01; Jackson của Spring Boot 4 làm sẵn việc này, test ghim lại kết quả.</w:t>
+      </w:r>
+    </w:p>
+    <w:p>
+      <w:pPr>
+        <w:pStyle w:val="ListParagraph"/>
+        <w:numPr>
+          <w:ilvl w:val="0"/>
+          <w:numId w:val="1"/>
+        </w:numPr>
+      </w:pPr>
+      <w:r>
+        <w:t xml:space="preserve">Test kiểm </w:t>
+      </w:r>
+      <w:r>
+        <w:rPr>
+          <w:b/>
+          <w:bCs/>
+        </w:rPr>
+        <w:t xml:space="preserve">đúng tập tên trường</w:t>
+      </w:r>
+      <w:r>
+        <w:t xml:space="preserve"> (11 tên), không chỉ kiểm "không có trường token". Thêm bất kỳ trường nào cũng phải sửa test, tức là phải có người cố ý làm.</w:t>
+      </w:r>
+    </w:p>
+    <w:p>
+      <w:pPr>
+        <w:pStyle w:val="Heading3"/>
+      </w:pPr>
+      <w:r>
+        <w:t xml:space="preserve">19.5 </w:t>
+      </w:r>
+      <w:r>
+        <w:rPr>
+          <w:rFonts w:ascii="Consolas" w:eastAsia="Consolas" w:hAnsi="Consolas" w:cs="Consolas"/>
+        </w:rPr>
+        <w:t xml:space="preserve">find</w:t>
+      </w:r>
+      <w:r>
+        <w:t xml:space="preserve"> chứ không phải </w:t>
+      </w:r>
+      <w:r>
+        <w:rPr>
+          <w:rFonts w:ascii="Consolas" w:eastAsia="Consolas" w:hAnsi="Consolas" w:cs="Consolas"/>
+        </w:rPr>
+        <w:t xml:space="preserve">get</w:t>
+      </w:r>
+      <w:r>
+        <w:t xml:space="preserve"> khi lấy capabilities</w:t>
+      </w:r>
+    </w:p>
+    <w:p>
+      <w:pPr>
+        <w:pStyle w:val="ListParagraph"/>
+        <w:numPr>
+          <w:ilvl w:val="0"/>
+          <w:numId w:val="1"/>
+        </w:numPr>
+      </w:pPr>
+      <w:r>
+        <w:t xml:space="preserve">Connector có thể bị gỡ khỏi ứng dụng trong khi account vẫn còn trong DB. </w:t>
+      </w:r>
+      <w:r>
+        <w:rPr>
+          <w:rFonts w:ascii="Consolas" w:eastAsia="Consolas" w:hAnsi="Consolas" w:cs="Consolas"/>
+        </w:rPr>
+        <w:t xml:space="preserve">ProviderRegistry.get</w:t>
+      </w:r>
+      <w:r>
+        <w:t xml:space="preserve"> sẽ ném </w:t>
+      </w:r>
+      <w:r>
+        <w:rPr>
+          <w:rFonts w:ascii="Consolas" w:eastAsia="Consolas" w:hAnsi="Consolas" w:cs="Consolas"/>
+        </w:rPr>
+        <w:t xml:space="preserve">UNKNOWN_PROVIDER</w:t>
+      </w:r>
+      <w:r>
+        <w:t xml:space="preserve">, và một account làm hỏng cả danh sách. </w:t>
+      </w:r>
+      <w:r>
+        <w:rPr>
+          <w:rFonts w:ascii="Consolas" w:eastAsia="Consolas" w:hAnsi="Consolas" w:cs="Consolas"/>
+        </w:rPr>
+        <w:t xml:space="preserve">find</w:t>
+      </w:r>
+      <w:r>
+        <w:t xml:space="preserve"> trả </w:t>
+      </w:r>
+      <w:r>
+        <w:rPr>
+          <w:rFonts w:ascii="Consolas" w:eastAsia="Consolas" w:hAnsi="Consolas" w:cs="Consolas"/>
+        </w:rPr>
+        <w:t xml:space="preserve">Optional</w:t>
+      </w:r>
+      <w:r>
+        <w:t xml:space="preserve"> rỗng: account vẫn hiện, chỉ có </w:t>
+      </w:r>
+      <w:r>
+        <w:rPr>
+          <w:rFonts w:ascii="Consolas" w:eastAsia="Consolas" w:hAnsi="Consolas" w:cs="Consolas"/>
+        </w:rPr>
+        <w:t xml:space="preserve">capabilities: []</w:t>
       </w:r>
       <w:r>
         <w:t xml:space="preserve">.</w:t>
@@ -11660,202 +11681,49 @@
     </w:p>
     <w:p>
       <w:pPr>
-        <w:pStyle w:val="ListParagraph"/>
-        <w:numPr>
-          <w:ilvl w:val="0"/>
-          <w:numId w:val="1"/>
-        </w:numPr>
-      </w:pPr>
-      <w:r>
-        <w:rPr>
-          <w:rFonts w:ascii="Consolas" w:eastAsia="Consolas" w:hAnsi="Consolas" w:cs="Consolas"/>
-          <w:b/>
-          <w:bCs/>
-        </w:rPr>
-        <w:t xml:space="preserve">AssertablePublishedEvents</w:t>
-      </w:r>
-      <w:r>
-        <w:rPr>
-          <w:b/>
-          <w:bCs/>
-        </w:rPr>
-        <w:t xml:space="preserve"> làm tham số của method test:</w:t>
-      </w:r>
-      <w:r>
-        <w:t xml:space="preserve"> Spring Modulith ghi lại mọi event được publish trong test đó; </w:t>
-      </w:r>
-      <w:r>
-        <w:rPr>
-          <w:rFonts w:ascii="Consolas" w:eastAsia="Consolas" w:hAnsi="Consolas" w:cs="Consolas"/>
-        </w:rPr>
-        <w:t xml:space="preserve">events.ofType(AccountConnected.class)</w:t>
-      </w:r>
-      <w:r>
-        <w:t xml:space="preserve"> lấy ra để kiểm tra số lượng và nội dung.</w:t>
-      </w:r>
-    </w:p>
-    <w:p>
-      <w:pPr>
-        <w:pStyle w:val="ListParagraph"/>
-        <w:numPr>
-          <w:ilvl w:val="0"/>
-          <w:numId w:val="1"/>
-        </w:numPr>
-      </w:pPr>
-      <w:r>
-        <w:rPr>
-          <w:rFonts w:ascii="Consolas" w:eastAsia="Consolas" w:hAnsi="Consolas" w:cs="Consolas"/>
-          <w:b/>
-          <w:bCs/>
-        </w:rPr>
-        <w:t xml:space="preserve">@MockitoSpyBean</w:t>
-      </w:r>
-      <w:r>
-        <w:rPr>
-          <w:b/>
-          <w:bCs/>
-        </w:rPr>
-        <w:t xml:space="preserve">:</w:t>
-      </w:r>
-      <w:r>
-        <w:t xml:space="preserve"> bọc bean thật. Bình thường nó chạy code thật; riêng một test bảo nó ném lỗi bằng </w:t>
-      </w:r>
-      <w:r>
-        <w:rPr>
-          <w:rFonts w:ascii="Consolas" w:eastAsia="Consolas" w:hAnsi="Consolas" w:cs="Consolas"/>
-        </w:rPr>
-        <w:t xml:space="preserve">doThrow(...).when(credentials).save(any(), any(), any())</w:t>
-      </w:r>
-      <w:r>
-        <w:t xml:space="preserve">, để giả lập "lưu credential thất bại" mà không sửa code production. Assertion vẫn kiểm tra DB thật, không kiểm tra mock.</w:t>
-      </w:r>
-    </w:p>
-    <w:p>
-      <w:pPr>
-        <w:pStyle w:val="ListParagraph"/>
-        <w:numPr>
-          <w:ilvl w:val="0"/>
-          <w:numId w:val="1"/>
-        </w:numPr>
-      </w:pPr>
-      <w:r>
-        <w:rPr>
-          <w:b/>
-          <w:bCs/>
-        </w:rPr>
-        <w:t xml:space="preserve">Bean riêng cho test:</w:t>
-      </w:r>
-      <w:r>
-        <w:t xml:space="preserve"> một class </w:t>
-      </w:r>
-      <w:r>
-        <w:rPr>
-          <w:rFonts w:ascii="Consolas" w:eastAsia="Consolas" w:hAnsi="Consolas" w:cs="Consolas"/>
-        </w:rPr>
-        <w:t xml:space="preserve">@TestConfiguration</w:t>
-      </w:r>
-      <w:r>
-        <w:t xml:space="preserve"> lồng trong class test tạo </w:t>
-      </w:r>
-      <w:r>
-        <w:rPr>
-          <w:rFonts w:ascii="Consolas" w:eastAsia="Consolas" w:hAnsi="Consolas" w:cs="Consolas"/>
-        </w:rPr>
-        <w:t xml:space="preserve">FakeMessageProvider</w:t>
-      </w:r>
-      <w:r>
-        <w:t xml:space="preserve"> loại </w:t>
-      </w:r>
-      <w:r>
-        <w:rPr>
-          <w:rFonts w:ascii="Consolas" w:eastAsia="Consolas" w:hAnsi="Consolas" w:cs="Consolas"/>
-        </w:rPr>
-        <w:t xml:space="preserve">fake</w:t>
-      </w:r>
-      <w:r>
-        <w:t xml:space="preserve"> làm bean, để </w:t>
-      </w:r>
-      <w:r>
-        <w:rPr>
-          <w:rFonts w:ascii="Consolas" w:eastAsia="Consolas" w:hAnsi="Consolas" w:cs="Consolas"/>
-        </w:rPr>
-        <w:t xml:space="preserve">ProviderRegistry</w:t>
-      </w:r>
-      <w:r>
-        <w:t xml:space="preserve"> thấy provider này.</w:t>
-      </w:r>
-    </w:p>
-    <w:p>
-      <w:pPr>
-        <w:pStyle w:val="ListParagraph"/>
-        <w:numPr>
-          <w:ilvl w:val="0"/>
-          <w:numId w:val="1"/>
-        </w:numPr>
-      </w:pPr>
-      <w:r>
-        <w:rPr>
-          <w:rFonts w:ascii="Consolas" w:eastAsia="Consolas" w:hAnsi="Consolas" w:cs="Consolas"/>
-          <w:b/>
-          <w:bCs/>
-        </w:rPr>
-        <w:t xml:space="preserve">row_to_json(c)::text</w:t>
-      </w:r>
-      <w:r>
-        <w:rPr>
-          <w:b/>
-          <w:bCs/>
-        </w:rPr>
-        <w:t xml:space="preserve"> của PostgreSQL:</w:t>
-      </w:r>
-      <w:r>
-        <w:t xml:space="preserve"> biến cả một dòng thành chuỗi JSON để kiểm tra bằng một lệnh rằng </w:t>
-      </w:r>
-      <w:r>
-        <w:rPr>
-          <w:b/>
-          <w:bCs/>
-        </w:rPr>
-        <w:t xml:space="preserve">không cột nào</w:t>
-      </w:r>
-      <w:r>
-        <w:t xml:space="preserve"> chứa token dạng chữ.</w:t>
-      </w:r>
-    </w:p>
-    <w:p>
-      <w:pPr>
-        <w:pStyle w:val="ListParagraph"/>
-        <w:numPr>
-          <w:ilvl w:val="0"/>
-          <w:numId w:val="1"/>
-        </w:numPr>
-      </w:pPr>
-      <w:r>
-        <w:rPr>
-          <w:rFonts w:ascii="Consolas" w:eastAsia="Consolas" w:hAnsi="Consolas" w:cs="Consolas"/>
-          <w:b/>
-          <w:bCs/>
-        </w:rPr>
-        <w:t xml:space="preserve">entityManager.flush()</w:t>
-      </w:r>
-      <w:r>
-        <w:rPr>
-          <w:b/>
-          <w:bCs/>
-        </w:rPr>
-        <w:t xml:space="preserve"> để lộ lỗi:</w:t>
-      </w:r>
-      <w:r>
-        <w:t xml:space="preserve"> trong </w:t>
-      </w:r>
-      <w:r>
-        <w:rPr>
-          <w:rFonts w:ascii="Consolas" w:eastAsia="Consolas" w:hAnsi="Consolas" w:cs="Consolas"/>
-        </w:rPr>
-        <w:t xml:space="preserve">@DataJpaTest</w:t>
-      </w:r>
-      <w:r>
-        <w:t xml:space="preserve">, lệnh ghi chỉ thật sự xuống DB khi flush. Muốn thấy lỗi khóa ngoại thì phải flush ngay trong đoạn code đang chờ lỗi; test còn kiểm tra cả stack trace của lỗi đó không chứa token.</w:t>
+        <w:pStyle w:val="Heading3"/>
+      </w:pPr>
+      <w:r>
+        <w:t xml:space="preserve">19.6 </w:t>
+      </w:r>
+      <w:r>
+        <w:rPr>
+          <w:rFonts w:ascii="Consolas" w:eastAsia="Consolas" w:hAnsi="Consolas" w:cs="Consolas"/>
+        </w:rPr>
+        <w:t xml:space="preserve">@Transactional(readOnly = true)</w:t>
+      </w:r>
+    </w:p>
+    <w:p>
+      <w:pPr>
+        <w:pStyle w:val="ListParagraph"/>
+        <w:numPr>
+          <w:ilvl w:val="0"/>
+          <w:numId w:val="1"/>
+        </w:numPr>
+      </w:pPr>
+      <w:r>
+        <w:t xml:space="preserve">Đặt ở class: mọi method chạy trong transaction chỉ đọc. Ý định của code rõ ràng, và Hibernate bỏ bước dò thay đổi lúc kết thúc vì không có gì để ghi.</w:t>
+      </w:r>
+    </w:p>
+    <w:p>
+      <w:pPr>
+        <w:pStyle w:val="ListParagraph"/>
+        <w:numPr>
+          <w:ilvl w:val="0"/>
+          <w:numId w:val="1"/>
+        </w:numPr>
+      </w:pPr>
+      <w:r>
+        <w:t xml:space="preserve">Ứng dụng tắt </w:t>
+      </w:r>
+      <w:r>
+        <w:rPr>
+          <w:rFonts w:ascii="Consolas" w:eastAsia="Consolas" w:hAnsi="Consolas" w:cs="Consolas"/>
+        </w:rPr>
+        <w:t xml:space="preserve">open-in-view</w:t>
+      </w:r>
+      <w:r>
+        <w:t xml:space="preserve"> (F01): phiên Hibernate kết thúc khi service trả về. Controller chỉ đọc field thường của entity nên không gặp lỗi lazy loading.</w:t>
       </w:r>
     </w:p>
     <w:p>
@@ -11871,7 +11739,920 @@
         <w:pStyle w:val="Heading2"/>
       </w:pPr>
       <w:r>
-        <w:t xml:space="preserve">20. Tự kiểm tra F02 (phần đã làm)</w:t>
+        <w:t xml:space="preserve">20. Kỹ thuật test mới trong F02</w:t>
+      </w:r>
+    </w:p>
+    <w:p>
+      <w:pPr>
+        <w:pStyle w:val="ListParagraph"/>
+        <w:numPr>
+          <w:ilvl w:val="0"/>
+          <w:numId w:val="1"/>
+        </w:numPr>
+      </w:pPr>
+      <w:r>
+        <w:rPr>
+          <w:rFonts w:ascii="Consolas" w:eastAsia="Consolas" w:hAnsi="Consolas" w:cs="Consolas"/>
+          <w:b/>
+          <w:bCs/>
+        </w:rPr>
+        <w:t xml:space="preserve">@DataJpaTest</w:t>
+      </w:r>
+      <w:r>
+        <w:rPr>
+          <w:b/>
+          <w:bCs/>
+        </w:rPr>
+        <w:t xml:space="preserve"> + </w:t>
+      </w:r>
+      <w:r>
+        <w:rPr>
+          <w:rFonts w:ascii="Consolas" w:eastAsia="Consolas" w:hAnsi="Consolas" w:cs="Consolas"/>
+          <w:b/>
+          <w:bCs/>
+        </w:rPr>
+        <w:t xml:space="preserve">@AutoConfigureTestDatabase(replace = NONE)</w:t>
+      </w:r>
+      <w:r>
+        <w:rPr>
+          <w:b/>
+          <w:bCs/>
+        </w:rPr>
+        <w:t xml:space="preserve">:</w:t>
+      </w:r>
+      <w:r>
+        <w:t xml:space="preserve"> slice chỉ nạp JPA và Flyway, chạy trên PostgreSQL thật (Testcontainers) để </w:t>
+      </w:r>
+      <w:r>
+        <w:rPr>
+          <w:rFonts w:ascii="Consolas" w:eastAsia="Consolas" w:hAnsi="Consolas" w:cs="Consolas"/>
+        </w:rPr>
+        <w:t xml:space="preserve">CHECK</w:t>
+      </w:r>
+      <w:r>
+        <w:t xml:space="preserve">, </w:t>
+      </w:r>
+      <w:r>
+        <w:rPr>
+          <w:rFonts w:ascii="Consolas" w:eastAsia="Consolas" w:hAnsi="Consolas" w:cs="Consolas"/>
+        </w:rPr>
+        <w:t xml:space="preserve">UNIQUE</w:t>
+      </w:r>
+      <w:r>
+        <w:t xml:space="preserve">, khóa ngoại hoạt động như production. Mỗi test tự rollback.</w:t>
+      </w:r>
+    </w:p>
+    <w:p>
+      <w:pPr>
+        <w:pStyle w:val="ListParagraph"/>
+        <w:numPr>
+          <w:ilvl w:val="0"/>
+          <w:numId w:val="1"/>
+        </w:numPr>
+      </w:pPr>
+      <w:r>
+        <w:rPr>
+          <w:rFonts w:ascii="Consolas" w:eastAsia="Consolas" w:hAnsi="Consolas" w:cs="Consolas"/>
+          <w:b/>
+          <w:bCs/>
+        </w:rPr>
+        <w:t xml:space="preserve">entityManager.clear()</w:t>
+      </w:r>
+      <w:r>
+        <w:rPr>
+          <w:b/>
+          <w:bCs/>
+        </w:rPr>
+        <w:t xml:space="preserve">:</w:t>
+      </w:r>
+      <w:r>
+        <w:t xml:space="preserve"> xóa bộ nhớ đệm của Hibernate để lần đọc sau thật sự đi xuống DB. Không có nó, test chỉ đọc lại object trong bộ nhớ.</w:t>
+      </w:r>
+    </w:p>
+    <w:p>
+      <w:pPr>
+        <w:pStyle w:val="ListParagraph"/>
+        <w:numPr>
+          <w:ilvl w:val="0"/>
+          <w:numId w:val="1"/>
+        </w:numPr>
+      </w:pPr>
+      <w:r>
+        <w:rPr>
+          <w:rFonts w:ascii="Consolas" w:eastAsia="Consolas" w:hAnsi="Consolas" w:cs="Consolas"/>
+          <w:b/>
+          <w:bCs/>
+        </w:rPr>
+        <w:t xml:space="preserve">JdbcTemplate</w:t>
+      </w:r>
+      <w:r>
+        <w:rPr>
+          <w:b/>
+          <w:bCs/>
+        </w:rPr>
+        <w:t xml:space="preserve">:</w:t>
+      </w:r>
+      <w:r>
+        <w:t xml:space="preserve"> chạy SQL thô để nhìn đúng cái nằm trong DB, hoặc để thử ràng buộc mà Java không tạo ra được (ví dụ ghi </w:t>
+      </w:r>
+      <w:r>
+        <w:rPr>
+          <w:rFonts w:ascii="Consolas" w:eastAsia="Consolas" w:hAnsi="Consolas" w:cs="Consolas"/>
+        </w:rPr>
+        <w:t xml:space="preserve">status = 'SYNCING'</w:t>
+      </w:r>
+      <w:r>
+        <w:t xml:space="preserve">).</w:t>
+      </w:r>
+    </w:p>
+    <w:p>
+      <w:pPr>
+        <w:pStyle w:val="ListParagraph"/>
+        <w:numPr>
+          <w:ilvl w:val="0"/>
+          <w:numId w:val="1"/>
+        </w:numPr>
+      </w:pPr>
+      <w:r>
+        <w:rPr>
+          <w:rFonts w:ascii="Consolas" w:eastAsia="Consolas" w:hAnsi="Consolas" w:cs="Consolas"/>
+          <w:b/>
+          <w:bCs/>
+        </w:rPr>
+        <w:t xml:space="preserve">ApplicationContextRunner</w:t>
+      </w:r>
+      <w:r>
+        <w:rPr>
+          <w:b/>
+          <w:bCs/>
+        </w:rPr>
+        <w:t xml:space="preserve"> cho kiểm tra khởi động:</w:t>
+      </w:r>
+      <w:r>
+        <w:t xml:space="preserve"> dựng một context nhỏ với cấu hình sai để chứng minh app </w:t>
+      </w:r>
+      <w:r>
+        <w:rPr>
+          <w:b/>
+          <w:bCs/>
+        </w:rPr>
+        <w:t xml:space="preserve">không</w:t>
+      </w:r>
+      <w:r>
+        <w:t xml:space="preserve"> start và thông báo không lộ secret.</w:t>
+      </w:r>
+    </w:p>
+    <w:p>
+      <w:pPr>
+        <w:pStyle w:val="ListParagraph"/>
+        <w:numPr>
+          <w:ilvl w:val="0"/>
+          <w:numId w:val="1"/>
+        </w:numPr>
+      </w:pPr>
+      <w:r>
+        <w:rPr>
+          <w:b/>
+          <w:bCs/>
+        </w:rPr>
+        <w:t xml:space="preserve">Mockito </w:t>
+      </w:r>
+      <w:r>
+        <w:rPr>
+          <w:rFonts w:ascii="Consolas" w:eastAsia="Consolas" w:hAnsi="Consolas" w:cs="Consolas"/>
+          <w:b/>
+          <w:bCs/>
+        </w:rPr>
+        <w:t xml:space="preserve">mock(...)</w:t>
+      </w:r>
+      <w:r>
+        <w:rPr>
+          <w:b/>
+          <w:bCs/>
+        </w:rPr>
+        <w:t xml:space="preserve"> trong unit test:</w:t>
+      </w:r>
+      <w:r>
+        <w:t xml:space="preserve"> </w:t>
+      </w:r>
+      <w:r>
+        <w:rPr>
+          <w:rFonts w:ascii="Consolas" w:eastAsia="Consolas" w:hAnsi="Consolas" w:cs="Consolas"/>
+        </w:rPr>
+        <w:t xml:space="preserve">OwnerCurrentUserTests</w:t>
+      </w:r>
+      <w:r>
+        <w:t xml:space="preserve"> giả repository để test </w:t>
+      </w:r>
+      <w:r>
+        <w:rPr>
+          <w:rFonts w:ascii="Consolas" w:eastAsia="Consolas" w:hAnsi="Consolas" w:cs="Consolas"/>
+        </w:rPr>
+        <w:t xml:space="preserve">CurrentUser</w:t>
+      </w:r>
+      <w:r>
+        <w:t xml:space="preserve"> mà không cần DB.</w:t>
+      </w:r>
+    </w:p>
+    <w:p>
+      <w:pPr>
+        <w:pStyle w:val="ListParagraph"/>
+        <w:numPr>
+          <w:ilvl w:val="0"/>
+          <w:numId w:val="1"/>
+        </w:numPr>
+      </w:pPr>
+      <w:r>
+        <w:rPr>
+          <w:b/>
+          <w:bCs/>
+        </w:rPr>
+        <w:t xml:space="preserve">Kiểm tra ngược ở mọi task:</w:t>
+      </w:r>
+    </w:p>
+    <w:p>
+      <w:pPr>
+        <w:pStyle w:val="ListParagraph"/>
+        <w:numPr>
+          <w:ilvl w:val="1"/>
+          <w:numId w:val="1"/>
+        </w:numPr>
+      </w:pPr>
+      <w:r>
+        <w:t xml:space="preserve">BE-09: bỏ bước tìm theo email → 2 test idempotent đỏ.</w:t>
+      </w:r>
+    </w:p>
+    <w:p>
+      <w:pPr>
+        <w:pStyle w:val="ListParagraph"/>
+        <w:numPr>
+          <w:ilvl w:val="1"/>
+          <w:numId w:val="1"/>
+        </w:numPr>
+      </w:pPr>
+      <w:r>
+        <w:t xml:space="preserve">BE-10: cho </w:t>
+      </w:r>
+      <w:r>
+        <w:rPr>
+          <w:rFonts w:ascii="Consolas" w:eastAsia="Consolas" w:hAnsi="Consolas" w:cs="Consolas"/>
+        </w:rPr>
+        <w:t xml:space="preserve">markHealthy</w:t>
+      </w:r>
+      <w:r>
+        <w:t xml:space="preserve"> gỡ </w:t>
+      </w:r>
+      <w:r>
+        <w:rPr>
+          <w:rFonts w:ascii="Consolas" w:eastAsia="Consolas" w:hAnsi="Consolas" w:cs="Consolas"/>
+        </w:rPr>
+        <w:t xml:space="preserve">AUTH_EXPIRED</w:t>
+      </w:r>
+      <w:r>
+        <w:t xml:space="preserve"> → đúng ô đó đỏ.</w:t>
+      </w:r>
+    </w:p>
+    <w:p>
+      <w:pPr>
+        <w:pStyle w:val="ListParagraph"/>
+        <w:numPr>
+          <w:ilvl w:val="1"/>
+          <w:numId w:val="1"/>
+        </w:numPr>
+      </w:pPr>
+      <w:r>
+        <w:t xml:space="preserve">BE-12: IV cố định → 1 test đỏ; bỏ AAD → 3 test đỏ; tag 96 bit → 2 test đỏ.</w:t>
+      </w:r>
+    </w:p>
+    <w:p>
+      <w:pPr>
+        <w:pStyle w:val="ListParagraph"/>
+        <w:numPr>
+          <w:ilvl w:val="1"/>
+          <w:numId w:val="1"/>
+        </w:numPr>
+      </w:pPr>
+      <w:r>
+        <w:t xml:space="preserve">BE-13: store "quên" ghi refresh token → test xoay khóa đỏ.</w:t>
+      </w:r>
+    </w:p>
+    <w:p>
+      <w:pPr>
+        <w:pStyle w:val="ListParagraph"/>
+        <w:numPr>
+          <w:ilvl w:val="1"/>
+          <w:numId w:val="1"/>
+        </w:numPr>
+      </w:pPr>
+      <w:r>
+        <w:t xml:space="preserve">BE-14: bỏ </w:t>
+      </w:r>
+      <w:r>
+        <w:rPr>
+          <w:rFonts w:ascii="Consolas" w:eastAsia="Consolas" w:hAnsi="Consolas" w:cs="Consolas"/>
+        </w:rPr>
+        <w:t xml:space="preserve">@Transactional</w:t>
+      </w:r>
+      <w:r>
+        <w:t xml:space="preserve"> → test rollback và test reconnect đỏ; không tìm account cũ → test reconnect đỏ (lỗi </w:t>
+      </w:r>
+      <w:r>
+        <w:rPr>
+          <w:rFonts w:ascii="Consolas" w:eastAsia="Consolas" w:hAnsi="Consolas" w:cs="Consolas"/>
+        </w:rPr>
+        <w:t xml:space="preserve">UNIQUE</w:t>
+      </w:r>
+      <w:r>
+        <w:t xml:space="preserve">); bỏ kiểm tra provider → test provider lạ đỏ; </w:t>
+      </w:r>
+      <w:r>
+        <w:rPr>
+          <w:rFonts w:ascii="Consolas" w:eastAsia="Consolas" w:hAnsi="Consolas" w:cs="Consolas"/>
+        </w:rPr>
+        <w:t xml:space="preserve">reconnected</w:t>
+      </w:r>
+      <w:r>
+        <w:t xml:space="preserve"> luôn </w:t>
+      </w:r>
+      <w:r>
+        <w:rPr>
+          <w:rFonts w:ascii="Consolas" w:eastAsia="Consolas" w:hAnsi="Consolas" w:cs="Consolas"/>
+        </w:rPr>
+        <w:t xml:space="preserve">false</w:t>
+      </w:r>
+      <w:r>
+        <w:t xml:space="preserve"> → test reconnect đỏ; publish trước khi lưu credential → test rollback đỏ; thêm một trường vào event → test payload đỏ.</w:t>
+      </w:r>
+    </w:p>
+    <w:p>
+      <w:pPr>
+        <w:pStyle w:val="ListParagraph"/>
+        <w:numPr>
+          <w:ilvl w:val="1"/>
+          <w:numId w:val="1"/>
+        </w:numPr>
+      </w:pPr>
+      <w:r>
+        <w:t xml:space="preserve">BE-15: danh sách không lọc owner → 2 test đỏ; </w:t>
+      </w:r>
+      <w:r>
+        <w:rPr>
+          <w:rFonts w:ascii="Consolas" w:eastAsia="Consolas" w:hAnsi="Consolas" w:cs="Consolas"/>
+        </w:rPr>
+        <w:t xml:space="preserve">get</w:t>
+      </w:r>
+      <w:r>
+        <w:t xml:space="preserve"> không lọc owner → test cô lập đỏ; mới nhất trước → test thứ tự đỏ; </w:t>
+      </w:r>
+      <w:r>
+        <w:rPr>
+          <w:rFonts w:ascii="Consolas" w:eastAsia="Consolas" w:hAnsi="Consolas" w:cs="Consolas"/>
+        </w:rPr>
+        <w:t xml:space="preserve">ProviderRegistry.get</w:t>
+      </w:r>
+      <w:r>
+        <w:t xml:space="preserve"> thay </w:t>
+      </w:r>
+      <w:r>
+        <w:rPr>
+          <w:rFonts w:ascii="Consolas" w:eastAsia="Consolas" w:hAnsi="Consolas" w:cs="Consolas"/>
+        </w:rPr>
+        <w:t xml:space="preserve">find</w:t>
+      </w:r>
+      <w:r>
+        <w:t xml:space="preserve"> → test connector đã gỡ đỏ; </w:t>
+      </w:r>
+      <w:r>
+        <w:rPr>
+          <w:rFonts w:ascii="Consolas" w:eastAsia="Consolas" w:hAnsi="Consolas" w:cs="Consolas"/>
+        </w:rPr>
+        <w:t xml:space="preserve">ownerId</w:t>
+      </w:r>
+      <w:r>
+        <w:t xml:space="preserve"> lọt vào response → test tập trường đỏ; detail nói "của người khác" → test cô lập đỏ.</w:t>
+      </w:r>
+    </w:p>
+    <w:p>
+      <w:pPr>
+        <w:pStyle w:val="ListParagraph"/>
+        <w:numPr>
+          <w:ilvl w:val="0"/>
+          <w:numId w:val="1"/>
+        </w:numPr>
+      </w:pPr>
+      <w:r>
+        <w:rPr>
+          <w:b/>
+          <w:bCs/>
+        </w:rPr>
+        <w:t xml:space="preserve">Chạy cả ứng dụng thay cho web slice (BE-15):</w:t>
+      </w:r>
+      <w:r>
+        <w:t xml:space="preserve"> </w:t>
+      </w:r>
+      <w:r>
+        <w:rPr>
+          <w:rFonts w:ascii="Consolas" w:eastAsia="Consolas" w:hAnsi="Consolas" w:cs="Consolas"/>
+        </w:rPr>
+        <w:t xml:space="preserve">@SpringBootTest</w:t>
+      </w:r>
+      <w:r>
+        <w:t xml:space="preserve"> + </w:t>
+      </w:r>
+      <w:r>
+        <w:rPr>
+          <w:rFonts w:ascii="Consolas" w:eastAsia="Consolas" w:hAnsi="Consolas" w:cs="Consolas"/>
+        </w:rPr>
+        <w:t xml:space="preserve">@AutoConfigureMockMvc</w:t>
+      </w:r>
+      <w:r>
+        <w:t xml:space="preserve"> gửi request HTTP giả qua đúng các lớp thật: security, </w:t>
+      </w:r>
+      <w:r>
+        <w:rPr>
+          <w:rFonts w:ascii="Consolas" w:eastAsia="Consolas" w:hAnsi="Consolas" w:cs="Consolas"/>
+        </w:rPr>
+        <w:t xml:space="preserve">CurrentUser</w:t>
+      </w:r>
+      <w:r>
+        <w:t xml:space="preserve">, service, PostgreSQL, error handler, Jackson. Chọn thay cho </w:t>
+      </w:r>
+      <w:r>
+        <w:rPr>
+          <w:rFonts w:ascii="Consolas" w:eastAsia="Consolas" w:hAnsi="Consolas" w:cs="Consolas"/>
+        </w:rPr>
+        <w:t xml:space="preserve">@WebMvcTest</w:t>
+      </w:r>
+      <w:r>
+        <w:t xml:space="preserve"> với service giả vì test cô lập dữ liệu phải chạy trên dữ liệu thật; với service giả, test chỉ kiểm tra cái mock.</w:t>
+      </w:r>
+    </w:p>
+    <w:p>
+      <w:pPr>
+        <w:pStyle w:val="ListParagraph"/>
+        <w:numPr>
+          <w:ilvl w:val="0"/>
+          <w:numId w:val="1"/>
+        </w:numPr>
+      </w:pPr>
+      <w:r>
+        <w:rPr>
+          <w:b/>
+          <w:bCs/>
+        </w:rPr>
+        <w:t xml:space="preserve">Ghim thời điểm bằng SQL:</w:t>
+      </w:r>
+      <w:r>
+        <w:t xml:space="preserve"> </w:t>
+      </w:r>
+      <w:r>
+        <w:rPr>
+          <w:rFonts w:ascii="Consolas" w:eastAsia="Consolas" w:hAnsi="Consolas" w:cs="Consolas"/>
+        </w:rPr>
+        <w:t xml:space="preserve">@PrePersist</w:t>
+      </w:r>
+      <w:r>
+        <w:t xml:space="preserve"> điền </w:t>
+      </w:r>
+      <w:r>
+        <w:rPr>
+          <w:rFonts w:ascii="Consolas" w:eastAsia="Consolas" w:hAnsi="Consolas" w:cs="Consolas"/>
+        </w:rPr>
+        <w:t xml:space="preserve">created_at</w:t>
+      </w:r>
+      <w:r>
+        <w:t xml:space="preserve"> bằng giờ thật nên không biết trước. Test ghi đè bằng </w:t>
+      </w:r>
+      <w:r>
+        <w:rPr>
+          <w:rFonts w:ascii="Consolas" w:eastAsia="Consolas" w:hAnsi="Consolas" w:cs="Consolas"/>
+        </w:rPr>
+        <w:t xml:space="preserve">UPDATE connected_account SET created_at = ?</w:t>
+      </w:r>
+      <w:r>
+        <w:t xml:space="preserve"> để biết chắc thứ tự và chuỗi JSON mong đợi (</w:t>
+      </w:r>
+      <w:r>
+        <w:rPr>
+          <w:rFonts w:ascii="Consolas" w:eastAsia="Consolas" w:hAnsi="Consolas" w:cs="Consolas"/>
+        </w:rPr>
+        <w:t xml:space="preserve">2026-10-05T03:15:00Z</w:t>
+      </w:r>
+      <w:r>
+        <w:t xml:space="preserve">). Account "mới hơn" được tạo </w:t>
+      </w:r>
+      <w:r>
+        <w:rPr>
+          <w:b/>
+          <w:bCs/>
+        </w:rPr>
+        <w:t xml:space="preserve">trước</w:t>
+      </w:r>
+      <w:r>
+        <w:t xml:space="preserve">, để test thứ tự không thể xanh chỉ nhờ thứ tự chèn.</w:t>
+      </w:r>
+    </w:p>
+    <w:p>
+      <w:pPr>
+        <w:pStyle w:val="ListParagraph"/>
+        <w:numPr>
+          <w:ilvl w:val="0"/>
+          <w:numId w:val="1"/>
+        </w:numPr>
+      </w:pPr>
+      <w:r>
+        <w:rPr>
+          <w:rFonts w:ascii="Consolas" w:eastAsia="Consolas" w:hAnsi="Consolas" w:cs="Consolas"/>
+          <w:b/>
+          <w:bCs/>
+        </w:rPr>
+        <w:t xml:space="preserve">JsonPath.read(body, "$")</w:t>
+      </w:r>
+      <w:r>
+        <w:rPr>
+          <w:b/>
+          <w:bCs/>
+        </w:rPr>
+        <w:t xml:space="preserve">:</w:t>
+      </w:r>
+      <w:r>
+        <w:t xml:space="preserve"> đọc JSON thành </w:t>
+      </w:r>
+      <w:r>
+        <w:rPr>
+          <w:rFonts w:ascii="Consolas" w:eastAsia="Consolas" w:hAnsi="Consolas" w:cs="Consolas"/>
+        </w:rPr>
+        <w:t xml:space="preserve">Map</w:t>
+      </w:r>
+      <w:r>
+        <w:t xml:space="preserve"> để so tập tên trường.</w:t>
+      </w:r>
+    </w:p>
+    <w:p>
+      <w:pPr>
+        <w:pStyle w:val="ListParagraph"/>
+        <w:numPr>
+          <w:ilvl w:val="0"/>
+          <w:numId w:val="1"/>
+        </w:numPr>
+      </w:pPr>
+      <w:r>
+        <w:rPr>
+          <w:rFonts w:ascii="Consolas" w:eastAsia="Consolas" w:hAnsi="Consolas" w:cs="Consolas"/>
+          <w:b/>
+          <w:bCs/>
+        </w:rPr>
+        <w:t xml:space="preserve">@ApplicationModuleTest(mode = DIRECT_DEPENDENCIES)</w:t>
+      </w:r>
+      <w:r>
+        <w:rPr>
+          <w:b/>
+          <w:bCs/>
+        </w:rPr>
+        <w:t xml:space="preserve"> (Spring Modulith, BE-14):</w:t>
+      </w:r>
+      <w:r>
+        <w:t xml:space="preserve"> chỉ khởi động module </w:t>
+      </w:r>
+      <w:r>
+        <w:rPr>
+          <w:rFonts w:ascii="Consolas" w:eastAsia="Consolas" w:hAnsi="Consolas" w:cs="Consolas"/>
+        </w:rPr>
+        <w:t xml:space="preserve">account</w:t>
+      </w:r>
+      <w:r>
+        <w:t xml:space="preserve"> cộng các module nó dùng trực tiếp, không phải cả ứng dụng. Lúc làm BE-14 đó chỉ là </w:t>
+      </w:r>
+      <w:r>
+        <w:rPr>
+          <w:rFonts w:ascii="Consolas" w:eastAsia="Consolas" w:hAnsi="Consolas" w:cs="Consolas"/>
+        </w:rPr>
+        <w:t xml:space="preserve">provider</w:t>
+      </w:r>
+      <w:r>
+        <w:t xml:space="preserve">; từ BE-15, </w:t>
+      </w:r>
+      <w:r>
+        <w:rPr>
+          <w:rFonts w:ascii="Consolas" w:eastAsia="Consolas" w:hAnsi="Consolas" w:cs="Consolas"/>
+        </w:rPr>
+        <w:t xml:space="preserve">account</w:t>
+      </w:r>
+      <w:r>
+        <w:t xml:space="preserve"> dùng thêm </w:t>
+      </w:r>
+      <w:r>
+        <w:rPr>
+          <w:rFonts w:ascii="Consolas" w:eastAsia="Consolas" w:hAnsi="Consolas" w:cs="Consolas"/>
+        </w:rPr>
+        <w:t xml:space="preserve">CurrentUser</w:t>
+      </w:r>
+      <w:r>
+        <w:t xml:space="preserve"> (module </w:t>
+      </w:r>
+      <w:r>
+        <w:rPr>
+          <w:rFonts w:ascii="Consolas" w:eastAsia="Consolas" w:hAnsi="Consolas" w:cs="Consolas"/>
+        </w:rPr>
+        <w:t xml:space="preserve">identity</w:t>
+      </w:r>
+      <w:r>
+        <w:t xml:space="preserve">) và mã lỗi của </w:t>
+      </w:r>
+      <w:r>
+        <w:rPr>
+          <w:rFonts w:ascii="Consolas" w:eastAsia="Consolas" w:hAnsi="Consolas" w:cs="Consolas"/>
+        </w:rPr>
+        <w:t xml:space="preserve">common</w:t>
+      </w:r>
+      <w:r>
+        <w:t xml:space="preserve">, nên hai module này cũng được nạp. Test vẫn tự dọn bảng và tự chèn owner của nó vào </w:t>
+      </w:r>
+      <w:r>
+        <w:rPr>
+          <w:rFonts w:ascii="Consolas" w:eastAsia="Consolas" w:hAnsi="Consolas" w:cs="Consolas"/>
+        </w:rPr>
+        <w:t xml:space="preserve">app_user</w:t>
+      </w:r>
+      <w:r>
+        <w:t xml:space="preserve"> bằng </w:t>
+      </w:r>
+      <w:r>
+        <w:rPr>
+          <w:rFonts w:ascii="Consolas" w:eastAsia="Consolas" w:hAnsi="Consolas" w:cs="Consolas"/>
+        </w:rPr>
+        <w:t xml:space="preserve">JdbcTemplate</w:t>
+      </w:r>
+      <w:r>
+        <w:t xml:space="preserve">, nên không phụ thuộc owner được tạo lúc khởi động.</w:t>
+      </w:r>
+    </w:p>
+    <w:p>
+      <w:pPr>
+        <w:pStyle w:val="ListParagraph"/>
+        <w:numPr>
+          <w:ilvl w:val="0"/>
+          <w:numId w:val="1"/>
+        </w:numPr>
+      </w:pPr>
+      <w:r>
+        <w:rPr>
+          <w:b/>
+          <w:bCs/>
+        </w:rPr>
+        <w:t xml:space="preserve">Test không có </w:t>
+      </w:r>
+      <w:r>
+        <w:rPr>
+          <w:rFonts w:ascii="Consolas" w:eastAsia="Consolas" w:hAnsi="Consolas" w:cs="Consolas"/>
+          <w:b/>
+          <w:bCs/>
+        </w:rPr>
+        <w:t xml:space="preserve">@Transactional</w:t>
+      </w:r>
+      <w:r>
+        <w:rPr>
+          <w:b/>
+          <w:bCs/>
+        </w:rPr>
+        <w:t xml:space="preserve">:</w:t>
+      </w:r>
+      <w:r>
+        <w:t xml:space="preserve"> để service tự commit hoặc rollback như khi chạy thật. Cái giá là dữ liệu ở lại sau mỗi test, nên </w:t>
+      </w:r>
+      <w:r>
+        <w:rPr>
+          <w:rFonts w:ascii="Consolas" w:eastAsia="Consolas" w:hAnsi="Consolas" w:cs="Consolas"/>
+        </w:rPr>
+        <w:t xml:space="preserve">@BeforeEach</w:t>
+      </w:r>
+      <w:r>
+        <w:t xml:space="preserve"> tự dọn bảng bằng </w:t>
+      </w:r>
+      <w:r>
+        <w:rPr>
+          <w:rFonts w:ascii="Consolas" w:eastAsia="Consolas" w:hAnsi="Consolas" w:cs="Consolas"/>
+        </w:rPr>
+        <w:t xml:space="preserve">JdbcTestUtils.deleteFromTables</w:t>
+      </w:r>
+      <w:r>
+        <w:t xml:space="preserve">.</w:t>
+      </w:r>
+    </w:p>
+    <w:p>
+      <w:pPr>
+        <w:pStyle w:val="ListParagraph"/>
+        <w:numPr>
+          <w:ilvl w:val="0"/>
+          <w:numId w:val="1"/>
+        </w:numPr>
+      </w:pPr>
+      <w:r>
+        <w:rPr>
+          <w:rFonts w:ascii="Consolas" w:eastAsia="Consolas" w:hAnsi="Consolas" w:cs="Consolas"/>
+          <w:b/>
+          <w:bCs/>
+        </w:rPr>
+        <w:t xml:space="preserve">AssertablePublishedEvents</w:t>
+      </w:r>
+      <w:r>
+        <w:rPr>
+          <w:b/>
+          <w:bCs/>
+        </w:rPr>
+        <w:t xml:space="preserve"> làm tham số của method test:</w:t>
+      </w:r>
+      <w:r>
+        <w:t xml:space="preserve"> Spring Modulith ghi lại mọi event được publish trong test đó; </w:t>
+      </w:r>
+      <w:r>
+        <w:rPr>
+          <w:rFonts w:ascii="Consolas" w:eastAsia="Consolas" w:hAnsi="Consolas" w:cs="Consolas"/>
+        </w:rPr>
+        <w:t xml:space="preserve">events.ofType(AccountConnected.class)</w:t>
+      </w:r>
+      <w:r>
+        <w:t xml:space="preserve"> lấy ra để kiểm tra số lượng và nội dung.</w:t>
+      </w:r>
+    </w:p>
+    <w:p>
+      <w:pPr>
+        <w:pStyle w:val="ListParagraph"/>
+        <w:numPr>
+          <w:ilvl w:val="0"/>
+          <w:numId w:val="1"/>
+        </w:numPr>
+      </w:pPr>
+      <w:r>
+        <w:rPr>
+          <w:rFonts w:ascii="Consolas" w:eastAsia="Consolas" w:hAnsi="Consolas" w:cs="Consolas"/>
+          <w:b/>
+          <w:bCs/>
+        </w:rPr>
+        <w:t xml:space="preserve">@MockitoSpyBean</w:t>
+      </w:r>
+      <w:r>
+        <w:rPr>
+          <w:b/>
+          <w:bCs/>
+        </w:rPr>
+        <w:t xml:space="preserve">:</w:t>
+      </w:r>
+      <w:r>
+        <w:t xml:space="preserve"> bọc bean thật. Bình thường nó chạy code thật; riêng một test bảo nó ném lỗi bằng </w:t>
+      </w:r>
+      <w:r>
+        <w:rPr>
+          <w:rFonts w:ascii="Consolas" w:eastAsia="Consolas" w:hAnsi="Consolas" w:cs="Consolas"/>
+        </w:rPr>
+        <w:t xml:space="preserve">doThrow(...).when(credentials).save(any(), any(), any())</w:t>
+      </w:r>
+      <w:r>
+        <w:t xml:space="preserve">, để giả lập "lưu credential thất bại" mà không sửa code production. Assertion vẫn kiểm tra DB thật, không kiểm tra mock.</w:t>
+      </w:r>
+    </w:p>
+    <w:p>
+      <w:pPr>
+        <w:pStyle w:val="ListParagraph"/>
+        <w:numPr>
+          <w:ilvl w:val="0"/>
+          <w:numId w:val="1"/>
+        </w:numPr>
+      </w:pPr>
+      <w:r>
+        <w:rPr>
+          <w:b/>
+          <w:bCs/>
+        </w:rPr>
+        <w:t xml:space="preserve">Bean riêng cho test:</w:t>
+      </w:r>
+      <w:r>
+        <w:t xml:space="preserve"> một class </w:t>
+      </w:r>
+      <w:r>
+        <w:rPr>
+          <w:rFonts w:ascii="Consolas" w:eastAsia="Consolas" w:hAnsi="Consolas" w:cs="Consolas"/>
+        </w:rPr>
+        <w:t xml:space="preserve">@TestConfiguration</w:t>
+      </w:r>
+      <w:r>
+        <w:t xml:space="preserve"> lồng trong class test tạo </w:t>
+      </w:r>
+      <w:r>
+        <w:rPr>
+          <w:rFonts w:ascii="Consolas" w:eastAsia="Consolas" w:hAnsi="Consolas" w:cs="Consolas"/>
+        </w:rPr>
+        <w:t xml:space="preserve">FakeMessageProvider</w:t>
+      </w:r>
+      <w:r>
+        <w:t xml:space="preserve"> loại </w:t>
+      </w:r>
+      <w:r>
+        <w:rPr>
+          <w:rFonts w:ascii="Consolas" w:eastAsia="Consolas" w:hAnsi="Consolas" w:cs="Consolas"/>
+        </w:rPr>
+        <w:t xml:space="preserve">fake</w:t>
+      </w:r>
+      <w:r>
+        <w:t xml:space="preserve"> làm bean, để </w:t>
+      </w:r>
+      <w:r>
+        <w:rPr>
+          <w:rFonts w:ascii="Consolas" w:eastAsia="Consolas" w:hAnsi="Consolas" w:cs="Consolas"/>
+        </w:rPr>
+        <w:t xml:space="preserve">ProviderRegistry</w:t>
+      </w:r>
+      <w:r>
+        <w:t xml:space="preserve"> thấy provider này.</w:t>
+      </w:r>
+    </w:p>
+    <w:p>
+      <w:pPr>
+        <w:pStyle w:val="ListParagraph"/>
+        <w:numPr>
+          <w:ilvl w:val="0"/>
+          <w:numId w:val="1"/>
+        </w:numPr>
+      </w:pPr>
+      <w:r>
+        <w:rPr>
+          <w:rFonts w:ascii="Consolas" w:eastAsia="Consolas" w:hAnsi="Consolas" w:cs="Consolas"/>
+          <w:b/>
+          <w:bCs/>
+        </w:rPr>
+        <w:t xml:space="preserve">row_to_json(c)::text</w:t>
+      </w:r>
+      <w:r>
+        <w:rPr>
+          <w:b/>
+          <w:bCs/>
+        </w:rPr>
+        <w:t xml:space="preserve"> của PostgreSQL:</w:t>
+      </w:r>
+      <w:r>
+        <w:t xml:space="preserve"> biến cả một dòng thành chuỗi JSON để kiểm tra bằng một lệnh rằng </w:t>
+      </w:r>
+      <w:r>
+        <w:rPr>
+          <w:b/>
+          <w:bCs/>
+        </w:rPr>
+        <w:t xml:space="preserve">không cột nào</w:t>
+      </w:r>
+      <w:r>
+        <w:t xml:space="preserve"> chứa token dạng chữ.</w:t>
+      </w:r>
+    </w:p>
+    <w:p>
+      <w:pPr>
+        <w:pStyle w:val="ListParagraph"/>
+        <w:numPr>
+          <w:ilvl w:val="0"/>
+          <w:numId w:val="1"/>
+        </w:numPr>
+      </w:pPr>
+      <w:r>
+        <w:rPr>
+          <w:rFonts w:ascii="Consolas" w:eastAsia="Consolas" w:hAnsi="Consolas" w:cs="Consolas"/>
+          <w:b/>
+          <w:bCs/>
+        </w:rPr>
+        <w:t xml:space="preserve">entityManager.flush()</w:t>
+      </w:r>
+      <w:r>
+        <w:rPr>
+          <w:b/>
+          <w:bCs/>
+        </w:rPr>
+        <w:t xml:space="preserve"> để lộ lỗi:</w:t>
+      </w:r>
+      <w:r>
+        <w:t xml:space="preserve"> trong </w:t>
+      </w:r>
+      <w:r>
+        <w:rPr>
+          <w:rFonts w:ascii="Consolas" w:eastAsia="Consolas" w:hAnsi="Consolas" w:cs="Consolas"/>
+        </w:rPr>
+        <w:t xml:space="preserve">@DataJpaTest</w:t>
+      </w:r>
+      <w:r>
+        <w:t xml:space="preserve">, lệnh ghi chỉ thật sự xuống DB khi flush. Muốn thấy lỗi khóa ngoại thì phải flush ngay trong đoạn code đang chờ lỗi; test còn kiểm tra cả stack trace của lỗi đó không chứa token.</w:t>
+      </w:r>
+    </w:p>
+    <w:p>
+      <w:pPr>
+        <w:pBdr>
+          <w:bottom w:val="single" w:sz="4" w:space="0" w:color="auto"/>
+        </w:pBdr>
+        <w:ind w:left="0"/>
+      </w:pPr>
+    </w:p>
+    <w:p>
+      <w:pPr>
+        <w:pStyle w:val="Heading2"/>
+      </w:pPr>
+      <w:r>
+        <w:t xml:space="preserve">21. Tự kiểm tra F02 (phần đã làm)</w:t>
       </w:r>
     </w:p>
     <w:p>
@@ -12211,6 +12992,90 @@
       </w:r>
       <w:r>
         <w:t xml:space="preserve">?</w:t>
+      </w:r>
+    </w:p>
+    <w:p>
+      <w:pPr>
+        <w:pStyle w:val="ListParagraph"/>
+        <w:numPr>
+          <w:ilvl w:val="0"/>
+          <w:numId w:val="101"/>
+        </w:numPr>
+      </w:pPr>
+      <w:r>
+        <w:t xml:space="preserve">Vì sao </w:t>
+      </w:r>
+      <w:r>
+        <w:rPr>
+          <w:rFonts w:ascii="Consolas" w:eastAsia="Consolas" w:hAnsi="Consolas" w:cs="Consolas"/>
+        </w:rPr>
+        <w:t xml:space="preserve">AccountQueryService</w:t>
+      </w:r>
+      <w:r>
+        <w:t xml:space="preserve"> không có method </w:t>
+      </w:r>
+      <w:r>
+        <w:rPr>
+          <w:rFonts w:ascii="Consolas" w:eastAsia="Consolas" w:hAnsi="Consolas" w:cs="Consolas"/>
+        </w:rPr>
+        <w:t xml:space="preserve">get(accountId)</w:t>
+      </w:r>
+      <w:r>
+        <w:t xml:space="preserve"> chỉ nhận ID?</w:t>
+      </w:r>
+    </w:p>
+    <w:p>
+      <w:pPr>
+        <w:pStyle w:val="ListParagraph"/>
+        <w:numPr>
+          <w:ilvl w:val="0"/>
+          <w:numId w:val="101"/>
+        </w:numPr>
+      </w:pPr>
+      <w:r>
+        <w:t xml:space="preserve">Vì sao account của người khác trả 404 mà không phải 403?</w:t>
+      </w:r>
+    </w:p>
+    <w:p>
+      <w:pPr>
+        <w:pStyle w:val="ListParagraph"/>
+        <w:numPr>
+          <w:ilvl w:val="0"/>
+          <w:numId w:val="101"/>
+        </w:numPr>
+      </w:pPr>
+      <w:r>
+        <w:t xml:space="preserve">Vì sao không trả thẳng entity </w:t>
+      </w:r>
+      <w:r>
+        <w:rPr>
+          <w:rFonts w:ascii="Consolas" w:eastAsia="Consolas" w:hAnsi="Consolas" w:cs="Consolas"/>
+        </w:rPr>
+        <w:t xml:space="preserve">ConnectedAccount</w:t>
+      </w:r>
+      <w:r>
+        <w:t xml:space="preserve"> ra JSON?</w:t>
+      </w:r>
+    </w:p>
+    <w:p>
+      <w:pPr>
+        <w:pStyle w:val="ListParagraph"/>
+        <w:numPr>
+          <w:ilvl w:val="0"/>
+          <w:numId w:val="101"/>
+        </w:numPr>
+      </w:pPr>
+      <w:r>
+        <w:t xml:space="preserve">Connector Gmail bị gỡ khỏi ứng dụng thì </w:t>
+      </w:r>
+      <w:r>
+        <w:rPr>
+          <w:rFonts w:ascii="Consolas" w:eastAsia="Consolas" w:hAnsi="Consolas" w:cs="Consolas"/>
+        </w:rPr>
+        <w:t xml:space="preserve">GET /api/accounts</w:t>
+      </w:r>
+      <w:r>
+        <w:t xml:space="preserve"> trả gì cho account Gmail cũ?</w:t>
       </w:r>
     </w:p>
     <w:p>
@@ -12219,7 +13084,7 @@
           <w:i/>
           <w:iCs/>
         </w:rPr>
-        <w:t xml:space="preserve">(Phần BE-15…BE-18 — REST API, xóa account, nghiệm thu — sẽ được bổ sung khi làm.)</w:t>
+        <w:t xml:space="preserve">(Phần BE-16…BE-18 — sửa account, xóa account, nghiệm thu — sẽ được bổ sung khi làm.)</w:t>
       </w:r>
     </w:p>
     <w:sectPr>

</xml_diff>

<commit_message>
docs(knowledge): add BE-16 (PATCH and status events) to the Phase 0 guide
New section 20 explains PATCH semantics (missing and null both mean
"keep", Boolean rather than boolean, at least one field), validation in
two layers with one rule (@ValidDisplayName calls the domain rule; why
@Size is wrong for emoji and blank names), changes through the actions
of the aggregate and AccountStatusChanged, why AccountStatus moved to
the module API, optimistic locking in practice and the single 404
factory. The test section gains @RecordApplicationEvents and the
TransactionTemplate trick; section 18.5 no longer lists the reconnect
event as pending; four self-check questions added. The Word copy is
regenerated (docs check clean) and the new pages were inspected.

Co-Authored-By: Claude Opus 5.5 (1M context) <noreply@anthropic.com>
</commit_message>
<xml_diff>
--- a/docs/knowledge/phase-0-backend-foundation.docx
+++ b/docs/knowledge/phase-0-backend-foundation.docx
@@ -97,7 +97,7 @@
         <w:t xml:space="preserve">Phạm vi:</w:t>
       </w:r>
       <w:r>
-        <w:t xml:space="preserve"> F01 Project Foundation và F03 Provider Contract (mục 0–12); F02 Connected Accounts (mục 13–21, đang làm: xong BE-09…BE-15).</w:t>
+        <w:t xml:space="preserve"> F01 Project Foundation và F03 Provider Contract (mục 0–12); F02 Connected Accounts (mục 13–22, đang làm: xong BE-09…BE-16).</w:t>
         <w:br/>
       </w:r>
       <w:r>
@@ -7283,7 +7283,7 @@
           </w:tcPr>
           <w:p>
             <w:r>
-              <w:t xml:space="preserve">BE-16…BE-18</w:t>
+              <w:t xml:space="preserve">BE-16</w:t>
             </w:r>
           </w:p>
         </w:tc>
@@ -7293,7 +7293,54 @@
           </w:tcPr>
           <w:p>
             <w:r>
-              <w:t xml:space="preserve">Sửa account (PATCH), xóa, nghiệm thu</w:t>
+              <w:t xml:space="preserve">Sửa account (</w:t>
+            </w:r>
+            <w:r>
+              <w:rPr>
+                <w:rFonts w:ascii="Consolas" w:eastAsia="Consolas" w:hAnsi="Consolas" w:cs="Consolas"/>
+              </w:rPr>
+              <w:t xml:space="preserve">PATCH</w:t>
+            </w:r>
+            <w:r>
+              <w:t xml:space="preserve">), event </w:t>
+            </w:r>
+            <w:r>
+              <w:rPr>
+                <w:rFonts w:ascii="Consolas" w:eastAsia="Consolas" w:hAnsi="Consolas" w:cs="Consolas"/>
+              </w:rPr>
+              <w:t xml:space="preserve">AccountStatusChanged</w:t>
+            </w:r>
+          </w:p>
+        </w:tc>
+        <w:tc>
+          <w:tcPr>
+            <w:tcW w:w="3120" w:type="dxa"/>
+          </w:tcPr>
+          <w:p>
+            <w:r>
+              <w:t xml:space="preserve">xong</w:t>
+            </w:r>
+          </w:p>
+        </w:tc>
+      </w:tr>
+      <w:tr>
+        <w:tc>
+          <w:tcPr>
+            <w:tcW w:w="3120" w:type="dxa"/>
+          </w:tcPr>
+          <w:p>
+            <w:r>
+              <w:t xml:space="preserve">BE-17…BE-18</w:t>
+            </w:r>
+          </w:p>
+        </w:tc>
+        <w:tc>
+          <w:tcPr>
+            <w:tcW w:w="3120" w:type="dxa"/>
+          </w:tcPr>
+          <w:p>
+            <w:r>
+              <w:t xml:space="preserve">Xóa account, nghiệm thu</w:t>
             </w:r>
           </w:p>
         </w:tc>
@@ -10949,7 +10996,7 @@
           <w:b/>
           <w:bCs/>
         </w:rPr>
-        <w:t xml:space="preserve">Chưa làm:</w:t>
+        <w:t xml:space="preserve">Làm ở BE-16:</w:t>
       </w:r>
       <w:r>
         <w:t xml:space="preserve"> khi reconnect đổi trạng thái thật (ví dụ </w:t>
@@ -10970,7 +11017,7 @@
         <w:t xml:space="preserve">CONNECTED</w:t>
       </w:r>
       <w:r>
-        <w:t xml:space="preserve">), design muốn có thêm event </w:t>
+        <w:t xml:space="preserve">), service phát thêm event </w:t>
       </w:r>
       <w:r>
         <w:rPr>
@@ -10979,25 +11026,7 @@
         <w:t xml:space="preserve">AccountStatusChanged</w:t>
       </w:r>
       <w:r>
-        <w:t xml:space="preserve">. Việc này dời sang BE-16, nơi event đó được tạo. Lý do: event mang </w:t>
-      </w:r>
-      <w:r>
-        <w:rPr>
-          <w:rFonts w:ascii="Consolas" w:eastAsia="Consolas" w:hAnsi="Consolas" w:cs="Consolas"/>
-        </w:rPr>
-        <w:t xml:space="preserve">from</w:t>
-      </w:r>
-      <w:r>
-        <w:t xml:space="preserve">/</w:t>
-      </w:r>
-      <w:r>
-        <w:rPr>
-          <w:rFonts w:ascii="Consolas" w:eastAsia="Consolas" w:hAnsi="Consolas" w:cs="Consolas"/>
-        </w:rPr>
-        <w:t xml:space="preserve">to</w:t>
-      </w:r>
-      <w:r>
-        <w:t xml:space="preserve"> kiểu </w:t>
+        <w:t xml:space="preserve">. Việc này dời sang BE-16, nơi event đó được tạo, vì phải chốt trước chỗ đặt </w:t>
       </w:r>
       <w:r>
         <w:rPr>
@@ -11006,34 +11035,7 @@
         <w:t xml:space="preserve">AccountStatus</w:t>
       </w:r>
       <w:r>
-        <w:t xml:space="preserve">, mà </w:t>
-      </w:r>
-      <w:r>
-        <w:rPr>
-          <w:rFonts w:ascii="Consolas" w:eastAsia="Consolas" w:hAnsi="Consolas" w:cs="Consolas"/>
-        </w:rPr>
-        <w:t xml:space="preserve">AccountStatus</w:t>
-      </w:r>
-      <w:r>
-        <w:t xml:space="preserve"> đang nằm trong package nội bộ </w:t>
-      </w:r>
-      <w:r>
-        <w:rPr>
-          <w:rFonts w:ascii="Consolas" w:eastAsia="Consolas" w:hAnsi="Consolas" w:cs="Consolas"/>
-        </w:rPr>
-        <w:t xml:space="preserve">account.domain</w:t>
-      </w:r>
-      <w:r>
-        <w:t xml:space="preserve">; module khác đọc event sẽ vi phạm luật Modulith. Vì vậy chỗ đặt </w:t>
-      </w:r>
-      <w:r>
-        <w:rPr>
-          <w:rFonts w:ascii="Consolas" w:eastAsia="Consolas" w:hAnsi="Consolas" w:cs="Consolas"/>
-        </w:rPr>
-        <w:t xml:space="preserve">AccountStatus</w:t>
-      </w:r>
-      <w:r>
-        <w:t xml:space="preserve"> phải chốt cùng lúc tạo event.</w:t>
+        <w:t xml:space="preserve"> (mục 20.4).</w:t>
       </w:r>
     </w:p>
     <w:p>
@@ -11739,39 +11741,211 @@
         <w:pStyle w:val="Heading2"/>
       </w:pPr>
       <w:r>
-        <w:t xml:space="preserve">20. Kỹ thuật test mới trong F02</w:t>
-      </w:r>
-    </w:p>
-    <w:p>
-      <w:pPr>
-        <w:pStyle w:val="ListParagraph"/>
-        <w:numPr>
-          <w:ilvl w:val="0"/>
-          <w:numId w:val="1"/>
-        </w:numPr>
-      </w:pPr>
-      <w:r>
-        <w:rPr>
-          <w:rFonts w:ascii="Consolas" w:eastAsia="Consolas" w:hAnsi="Consolas" w:cs="Consolas"/>
-          <w:b/>
-          <w:bCs/>
-        </w:rPr>
-        <w:t xml:space="preserve">@DataJpaTest</w:t>
-      </w:r>
-      <w:r>
-        <w:rPr>
-          <w:b/>
-          <w:bCs/>
-        </w:rPr>
-        <w:t xml:space="preserve"> + </w:t>
-      </w:r>
-      <w:r>
-        <w:rPr>
-          <w:rFonts w:ascii="Consolas" w:eastAsia="Consolas" w:hAnsi="Consolas" w:cs="Consolas"/>
-          <w:b/>
-          <w:bCs/>
-        </w:rPr>
-        <w:t xml:space="preserve">@AutoConfigureTestDatabase(replace = NONE)</w:t>
+        <w:t xml:space="preserve">20. Sửa account: PATCH và event trạng thái (BE-16)</w:t>
+      </w:r>
+    </w:p>
+    <w:p>
+      <w:pPr>
+        <w:pStyle w:val="Heading3"/>
+      </w:pPr>
+      <w:r>
+        <w:t xml:space="preserve">20.1 PATCH: chỉ gửi cái muốn đổi</w:t>
+      </w:r>
+    </w:p>
+    <w:p>
+      <w:pPr>
+        <w:pStyle w:val="ListParagraph"/>
+        <w:numPr>
+          <w:ilvl w:val="0"/>
+          <w:numId w:val="1"/>
+        </w:numPr>
+      </w:pPr>
+      <w:r>
+        <w:rPr>
+          <w:b/>
+          <w:bCs/>
+        </w:rPr>
+        <w:t xml:space="preserve">Ở đâu:</w:t>
+      </w:r>
+      <w:r>
+        <w:t xml:space="preserve"> </w:t>
+      </w:r>
+      <w:r>
+        <w:rPr>
+          <w:rFonts w:ascii="Consolas" w:eastAsia="Consolas" w:hAnsi="Consolas" w:cs="Consolas"/>
+        </w:rPr>
+        <w:t xml:space="preserve">account/api/AccountsController.java</w:t>
+      </w:r>
+      <w:r>
+        <w:t xml:space="preserve"> (method </w:t>
+      </w:r>
+      <w:r>
+        <w:rPr>
+          <w:rFonts w:ascii="Consolas" w:eastAsia="Consolas" w:hAnsi="Consolas" w:cs="Consolas"/>
+        </w:rPr>
+        <w:t xml:space="preserve">update</w:t>
+      </w:r>
+      <w:r>
+        <w:t xml:space="preserve">), </w:t>
+      </w:r>
+      <w:r>
+        <w:rPr>
+          <w:rFonts w:ascii="Consolas" w:eastAsia="Consolas" w:hAnsi="Consolas" w:cs="Consolas"/>
+        </w:rPr>
+        <w:t xml:space="preserve">account/api/UpdateAccountRequest.java</w:t>
+      </w:r>
+      <w:r>
+        <w:t xml:space="preserve">, </w:t>
+      </w:r>
+      <w:r>
+        <w:rPr>
+          <w:rFonts w:ascii="Consolas" w:eastAsia="Consolas" w:hAnsi="Consolas" w:cs="Consolas"/>
+        </w:rPr>
+        <w:t xml:space="preserve">account/application/AccountManagementService.java</w:t>
+      </w:r>
+      <w:r>
+        <w:t xml:space="preserve">, </w:t>
+      </w:r>
+      <w:r>
+        <w:rPr>
+          <w:rFonts w:ascii="Consolas" w:eastAsia="Consolas" w:hAnsi="Consolas" w:cs="Consolas"/>
+        </w:rPr>
+        <w:t xml:space="preserve">account/application/UpdateAccountCommand.java</w:t>
+      </w:r>
+      <w:r>
+        <w:t xml:space="preserve">.</w:t>
+      </w:r>
+    </w:p>
+    <w:p>
+      <w:pPr>
+        <w:pStyle w:val="ListParagraph"/>
+        <w:numPr>
+          <w:ilvl w:val="0"/>
+          <w:numId w:val="1"/>
+        </w:numPr>
+      </w:pPr>
+      <w:r>
+        <w:rPr>
+          <w:b/>
+          <w:bCs/>
+        </w:rPr>
+        <w:t xml:space="preserve">PUT và PATCH:</w:t>
+      </w:r>
+      <w:r>
+        <w:t xml:space="preserve"> PUT thay </w:t>
+      </w:r>
+      <w:r>
+        <w:rPr>
+          <w:b/>
+          <w:bCs/>
+        </w:rPr>
+        <w:t xml:space="preserve">cả</w:t>
+      </w:r>
+      <w:r>
+        <w:t xml:space="preserve"> tài nguyên; PATCH chỉ sửa </w:t>
+      </w:r>
+      <w:r>
+        <w:rPr>
+          <w:b/>
+          <w:bCs/>
+        </w:rPr>
+        <w:t xml:space="preserve">một phần</w:t>
+      </w:r>
+      <w:r>
+        <w:t xml:space="preserve">. Body </w:t>
+      </w:r>
+      <w:r>
+        <w:rPr>
+          <w:rFonts w:ascii="Consolas" w:eastAsia="Consolas" w:hAnsi="Consolas" w:cs="Consolas"/>
+        </w:rPr>
+        <w:t xml:space="preserve">{"syncEnabled": false}</w:t>
+      </w:r>
+      <w:r>
+        <w:t xml:space="preserve"> chỉ đụng tới một trường.</w:t>
+      </w:r>
+    </w:p>
+    <w:p>
+      <w:pPr>
+        <w:pStyle w:val="ListParagraph"/>
+        <w:numPr>
+          <w:ilvl w:val="0"/>
+          <w:numId w:val="1"/>
+        </w:numPr>
+      </w:pPr>
+      <w:r>
+        <w:rPr>
+          <w:b/>
+          <w:bCs/>
+        </w:rPr>
+        <w:t xml:space="preserve">Trường vắng mặt và </w:t>
+      </w:r>
+      <w:r>
+        <w:rPr>
+          <w:rFonts w:ascii="Consolas" w:eastAsia="Consolas" w:hAnsi="Consolas" w:cs="Consolas"/>
+          <w:b/>
+          <w:bCs/>
+        </w:rPr>
+        <w:t xml:space="preserve">null</w:t>
+      </w:r>
+      <w:r>
+        <w:rPr>
+          <w:b/>
+          <w:bCs/>
+        </w:rPr>
+        <w:t xml:space="preserve"> cùng nghĩa "giữ nguyên".</w:t>
+      </w:r>
+      <w:r>
+        <w:t xml:space="preserve"> Không cần phân biệt hai trường hợp này vì không trường nào của account được phép xóa về rỗng. Nếu sau này cần, phải dùng kiểu khác (ví dụ </w:t>
+      </w:r>
+      <w:r>
+        <w:rPr>
+          <w:rFonts w:ascii="Consolas" w:eastAsia="Consolas" w:hAnsi="Consolas" w:cs="Consolas"/>
+        </w:rPr>
+        <w:t xml:space="preserve">Optional</w:t>
+      </w:r>
+      <w:r>
+        <w:t xml:space="preserve">), vì record Java không biết client gửi </w:t>
+      </w:r>
+      <w:r>
+        <w:rPr>
+          <w:rFonts w:ascii="Consolas" w:eastAsia="Consolas" w:hAnsi="Consolas" w:cs="Consolas"/>
+        </w:rPr>
+        <w:t xml:space="preserve">null</w:t>
+      </w:r>
+      <w:r>
+        <w:t xml:space="preserve"> hay không gửi gì.</w:t>
+      </w:r>
+    </w:p>
+    <w:p>
+      <w:pPr>
+        <w:pStyle w:val="ListParagraph"/>
+        <w:numPr>
+          <w:ilvl w:val="0"/>
+          <w:numId w:val="1"/>
+        </w:numPr>
+      </w:pPr>
+      <w:r>
+        <w:rPr>
+          <w:rFonts w:ascii="Consolas" w:eastAsia="Consolas" w:hAnsi="Consolas" w:cs="Consolas"/>
+          <w:b/>
+          <w:bCs/>
+        </w:rPr>
+        <w:t xml:space="preserve">Boolean</w:t>
+      </w:r>
+      <w:r>
+        <w:rPr>
+          <w:b/>
+          <w:bCs/>
+        </w:rPr>
+        <w:t xml:space="preserve"> (B hoa) chứ không phải </w:t>
+      </w:r>
+      <w:r>
+        <w:rPr>
+          <w:rFonts w:ascii="Consolas" w:eastAsia="Consolas" w:hAnsi="Consolas" w:cs="Consolas"/>
+          <w:b/>
+          <w:bCs/>
+        </w:rPr>
+        <w:t xml:space="preserve">boolean</w:t>
       </w:r>
       <w:r>
         <w:rPr>
@@ -11781,13 +11955,295 @@
         <w:t xml:space="preserve">:</w:t>
       </w:r>
       <w:r>
-        <w:t xml:space="preserve"> slice chỉ nạp JPA và Flyway, chạy trên PostgreSQL thật (Testcontainers) để </w:t>
-      </w:r>
-      <w:r>
-        <w:rPr>
-          <w:rFonts w:ascii="Consolas" w:eastAsia="Consolas" w:hAnsi="Consolas" w:cs="Consolas"/>
-        </w:rPr>
-        <w:t xml:space="preserve">CHECK</w:t>
+        <w:t xml:space="preserve"> </w:t>
+      </w:r>
+      <w:r>
+        <w:rPr>
+          <w:rFonts w:ascii="Consolas" w:eastAsia="Consolas" w:hAnsi="Consolas" w:cs="Consolas"/>
+        </w:rPr>
+        <w:t xml:space="preserve">boolean</w:t>
+      </w:r>
+      <w:r>
+        <w:t xml:space="preserve"> không có giá trị </w:t>
+      </w:r>
+      <w:r>
+        <w:rPr>
+          <w:rFonts w:ascii="Consolas" w:eastAsia="Consolas" w:hAnsi="Consolas" w:cs="Consolas"/>
+        </w:rPr>
+        <w:t xml:space="preserve">null</w:t>
+      </w:r>
+      <w:r>
+        <w:t xml:space="preserve">, nên không biết client có gửi trường đó hay không.</w:t>
+      </w:r>
+    </w:p>
+    <w:p>
+      <w:pPr>
+        <w:pStyle w:val="ListParagraph"/>
+        <w:numPr>
+          <w:ilvl w:val="0"/>
+          <w:numId w:val="1"/>
+        </w:numPr>
+      </w:pPr>
+      <w:r>
+        <w:rPr>
+          <w:rFonts w:ascii="Consolas" w:eastAsia="Consolas" w:hAnsi="Consolas" w:cs="Consolas"/>
+          <w:b/>
+          <w:bCs/>
+        </w:rPr>
+        <w:t xml:space="preserve">{}</w:t>
+      </w:r>
+      <w:r>
+        <w:rPr>
+          <w:b/>
+          <w:bCs/>
+        </w:rPr>
+        <w:t xml:space="preserve"> bị từ chối (400):</w:t>
+      </w:r>
+      <w:r>
+        <w:t xml:space="preserve"> </w:t>
+      </w:r>
+      <w:r>
+        <w:rPr>
+          <w:rFonts w:ascii="Consolas" w:eastAsia="Consolas" w:hAnsi="Consolas" w:cs="Consolas"/>
+        </w:rPr>
+        <w:t xml:space="preserve">@AssertTrue</w:t>
+      </w:r>
+      <w:r>
+        <w:t xml:space="preserve"> gắn trên method </w:t>
+      </w:r>
+      <w:r>
+        <w:rPr>
+          <w:rFonts w:ascii="Consolas" w:eastAsia="Consolas" w:hAnsi="Consolas" w:cs="Consolas"/>
+        </w:rPr>
+        <w:t xml:space="preserve">isAnyFieldGiven()</w:t>
+      </w:r>
+      <w:r>
+        <w:t xml:space="preserve">. Bean Validation coi method </w:t>
+      </w:r>
+      <w:r>
+        <w:rPr>
+          <w:rFonts w:ascii="Consolas" w:eastAsia="Consolas" w:hAnsi="Consolas" w:cs="Consolas"/>
+        </w:rPr>
+        <w:t xml:space="preserve">isXxx()</w:t>
+      </w:r>
+      <w:r>
+        <w:t xml:space="preserve"> như một thuộc tính và báo lỗi khi nó trả </w:t>
+      </w:r>
+      <w:r>
+        <w:rPr>
+          <w:rFonts w:ascii="Consolas" w:eastAsia="Consolas" w:hAnsi="Consolas" w:cs="Consolas"/>
+        </w:rPr>
+        <w:t xml:space="preserve">false</w:t>
+      </w:r>
+      <w:r>
+        <w:t xml:space="preserve">.</w:t>
+      </w:r>
+    </w:p>
+    <w:p>
+      <w:pPr>
+        <w:pStyle w:val="Heading3"/>
+      </w:pPr>
+      <w:r>
+        <w:t xml:space="preserve">20.2 Kiểm tra ở hai tầng, dùng một luật</w:t>
+      </w:r>
+    </w:p>
+    <w:p>
+      <w:pPr>
+        <w:shd w:val="clear" w:color="auto" w:fill="F2F3F5"/>
+        <w:ind w:left="0"/>
+      </w:pPr>
+      <w:r>
+        <w:rPr>
+          <w:rFonts w:ascii="Consolas" w:eastAsia="Consolas" w:hAnsi="Consolas" w:cs="Consolas"/>
+          <w:sz w:val="19"/>
+          <w:szCs w:val="19"/>
+        </w:rPr>
+        <w:t xml:space="preserve">JSON</w:t>
+        <w:br/>
+        <w:t xml:space="preserve">  |</w:t>
+        <w:br/>
+        <w:t xml:space="preserve">  v</w:t>
+        <w:br/>
+        <w:t xml:space="preserve">UpdateAccountRequest        @Valid: @ValidDisplayName, @AssertTrue</w:t>
+        <w:br/>
+        <w:t xml:space="preserve">  |                         sai -&gt; 400 VALIDATION_FAILED</w:t>
+        <w:br/>
+        <w:t xml:space="preserve">  v</w:t>
+        <w:br/>
+        <w:t xml:space="preserve">AccountManagementService.update</w:t>
+        <w:br/>
+        <w:t xml:space="preserve">  |</w:t>
+        <w:br/>
+        <w:t xml:space="preserve">  v</w:t>
+        <w:br/>
+        <w:t xml:space="preserve">ConnectedAccount.rename()   luật domain, lớp bảo vệ cuối</w:t>
+        <w:br/>
+        <w:t xml:space="preserve">                            sai -&gt; IllegalArgumentException -&gt; 500</w:t>
+      </w:r>
+    </w:p>
+    <w:p>
+      <w:pPr>
+        <w:pStyle w:val="ListParagraph"/>
+        <w:numPr>
+          <w:ilvl w:val="0"/>
+          <w:numId w:val="1"/>
+        </w:numPr>
+      </w:pPr>
+      <w:r>
+        <w:t xml:space="preserve">Tầng web phải bắt hết lỗi do người dùng nhập, vì lỗi nào lọt xuống domain sẽ thành 500 ("lỗi server") thay vì 400.</w:t>
+      </w:r>
+    </w:p>
+    <w:p>
+      <w:pPr>
+        <w:pStyle w:val="ListParagraph"/>
+        <w:numPr>
+          <w:ilvl w:val="0"/>
+          <w:numId w:val="1"/>
+        </w:numPr>
+      </w:pPr>
+      <w:r>
+        <w:t xml:space="preserve">Hai tầng dùng </w:t>
+      </w:r>
+      <w:r>
+        <w:rPr>
+          <w:b/>
+          <w:bCs/>
+        </w:rPr>
+        <w:t xml:space="preserve">cùng một luật</w:t>
+      </w:r>
+      <w:r>
+        <w:t xml:space="preserve">: method static </w:t>
+      </w:r>
+      <w:r>
+        <w:rPr>
+          <w:rFonts w:ascii="Consolas" w:eastAsia="Consolas" w:hAnsi="Consolas" w:cs="Consolas"/>
+        </w:rPr>
+        <w:t xml:space="preserve">ConnectedAccount.isValidDisplayName</w:t>
+      </w:r>
+      <w:r>
+        <w:t xml:space="preserve">. Constraint tự viết </w:t>
+      </w:r>
+      <w:r>
+        <w:rPr>
+          <w:rFonts w:ascii="Consolas" w:eastAsia="Consolas" w:hAnsi="Consolas" w:cs="Consolas"/>
+        </w:rPr>
+        <w:t xml:space="preserve">@ValidDisplayName</w:t>
+      </w:r>
+      <w:r>
+        <w:t xml:space="preserve"> chỉ gọi lại luật đó. Sửa luật ở một chỗ thì cả hai tầng đổi theo.</w:t>
+      </w:r>
+    </w:p>
+    <w:p>
+      <w:pPr>
+        <w:pStyle w:val="ListParagraph"/>
+        <w:numPr>
+          <w:ilvl w:val="0"/>
+          <w:numId w:val="1"/>
+        </w:numPr>
+      </w:pPr>
+      <w:r>
+        <w:rPr>
+          <w:b/>
+          <w:bCs/>
+        </w:rPr>
+        <w:t xml:space="preserve">Vì sao không dùng </w:t>
+      </w:r>
+      <w:r>
+        <w:rPr>
+          <w:rFonts w:ascii="Consolas" w:eastAsia="Consolas" w:hAnsi="Consolas" w:cs="Consolas"/>
+          <w:b/>
+          <w:bCs/>
+        </w:rPr>
+        <w:t xml:space="preserve">@Size(min = 1, max = 100)</w:t>
+      </w:r>
+      <w:r>
+        <w:rPr>
+          <w:b/>
+          <w:bCs/>
+        </w:rPr>
+        <w:t xml:space="preserve">:</w:t>
+      </w:r>
+      <w:r>
+        <w:t xml:space="preserve"> </w:t>
+      </w:r>
+      <w:r>
+        <w:rPr>
+          <w:rFonts w:ascii="Consolas" w:eastAsia="Consolas" w:hAnsi="Consolas" w:cs="Consolas"/>
+        </w:rPr>
+        <w:t xml:space="preserve">@Size</w:t>
+      </w:r>
+      <w:r>
+        <w:t xml:space="preserve"> đếm </w:t>
+      </w:r>
+      <w:r>
+        <w:rPr>
+          <w:rFonts w:ascii="Consolas" w:eastAsia="Consolas" w:hAnsi="Consolas" w:cs="Consolas"/>
+        </w:rPr>
+        <w:t xml:space="preserve">char</w:t>
+      </w:r>
+      <w:r>
+        <w:t xml:space="preserve"> của Java (một emoji là 2 </w:t>
+      </w:r>
+      <w:r>
+        <w:rPr>
+          <w:rFonts w:ascii="Consolas" w:eastAsia="Consolas" w:hAnsi="Consolas" w:cs="Consolas"/>
+        </w:rPr>
+        <w:t xml:space="preserve">char</w:t>
+      </w:r>
+      <w:r>
+        <w:t xml:space="preserve">, mục 16.4) nên từ chối một tên 100 emoji hợp lệ. Còn </w:t>
+      </w:r>
+      <w:r>
+        <w:rPr>
+          <w:rFonts w:ascii="Consolas" w:eastAsia="Consolas" w:hAnsi="Consolas" w:cs="Consolas"/>
+        </w:rPr>
+        <w:t xml:space="preserve">"   "</w:t>
+      </w:r>
+      <w:r>
+        <w:t xml:space="preserve"> dài 3 ký tự nên lọt qua </w:t>
+      </w:r>
+      <w:r>
+        <w:rPr>
+          <w:rFonts w:ascii="Consolas" w:eastAsia="Consolas" w:hAnsi="Consolas" w:cs="Consolas"/>
+        </w:rPr>
+        <w:t xml:space="preserve">@Size</w:t>
+      </w:r>
+      <w:r>
+        <w:t xml:space="preserve">, xuống domain bị từ chối và thành 500. Kiểm tra ngược đã cho thấy đúng hai lỗi này.</w:t>
+      </w:r>
+    </w:p>
+    <w:p>
+      <w:pPr>
+        <w:pStyle w:val="ListParagraph"/>
+        <w:numPr>
+          <w:ilvl w:val="0"/>
+          <w:numId w:val="1"/>
+        </w:numPr>
+      </w:pPr>
+      <w:r>
+        <w:rPr>
+          <w:b/>
+          <w:bCs/>
+        </w:rPr>
+        <w:t xml:space="preserve">Cách viết một constraint riêng:</w:t>
+      </w:r>
+      <w:r>
+        <w:t xml:space="preserve"> annotation có </w:t>
+      </w:r>
+      <w:r>
+        <w:rPr>
+          <w:rFonts w:ascii="Consolas" w:eastAsia="Consolas" w:hAnsi="Consolas" w:cs="Consolas"/>
+        </w:rPr>
+        <w:t xml:space="preserve">@Constraint(validatedBy = ...)</w:t>
+      </w:r>
+      <w:r>
+        <w:t xml:space="preserve"> và ba thuộc tính bắt buộc (</w:t>
+      </w:r>
+      <w:r>
+        <w:rPr>
+          <w:rFonts w:ascii="Consolas" w:eastAsia="Consolas" w:hAnsi="Consolas" w:cs="Consolas"/>
+        </w:rPr>
+        <w:t xml:space="preserve">message</w:t>
       </w:r>
       <w:r>
         <w:t xml:space="preserve">, </w:t>
@@ -11796,211 +12252,207 @@
         <w:rPr>
           <w:rFonts w:ascii="Consolas" w:eastAsia="Consolas" w:hAnsi="Consolas" w:cs="Consolas"/>
         </w:rPr>
-        <w:t xml:space="preserve">UNIQUE</w:t>
-      </w:r>
-      <w:r>
-        <w:t xml:space="preserve">, khóa ngoại hoạt động như production. Mỗi test tự rollback.</w:t>
-      </w:r>
-    </w:p>
-    <w:p>
-      <w:pPr>
-        <w:pStyle w:val="ListParagraph"/>
-        <w:numPr>
-          <w:ilvl w:val="0"/>
-          <w:numId w:val="1"/>
-        </w:numPr>
-      </w:pPr>
-      <w:r>
-        <w:rPr>
-          <w:rFonts w:ascii="Consolas" w:eastAsia="Consolas" w:hAnsi="Consolas" w:cs="Consolas"/>
-          <w:b/>
-          <w:bCs/>
-        </w:rPr>
-        <w:t xml:space="preserve">entityManager.clear()</w:t>
-      </w:r>
-      <w:r>
-        <w:rPr>
-          <w:b/>
-          <w:bCs/>
-        </w:rPr>
-        <w:t xml:space="preserve">:</w:t>
-      </w:r>
-      <w:r>
-        <w:t xml:space="preserve"> xóa bộ nhớ đệm của Hibernate để lần đọc sau thật sự đi xuống DB. Không có nó, test chỉ đọc lại object trong bộ nhớ.</w:t>
-      </w:r>
-    </w:p>
-    <w:p>
-      <w:pPr>
-        <w:pStyle w:val="ListParagraph"/>
-        <w:numPr>
-          <w:ilvl w:val="0"/>
-          <w:numId w:val="1"/>
-        </w:numPr>
-      </w:pPr>
-      <w:r>
-        <w:rPr>
-          <w:rFonts w:ascii="Consolas" w:eastAsia="Consolas" w:hAnsi="Consolas" w:cs="Consolas"/>
-          <w:b/>
-          <w:bCs/>
-        </w:rPr>
-        <w:t xml:space="preserve">JdbcTemplate</w:t>
-      </w:r>
-      <w:r>
-        <w:rPr>
-          <w:b/>
-          <w:bCs/>
-        </w:rPr>
-        <w:t xml:space="preserve">:</w:t>
-      </w:r>
-      <w:r>
-        <w:t xml:space="preserve"> chạy SQL thô để nhìn đúng cái nằm trong DB, hoặc để thử ràng buộc mà Java không tạo ra được (ví dụ ghi </w:t>
-      </w:r>
-      <w:r>
-        <w:rPr>
-          <w:rFonts w:ascii="Consolas" w:eastAsia="Consolas" w:hAnsi="Consolas" w:cs="Consolas"/>
-        </w:rPr>
-        <w:t xml:space="preserve">status = 'SYNCING'</w:t>
-      </w:r>
-      <w:r>
-        <w:t xml:space="preserve">).</w:t>
-      </w:r>
-    </w:p>
-    <w:p>
-      <w:pPr>
-        <w:pStyle w:val="ListParagraph"/>
-        <w:numPr>
-          <w:ilvl w:val="0"/>
-          <w:numId w:val="1"/>
-        </w:numPr>
-      </w:pPr>
-      <w:r>
-        <w:rPr>
-          <w:rFonts w:ascii="Consolas" w:eastAsia="Consolas" w:hAnsi="Consolas" w:cs="Consolas"/>
-          <w:b/>
-          <w:bCs/>
-        </w:rPr>
-        <w:t xml:space="preserve">ApplicationContextRunner</w:t>
-      </w:r>
-      <w:r>
-        <w:rPr>
-          <w:b/>
-          <w:bCs/>
-        </w:rPr>
-        <w:t xml:space="preserve"> cho kiểm tra khởi động:</w:t>
-      </w:r>
-      <w:r>
-        <w:t xml:space="preserve"> dựng một context nhỏ với cấu hình sai để chứng minh app </w:t>
-      </w:r>
-      <w:r>
-        <w:rPr>
-          <w:b/>
-          <w:bCs/>
-        </w:rPr>
-        <w:t xml:space="preserve">không</w:t>
-      </w:r>
-      <w:r>
-        <w:t xml:space="preserve"> start và thông báo không lộ secret.</w:t>
-      </w:r>
-    </w:p>
-    <w:p>
-      <w:pPr>
-        <w:pStyle w:val="ListParagraph"/>
-        <w:numPr>
-          <w:ilvl w:val="0"/>
-          <w:numId w:val="1"/>
-        </w:numPr>
-      </w:pPr>
-      <w:r>
-        <w:rPr>
-          <w:b/>
-          <w:bCs/>
-        </w:rPr>
-        <w:t xml:space="preserve">Mockito </w:t>
-      </w:r>
-      <w:r>
-        <w:rPr>
-          <w:rFonts w:ascii="Consolas" w:eastAsia="Consolas" w:hAnsi="Consolas" w:cs="Consolas"/>
-          <w:b/>
-          <w:bCs/>
-        </w:rPr>
-        <w:t xml:space="preserve">mock(...)</w:t>
-      </w:r>
-      <w:r>
-        <w:rPr>
-          <w:b/>
-          <w:bCs/>
-        </w:rPr>
-        <w:t xml:space="preserve"> trong unit test:</w:t>
-      </w:r>
-      <w:r>
-        <w:t xml:space="preserve"> </w:t>
-      </w:r>
-      <w:r>
-        <w:rPr>
-          <w:rFonts w:ascii="Consolas" w:eastAsia="Consolas" w:hAnsi="Consolas" w:cs="Consolas"/>
-        </w:rPr>
-        <w:t xml:space="preserve">OwnerCurrentUserTests</w:t>
-      </w:r>
-      <w:r>
-        <w:t xml:space="preserve"> giả repository để test </w:t>
-      </w:r>
-      <w:r>
-        <w:rPr>
-          <w:rFonts w:ascii="Consolas" w:eastAsia="Consolas" w:hAnsi="Consolas" w:cs="Consolas"/>
-        </w:rPr>
-        <w:t xml:space="preserve">CurrentUser</w:t>
-      </w:r>
-      <w:r>
-        <w:t xml:space="preserve"> mà không cần DB.</w:t>
-      </w:r>
-    </w:p>
-    <w:p>
-      <w:pPr>
-        <w:pStyle w:val="ListParagraph"/>
-        <w:numPr>
-          <w:ilvl w:val="0"/>
-          <w:numId w:val="1"/>
-        </w:numPr>
-      </w:pPr>
-      <w:r>
-        <w:rPr>
-          <w:b/>
-          <w:bCs/>
-        </w:rPr>
-        <w:t xml:space="preserve">Kiểm tra ngược ở mọi task:</w:t>
-      </w:r>
-    </w:p>
-    <w:p>
-      <w:pPr>
-        <w:pStyle w:val="ListParagraph"/>
-        <w:numPr>
-          <w:ilvl w:val="1"/>
-          <w:numId w:val="1"/>
-        </w:numPr>
-      </w:pPr>
-      <w:r>
-        <w:t xml:space="preserve">BE-09: bỏ bước tìm theo email → 2 test idempotent đỏ.</w:t>
-      </w:r>
-    </w:p>
-    <w:p>
-      <w:pPr>
-        <w:pStyle w:val="ListParagraph"/>
-        <w:numPr>
-          <w:ilvl w:val="1"/>
-          <w:numId w:val="1"/>
-        </w:numPr>
-      </w:pPr>
-      <w:r>
-        <w:t xml:space="preserve">BE-10: cho </w:t>
-      </w:r>
-      <w:r>
-        <w:rPr>
-          <w:rFonts w:ascii="Consolas" w:eastAsia="Consolas" w:hAnsi="Consolas" w:cs="Consolas"/>
-        </w:rPr>
-        <w:t xml:space="preserve">markHealthy</w:t>
-      </w:r>
-      <w:r>
-        <w:t xml:space="preserve"> gỡ </w:t>
+        <w:t xml:space="preserve">groups</w:t>
+      </w:r>
+      <w:r>
+        <w:t xml:space="preserve">, </w:t>
+      </w:r>
+      <w:r>
+        <w:rPr>
+          <w:rFonts w:ascii="Consolas" w:eastAsia="Consolas" w:hAnsi="Consolas" w:cs="Consolas"/>
+        </w:rPr>
+        <w:t xml:space="preserve">payload</w:t>
+      </w:r>
+      <w:r>
+        <w:t xml:space="preserve">), cộng một class </w:t>
+      </w:r>
+      <w:r>
+        <w:rPr>
+          <w:rFonts w:ascii="Consolas" w:eastAsia="Consolas" w:hAnsi="Consolas" w:cs="Consolas"/>
+        </w:rPr>
+        <w:t xml:space="preserve">ConstraintValidator</w:t>
+      </w:r>
+      <w:r>
+        <w:t xml:space="preserve"> có method </w:t>
+      </w:r>
+      <w:r>
+        <w:rPr>
+          <w:rFonts w:ascii="Consolas" w:eastAsia="Consolas" w:hAnsi="Consolas" w:cs="Consolas"/>
+        </w:rPr>
+        <w:t xml:space="preserve">isValid</w:t>
+      </w:r>
+      <w:r>
+        <w:t xml:space="preserve">. Giá trị </w:t>
+      </w:r>
+      <w:r>
+        <w:rPr>
+          <w:rFonts w:ascii="Consolas" w:eastAsia="Consolas" w:hAnsi="Consolas" w:cs="Consolas"/>
+        </w:rPr>
+        <w:t xml:space="preserve">null</w:t>
+      </w:r>
+      <w:r>
+        <w:t xml:space="preserve"> trả </w:t>
+      </w:r>
+      <w:r>
+        <w:rPr>
+          <w:rFonts w:ascii="Consolas" w:eastAsia="Consolas" w:hAnsi="Consolas" w:cs="Consolas"/>
+        </w:rPr>
+        <w:t xml:space="preserve">true</w:t>
+      </w:r>
+      <w:r>
+        <w:t xml:space="preserve">, vì "không gửi" là hợp lệ.</w:t>
+      </w:r>
+    </w:p>
+    <w:p>
+      <w:pPr>
+        <w:pStyle w:val="Heading3"/>
+      </w:pPr>
+      <w:r>
+        <w:t xml:space="preserve">20.3 Mọi thay đổi đi qua hành động của aggregate</w:t>
+      </w:r>
+    </w:p>
+    <w:p>
+      <w:pPr>
+        <w:pStyle w:val="ListParagraph"/>
+        <w:numPr>
+          <w:ilvl w:val="0"/>
+          <w:numId w:val="1"/>
+        </w:numPr>
+      </w:pPr>
+      <w:r>
+        <w:t xml:space="preserve">Service không gán </w:t>
+      </w:r>
+      <w:r>
+        <w:rPr>
+          <w:rFonts w:ascii="Consolas" w:eastAsia="Consolas" w:hAnsi="Consolas" w:cs="Consolas"/>
+        </w:rPr>
+        <w:t xml:space="preserve">status</w:t>
+      </w:r>
+      <w:r>
+        <w:t xml:space="preserve">; nó gọi </w:t>
+      </w:r>
+      <w:r>
+        <w:rPr>
+          <w:rFonts w:ascii="Consolas" w:eastAsia="Consolas" w:hAnsi="Consolas" w:cs="Consolas"/>
+        </w:rPr>
+        <w:t xml:space="preserve">enable()</w:t>
+      </w:r>
+      <w:r>
+        <w:t xml:space="preserve">, </w:t>
+      </w:r>
+      <w:r>
+        <w:rPr>
+          <w:rFonts w:ascii="Consolas" w:eastAsia="Consolas" w:hAnsi="Consolas" w:cs="Consolas"/>
+        </w:rPr>
+        <w:t xml:space="preserve">disable()</w:t>
+      </w:r>
+      <w:r>
+        <w:t xml:space="preserve">, </w:t>
+      </w:r>
+      <w:r>
+        <w:rPr>
+          <w:rFonts w:ascii="Consolas" w:eastAsia="Consolas" w:hAnsi="Consolas" w:cs="Consolas"/>
+        </w:rPr>
+        <w:t xml:space="preserve">rename()</w:t>
+      </w:r>
+      <w:r>
+        <w:t xml:space="preserve">, </w:t>
+      </w:r>
+      <w:r>
+        <w:rPr>
+          <w:rFonts w:ascii="Consolas" w:eastAsia="Consolas" w:hAnsi="Consolas" w:cs="Consolas"/>
+        </w:rPr>
+        <w:t xml:space="preserve">pauseSync()</w:t>
+      </w:r>
+      <w:r>
+        <w:t xml:space="preserve">, </w:t>
+      </w:r>
+      <w:r>
+        <w:rPr>
+          <w:rFonts w:ascii="Consolas" w:eastAsia="Consolas" w:hAnsi="Consolas" w:cs="Consolas"/>
+        </w:rPr>
+        <w:t xml:space="preserve">resumeSync()</w:t>
+      </w:r>
+      <w:r>
+        <w:t xml:space="preserve">. Nhờ vậy bảng chuyển trạng thái (mục 16.2) tự áp dụng: </w:t>
+      </w:r>
+      <w:r>
+        <w:rPr>
+          <w:rFonts w:ascii="Consolas" w:eastAsia="Consolas" w:hAnsi="Consolas" w:cs="Consolas"/>
+        </w:rPr>
+        <w:t xml:space="preserve">{"enabled": true}</w:t>
+      </w:r>
+      <w:r>
+        <w:t xml:space="preserve"> trên account đang </w:t>
+      </w:r>
+      <w:r>
+        <w:rPr>
+          <w:rFonts w:ascii="Consolas" w:eastAsia="Consolas" w:hAnsi="Consolas" w:cs="Consolas"/>
+        </w:rPr>
+        <w:t xml:space="preserve">CONNECTED</w:t>
+      </w:r>
+      <w:r>
+        <w:t xml:space="preserve"> không đổi gì, không ghi DB, không phát event, </w:t>
+      </w:r>
+      <w:r>
+        <w:rPr>
+          <w:rFonts w:ascii="Consolas" w:eastAsia="Consolas" w:hAnsi="Consolas" w:cs="Consolas"/>
+        </w:rPr>
+        <w:t xml:space="preserve">updatedAt</w:t>
+      </w:r>
+      <w:r>
+        <w:t xml:space="preserve"> giữ nguyên.</w:t>
+      </w:r>
+    </w:p>
+    <w:p>
+      <w:pPr>
+        <w:pStyle w:val="ListParagraph"/>
+        <w:numPr>
+          <w:ilvl w:val="0"/>
+          <w:numId w:val="1"/>
+        </w:numPr>
+      </w:pPr>
+      <w:r>
+        <w:t xml:space="preserve">Mỗi </w:t>
+      </w:r>
+      <w:r>
+        <w:rPr>
+          <w:rFonts w:ascii="Consolas" w:eastAsia="Consolas" w:hAnsi="Consolas" w:cs="Consolas"/>
+        </w:rPr>
+        <w:t xml:space="preserve">StatusChange</w:t>
+      </w:r>
+      <w:r>
+        <w:t xml:space="preserve"> thật thành một event </w:t>
+      </w:r>
+      <w:r>
+        <w:rPr>
+          <w:rFonts w:ascii="Consolas" w:eastAsia="Consolas" w:hAnsi="Consolas" w:cs="Consolas"/>
+        </w:rPr>
+        <w:t xml:space="preserve">AccountStatusChanged(accountId, from, to, occurredAt)</w:t>
+      </w:r>
+      <w:r>
+        <w:t xml:space="preserve">. Đây là lý do BE-10 cho các hành động trả </w:t>
+      </w:r>
+      <w:r>
+        <w:rPr>
+          <w:rFonts w:ascii="Consolas" w:eastAsia="Consolas" w:hAnsi="Consolas" w:cs="Consolas"/>
+        </w:rPr>
+        <w:t xml:space="preserve">Optional&lt;StatusChange&gt;</w:t>
+      </w:r>
+      <w:r>
+        <w:t xml:space="preserve">.</w:t>
+      </w:r>
+    </w:p>
+    <w:p>
+      <w:pPr>
+        <w:pStyle w:val="ListParagraph"/>
+        <w:numPr>
+          <w:ilvl w:val="0"/>
+          <w:numId w:val="1"/>
+        </w:numPr>
+      </w:pPr>
+      <w:r>
+        <w:t xml:space="preserve">Reconnect (BE-14) cũng theo luật đó: </w:t>
       </w:r>
       <w:r>
         <w:rPr>
@@ -12009,431 +12461,249 @@
         <w:t xml:space="preserve">AUTH_EXPIRED</w:t>
       </w:r>
       <w:r>
-        <w:t xml:space="preserve"> → đúng ô đó đỏ.</w:t>
-      </w:r>
-    </w:p>
-    <w:p>
-      <w:pPr>
-        <w:pStyle w:val="ListParagraph"/>
-        <w:numPr>
-          <w:ilvl w:val="1"/>
-          <w:numId w:val="1"/>
-        </w:numPr>
-      </w:pPr>
-      <w:r>
-        <w:t xml:space="preserve">BE-12: IV cố định → 1 test đỏ; bỏ AAD → 3 test đỏ; tag 96 bit → 2 test đỏ.</w:t>
-      </w:r>
-    </w:p>
-    <w:p>
-      <w:pPr>
-        <w:pStyle w:val="ListParagraph"/>
-        <w:numPr>
-          <w:ilvl w:val="1"/>
-          <w:numId w:val="1"/>
-        </w:numPr>
-      </w:pPr>
-      <w:r>
-        <w:t xml:space="preserve">BE-13: store "quên" ghi refresh token → test xoay khóa đỏ.</w:t>
-      </w:r>
-    </w:p>
-    <w:p>
-      <w:pPr>
-        <w:pStyle w:val="ListParagraph"/>
-        <w:numPr>
-          <w:ilvl w:val="1"/>
-          <w:numId w:val="1"/>
-        </w:numPr>
-      </w:pPr>
-      <w:r>
-        <w:t xml:space="preserve">BE-14: bỏ </w:t>
-      </w:r>
-      <w:r>
-        <w:rPr>
-          <w:rFonts w:ascii="Consolas" w:eastAsia="Consolas" w:hAnsi="Consolas" w:cs="Consolas"/>
-        </w:rPr>
-        <w:t xml:space="preserve">@Transactional</w:t>
-      </w:r>
-      <w:r>
-        <w:t xml:space="preserve"> → test rollback và test reconnect đỏ; không tìm account cũ → test reconnect đỏ (lỗi </w:t>
-      </w:r>
-      <w:r>
-        <w:rPr>
-          <w:rFonts w:ascii="Consolas" w:eastAsia="Consolas" w:hAnsi="Consolas" w:cs="Consolas"/>
-        </w:rPr>
-        <w:t xml:space="preserve">UNIQUE</w:t>
-      </w:r>
-      <w:r>
-        <w:t xml:space="preserve">); bỏ kiểm tra provider → test provider lạ đỏ; </w:t>
-      </w:r>
-      <w:r>
-        <w:rPr>
-          <w:rFonts w:ascii="Consolas" w:eastAsia="Consolas" w:hAnsi="Consolas" w:cs="Consolas"/>
-        </w:rPr>
-        <w:t xml:space="preserve">reconnected</w:t>
-      </w:r>
-      <w:r>
-        <w:t xml:space="preserve"> luôn </w:t>
-      </w:r>
-      <w:r>
-        <w:rPr>
-          <w:rFonts w:ascii="Consolas" w:eastAsia="Consolas" w:hAnsi="Consolas" w:cs="Consolas"/>
-        </w:rPr>
-        <w:t xml:space="preserve">false</w:t>
-      </w:r>
-      <w:r>
-        <w:t xml:space="preserve"> → test reconnect đỏ; publish trước khi lưu credential → test rollback đỏ; thêm một trường vào event → test payload đỏ.</w:t>
-      </w:r>
-    </w:p>
-    <w:p>
-      <w:pPr>
-        <w:pStyle w:val="ListParagraph"/>
-        <w:numPr>
-          <w:ilvl w:val="1"/>
-          <w:numId w:val="1"/>
-        </w:numPr>
-      </w:pPr>
-      <w:r>
-        <w:t xml:space="preserve">BE-15: danh sách không lọc owner → 2 test đỏ; </w:t>
-      </w:r>
-      <w:r>
-        <w:rPr>
-          <w:rFonts w:ascii="Consolas" w:eastAsia="Consolas" w:hAnsi="Consolas" w:cs="Consolas"/>
-        </w:rPr>
-        <w:t xml:space="preserve">get</w:t>
-      </w:r>
-      <w:r>
-        <w:t xml:space="preserve"> không lọc owner → test cô lập đỏ; mới nhất trước → test thứ tự đỏ; </w:t>
-      </w:r>
-      <w:r>
-        <w:rPr>
-          <w:rFonts w:ascii="Consolas" w:eastAsia="Consolas" w:hAnsi="Consolas" w:cs="Consolas"/>
-        </w:rPr>
-        <w:t xml:space="preserve">ProviderRegistry.get</w:t>
-      </w:r>
-      <w:r>
-        <w:t xml:space="preserve"> thay </w:t>
-      </w:r>
-      <w:r>
-        <w:rPr>
-          <w:rFonts w:ascii="Consolas" w:eastAsia="Consolas" w:hAnsi="Consolas" w:cs="Consolas"/>
-        </w:rPr>
-        <w:t xml:space="preserve">find</w:t>
-      </w:r>
-      <w:r>
-        <w:t xml:space="preserve"> → test connector đã gỡ đỏ; </w:t>
-      </w:r>
-      <w:r>
-        <w:rPr>
-          <w:rFonts w:ascii="Consolas" w:eastAsia="Consolas" w:hAnsi="Consolas" w:cs="Consolas"/>
-        </w:rPr>
-        <w:t xml:space="preserve">ownerId</w:t>
-      </w:r>
-      <w:r>
-        <w:t xml:space="preserve"> lọt vào response → test tập trường đỏ; detail nói "của người khác" → test cô lập đỏ.</w:t>
-      </w:r>
-    </w:p>
-    <w:p>
-      <w:pPr>
-        <w:pStyle w:val="ListParagraph"/>
-        <w:numPr>
-          <w:ilvl w:val="0"/>
-          <w:numId w:val="1"/>
-        </w:numPr>
-      </w:pPr>
-      <w:r>
-        <w:rPr>
-          <w:b/>
-          <w:bCs/>
-        </w:rPr>
-        <w:t xml:space="preserve">Chạy cả ứng dụng thay cho web slice (BE-15):</w:t>
-      </w:r>
-      <w:r>
-        <w:t xml:space="preserve"> </w:t>
-      </w:r>
-      <w:r>
-        <w:rPr>
-          <w:rFonts w:ascii="Consolas" w:eastAsia="Consolas" w:hAnsi="Consolas" w:cs="Consolas"/>
-        </w:rPr>
-        <w:t xml:space="preserve">@SpringBootTest</w:t>
-      </w:r>
-      <w:r>
-        <w:t xml:space="preserve"> + </w:t>
-      </w:r>
-      <w:r>
-        <w:rPr>
-          <w:rFonts w:ascii="Consolas" w:eastAsia="Consolas" w:hAnsi="Consolas" w:cs="Consolas"/>
-        </w:rPr>
-        <w:t xml:space="preserve">@AutoConfigureMockMvc</w:t>
-      </w:r>
-      <w:r>
-        <w:t xml:space="preserve"> gửi request HTTP giả qua đúng các lớp thật: security, </w:t>
-      </w:r>
-      <w:r>
-        <w:rPr>
-          <w:rFonts w:ascii="Consolas" w:eastAsia="Consolas" w:hAnsi="Consolas" w:cs="Consolas"/>
-        </w:rPr>
-        <w:t xml:space="preserve">CurrentUser</w:t>
-      </w:r>
-      <w:r>
-        <w:t xml:space="preserve">, service, PostgreSQL, error handler, Jackson. Chọn thay cho </w:t>
-      </w:r>
-      <w:r>
-        <w:rPr>
-          <w:rFonts w:ascii="Consolas" w:eastAsia="Consolas" w:hAnsi="Consolas" w:cs="Consolas"/>
-        </w:rPr>
-        <w:t xml:space="preserve">@WebMvcTest</w:t>
-      </w:r>
-      <w:r>
-        <w:t xml:space="preserve"> với service giả vì test cô lập dữ liệu phải chạy trên dữ liệu thật; với service giả, test chỉ kiểm tra cái mock.</w:t>
-      </w:r>
-    </w:p>
-    <w:p>
-      <w:pPr>
-        <w:pStyle w:val="ListParagraph"/>
-        <w:numPr>
-          <w:ilvl w:val="0"/>
-          <w:numId w:val="1"/>
-        </w:numPr>
-      </w:pPr>
-      <w:r>
-        <w:rPr>
-          <w:b/>
-          <w:bCs/>
-        </w:rPr>
-        <w:t xml:space="preserve">Ghim thời điểm bằng SQL:</w:t>
-      </w:r>
-      <w:r>
-        <w:t xml:space="preserve"> </w:t>
-      </w:r>
-      <w:r>
-        <w:rPr>
-          <w:rFonts w:ascii="Consolas" w:eastAsia="Consolas" w:hAnsi="Consolas" w:cs="Consolas"/>
-        </w:rPr>
-        <w:t xml:space="preserve">@PrePersist</w:t>
-      </w:r>
-      <w:r>
-        <w:t xml:space="preserve"> điền </w:t>
-      </w:r>
-      <w:r>
-        <w:rPr>
-          <w:rFonts w:ascii="Consolas" w:eastAsia="Consolas" w:hAnsi="Consolas" w:cs="Consolas"/>
-        </w:rPr>
-        <w:t xml:space="preserve">created_at</w:t>
-      </w:r>
-      <w:r>
-        <w:t xml:space="preserve"> bằng giờ thật nên không biết trước. Test ghi đè bằng </w:t>
-      </w:r>
-      <w:r>
-        <w:rPr>
-          <w:rFonts w:ascii="Consolas" w:eastAsia="Consolas" w:hAnsi="Consolas" w:cs="Consolas"/>
-        </w:rPr>
-        <w:t xml:space="preserve">UPDATE connected_account SET created_at = ?</w:t>
-      </w:r>
-      <w:r>
-        <w:t xml:space="preserve"> để biết chắc thứ tự và chuỗi JSON mong đợi (</w:t>
-      </w:r>
-      <w:r>
-        <w:rPr>
-          <w:rFonts w:ascii="Consolas" w:eastAsia="Consolas" w:hAnsi="Consolas" w:cs="Consolas"/>
-        </w:rPr>
-        <w:t xml:space="preserve">2026-10-05T03:15:00Z</w:t>
-      </w:r>
-      <w:r>
-        <w:t xml:space="preserve">). Account "mới hơn" được tạo </w:t>
-      </w:r>
-      <w:r>
-        <w:rPr>
-          <w:b/>
-          <w:bCs/>
-        </w:rPr>
-        <w:t xml:space="preserve">trước</w:t>
-      </w:r>
-      <w:r>
-        <w:t xml:space="preserve">, để test thứ tự không thể xanh chỉ nhờ thứ tự chèn.</w:t>
-      </w:r>
-    </w:p>
-    <w:p>
-      <w:pPr>
-        <w:pStyle w:val="ListParagraph"/>
-        <w:numPr>
-          <w:ilvl w:val="0"/>
-          <w:numId w:val="1"/>
-        </w:numPr>
-      </w:pPr>
-      <w:r>
-        <w:rPr>
-          <w:rFonts w:ascii="Consolas" w:eastAsia="Consolas" w:hAnsi="Consolas" w:cs="Consolas"/>
-          <w:b/>
-          <w:bCs/>
-        </w:rPr>
-        <w:t xml:space="preserve">JsonPath.read(body, "$")</w:t>
-      </w:r>
-      <w:r>
-        <w:rPr>
-          <w:b/>
-          <w:bCs/>
-        </w:rPr>
-        <w:t xml:space="preserve">:</w:t>
-      </w:r>
-      <w:r>
-        <w:t xml:space="preserve"> đọc JSON thành </w:t>
-      </w:r>
-      <w:r>
-        <w:rPr>
-          <w:rFonts w:ascii="Consolas" w:eastAsia="Consolas" w:hAnsi="Consolas" w:cs="Consolas"/>
-        </w:rPr>
-        <w:t xml:space="preserve">Map</w:t>
-      </w:r>
-      <w:r>
-        <w:t xml:space="preserve"> để so tập tên trường.</w:t>
-      </w:r>
-    </w:p>
-    <w:p>
-      <w:pPr>
-        <w:pStyle w:val="ListParagraph"/>
-        <w:numPr>
-          <w:ilvl w:val="0"/>
-          <w:numId w:val="1"/>
-        </w:numPr>
-      </w:pPr>
-      <w:r>
-        <w:rPr>
-          <w:rFonts w:ascii="Consolas" w:eastAsia="Consolas" w:hAnsi="Consolas" w:cs="Consolas"/>
-          <w:b/>
-          <w:bCs/>
-        </w:rPr>
-        <w:t xml:space="preserve">@ApplicationModuleTest(mode = DIRECT_DEPENDENCIES)</w:t>
-      </w:r>
-      <w:r>
-        <w:rPr>
-          <w:b/>
-          <w:bCs/>
-        </w:rPr>
-        <w:t xml:space="preserve"> (Spring Modulith, BE-14):</w:t>
-      </w:r>
-      <w:r>
-        <w:t xml:space="preserve"> chỉ khởi động module </w:t>
-      </w:r>
-      <w:r>
-        <w:rPr>
-          <w:rFonts w:ascii="Consolas" w:eastAsia="Consolas" w:hAnsi="Consolas" w:cs="Consolas"/>
-        </w:rPr>
-        <w:t xml:space="preserve">account</w:t>
-      </w:r>
-      <w:r>
-        <w:t xml:space="preserve"> cộng các module nó dùng trực tiếp, không phải cả ứng dụng. Lúc làm BE-14 đó chỉ là </w:t>
-      </w:r>
-      <w:r>
-        <w:rPr>
-          <w:rFonts w:ascii="Consolas" w:eastAsia="Consolas" w:hAnsi="Consolas" w:cs="Consolas"/>
-        </w:rPr>
-        <w:t xml:space="preserve">provider</w:t>
-      </w:r>
-      <w:r>
-        <w:t xml:space="preserve">; từ BE-15, </w:t>
-      </w:r>
-      <w:r>
-        <w:rPr>
-          <w:rFonts w:ascii="Consolas" w:eastAsia="Consolas" w:hAnsi="Consolas" w:cs="Consolas"/>
-        </w:rPr>
-        <w:t xml:space="preserve">account</w:t>
-      </w:r>
-      <w:r>
-        <w:t xml:space="preserve"> dùng thêm </w:t>
-      </w:r>
-      <w:r>
-        <w:rPr>
-          <w:rFonts w:ascii="Consolas" w:eastAsia="Consolas" w:hAnsi="Consolas" w:cs="Consolas"/>
-        </w:rPr>
-        <w:t xml:space="preserve">CurrentUser</w:t>
-      </w:r>
-      <w:r>
-        <w:t xml:space="preserve"> (module </w:t>
-      </w:r>
-      <w:r>
-        <w:rPr>
-          <w:rFonts w:ascii="Consolas" w:eastAsia="Consolas" w:hAnsi="Consolas" w:cs="Consolas"/>
-        </w:rPr>
-        <w:t xml:space="preserve">identity</w:t>
-      </w:r>
-      <w:r>
-        <w:t xml:space="preserve">) và mã lỗi của </w:t>
-      </w:r>
-      <w:r>
-        <w:rPr>
-          <w:rFonts w:ascii="Consolas" w:eastAsia="Consolas" w:hAnsi="Consolas" w:cs="Consolas"/>
-        </w:rPr>
-        <w:t xml:space="preserve">common</w:t>
-      </w:r>
-      <w:r>
-        <w:t xml:space="preserve">, nên hai module này cũng được nạp. Test vẫn tự dọn bảng và tự chèn owner của nó vào </w:t>
-      </w:r>
-      <w:r>
-        <w:rPr>
-          <w:rFonts w:ascii="Consolas" w:eastAsia="Consolas" w:hAnsi="Consolas" w:cs="Consolas"/>
-        </w:rPr>
-        <w:t xml:space="preserve">app_user</w:t>
-      </w:r>
-      <w:r>
-        <w:t xml:space="preserve"> bằng </w:t>
-      </w:r>
-      <w:r>
-        <w:rPr>
-          <w:rFonts w:ascii="Consolas" w:eastAsia="Consolas" w:hAnsi="Consolas" w:cs="Consolas"/>
-        </w:rPr>
-        <w:t xml:space="preserve">JdbcTemplate</w:t>
-      </w:r>
-      <w:r>
-        <w:t xml:space="preserve">, nên không phụ thuộc owner được tạo lúc khởi động.</w:t>
-      </w:r>
-    </w:p>
-    <w:p>
-      <w:pPr>
-        <w:pStyle w:val="ListParagraph"/>
-        <w:numPr>
-          <w:ilvl w:val="0"/>
-          <w:numId w:val="1"/>
-        </w:numPr>
-      </w:pPr>
-      <w:r>
-        <w:rPr>
-          <w:b/>
-          <w:bCs/>
-        </w:rPr>
-        <w:t xml:space="preserve">Test không có </w:t>
-      </w:r>
-      <w:r>
-        <w:rPr>
-          <w:rFonts w:ascii="Consolas" w:eastAsia="Consolas" w:hAnsi="Consolas" w:cs="Consolas"/>
-          <w:b/>
-          <w:bCs/>
-        </w:rPr>
-        <w:t xml:space="preserve">@Transactional</w:t>
-      </w:r>
-      <w:r>
-        <w:rPr>
-          <w:b/>
-          <w:bCs/>
-        </w:rPr>
-        <w:t xml:space="preserve">:</w:t>
-      </w:r>
-      <w:r>
-        <w:t xml:space="preserve"> để service tự commit hoặc rollback như khi chạy thật. Cái giá là dữ liệu ở lại sau mỗi test, nên </w:t>
-      </w:r>
-      <w:r>
-        <w:rPr>
-          <w:rFonts w:ascii="Consolas" w:eastAsia="Consolas" w:hAnsi="Consolas" w:cs="Consolas"/>
-        </w:rPr>
-        <w:t xml:space="preserve">@BeforeEach</w:t>
-      </w:r>
-      <w:r>
-        <w:t xml:space="preserve"> tự dọn bảng bằng </w:t>
-      </w:r>
-      <w:r>
-        <w:rPr>
-          <w:rFonts w:ascii="Consolas" w:eastAsia="Consolas" w:hAnsi="Consolas" w:cs="Consolas"/>
-        </w:rPr>
-        <w:t xml:space="preserve">JdbcTestUtils.deleteFromTables</w:t>
+        <w:t xml:space="preserve"> sang </w:t>
+      </w:r>
+      <w:r>
+        <w:rPr>
+          <w:rFonts w:ascii="Consolas" w:eastAsia="Consolas" w:hAnsi="Consolas" w:cs="Consolas"/>
+        </w:rPr>
+        <w:t xml:space="preserve">CONNECTED</w:t>
+      </w:r>
+      <w:r>
+        <w:t xml:space="preserve"> phát </w:t>
+      </w:r>
+      <w:r>
+        <w:rPr>
+          <w:rFonts w:ascii="Consolas" w:eastAsia="Consolas" w:hAnsi="Consolas" w:cs="Consolas"/>
+        </w:rPr>
+        <w:t xml:space="preserve">AccountStatusChanged</w:t>
+      </w:r>
+      <w:r>
+        <w:t xml:space="preserve"> trước </w:t>
+      </w:r>
+      <w:r>
+        <w:rPr>
+          <w:rFonts w:ascii="Consolas" w:eastAsia="Consolas" w:hAnsi="Consolas" w:cs="Consolas"/>
+        </w:rPr>
+        <w:t xml:space="preserve">AccountConnected</w:t>
+      </w:r>
+      <w:r>
+        <w:t xml:space="preserve">, cùng một thời điểm.</w:t>
+      </w:r>
+    </w:p>
+    <w:p>
+      <w:pPr>
+        <w:pStyle w:val="Heading3"/>
+      </w:pPr>
+      <w:r>
+        <w:t xml:space="preserve">20.4 </w:t>
+      </w:r>
+      <w:r>
+        <w:rPr>
+          <w:rFonts w:ascii="Consolas" w:eastAsia="Consolas" w:hAnsi="Consolas" w:cs="Consolas"/>
+        </w:rPr>
+        <w:t xml:space="preserve">AccountStatus</w:t>
+      </w:r>
+      <w:r>
+        <w:t xml:space="preserve"> chuyển lên API của module (người dùng chọn)</w:t>
+      </w:r>
+    </w:p>
+    <w:p>
+      <w:pPr>
+        <w:pStyle w:val="ListParagraph"/>
+        <w:numPr>
+          <w:ilvl w:val="0"/>
+          <w:numId w:val="1"/>
+        </w:numPr>
+      </w:pPr>
+      <w:r>
+        <w:t xml:space="preserve">Event public mang </w:t>
+      </w:r>
+      <w:r>
+        <w:rPr>
+          <w:rFonts w:ascii="Consolas" w:eastAsia="Consolas" w:hAnsi="Consolas" w:cs="Consolas"/>
+        </w:rPr>
+        <w:t xml:space="preserve">from</w:t>
+      </w:r>
+      <w:r>
+        <w:t xml:space="preserve">/</w:t>
+      </w:r>
+      <w:r>
+        <w:rPr>
+          <w:rFonts w:ascii="Consolas" w:eastAsia="Consolas" w:hAnsi="Consolas" w:cs="Consolas"/>
+        </w:rPr>
+        <w:t xml:space="preserve">to</w:t>
+      </w:r>
+      <w:r>
+        <w:t xml:space="preserve"> kiểu </w:t>
+      </w:r>
+      <w:r>
+        <w:rPr>
+          <w:rFonts w:ascii="Consolas" w:eastAsia="Consolas" w:hAnsi="Consolas" w:cs="Consolas"/>
+        </w:rPr>
+        <w:t xml:space="preserve">AccountStatus</w:t>
+      </w:r>
+      <w:r>
+        <w:t xml:space="preserve">. Nếu enum nằm trong </w:t>
+      </w:r>
+      <w:r>
+        <w:rPr>
+          <w:rFonts w:ascii="Consolas" w:eastAsia="Consolas" w:hAnsi="Consolas" w:cs="Consolas"/>
+        </w:rPr>
+        <w:t xml:space="preserve">account.domain</w:t>
+      </w:r>
+      <w:r>
+        <w:t xml:space="preserve"> (package nội bộ), module khác (F07) gọi </w:t>
+      </w:r>
+      <w:r>
+        <w:rPr>
+          <w:rFonts w:ascii="Consolas" w:eastAsia="Consolas" w:hAnsi="Consolas" w:cs="Consolas"/>
+        </w:rPr>
+        <w:t xml:space="preserve">event.to()</w:t>
+      </w:r>
+      <w:r>
+        <w:t xml:space="preserve"> là phụ thuộc vào một kiểu nội bộ, và Modulith báo lỗi. Vì vậy enum chuyển lên </w:t>
+      </w:r>
+      <w:r>
+        <w:rPr>
+          <w:rFonts w:ascii="Consolas" w:eastAsia="Consolas" w:hAnsi="Consolas" w:cs="Consolas"/>
+        </w:rPr>
+        <w:t xml:space="preserve">dev.sino.account</w:t>
+      </w:r>
+      <w:r>
+        <w:t xml:space="preserve">, cạnh các event.</w:t>
+      </w:r>
+    </w:p>
+    <w:p>
+      <w:pPr>
+        <w:pStyle w:val="ListParagraph"/>
+        <w:numPr>
+          <w:ilvl w:val="0"/>
+          <w:numId w:val="1"/>
+        </w:numPr>
+      </w:pPr>
+      <w:r>
+        <w:t xml:space="preserve">Phương án bị loại: giữ chỗ cũ và gắn </w:t>
+      </w:r>
+      <w:r>
+        <w:rPr>
+          <w:rFonts w:ascii="Consolas" w:eastAsia="Consolas" w:hAnsi="Consolas" w:cs="Consolas"/>
+        </w:rPr>
+        <w:t xml:space="preserve">@NamedInterface</w:t>
+      </w:r>
+      <w:r>
+        <w:t xml:space="preserve"> riêng cho enum; hoặc cho event mang chuỗi.</w:t>
+      </w:r>
+    </w:p>
+    <w:p>
+      <w:pPr>
+        <w:pStyle w:val="ListParagraph"/>
+        <w:numPr>
+          <w:ilvl w:val="0"/>
+          <w:numId w:val="1"/>
+        </w:numPr>
+      </w:pPr>
+      <w:r>
+        <w:rPr>
+          <w:b/>
+          <w:bCs/>
+        </w:rPr>
+        <w:t xml:space="preserve">Quy tắc rút ra:</w:t>
+      </w:r>
+      <w:r>
+        <w:t xml:space="preserve"> kiểu nào xuất hiện trong API public của module (event, interface) thì bản thân nó cũng phải public theo nghĩa của Modulith.</w:t>
+      </w:r>
+    </w:p>
+    <w:p>
+      <w:pPr>
+        <w:pStyle w:val="Heading3"/>
+      </w:pPr>
+      <w:r>
+        <w:t xml:space="preserve">20.5 Optimistic locking trong thực tế (409)</w:t>
+      </w:r>
+    </w:p>
+    <w:p>
+      <w:pPr>
+        <w:pStyle w:val="ListParagraph"/>
+        <w:numPr>
+          <w:ilvl w:val="0"/>
+          <w:numId w:val="1"/>
+        </w:numPr>
+      </w:pPr>
+      <w:r>
+        <w:t xml:space="preserve">Client không gửi </w:t>
+      </w:r>
+      <w:r>
+        <w:rPr>
+          <w:rFonts w:ascii="Consolas" w:eastAsia="Consolas" w:hAnsi="Consolas" w:cs="Consolas"/>
+        </w:rPr>
+        <w:t xml:space="preserve">version</w:t>
+      </w:r>
+      <w:r>
+        <w:t xml:space="preserve">. Xung đột xảy ra khi hai request cùng sửa một account: cả hai đọc version 3; request A ghi xong, version thành 4; request B ghi </w:t>
+      </w:r>
+      <w:r>
+        <w:rPr>
+          <w:rFonts w:ascii="Consolas" w:eastAsia="Consolas" w:hAnsi="Consolas" w:cs="Consolas"/>
+        </w:rPr>
+        <w:t xml:space="preserve">... WHERE version = 3</w:t>
+      </w:r>
+      <w:r>
+        <w:t xml:space="preserve">, không trúng dòng nào, Hibernate ném </w:t>
+      </w:r>
+      <w:r>
+        <w:rPr>
+          <w:rFonts w:ascii="Consolas" w:eastAsia="Consolas" w:hAnsi="Consolas" w:cs="Consolas"/>
+        </w:rPr>
+        <w:t xml:space="preserve">OptimisticLockingFailureException</w:t>
+      </w:r>
+      <w:r>
+        <w:t xml:space="preserve"> lúc commit, và F01 đổi lỗi đó thành 409 </w:t>
+      </w:r>
+      <w:r>
+        <w:rPr>
+          <w:rFonts w:ascii="Consolas" w:eastAsia="Consolas" w:hAnsi="Consolas" w:cs="Consolas"/>
+        </w:rPr>
+        <w:t xml:space="preserve">CONCURRENT_MODIFICATION</w:t>
+      </w:r>
+      <w:r>
+        <w:t xml:space="preserve">. Request B không âm thầm ghi đè thay đổi của A.</w:t>
+      </w:r>
+    </w:p>
+    <w:p>
+      <w:pPr>
+        <w:pStyle w:val="ListParagraph"/>
+        <w:numPr>
+          <w:ilvl w:val="0"/>
+          <w:numId w:val="1"/>
+        </w:numPr>
+      </w:pPr>
+      <w:r>
+        <w:t xml:space="preserve">Vì vậy cách sửa phải là "đọc entity, đổi field, để Hibernate ghi", vì cách này có kiểm </w:t>
+      </w:r>
+      <w:r>
+        <w:rPr>
+          <w:rFonts w:ascii="Consolas" w:eastAsia="Consolas" w:hAnsi="Consolas" w:cs="Consolas"/>
+        </w:rPr>
+        <w:t xml:space="preserve">version</w:t>
+      </w:r>
+      <w:r>
+        <w:t xml:space="preserve">. Một câu </w:t>
+      </w:r>
+      <w:r>
+        <w:rPr>
+          <w:rFonts w:ascii="Consolas" w:eastAsia="Consolas" w:hAnsi="Consolas" w:cs="Consolas"/>
+        </w:rPr>
+        <w:t xml:space="preserve">UPDATE</w:t>
+      </w:r>
+      <w:r>
+        <w:t xml:space="preserve"> viết tay sẽ bỏ qua </w:t>
+      </w:r>
+      <w:r>
+        <w:rPr>
+          <w:rFonts w:ascii="Consolas" w:eastAsia="Consolas" w:hAnsi="Consolas" w:cs="Consolas"/>
+        </w:rPr>
+        <w:t xml:space="preserve">version</w:t>
       </w:r>
       <w:r>
         <w:t xml:space="preserve">.</w:t>
@@ -12441,202 +12711,37 @@
     </w:p>
     <w:p>
       <w:pPr>
-        <w:pStyle w:val="ListParagraph"/>
-        <w:numPr>
-          <w:ilvl w:val="0"/>
-          <w:numId w:val="1"/>
-        </w:numPr>
-      </w:pPr>
-      <w:r>
-        <w:rPr>
-          <w:rFonts w:ascii="Consolas" w:eastAsia="Consolas" w:hAnsi="Consolas" w:cs="Consolas"/>
-          <w:b/>
-          <w:bCs/>
-        </w:rPr>
-        <w:t xml:space="preserve">AssertablePublishedEvents</w:t>
-      </w:r>
-      <w:r>
-        <w:rPr>
-          <w:b/>
-          <w:bCs/>
-        </w:rPr>
-        <w:t xml:space="preserve"> làm tham số của method test:</w:t>
-      </w:r>
-      <w:r>
-        <w:t xml:space="preserve"> Spring Modulith ghi lại mọi event được publish trong test đó; </w:t>
-      </w:r>
-      <w:r>
-        <w:rPr>
-          <w:rFonts w:ascii="Consolas" w:eastAsia="Consolas" w:hAnsi="Consolas" w:cs="Consolas"/>
-        </w:rPr>
-        <w:t xml:space="preserve">events.ofType(AccountConnected.class)</w:t>
-      </w:r>
-      <w:r>
-        <w:t xml:space="preserve"> lấy ra để kiểm tra số lượng và nội dung.</w:t>
-      </w:r>
-    </w:p>
-    <w:p>
-      <w:pPr>
-        <w:pStyle w:val="ListParagraph"/>
-        <w:numPr>
-          <w:ilvl w:val="0"/>
-          <w:numId w:val="1"/>
-        </w:numPr>
-      </w:pPr>
-      <w:r>
-        <w:rPr>
-          <w:rFonts w:ascii="Consolas" w:eastAsia="Consolas" w:hAnsi="Consolas" w:cs="Consolas"/>
-          <w:b/>
-          <w:bCs/>
-        </w:rPr>
-        <w:t xml:space="preserve">@MockitoSpyBean</w:t>
-      </w:r>
-      <w:r>
-        <w:rPr>
-          <w:b/>
-          <w:bCs/>
-        </w:rPr>
-        <w:t xml:space="preserve">:</w:t>
-      </w:r>
-      <w:r>
-        <w:t xml:space="preserve"> bọc bean thật. Bình thường nó chạy code thật; riêng một test bảo nó ném lỗi bằng </w:t>
-      </w:r>
-      <w:r>
-        <w:rPr>
-          <w:rFonts w:ascii="Consolas" w:eastAsia="Consolas" w:hAnsi="Consolas" w:cs="Consolas"/>
-        </w:rPr>
-        <w:t xml:space="preserve">doThrow(...).when(credentials).save(any(), any(), any())</w:t>
-      </w:r>
-      <w:r>
-        <w:t xml:space="preserve">, để giả lập "lưu credential thất bại" mà không sửa code production. Assertion vẫn kiểm tra DB thật, không kiểm tra mock.</w:t>
-      </w:r>
-    </w:p>
-    <w:p>
-      <w:pPr>
-        <w:pStyle w:val="ListParagraph"/>
-        <w:numPr>
-          <w:ilvl w:val="0"/>
-          <w:numId w:val="1"/>
-        </w:numPr>
-      </w:pPr>
-      <w:r>
-        <w:rPr>
-          <w:b/>
-          <w:bCs/>
-        </w:rPr>
-        <w:t xml:space="preserve">Bean riêng cho test:</w:t>
-      </w:r>
-      <w:r>
-        <w:t xml:space="preserve"> một class </w:t>
-      </w:r>
-      <w:r>
-        <w:rPr>
-          <w:rFonts w:ascii="Consolas" w:eastAsia="Consolas" w:hAnsi="Consolas" w:cs="Consolas"/>
-        </w:rPr>
-        <w:t xml:space="preserve">@TestConfiguration</w:t>
-      </w:r>
-      <w:r>
-        <w:t xml:space="preserve"> lồng trong class test tạo </w:t>
-      </w:r>
-      <w:r>
-        <w:rPr>
-          <w:rFonts w:ascii="Consolas" w:eastAsia="Consolas" w:hAnsi="Consolas" w:cs="Consolas"/>
-        </w:rPr>
-        <w:t xml:space="preserve">FakeMessageProvider</w:t>
-      </w:r>
-      <w:r>
-        <w:t xml:space="preserve"> loại </w:t>
-      </w:r>
-      <w:r>
-        <w:rPr>
-          <w:rFonts w:ascii="Consolas" w:eastAsia="Consolas" w:hAnsi="Consolas" w:cs="Consolas"/>
-        </w:rPr>
-        <w:t xml:space="preserve">fake</w:t>
-      </w:r>
-      <w:r>
-        <w:t xml:space="preserve"> làm bean, để </w:t>
-      </w:r>
-      <w:r>
-        <w:rPr>
-          <w:rFonts w:ascii="Consolas" w:eastAsia="Consolas" w:hAnsi="Consolas" w:cs="Consolas"/>
-        </w:rPr>
-        <w:t xml:space="preserve">ProviderRegistry</w:t>
-      </w:r>
-      <w:r>
-        <w:t xml:space="preserve"> thấy provider này.</w:t>
-      </w:r>
-    </w:p>
-    <w:p>
-      <w:pPr>
-        <w:pStyle w:val="ListParagraph"/>
-        <w:numPr>
-          <w:ilvl w:val="0"/>
-          <w:numId w:val="1"/>
-        </w:numPr>
-      </w:pPr>
-      <w:r>
-        <w:rPr>
-          <w:rFonts w:ascii="Consolas" w:eastAsia="Consolas" w:hAnsi="Consolas" w:cs="Consolas"/>
-          <w:b/>
-          <w:bCs/>
-        </w:rPr>
-        <w:t xml:space="preserve">row_to_json(c)::text</w:t>
-      </w:r>
-      <w:r>
-        <w:rPr>
-          <w:b/>
-          <w:bCs/>
-        </w:rPr>
-        <w:t xml:space="preserve"> của PostgreSQL:</w:t>
-      </w:r>
-      <w:r>
-        <w:t xml:space="preserve"> biến cả một dòng thành chuỗi JSON để kiểm tra bằng một lệnh rằng </w:t>
-      </w:r>
-      <w:r>
-        <w:rPr>
-          <w:b/>
-          <w:bCs/>
-        </w:rPr>
-        <w:t xml:space="preserve">không cột nào</w:t>
-      </w:r>
-      <w:r>
-        <w:t xml:space="preserve"> chứa token dạng chữ.</w:t>
-      </w:r>
-    </w:p>
-    <w:p>
-      <w:pPr>
-        <w:pStyle w:val="ListParagraph"/>
-        <w:numPr>
-          <w:ilvl w:val="0"/>
-          <w:numId w:val="1"/>
-        </w:numPr>
-      </w:pPr>
-      <w:r>
-        <w:rPr>
-          <w:rFonts w:ascii="Consolas" w:eastAsia="Consolas" w:hAnsi="Consolas" w:cs="Consolas"/>
-          <w:b/>
-          <w:bCs/>
-        </w:rPr>
-        <w:t xml:space="preserve">entityManager.flush()</w:t>
-      </w:r>
-      <w:r>
-        <w:rPr>
-          <w:b/>
-          <w:bCs/>
-        </w:rPr>
-        <w:t xml:space="preserve"> để lộ lỗi:</w:t>
-      </w:r>
-      <w:r>
-        <w:t xml:space="preserve"> trong </w:t>
-      </w:r>
-      <w:r>
-        <w:rPr>
-          <w:rFonts w:ascii="Consolas" w:eastAsia="Consolas" w:hAnsi="Consolas" w:cs="Consolas"/>
-        </w:rPr>
-        <w:t xml:space="preserve">@DataJpaTest</w:t>
-      </w:r>
-      <w:r>
-        <w:t xml:space="preserve">, lệnh ghi chỉ thật sự xuống DB khi flush. Muốn thấy lỗi khóa ngoại thì phải flush ngay trong đoạn code đang chờ lỗi; test còn kiểm tra cả stack trace của lỗi đó không chứa token.</w:t>
+        <w:pStyle w:val="Heading3"/>
+      </w:pPr>
+      <w:r>
+        <w:t xml:space="preserve">20.6 Một chỗ duy nhất tạo lỗi 404</w:t>
+      </w:r>
+    </w:p>
+    <w:p>
+      <w:pPr>
+        <w:pStyle w:val="ListParagraph"/>
+        <w:numPr>
+          <w:ilvl w:val="0"/>
+          <w:numId w:val="1"/>
+        </w:numPr>
+      </w:pPr>
+      <w:r>
+        <w:rPr>
+          <w:rFonts w:ascii="Consolas" w:eastAsia="Consolas" w:hAnsi="Consolas" w:cs="Consolas"/>
+        </w:rPr>
+        <w:t xml:space="preserve">AccountErrorCode.accountNotFound()</w:t>
+      </w:r>
+      <w:r>
+        <w:t xml:space="preserve"> (static, package-private) là chỗ duy nhất tạo </w:t>
+      </w:r>
+      <w:r>
+        <w:rPr>
+          <w:rFonts w:ascii="Consolas" w:eastAsia="Consolas" w:hAnsi="Consolas" w:cs="Consolas"/>
+        </w:rPr>
+        <w:t xml:space="preserve">SinoException(ACCOUNT_NOT_FOUND, "Account not found.")</w:t>
+      </w:r>
+      <w:r>
+        <w:t xml:space="preserve">. API đọc và API sửa cùng dùng nó, nên body 404 luôn giống hệt nhau (mục 19.3).</w:t>
       </w:r>
     </w:p>
     <w:p>
@@ -12652,7 +12757,1091 @@
         <w:pStyle w:val="Heading2"/>
       </w:pPr>
       <w:r>
-        <w:t xml:space="preserve">21. Tự kiểm tra F02 (phần đã làm)</w:t>
+        <w:t xml:space="preserve">21. Kỹ thuật test mới trong F02</w:t>
+      </w:r>
+    </w:p>
+    <w:p>
+      <w:pPr>
+        <w:pStyle w:val="ListParagraph"/>
+        <w:numPr>
+          <w:ilvl w:val="0"/>
+          <w:numId w:val="1"/>
+        </w:numPr>
+      </w:pPr>
+      <w:r>
+        <w:rPr>
+          <w:rFonts w:ascii="Consolas" w:eastAsia="Consolas" w:hAnsi="Consolas" w:cs="Consolas"/>
+          <w:b/>
+          <w:bCs/>
+        </w:rPr>
+        <w:t xml:space="preserve">@DataJpaTest</w:t>
+      </w:r>
+      <w:r>
+        <w:rPr>
+          <w:b/>
+          <w:bCs/>
+        </w:rPr>
+        <w:t xml:space="preserve"> + </w:t>
+      </w:r>
+      <w:r>
+        <w:rPr>
+          <w:rFonts w:ascii="Consolas" w:eastAsia="Consolas" w:hAnsi="Consolas" w:cs="Consolas"/>
+          <w:b/>
+          <w:bCs/>
+        </w:rPr>
+        <w:t xml:space="preserve">@AutoConfigureTestDatabase(replace = NONE)</w:t>
+      </w:r>
+      <w:r>
+        <w:rPr>
+          <w:b/>
+          <w:bCs/>
+        </w:rPr>
+        <w:t xml:space="preserve">:</w:t>
+      </w:r>
+      <w:r>
+        <w:t xml:space="preserve"> slice chỉ nạp JPA và Flyway, chạy trên PostgreSQL thật (Testcontainers) để </w:t>
+      </w:r>
+      <w:r>
+        <w:rPr>
+          <w:rFonts w:ascii="Consolas" w:eastAsia="Consolas" w:hAnsi="Consolas" w:cs="Consolas"/>
+        </w:rPr>
+        <w:t xml:space="preserve">CHECK</w:t>
+      </w:r>
+      <w:r>
+        <w:t xml:space="preserve">, </w:t>
+      </w:r>
+      <w:r>
+        <w:rPr>
+          <w:rFonts w:ascii="Consolas" w:eastAsia="Consolas" w:hAnsi="Consolas" w:cs="Consolas"/>
+        </w:rPr>
+        <w:t xml:space="preserve">UNIQUE</w:t>
+      </w:r>
+      <w:r>
+        <w:t xml:space="preserve">, khóa ngoại hoạt động như production. Mỗi test tự rollback.</w:t>
+      </w:r>
+    </w:p>
+    <w:p>
+      <w:pPr>
+        <w:pStyle w:val="ListParagraph"/>
+        <w:numPr>
+          <w:ilvl w:val="0"/>
+          <w:numId w:val="1"/>
+        </w:numPr>
+      </w:pPr>
+      <w:r>
+        <w:rPr>
+          <w:rFonts w:ascii="Consolas" w:eastAsia="Consolas" w:hAnsi="Consolas" w:cs="Consolas"/>
+          <w:b/>
+          <w:bCs/>
+        </w:rPr>
+        <w:t xml:space="preserve">entityManager.clear()</w:t>
+      </w:r>
+      <w:r>
+        <w:rPr>
+          <w:b/>
+          <w:bCs/>
+        </w:rPr>
+        <w:t xml:space="preserve">:</w:t>
+      </w:r>
+      <w:r>
+        <w:t xml:space="preserve"> xóa bộ nhớ đệm của Hibernate để lần đọc sau thật sự đi xuống DB. Không có nó, test chỉ đọc lại object trong bộ nhớ.</w:t>
+      </w:r>
+    </w:p>
+    <w:p>
+      <w:pPr>
+        <w:pStyle w:val="ListParagraph"/>
+        <w:numPr>
+          <w:ilvl w:val="0"/>
+          <w:numId w:val="1"/>
+        </w:numPr>
+      </w:pPr>
+      <w:r>
+        <w:rPr>
+          <w:rFonts w:ascii="Consolas" w:eastAsia="Consolas" w:hAnsi="Consolas" w:cs="Consolas"/>
+          <w:b/>
+          <w:bCs/>
+        </w:rPr>
+        <w:t xml:space="preserve">JdbcTemplate</w:t>
+      </w:r>
+      <w:r>
+        <w:rPr>
+          <w:b/>
+          <w:bCs/>
+        </w:rPr>
+        <w:t xml:space="preserve">:</w:t>
+      </w:r>
+      <w:r>
+        <w:t xml:space="preserve"> chạy SQL thô để nhìn đúng cái nằm trong DB, hoặc để thử ràng buộc mà Java không tạo ra được (ví dụ ghi </w:t>
+      </w:r>
+      <w:r>
+        <w:rPr>
+          <w:rFonts w:ascii="Consolas" w:eastAsia="Consolas" w:hAnsi="Consolas" w:cs="Consolas"/>
+        </w:rPr>
+        <w:t xml:space="preserve">status = 'SYNCING'</w:t>
+      </w:r>
+      <w:r>
+        <w:t xml:space="preserve">).</w:t>
+      </w:r>
+    </w:p>
+    <w:p>
+      <w:pPr>
+        <w:pStyle w:val="ListParagraph"/>
+        <w:numPr>
+          <w:ilvl w:val="0"/>
+          <w:numId w:val="1"/>
+        </w:numPr>
+      </w:pPr>
+      <w:r>
+        <w:rPr>
+          <w:rFonts w:ascii="Consolas" w:eastAsia="Consolas" w:hAnsi="Consolas" w:cs="Consolas"/>
+          <w:b/>
+          <w:bCs/>
+        </w:rPr>
+        <w:t xml:space="preserve">ApplicationContextRunner</w:t>
+      </w:r>
+      <w:r>
+        <w:rPr>
+          <w:b/>
+          <w:bCs/>
+        </w:rPr>
+        <w:t xml:space="preserve"> cho kiểm tra khởi động:</w:t>
+      </w:r>
+      <w:r>
+        <w:t xml:space="preserve"> dựng một context nhỏ với cấu hình sai để chứng minh app </w:t>
+      </w:r>
+      <w:r>
+        <w:rPr>
+          <w:b/>
+          <w:bCs/>
+        </w:rPr>
+        <w:t xml:space="preserve">không</w:t>
+      </w:r>
+      <w:r>
+        <w:t xml:space="preserve"> start và thông báo không lộ secret.</w:t>
+      </w:r>
+    </w:p>
+    <w:p>
+      <w:pPr>
+        <w:pStyle w:val="ListParagraph"/>
+        <w:numPr>
+          <w:ilvl w:val="0"/>
+          <w:numId w:val="1"/>
+        </w:numPr>
+      </w:pPr>
+      <w:r>
+        <w:rPr>
+          <w:b/>
+          <w:bCs/>
+        </w:rPr>
+        <w:t xml:space="preserve">Mockito </w:t>
+      </w:r>
+      <w:r>
+        <w:rPr>
+          <w:rFonts w:ascii="Consolas" w:eastAsia="Consolas" w:hAnsi="Consolas" w:cs="Consolas"/>
+          <w:b/>
+          <w:bCs/>
+        </w:rPr>
+        <w:t xml:space="preserve">mock(...)</w:t>
+      </w:r>
+      <w:r>
+        <w:rPr>
+          <w:b/>
+          <w:bCs/>
+        </w:rPr>
+        <w:t xml:space="preserve"> trong unit test:</w:t>
+      </w:r>
+      <w:r>
+        <w:t xml:space="preserve"> </w:t>
+      </w:r>
+      <w:r>
+        <w:rPr>
+          <w:rFonts w:ascii="Consolas" w:eastAsia="Consolas" w:hAnsi="Consolas" w:cs="Consolas"/>
+        </w:rPr>
+        <w:t xml:space="preserve">OwnerCurrentUserTests</w:t>
+      </w:r>
+      <w:r>
+        <w:t xml:space="preserve"> giả repository để test </w:t>
+      </w:r>
+      <w:r>
+        <w:rPr>
+          <w:rFonts w:ascii="Consolas" w:eastAsia="Consolas" w:hAnsi="Consolas" w:cs="Consolas"/>
+        </w:rPr>
+        <w:t xml:space="preserve">CurrentUser</w:t>
+      </w:r>
+      <w:r>
+        <w:t xml:space="preserve"> mà không cần DB.</w:t>
+      </w:r>
+    </w:p>
+    <w:p>
+      <w:pPr>
+        <w:pStyle w:val="ListParagraph"/>
+        <w:numPr>
+          <w:ilvl w:val="0"/>
+          <w:numId w:val="1"/>
+        </w:numPr>
+      </w:pPr>
+      <w:r>
+        <w:rPr>
+          <w:b/>
+          <w:bCs/>
+        </w:rPr>
+        <w:t xml:space="preserve">Kiểm tra ngược ở mọi task:</w:t>
+      </w:r>
+    </w:p>
+    <w:p>
+      <w:pPr>
+        <w:pStyle w:val="ListParagraph"/>
+        <w:numPr>
+          <w:ilvl w:val="1"/>
+          <w:numId w:val="1"/>
+        </w:numPr>
+      </w:pPr>
+      <w:r>
+        <w:t xml:space="preserve">BE-09: bỏ bước tìm theo email → 2 test idempotent đỏ.</w:t>
+      </w:r>
+    </w:p>
+    <w:p>
+      <w:pPr>
+        <w:pStyle w:val="ListParagraph"/>
+        <w:numPr>
+          <w:ilvl w:val="1"/>
+          <w:numId w:val="1"/>
+        </w:numPr>
+      </w:pPr>
+      <w:r>
+        <w:t xml:space="preserve">BE-10: cho </w:t>
+      </w:r>
+      <w:r>
+        <w:rPr>
+          <w:rFonts w:ascii="Consolas" w:eastAsia="Consolas" w:hAnsi="Consolas" w:cs="Consolas"/>
+        </w:rPr>
+        <w:t xml:space="preserve">markHealthy</w:t>
+      </w:r>
+      <w:r>
+        <w:t xml:space="preserve"> gỡ </w:t>
+      </w:r>
+      <w:r>
+        <w:rPr>
+          <w:rFonts w:ascii="Consolas" w:eastAsia="Consolas" w:hAnsi="Consolas" w:cs="Consolas"/>
+        </w:rPr>
+        <w:t xml:space="preserve">AUTH_EXPIRED</w:t>
+      </w:r>
+      <w:r>
+        <w:t xml:space="preserve"> → đúng ô đó đỏ.</w:t>
+      </w:r>
+    </w:p>
+    <w:p>
+      <w:pPr>
+        <w:pStyle w:val="ListParagraph"/>
+        <w:numPr>
+          <w:ilvl w:val="1"/>
+          <w:numId w:val="1"/>
+        </w:numPr>
+      </w:pPr>
+      <w:r>
+        <w:t xml:space="preserve">BE-12: IV cố định → 1 test đỏ; bỏ AAD → 3 test đỏ; tag 96 bit → 2 test đỏ.</w:t>
+      </w:r>
+    </w:p>
+    <w:p>
+      <w:pPr>
+        <w:pStyle w:val="ListParagraph"/>
+        <w:numPr>
+          <w:ilvl w:val="1"/>
+          <w:numId w:val="1"/>
+        </w:numPr>
+      </w:pPr>
+      <w:r>
+        <w:t xml:space="preserve">BE-13: store "quên" ghi refresh token → test xoay khóa đỏ.</w:t>
+      </w:r>
+    </w:p>
+    <w:p>
+      <w:pPr>
+        <w:pStyle w:val="ListParagraph"/>
+        <w:numPr>
+          <w:ilvl w:val="1"/>
+          <w:numId w:val="1"/>
+        </w:numPr>
+      </w:pPr>
+      <w:r>
+        <w:t xml:space="preserve">BE-14: bỏ </w:t>
+      </w:r>
+      <w:r>
+        <w:rPr>
+          <w:rFonts w:ascii="Consolas" w:eastAsia="Consolas" w:hAnsi="Consolas" w:cs="Consolas"/>
+        </w:rPr>
+        <w:t xml:space="preserve">@Transactional</w:t>
+      </w:r>
+      <w:r>
+        <w:t xml:space="preserve"> → test rollback và test reconnect đỏ; không tìm account cũ → test reconnect đỏ (lỗi </w:t>
+      </w:r>
+      <w:r>
+        <w:rPr>
+          <w:rFonts w:ascii="Consolas" w:eastAsia="Consolas" w:hAnsi="Consolas" w:cs="Consolas"/>
+        </w:rPr>
+        <w:t xml:space="preserve">UNIQUE</w:t>
+      </w:r>
+      <w:r>
+        <w:t xml:space="preserve">); bỏ kiểm tra provider → test provider lạ đỏ; </w:t>
+      </w:r>
+      <w:r>
+        <w:rPr>
+          <w:rFonts w:ascii="Consolas" w:eastAsia="Consolas" w:hAnsi="Consolas" w:cs="Consolas"/>
+        </w:rPr>
+        <w:t xml:space="preserve">reconnected</w:t>
+      </w:r>
+      <w:r>
+        <w:t xml:space="preserve"> luôn </w:t>
+      </w:r>
+      <w:r>
+        <w:rPr>
+          <w:rFonts w:ascii="Consolas" w:eastAsia="Consolas" w:hAnsi="Consolas" w:cs="Consolas"/>
+        </w:rPr>
+        <w:t xml:space="preserve">false</w:t>
+      </w:r>
+      <w:r>
+        <w:t xml:space="preserve"> → test reconnect đỏ; publish trước khi lưu credential → test rollback đỏ; thêm một trường vào event → test payload đỏ.</w:t>
+      </w:r>
+    </w:p>
+    <w:p>
+      <w:pPr>
+        <w:pStyle w:val="ListParagraph"/>
+        <w:numPr>
+          <w:ilvl w:val="1"/>
+          <w:numId w:val="1"/>
+        </w:numPr>
+      </w:pPr>
+      <w:r>
+        <w:t xml:space="preserve">BE-15: danh sách không lọc owner → 2 test đỏ; </w:t>
+      </w:r>
+      <w:r>
+        <w:rPr>
+          <w:rFonts w:ascii="Consolas" w:eastAsia="Consolas" w:hAnsi="Consolas" w:cs="Consolas"/>
+        </w:rPr>
+        <w:t xml:space="preserve">get</w:t>
+      </w:r>
+      <w:r>
+        <w:t xml:space="preserve"> không lọc owner → test cô lập đỏ; mới nhất trước → test thứ tự đỏ; </w:t>
+      </w:r>
+      <w:r>
+        <w:rPr>
+          <w:rFonts w:ascii="Consolas" w:eastAsia="Consolas" w:hAnsi="Consolas" w:cs="Consolas"/>
+        </w:rPr>
+        <w:t xml:space="preserve">ProviderRegistry.get</w:t>
+      </w:r>
+      <w:r>
+        <w:t xml:space="preserve"> thay </w:t>
+      </w:r>
+      <w:r>
+        <w:rPr>
+          <w:rFonts w:ascii="Consolas" w:eastAsia="Consolas" w:hAnsi="Consolas" w:cs="Consolas"/>
+        </w:rPr>
+        <w:t xml:space="preserve">find</w:t>
+      </w:r>
+      <w:r>
+        <w:t xml:space="preserve"> → test connector đã gỡ đỏ; </w:t>
+      </w:r>
+      <w:r>
+        <w:rPr>
+          <w:rFonts w:ascii="Consolas" w:eastAsia="Consolas" w:hAnsi="Consolas" w:cs="Consolas"/>
+        </w:rPr>
+        <w:t xml:space="preserve">ownerId</w:t>
+      </w:r>
+      <w:r>
+        <w:t xml:space="preserve"> lọt vào response → test tập trường đỏ; detail nói "của người khác" → test cô lập đỏ.</w:t>
+      </w:r>
+    </w:p>
+    <w:p>
+      <w:pPr>
+        <w:pStyle w:val="ListParagraph"/>
+        <w:numPr>
+          <w:ilvl w:val="1"/>
+          <w:numId w:val="1"/>
+        </w:numPr>
+      </w:pPr>
+      <w:r>
+        <w:t xml:space="preserve">BE-16 (10 lỗi, chạy bằng một script nhỏ áp từng lỗi rồi khôi phục): </w:t>
+      </w:r>
+      <w:r>
+        <w:rPr>
+          <w:rFonts w:ascii="Consolas" w:eastAsia="Consolas" w:hAnsi="Consolas" w:cs="Consolas"/>
+        </w:rPr>
+        <w:t xml:space="preserve">@Size</w:t>
+      </w:r>
+      <w:r>
+        <w:t xml:space="preserve"> thay luật domain → tên trắng ra 500 và 100 emoji bị từ chối; bỏ "ít nhất một trường" → test </w:t>
+      </w:r>
+      <w:r>
+        <w:rPr>
+          <w:rFonts w:ascii="Consolas" w:eastAsia="Consolas" w:hAnsi="Consolas" w:cs="Consolas"/>
+        </w:rPr>
+        <w:t xml:space="preserve">{}</w:t>
+      </w:r>
+      <w:r>
+        <w:t xml:space="preserve"> đỏ; đảo nghĩa </w:t>
+      </w:r>
+      <w:r>
+        <w:rPr>
+          <w:rFonts w:ascii="Consolas" w:eastAsia="Consolas" w:hAnsi="Consolas" w:cs="Consolas"/>
+        </w:rPr>
+        <w:t xml:space="preserve">enabled</w:t>
+      </w:r>
+      <w:r>
+        <w:t xml:space="preserve"> → 2 test đỏ; không phát event khi tắt → đỏ; phát event cả khi không đổi gì → 2 test đỏ; PATCH không lọc owner → đỏ; bỏ </w:t>
+      </w:r>
+      <w:r>
+        <w:rPr>
+          <w:rFonts w:ascii="Consolas" w:eastAsia="Consolas" w:hAnsi="Consolas" w:cs="Consolas"/>
+        </w:rPr>
+        <w:t xml:space="preserve">@Version</w:t>
+      </w:r>
+      <w:r>
+        <w:t xml:space="preserve"> → test version cũ đỏ; không phát event khi reconnect → đỏ; phát event ở mọi lần reconnect → đỏ; thêm trường vào event → đỏ.</w:t>
+      </w:r>
+    </w:p>
+    <w:p>
+      <w:pPr>
+        <w:pStyle w:val="ListParagraph"/>
+        <w:numPr>
+          <w:ilvl w:val="0"/>
+          <w:numId w:val="1"/>
+        </w:numPr>
+      </w:pPr>
+      <w:r>
+        <w:rPr>
+          <w:rFonts w:ascii="Consolas" w:eastAsia="Consolas" w:hAnsi="Consolas" w:cs="Consolas"/>
+          <w:b/>
+          <w:bCs/>
+        </w:rPr>
+        <w:t xml:space="preserve">@RecordApplicationEvents</w:t>
+      </w:r>
+      <w:r>
+        <w:rPr>
+          <w:b/>
+          <w:bCs/>
+        </w:rPr>
+        <w:t xml:space="preserve"> + </w:t>
+      </w:r>
+      <w:r>
+        <w:rPr>
+          <w:rFonts w:ascii="Consolas" w:eastAsia="Consolas" w:hAnsi="Consolas" w:cs="Consolas"/>
+          <w:b/>
+          <w:bCs/>
+        </w:rPr>
+        <w:t xml:space="preserve">ApplicationEvents</w:t>
+      </w:r>
+      <w:r>
+        <w:rPr>
+          <w:b/>
+          <w:bCs/>
+        </w:rPr>
+        <w:t xml:space="preserve"> (Spring Test, BE-16):</w:t>
+      </w:r>
+      <w:r>
+        <w:t xml:space="preserve"> ghi lại event được publish trong một test </w:t>
+      </w:r>
+      <w:r>
+        <w:rPr>
+          <w:rFonts w:ascii="Consolas" w:eastAsia="Consolas" w:hAnsi="Consolas" w:cs="Consolas"/>
+        </w:rPr>
+        <w:t xml:space="preserve">@SpringBootTest</w:t>
+      </w:r>
+      <w:r>
+        <w:t xml:space="preserve">; </w:t>
+      </w:r>
+      <w:r>
+        <w:rPr>
+          <w:rFonts w:ascii="Consolas" w:eastAsia="Consolas" w:hAnsi="Consolas" w:cs="Consolas"/>
+        </w:rPr>
+        <w:t xml:space="preserve">events.stream(AccountStatusChanged.class)</w:t>
+      </w:r>
+      <w:r>
+        <w:t xml:space="preserve"> lấy ra để kiểm tra. </w:t>
+      </w:r>
+      <w:r>
+        <w:rPr>
+          <w:rFonts w:ascii="Consolas" w:eastAsia="Consolas" w:hAnsi="Consolas" w:cs="Consolas"/>
+        </w:rPr>
+        <w:t xml:space="preserve">AssertablePublishedEvents</w:t>
+      </w:r>
+      <w:r>
+        <w:t xml:space="preserve"> là cách tương tự của Spring Modulith, dùng trong module test.</w:t>
+      </w:r>
+    </w:p>
+    <w:p>
+      <w:pPr>
+        <w:pStyle w:val="ListParagraph"/>
+        <w:numPr>
+          <w:ilvl w:val="0"/>
+          <w:numId w:val="1"/>
+        </w:numPr>
+      </w:pPr>
+      <w:r>
+        <w:rPr>
+          <w:rFonts w:ascii="Consolas" w:eastAsia="Consolas" w:hAnsi="Consolas" w:cs="Consolas"/>
+          <w:b/>
+          <w:bCs/>
+        </w:rPr>
+        <w:t xml:space="preserve">TransactionTemplate</w:t>
+      </w:r>
+      <w:r>
+        <w:rPr>
+          <w:b/>
+          <w:bCs/>
+        </w:rPr>
+        <w:t xml:space="preserve"> trong test (BE-16):</w:t>
+      </w:r>
+      <w:r>
+        <w:t xml:space="preserve"> mở transaction bằng code để chen một bước vào giữa. Test gọi service (đã đọc </w:t>
+      </w:r>
+      <w:r>
+        <w:rPr>
+          <w:rFonts w:ascii="Consolas" w:eastAsia="Consolas" w:hAnsi="Consolas" w:cs="Consolas"/>
+        </w:rPr>
+        <w:t xml:space="preserve">version</w:t>
+      </w:r>
+      <w:r>
+        <w:t xml:space="preserve"> cũ), rồi giả "một request khác" bằng </w:t>
+      </w:r>
+      <w:r>
+        <w:rPr>
+          <w:rFonts w:ascii="Consolas" w:eastAsia="Consolas" w:hAnsi="Consolas" w:cs="Consolas"/>
+        </w:rPr>
+        <w:t xml:space="preserve">UPDATE ... SET version = version + 1</w:t>
+      </w:r>
+      <w:r>
+        <w:t xml:space="preserve"> trong cùng transaction; lúc commit phải ra </w:t>
+      </w:r>
+      <w:r>
+        <w:rPr>
+          <w:rFonts w:ascii="Consolas" w:eastAsia="Consolas" w:hAnsi="Consolas" w:cs="Consolas"/>
+        </w:rPr>
+        <w:t xml:space="preserve">OptimisticLockingFailureException</w:t>
+      </w:r>
+      <w:r>
+        <w:t xml:space="preserve">. Qua MockMvc không canh được hai request chạy chồng nhau, nên phần đổi lỗi thành 409 dựa vào test có sẵn của F01.</w:t>
+      </w:r>
+    </w:p>
+    <w:p>
+      <w:pPr>
+        <w:pStyle w:val="ListParagraph"/>
+        <w:numPr>
+          <w:ilvl w:val="0"/>
+          <w:numId w:val="1"/>
+        </w:numPr>
+      </w:pPr>
+      <w:r>
+        <w:rPr>
+          <w:b/>
+          <w:bCs/>
+        </w:rPr>
+        <w:t xml:space="preserve">Chạy cả ứng dụng thay cho web slice (BE-15):</w:t>
+      </w:r>
+      <w:r>
+        <w:t xml:space="preserve"> </w:t>
+      </w:r>
+      <w:r>
+        <w:rPr>
+          <w:rFonts w:ascii="Consolas" w:eastAsia="Consolas" w:hAnsi="Consolas" w:cs="Consolas"/>
+        </w:rPr>
+        <w:t xml:space="preserve">@SpringBootTest</w:t>
+      </w:r>
+      <w:r>
+        <w:t xml:space="preserve"> + </w:t>
+      </w:r>
+      <w:r>
+        <w:rPr>
+          <w:rFonts w:ascii="Consolas" w:eastAsia="Consolas" w:hAnsi="Consolas" w:cs="Consolas"/>
+        </w:rPr>
+        <w:t xml:space="preserve">@AutoConfigureMockMvc</w:t>
+      </w:r>
+      <w:r>
+        <w:t xml:space="preserve"> gửi request HTTP giả qua đúng các lớp thật: security, </w:t>
+      </w:r>
+      <w:r>
+        <w:rPr>
+          <w:rFonts w:ascii="Consolas" w:eastAsia="Consolas" w:hAnsi="Consolas" w:cs="Consolas"/>
+        </w:rPr>
+        <w:t xml:space="preserve">CurrentUser</w:t>
+      </w:r>
+      <w:r>
+        <w:t xml:space="preserve">, service, PostgreSQL, error handler, Jackson. Chọn thay cho </w:t>
+      </w:r>
+      <w:r>
+        <w:rPr>
+          <w:rFonts w:ascii="Consolas" w:eastAsia="Consolas" w:hAnsi="Consolas" w:cs="Consolas"/>
+        </w:rPr>
+        <w:t xml:space="preserve">@WebMvcTest</w:t>
+      </w:r>
+      <w:r>
+        <w:t xml:space="preserve"> với service giả vì test cô lập dữ liệu phải chạy trên dữ liệu thật; với service giả, test chỉ kiểm tra cái mock.</w:t>
+      </w:r>
+    </w:p>
+    <w:p>
+      <w:pPr>
+        <w:pStyle w:val="ListParagraph"/>
+        <w:numPr>
+          <w:ilvl w:val="0"/>
+          <w:numId w:val="1"/>
+        </w:numPr>
+      </w:pPr>
+      <w:r>
+        <w:rPr>
+          <w:b/>
+          <w:bCs/>
+        </w:rPr>
+        <w:t xml:space="preserve">Ghim thời điểm bằng SQL:</w:t>
+      </w:r>
+      <w:r>
+        <w:t xml:space="preserve"> </w:t>
+      </w:r>
+      <w:r>
+        <w:rPr>
+          <w:rFonts w:ascii="Consolas" w:eastAsia="Consolas" w:hAnsi="Consolas" w:cs="Consolas"/>
+        </w:rPr>
+        <w:t xml:space="preserve">@PrePersist</w:t>
+      </w:r>
+      <w:r>
+        <w:t xml:space="preserve"> điền </w:t>
+      </w:r>
+      <w:r>
+        <w:rPr>
+          <w:rFonts w:ascii="Consolas" w:eastAsia="Consolas" w:hAnsi="Consolas" w:cs="Consolas"/>
+        </w:rPr>
+        <w:t xml:space="preserve">created_at</w:t>
+      </w:r>
+      <w:r>
+        <w:t xml:space="preserve"> bằng giờ thật nên không biết trước. Test ghi đè bằng </w:t>
+      </w:r>
+      <w:r>
+        <w:rPr>
+          <w:rFonts w:ascii="Consolas" w:eastAsia="Consolas" w:hAnsi="Consolas" w:cs="Consolas"/>
+        </w:rPr>
+        <w:t xml:space="preserve">UPDATE connected_account SET created_at = ?</w:t>
+      </w:r>
+      <w:r>
+        <w:t xml:space="preserve"> để biết chắc thứ tự và chuỗi JSON mong đợi (</w:t>
+      </w:r>
+      <w:r>
+        <w:rPr>
+          <w:rFonts w:ascii="Consolas" w:eastAsia="Consolas" w:hAnsi="Consolas" w:cs="Consolas"/>
+        </w:rPr>
+        <w:t xml:space="preserve">2026-10-05T03:15:00Z</w:t>
+      </w:r>
+      <w:r>
+        <w:t xml:space="preserve">). Account "mới hơn" được tạo </w:t>
+      </w:r>
+      <w:r>
+        <w:rPr>
+          <w:b/>
+          <w:bCs/>
+        </w:rPr>
+        <w:t xml:space="preserve">trước</w:t>
+      </w:r>
+      <w:r>
+        <w:t xml:space="preserve">, để test thứ tự không thể xanh chỉ nhờ thứ tự chèn.</w:t>
+      </w:r>
+    </w:p>
+    <w:p>
+      <w:pPr>
+        <w:pStyle w:val="ListParagraph"/>
+        <w:numPr>
+          <w:ilvl w:val="0"/>
+          <w:numId w:val="1"/>
+        </w:numPr>
+      </w:pPr>
+      <w:r>
+        <w:rPr>
+          <w:rFonts w:ascii="Consolas" w:eastAsia="Consolas" w:hAnsi="Consolas" w:cs="Consolas"/>
+          <w:b/>
+          <w:bCs/>
+        </w:rPr>
+        <w:t xml:space="preserve">JsonPath.read(body, "$")</w:t>
+      </w:r>
+      <w:r>
+        <w:rPr>
+          <w:b/>
+          <w:bCs/>
+        </w:rPr>
+        <w:t xml:space="preserve">:</w:t>
+      </w:r>
+      <w:r>
+        <w:t xml:space="preserve"> đọc JSON thành </w:t>
+      </w:r>
+      <w:r>
+        <w:rPr>
+          <w:rFonts w:ascii="Consolas" w:eastAsia="Consolas" w:hAnsi="Consolas" w:cs="Consolas"/>
+        </w:rPr>
+        <w:t xml:space="preserve">Map</w:t>
+      </w:r>
+      <w:r>
+        <w:t xml:space="preserve"> để so tập tên trường.</w:t>
+      </w:r>
+    </w:p>
+    <w:p>
+      <w:pPr>
+        <w:pStyle w:val="ListParagraph"/>
+        <w:numPr>
+          <w:ilvl w:val="0"/>
+          <w:numId w:val="1"/>
+        </w:numPr>
+      </w:pPr>
+      <w:r>
+        <w:rPr>
+          <w:rFonts w:ascii="Consolas" w:eastAsia="Consolas" w:hAnsi="Consolas" w:cs="Consolas"/>
+          <w:b/>
+          <w:bCs/>
+        </w:rPr>
+        <w:t xml:space="preserve">@ApplicationModuleTest(mode = DIRECT_DEPENDENCIES)</w:t>
+      </w:r>
+      <w:r>
+        <w:rPr>
+          <w:b/>
+          <w:bCs/>
+        </w:rPr>
+        <w:t xml:space="preserve"> (Spring Modulith, BE-14):</w:t>
+      </w:r>
+      <w:r>
+        <w:t xml:space="preserve"> chỉ khởi động module </w:t>
+      </w:r>
+      <w:r>
+        <w:rPr>
+          <w:rFonts w:ascii="Consolas" w:eastAsia="Consolas" w:hAnsi="Consolas" w:cs="Consolas"/>
+        </w:rPr>
+        <w:t xml:space="preserve">account</w:t>
+      </w:r>
+      <w:r>
+        <w:t xml:space="preserve"> cộng các module nó dùng trực tiếp, không phải cả ứng dụng. Lúc làm BE-14 đó chỉ là </w:t>
+      </w:r>
+      <w:r>
+        <w:rPr>
+          <w:rFonts w:ascii="Consolas" w:eastAsia="Consolas" w:hAnsi="Consolas" w:cs="Consolas"/>
+        </w:rPr>
+        <w:t xml:space="preserve">provider</w:t>
+      </w:r>
+      <w:r>
+        <w:t xml:space="preserve">; từ BE-15, </w:t>
+      </w:r>
+      <w:r>
+        <w:rPr>
+          <w:rFonts w:ascii="Consolas" w:eastAsia="Consolas" w:hAnsi="Consolas" w:cs="Consolas"/>
+        </w:rPr>
+        <w:t xml:space="preserve">account</w:t>
+      </w:r>
+      <w:r>
+        <w:t xml:space="preserve"> dùng thêm </w:t>
+      </w:r>
+      <w:r>
+        <w:rPr>
+          <w:rFonts w:ascii="Consolas" w:eastAsia="Consolas" w:hAnsi="Consolas" w:cs="Consolas"/>
+        </w:rPr>
+        <w:t xml:space="preserve">CurrentUser</w:t>
+      </w:r>
+      <w:r>
+        <w:t xml:space="preserve"> (module </w:t>
+      </w:r>
+      <w:r>
+        <w:rPr>
+          <w:rFonts w:ascii="Consolas" w:eastAsia="Consolas" w:hAnsi="Consolas" w:cs="Consolas"/>
+        </w:rPr>
+        <w:t xml:space="preserve">identity</w:t>
+      </w:r>
+      <w:r>
+        <w:t xml:space="preserve">) và mã lỗi của </w:t>
+      </w:r>
+      <w:r>
+        <w:rPr>
+          <w:rFonts w:ascii="Consolas" w:eastAsia="Consolas" w:hAnsi="Consolas" w:cs="Consolas"/>
+        </w:rPr>
+        <w:t xml:space="preserve">common</w:t>
+      </w:r>
+      <w:r>
+        <w:t xml:space="preserve">, nên hai module này cũng được nạp. Test vẫn tự dọn bảng và tự chèn owner của nó vào </w:t>
+      </w:r>
+      <w:r>
+        <w:rPr>
+          <w:rFonts w:ascii="Consolas" w:eastAsia="Consolas" w:hAnsi="Consolas" w:cs="Consolas"/>
+        </w:rPr>
+        <w:t xml:space="preserve">app_user</w:t>
+      </w:r>
+      <w:r>
+        <w:t xml:space="preserve"> bằng </w:t>
+      </w:r>
+      <w:r>
+        <w:rPr>
+          <w:rFonts w:ascii="Consolas" w:eastAsia="Consolas" w:hAnsi="Consolas" w:cs="Consolas"/>
+        </w:rPr>
+        <w:t xml:space="preserve">JdbcTemplate</w:t>
+      </w:r>
+      <w:r>
+        <w:t xml:space="preserve">, nên không phụ thuộc owner được tạo lúc khởi động.</w:t>
+      </w:r>
+    </w:p>
+    <w:p>
+      <w:pPr>
+        <w:pStyle w:val="ListParagraph"/>
+        <w:numPr>
+          <w:ilvl w:val="0"/>
+          <w:numId w:val="1"/>
+        </w:numPr>
+      </w:pPr>
+      <w:r>
+        <w:rPr>
+          <w:b/>
+          <w:bCs/>
+        </w:rPr>
+        <w:t xml:space="preserve">Test không có </w:t>
+      </w:r>
+      <w:r>
+        <w:rPr>
+          <w:rFonts w:ascii="Consolas" w:eastAsia="Consolas" w:hAnsi="Consolas" w:cs="Consolas"/>
+          <w:b/>
+          <w:bCs/>
+        </w:rPr>
+        <w:t xml:space="preserve">@Transactional</w:t>
+      </w:r>
+      <w:r>
+        <w:rPr>
+          <w:b/>
+          <w:bCs/>
+        </w:rPr>
+        <w:t xml:space="preserve">:</w:t>
+      </w:r>
+      <w:r>
+        <w:t xml:space="preserve"> để service tự commit hoặc rollback như khi chạy thật. Cái giá là dữ liệu ở lại sau mỗi test, nên </w:t>
+      </w:r>
+      <w:r>
+        <w:rPr>
+          <w:rFonts w:ascii="Consolas" w:eastAsia="Consolas" w:hAnsi="Consolas" w:cs="Consolas"/>
+        </w:rPr>
+        <w:t xml:space="preserve">@BeforeEach</w:t>
+      </w:r>
+      <w:r>
+        <w:t xml:space="preserve"> tự dọn bảng bằng </w:t>
+      </w:r>
+      <w:r>
+        <w:rPr>
+          <w:rFonts w:ascii="Consolas" w:eastAsia="Consolas" w:hAnsi="Consolas" w:cs="Consolas"/>
+        </w:rPr>
+        <w:t xml:space="preserve">JdbcTestUtils.deleteFromTables</w:t>
+      </w:r>
+      <w:r>
+        <w:t xml:space="preserve">.</w:t>
+      </w:r>
+    </w:p>
+    <w:p>
+      <w:pPr>
+        <w:pStyle w:val="ListParagraph"/>
+        <w:numPr>
+          <w:ilvl w:val="0"/>
+          <w:numId w:val="1"/>
+        </w:numPr>
+      </w:pPr>
+      <w:r>
+        <w:rPr>
+          <w:rFonts w:ascii="Consolas" w:eastAsia="Consolas" w:hAnsi="Consolas" w:cs="Consolas"/>
+          <w:b/>
+          <w:bCs/>
+        </w:rPr>
+        <w:t xml:space="preserve">AssertablePublishedEvents</w:t>
+      </w:r>
+      <w:r>
+        <w:rPr>
+          <w:b/>
+          <w:bCs/>
+        </w:rPr>
+        <w:t xml:space="preserve"> làm tham số của method test:</w:t>
+      </w:r>
+      <w:r>
+        <w:t xml:space="preserve"> Spring Modulith ghi lại mọi event được publish trong test đó; </w:t>
+      </w:r>
+      <w:r>
+        <w:rPr>
+          <w:rFonts w:ascii="Consolas" w:eastAsia="Consolas" w:hAnsi="Consolas" w:cs="Consolas"/>
+        </w:rPr>
+        <w:t xml:space="preserve">events.ofType(AccountConnected.class)</w:t>
+      </w:r>
+      <w:r>
+        <w:t xml:space="preserve"> lấy ra để kiểm tra số lượng và nội dung.</w:t>
+      </w:r>
+    </w:p>
+    <w:p>
+      <w:pPr>
+        <w:pStyle w:val="ListParagraph"/>
+        <w:numPr>
+          <w:ilvl w:val="0"/>
+          <w:numId w:val="1"/>
+        </w:numPr>
+      </w:pPr>
+      <w:r>
+        <w:rPr>
+          <w:rFonts w:ascii="Consolas" w:eastAsia="Consolas" w:hAnsi="Consolas" w:cs="Consolas"/>
+          <w:b/>
+          <w:bCs/>
+        </w:rPr>
+        <w:t xml:space="preserve">@MockitoSpyBean</w:t>
+      </w:r>
+      <w:r>
+        <w:rPr>
+          <w:b/>
+          <w:bCs/>
+        </w:rPr>
+        <w:t xml:space="preserve">:</w:t>
+      </w:r>
+      <w:r>
+        <w:t xml:space="preserve"> bọc bean thật. Bình thường nó chạy code thật; riêng một test bảo nó ném lỗi bằng </w:t>
+      </w:r>
+      <w:r>
+        <w:rPr>
+          <w:rFonts w:ascii="Consolas" w:eastAsia="Consolas" w:hAnsi="Consolas" w:cs="Consolas"/>
+        </w:rPr>
+        <w:t xml:space="preserve">doThrow(...).when(credentials).save(any(), any(), any())</w:t>
+      </w:r>
+      <w:r>
+        <w:t xml:space="preserve">, để giả lập "lưu credential thất bại" mà không sửa code production. Assertion vẫn kiểm tra DB thật, không kiểm tra mock.</w:t>
+      </w:r>
+    </w:p>
+    <w:p>
+      <w:pPr>
+        <w:pStyle w:val="ListParagraph"/>
+        <w:numPr>
+          <w:ilvl w:val="0"/>
+          <w:numId w:val="1"/>
+        </w:numPr>
+      </w:pPr>
+      <w:r>
+        <w:rPr>
+          <w:b/>
+          <w:bCs/>
+        </w:rPr>
+        <w:t xml:space="preserve">Bean riêng cho test:</w:t>
+      </w:r>
+      <w:r>
+        <w:t xml:space="preserve"> một class </w:t>
+      </w:r>
+      <w:r>
+        <w:rPr>
+          <w:rFonts w:ascii="Consolas" w:eastAsia="Consolas" w:hAnsi="Consolas" w:cs="Consolas"/>
+        </w:rPr>
+        <w:t xml:space="preserve">@TestConfiguration</w:t>
+      </w:r>
+      <w:r>
+        <w:t xml:space="preserve"> lồng trong class test tạo </w:t>
+      </w:r>
+      <w:r>
+        <w:rPr>
+          <w:rFonts w:ascii="Consolas" w:eastAsia="Consolas" w:hAnsi="Consolas" w:cs="Consolas"/>
+        </w:rPr>
+        <w:t xml:space="preserve">FakeMessageProvider</w:t>
+      </w:r>
+      <w:r>
+        <w:t xml:space="preserve"> loại </w:t>
+      </w:r>
+      <w:r>
+        <w:rPr>
+          <w:rFonts w:ascii="Consolas" w:eastAsia="Consolas" w:hAnsi="Consolas" w:cs="Consolas"/>
+        </w:rPr>
+        <w:t xml:space="preserve">fake</w:t>
+      </w:r>
+      <w:r>
+        <w:t xml:space="preserve"> làm bean, để </w:t>
+      </w:r>
+      <w:r>
+        <w:rPr>
+          <w:rFonts w:ascii="Consolas" w:eastAsia="Consolas" w:hAnsi="Consolas" w:cs="Consolas"/>
+        </w:rPr>
+        <w:t xml:space="preserve">ProviderRegistry</w:t>
+      </w:r>
+      <w:r>
+        <w:t xml:space="preserve"> thấy provider này.</w:t>
+      </w:r>
+    </w:p>
+    <w:p>
+      <w:pPr>
+        <w:pStyle w:val="ListParagraph"/>
+        <w:numPr>
+          <w:ilvl w:val="0"/>
+          <w:numId w:val="1"/>
+        </w:numPr>
+      </w:pPr>
+      <w:r>
+        <w:rPr>
+          <w:rFonts w:ascii="Consolas" w:eastAsia="Consolas" w:hAnsi="Consolas" w:cs="Consolas"/>
+          <w:b/>
+          <w:bCs/>
+        </w:rPr>
+        <w:t xml:space="preserve">row_to_json(c)::text</w:t>
+      </w:r>
+      <w:r>
+        <w:rPr>
+          <w:b/>
+          <w:bCs/>
+        </w:rPr>
+        <w:t xml:space="preserve"> của PostgreSQL:</w:t>
+      </w:r>
+      <w:r>
+        <w:t xml:space="preserve"> biến cả một dòng thành chuỗi JSON để kiểm tra bằng một lệnh rằng </w:t>
+      </w:r>
+      <w:r>
+        <w:rPr>
+          <w:b/>
+          <w:bCs/>
+        </w:rPr>
+        <w:t xml:space="preserve">không cột nào</w:t>
+      </w:r>
+      <w:r>
+        <w:t xml:space="preserve"> chứa token dạng chữ.</w:t>
+      </w:r>
+    </w:p>
+    <w:p>
+      <w:pPr>
+        <w:pStyle w:val="ListParagraph"/>
+        <w:numPr>
+          <w:ilvl w:val="0"/>
+          <w:numId w:val="1"/>
+        </w:numPr>
+      </w:pPr>
+      <w:r>
+        <w:rPr>
+          <w:rFonts w:ascii="Consolas" w:eastAsia="Consolas" w:hAnsi="Consolas" w:cs="Consolas"/>
+          <w:b/>
+          <w:bCs/>
+        </w:rPr>
+        <w:t xml:space="preserve">entityManager.flush()</w:t>
+      </w:r>
+      <w:r>
+        <w:rPr>
+          <w:b/>
+          <w:bCs/>
+        </w:rPr>
+        <w:t xml:space="preserve"> để lộ lỗi:</w:t>
+      </w:r>
+      <w:r>
+        <w:t xml:space="preserve"> trong </w:t>
+      </w:r>
+      <w:r>
+        <w:rPr>
+          <w:rFonts w:ascii="Consolas" w:eastAsia="Consolas" w:hAnsi="Consolas" w:cs="Consolas"/>
+        </w:rPr>
+        <w:t xml:space="preserve">@DataJpaTest</w:t>
+      </w:r>
+      <w:r>
+        <w:t xml:space="preserve">, lệnh ghi chỉ thật sự xuống DB khi flush. Muốn thấy lỗi khóa ngoại thì phải flush ngay trong đoạn code đang chờ lỗi; test còn kiểm tra cả stack trace của lỗi đó không chứa token.</w:t>
+      </w:r>
+    </w:p>
+    <w:p>
+      <w:pPr>
+        <w:pBdr>
+          <w:bottom w:val="single" w:sz="4" w:space="0" w:color="auto"/>
+        </w:pBdr>
+        <w:ind w:left="0"/>
+      </w:pPr>
+    </w:p>
+    <w:p>
+      <w:pPr>
+        <w:pStyle w:val="Heading2"/>
+      </w:pPr>
+      <w:r>
+        <w:t xml:space="preserve">22. Tự kiểm tra F02 (phần đã làm)</w:t>
       </w:r>
     </w:p>
     <w:p>
@@ -13076,6 +14265,126 @@
       </w:r>
       <w:r>
         <w:t xml:space="preserve"> trả gì cho account Gmail cũ?</w:t>
+      </w:r>
+    </w:p>
+    <w:p>
+      <w:pPr>
+        <w:pStyle w:val="ListParagraph"/>
+        <w:numPr>
+          <w:ilvl w:val="0"/>
+          <w:numId w:val="101"/>
+        </w:numPr>
+      </w:pPr>
+      <w:r>
+        <w:t xml:space="preserve">Vì sao các trường của </w:t>
+      </w:r>
+      <w:r>
+        <w:rPr>
+          <w:rFonts w:ascii="Consolas" w:eastAsia="Consolas" w:hAnsi="Consolas" w:cs="Consolas"/>
+        </w:rPr>
+        <w:t xml:space="preserve">UpdateAccountRequest</w:t>
+      </w:r>
+      <w:r>
+        <w:t xml:space="preserve"> là </w:t>
+      </w:r>
+      <w:r>
+        <w:rPr>
+          <w:rFonts w:ascii="Consolas" w:eastAsia="Consolas" w:hAnsi="Consolas" w:cs="Consolas"/>
+        </w:rPr>
+        <w:t xml:space="preserve">Boolean</w:t>
+      </w:r>
+      <w:r>
+        <w:t xml:space="preserve"> chứ không phải </w:t>
+      </w:r>
+      <w:r>
+        <w:rPr>
+          <w:rFonts w:ascii="Consolas" w:eastAsia="Consolas" w:hAnsi="Consolas" w:cs="Consolas"/>
+        </w:rPr>
+        <w:t xml:space="preserve">boolean</w:t>
+      </w:r>
+      <w:r>
+        <w:t xml:space="preserve">?</w:t>
+      </w:r>
+    </w:p>
+    <w:p>
+      <w:pPr>
+        <w:pStyle w:val="ListParagraph"/>
+        <w:numPr>
+          <w:ilvl w:val="0"/>
+          <w:numId w:val="101"/>
+        </w:numPr>
+      </w:pPr>
+      <w:r>
+        <w:t xml:space="preserve">Nếu chỉ dùng </w:t>
+      </w:r>
+      <w:r>
+        <w:rPr>
+          <w:rFonts w:ascii="Consolas" w:eastAsia="Consolas" w:hAnsi="Consolas" w:cs="Consolas"/>
+        </w:rPr>
+        <w:t xml:space="preserve">@Size(max = 100)</w:t>
+      </w:r>
+      <w:r>
+        <w:t xml:space="preserve"> cho </w:t>
+      </w:r>
+      <w:r>
+        <w:rPr>
+          <w:rFonts w:ascii="Consolas" w:eastAsia="Consolas" w:hAnsi="Consolas" w:cs="Consolas"/>
+        </w:rPr>
+        <w:t xml:space="preserve">displayName</w:t>
+      </w:r>
+      <w:r>
+        <w:t xml:space="preserve"> thì hai lỗi nào xảy ra?</w:t>
+      </w:r>
+    </w:p>
+    <w:p>
+      <w:pPr>
+        <w:pStyle w:val="ListParagraph"/>
+        <w:numPr>
+          <w:ilvl w:val="0"/>
+          <w:numId w:val="101"/>
+        </w:numPr>
+      </w:pPr>
+      <w:r>
+        <w:t xml:space="preserve">Hai request cùng đổi tên một account cùng lúc: request đến sau nhận gì, và nhờ đâu?</w:t>
+      </w:r>
+    </w:p>
+    <w:p>
+      <w:pPr>
+        <w:pStyle w:val="ListParagraph"/>
+        <w:numPr>
+          <w:ilvl w:val="0"/>
+          <w:numId w:val="101"/>
+        </w:numPr>
+      </w:pPr>
+      <w:r>
+        <w:t xml:space="preserve">Vì sao </w:t>
+      </w:r>
+      <w:r>
+        <w:rPr>
+          <w:rFonts w:ascii="Consolas" w:eastAsia="Consolas" w:hAnsi="Consolas" w:cs="Consolas"/>
+        </w:rPr>
+        <w:t xml:space="preserve">AccountStatus</w:t>
+      </w:r>
+      <w:r>
+        <w:t xml:space="preserve"> phải nằm ở </w:t>
+      </w:r>
+      <w:r>
+        <w:rPr>
+          <w:rFonts w:ascii="Consolas" w:eastAsia="Consolas" w:hAnsi="Consolas" w:cs="Consolas"/>
+        </w:rPr>
+        <w:t xml:space="preserve">dev.sino.account</w:t>
+      </w:r>
+      <w:r>
+        <w:t xml:space="preserve"> khi có event </w:t>
+      </w:r>
+      <w:r>
+        <w:rPr>
+          <w:rFonts w:ascii="Consolas" w:eastAsia="Consolas" w:hAnsi="Consolas" w:cs="Consolas"/>
+        </w:rPr>
+        <w:t xml:space="preserve">AccountStatusChanged</w:t>
+      </w:r>
+      <w:r>
+        <w:t xml:space="preserve">?</w:t>
       </w:r>
     </w:p>
     <w:p>
@@ -13084,7 +14393,7 @@
           <w:i/>
           <w:iCs/>
         </w:rPr>
-        <w:t xml:space="preserve">(Phần BE-16…BE-18 — sửa account, xóa account, nghiệm thu — sẽ được bổ sung khi làm.)</w:t>
+        <w:t xml:space="preserve">(Phần BE-17…BE-18 — xóa account, nghiệm thu — sẽ được bổ sung khi làm.)</w:t>
       </w:r>
     </w:p>
     <w:sectPr>

</xml_diff>

<commit_message>
docs(knowledge): add BE-17 (soft delete) to the Phase 0 guide
New section 21 explains soft versus hard delete and its cost, the three
steps of one removal in one transaction (why the credential is deleted
for good while the account row stays, why the status is left alone),
filtering with RemovedAtIsNull in the method names instead of a hidden
@SQLRestriction, bringing a removed account back on reconnect, and the
V5 migration. The test section gains the BE-17 mutations and the
grouped event payload tests; four self-check questions added. The Word
copy is regenerated (docs check clean) and the new pages were inspected.

Co-Authored-By: Claude Opus 5.5 (1M context) <noreply@anthropic.com>
</commit_message>
<xml_diff>
--- a/docs/knowledge/phase-0-backend-foundation.docx
+++ b/docs/knowledge/phase-0-backend-foundation.docx
@@ -97,7 +97,7 @@
         <w:t xml:space="preserve">Phạm vi:</w:t>
       </w:r>
       <w:r>
-        <w:t xml:space="preserve"> F01 Project Foundation và F03 Provider Contract (mục 0–12); F02 Connected Accounts (mục 13–22, đang làm: xong BE-09…BE-16).</w:t>
+        <w:t xml:space="preserve"> F01 Project Foundation và F03 Provider Contract (mục 0–12); F02 Connected Accounts (mục 13–23, đang làm: xong BE-09…BE-17).</w:t>
         <w:br/>
       </w:r>
       <w:r>
@@ -7330,7 +7330,7 @@
           </w:tcPr>
           <w:p>
             <w:r>
-              <w:t xml:space="preserve">BE-17…BE-18</w:t>
+              <w:t xml:space="preserve">BE-17</w:t>
             </w:r>
           </w:p>
         </w:tc>
@@ -7340,7 +7340,54 @@
           </w:tcPr>
           <w:p>
             <w:r>
-              <w:t xml:space="preserve">Xóa account, nghiệm thu</w:t>
+              <w:t xml:space="preserve">Xóa account (</w:t>
+            </w:r>
+            <w:r>
+              <w:rPr>
+                <w:rFonts w:ascii="Consolas" w:eastAsia="Consolas" w:hAnsi="Consolas" w:cs="Consolas"/>
+              </w:rPr>
+              <w:t xml:space="preserve">DELETE</w:t>
+            </w:r>
+            <w:r>
+              <w:t xml:space="preserve">, xóa mềm theo D-13 = B), event </w:t>
+            </w:r>
+            <w:r>
+              <w:rPr>
+                <w:rFonts w:ascii="Consolas" w:eastAsia="Consolas" w:hAnsi="Consolas" w:cs="Consolas"/>
+              </w:rPr>
+              <w:t xml:space="preserve">AccountRemoved</w:t>
+            </w:r>
+          </w:p>
+        </w:tc>
+        <w:tc>
+          <w:tcPr>
+            <w:tcW w:w="3120" w:type="dxa"/>
+          </w:tcPr>
+          <w:p>
+            <w:r>
+              <w:t xml:space="preserve">xong</w:t>
+            </w:r>
+          </w:p>
+        </w:tc>
+      </w:tr>
+      <w:tr>
+        <w:tc>
+          <w:tcPr>
+            <w:tcW w:w="3120" w:type="dxa"/>
+          </w:tcPr>
+          <w:p>
+            <w:r>
+              <w:t xml:space="preserve">BE-18</w:t>
+            </w:r>
+          </w:p>
+        </w:tc>
+        <w:tc>
+          <w:tcPr>
+            <w:tcW w:w="3120" w:type="dxa"/>
+          </w:tcPr>
+          <w:p>
+            <w:r>
+              <w:t xml:space="preserve">Kiểm tra end-to-end, chống lộ secret, nghiệm thu F02</w:t>
             </w:r>
           </w:p>
         </w:tc>
@@ -12757,55 +12804,99 @@
         <w:pStyle w:val="Heading2"/>
       </w:pPr>
       <w:r>
-        <w:t xml:space="preserve">21. Kỹ thuật test mới trong F02</w:t>
-      </w:r>
-    </w:p>
-    <w:p>
-      <w:pPr>
-        <w:pStyle w:val="ListParagraph"/>
-        <w:numPr>
-          <w:ilvl w:val="0"/>
-          <w:numId w:val="1"/>
-        </w:numPr>
-      </w:pPr>
-      <w:r>
-        <w:rPr>
-          <w:rFonts w:ascii="Consolas" w:eastAsia="Consolas" w:hAnsi="Consolas" w:cs="Consolas"/>
-          <w:b/>
-          <w:bCs/>
-        </w:rPr>
-        <w:t xml:space="preserve">@DataJpaTest</w:t>
-      </w:r>
-      <w:r>
-        <w:rPr>
-          <w:b/>
-          <w:bCs/>
-        </w:rPr>
-        <w:t xml:space="preserve"> + </w:t>
-      </w:r>
-      <w:r>
-        <w:rPr>
-          <w:rFonts w:ascii="Consolas" w:eastAsia="Consolas" w:hAnsi="Consolas" w:cs="Consolas"/>
-          <w:b/>
-          <w:bCs/>
-        </w:rPr>
-        <w:t xml:space="preserve">@AutoConfigureTestDatabase(replace = NONE)</w:t>
-      </w:r>
-      <w:r>
-        <w:rPr>
-          <w:b/>
-          <w:bCs/>
-        </w:rPr>
-        <w:t xml:space="preserve">:</w:t>
-      </w:r>
-      <w:r>
-        <w:t xml:space="preserve"> slice chỉ nạp JPA và Flyway, chạy trên PostgreSQL thật (Testcontainers) để </w:t>
-      </w:r>
-      <w:r>
-        <w:rPr>
-          <w:rFonts w:ascii="Consolas" w:eastAsia="Consolas" w:hAnsi="Consolas" w:cs="Consolas"/>
-        </w:rPr>
-        <w:t xml:space="preserve">CHECK</w:t>
+        <w:t xml:space="preserve">21. Xóa account: xóa mềm (BE-17, D-13 = B)</w:t>
+      </w:r>
+    </w:p>
+    <w:p>
+      <w:pPr>
+        <w:pStyle w:val="Heading3"/>
+      </w:pPr>
+      <w:r>
+        <w:t xml:space="preserve">21.1 Xóa mềm là gì</w:t>
+      </w:r>
+    </w:p>
+    <w:p>
+      <w:pPr>
+        <w:pStyle w:val="ListParagraph"/>
+        <w:numPr>
+          <w:ilvl w:val="0"/>
+          <w:numId w:val="1"/>
+        </w:numPr>
+      </w:pPr>
+      <w:r>
+        <w:rPr>
+          <w:b/>
+          <w:bCs/>
+        </w:rPr>
+        <w:t xml:space="preserve">Xóa cứng</w:t>
+      </w:r>
+      <w:r>
+        <w:t xml:space="preserve"> (hard delete): </w:t>
+      </w:r>
+      <w:r>
+        <w:rPr>
+          <w:rFonts w:ascii="Consolas" w:eastAsia="Consolas" w:hAnsi="Consolas" w:cs="Consolas"/>
+        </w:rPr>
+        <w:t xml:space="preserve">DELETE FROM ...</w:t>
+      </w:r>
+      <w:r>
+        <w:t xml:space="preserve">, dòng biến mất khỏi bảng. </w:t>
+      </w:r>
+      <w:r>
+        <w:rPr>
+          <w:b/>
+          <w:bCs/>
+        </w:rPr>
+        <w:t xml:space="preserve">Xóa mềm</w:t>
+      </w:r>
+      <w:r>
+        <w:t xml:space="preserve"> (soft delete): giữ dòng, ghi một dấu (ở đây là cột </w:t>
+      </w:r>
+      <w:r>
+        <w:rPr>
+          <w:rFonts w:ascii="Consolas" w:eastAsia="Consolas" w:hAnsi="Consolas" w:cs="Consolas"/>
+        </w:rPr>
+        <w:t xml:space="preserve">removed_at</w:t>
+      </w:r>
+      <w:r>
+        <w:t xml:space="preserve">), và mọi chỗ đọc phải bỏ qua dòng có dấu.</w:t>
+      </w:r>
+    </w:p>
+    <w:p>
+      <w:pPr>
+        <w:pStyle w:val="ListParagraph"/>
+        <w:numPr>
+          <w:ilvl w:val="0"/>
+          <w:numId w:val="1"/>
+        </w:numPr>
+      </w:pPr>
+      <w:r>
+        <w:t xml:space="preserve">Người dùng chọn xóa mềm (D-13 = B) để giữ lịch sử. Cái giá đã nêu trong design: mọi truy vấn phải lọc; kết nối lại phải dùng lại bản ghi cũ; credential vẫn phải xóa riêng.</w:t>
+      </w:r>
+    </w:p>
+    <w:p>
+      <w:pPr>
+        <w:pStyle w:val="ListParagraph"/>
+        <w:numPr>
+          <w:ilvl w:val="0"/>
+          <w:numId w:val="1"/>
+        </w:numPr>
+      </w:pPr>
+      <w:r>
+        <w:rPr>
+          <w:b/>
+          <w:bCs/>
+        </w:rPr>
+        <w:t xml:space="preserve">Ở đâu:</w:t>
+      </w:r>
+      <w:r>
+        <w:t xml:space="preserve"> </w:t>
+      </w:r>
+      <w:r>
+        <w:rPr>
+          <w:rFonts w:ascii="Consolas" w:eastAsia="Consolas" w:hAnsi="Consolas" w:cs="Consolas"/>
+        </w:rPr>
+        <w:t xml:space="preserve">db/migration/V5__account_add_removed_at.sql</w:t>
       </w:r>
       <w:r>
         <w:t xml:space="preserve">, </w:t>
@@ -12814,100 +12905,288 @@
         <w:rPr>
           <w:rFonts w:ascii="Consolas" w:eastAsia="Consolas" w:hAnsi="Consolas" w:cs="Consolas"/>
         </w:rPr>
-        <w:t xml:space="preserve">UNIQUE</w:t>
-      </w:r>
-      <w:r>
-        <w:t xml:space="preserve">, khóa ngoại hoạt động như production. Mỗi test tự rollback.</w:t>
-      </w:r>
-    </w:p>
-    <w:p>
-      <w:pPr>
-        <w:pStyle w:val="ListParagraph"/>
-        <w:numPr>
-          <w:ilvl w:val="0"/>
-          <w:numId w:val="1"/>
-        </w:numPr>
-      </w:pPr>
-      <w:r>
-        <w:rPr>
-          <w:rFonts w:ascii="Consolas" w:eastAsia="Consolas" w:hAnsi="Consolas" w:cs="Consolas"/>
-          <w:b/>
-          <w:bCs/>
-        </w:rPr>
-        <w:t xml:space="preserve">entityManager.clear()</w:t>
-      </w:r>
-      <w:r>
-        <w:rPr>
-          <w:b/>
-          <w:bCs/>
-        </w:rPr>
-        <w:t xml:space="preserve">:</w:t>
-      </w:r>
-      <w:r>
-        <w:t xml:space="preserve"> xóa bộ nhớ đệm của Hibernate để lần đọc sau thật sự đi xuống DB. Không có nó, test chỉ đọc lại object trong bộ nhớ.</w:t>
-      </w:r>
-    </w:p>
-    <w:p>
-      <w:pPr>
-        <w:pStyle w:val="ListParagraph"/>
-        <w:numPr>
-          <w:ilvl w:val="0"/>
-          <w:numId w:val="1"/>
-        </w:numPr>
-      </w:pPr>
-      <w:r>
-        <w:rPr>
-          <w:rFonts w:ascii="Consolas" w:eastAsia="Consolas" w:hAnsi="Consolas" w:cs="Consolas"/>
-          <w:b/>
-          <w:bCs/>
-        </w:rPr>
-        <w:t xml:space="preserve">JdbcTemplate</w:t>
-      </w:r>
-      <w:r>
-        <w:rPr>
-          <w:b/>
-          <w:bCs/>
-        </w:rPr>
-        <w:t xml:space="preserve">:</w:t>
-      </w:r>
-      <w:r>
-        <w:t xml:space="preserve"> chạy SQL thô để nhìn đúng cái nằm trong DB, hoặc để thử ràng buộc mà Java không tạo ra được (ví dụ ghi </w:t>
-      </w:r>
-      <w:r>
-        <w:rPr>
-          <w:rFonts w:ascii="Consolas" w:eastAsia="Consolas" w:hAnsi="Consolas" w:cs="Consolas"/>
-        </w:rPr>
-        <w:t xml:space="preserve">status = 'SYNCING'</w:t>
-      </w:r>
-      <w:r>
-        <w:t xml:space="preserve">).</w:t>
-      </w:r>
-    </w:p>
-    <w:p>
-      <w:pPr>
-        <w:pStyle w:val="ListParagraph"/>
-        <w:numPr>
-          <w:ilvl w:val="0"/>
-          <w:numId w:val="1"/>
-        </w:numPr>
-      </w:pPr>
-      <w:r>
-        <w:rPr>
-          <w:rFonts w:ascii="Consolas" w:eastAsia="Consolas" w:hAnsi="Consolas" w:cs="Consolas"/>
-          <w:b/>
-          <w:bCs/>
-        </w:rPr>
-        <w:t xml:space="preserve">ApplicationContextRunner</w:t>
-      </w:r>
-      <w:r>
-        <w:rPr>
-          <w:b/>
-          <w:bCs/>
-        </w:rPr>
-        <w:t xml:space="preserve"> cho kiểm tra khởi động:</w:t>
-      </w:r>
-      <w:r>
-        <w:t xml:space="preserve"> dựng một context nhỏ với cấu hình sai để chứng minh app </w:t>
+        <w:t xml:space="preserve">account/domain/ConnectedAccount.java</w:t>
+      </w:r>
+      <w:r>
+        <w:t xml:space="preserve"> (</w:t>
+      </w:r>
+      <w:r>
+        <w:rPr>
+          <w:rFonts w:ascii="Consolas" w:eastAsia="Consolas" w:hAnsi="Consolas" w:cs="Consolas"/>
+        </w:rPr>
+        <w:t xml:space="preserve">remove</w:t>
+      </w:r>
+      <w:r>
+        <w:t xml:space="preserve">, </w:t>
+      </w:r>
+      <w:r>
+        <w:rPr>
+          <w:rFonts w:ascii="Consolas" w:eastAsia="Consolas" w:hAnsi="Consolas" w:cs="Consolas"/>
+        </w:rPr>
+        <w:t xml:space="preserve">isRemoved</w:t>
+      </w:r>
+      <w:r>
+        <w:t xml:space="preserve">, </w:t>
+      </w:r>
+      <w:r>
+        <w:rPr>
+          <w:rFonts w:ascii="Consolas" w:eastAsia="Consolas" w:hAnsi="Consolas" w:cs="Consolas"/>
+        </w:rPr>
+        <w:t xml:space="preserve">removedAt</w:t>
+      </w:r>
+      <w:r>
+        <w:t xml:space="preserve">), </w:t>
+      </w:r>
+      <w:r>
+        <w:rPr>
+          <w:rFonts w:ascii="Consolas" w:eastAsia="Consolas" w:hAnsi="Consolas" w:cs="Consolas"/>
+        </w:rPr>
+        <w:t xml:space="preserve">account/application/AccountManagementService.java</w:t>
+      </w:r>
+      <w:r>
+        <w:t xml:space="preserve"> (</w:t>
+      </w:r>
+      <w:r>
+        <w:rPr>
+          <w:rFonts w:ascii="Consolas" w:eastAsia="Consolas" w:hAnsi="Consolas" w:cs="Consolas"/>
+        </w:rPr>
+        <w:t xml:space="preserve">remove</w:t>
+      </w:r>
+      <w:r>
+        <w:t xml:space="preserve">), </w:t>
+      </w:r>
+      <w:r>
+        <w:rPr>
+          <w:rFonts w:ascii="Consolas" w:eastAsia="Consolas" w:hAnsi="Consolas" w:cs="Consolas"/>
+        </w:rPr>
+        <w:t xml:space="preserve">account/api/AccountsController.java</w:t>
+      </w:r>
+      <w:r>
+        <w:t xml:space="preserve"> (</w:t>
+      </w:r>
+      <w:r>
+        <w:rPr>
+          <w:rFonts w:ascii="Consolas" w:eastAsia="Consolas" w:hAnsi="Consolas" w:cs="Consolas"/>
+        </w:rPr>
+        <w:t xml:space="preserve">DELETE</w:t>
+      </w:r>
+      <w:r>
+        <w:t xml:space="preserve">), event </w:t>
+      </w:r>
+      <w:r>
+        <w:rPr>
+          <w:rFonts w:ascii="Consolas" w:eastAsia="Consolas" w:hAnsi="Consolas" w:cs="Consolas"/>
+        </w:rPr>
+        <w:t xml:space="preserve">account/AccountRemoved.java</w:t>
+      </w:r>
+      <w:r>
+        <w:t xml:space="preserve">.</w:t>
+      </w:r>
+    </w:p>
+    <w:p>
+      <w:pPr>
+        <w:pStyle w:val="Heading3"/>
+      </w:pPr>
+      <w:r>
+        <w:t xml:space="preserve">21.2 Một lần xóa làm ba việc trong một transaction</w:t>
+      </w:r>
+    </w:p>
+    <w:p>
+      <w:pPr>
+        <w:shd w:val="clear" w:color="auto" w:fill="F2F3F5"/>
+        <w:ind w:left="0"/>
+      </w:pPr>
+      <w:r>
+        <w:rPr>
+          <w:rFonts w:ascii="Consolas" w:eastAsia="Consolas" w:hAnsi="Consolas" w:cs="Consolas"/>
+          <w:sz w:val="19"/>
+          <w:szCs w:val="19"/>
+        </w:rPr>
+        <w:t xml:space="preserve">DELETE /api/accounts/{id}</w:t>
+        <w:br/>
+        <w:t xml:space="preserve">  -&gt; AccountManagementService.remove(ownerId, id)      @Transactional</w:t>
+        <w:br/>
+        <w:t xml:space="preserve">       1. tìm account của owner, chưa bị xóa       không có -&gt; 404</w:t>
+        <w:br/>
+        <w:t xml:space="preserve">       2. account.remove(now)     ghi removed_at, dòng vẫn còn</w:t>
+        <w:br/>
+        <w:t xml:space="preserve">       3. credentials.delete(id)  xóa HẲN dòng account_credential</w:t>
+        <w:br/>
+        <w:t xml:space="preserve">       4. publish AccountRemoved</w:t>
+        <w:br/>
+        <w:t xml:space="preserve">  &lt;- 204 No Content (không có body)</w:t>
+      </w:r>
+    </w:p>
+    <w:p>
+      <w:pPr>
+        <w:pStyle w:val="ListParagraph"/>
+        <w:numPr>
+          <w:ilvl w:val="0"/>
+          <w:numId w:val="1"/>
+        </w:numPr>
+      </w:pPr>
+      <w:r>
+        <w:rPr>
+          <w:b/>
+          <w:bCs/>
+        </w:rPr>
+        <w:t xml:space="preserve">Vì sao xóa hẳn credential dù account chỉ bị xóa mềm:</w:t>
+      </w:r>
+      <w:r>
+        <w:t xml:space="preserve"> giữ lịch sử là giữ dữ liệu nghiệp vụ, không phải giữ chìa khóa vào hộp thư của người dùng. Người dùng đã bấm xóa thì token không được nằm lại trong DB.</w:t>
+      </w:r>
+    </w:p>
+    <w:p>
+      <w:pPr>
+        <w:pStyle w:val="ListParagraph"/>
+        <w:numPr>
+          <w:ilvl w:val="0"/>
+          <w:numId w:val="1"/>
+        </w:numPr>
+      </w:pPr>
+      <w:r>
+        <w:rPr>
+          <w:rFonts w:ascii="Consolas" w:eastAsia="Consolas" w:hAnsi="Consolas" w:cs="Consolas"/>
+          <w:b/>
+          <w:bCs/>
+        </w:rPr>
+        <w:t xml:space="preserve">status</w:t>
+      </w:r>
+      <w:r>
+        <w:rPr>
+          <w:b/>
+          <w:bCs/>
+        </w:rPr>
+        <w:t xml:space="preserve"> giữ nguyên:</w:t>
+      </w:r>
+      <w:r>
+        <w:t xml:space="preserve"> "đã xóa" và "trạng thái kết nối" là hai chuyện khác nhau; trộn vào nhau thì lúc kết nối lại sẽ khó biết trạng thái trước đó.</w:t>
+      </w:r>
+    </w:p>
+    <w:p>
+      <w:pPr>
+        <w:pStyle w:val="ListParagraph"/>
+        <w:numPr>
+          <w:ilvl w:val="0"/>
+          <w:numId w:val="1"/>
+        </w:numPr>
+      </w:pPr>
+      <w:r>
+        <w:rPr>
+          <w:b/>
+          <w:bCs/>
+        </w:rPr>
+        <w:t xml:space="preserve">204 No Content:</w:t>
+      </w:r>
+      <w:r>
+        <w:t xml:space="preserve"> method controller trả </w:t>
+      </w:r>
+      <w:r>
+        <w:rPr>
+          <w:rFonts w:ascii="Consolas" w:eastAsia="Consolas" w:hAnsi="Consolas" w:cs="Consolas"/>
+        </w:rPr>
+        <w:t xml:space="preserve">void</w:t>
+      </w:r>
+      <w:r>
+        <w:t xml:space="preserve"> và có </w:t>
+      </w:r>
+      <w:r>
+        <w:rPr>
+          <w:rFonts w:ascii="Consolas" w:eastAsia="Consolas" w:hAnsi="Consolas" w:cs="Consolas"/>
+        </w:rPr>
+        <w:t xml:space="preserve">@ResponseStatus(HttpStatus.NO_CONTENT)</w:t>
+      </w:r>
+      <w:r>
+        <w:t xml:space="preserve">.</w:t>
+      </w:r>
+    </w:p>
+    <w:p>
+      <w:pPr>
+        <w:pStyle w:val="Heading3"/>
+      </w:pPr>
+      <w:r>
+        <w:t xml:space="preserve">21.3 Lọc ở đâu: viết vào tên method thay vì lọc ngầm</w:t>
+      </w:r>
+    </w:p>
+    <w:p>
+      <w:pPr>
+        <w:pStyle w:val="ListParagraph"/>
+        <w:numPr>
+          <w:ilvl w:val="0"/>
+          <w:numId w:val="1"/>
+        </w:numPr>
+      </w:pPr>
+      <w:r>
+        <w:t xml:space="preserve">Repository chỉ còn hai truy vấn cho API: </w:t>
+      </w:r>
+      <w:r>
+        <w:rPr>
+          <w:rFonts w:ascii="Consolas" w:eastAsia="Consolas" w:hAnsi="Consolas" w:cs="Consolas"/>
+        </w:rPr>
+        <w:t xml:space="preserve">findByOwnerIdAndRemovedAtIsNullOrderByCreatedAtAscIdAsc</w:t>
+      </w:r>
+      <w:r>
+        <w:t xml:space="preserve"> và </w:t>
+      </w:r>
+      <w:r>
+        <w:rPr>
+          <w:rFonts w:ascii="Consolas" w:eastAsia="Consolas" w:hAnsi="Consolas" w:cs="Consolas"/>
+        </w:rPr>
+        <w:t xml:space="preserve">findByIdAndOwnerIdAndRemovedAtIsNull</w:t>
+      </w:r>
+      <w:r>
+        <w:t xml:space="preserve">. </w:t>
+      </w:r>
+      <w:r>
+        <w:rPr>
+          <w:rFonts w:ascii="Consolas" w:eastAsia="Consolas" w:hAnsi="Consolas" w:cs="Consolas"/>
+        </w:rPr>
+        <w:t xml:space="preserve">RemovedAtIsNull</w:t>
+      </w:r>
+      <w:r>
+        <w:t xml:space="preserve"> trong tên tức là </w:t>
+      </w:r>
+      <w:r>
+        <w:rPr>
+          <w:rFonts w:ascii="Consolas" w:eastAsia="Consolas" w:hAnsi="Consolas" w:cs="Consolas"/>
+        </w:rPr>
+        <w:t xml:space="preserve">WHERE removed_at IS NULL</w:t>
+      </w:r>
+      <w:r>
+        <w:t xml:space="preserve">.</w:t>
+      </w:r>
+    </w:p>
+    <w:p>
+      <w:pPr>
+        <w:pStyle w:val="ListParagraph"/>
+        <w:numPr>
+          <w:ilvl w:val="0"/>
+          <w:numId w:val="1"/>
+        </w:numPr>
+      </w:pPr>
+      <w:r>
+        <w:t xml:space="preserve">Hai method cũ không lọc đã bị xóa, để không ai gọi nhầm.</w:t>
+      </w:r>
+    </w:p>
+    <w:p>
+      <w:pPr>
+        <w:pStyle w:val="ListParagraph"/>
+        <w:numPr>
+          <w:ilvl w:val="0"/>
+          <w:numId w:val="1"/>
+        </w:numPr>
+      </w:pPr>
+      <w:r>
+        <w:t xml:space="preserve">Riêng </w:t>
+      </w:r>
+      <w:r>
+        <w:rPr>
+          <w:rFonts w:ascii="Consolas" w:eastAsia="Consolas" w:hAnsi="Consolas" w:cs="Consolas"/>
+        </w:rPr>
+        <w:t xml:space="preserve">findByOwnerIdAndProviderAndExternalAccountId</w:t>
+      </w:r>
+      <w:r>
+        <w:t xml:space="preserve"> </w:t>
       </w:r>
       <w:r>
         <w:rPr>
@@ -12917,38 +13196,32 @@
         <w:t xml:space="preserve">không</w:t>
       </w:r>
       <w:r>
-        <w:t xml:space="preserve"> start và thông báo không lộ secret.</w:t>
-      </w:r>
-    </w:p>
-    <w:p>
-      <w:pPr>
-        <w:pStyle w:val="ListParagraph"/>
-        <w:numPr>
-          <w:ilvl w:val="0"/>
-          <w:numId w:val="1"/>
-        </w:numPr>
-      </w:pPr>
-      <w:r>
-        <w:rPr>
-          <w:b/>
-          <w:bCs/>
-        </w:rPr>
-        <w:t xml:space="preserve">Mockito </w:t>
-      </w:r>
-      <w:r>
-        <w:rPr>
-          <w:rFonts w:ascii="Consolas" w:eastAsia="Consolas" w:hAnsi="Consolas" w:cs="Consolas"/>
-          <w:b/>
-          <w:bCs/>
-        </w:rPr>
-        <w:t xml:space="preserve">mock(...)</w:t>
-      </w:r>
-      <w:r>
-        <w:rPr>
-          <w:b/>
-          <w:bCs/>
-        </w:rPr>
-        <w:t xml:space="preserve"> trong unit test:</w:t>
+        <w:t xml:space="preserve"> lọc: </w:t>
+      </w:r>
+      <w:r>
+        <w:rPr>
+          <w:rFonts w:ascii="Consolas" w:eastAsia="Consolas" w:hAnsi="Consolas" w:cs="Consolas"/>
+        </w:rPr>
+        <w:t xml:space="preserve">register</w:t>
+      </w:r>
+      <w:r>
+        <w:t xml:space="preserve"> cần thấy account đã xóa để dùng lại.</w:t>
+      </w:r>
+    </w:p>
+    <w:p>
+      <w:pPr>
+        <w:pStyle w:val="ListParagraph"/>
+        <w:numPr>
+          <w:ilvl w:val="0"/>
+          <w:numId w:val="1"/>
+        </w:numPr>
+      </w:pPr>
+      <w:r>
+        <w:rPr>
+          <w:b/>
+          <w:bCs/>
+        </w:rPr>
+        <w:t xml:space="preserve">Phương án bị loại:</w:t>
       </w:r>
       <w:r>
         <w:t xml:space="preserve"> </w:t>
@@ -12957,875 +13230,184 @@
         <w:rPr>
           <w:rFonts w:ascii="Consolas" w:eastAsia="Consolas" w:hAnsi="Consolas" w:cs="Consolas"/>
         </w:rPr>
-        <w:t xml:space="preserve">OwnerCurrentUserTests</w:t>
-      </w:r>
-      <w:r>
-        <w:t xml:space="preserve"> giả repository để test </w:t>
-      </w:r>
-      <w:r>
-        <w:rPr>
-          <w:rFonts w:ascii="Consolas" w:eastAsia="Consolas" w:hAnsi="Consolas" w:cs="Consolas"/>
-        </w:rPr>
-        <w:t xml:space="preserve">CurrentUser</w:t>
-      </w:r>
-      <w:r>
-        <w:t xml:space="preserve"> mà không cần DB.</w:t>
-      </w:r>
-    </w:p>
-    <w:p>
-      <w:pPr>
-        <w:pStyle w:val="ListParagraph"/>
-        <w:numPr>
-          <w:ilvl w:val="0"/>
-          <w:numId w:val="1"/>
-        </w:numPr>
-      </w:pPr>
-      <w:r>
-        <w:rPr>
-          <w:b/>
-          <w:bCs/>
-        </w:rPr>
-        <w:t xml:space="preserve">Kiểm tra ngược ở mọi task:</w:t>
-      </w:r>
-    </w:p>
-    <w:p>
-      <w:pPr>
-        <w:pStyle w:val="ListParagraph"/>
-        <w:numPr>
-          <w:ilvl w:val="1"/>
-          <w:numId w:val="1"/>
-        </w:numPr>
-      </w:pPr>
-      <w:r>
-        <w:t xml:space="preserve">BE-09: bỏ bước tìm theo email → 2 test idempotent đỏ.</w:t>
-      </w:r>
-    </w:p>
-    <w:p>
-      <w:pPr>
-        <w:pStyle w:val="ListParagraph"/>
-        <w:numPr>
-          <w:ilvl w:val="1"/>
-          <w:numId w:val="1"/>
-        </w:numPr>
-      </w:pPr>
-      <w:r>
-        <w:t xml:space="preserve">BE-10: cho </w:t>
-      </w:r>
-      <w:r>
-        <w:rPr>
-          <w:rFonts w:ascii="Consolas" w:eastAsia="Consolas" w:hAnsi="Consolas" w:cs="Consolas"/>
-        </w:rPr>
-        <w:t xml:space="preserve">markHealthy</w:t>
-      </w:r>
-      <w:r>
-        <w:t xml:space="preserve"> gỡ </w:t>
-      </w:r>
-      <w:r>
-        <w:rPr>
-          <w:rFonts w:ascii="Consolas" w:eastAsia="Consolas" w:hAnsi="Consolas" w:cs="Consolas"/>
-        </w:rPr>
-        <w:t xml:space="preserve">AUTH_EXPIRED</w:t>
-      </w:r>
-      <w:r>
-        <w:t xml:space="preserve"> → đúng ô đó đỏ.</w:t>
-      </w:r>
-    </w:p>
-    <w:p>
-      <w:pPr>
-        <w:pStyle w:val="ListParagraph"/>
-        <w:numPr>
-          <w:ilvl w:val="1"/>
-          <w:numId w:val="1"/>
-        </w:numPr>
-      </w:pPr>
-      <w:r>
-        <w:t xml:space="preserve">BE-12: IV cố định → 1 test đỏ; bỏ AAD → 3 test đỏ; tag 96 bit → 2 test đỏ.</w:t>
-      </w:r>
-    </w:p>
-    <w:p>
-      <w:pPr>
-        <w:pStyle w:val="ListParagraph"/>
-        <w:numPr>
-          <w:ilvl w:val="1"/>
-          <w:numId w:val="1"/>
-        </w:numPr>
-      </w:pPr>
-      <w:r>
-        <w:t xml:space="preserve">BE-13: store "quên" ghi refresh token → test xoay khóa đỏ.</w:t>
-      </w:r>
-    </w:p>
-    <w:p>
-      <w:pPr>
-        <w:pStyle w:val="ListParagraph"/>
-        <w:numPr>
-          <w:ilvl w:val="1"/>
-          <w:numId w:val="1"/>
-        </w:numPr>
-      </w:pPr>
-      <w:r>
-        <w:t xml:space="preserve">BE-14: bỏ </w:t>
-      </w:r>
-      <w:r>
-        <w:rPr>
-          <w:rFonts w:ascii="Consolas" w:eastAsia="Consolas" w:hAnsi="Consolas" w:cs="Consolas"/>
-        </w:rPr>
-        <w:t xml:space="preserve">@Transactional</w:t>
-      </w:r>
-      <w:r>
-        <w:t xml:space="preserve"> → test rollback và test reconnect đỏ; không tìm account cũ → test reconnect đỏ (lỗi </w:t>
-      </w:r>
-      <w:r>
-        <w:rPr>
-          <w:rFonts w:ascii="Consolas" w:eastAsia="Consolas" w:hAnsi="Consolas" w:cs="Consolas"/>
-        </w:rPr>
-        <w:t xml:space="preserve">UNIQUE</w:t>
-      </w:r>
-      <w:r>
-        <w:t xml:space="preserve">); bỏ kiểm tra provider → test provider lạ đỏ; </w:t>
-      </w:r>
-      <w:r>
-        <w:rPr>
-          <w:rFonts w:ascii="Consolas" w:eastAsia="Consolas" w:hAnsi="Consolas" w:cs="Consolas"/>
-        </w:rPr>
-        <w:t xml:space="preserve">reconnected</w:t>
-      </w:r>
-      <w:r>
-        <w:t xml:space="preserve"> luôn </w:t>
-      </w:r>
-      <w:r>
-        <w:rPr>
-          <w:rFonts w:ascii="Consolas" w:eastAsia="Consolas" w:hAnsi="Consolas" w:cs="Consolas"/>
-        </w:rPr>
-        <w:t xml:space="preserve">false</w:t>
-      </w:r>
-      <w:r>
-        <w:t xml:space="preserve"> → test reconnect đỏ; publish trước khi lưu credential → test rollback đỏ; thêm một trường vào event → test payload đỏ.</w:t>
-      </w:r>
-    </w:p>
-    <w:p>
-      <w:pPr>
-        <w:pStyle w:val="ListParagraph"/>
-        <w:numPr>
-          <w:ilvl w:val="1"/>
-          <w:numId w:val="1"/>
-        </w:numPr>
-      </w:pPr>
-      <w:r>
-        <w:t xml:space="preserve">BE-15: danh sách không lọc owner → 2 test đỏ; </w:t>
-      </w:r>
-      <w:r>
-        <w:rPr>
-          <w:rFonts w:ascii="Consolas" w:eastAsia="Consolas" w:hAnsi="Consolas" w:cs="Consolas"/>
-        </w:rPr>
-        <w:t xml:space="preserve">get</w:t>
-      </w:r>
-      <w:r>
-        <w:t xml:space="preserve"> không lọc owner → test cô lập đỏ; mới nhất trước → test thứ tự đỏ; </w:t>
-      </w:r>
-      <w:r>
-        <w:rPr>
-          <w:rFonts w:ascii="Consolas" w:eastAsia="Consolas" w:hAnsi="Consolas" w:cs="Consolas"/>
-        </w:rPr>
-        <w:t xml:space="preserve">ProviderRegistry.get</w:t>
-      </w:r>
-      <w:r>
-        <w:t xml:space="preserve"> thay </w:t>
-      </w:r>
-      <w:r>
-        <w:rPr>
-          <w:rFonts w:ascii="Consolas" w:eastAsia="Consolas" w:hAnsi="Consolas" w:cs="Consolas"/>
-        </w:rPr>
-        <w:t xml:space="preserve">find</w:t>
-      </w:r>
-      <w:r>
-        <w:t xml:space="preserve"> → test connector đã gỡ đỏ; </w:t>
-      </w:r>
-      <w:r>
-        <w:rPr>
-          <w:rFonts w:ascii="Consolas" w:eastAsia="Consolas" w:hAnsi="Consolas" w:cs="Consolas"/>
-        </w:rPr>
-        <w:t xml:space="preserve">ownerId</w:t>
-      </w:r>
-      <w:r>
-        <w:t xml:space="preserve"> lọt vào response → test tập trường đỏ; detail nói "của người khác" → test cô lập đỏ.</w:t>
-      </w:r>
-    </w:p>
-    <w:p>
-      <w:pPr>
-        <w:pStyle w:val="ListParagraph"/>
-        <w:numPr>
-          <w:ilvl w:val="1"/>
-          <w:numId w:val="1"/>
-        </w:numPr>
-      </w:pPr>
-      <w:r>
-        <w:t xml:space="preserve">BE-16 (10 lỗi, chạy bằng một script nhỏ áp từng lỗi rồi khôi phục): </w:t>
-      </w:r>
-      <w:r>
-        <w:rPr>
-          <w:rFonts w:ascii="Consolas" w:eastAsia="Consolas" w:hAnsi="Consolas" w:cs="Consolas"/>
-        </w:rPr>
-        <w:t xml:space="preserve">@Size</w:t>
-      </w:r>
-      <w:r>
-        <w:t xml:space="preserve"> thay luật domain → tên trắng ra 500 và 100 emoji bị từ chối; bỏ "ít nhất một trường" → test </w:t>
-      </w:r>
-      <w:r>
-        <w:rPr>
-          <w:rFonts w:ascii="Consolas" w:eastAsia="Consolas" w:hAnsi="Consolas" w:cs="Consolas"/>
-        </w:rPr>
-        <w:t xml:space="preserve">{}</w:t>
-      </w:r>
-      <w:r>
-        <w:t xml:space="preserve"> đỏ; đảo nghĩa </w:t>
-      </w:r>
-      <w:r>
-        <w:rPr>
-          <w:rFonts w:ascii="Consolas" w:eastAsia="Consolas" w:hAnsi="Consolas" w:cs="Consolas"/>
-        </w:rPr>
-        <w:t xml:space="preserve">enabled</w:t>
-      </w:r>
-      <w:r>
-        <w:t xml:space="preserve"> → 2 test đỏ; không phát event khi tắt → đỏ; phát event cả khi không đổi gì → 2 test đỏ; PATCH không lọc owner → đỏ; bỏ </w:t>
-      </w:r>
-      <w:r>
-        <w:rPr>
-          <w:rFonts w:ascii="Consolas" w:eastAsia="Consolas" w:hAnsi="Consolas" w:cs="Consolas"/>
-        </w:rPr>
-        <w:t xml:space="preserve">@Version</w:t>
-      </w:r>
-      <w:r>
-        <w:t xml:space="preserve"> → test version cũ đỏ; không phát event khi reconnect → đỏ; phát event ở mọi lần reconnect → đỏ; thêm trường vào event → đỏ.</w:t>
-      </w:r>
-    </w:p>
-    <w:p>
-      <w:pPr>
-        <w:pStyle w:val="ListParagraph"/>
-        <w:numPr>
-          <w:ilvl w:val="0"/>
-          <w:numId w:val="1"/>
-        </w:numPr>
-      </w:pPr>
-      <w:r>
-        <w:rPr>
-          <w:rFonts w:ascii="Consolas" w:eastAsia="Consolas" w:hAnsi="Consolas" w:cs="Consolas"/>
-          <w:b/>
-          <w:bCs/>
-        </w:rPr>
-        <w:t xml:space="preserve">@RecordApplicationEvents</w:t>
-      </w:r>
-      <w:r>
-        <w:rPr>
-          <w:b/>
-          <w:bCs/>
-        </w:rPr>
-        <w:t xml:space="preserve"> + </w:t>
-      </w:r>
-      <w:r>
-        <w:rPr>
-          <w:rFonts w:ascii="Consolas" w:eastAsia="Consolas" w:hAnsi="Consolas" w:cs="Consolas"/>
-          <w:b/>
-          <w:bCs/>
-        </w:rPr>
-        <w:t xml:space="preserve">ApplicationEvents</w:t>
-      </w:r>
-      <w:r>
-        <w:rPr>
-          <w:b/>
-          <w:bCs/>
-        </w:rPr>
-        <w:t xml:space="preserve"> (Spring Test, BE-16):</w:t>
-      </w:r>
-      <w:r>
-        <w:t xml:space="preserve"> ghi lại event được publish trong một test </w:t>
-      </w:r>
-      <w:r>
-        <w:rPr>
-          <w:rFonts w:ascii="Consolas" w:eastAsia="Consolas" w:hAnsi="Consolas" w:cs="Consolas"/>
-        </w:rPr>
-        <w:t xml:space="preserve">@SpringBootTest</w:t>
-      </w:r>
-      <w:r>
-        <w:t xml:space="preserve">; </w:t>
-      </w:r>
-      <w:r>
-        <w:rPr>
-          <w:rFonts w:ascii="Consolas" w:eastAsia="Consolas" w:hAnsi="Consolas" w:cs="Consolas"/>
-        </w:rPr>
-        <w:t xml:space="preserve">events.stream(AccountStatusChanged.class)</w:t>
-      </w:r>
-      <w:r>
-        <w:t xml:space="preserve"> lấy ra để kiểm tra. </w:t>
-      </w:r>
-      <w:r>
-        <w:rPr>
-          <w:rFonts w:ascii="Consolas" w:eastAsia="Consolas" w:hAnsi="Consolas" w:cs="Consolas"/>
-        </w:rPr>
-        <w:t xml:space="preserve">AssertablePublishedEvents</w:t>
-      </w:r>
-      <w:r>
-        <w:t xml:space="preserve"> là cách tương tự của Spring Modulith, dùng trong module test.</w:t>
-      </w:r>
-    </w:p>
-    <w:p>
-      <w:pPr>
-        <w:pStyle w:val="ListParagraph"/>
-        <w:numPr>
-          <w:ilvl w:val="0"/>
-          <w:numId w:val="1"/>
-        </w:numPr>
-      </w:pPr>
-      <w:r>
-        <w:rPr>
-          <w:rFonts w:ascii="Consolas" w:eastAsia="Consolas" w:hAnsi="Consolas" w:cs="Consolas"/>
-          <w:b/>
-          <w:bCs/>
-        </w:rPr>
-        <w:t xml:space="preserve">TransactionTemplate</w:t>
-      </w:r>
-      <w:r>
-        <w:rPr>
-          <w:b/>
-          <w:bCs/>
-        </w:rPr>
-        <w:t xml:space="preserve"> trong test (BE-16):</w:t>
-      </w:r>
-      <w:r>
-        <w:t xml:space="preserve"> mở transaction bằng code để chen một bước vào giữa. Test gọi service (đã đọc </w:t>
-      </w:r>
-      <w:r>
-        <w:rPr>
-          <w:rFonts w:ascii="Consolas" w:eastAsia="Consolas" w:hAnsi="Consolas" w:cs="Consolas"/>
-        </w:rPr>
-        <w:t xml:space="preserve">version</w:t>
-      </w:r>
-      <w:r>
-        <w:t xml:space="preserve"> cũ), rồi giả "một request khác" bằng </w:t>
-      </w:r>
-      <w:r>
-        <w:rPr>
-          <w:rFonts w:ascii="Consolas" w:eastAsia="Consolas" w:hAnsi="Consolas" w:cs="Consolas"/>
-        </w:rPr>
-        <w:t xml:space="preserve">UPDATE ... SET version = version + 1</w:t>
-      </w:r>
-      <w:r>
-        <w:t xml:space="preserve"> trong cùng transaction; lúc commit phải ra </w:t>
-      </w:r>
-      <w:r>
-        <w:rPr>
-          <w:rFonts w:ascii="Consolas" w:eastAsia="Consolas" w:hAnsi="Consolas" w:cs="Consolas"/>
-        </w:rPr>
-        <w:t xml:space="preserve">OptimisticLockingFailureException</w:t>
-      </w:r>
-      <w:r>
-        <w:t xml:space="preserve">. Qua MockMvc không canh được hai request chạy chồng nhau, nên phần đổi lỗi thành 409 dựa vào test có sẵn của F01.</w:t>
-      </w:r>
-    </w:p>
-    <w:p>
-      <w:pPr>
-        <w:pStyle w:val="ListParagraph"/>
-        <w:numPr>
-          <w:ilvl w:val="0"/>
-          <w:numId w:val="1"/>
-        </w:numPr>
-      </w:pPr>
-      <w:r>
-        <w:rPr>
-          <w:b/>
-          <w:bCs/>
-        </w:rPr>
-        <w:t xml:space="preserve">Chạy cả ứng dụng thay cho web slice (BE-15):</w:t>
-      </w:r>
-      <w:r>
-        <w:t xml:space="preserve"> </w:t>
-      </w:r>
-      <w:r>
-        <w:rPr>
-          <w:rFonts w:ascii="Consolas" w:eastAsia="Consolas" w:hAnsi="Consolas" w:cs="Consolas"/>
-        </w:rPr>
-        <w:t xml:space="preserve">@SpringBootTest</w:t>
-      </w:r>
-      <w:r>
-        <w:t xml:space="preserve"> + </w:t>
-      </w:r>
-      <w:r>
-        <w:rPr>
-          <w:rFonts w:ascii="Consolas" w:eastAsia="Consolas" w:hAnsi="Consolas" w:cs="Consolas"/>
-        </w:rPr>
-        <w:t xml:space="preserve">@AutoConfigureMockMvc</w:t>
-      </w:r>
-      <w:r>
-        <w:t xml:space="preserve"> gửi request HTTP giả qua đúng các lớp thật: security, </w:t>
-      </w:r>
-      <w:r>
-        <w:rPr>
-          <w:rFonts w:ascii="Consolas" w:eastAsia="Consolas" w:hAnsi="Consolas" w:cs="Consolas"/>
-        </w:rPr>
-        <w:t xml:space="preserve">CurrentUser</w:t>
-      </w:r>
-      <w:r>
-        <w:t xml:space="preserve">, service, PostgreSQL, error handler, Jackson. Chọn thay cho </w:t>
-      </w:r>
-      <w:r>
-        <w:rPr>
-          <w:rFonts w:ascii="Consolas" w:eastAsia="Consolas" w:hAnsi="Consolas" w:cs="Consolas"/>
-        </w:rPr>
-        <w:t xml:space="preserve">@WebMvcTest</w:t>
-      </w:r>
-      <w:r>
-        <w:t xml:space="preserve"> với service giả vì test cô lập dữ liệu phải chạy trên dữ liệu thật; với service giả, test chỉ kiểm tra cái mock.</w:t>
-      </w:r>
-    </w:p>
-    <w:p>
-      <w:pPr>
-        <w:pStyle w:val="ListParagraph"/>
-        <w:numPr>
-          <w:ilvl w:val="0"/>
-          <w:numId w:val="1"/>
-        </w:numPr>
-      </w:pPr>
-      <w:r>
-        <w:rPr>
-          <w:b/>
-          <w:bCs/>
-        </w:rPr>
-        <w:t xml:space="preserve">Ghim thời điểm bằng SQL:</w:t>
-      </w:r>
-      <w:r>
-        <w:t xml:space="preserve"> </w:t>
-      </w:r>
-      <w:r>
-        <w:rPr>
-          <w:rFonts w:ascii="Consolas" w:eastAsia="Consolas" w:hAnsi="Consolas" w:cs="Consolas"/>
-        </w:rPr>
-        <w:t xml:space="preserve">@PrePersist</w:t>
-      </w:r>
-      <w:r>
-        <w:t xml:space="preserve"> điền </w:t>
-      </w:r>
-      <w:r>
-        <w:rPr>
-          <w:rFonts w:ascii="Consolas" w:eastAsia="Consolas" w:hAnsi="Consolas" w:cs="Consolas"/>
-        </w:rPr>
-        <w:t xml:space="preserve">created_at</w:t>
-      </w:r>
-      <w:r>
-        <w:t xml:space="preserve"> bằng giờ thật nên không biết trước. Test ghi đè bằng </w:t>
-      </w:r>
-      <w:r>
-        <w:rPr>
-          <w:rFonts w:ascii="Consolas" w:eastAsia="Consolas" w:hAnsi="Consolas" w:cs="Consolas"/>
-        </w:rPr>
-        <w:t xml:space="preserve">UPDATE connected_account SET created_at = ?</w:t>
-      </w:r>
-      <w:r>
-        <w:t xml:space="preserve"> để biết chắc thứ tự và chuỗi JSON mong đợi (</w:t>
-      </w:r>
-      <w:r>
-        <w:rPr>
-          <w:rFonts w:ascii="Consolas" w:eastAsia="Consolas" w:hAnsi="Consolas" w:cs="Consolas"/>
-        </w:rPr>
-        <w:t xml:space="preserve">2026-10-05T03:15:00Z</w:t>
-      </w:r>
-      <w:r>
-        <w:t xml:space="preserve">). Account "mới hơn" được tạo </w:t>
-      </w:r>
-      <w:r>
-        <w:rPr>
-          <w:b/>
-          <w:bCs/>
-        </w:rPr>
-        <w:t xml:space="preserve">trước</w:t>
-      </w:r>
-      <w:r>
-        <w:t xml:space="preserve">, để test thứ tự không thể xanh chỉ nhờ thứ tự chèn.</w:t>
-      </w:r>
-    </w:p>
-    <w:p>
-      <w:pPr>
-        <w:pStyle w:val="ListParagraph"/>
-        <w:numPr>
-          <w:ilvl w:val="0"/>
-          <w:numId w:val="1"/>
-        </w:numPr>
-      </w:pPr>
-      <w:r>
-        <w:rPr>
-          <w:rFonts w:ascii="Consolas" w:eastAsia="Consolas" w:hAnsi="Consolas" w:cs="Consolas"/>
-          <w:b/>
-          <w:bCs/>
-        </w:rPr>
-        <w:t xml:space="preserve">JsonPath.read(body, "$")</w:t>
-      </w:r>
-      <w:r>
-        <w:rPr>
-          <w:b/>
-          <w:bCs/>
-        </w:rPr>
-        <w:t xml:space="preserve">:</w:t>
-      </w:r>
-      <w:r>
-        <w:t xml:space="preserve"> đọc JSON thành </w:t>
-      </w:r>
-      <w:r>
-        <w:rPr>
-          <w:rFonts w:ascii="Consolas" w:eastAsia="Consolas" w:hAnsi="Consolas" w:cs="Consolas"/>
-        </w:rPr>
-        <w:t xml:space="preserve">Map</w:t>
-      </w:r>
-      <w:r>
-        <w:t xml:space="preserve"> để so tập tên trường.</w:t>
-      </w:r>
-    </w:p>
-    <w:p>
-      <w:pPr>
-        <w:pStyle w:val="ListParagraph"/>
-        <w:numPr>
-          <w:ilvl w:val="0"/>
-          <w:numId w:val="1"/>
-        </w:numPr>
-      </w:pPr>
-      <w:r>
-        <w:rPr>
-          <w:rFonts w:ascii="Consolas" w:eastAsia="Consolas" w:hAnsi="Consolas" w:cs="Consolas"/>
-          <w:b/>
-          <w:bCs/>
-        </w:rPr>
-        <w:t xml:space="preserve">@ApplicationModuleTest(mode = DIRECT_DEPENDENCIES)</w:t>
-      </w:r>
-      <w:r>
-        <w:rPr>
-          <w:b/>
-          <w:bCs/>
-        </w:rPr>
-        <w:t xml:space="preserve"> (Spring Modulith, BE-14):</w:t>
-      </w:r>
-      <w:r>
-        <w:t xml:space="preserve"> chỉ khởi động module </w:t>
-      </w:r>
-      <w:r>
-        <w:rPr>
-          <w:rFonts w:ascii="Consolas" w:eastAsia="Consolas" w:hAnsi="Consolas" w:cs="Consolas"/>
-        </w:rPr>
-        <w:t xml:space="preserve">account</w:t>
-      </w:r>
-      <w:r>
-        <w:t xml:space="preserve"> cộng các module nó dùng trực tiếp, không phải cả ứng dụng. Lúc làm BE-14 đó chỉ là </w:t>
-      </w:r>
-      <w:r>
-        <w:rPr>
-          <w:rFonts w:ascii="Consolas" w:eastAsia="Consolas" w:hAnsi="Consolas" w:cs="Consolas"/>
-        </w:rPr>
-        <w:t xml:space="preserve">provider</w:t>
-      </w:r>
-      <w:r>
-        <w:t xml:space="preserve">; từ BE-15, </w:t>
-      </w:r>
-      <w:r>
-        <w:rPr>
-          <w:rFonts w:ascii="Consolas" w:eastAsia="Consolas" w:hAnsi="Consolas" w:cs="Consolas"/>
-        </w:rPr>
-        <w:t xml:space="preserve">account</w:t>
-      </w:r>
-      <w:r>
-        <w:t xml:space="preserve"> dùng thêm </w:t>
-      </w:r>
-      <w:r>
-        <w:rPr>
-          <w:rFonts w:ascii="Consolas" w:eastAsia="Consolas" w:hAnsi="Consolas" w:cs="Consolas"/>
-        </w:rPr>
-        <w:t xml:space="preserve">CurrentUser</w:t>
-      </w:r>
-      <w:r>
-        <w:t xml:space="preserve"> (module </w:t>
-      </w:r>
-      <w:r>
-        <w:rPr>
-          <w:rFonts w:ascii="Consolas" w:eastAsia="Consolas" w:hAnsi="Consolas" w:cs="Consolas"/>
-        </w:rPr>
-        <w:t xml:space="preserve">identity</w:t>
-      </w:r>
-      <w:r>
-        <w:t xml:space="preserve">) và mã lỗi của </w:t>
-      </w:r>
-      <w:r>
-        <w:rPr>
-          <w:rFonts w:ascii="Consolas" w:eastAsia="Consolas" w:hAnsi="Consolas" w:cs="Consolas"/>
-        </w:rPr>
-        <w:t xml:space="preserve">common</w:t>
-      </w:r>
-      <w:r>
-        <w:t xml:space="preserve">, nên hai module này cũng được nạp. Test vẫn tự dọn bảng và tự chèn owner của nó vào </w:t>
-      </w:r>
-      <w:r>
-        <w:rPr>
-          <w:rFonts w:ascii="Consolas" w:eastAsia="Consolas" w:hAnsi="Consolas" w:cs="Consolas"/>
-        </w:rPr>
-        <w:t xml:space="preserve">app_user</w:t>
-      </w:r>
-      <w:r>
-        <w:t xml:space="preserve"> bằng </w:t>
-      </w:r>
-      <w:r>
-        <w:rPr>
-          <w:rFonts w:ascii="Consolas" w:eastAsia="Consolas" w:hAnsi="Consolas" w:cs="Consolas"/>
-        </w:rPr>
-        <w:t xml:space="preserve">JdbcTemplate</w:t>
-      </w:r>
-      <w:r>
-        <w:t xml:space="preserve">, nên không phụ thuộc owner được tạo lúc khởi động.</w:t>
-      </w:r>
-    </w:p>
-    <w:p>
-      <w:pPr>
-        <w:pStyle w:val="ListParagraph"/>
-        <w:numPr>
-          <w:ilvl w:val="0"/>
-          <w:numId w:val="1"/>
-        </w:numPr>
-      </w:pPr>
-      <w:r>
-        <w:rPr>
-          <w:b/>
-          <w:bCs/>
-        </w:rPr>
-        <w:t xml:space="preserve">Test không có </w:t>
-      </w:r>
-      <w:r>
-        <w:rPr>
-          <w:rFonts w:ascii="Consolas" w:eastAsia="Consolas" w:hAnsi="Consolas" w:cs="Consolas"/>
-          <w:b/>
-          <w:bCs/>
-        </w:rPr>
-        <w:t xml:space="preserve">@Transactional</w:t>
-      </w:r>
-      <w:r>
-        <w:rPr>
-          <w:b/>
-          <w:bCs/>
-        </w:rPr>
-        <w:t xml:space="preserve">:</w:t>
-      </w:r>
-      <w:r>
-        <w:t xml:space="preserve"> để service tự commit hoặc rollback như khi chạy thật. Cái giá là dữ liệu ở lại sau mỗi test, nên </w:t>
-      </w:r>
-      <w:r>
-        <w:rPr>
-          <w:rFonts w:ascii="Consolas" w:eastAsia="Consolas" w:hAnsi="Consolas" w:cs="Consolas"/>
-        </w:rPr>
-        <w:t xml:space="preserve">@BeforeEach</w:t>
-      </w:r>
-      <w:r>
-        <w:t xml:space="preserve"> tự dọn bảng bằng </w:t>
-      </w:r>
-      <w:r>
-        <w:rPr>
-          <w:rFonts w:ascii="Consolas" w:eastAsia="Consolas" w:hAnsi="Consolas" w:cs="Consolas"/>
-        </w:rPr>
-        <w:t xml:space="preserve">JdbcTestUtils.deleteFromTables</w:t>
-      </w:r>
-      <w:r>
-        <w:t xml:space="preserve">.</w:t>
-      </w:r>
-    </w:p>
-    <w:p>
-      <w:pPr>
-        <w:pStyle w:val="ListParagraph"/>
-        <w:numPr>
-          <w:ilvl w:val="0"/>
-          <w:numId w:val="1"/>
-        </w:numPr>
-      </w:pPr>
-      <w:r>
-        <w:rPr>
-          <w:rFonts w:ascii="Consolas" w:eastAsia="Consolas" w:hAnsi="Consolas" w:cs="Consolas"/>
-          <w:b/>
-          <w:bCs/>
-        </w:rPr>
-        <w:t xml:space="preserve">AssertablePublishedEvents</w:t>
-      </w:r>
-      <w:r>
-        <w:rPr>
-          <w:b/>
-          <w:bCs/>
-        </w:rPr>
-        <w:t xml:space="preserve"> làm tham số của method test:</w:t>
-      </w:r>
-      <w:r>
-        <w:t xml:space="preserve"> Spring Modulith ghi lại mọi event được publish trong test đó; </w:t>
-      </w:r>
-      <w:r>
-        <w:rPr>
-          <w:rFonts w:ascii="Consolas" w:eastAsia="Consolas" w:hAnsi="Consolas" w:cs="Consolas"/>
-        </w:rPr>
-        <w:t xml:space="preserve">events.ofType(AccountConnected.class)</w:t>
-      </w:r>
-      <w:r>
-        <w:t xml:space="preserve"> lấy ra để kiểm tra số lượng và nội dung.</w:t>
-      </w:r>
-    </w:p>
-    <w:p>
-      <w:pPr>
-        <w:pStyle w:val="ListParagraph"/>
-        <w:numPr>
-          <w:ilvl w:val="0"/>
-          <w:numId w:val="1"/>
-        </w:numPr>
-      </w:pPr>
-      <w:r>
-        <w:rPr>
-          <w:rFonts w:ascii="Consolas" w:eastAsia="Consolas" w:hAnsi="Consolas" w:cs="Consolas"/>
-          <w:b/>
-          <w:bCs/>
-        </w:rPr>
-        <w:t xml:space="preserve">@MockitoSpyBean</w:t>
-      </w:r>
-      <w:r>
-        <w:rPr>
-          <w:b/>
-          <w:bCs/>
-        </w:rPr>
-        <w:t xml:space="preserve">:</w:t>
-      </w:r>
-      <w:r>
-        <w:t xml:space="preserve"> bọc bean thật. Bình thường nó chạy code thật; riêng một test bảo nó ném lỗi bằng </w:t>
-      </w:r>
-      <w:r>
-        <w:rPr>
-          <w:rFonts w:ascii="Consolas" w:eastAsia="Consolas" w:hAnsi="Consolas" w:cs="Consolas"/>
-        </w:rPr>
-        <w:t xml:space="preserve">doThrow(...).when(credentials).save(any(), any(), any())</w:t>
-      </w:r>
-      <w:r>
-        <w:t xml:space="preserve">, để giả lập "lưu credential thất bại" mà không sửa code production. Assertion vẫn kiểm tra DB thật, không kiểm tra mock.</w:t>
-      </w:r>
-    </w:p>
-    <w:p>
-      <w:pPr>
-        <w:pStyle w:val="ListParagraph"/>
-        <w:numPr>
-          <w:ilvl w:val="0"/>
-          <w:numId w:val="1"/>
-        </w:numPr>
-      </w:pPr>
-      <w:r>
-        <w:rPr>
-          <w:b/>
-          <w:bCs/>
-        </w:rPr>
-        <w:t xml:space="preserve">Bean riêng cho test:</w:t>
-      </w:r>
-      <w:r>
-        <w:t xml:space="preserve"> một class </w:t>
-      </w:r>
-      <w:r>
-        <w:rPr>
-          <w:rFonts w:ascii="Consolas" w:eastAsia="Consolas" w:hAnsi="Consolas" w:cs="Consolas"/>
-        </w:rPr>
-        <w:t xml:space="preserve">@TestConfiguration</w:t>
-      </w:r>
-      <w:r>
-        <w:t xml:space="preserve"> lồng trong class test tạo </w:t>
-      </w:r>
-      <w:r>
-        <w:rPr>
-          <w:rFonts w:ascii="Consolas" w:eastAsia="Consolas" w:hAnsi="Consolas" w:cs="Consolas"/>
-        </w:rPr>
-        <w:t xml:space="preserve">FakeMessageProvider</w:t>
-      </w:r>
-      <w:r>
-        <w:t xml:space="preserve"> loại </w:t>
-      </w:r>
-      <w:r>
-        <w:rPr>
-          <w:rFonts w:ascii="Consolas" w:eastAsia="Consolas" w:hAnsi="Consolas" w:cs="Consolas"/>
-        </w:rPr>
-        <w:t xml:space="preserve">fake</w:t>
-      </w:r>
-      <w:r>
-        <w:t xml:space="preserve"> làm bean, để </w:t>
-      </w:r>
-      <w:r>
-        <w:rPr>
-          <w:rFonts w:ascii="Consolas" w:eastAsia="Consolas" w:hAnsi="Consolas" w:cs="Consolas"/>
-        </w:rPr>
-        <w:t xml:space="preserve">ProviderRegistry</w:t>
-      </w:r>
-      <w:r>
-        <w:t xml:space="preserve"> thấy provider này.</w:t>
-      </w:r>
-    </w:p>
-    <w:p>
-      <w:pPr>
-        <w:pStyle w:val="ListParagraph"/>
-        <w:numPr>
-          <w:ilvl w:val="0"/>
-          <w:numId w:val="1"/>
-        </w:numPr>
-      </w:pPr>
-      <w:r>
-        <w:rPr>
-          <w:rFonts w:ascii="Consolas" w:eastAsia="Consolas" w:hAnsi="Consolas" w:cs="Consolas"/>
-          <w:b/>
-          <w:bCs/>
-        </w:rPr>
-        <w:t xml:space="preserve">row_to_json(c)::text</w:t>
-      </w:r>
-      <w:r>
-        <w:rPr>
-          <w:b/>
-          <w:bCs/>
-        </w:rPr>
-        <w:t xml:space="preserve"> của PostgreSQL:</w:t>
-      </w:r>
-      <w:r>
-        <w:t xml:space="preserve"> biến cả một dòng thành chuỗi JSON để kiểm tra bằng một lệnh rằng </w:t>
-      </w:r>
-      <w:r>
-        <w:rPr>
-          <w:b/>
-          <w:bCs/>
-        </w:rPr>
-        <w:t xml:space="preserve">không cột nào</w:t>
-      </w:r>
-      <w:r>
-        <w:t xml:space="preserve"> chứa token dạng chữ.</w:t>
-      </w:r>
-    </w:p>
-    <w:p>
-      <w:pPr>
-        <w:pStyle w:val="ListParagraph"/>
-        <w:numPr>
-          <w:ilvl w:val="0"/>
-          <w:numId w:val="1"/>
-        </w:numPr>
-      </w:pPr>
-      <w:r>
-        <w:rPr>
-          <w:rFonts w:ascii="Consolas" w:eastAsia="Consolas" w:hAnsi="Consolas" w:cs="Consolas"/>
-          <w:b/>
-          <w:bCs/>
-        </w:rPr>
-        <w:t xml:space="preserve">entityManager.flush()</w:t>
-      </w:r>
-      <w:r>
-        <w:rPr>
-          <w:b/>
-          <w:bCs/>
-        </w:rPr>
-        <w:t xml:space="preserve"> để lộ lỗi:</w:t>
-      </w:r>
-      <w:r>
-        <w:t xml:space="preserve"> trong </w:t>
-      </w:r>
-      <w:r>
-        <w:rPr>
-          <w:rFonts w:ascii="Consolas" w:eastAsia="Consolas" w:hAnsi="Consolas" w:cs="Consolas"/>
-        </w:rPr>
-        <w:t xml:space="preserve">@DataJpaTest</w:t>
-      </w:r>
-      <w:r>
-        <w:t xml:space="preserve">, lệnh ghi chỉ thật sự xuống DB khi flush. Muốn thấy lỗi khóa ngoại thì phải flush ngay trong đoạn code đang chờ lỗi; test còn kiểm tra cả stack trace của lỗi đó không chứa token.</w:t>
+        <w:t xml:space="preserve">@SQLRestriction("removed_at is null")</w:t>
+      </w:r>
+      <w:r>
+        <w:t xml:space="preserve"> của Hibernate, tự thêm điều kiện vào mọi truy vấn của entity. Cách này gọn hơn, nhưng </w:t>
+      </w:r>
+      <w:r>
+        <w:rPr>
+          <w:rFonts w:ascii="Consolas" w:eastAsia="Consolas" w:hAnsi="Consolas" w:cs="Consolas"/>
+        </w:rPr>
+        <w:t xml:space="preserve">register</w:t>
+      </w:r>
+      <w:r>
+        <w:t xml:space="preserve"> sẽ không còn thấy dòng đã xóa (phải viết SQL thô), và người đọc code không thấy điều kiện lọc nằm ở đâu.</w:t>
+      </w:r>
+    </w:p>
+    <w:p>
+      <w:pPr>
+        <w:pStyle w:val="ListParagraph"/>
+        <w:numPr>
+          <w:ilvl w:val="0"/>
+          <w:numId w:val="1"/>
+        </w:numPr>
+      </w:pPr>
+      <w:r>
+        <w:rPr>
+          <w:b/>
+          <w:bCs/>
+        </w:rPr>
+        <w:t xml:space="preserve">Bẫy của xóa mềm:</w:t>
+      </w:r>
+      <w:r>
+        <w:t xml:space="preserve"> mọi truy vấn mới sau này (F05, F07...) đều phải nhớ lọc. Test "account đã xóa không còn hiện" bảo vệ các truy vấn hiện có; truy vấn mới cần test riêng.</w:t>
+      </w:r>
+    </w:p>
+    <w:p>
+      <w:pPr>
+        <w:pStyle w:val="Heading3"/>
+      </w:pPr>
+      <w:r>
+        <w:t xml:space="preserve">21.4 Kết nối lại account đã xóa: dùng lại bản ghi cũ</w:t>
+      </w:r>
+    </w:p>
+    <w:p>
+      <w:pPr>
+        <w:pStyle w:val="ListParagraph"/>
+        <w:numPr>
+          <w:ilvl w:val="0"/>
+          <w:numId w:val="1"/>
+        </w:numPr>
+      </w:pPr>
+      <w:r>
+        <w:rPr>
+          <w:rFonts w:ascii="Consolas" w:eastAsia="Consolas" w:hAnsi="Consolas" w:cs="Consolas"/>
+        </w:rPr>
+        <w:t xml:space="preserve">UNIQUE (user_id, provider, external_account_id)</w:t>
+      </w:r>
+      <w:r>
+        <w:t xml:space="preserve"> giữ nguyên, nên không thể có dòng thứ hai cho cùng một tài khoản Gmail. </w:t>
+      </w:r>
+      <w:r>
+        <w:rPr>
+          <w:rFonts w:ascii="Consolas" w:eastAsia="Consolas" w:hAnsi="Consolas" w:cs="Consolas"/>
+        </w:rPr>
+        <w:t xml:space="preserve">register</w:t>
+      </w:r>
+      <w:r>
+        <w:t xml:space="preserve"> tìm thấy dòng cũ (kể cả đã xóa) rồi gọi </w:t>
+      </w:r>
+      <w:r>
+        <w:rPr>
+          <w:rFonts w:ascii="Consolas" w:eastAsia="Consolas" w:hAnsi="Consolas" w:cs="Consolas"/>
+        </w:rPr>
+        <w:t xml:space="preserve">reconnect()</w:t>
+      </w:r>
+      <w:r>
+        <w:t xml:space="preserve">: xóa </w:t>
+      </w:r>
+      <w:r>
+        <w:rPr>
+          <w:rFonts w:ascii="Consolas" w:eastAsia="Consolas" w:hAnsi="Consolas" w:cs="Consolas"/>
+        </w:rPr>
+        <w:t xml:space="preserve">removed_at</w:t>
+      </w:r>
+      <w:r>
+        <w:t xml:space="preserve">, bật lại sync, trạng thái </w:t>
+      </w:r>
+      <w:r>
+        <w:rPr>
+          <w:rFonts w:ascii="Consolas" w:eastAsia="Consolas" w:hAnsi="Consolas" w:cs="Consolas"/>
+        </w:rPr>
+        <w:t xml:space="preserve">CONNECTED</w:t>
+      </w:r>
+      <w:r>
+        <w:t xml:space="preserve">, lưu credential mới, giữ nguyên ID.</w:t>
+      </w:r>
+    </w:p>
+    <w:p>
+      <w:pPr>
+        <w:pStyle w:val="ListParagraph"/>
+        <w:numPr>
+          <w:ilvl w:val="0"/>
+          <w:numId w:val="1"/>
+        </w:numPr>
+      </w:pPr>
+      <w:r>
+        <w:t xml:space="preserve">Sync chỉ được bật lại khi dùng lại account </w:t>
+      </w:r>
+      <w:r>
+        <w:rPr>
+          <w:b/>
+          <w:bCs/>
+        </w:rPr>
+        <w:t xml:space="preserve">đã xóa</w:t>
+      </w:r>
+      <w:r>
+        <w:t xml:space="preserve">, vì account đó "bắt đầu như mới". Reconnect thường vẫn giữ lựa chọn tạm dừng của người dùng; có test cho cả hai trường hợp.</w:t>
+      </w:r>
+    </w:p>
+    <w:p>
+      <w:pPr>
+        <w:pStyle w:val="ListParagraph"/>
+        <w:numPr>
+          <w:ilvl w:val="0"/>
+          <w:numId w:val="1"/>
+        </w:numPr>
+      </w:pPr>
+      <w:r>
+        <w:t xml:space="preserve">Hệ quả cho F05: tin nhắn cũ gắn với cùng ID sẽ hiện lại (nếu khi đó còn giữ).</w:t>
+      </w:r>
+    </w:p>
+    <w:p>
+      <w:pPr>
+        <w:pStyle w:val="Heading3"/>
+      </w:pPr>
+      <w:r>
+        <w:t xml:space="preserve">21.5 Migration thêm cột</w:t>
+      </w:r>
+    </w:p>
+    <w:p>
+      <w:pPr>
+        <w:pStyle w:val="ListParagraph"/>
+        <w:numPr>
+          <w:ilvl w:val="0"/>
+          <w:numId w:val="1"/>
+        </w:numPr>
+      </w:pPr>
+      <w:r>
+        <w:t xml:space="preserve">V5: </w:t>
+      </w:r>
+      <w:r>
+        <w:rPr>
+          <w:rFonts w:ascii="Consolas" w:eastAsia="Consolas" w:hAnsi="Consolas" w:cs="Consolas"/>
+        </w:rPr>
+        <w:t xml:space="preserve">ALTER TABLE connected_account ADD COLUMN removed_at timestamptz;</w:t>
+      </w:r>
+      <w:r>
+        <w:t xml:space="preserve">. Cột cho phép </w:t>
+      </w:r>
+      <w:r>
+        <w:rPr>
+          <w:rFonts w:ascii="Consolas" w:eastAsia="Consolas" w:hAnsi="Consolas" w:cs="Consolas"/>
+        </w:rPr>
+        <w:t xml:space="preserve">null</w:t>
+      </w:r>
+      <w:r>
+        <w:t xml:space="preserve"> nên các dòng có sẵn không cần giá trị.</w:t>
+      </w:r>
+    </w:p>
+    <w:p>
+      <w:pPr>
+        <w:pStyle w:val="ListParagraph"/>
+        <w:numPr>
+          <w:ilvl w:val="0"/>
+          <w:numId w:val="1"/>
+        </w:numPr>
+      </w:pPr>
+      <w:r>
+        <w:t xml:space="preserve">Không sửa V3 (đã áp lên DB rồi): mọi thay đổi schema là một migration mới.</w:t>
       </w:r>
     </w:p>
     <w:p>
@@ -13841,7 +13423,1194 @@
         <w:pStyle w:val="Heading2"/>
       </w:pPr>
       <w:r>
-        <w:t xml:space="preserve">22. Tự kiểm tra F02 (phần đã làm)</w:t>
+        <w:t xml:space="preserve">22. Kỹ thuật test mới trong F02</w:t>
+      </w:r>
+    </w:p>
+    <w:p>
+      <w:pPr>
+        <w:pStyle w:val="ListParagraph"/>
+        <w:numPr>
+          <w:ilvl w:val="0"/>
+          <w:numId w:val="1"/>
+        </w:numPr>
+      </w:pPr>
+      <w:r>
+        <w:rPr>
+          <w:rFonts w:ascii="Consolas" w:eastAsia="Consolas" w:hAnsi="Consolas" w:cs="Consolas"/>
+          <w:b/>
+          <w:bCs/>
+        </w:rPr>
+        <w:t xml:space="preserve">@DataJpaTest</w:t>
+      </w:r>
+      <w:r>
+        <w:rPr>
+          <w:b/>
+          <w:bCs/>
+        </w:rPr>
+        <w:t xml:space="preserve"> + </w:t>
+      </w:r>
+      <w:r>
+        <w:rPr>
+          <w:rFonts w:ascii="Consolas" w:eastAsia="Consolas" w:hAnsi="Consolas" w:cs="Consolas"/>
+          <w:b/>
+          <w:bCs/>
+        </w:rPr>
+        <w:t xml:space="preserve">@AutoConfigureTestDatabase(replace = NONE)</w:t>
+      </w:r>
+      <w:r>
+        <w:rPr>
+          <w:b/>
+          <w:bCs/>
+        </w:rPr>
+        <w:t xml:space="preserve">:</w:t>
+      </w:r>
+      <w:r>
+        <w:t xml:space="preserve"> slice chỉ nạp JPA và Flyway, chạy trên PostgreSQL thật (Testcontainers) để </w:t>
+      </w:r>
+      <w:r>
+        <w:rPr>
+          <w:rFonts w:ascii="Consolas" w:eastAsia="Consolas" w:hAnsi="Consolas" w:cs="Consolas"/>
+        </w:rPr>
+        <w:t xml:space="preserve">CHECK</w:t>
+      </w:r>
+      <w:r>
+        <w:t xml:space="preserve">, </w:t>
+      </w:r>
+      <w:r>
+        <w:rPr>
+          <w:rFonts w:ascii="Consolas" w:eastAsia="Consolas" w:hAnsi="Consolas" w:cs="Consolas"/>
+        </w:rPr>
+        <w:t xml:space="preserve">UNIQUE</w:t>
+      </w:r>
+      <w:r>
+        <w:t xml:space="preserve">, khóa ngoại hoạt động như production. Mỗi test tự rollback.</w:t>
+      </w:r>
+    </w:p>
+    <w:p>
+      <w:pPr>
+        <w:pStyle w:val="ListParagraph"/>
+        <w:numPr>
+          <w:ilvl w:val="0"/>
+          <w:numId w:val="1"/>
+        </w:numPr>
+      </w:pPr>
+      <w:r>
+        <w:rPr>
+          <w:rFonts w:ascii="Consolas" w:eastAsia="Consolas" w:hAnsi="Consolas" w:cs="Consolas"/>
+          <w:b/>
+          <w:bCs/>
+        </w:rPr>
+        <w:t xml:space="preserve">entityManager.clear()</w:t>
+      </w:r>
+      <w:r>
+        <w:rPr>
+          <w:b/>
+          <w:bCs/>
+        </w:rPr>
+        <w:t xml:space="preserve">:</w:t>
+      </w:r>
+      <w:r>
+        <w:t xml:space="preserve"> xóa bộ nhớ đệm của Hibernate để lần đọc sau thật sự đi xuống DB. Không có nó, test chỉ đọc lại object trong bộ nhớ.</w:t>
+      </w:r>
+    </w:p>
+    <w:p>
+      <w:pPr>
+        <w:pStyle w:val="ListParagraph"/>
+        <w:numPr>
+          <w:ilvl w:val="0"/>
+          <w:numId w:val="1"/>
+        </w:numPr>
+      </w:pPr>
+      <w:r>
+        <w:rPr>
+          <w:rFonts w:ascii="Consolas" w:eastAsia="Consolas" w:hAnsi="Consolas" w:cs="Consolas"/>
+          <w:b/>
+          <w:bCs/>
+        </w:rPr>
+        <w:t xml:space="preserve">JdbcTemplate</w:t>
+      </w:r>
+      <w:r>
+        <w:rPr>
+          <w:b/>
+          <w:bCs/>
+        </w:rPr>
+        <w:t xml:space="preserve">:</w:t>
+      </w:r>
+      <w:r>
+        <w:t xml:space="preserve"> chạy SQL thô để nhìn đúng cái nằm trong DB, hoặc để thử ràng buộc mà Java không tạo ra được (ví dụ ghi </w:t>
+      </w:r>
+      <w:r>
+        <w:rPr>
+          <w:rFonts w:ascii="Consolas" w:eastAsia="Consolas" w:hAnsi="Consolas" w:cs="Consolas"/>
+        </w:rPr>
+        <w:t xml:space="preserve">status = 'SYNCING'</w:t>
+      </w:r>
+      <w:r>
+        <w:t xml:space="preserve">).</w:t>
+      </w:r>
+    </w:p>
+    <w:p>
+      <w:pPr>
+        <w:pStyle w:val="ListParagraph"/>
+        <w:numPr>
+          <w:ilvl w:val="0"/>
+          <w:numId w:val="1"/>
+        </w:numPr>
+      </w:pPr>
+      <w:r>
+        <w:rPr>
+          <w:rFonts w:ascii="Consolas" w:eastAsia="Consolas" w:hAnsi="Consolas" w:cs="Consolas"/>
+          <w:b/>
+          <w:bCs/>
+        </w:rPr>
+        <w:t xml:space="preserve">ApplicationContextRunner</w:t>
+      </w:r>
+      <w:r>
+        <w:rPr>
+          <w:b/>
+          <w:bCs/>
+        </w:rPr>
+        <w:t xml:space="preserve"> cho kiểm tra khởi động:</w:t>
+      </w:r>
+      <w:r>
+        <w:t xml:space="preserve"> dựng một context nhỏ với cấu hình sai để chứng minh app </w:t>
+      </w:r>
+      <w:r>
+        <w:rPr>
+          <w:b/>
+          <w:bCs/>
+        </w:rPr>
+        <w:t xml:space="preserve">không</w:t>
+      </w:r>
+      <w:r>
+        <w:t xml:space="preserve"> start và thông báo không lộ secret.</w:t>
+      </w:r>
+    </w:p>
+    <w:p>
+      <w:pPr>
+        <w:pStyle w:val="ListParagraph"/>
+        <w:numPr>
+          <w:ilvl w:val="0"/>
+          <w:numId w:val="1"/>
+        </w:numPr>
+      </w:pPr>
+      <w:r>
+        <w:rPr>
+          <w:b/>
+          <w:bCs/>
+        </w:rPr>
+        <w:t xml:space="preserve">Mockito </w:t>
+      </w:r>
+      <w:r>
+        <w:rPr>
+          <w:rFonts w:ascii="Consolas" w:eastAsia="Consolas" w:hAnsi="Consolas" w:cs="Consolas"/>
+          <w:b/>
+          <w:bCs/>
+        </w:rPr>
+        <w:t xml:space="preserve">mock(...)</w:t>
+      </w:r>
+      <w:r>
+        <w:rPr>
+          <w:b/>
+          <w:bCs/>
+        </w:rPr>
+        <w:t xml:space="preserve"> trong unit test:</w:t>
+      </w:r>
+      <w:r>
+        <w:t xml:space="preserve"> </w:t>
+      </w:r>
+      <w:r>
+        <w:rPr>
+          <w:rFonts w:ascii="Consolas" w:eastAsia="Consolas" w:hAnsi="Consolas" w:cs="Consolas"/>
+        </w:rPr>
+        <w:t xml:space="preserve">OwnerCurrentUserTests</w:t>
+      </w:r>
+      <w:r>
+        <w:t xml:space="preserve"> giả repository để test </w:t>
+      </w:r>
+      <w:r>
+        <w:rPr>
+          <w:rFonts w:ascii="Consolas" w:eastAsia="Consolas" w:hAnsi="Consolas" w:cs="Consolas"/>
+        </w:rPr>
+        <w:t xml:space="preserve">CurrentUser</w:t>
+      </w:r>
+      <w:r>
+        <w:t xml:space="preserve"> mà không cần DB.</w:t>
+      </w:r>
+    </w:p>
+    <w:p>
+      <w:pPr>
+        <w:pStyle w:val="ListParagraph"/>
+        <w:numPr>
+          <w:ilvl w:val="0"/>
+          <w:numId w:val="1"/>
+        </w:numPr>
+      </w:pPr>
+      <w:r>
+        <w:rPr>
+          <w:b/>
+          <w:bCs/>
+        </w:rPr>
+        <w:t xml:space="preserve">Kiểm tra ngược ở mọi task:</w:t>
+      </w:r>
+    </w:p>
+    <w:p>
+      <w:pPr>
+        <w:pStyle w:val="ListParagraph"/>
+        <w:numPr>
+          <w:ilvl w:val="1"/>
+          <w:numId w:val="1"/>
+        </w:numPr>
+      </w:pPr>
+      <w:r>
+        <w:t xml:space="preserve">BE-09: bỏ bước tìm theo email → 2 test idempotent đỏ.</w:t>
+      </w:r>
+    </w:p>
+    <w:p>
+      <w:pPr>
+        <w:pStyle w:val="ListParagraph"/>
+        <w:numPr>
+          <w:ilvl w:val="1"/>
+          <w:numId w:val="1"/>
+        </w:numPr>
+      </w:pPr>
+      <w:r>
+        <w:t xml:space="preserve">BE-10: cho </w:t>
+      </w:r>
+      <w:r>
+        <w:rPr>
+          <w:rFonts w:ascii="Consolas" w:eastAsia="Consolas" w:hAnsi="Consolas" w:cs="Consolas"/>
+        </w:rPr>
+        <w:t xml:space="preserve">markHealthy</w:t>
+      </w:r>
+      <w:r>
+        <w:t xml:space="preserve"> gỡ </w:t>
+      </w:r>
+      <w:r>
+        <w:rPr>
+          <w:rFonts w:ascii="Consolas" w:eastAsia="Consolas" w:hAnsi="Consolas" w:cs="Consolas"/>
+        </w:rPr>
+        <w:t xml:space="preserve">AUTH_EXPIRED</w:t>
+      </w:r>
+      <w:r>
+        <w:t xml:space="preserve"> → đúng ô đó đỏ.</w:t>
+      </w:r>
+    </w:p>
+    <w:p>
+      <w:pPr>
+        <w:pStyle w:val="ListParagraph"/>
+        <w:numPr>
+          <w:ilvl w:val="1"/>
+          <w:numId w:val="1"/>
+        </w:numPr>
+      </w:pPr>
+      <w:r>
+        <w:t xml:space="preserve">BE-12: IV cố định → 1 test đỏ; bỏ AAD → 3 test đỏ; tag 96 bit → 2 test đỏ.</w:t>
+      </w:r>
+    </w:p>
+    <w:p>
+      <w:pPr>
+        <w:pStyle w:val="ListParagraph"/>
+        <w:numPr>
+          <w:ilvl w:val="1"/>
+          <w:numId w:val="1"/>
+        </w:numPr>
+      </w:pPr>
+      <w:r>
+        <w:t xml:space="preserve">BE-13: store "quên" ghi refresh token → test xoay khóa đỏ.</w:t>
+      </w:r>
+    </w:p>
+    <w:p>
+      <w:pPr>
+        <w:pStyle w:val="ListParagraph"/>
+        <w:numPr>
+          <w:ilvl w:val="1"/>
+          <w:numId w:val="1"/>
+        </w:numPr>
+      </w:pPr>
+      <w:r>
+        <w:t xml:space="preserve">BE-14: bỏ </w:t>
+      </w:r>
+      <w:r>
+        <w:rPr>
+          <w:rFonts w:ascii="Consolas" w:eastAsia="Consolas" w:hAnsi="Consolas" w:cs="Consolas"/>
+        </w:rPr>
+        <w:t xml:space="preserve">@Transactional</w:t>
+      </w:r>
+      <w:r>
+        <w:t xml:space="preserve"> → test rollback và test reconnect đỏ; không tìm account cũ → test reconnect đỏ (lỗi </w:t>
+      </w:r>
+      <w:r>
+        <w:rPr>
+          <w:rFonts w:ascii="Consolas" w:eastAsia="Consolas" w:hAnsi="Consolas" w:cs="Consolas"/>
+        </w:rPr>
+        <w:t xml:space="preserve">UNIQUE</w:t>
+      </w:r>
+      <w:r>
+        <w:t xml:space="preserve">); bỏ kiểm tra provider → test provider lạ đỏ; </w:t>
+      </w:r>
+      <w:r>
+        <w:rPr>
+          <w:rFonts w:ascii="Consolas" w:eastAsia="Consolas" w:hAnsi="Consolas" w:cs="Consolas"/>
+        </w:rPr>
+        <w:t xml:space="preserve">reconnected</w:t>
+      </w:r>
+      <w:r>
+        <w:t xml:space="preserve"> luôn </w:t>
+      </w:r>
+      <w:r>
+        <w:rPr>
+          <w:rFonts w:ascii="Consolas" w:eastAsia="Consolas" w:hAnsi="Consolas" w:cs="Consolas"/>
+        </w:rPr>
+        <w:t xml:space="preserve">false</w:t>
+      </w:r>
+      <w:r>
+        <w:t xml:space="preserve"> → test reconnect đỏ; publish trước khi lưu credential → test rollback đỏ; thêm một trường vào event → test payload đỏ.</w:t>
+      </w:r>
+    </w:p>
+    <w:p>
+      <w:pPr>
+        <w:pStyle w:val="ListParagraph"/>
+        <w:numPr>
+          <w:ilvl w:val="1"/>
+          <w:numId w:val="1"/>
+        </w:numPr>
+      </w:pPr>
+      <w:r>
+        <w:t xml:space="preserve">BE-15: danh sách không lọc owner → 2 test đỏ; </w:t>
+      </w:r>
+      <w:r>
+        <w:rPr>
+          <w:rFonts w:ascii="Consolas" w:eastAsia="Consolas" w:hAnsi="Consolas" w:cs="Consolas"/>
+        </w:rPr>
+        <w:t xml:space="preserve">get</w:t>
+      </w:r>
+      <w:r>
+        <w:t xml:space="preserve"> không lọc owner → test cô lập đỏ; mới nhất trước → test thứ tự đỏ; </w:t>
+      </w:r>
+      <w:r>
+        <w:rPr>
+          <w:rFonts w:ascii="Consolas" w:eastAsia="Consolas" w:hAnsi="Consolas" w:cs="Consolas"/>
+        </w:rPr>
+        <w:t xml:space="preserve">ProviderRegistry.get</w:t>
+      </w:r>
+      <w:r>
+        <w:t xml:space="preserve"> thay </w:t>
+      </w:r>
+      <w:r>
+        <w:rPr>
+          <w:rFonts w:ascii="Consolas" w:eastAsia="Consolas" w:hAnsi="Consolas" w:cs="Consolas"/>
+        </w:rPr>
+        <w:t xml:space="preserve">find</w:t>
+      </w:r>
+      <w:r>
+        <w:t xml:space="preserve"> → test connector đã gỡ đỏ; </w:t>
+      </w:r>
+      <w:r>
+        <w:rPr>
+          <w:rFonts w:ascii="Consolas" w:eastAsia="Consolas" w:hAnsi="Consolas" w:cs="Consolas"/>
+        </w:rPr>
+        <w:t xml:space="preserve">ownerId</w:t>
+      </w:r>
+      <w:r>
+        <w:t xml:space="preserve"> lọt vào response → test tập trường đỏ; detail nói "của người khác" → test cô lập đỏ.</w:t>
+      </w:r>
+    </w:p>
+    <w:p>
+      <w:pPr>
+        <w:pStyle w:val="ListParagraph"/>
+        <w:numPr>
+          <w:ilvl w:val="1"/>
+          <w:numId w:val="1"/>
+        </w:numPr>
+      </w:pPr>
+      <w:r>
+        <w:t xml:space="preserve">BE-16 (10 lỗi, chạy bằng một script nhỏ áp từng lỗi rồi khôi phục): </w:t>
+      </w:r>
+      <w:r>
+        <w:rPr>
+          <w:rFonts w:ascii="Consolas" w:eastAsia="Consolas" w:hAnsi="Consolas" w:cs="Consolas"/>
+        </w:rPr>
+        <w:t xml:space="preserve">@Size</w:t>
+      </w:r>
+      <w:r>
+        <w:t xml:space="preserve"> thay luật domain → tên trắng ra 500 và 100 emoji bị từ chối; bỏ "ít nhất một trường" → test </w:t>
+      </w:r>
+      <w:r>
+        <w:rPr>
+          <w:rFonts w:ascii="Consolas" w:eastAsia="Consolas" w:hAnsi="Consolas" w:cs="Consolas"/>
+        </w:rPr>
+        <w:t xml:space="preserve">{}</w:t>
+      </w:r>
+      <w:r>
+        <w:t xml:space="preserve"> đỏ; đảo nghĩa </w:t>
+      </w:r>
+      <w:r>
+        <w:rPr>
+          <w:rFonts w:ascii="Consolas" w:eastAsia="Consolas" w:hAnsi="Consolas" w:cs="Consolas"/>
+        </w:rPr>
+        <w:t xml:space="preserve">enabled</w:t>
+      </w:r>
+      <w:r>
+        <w:t xml:space="preserve"> → 2 test đỏ; không phát event khi tắt → đỏ; phát event cả khi không đổi gì → 2 test đỏ; PATCH không lọc owner → đỏ; bỏ </w:t>
+      </w:r>
+      <w:r>
+        <w:rPr>
+          <w:rFonts w:ascii="Consolas" w:eastAsia="Consolas" w:hAnsi="Consolas" w:cs="Consolas"/>
+        </w:rPr>
+        <w:t xml:space="preserve">@Version</w:t>
+      </w:r>
+      <w:r>
+        <w:t xml:space="preserve"> → test version cũ đỏ; không phát event khi reconnect → đỏ; phát event ở mọi lần reconnect → đỏ; thêm trường vào event → đỏ.</w:t>
+      </w:r>
+    </w:p>
+    <w:p>
+      <w:pPr>
+        <w:pStyle w:val="ListParagraph"/>
+        <w:numPr>
+          <w:ilvl w:val="1"/>
+          <w:numId w:val="1"/>
+        </w:numPr>
+      </w:pPr>
+      <w:r>
+        <w:t xml:space="preserve">BE-17 (12 lỗi, cùng cách bằng script): </w:t>
+      </w:r>
+      <w:r>
+        <w:rPr>
+          <w:rFonts w:ascii="Consolas" w:eastAsia="Consolas" w:hAnsi="Consolas" w:cs="Consolas"/>
+        </w:rPr>
+        <w:t xml:space="preserve">remove</w:t>
+      </w:r>
+      <w:r>
+        <w:t xml:space="preserve"> không ghi gì → 7 test đỏ; cho xóa hai lần → đỏ; </w:t>
+      </w:r>
+      <w:r>
+        <w:rPr>
+          <w:rFonts w:ascii="Consolas" w:eastAsia="Consolas" w:hAnsi="Consolas" w:cs="Consolas"/>
+        </w:rPr>
+        <w:t xml:space="preserve">remove</w:t>
+      </w:r>
+      <w:r>
+        <w:t xml:space="preserve"> đổi </w:t>
+      </w:r>
+      <w:r>
+        <w:rPr>
+          <w:rFonts w:ascii="Consolas" w:eastAsia="Consolas" w:hAnsi="Consolas" w:cs="Consolas"/>
+        </w:rPr>
+        <w:t xml:space="preserve">status</w:t>
+      </w:r>
+      <w:r>
+        <w:t xml:space="preserve"> → đỏ; dùng lại account đã xóa mà không xóa </w:t>
+      </w:r>
+      <w:r>
+        <w:rPr>
+          <w:rFonts w:ascii="Consolas" w:eastAsia="Consolas" w:hAnsi="Consolas" w:cs="Consolas"/>
+        </w:rPr>
+        <w:t xml:space="preserve">removed_at</w:t>
+      </w:r>
+      <w:r>
+        <w:t xml:space="preserve"> → 2 đỏ; dùng lại mà không bật sync → 2 đỏ; mọi reconnect đều bật sync → đỏ; giữ lại credential → đỏ; không phát </w:t>
+      </w:r>
+      <w:r>
+        <w:rPr>
+          <w:rFonts w:ascii="Consolas" w:eastAsia="Consolas" w:hAnsi="Consolas" w:cs="Consolas"/>
+        </w:rPr>
+        <w:t xml:space="preserve">AccountRemoved</w:t>
+      </w:r>
+      <w:r>
+        <w:t xml:space="preserve"> → 2 đỏ; danh sách hiện account đã xóa → đỏ; GET thấy account đã xóa → đỏ; PATCH/DELETE với tới account đã xóa → đỏ; PATCH/DELETE bỏ qua owner → 2 đỏ.</w:t>
+      </w:r>
+    </w:p>
+    <w:p>
+      <w:pPr>
+        <w:pStyle w:val="ListParagraph"/>
+        <w:numPr>
+          <w:ilvl w:val="0"/>
+          <w:numId w:val="1"/>
+        </w:numPr>
+      </w:pPr>
+      <w:r>
+        <w:rPr>
+          <w:rFonts w:ascii="Consolas" w:eastAsia="Consolas" w:hAnsi="Consolas" w:cs="Consolas"/>
+          <w:b/>
+          <w:bCs/>
+        </w:rPr>
+        <w:t xml:space="preserve">@RecordApplicationEvents</w:t>
+      </w:r>
+      <w:r>
+        <w:rPr>
+          <w:b/>
+          <w:bCs/>
+        </w:rPr>
+        <w:t xml:space="preserve"> + </w:t>
+      </w:r>
+      <w:r>
+        <w:rPr>
+          <w:rFonts w:ascii="Consolas" w:eastAsia="Consolas" w:hAnsi="Consolas" w:cs="Consolas"/>
+          <w:b/>
+          <w:bCs/>
+        </w:rPr>
+        <w:t xml:space="preserve">ApplicationEvents</w:t>
+      </w:r>
+      <w:r>
+        <w:rPr>
+          <w:b/>
+          <w:bCs/>
+        </w:rPr>
+        <w:t xml:space="preserve"> (Spring Test, BE-16):</w:t>
+      </w:r>
+      <w:r>
+        <w:t xml:space="preserve"> ghi lại event được publish trong một test </w:t>
+      </w:r>
+      <w:r>
+        <w:rPr>
+          <w:rFonts w:ascii="Consolas" w:eastAsia="Consolas" w:hAnsi="Consolas" w:cs="Consolas"/>
+        </w:rPr>
+        <w:t xml:space="preserve">@SpringBootTest</w:t>
+      </w:r>
+      <w:r>
+        <w:t xml:space="preserve">; </w:t>
+      </w:r>
+      <w:r>
+        <w:rPr>
+          <w:rFonts w:ascii="Consolas" w:eastAsia="Consolas" w:hAnsi="Consolas" w:cs="Consolas"/>
+        </w:rPr>
+        <w:t xml:space="preserve">events.stream(AccountStatusChanged.class)</w:t>
+      </w:r>
+      <w:r>
+        <w:t xml:space="preserve"> lấy ra để kiểm tra. </w:t>
+      </w:r>
+      <w:r>
+        <w:rPr>
+          <w:rFonts w:ascii="Consolas" w:eastAsia="Consolas" w:hAnsi="Consolas" w:cs="Consolas"/>
+        </w:rPr>
+        <w:t xml:space="preserve">AssertablePublishedEvents</w:t>
+      </w:r>
+      <w:r>
+        <w:t xml:space="preserve"> là cách tương tự của Spring Modulith, dùng trong module test.</w:t>
+      </w:r>
+    </w:p>
+    <w:p>
+      <w:pPr>
+        <w:pStyle w:val="ListParagraph"/>
+        <w:numPr>
+          <w:ilvl w:val="0"/>
+          <w:numId w:val="1"/>
+        </w:numPr>
+      </w:pPr>
+      <w:r>
+        <w:rPr>
+          <w:rFonts w:ascii="Consolas" w:eastAsia="Consolas" w:hAnsi="Consolas" w:cs="Consolas"/>
+          <w:b/>
+          <w:bCs/>
+        </w:rPr>
+        <w:t xml:space="preserve">TransactionTemplate</w:t>
+      </w:r>
+      <w:r>
+        <w:rPr>
+          <w:b/>
+          <w:bCs/>
+        </w:rPr>
+        <w:t xml:space="preserve"> trong test (BE-16):</w:t>
+      </w:r>
+      <w:r>
+        <w:t xml:space="preserve"> mở transaction bằng code để chen một bước vào giữa. Test gọi service (đã đọc </w:t>
+      </w:r>
+      <w:r>
+        <w:rPr>
+          <w:rFonts w:ascii="Consolas" w:eastAsia="Consolas" w:hAnsi="Consolas" w:cs="Consolas"/>
+        </w:rPr>
+        <w:t xml:space="preserve">version</w:t>
+      </w:r>
+      <w:r>
+        <w:t xml:space="preserve"> cũ), rồi giả "một request khác" bằng </w:t>
+      </w:r>
+      <w:r>
+        <w:rPr>
+          <w:rFonts w:ascii="Consolas" w:eastAsia="Consolas" w:hAnsi="Consolas" w:cs="Consolas"/>
+        </w:rPr>
+        <w:t xml:space="preserve">UPDATE ... SET version = version + 1</w:t>
+      </w:r>
+      <w:r>
+        <w:t xml:space="preserve"> trong cùng transaction; lúc commit phải ra </w:t>
+      </w:r>
+      <w:r>
+        <w:rPr>
+          <w:rFonts w:ascii="Consolas" w:eastAsia="Consolas" w:hAnsi="Consolas" w:cs="Consolas"/>
+        </w:rPr>
+        <w:t xml:space="preserve">OptimisticLockingFailureException</w:t>
+      </w:r>
+      <w:r>
+        <w:t xml:space="preserve">. Qua MockMvc không canh được hai request chạy chồng nhau, nên phần đổi lỗi thành 409 dựa vào test có sẵn của F01.</w:t>
+      </w:r>
+    </w:p>
+    <w:p>
+      <w:pPr>
+        <w:pStyle w:val="ListParagraph"/>
+        <w:numPr>
+          <w:ilvl w:val="0"/>
+          <w:numId w:val="1"/>
+        </w:numPr>
+      </w:pPr>
+      <w:r>
+        <w:rPr>
+          <w:b/>
+          <w:bCs/>
+        </w:rPr>
+        <w:t xml:space="preserve">Test payload của event gom về một chỗ (BE-17):</w:t>
+      </w:r>
+      <w:r>
+        <w:t xml:space="preserve"> </w:t>
+      </w:r>
+      <w:r>
+        <w:rPr>
+          <w:rFonts w:ascii="Consolas" w:eastAsia="Consolas" w:hAnsi="Consolas" w:cs="Consolas"/>
+        </w:rPr>
+        <w:t xml:space="preserve">AccountEventsTests</w:t>
+      </w:r>
+      <w:r>
+        <w:t xml:space="preserve"> (package </w:t>
+      </w:r>
+      <w:r>
+        <w:rPr>
+          <w:rFonts w:ascii="Consolas" w:eastAsia="Consolas" w:hAnsi="Consolas" w:cs="Consolas"/>
+        </w:rPr>
+        <w:t xml:space="preserve">dev.sino.account</w:t>
+      </w:r>
+      <w:r>
+        <w:t xml:space="preserve">) kiểm tên các trường của cả ba event bằng </w:t>
+      </w:r>
+      <w:r>
+        <w:rPr>
+          <w:rFonts w:ascii="Consolas" w:eastAsia="Consolas" w:hAnsi="Consolas" w:cs="Consolas"/>
+        </w:rPr>
+        <w:t xml:space="preserve">getRecordComponents()</w:t>
+      </w:r>
+      <w:r>
+        <w:t xml:space="preserve">. Đây là unit test thuần, không cần Spring, nên tách khỏi module test của luồng đăng ký.</w:t>
+      </w:r>
+    </w:p>
+    <w:p>
+      <w:pPr>
+        <w:pStyle w:val="ListParagraph"/>
+        <w:numPr>
+          <w:ilvl w:val="0"/>
+          <w:numId w:val="1"/>
+        </w:numPr>
+      </w:pPr>
+      <w:r>
+        <w:rPr>
+          <w:b/>
+          <w:bCs/>
+        </w:rPr>
+        <w:t xml:space="preserve">Chạy cả ứng dụng thay cho web slice (BE-15):</w:t>
+      </w:r>
+      <w:r>
+        <w:t xml:space="preserve"> </w:t>
+      </w:r>
+      <w:r>
+        <w:rPr>
+          <w:rFonts w:ascii="Consolas" w:eastAsia="Consolas" w:hAnsi="Consolas" w:cs="Consolas"/>
+        </w:rPr>
+        <w:t xml:space="preserve">@SpringBootTest</w:t>
+      </w:r>
+      <w:r>
+        <w:t xml:space="preserve"> + </w:t>
+      </w:r>
+      <w:r>
+        <w:rPr>
+          <w:rFonts w:ascii="Consolas" w:eastAsia="Consolas" w:hAnsi="Consolas" w:cs="Consolas"/>
+        </w:rPr>
+        <w:t xml:space="preserve">@AutoConfigureMockMvc</w:t>
+      </w:r>
+      <w:r>
+        <w:t xml:space="preserve"> gửi request HTTP giả qua đúng các lớp thật: security, </w:t>
+      </w:r>
+      <w:r>
+        <w:rPr>
+          <w:rFonts w:ascii="Consolas" w:eastAsia="Consolas" w:hAnsi="Consolas" w:cs="Consolas"/>
+        </w:rPr>
+        <w:t xml:space="preserve">CurrentUser</w:t>
+      </w:r>
+      <w:r>
+        <w:t xml:space="preserve">, service, PostgreSQL, error handler, Jackson. Chọn thay cho </w:t>
+      </w:r>
+      <w:r>
+        <w:rPr>
+          <w:rFonts w:ascii="Consolas" w:eastAsia="Consolas" w:hAnsi="Consolas" w:cs="Consolas"/>
+        </w:rPr>
+        <w:t xml:space="preserve">@WebMvcTest</w:t>
+      </w:r>
+      <w:r>
+        <w:t xml:space="preserve"> với service giả vì test cô lập dữ liệu phải chạy trên dữ liệu thật; với service giả, test chỉ kiểm tra cái mock.</w:t>
+      </w:r>
+    </w:p>
+    <w:p>
+      <w:pPr>
+        <w:pStyle w:val="ListParagraph"/>
+        <w:numPr>
+          <w:ilvl w:val="0"/>
+          <w:numId w:val="1"/>
+        </w:numPr>
+      </w:pPr>
+      <w:r>
+        <w:rPr>
+          <w:b/>
+          <w:bCs/>
+        </w:rPr>
+        <w:t xml:space="preserve">Ghim thời điểm bằng SQL:</w:t>
+      </w:r>
+      <w:r>
+        <w:t xml:space="preserve"> </w:t>
+      </w:r>
+      <w:r>
+        <w:rPr>
+          <w:rFonts w:ascii="Consolas" w:eastAsia="Consolas" w:hAnsi="Consolas" w:cs="Consolas"/>
+        </w:rPr>
+        <w:t xml:space="preserve">@PrePersist</w:t>
+      </w:r>
+      <w:r>
+        <w:t xml:space="preserve"> điền </w:t>
+      </w:r>
+      <w:r>
+        <w:rPr>
+          <w:rFonts w:ascii="Consolas" w:eastAsia="Consolas" w:hAnsi="Consolas" w:cs="Consolas"/>
+        </w:rPr>
+        <w:t xml:space="preserve">created_at</w:t>
+      </w:r>
+      <w:r>
+        <w:t xml:space="preserve"> bằng giờ thật nên không biết trước. Test ghi đè bằng </w:t>
+      </w:r>
+      <w:r>
+        <w:rPr>
+          <w:rFonts w:ascii="Consolas" w:eastAsia="Consolas" w:hAnsi="Consolas" w:cs="Consolas"/>
+        </w:rPr>
+        <w:t xml:space="preserve">UPDATE connected_account SET created_at = ?</w:t>
+      </w:r>
+      <w:r>
+        <w:t xml:space="preserve"> để biết chắc thứ tự và chuỗi JSON mong đợi (</w:t>
+      </w:r>
+      <w:r>
+        <w:rPr>
+          <w:rFonts w:ascii="Consolas" w:eastAsia="Consolas" w:hAnsi="Consolas" w:cs="Consolas"/>
+        </w:rPr>
+        <w:t xml:space="preserve">2026-10-05T03:15:00Z</w:t>
+      </w:r>
+      <w:r>
+        <w:t xml:space="preserve">). Account "mới hơn" được tạo </w:t>
+      </w:r>
+      <w:r>
+        <w:rPr>
+          <w:b/>
+          <w:bCs/>
+        </w:rPr>
+        <w:t xml:space="preserve">trước</w:t>
+      </w:r>
+      <w:r>
+        <w:t xml:space="preserve">, để test thứ tự không thể xanh chỉ nhờ thứ tự chèn.</w:t>
+      </w:r>
+    </w:p>
+    <w:p>
+      <w:pPr>
+        <w:pStyle w:val="ListParagraph"/>
+        <w:numPr>
+          <w:ilvl w:val="0"/>
+          <w:numId w:val="1"/>
+        </w:numPr>
+      </w:pPr>
+      <w:r>
+        <w:rPr>
+          <w:rFonts w:ascii="Consolas" w:eastAsia="Consolas" w:hAnsi="Consolas" w:cs="Consolas"/>
+          <w:b/>
+          <w:bCs/>
+        </w:rPr>
+        <w:t xml:space="preserve">JsonPath.read(body, "$")</w:t>
+      </w:r>
+      <w:r>
+        <w:rPr>
+          <w:b/>
+          <w:bCs/>
+        </w:rPr>
+        <w:t xml:space="preserve">:</w:t>
+      </w:r>
+      <w:r>
+        <w:t xml:space="preserve"> đọc JSON thành </w:t>
+      </w:r>
+      <w:r>
+        <w:rPr>
+          <w:rFonts w:ascii="Consolas" w:eastAsia="Consolas" w:hAnsi="Consolas" w:cs="Consolas"/>
+        </w:rPr>
+        <w:t xml:space="preserve">Map</w:t>
+      </w:r>
+      <w:r>
+        <w:t xml:space="preserve"> để so tập tên trường.</w:t>
+      </w:r>
+    </w:p>
+    <w:p>
+      <w:pPr>
+        <w:pStyle w:val="ListParagraph"/>
+        <w:numPr>
+          <w:ilvl w:val="0"/>
+          <w:numId w:val="1"/>
+        </w:numPr>
+      </w:pPr>
+      <w:r>
+        <w:rPr>
+          <w:rFonts w:ascii="Consolas" w:eastAsia="Consolas" w:hAnsi="Consolas" w:cs="Consolas"/>
+          <w:b/>
+          <w:bCs/>
+        </w:rPr>
+        <w:t xml:space="preserve">@ApplicationModuleTest(mode = DIRECT_DEPENDENCIES)</w:t>
+      </w:r>
+      <w:r>
+        <w:rPr>
+          <w:b/>
+          <w:bCs/>
+        </w:rPr>
+        <w:t xml:space="preserve"> (Spring Modulith, BE-14):</w:t>
+      </w:r>
+      <w:r>
+        <w:t xml:space="preserve"> chỉ khởi động module </w:t>
+      </w:r>
+      <w:r>
+        <w:rPr>
+          <w:rFonts w:ascii="Consolas" w:eastAsia="Consolas" w:hAnsi="Consolas" w:cs="Consolas"/>
+        </w:rPr>
+        <w:t xml:space="preserve">account</w:t>
+      </w:r>
+      <w:r>
+        <w:t xml:space="preserve"> cộng các module nó dùng trực tiếp, không phải cả ứng dụng. Lúc làm BE-14 đó chỉ là </w:t>
+      </w:r>
+      <w:r>
+        <w:rPr>
+          <w:rFonts w:ascii="Consolas" w:eastAsia="Consolas" w:hAnsi="Consolas" w:cs="Consolas"/>
+        </w:rPr>
+        <w:t xml:space="preserve">provider</w:t>
+      </w:r>
+      <w:r>
+        <w:t xml:space="preserve">; từ BE-15, </w:t>
+      </w:r>
+      <w:r>
+        <w:rPr>
+          <w:rFonts w:ascii="Consolas" w:eastAsia="Consolas" w:hAnsi="Consolas" w:cs="Consolas"/>
+        </w:rPr>
+        <w:t xml:space="preserve">account</w:t>
+      </w:r>
+      <w:r>
+        <w:t xml:space="preserve"> dùng thêm </w:t>
+      </w:r>
+      <w:r>
+        <w:rPr>
+          <w:rFonts w:ascii="Consolas" w:eastAsia="Consolas" w:hAnsi="Consolas" w:cs="Consolas"/>
+        </w:rPr>
+        <w:t xml:space="preserve">CurrentUser</w:t>
+      </w:r>
+      <w:r>
+        <w:t xml:space="preserve"> (module </w:t>
+      </w:r>
+      <w:r>
+        <w:rPr>
+          <w:rFonts w:ascii="Consolas" w:eastAsia="Consolas" w:hAnsi="Consolas" w:cs="Consolas"/>
+        </w:rPr>
+        <w:t xml:space="preserve">identity</w:t>
+      </w:r>
+      <w:r>
+        <w:t xml:space="preserve">) và mã lỗi của </w:t>
+      </w:r>
+      <w:r>
+        <w:rPr>
+          <w:rFonts w:ascii="Consolas" w:eastAsia="Consolas" w:hAnsi="Consolas" w:cs="Consolas"/>
+        </w:rPr>
+        <w:t xml:space="preserve">common</w:t>
+      </w:r>
+      <w:r>
+        <w:t xml:space="preserve">, nên hai module này cũng được nạp. Test vẫn tự dọn bảng và tự chèn owner của nó vào </w:t>
+      </w:r>
+      <w:r>
+        <w:rPr>
+          <w:rFonts w:ascii="Consolas" w:eastAsia="Consolas" w:hAnsi="Consolas" w:cs="Consolas"/>
+        </w:rPr>
+        <w:t xml:space="preserve">app_user</w:t>
+      </w:r>
+      <w:r>
+        <w:t xml:space="preserve"> bằng </w:t>
+      </w:r>
+      <w:r>
+        <w:rPr>
+          <w:rFonts w:ascii="Consolas" w:eastAsia="Consolas" w:hAnsi="Consolas" w:cs="Consolas"/>
+        </w:rPr>
+        <w:t xml:space="preserve">JdbcTemplate</w:t>
+      </w:r>
+      <w:r>
+        <w:t xml:space="preserve">, nên không phụ thuộc owner được tạo lúc khởi động.</w:t>
+      </w:r>
+    </w:p>
+    <w:p>
+      <w:pPr>
+        <w:pStyle w:val="ListParagraph"/>
+        <w:numPr>
+          <w:ilvl w:val="0"/>
+          <w:numId w:val="1"/>
+        </w:numPr>
+      </w:pPr>
+      <w:r>
+        <w:rPr>
+          <w:b/>
+          <w:bCs/>
+        </w:rPr>
+        <w:t xml:space="preserve">Test không có </w:t>
+      </w:r>
+      <w:r>
+        <w:rPr>
+          <w:rFonts w:ascii="Consolas" w:eastAsia="Consolas" w:hAnsi="Consolas" w:cs="Consolas"/>
+          <w:b/>
+          <w:bCs/>
+        </w:rPr>
+        <w:t xml:space="preserve">@Transactional</w:t>
+      </w:r>
+      <w:r>
+        <w:rPr>
+          <w:b/>
+          <w:bCs/>
+        </w:rPr>
+        <w:t xml:space="preserve">:</w:t>
+      </w:r>
+      <w:r>
+        <w:t xml:space="preserve"> để service tự commit hoặc rollback như khi chạy thật. Cái giá là dữ liệu ở lại sau mỗi test, nên </w:t>
+      </w:r>
+      <w:r>
+        <w:rPr>
+          <w:rFonts w:ascii="Consolas" w:eastAsia="Consolas" w:hAnsi="Consolas" w:cs="Consolas"/>
+        </w:rPr>
+        <w:t xml:space="preserve">@BeforeEach</w:t>
+      </w:r>
+      <w:r>
+        <w:t xml:space="preserve"> tự dọn bảng bằng </w:t>
+      </w:r>
+      <w:r>
+        <w:rPr>
+          <w:rFonts w:ascii="Consolas" w:eastAsia="Consolas" w:hAnsi="Consolas" w:cs="Consolas"/>
+        </w:rPr>
+        <w:t xml:space="preserve">JdbcTestUtils.deleteFromTables</w:t>
+      </w:r>
+      <w:r>
+        <w:t xml:space="preserve">.</w:t>
+      </w:r>
+    </w:p>
+    <w:p>
+      <w:pPr>
+        <w:pStyle w:val="ListParagraph"/>
+        <w:numPr>
+          <w:ilvl w:val="0"/>
+          <w:numId w:val="1"/>
+        </w:numPr>
+      </w:pPr>
+      <w:r>
+        <w:rPr>
+          <w:rFonts w:ascii="Consolas" w:eastAsia="Consolas" w:hAnsi="Consolas" w:cs="Consolas"/>
+          <w:b/>
+          <w:bCs/>
+        </w:rPr>
+        <w:t xml:space="preserve">AssertablePublishedEvents</w:t>
+      </w:r>
+      <w:r>
+        <w:rPr>
+          <w:b/>
+          <w:bCs/>
+        </w:rPr>
+        <w:t xml:space="preserve"> làm tham số của method test:</w:t>
+      </w:r>
+      <w:r>
+        <w:t xml:space="preserve"> Spring Modulith ghi lại mọi event được publish trong test đó; </w:t>
+      </w:r>
+      <w:r>
+        <w:rPr>
+          <w:rFonts w:ascii="Consolas" w:eastAsia="Consolas" w:hAnsi="Consolas" w:cs="Consolas"/>
+        </w:rPr>
+        <w:t xml:space="preserve">events.ofType(AccountConnected.class)</w:t>
+      </w:r>
+      <w:r>
+        <w:t xml:space="preserve"> lấy ra để kiểm tra số lượng và nội dung.</w:t>
+      </w:r>
+    </w:p>
+    <w:p>
+      <w:pPr>
+        <w:pStyle w:val="ListParagraph"/>
+        <w:numPr>
+          <w:ilvl w:val="0"/>
+          <w:numId w:val="1"/>
+        </w:numPr>
+      </w:pPr>
+      <w:r>
+        <w:rPr>
+          <w:rFonts w:ascii="Consolas" w:eastAsia="Consolas" w:hAnsi="Consolas" w:cs="Consolas"/>
+          <w:b/>
+          <w:bCs/>
+        </w:rPr>
+        <w:t xml:space="preserve">@MockitoSpyBean</w:t>
+      </w:r>
+      <w:r>
+        <w:rPr>
+          <w:b/>
+          <w:bCs/>
+        </w:rPr>
+        <w:t xml:space="preserve">:</w:t>
+      </w:r>
+      <w:r>
+        <w:t xml:space="preserve"> bọc bean thật. Bình thường nó chạy code thật; riêng một test bảo nó ném lỗi bằng </w:t>
+      </w:r>
+      <w:r>
+        <w:rPr>
+          <w:rFonts w:ascii="Consolas" w:eastAsia="Consolas" w:hAnsi="Consolas" w:cs="Consolas"/>
+        </w:rPr>
+        <w:t xml:space="preserve">doThrow(...).when(credentials).save(any(), any(), any())</w:t>
+      </w:r>
+      <w:r>
+        <w:t xml:space="preserve">, để giả lập "lưu credential thất bại" mà không sửa code production. Assertion vẫn kiểm tra DB thật, không kiểm tra mock.</w:t>
+      </w:r>
+    </w:p>
+    <w:p>
+      <w:pPr>
+        <w:pStyle w:val="ListParagraph"/>
+        <w:numPr>
+          <w:ilvl w:val="0"/>
+          <w:numId w:val="1"/>
+        </w:numPr>
+      </w:pPr>
+      <w:r>
+        <w:rPr>
+          <w:b/>
+          <w:bCs/>
+        </w:rPr>
+        <w:t xml:space="preserve">Bean riêng cho test:</w:t>
+      </w:r>
+      <w:r>
+        <w:t xml:space="preserve"> một class </w:t>
+      </w:r>
+      <w:r>
+        <w:rPr>
+          <w:rFonts w:ascii="Consolas" w:eastAsia="Consolas" w:hAnsi="Consolas" w:cs="Consolas"/>
+        </w:rPr>
+        <w:t xml:space="preserve">@TestConfiguration</w:t>
+      </w:r>
+      <w:r>
+        <w:t xml:space="preserve"> lồng trong class test tạo </w:t>
+      </w:r>
+      <w:r>
+        <w:rPr>
+          <w:rFonts w:ascii="Consolas" w:eastAsia="Consolas" w:hAnsi="Consolas" w:cs="Consolas"/>
+        </w:rPr>
+        <w:t xml:space="preserve">FakeMessageProvider</w:t>
+      </w:r>
+      <w:r>
+        <w:t xml:space="preserve"> loại </w:t>
+      </w:r>
+      <w:r>
+        <w:rPr>
+          <w:rFonts w:ascii="Consolas" w:eastAsia="Consolas" w:hAnsi="Consolas" w:cs="Consolas"/>
+        </w:rPr>
+        <w:t xml:space="preserve">fake</w:t>
+      </w:r>
+      <w:r>
+        <w:t xml:space="preserve"> làm bean, để </w:t>
+      </w:r>
+      <w:r>
+        <w:rPr>
+          <w:rFonts w:ascii="Consolas" w:eastAsia="Consolas" w:hAnsi="Consolas" w:cs="Consolas"/>
+        </w:rPr>
+        <w:t xml:space="preserve">ProviderRegistry</w:t>
+      </w:r>
+      <w:r>
+        <w:t xml:space="preserve"> thấy provider này.</w:t>
+      </w:r>
+    </w:p>
+    <w:p>
+      <w:pPr>
+        <w:pStyle w:val="ListParagraph"/>
+        <w:numPr>
+          <w:ilvl w:val="0"/>
+          <w:numId w:val="1"/>
+        </w:numPr>
+      </w:pPr>
+      <w:r>
+        <w:rPr>
+          <w:rFonts w:ascii="Consolas" w:eastAsia="Consolas" w:hAnsi="Consolas" w:cs="Consolas"/>
+          <w:b/>
+          <w:bCs/>
+        </w:rPr>
+        <w:t xml:space="preserve">row_to_json(c)::text</w:t>
+      </w:r>
+      <w:r>
+        <w:rPr>
+          <w:b/>
+          <w:bCs/>
+        </w:rPr>
+        <w:t xml:space="preserve"> của PostgreSQL:</w:t>
+      </w:r>
+      <w:r>
+        <w:t xml:space="preserve"> biến cả một dòng thành chuỗi JSON để kiểm tra bằng một lệnh rằng </w:t>
+      </w:r>
+      <w:r>
+        <w:rPr>
+          <w:b/>
+          <w:bCs/>
+        </w:rPr>
+        <w:t xml:space="preserve">không cột nào</w:t>
+      </w:r>
+      <w:r>
+        <w:t xml:space="preserve"> chứa token dạng chữ.</w:t>
+      </w:r>
+    </w:p>
+    <w:p>
+      <w:pPr>
+        <w:pStyle w:val="ListParagraph"/>
+        <w:numPr>
+          <w:ilvl w:val="0"/>
+          <w:numId w:val="1"/>
+        </w:numPr>
+      </w:pPr>
+      <w:r>
+        <w:rPr>
+          <w:rFonts w:ascii="Consolas" w:eastAsia="Consolas" w:hAnsi="Consolas" w:cs="Consolas"/>
+          <w:b/>
+          <w:bCs/>
+        </w:rPr>
+        <w:t xml:space="preserve">entityManager.flush()</w:t>
+      </w:r>
+      <w:r>
+        <w:rPr>
+          <w:b/>
+          <w:bCs/>
+        </w:rPr>
+        <w:t xml:space="preserve"> để lộ lỗi:</w:t>
+      </w:r>
+      <w:r>
+        <w:t xml:space="preserve"> trong </w:t>
+      </w:r>
+      <w:r>
+        <w:rPr>
+          <w:rFonts w:ascii="Consolas" w:eastAsia="Consolas" w:hAnsi="Consolas" w:cs="Consolas"/>
+        </w:rPr>
+        <w:t xml:space="preserve">@DataJpaTest</w:t>
+      </w:r>
+      <w:r>
+        <w:t xml:space="preserve">, lệnh ghi chỉ thật sự xuống DB khi flush. Muốn thấy lỗi khóa ngoại thì phải flush ngay trong đoạn code đang chờ lỗi; test còn kiểm tra cả stack trace của lỗi đó không chứa token.</w:t>
+      </w:r>
+    </w:p>
+    <w:p>
+      <w:pPr>
+        <w:pBdr>
+          <w:bottom w:val="single" w:sz="4" w:space="0" w:color="auto"/>
+        </w:pBdr>
+        <w:ind w:left="0"/>
+      </w:pPr>
+    </w:p>
+    <w:p>
+      <w:pPr>
+        <w:pStyle w:val="Heading2"/>
+      </w:pPr>
+      <w:r>
+        <w:t xml:space="preserve">23. Tự kiểm tra F02 (phần đã làm)</w:t>
       </w:r>
     </w:p>
     <w:p>
@@ -14385,6 +15154,63 @@
       </w:r>
       <w:r>
         <w:t xml:space="preserve">?</w:t>
+      </w:r>
+    </w:p>
+    <w:p>
+      <w:pPr>
+        <w:pStyle w:val="ListParagraph"/>
+        <w:numPr>
+          <w:ilvl w:val="0"/>
+          <w:numId w:val="101"/>
+        </w:numPr>
+      </w:pPr>
+      <w:r>
+        <w:t xml:space="preserve">Xóa mềm khác xóa cứng thế nào, và cái giá phải trả là gì?</w:t>
+      </w:r>
+    </w:p>
+    <w:p>
+      <w:pPr>
+        <w:pStyle w:val="ListParagraph"/>
+        <w:numPr>
+          <w:ilvl w:val="0"/>
+          <w:numId w:val="101"/>
+        </w:numPr>
+      </w:pPr>
+      <w:r>
+        <w:t xml:space="preserve">Account chỉ bị xóa mềm, vậy vì sao credential lại bị xóa hẳn?</w:t>
+      </w:r>
+    </w:p>
+    <w:p>
+      <w:pPr>
+        <w:pStyle w:val="ListParagraph"/>
+        <w:numPr>
+          <w:ilvl w:val="0"/>
+          <w:numId w:val="101"/>
+        </w:numPr>
+      </w:pPr>
+      <w:r>
+        <w:t xml:space="preserve">Vì sao không dùng </w:t>
+      </w:r>
+      <w:r>
+        <w:rPr>
+          <w:rFonts w:ascii="Consolas" w:eastAsia="Consolas" w:hAnsi="Consolas" w:cs="Consolas"/>
+        </w:rPr>
+        <w:t xml:space="preserve">@SQLRestriction</w:t>
+      </w:r>
+      <w:r>
+        <w:t xml:space="preserve"> để tự lọc account đã xóa?</w:t>
+      </w:r>
+    </w:p>
+    <w:p>
+      <w:pPr>
+        <w:pStyle w:val="ListParagraph"/>
+        <w:numPr>
+          <w:ilvl w:val="0"/>
+          <w:numId w:val="101"/>
+        </w:numPr>
+      </w:pPr>
+      <w:r>
+        <w:t xml:space="preserve">Xóa một account rồi kết nối lại đúng tài khoản Gmail đó thì ID, sync và credential ra sao?</w:t>
       </w:r>
     </w:p>
     <w:p>
@@ -14393,7 +15219,7 @@
           <w:i/>
           <w:iCs/>
         </w:rPr>
-        <w:t xml:space="preserve">(Phần BE-17…BE-18 — xóa account, nghiệm thu — sẽ được bổ sung khi làm.)</w:t>
+        <w:t xml:space="preserve">(Phần BE-18 — kiểm tra end-to-end và nghiệm thu F02 — sẽ được bổ sung khi làm.)</w:t>
       </w:r>
     </w:p>
     <w:sectPr>

</xml_diff>

<commit_message>
docs(knowledge): add BE-18 (F02 acceptance) and the five F02 answers
New section 22 explains the end-to-end test that hunts for leaked
tokens (DEBUG logging on purpose, checking that the log really ran, the
TestDispatcherServlet pitfall), psql run inside the database container,
how a test written after the code is shown able to fail, and how the
Definition of Done is ticked with evidence before the change is
archived. The self-check section gains two questions and short answers
to the five F02 questions BE-18 asked for (AES-GCM/IV/AAD, key
rotation, provider call outside the transaction, the state table,
delete then reconnect). The Word copy is regenerated (docs check clean)
and the new pages were inspected.

Co-Authored-By: Claude Opus 5.5 (1M context) <noreply@anthropic.com>
</commit_message>
<xml_diff>
--- a/docs/knowledge/phase-0-backend-foundation.docx
+++ b/docs/knowledge/phase-0-backend-foundation.docx
@@ -97,7 +97,7 @@
         <w:t xml:space="preserve">Phạm vi:</w:t>
       </w:r>
       <w:r>
-        <w:t xml:space="preserve"> F01 Project Foundation và F03 Provider Contract (mục 0–12); F02 Connected Accounts (mục 13–23, đang làm: xong BE-09…BE-17).</w:t>
+        <w:t xml:space="preserve"> F01 Project Foundation và F03 Provider Contract (mục 0–12); F02 Connected Accounts (mục 13–24, xong BE-09…BE-18, nghiệm thu và archive 2026-10-07).</w:t>
         <w:br/>
       </w:r>
       <w:r>
@@ -7397,7 +7397,7 @@
           </w:tcPr>
           <w:p>
             <w:r>
-              <w:t xml:space="preserve">chưa làm</w:t>
+              <w:t xml:space="preserve">xong</w:t>
             </w:r>
           </w:p>
         </w:tc>
@@ -13423,55 +13423,136 @@
         <w:pStyle w:val="Heading2"/>
       </w:pPr>
       <w:r>
-        <w:t xml:space="preserve">22. Kỹ thuật test mới trong F02</w:t>
-      </w:r>
-    </w:p>
-    <w:p>
-      <w:pPr>
-        <w:pStyle w:val="ListParagraph"/>
-        <w:numPr>
-          <w:ilvl w:val="0"/>
-          <w:numId w:val="1"/>
-        </w:numPr>
-      </w:pPr>
-      <w:r>
-        <w:rPr>
-          <w:rFonts w:ascii="Consolas" w:eastAsia="Consolas" w:hAnsi="Consolas" w:cs="Consolas"/>
-          <w:b/>
-          <w:bCs/>
-        </w:rPr>
-        <w:t xml:space="preserve">@DataJpaTest</w:t>
-      </w:r>
-      <w:r>
-        <w:rPr>
-          <w:b/>
-          <w:bCs/>
-        </w:rPr>
-        <w:t xml:space="preserve"> + </w:t>
-      </w:r>
-      <w:r>
-        <w:rPr>
-          <w:rFonts w:ascii="Consolas" w:eastAsia="Consolas" w:hAnsi="Consolas" w:cs="Consolas"/>
-          <w:b/>
-          <w:bCs/>
-        </w:rPr>
-        <w:t xml:space="preserve">@AutoConfigureTestDatabase(replace = NONE)</w:t>
-      </w:r>
-      <w:r>
-        <w:rPr>
-          <w:b/>
-          <w:bCs/>
-        </w:rPr>
-        <w:t xml:space="preserve">:</w:t>
-      </w:r>
-      <w:r>
-        <w:t xml:space="preserve"> slice chỉ nạp JPA và Flyway, chạy trên PostgreSQL thật (Testcontainers) để </w:t>
-      </w:r>
-      <w:r>
-        <w:rPr>
-          <w:rFonts w:ascii="Consolas" w:eastAsia="Consolas" w:hAnsi="Consolas" w:cs="Consolas"/>
-        </w:rPr>
-        <w:t xml:space="preserve">CHECK</w:t>
+        <w:t xml:space="preserve">22. Nghiệm thu F02: một test đi hết vòng đời (BE-18)</w:t>
+      </w:r>
+    </w:p>
+    <w:p>
+      <w:pPr>
+        <w:pStyle w:val="Heading3"/>
+      </w:pPr>
+      <w:r>
+        <w:t xml:space="preserve">22.1 Test end-to-end săn token bị lộ</w:t>
+      </w:r>
+    </w:p>
+    <w:p>
+      <w:pPr>
+        <w:pStyle w:val="ListParagraph"/>
+        <w:numPr>
+          <w:ilvl w:val="0"/>
+          <w:numId w:val="1"/>
+        </w:numPr>
+      </w:pPr>
+      <w:r>
+        <w:rPr>
+          <w:b/>
+          <w:bCs/>
+        </w:rPr>
+        <w:t xml:space="preserve">Ở đâu:</w:t>
+      </w:r>
+      <w:r>
+        <w:t xml:space="preserve"> </w:t>
+      </w:r>
+      <w:r>
+        <w:rPr>
+          <w:rFonts w:ascii="Consolas" w:eastAsia="Consolas" w:hAnsi="Consolas" w:cs="Consolas"/>
+        </w:rPr>
+        <w:t xml:space="preserve">src/test/java/dev/sino/account/AccountLifecycleEndToEndTests.java</w:t>
+      </w:r>
+      <w:r>
+        <w:t xml:space="preserve">.</w:t>
+      </w:r>
+    </w:p>
+    <w:p>
+      <w:pPr>
+        <w:pStyle w:val="ListParagraph"/>
+        <w:numPr>
+          <w:ilvl w:val="0"/>
+          <w:numId w:val="1"/>
+        </w:numPr>
+      </w:pPr>
+      <w:r>
+        <w:rPr>
+          <w:b/>
+          <w:bCs/>
+        </w:rPr>
+        <w:t xml:space="preserve">Là gì:</w:t>
+      </w:r>
+      <w:r>
+        <w:t xml:space="preserve"> một test chạy cả ứng dụng (PostgreSQL thật), đưa </w:t>
+      </w:r>
+      <w:r>
+        <w:rPr>
+          <w:b/>
+          <w:bCs/>
+        </w:rPr>
+        <w:t xml:space="preserve">một</w:t>
+      </w:r>
+      <w:r>
+        <w:t xml:space="preserve"> account đi hết vòng đời với token mẫu, rồi tìm token đó ở mọi nơi nó có thể lộ ra.</w:t>
+      </w:r>
+    </w:p>
+    <w:p>
+      <w:pPr>
+        <w:shd w:val="clear" w:color="auto" w:fill="F2F3F5"/>
+        <w:ind w:left="0"/>
+      </w:pPr>
+      <w:r>
+        <w:rPr>
+          <w:rFonts w:ascii="Consolas" w:eastAsia="Consolas" w:hAnsi="Consolas" w:cs="Consolas"/>
+          <w:sz w:val="19"/>
+          <w:szCs w:val="19"/>
+        </w:rPr>
+        <w:t xml:space="preserve">register (use case, như F04 sẽ gọi)    token mẫu đi vào</w:t>
+        <w:br/>
+        <w:t xml:space="preserve">  -&gt; psql trong container DB           cột *_enc chỉ có ciphertext</w:t>
+        <w:br/>
+        <w:t xml:space="preserve">  -&gt; GET /api/accounts                 \</w:t>
+        <w:br/>
+        <w:t xml:space="preserve">  -&gt; GET /api/accounts/{id}             |  5 response:</w:t>
+        <w:br/>
+        <w:t xml:space="preserve">  -&gt; PATCH (đổi tên + tắt)              |  không có token, không có scope</w:t>
+        <w:br/>
+        <w:t xml:space="preserve">  -&gt; DELETE                             |</w:t>
+        <w:br/>
+        <w:t xml:space="preserve">  -&gt; GET /api/accounts/{id} -&gt; 404     /</w:t>
+        <w:br/>
+        <w:t xml:space="preserve">  -&gt; credential: 0 dòng, account: còn, có removed_at</w:t>
+        <w:br/>
+        <w:t xml:space="preserve">  -&gt; toàn bộ log của test: không có token</w:t>
+      </w:r>
+    </w:p>
+    <w:p>
+      <w:pPr>
+        <w:pStyle w:val="ListParagraph"/>
+        <w:numPr>
+          <w:ilvl w:val="0"/>
+          <w:numId w:val="1"/>
+        </w:numPr>
+      </w:pPr>
+      <w:r>
+        <w:rPr>
+          <w:b/>
+          <w:bCs/>
+        </w:rPr>
+        <w:t xml:space="preserve">Bật log DEBUG trong test:</w:t>
+      </w:r>
+      <w:r>
+        <w:t xml:space="preserve"> </w:t>
+      </w:r>
+      <w:r>
+        <w:rPr>
+          <w:rFonts w:ascii="Consolas" w:eastAsia="Consolas" w:hAnsi="Consolas" w:cs="Consolas"/>
+        </w:rPr>
+        <w:t xml:space="preserve">@SpringBootTest(properties = {"logging.level.dev.sino=DEBUG", ...})</w:t>
+      </w:r>
+      <w:r>
+        <w:t xml:space="preserve"> cho </w:t>
+      </w:r>
+      <w:r>
+        <w:rPr>
+          <w:rFonts w:ascii="Consolas" w:eastAsia="Consolas" w:hAnsi="Consolas" w:cs="Consolas"/>
+        </w:rPr>
+        <w:t xml:space="preserve">dev.sino</w:t>
       </w:r>
       <w:r>
         <w:t xml:space="preserve">, </w:t>
@@ -13480,178 +13561,273 @@
         <w:rPr>
           <w:rFonts w:ascii="Consolas" w:eastAsia="Consolas" w:hAnsi="Consolas" w:cs="Consolas"/>
         </w:rPr>
-        <w:t xml:space="preserve">UNIQUE</w:t>
-      </w:r>
-      <w:r>
-        <w:t xml:space="preserve">, khóa ngoại hoạt động như production. Mỗi test tự rollback.</w:t>
-      </w:r>
-    </w:p>
-    <w:p>
-      <w:pPr>
-        <w:pStyle w:val="ListParagraph"/>
-        <w:numPr>
-          <w:ilvl w:val="0"/>
-          <w:numId w:val="1"/>
-        </w:numPr>
-      </w:pPr>
-      <w:r>
-        <w:rPr>
-          <w:rFonts w:ascii="Consolas" w:eastAsia="Consolas" w:hAnsi="Consolas" w:cs="Consolas"/>
-          <w:b/>
-          <w:bCs/>
-        </w:rPr>
-        <w:t xml:space="preserve">entityManager.clear()</w:t>
-      </w:r>
-      <w:r>
-        <w:rPr>
-          <w:b/>
-          <w:bCs/>
-        </w:rPr>
-        <w:t xml:space="preserve">:</w:t>
-      </w:r>
-      <w:r>
-        <w:t xml:space="preserve"> xóa bộ nhớ đệm của Hibernate để lần đọc sau thật sự đi xuống DB. Không có nó, test chỉ đọc lại object trong bộ nhớ.</w:t>
-      </w:r>
-    </w:p>
-    <w:p>
-      <w:pPr>
-        <w:pStyle w:val="ListParagraph"/>
-        <w:numPr>
-          <w:ilvl w:val="0"/>
-          <w:numId w:val="1"/>
-        </w:numPr>
-      </w:pPr>
-      <w:r>
-        <w:rPr>
-          <w:rFonts w:ascii="Consolas" w:eastAsia="Consolas" w:hAnsi="Consolas" w:cs="Consolas"/>
-          <w:b/>
-          <w:bCs/>
-        </w:rPr>
-        <w:t xml:space="preserve">JdbcTemplate</w:t>
-      </w:r>
-      <w:r>
-        <w:rPr>
-          <w:b/>
-          <w:bCs/>
-        </w:rPr>
-        <w:t xml:space="preserve">:</w:t>
-      </w:r>
-      <w:r>
-        <w:t xml:space="preserve"> chạy SQL thô để nhìn đúng cái nằm trong DB, hoặc để thử ràng buộc mà Java không tạo ra được (ví dụ ghi </w:t>
-      </w:r>
-      <w:r>
-        <w:rPr>
-          <w:rFonts w:ascii="Consolas" w:eastAsia="Consolas" w:hAnsi="Consolas" w:cs="Consolas"/>
-        </w:rPr>
-        <w:t xml:space="preserve">status = 'SYNCING'</w:t>
-      </w:r>
-      <w:r>
-        <w:t xml:space="preserve">).</w:t>
-      </w:r>
-    </w:p>
-    <w:p>
-      <w:pPr>
-        <w:pStyle w:val="ListParagraph"/>
-        <w:numPr>
-          <w:ilvl w:val="0"/>
-          <w:numId w:val="1"/>
-        </w:numPr>
-      </w:pPr>
-      <w:r>
-        <w:rPr>
-          <w:rFonts w:ascii="Consolas" w:eastAsia="Consolas" w:hAnsi="Consolas" w:cs="Consolas"/>
-          <w:b/>
-          <w:bCs/>
-        </w:rPr>
-        <w:t xml:space="preserve">ApplicationContextRunner</w:t>
-      </w:r>
-      <w:r>
-        <w:rPr>
-          <w:b/>
-          <w:bCs/>
-        </w:rPr>
-        <w:t xml:space="preserve"> cho kiểm tra khởi động:</w:t>
-      </w:r>
-      <w:r>
-        <w:t xml:space="preserve"> dựng một context nhỏ với cấu hình sai để chứng minh app </w:t>
-      </w:r>
-      <w:r>
-        <w:rPr>
-          <w:b/>
-          <w:bCs/>
-        </w:rPr>
-        <w:t xml:space="preserve">không</w:t>
-      </w:r>
-      <w:r>
-        <w:t xml:space="preserve"> start và thông báo không lộ secret.</w:t>
-      </w:r>
-    </w:p>
-    <w:p>
-      <w:pPr>
-        <w:pStyle w:val="ListParagraph"/>
-        <w:numPr>
-          <w:ilvl w:val="0"/>
-          <w:numId w:val="1"/>
-        </w:numPr>
-      </w:pPr>
-      <w:r>
-        <w:rPr>
-          <w:b/>
-          <w:bCs/>
-        </w:rPr>
-        <w:t xml:space="preserve">Mockito </w:t>
-      </w:r>
-      <w:r>
-        <w:rPr>
-          <w:rFonts w:ascii="Consolas" w:eastAsia="Consolas" w:hAnsi="Consolas" w:cs="Consolas"/>
-          <w:b/>
-          <w:bCs/>
-        </w:rPr>
-        <w:t xml:space="preserve">mock(...)</w:t>
-      </w:r>
-      <w:r>
-        <w:rPr>
-          <w:b/>
-          <w:bCs/>
-        </w:rPr>
-        <w:t xml:space="preserve"> trong unit test:</w:t>
+        <w:t xml:space="preserve">org.springframework.web</w:t>
+      </w:r>
+      <w:r>
+        <w:t xml:space="preserve">, </w:t>
+      </w:r>
+      <w:r>
+        <w:rPr>
+          <w:rFonts w:ascii="Consolas" w:eastAsia="Consolas" w:hAnsi="Consolas" w:cs="Consolas"/>
+        </w:rPr>
+        <w:t xml:space="preserve">org.hibernate.SQL</w:t>
+      </w:r>
+      <w:r>
+        <w:t xml:space="preserve">. Log càng nhiều thì càng nhiều chỗ có thể lộ: ở mức này Spring in cả nội dung response (</w:t>
+      </w:r>
+      <w:r>
+        <w:rPr>
+          <w:rFonts w:ascii="Consolas" w:eastAsia="Consolas" w:hAnsi="Consolas" w:cs="Consolas"/>
+        </w:rPr>
+        <w:t xml:space="preserve">Writing [AccountResponse[...]]</w:t>
+      </w:r>
+      <w:r>
+        <w:t xml:space="preserve">), còn Hibernate in mọi câu SQL. </w:t>
+      </w:r>
+      <w:r>
+        <w:rPr>
+          <w:rFonts w:ascii="Consolas" w:eastAsia="Consolas" w:hAnsi="Consolas" w:cs="Consolas"/>
+        </w:rPr>
+        <w:t xml:space="preserve">OutputCaptureExtension</w:t>
+      </w:r>
+      <w:r>
+        <w:t xml:space="preserve"> cùng tham số </w:t>
+      </w:r>
+      <w:r>
+        <w:rPr>
+          <w:rFonts w:ascii="Consolas" w:eastAsia="Consolas" w:hAnsi="Consolas" w:cs="Consolas"/>
+        </w:rPr>
+        <w:t xml:space="preserve">CapturedOutput</w:t>
+      </w:r>
+      <w:r>
+        <w:t xml:space="preserve"> gom mọi thứ in ra console để test kiểm tra.</w:t>
+      </w:r>
+    </w:p>
+    <w:p>
+      <w:pPr>
+        <w:pStyle w:val="ListParagraph"/>
+        <w:numPr>
+          <w:ilvl w:val="0"/>
+          <w:numId w:val="1"/>
+        </w:numPr>
+      </w:pPr>
+      <w:r>
+        <w:rPr>
+          <w:b/>
+          <w:bCs/>
+        </w:rPr>
+        <w:t xml:space="preserve">Kiểm tra rằng log thật sự chạy:</w:t>
+      </w:r>
+      <w:r>
+        <w:t xml:space="preserve"> nếu log bị tắt thì câu "log không có token" sẽ xanh mà không chứng minh được gì. Vì vậy test còn kiểm tra log </w:t>
+      </w:r>
+      <w:r>
+        <w:rPr>
+          <w:b/>
+          <w:bCs/>
+        </w:rPr>
+        <w:t xml:space="preserve">có</w:t>
+      </w:r>
+      <w:r>
+        <w:t xml:space="preserve"> chứa </w:t>
+      </w:r>
+      <w:r>
+        <w:rPr>
+          <w:rFonts w:ascii="Consolas" w:eastAsia="Consolas" w:hAnsi="Consolas" w:cs="Consolas"/>
+        </w:rPr>
+        <w:t xml:space="preserve">Mapped to ...AccountsController</w:t>
+      </w:r>
+      <w:r>
+        <w:t xml:space="preserve">, </w:t>
+      </w:r>
+      <w:r>
+        <w:rPr>
+          <w:rFonts w:ascii="Consolas" w:eastAsia="Consolas" w:hAnsi="Consolas" w:cs="Consolas"/>
+        </w:rPr>
+        <w:t xml:space="preserve">Writing [AccountResponse[</w:t>
+      </w:r>
+      <w:r>
+        <w:t xml:space="preserve"> và </w:t>
+      </w:r>
+      <w:r>
+        <w:rPr>
+          <w:rFonts w:ascii="Consolas" w:eastAsia="Consolas" w:hAnsi="Consolas" w:cs="Consolas"/>
+        </w:rPr>
+        <w:t xml:space="preserve">insert into account_credential</w:t>
+      </w:r>
+      <w:r>
+        <w:t xml:space="preserve">.</w:t>
+      </w:r>
+    </w:p>
+    <w:p>
+      <w:pPr>
+        <w:pStyle w:val="ListParagraph"/>
+        <w:numPr>
+          <w:ilvl w:val="0"/>
+          <w:numId w:val="1"/>
+        </w:numPr>
+      </w:pPr>
+      <w:r>
+        <w:rPr>
+          <w:b/>
+          <w:bCs/>
+        </w:rPr>
+        <w:t xml:space="preserve">Bẫy gặp phải:</w:t>
+      </w:r>
+      <w:r>
+        <w:t xml:space="preserve"> lần chạy đầu test đỏ vì tìm dòng </w:t>
+      </w:r>
+      <w:r>
+        <w:rPr>
+          <w:rFonts w:ascii="Consolas" w:eastAsia="Consolas" w:hAnsi="Consolas" w:cs="Consolas"/>
+        </w:rPr>
+        <w:t xml:space="preserve">GET "/api/accounts"</w:t>
+      </w:r>
+      <w:r>
+        <w:t xml:space="preserve">. MockMvc dùng </w:t>
+      </w:r>
+      <w:r>
+        <w:rPr>
+          <w:rFonts w:ascii="Consolas" w:eastAsia="Consolas" w:hAnsi="Consolas" w:cs="Consolas"/>
+        </w:rPr>
+        <w:t xml:space="preserve">TestDispatcherServlet</w:t>
+      </w:r>
+      <w:r>
+        <w:t xml:space="preserve">, mà logger của lớp này thuộc package </w:t>
+      </w:r>
+      <w:r>
+        <w:rPr>
+          <w:rFonts w:ascii="Consolas" w:eastAsia="Consolas" w:hAnsi="Consolas" w:cs="Consolas"/>
+        </w:rPr>
+        <w:t xml:space="preserve">org.springframework.test</w:t>
+      </w:r>
+      <w:r>
+        <w:t xml:space="preserve">, không phải </w:t>
+      </w:r>
+      <w:r>
+        <w:rPr>
+          <w:rFonts w:ascii="Consolas" w:eastAsia="Consolas" w:hAnsi="Consolas" w:cs="Consolas"/>
+        </w:rPr>
+        <w:t xml:space="preserve">org.springframework.web</w:t>
+      </w:r>
+      <w:r>
+        <w:t xml:space="preserve">, nên dòng đó không được in ra. Cách sửa là dựa vào các dòng log thật sự có trong output.</w:t>
+      </w:r>
+    </w:p>
+    <w:p>
+      <w:pPr>
+        <w:pStyle w:val="Heading3"/>
+      </w:pPr>
+      <w:r>
+        <w:t xml:space="preserve">22.2 psql thật, chạy trong container</w:t>
+      </w:r>
+    </w:p>
+    <w:p>
+      <w:pPr>
+        <w:pStyle w:val="ListParagraph"/>
+        <w:numPr>
+          <w:ilvl w:val="0"/>
+          <w:numId w:val="1"/>
+        </w:numPr>
+      </w:pPr>
+      <w:r>
+        <w:rPr>
+          <w:rFonts w:ascii="Consolas" w:eastAsia="Consolas" w:hAnsi="Consolas" w:cs="Consolas"/>
+        </w:rPr>
+        <w:t xml:space="preserve">postgres.execInContainer("psql", "-U", ..., "-c", "select ...")</w:t>
+      </w:r>
+      <w:r>
+        <w:t xml:space="preserve"> chạy chương trình </w:t>
+      </w:r>
+      <w:r>
+        <w:rPr>
+          <w:rFonts w:ascii="Consolas" w:eastAsia="Consolas" w:hAnsi="Consolas" w:cs="Consolas"/>
+        </w:rPr>
+        <w:t xml:space="preserve">psql</w:t>
       </w:r>
       <w:r>
         <w:t xml:space="preserve"> </w:t>
       </w:r>
       <w:r>
         <w:rPr>
-          <w:rFonts w:ascii="Consolas" w:eastAsia="Consolas" w:hAnsi="Consolas" w:cs="Consolas"/>
-        </w:rPr>
-        <w:t xml:space="preserve">OwnerCurrentUserTests</w:t>
-      </w:r>
-      <w:r>
-        <w:t xml:space="preserve"> giả repository để test </w:t>
-      </w:r>
-      <w:r>
-        <w:rPr>
-          <w:rFonts w:ascii="Consolas" w:eastAsia="Consolas" w:hAnsi="Consolas" w:cs="Consolas"/>
-        </w:rPr>
-        <w:t xml:space="preserve">CurrentUser</w:t>
-      </w:r>
-      <w:r>
-        <w:t xml:space="preserve"> mà không cần DB.</w:t>
-      </w:r>
-    </w:p>
-    <w:p>
-      <w:pPr>
-        <w:pStyle w:val="ListParagraph"/>
-        <w:numPr>
-          <w:ilvl w:val="0"/>
-          <w:numId w:val="1"/>
-        </w:numPr>
-      </w:pPr>
-      <w:r>
-        <w:rPr>
-          <w:b/>
-          <w:bCs/>
-        </w:rPr>
-        <w:t xml:space="preserve">Kiểm tra ngược ở mọi task:</w:t>
+          <w:b/>
+          <w:bCs/>
+        </w:rPr>
+        <w:t xml:space="preserve">bên trong</w:t>
+      </w:r>
+      <w:r>
+        <w:t xml:space="preserve"> container PostgreSQL của Testcontainers. Bean </w:t>
+      </w:r>
+      <w:r>
+        <w:rPr>
+          <w:rFonts w:ascii="Consolas" w:eastAsia="Consolas" w:hAnsi="Consolas" w:cs="Consolas"/>
+        </w:rPr>
+        <w:t xml:space="preserve">PostgreSQLContainer</w:t>
+      </w:r>
+      <w:r>
+        <w:t xml:space="preserve"> (từ </w:t>
+      </w:r>
+      <w:r>
+        <w:rPr>
+          <w:rFonts w:ascii="Consolas" w:eastAsia="Consolas" w:hAnsi="Consolas" w:cs="Consolas"/>
+        </w:rPr>
+        <w:t xml:space="preserve">TestcontainersConfiguration</w:t>
+      </w:r>
+      <w:r>
+        <w:t xml:space="preserve">) inject được vào test như mọi bean khác.</w:t>
+      </w:r>
+    </w:p>
+    <w:p>
+      <w:pPr>
+        <w:pStyle w:val="ListParagraph"/>
+        <w:numPr>
+          <w:ilvl w:val="0"/>
+          <w:numId w:val="1"/>
+        </w:numPr>
+      </w:pPr>
+      <w:r>
+        <w:t xml:space="preserve">Kết quả đọc được: </w:t>
+      </w:r>
+      <w:r>
+        <w:rPr>
+          <w:rFonts w:ascii="Consolas" w:eastAsia="Consolas" w:hAnsi="Consolas" w:cs="Consolas"/>
+        </w:rPr>
+        <w:t xml:space="preserve">OAUTH2|k1|5AJcgYSQ...|FMZbIgmE...</w:t>
+      </w:r>
+      <w:r>
+        <w:t xml:space="preserve">, tức là loại credential, ID khóa, rồi hai chuỗi base64 đã mã hóa; không có token gốc.</w:t>
+      </w:r>
+    </w:p>
+    <w:p>
+      <w:pPr>
+        <w:pStyle w:val="ListParagraph"/>
+        <w:numPr>
+          <w:ilvl w:val="0"/>
+          <w:numId w:val="1"/>
+        </w:numPr>
+      </w:pPr>
+      <w:r>
+        <w:t xml:space="preserve">Cách này thay cho "kiểm tra tay bằng psql" của kế hoạch, vì nó chạy lại được ở mọi lần build.</w:t>
+      </w:r>
+    </w:p>
+    <w:p>
+      <w:pPr>
+        <w:pStyle w:val="Heading3"/>
+      </w:pPr>
+      <w:r>
+        <w:t xml:space="preserve">22.3 Test viết sau code: phải chứng minh nó có thể đỏ</w:t>
+      </w:r>
+    </w:p>
+    <w:p>
+      <w:pPr>
+        <w:pStyle w:val="ListParagraph"/>
+        <w:numPr>
+          <w:ilvl w:val="0"/>
+          <w:numId w:val="1"/>
+        </w:numPr>
+      </w:pPr>
+      <w:r>
+        <w:t xml:space="preserve">Test end-to-end xanh ngay từ lần đầu, vì code đã có từ trước. Một test chưa từng đỏ thì chưa chứng minh được gì, nên tôi tự làm hỏng code để xem:</w:t>
       </w:r>
     </w:p>
     <w:p>
@@ -13663,7 +13839,26 @@
         </w:numPr>
       </w:pPr>
       <w:r>
-        <w:t xml:space="preserve">BE-09: bỏ bước tìm theo email → 2 test idempotent đỏ.</w:t>
+        <w:t xml:space="preserve">Service ghi command ra log DEBUG, </w:t>
+      </w:r>
+      <w:r>
+        <w:rPr>
+          <w:rFonts w:ascii="Consolas" w:eastAsia="Consolas" w:hAnsi="Consolas" w:cs="Consolas"/>
+        </w:rPr>
+        <w:t xml:space="preserve">toString()</w:t>
+      </w:r>
+      <w:r>
+        <w:t xml:space="preserve"> vẫn che token → </w:t>
+      </w:r>
+      <w:r>
+        <w:rPr>
+          <w:b/>
+          <w:bCs/>
+        </w:rPr>
+        <w:t xml:space="preserve">xanh</w:t>
+      </w:r>
+      <w:r>
+        <w:t xml:space="preserve"> (việc che token có tác dụng).</w:t>
       </w:r>
     </w:p>
     <w:p>
@@ -13675,25 +13870,17 @@
         </w:numPr>
       </w:pPr>
       <w:r>
-        <w:t xml:space="preserve">BE-10: cho </w:t>
-      </w:r>
-      <w:r>
-        <w:rPr>
-          <w:rFonts w:ascii="Consolas" w:eastAsia="Consolas" w:hAnsi="Consolas" w:cs="Consolas"/>
-        </w:rPr>
-        <w:t xml:space="preserve">markHealthy</w:t>
-      </w:r>
-      <w:r>
-        <w:t xml:space="preserve"> gỡ </w:t>
-      </w:r>
-      <w:r>
-        <w:rPr>
-          <w:rFonts w:ascii="Consolas" w:eastAsia="Consolas" w:hAnsi="Consolas" w:cs="Consolas"/>
-        </w:rPr>
-        <w:t xml:space="preserve">AUTH_EXPIRED</w:t>
-      </w:r>
-      <w:r>
-        <w:t xml:space="preserve"> → đúng ô đó đỏ.</w:t>
+        <w:t xml:space="preserve">Như trên nhưng bỏ phần che → </w:t>
+      </w:r>
+      <w:r>
+        <w:rPr>
+          <w:b/>
+          <w:bCs/>
+        </w:rPr>
+        <w:t xml:space="preserve">đỏ</w:t>
+      </w:r>
+      <w:r>
+        <w:t xml:space="preserve">: refresh token xuất hiện trong log.</w:t>
       </w:r>
     </w:p>
     <w:p>
@@ -13705,693 +13892,114 @@
         </w:numPr>
       </w:pPr>
       <w:r>
-        <w:t xml:space="preserve">BE-12: IV cố định → 1 test đỏ; bỏ AAD → 3 test đỏ; tag 96 bit → 2 test đỏ.</w:t>
-      </w:r>
-    </w:p>
-    <w:p>
-      <w:pPr>
-        <w:pStyle w:val="ListParagraph"/>
-        <w:numPr>
-          <w:ilvl w:val="1"/>
-          <w:numId w:val="1"/>
-        </w:numPr>
-      </w:pPr>
-      <w:r>
-        <w:t xml:space="preserve">BE-13: store "quên" ghi refresh token → test xoay khóa đỏ.</w:t>
-      </w:r>
-    </w:p>
-    <w:p>
-      <w:pPr>
-        <w:pStyle w:val="ListParagraph"/>
-        <w:numPr>
-          <w:ilvl w:val="1"/>
-          <w:numId w:val="1"/>
-        </w:numPr>
-      </w:pPr>
-      <w:r>
-        <w:t xml:space="preserve">BE-14: bỏ </w:t>
-      </w:r>
-      <w:r>
-        <w:rPr>
-          <w:rFonts w:ascii="Consolas" w:eastAsia="Consolas" w:hAnsi="Consolas" w:cs="Consolas"/>
-        </w:rPr>
-        <w:t xml:space="preserve">@Transactional</w:t>
-      </w:r>
-      <w:r>
-        <w:t xml:space="preserve"> → test rollback và test reconnect đỏ; không tìm account cũ → test reconnect đỏ (lỗi </w:t>
-      </w:r>
-      <w:r>
-        <w:rPr>
-          <w:rFonts w:ascii="Consolas" w:eastAsia="Consolas" w:hAnsi="Consolas" w:cs="Consolas"/>
-        </w:rPr>
-        <w:t xml:space="preserve">UNIQUE</w:t>
-      </w:r>
-      <w:r>
-        <w:t xml:space="preserve">); bỏ kiểm tra provider → test provider lạ đỏ; </w:t>
-      </w:r>
-      <w:r>
-        <w:rPr>
-          <w:rFonts w:ascii="Consolas" w:eastAsia="Consolas" w:hAnsi="Consolas" w:cs="Consolas"/>
-        </w:rPr>
-        <w:t xml:space="preserve">reconnected</w:t>
-      </w:r>
-      <w:r>
-        <w:t xml:space="preserve"> luôn </w:t>
-      </w:r>
-      <w:r>
-        <w:rPr>
-          <w:rFonts w:ascii="Consolas" w:eastAsia="Consolas" w:hAnsi="Consolas" w:cs="Consolas"/>
-        </w:rPr>
-        <w:t xml:space="preserve">false</w:t>
-      </w:r>
-      <w:r>
-        <w:t xml:space="preserve"> → test reconnect đỏ; publish trước khi lưu credential → test rollback đỏ; thêm một trường vào event → test payload đỏ.</w:t>
-      </w:r>
-    </w:p>
-    <w:p>
-      <w:pPr>
-        <w:pStyle w:val="ListParagraph"/>
-        <w:numPr>
-          <w:ilvl w:val="1"/>
-          <w:numId w:val="1"/>
-        </w:numPr>
-      </w:pPr>
-      <w:r>
-        <w:t xml:space="preserve">BE-15: danh sách không lọc owner → 2 test đỏ; </w:t>
-      </w:r>
-      <w:r>
-        <w:rPr>
-          <w:rFonts w:ascii="Consolas" w:eastAsia="Consolas" w:hAnsi="Consolas" w:cs="Consolas"/>
-        </w:rPr>
-        <w:t xml:space="preserve">get</w:t>
-      </w:r>
-      <w:r>
-        <w:t xml:space="preserve"> không lọc owner → test cô lập đỏ; mới nhất trước → test thứ tự đỏ; </w:t>
-      </w:r>
-      <w:r>
-        <w:rPr>
-          <w:rFonts w:ascii="Consolas" w:eastAsia="Consolas" w:hAnsi="Consolas" w:cs="Consolas"/>
-        </w:rPr>
-        <w:t xml:space="preserve">ProviderRegistry.get</w:t>
-      </w:r>
-      <w:r>
-        <w:t xml:space="preserve"> thay </w:t>
-      </w:r>
-      <w:r>
-        <w:rPr>
-          <w:rFonts w:ascii="Consolas" w:eastAsia="Consolas" w:hAnsi="Consolas" w:cs="Consolas"/>
-        </w:rPr>
-        <w:t xml:space="preserve">find</w:t>
-      </w:r>
-      <w:r>
-        <w:t xml:space="preserve"> → test connector đã gỡ đỏ; </w:t>
-      </w:r>
-      <w:r>
-        <w:rPr>
-          <w:rFonts w:ascii="Consolas" w:eastAsia="Consolas" w:hAnsi="Consolas" w:cs="Consolas"/>
-        </w:rPr>
-        <w:t xml:space="preserve">ownerId</w:t>
-      </w:r>
-      <w:r>
-        <w:t xml:space="preserve"> lọt vào response → test tập trường đỏ; detail nói "của người khác" → test cô lập đỏ.</w:t>
-      </w:r>
-    </w:p>
-    <w:p>
-      <w:pPr>
-        <w:pStyle w:val="ListParagraph"/>
-        <w:numPr>
-          <w:ilvl w:val="1"/>
-          <w:numId w:val="1"/>
-        </w:numPr>
-      </w:pPr>
-      <w:r>
-        <w:t xml:space="preserve">BE-16 (10 lỗi, chạy bằng một script nhỏ áp từng lỗi rồi khôi phục): </w:t>
-      </w:r>
-      <w:r>
-        <w:rPr>
-          <w:rFonts w:ascii="Consolas" w:eastAsia="Consolas" w:hAnsi="Consolas" w:cs="Consolas"/>
-        </w:rPr>
-        <w:t xml:space="preserve">@Size</w:t>
-      </w:r>
-      <w:r>
-        <w:t xml:space="preserve"> thay luật domain → tên trắng ra 500 và 100 emoji bị từ chối; bỏ "ít nhất một trường" → test </w:t>
-      </w:r>
-      <w:r>
-        <w:rPr>
-          <w:rFonts w:ascii="Consolas" w:eastAsia="Consolas" w:hAnsi="Consolas" w:cs="Consolas"/>
-        </w:rPr>
-        <w:t xml:space="preserve">{}</w:t>
-      </w:r>
-      <w:r>
-        <w:t xml:space="preserve"> đỏ; đảo nghĩa </w:t>
-      </w:r>
-      <w:r>
-        <w:rPr>
-          <w:rFonts w:ascii="Consolas" w:eastAsia="Consolas" w:hAnsi="Consolas" w:cs="Consolas"/>
-        </w:rPr>
-        <w:t xml:space="preserve">enabled</w:t>
-      </w:r>
-      <w:r>
-        <w:t xml:space="preserve"> → 2 test đỏ; không phát event khi tắt → đỏ; phát event cả khi không đổi gì → 2 test đỏ; PATCH không lọc owner → đỏ; bỏ </w:t>
-      </w:r>
-      <w:r>
-        <w:rPr>
-          <w:rFonts w:ascii="Consolas" w:eastAsia="Consolas" w:hAnsi="Consolas" w:cs="Consolas"/>
-        </w:rPr>
-        <w:t xml:space="preserve">@Version</w:t>
-      </w:r>
-      <w:r>
-        <w:t xml:space="preserve"> → test version cũ đỏ; không phát event khi reconnect → đỏ; phát event ở mọi lần reconnect → đỏ; thêm trường vào event → đỏ.</w:t>
-      </w:r>
-    </w:p>
-    <w:p>
-      <w:pPr>
-        <w:pStyle w:val="ListParagraph"/>
-        <w:numPr>
-          <w:ilvl w:val="1"/>
-          <w:numId w:val="1"/>
-        </w:numPr>
-      </w:pPr>
-      <w:r>
-        <w:t xml:space="preserve">BE-17 (12 lỗi, cùng cách bằng script): </w:t>
-      </w:r>
-      <w:r>
-        <w:rPr>
-          <w:rFonts w:ascii="Consolas" w:eastAsia="Consolas" w:hAnsi="Consolas" w:cs="Consolas"/>
-        </w:rPr>
-        <w:t xml:space="preserve">remove</w:t>
-      </w:r>
-      <w:r>
-        <w:t xml:space="preserve"> không ghi gì → 7 test đỏ; cho xóa hai lần → đỏ; </w:t>
-      </w:r>
-      <w:r>
-        <w:rPr>
-          <w:rFonts w:ascii="Consolas" w:eastAsia="Consolas" w:hAnsi="Consolas" w:cs="Consolas"/>
-        </w:rPr>
-        <w:t xml:space="preserve">remove</w:t>
-      </w:r>
-      <w:r>
-        <w:t xml:space="preserve"> đổi </w:t>
-      </w:r>
-      <w:r>
-        <w:rPr>
-          <w:rFonts w:ascii="Consolas" w:eastAsia="Consolas" w:hAnsi="Consolas" w:cs="Consolas"/>
-        </w:rPr>
-        <w:t xml:space="preserve">status</w:t>
-      </w:r>
-      <w:r>
-        <w:t xml:space="preserve"> → đỏ; dùng lại account đã xóa mà không xóa </w:t>
-      </w:r>
-      <w:r>
-        <w:rPr>
-          <w:rFonts w:ascii="Consolas" w:eastAsia="Consolas" w:hAnsi="Consolas" w:cs="Consolas"/>
-        </w:rPr>
-        <w:t xml:space="preserve">removed_at</w:t>
-      </w:r>
-      <w:r>
-        <w:t xml:space="preserve"> → 2 đỏ; dùng lại mà không bật sync → 2 đỏ; mọi reconnect đều bật sync → đỏ; giữ lại credential → đỏ; không phát </w:t>
-      </w:r>
-      <w:r>
-        <w:rPr>
-          <w:rFonts w:ascii="Consolas" w:eastAsia="Consolas" w:hAnsi="Consolas" w:cs="Consolas"/>
-        </w:rPr>
-        <w:t xml:space="preserve">AccountRemoved</w:t>
-      </w:r>
-      <w:r>
-        <w:t xml:space="preserve"> → 2 đỏ; danh sách hiện account đã xóa → đỏ; GET thấy account đã xóa → đỏ; PATCH/DELETE với tới account đã xóa → đỏ; PATCH/DELETE bỏ qua owner → 2 đỏ.</w:t>
-      </w:r>
-    </w:p>
-    <w:p>
-      <w:pPr>
-        <w:pStyle w:val="ListParagraph"/>
-        <w:numPr>
-          <w:ilvl w:val="0"/>
-          <w:numId w:val="1"/>
-        </w:numPr>
-      </w:pPr>
-      <w:r>
-        <w:rPr>
-          <w:rFonts w:ascii="Consolas" w:eastAsia="Consolas" w:hAnsi="Consolas" w:cs="Consolas"/>
-          <w:b/>
-          <w:bCs/>
-        </w:rPr>
-        <w:t xml:space="preserve">@RecordApplicationEvents</w:t>
-      </w:r>
-      <w:r>
-        <w:rPr>
-          <w:b/>
-          <w:bCs/>
-        </w:rPr>
-        <w:t xml:space="preserve"> + </w:t>
-      </w:r>
-      <w:r>
-        <w:rPr>
-          <w:rFonts w:ascii="Consolas" w:eastAsia="Consolas" w:hAnsi="Consolas" w:cs="Consolas"/>
-          <w:b/>
-          <w:bCs/>
-        </w:rPr>
-        <w:t xml:space="preserve">ApplicationEvents</w:t>
-      </w:r>
-      <w:r>
-        <w:rPr>
-          <w:b/>
-          <w:bCs/>
-        </w:rPr>
-        <w:t xml:space="preserve"> (Spring Test, BE-16):</w:t>
-      </w:r>
-      <w:r>
-        <w:t xml:space="preserve"> ghi lại event được publish trong một test </w:t>
-      </w:r>
-      <w:r>
-        <w:rPr>
-          <w:rFonts w:ascii="Consolas" w:eastAsia="Consolas" w:hAnsi="Consolas" w:cs="Consolas"/>
-        </w:rPr>
-        <w:t xml:space="preserve">@SpringBootTest</w:t>
-      </w:r>
-      <w:r>
-        <w:t xml:space="preserve">; </w:t>
-      </w:r>
-      <w:r>
-        <w:rPr>
-          <w:rFonts w:ascii="Consolas" w:eastAsia="Consolas" w:hAnsi="Consolas" w:cs="Consolas"/>
-        </w:rPr>
-        <w:t xml:space="preserve">events.stream(AccountStatusChanged.class)</w:t>
-      </w:r>
-      <w:r>
-        <w:t xml:space="preserve"> lấy ra để kiểm tra. </w:t>
-      </w:r>
-      <w:r>
-        <w:rPr>
-          <w:rFonts w:ascii="Consolas" w:eastAsia="Consolas" w:hAnsi="Consolas" w:cs="Consolas"/>
-        </w:rPr>
-        <w:t xml:space="preserve">AssertablePublishedEvents</w:t>
-      </w:r>
-      <w:r>
-        <w:t xml:space="preserve"> là cách tương tự của Spring Modulith, dùng trong module test.</w:t>
-      </w:r>
-    </w:p>
-    <w:p>
-      <w:pPr>
-        <w:pStyle w:val="ListParagraph"/>
-        <w:numPr>
-          <w:ilvl w:val="0"/>
-          <w:numId w:val="1"/>
-        </w:numPr>
-      </w:pPr>
-      <w:r>
-        <w:rPr>
-          <w:rFonts w:ascii="Consolas" w:eastAsia="Consolas" w:hAnsi="Consolas" w:cs="Consolas"/>
-          <w:b/>
-          <w:bCs/>
-        </w:rPr>
-        <w:t xml:space="preserve">TransactionTemplate</w:t>
-      </w:r>
-      <w:r>
-        <w:rPr>
-          <w:b/>
-          <w:bCs/>
-        </w:rPr>
-        <w:t xml:space="preserve"> trong test (BE-16):</w:t>
-      </w:r>
-      <w:r>
-        <w:t xml:space="preserve"> mở transaction bằng code để chen một bước vào giữa. Test gọi service (đã đọc </w:t>
-      </w:r>
-      <w:r>
-        <w:rPr>
-          <w:rFonts w:ascii="Consolas" w:eastAsia="Consolas" w:hAnsi="Consolas" w:cs="Consolas"/>
-        </w:rPr>
-        <w:t xml:space="preserve">version</w:t>
-      </w:r>
-      <w:r>
-        <w:t xml:space="preserve"> cũ), rồi giả "một request khác" bằng </w:t>
-      </w:r>
-      <w:r>
-        <w:rPr>
-          <w:rFonts w:ascii="Consolas" w:eastAsia="Consolas" w:hAnsi="Consolas" w:cs="Consolas"/>
-        </w:rPr>
-        <w:t xml:space="preserve">UPDATE ... SET version = version + 1</w:t>
-      </w:r>
-      <w:r>
-        <w:t xml:space="preserve"> trong cùng transaction; lúc commit phải ra </w:t>
-      </w:r>
-      <w:r>
-        <w:rPr>
-          <w:rFonts w:ascii="Consolas" w:eastAsia="Consolas" w:hAnsi="Consolas" w:cs="Consolas"/>
-        </w:rPr>
-        <w:t xml:space="preserve">OptimisticLockingFailureException</w:t>
-      </w:r>
-      <w:r>
-        <w:t xml:space="preserve">. Qua MockMvc không canh được hai request chạy chồng nhau, nên phần đổi lỗi thành 409 dựa vào test có sẵn của F01.</w:t>
-      </w:r>
-    </w:p>
-    <w:p>
-      <w:pPr>
-        <w:pStyle w:val="ListParagraph"/>
-        <w:numPr>
-          <w:ilvl w:val="0"/>
-          <w:numId w:val="1"/>
-        </w:numPr>
-      </w:pPr>
-      <w:r>
-        <w:rPr>
-          <w:b/>
-          <w:bCs/>
-        </w:rPr>
-        <w:t xml:space="preserve">Test payload của event gom về một chỗ (BE-17):</w:t>
-      </w:r>
-      <w:r>
-        <w:t xml:space="preserve"> </w:t>
-      </w:r>
-      <w:r>
-        <w:rPr>
-          <w:rFonts w:ascii="Consolas" w:eastAsia="Consolas" w:hAnsi="Consolas" w:cs="Consolas"/>
-        </w:rPr>
-        <w:t xml:space="preserve">AccountEventsTests</w:t>
-      </w:r>
-      <w:r>
-        <w:t xml:space="preserve"> (package </w:t>
-      </w:r>
-      <w:r>
-        <w:rPr>
-          <w:rFonts w:ascii="Consolas" w:eastAsia="Consolas" w:hAnsi="Consolas" w:cs="Consolas"/>
-        </w:rPr>
-        <w:t xml:space="preserve">dev.sino.account</w:t>
-      </w:r>
-      <w:r>
-        <w:t xml:space="preserve">) kiểm tên các trường của cả ba event bằng </w:t>
-      </w:r>
-      <w:r>
-        <w:rPr>
-          <w:rFonts w:ascii="Consolas" w:eastAsia="Consolas" w:hAnsi="Consolas" w:cs="Consolas"/>
-        </w:rPr>
-        <w:t xml:space="preserve">getRecordComponents()</w:t>
-      </w:r>
-      <w:r>
-        <w:t xml:space="preserve">. Đây là unit test thuần, không cần Spring, nên tách khỏi module test của luồng đăng ký.</w:t>
-      </w:r>
-    </w:p>
-    <w:p>
-      <w:pPr>
-        <w:pStyle w:val="ListParagraph"/>
-        <w:numPr>
-          <w:ilvl w:val="0"/>
-          <w:numId w:val="1"/>
-        </w:numPr>
-      </w:pPr>
-      <w:r>
-        <w:rPr>
-          <w:b/>
-          <w:bCs/>
-        </w:rPr>
-        <w:t xml:space="preserve">Chạy cả ứng dụng thay cho web slice (BE-15):</w:t>
-      </w:r>
-      <w:r>
-        <w:t xml:space="preserve"> </w:t>
-      </w:r>
-      <w:r>
-        <w:rPr>
-          <w:rFonts w:ascii="Consolas" w:eastAsia="Consolas" w:hAnsi="Consolas" w:cs="Consolas"/>
-        </w:rPr>
-        <w:t xml:space="preserve">@SpringBootTest</w:t>
-      </w:r>
-      <w:r>
-        <w:t xml:space="preserve"> + </w:t>
-      </w:r>
-      <w:r>
-        <w:rPr>
-          <w:rFonts w:ascii="Consolas" w:eastAsia="Consolas" w:hAnsi="Consolas" w:cs="Consolas"/>
-        </w:rPr>
-        <w:t xml:space="preserve">@AutoConfigureMockMvc</w:t>
-      </w:r>
-      <w:r>
-        <w:t xml:space="preserve"> gửi request HTTP giả qua đúng các lớp thật: security, </w:t>
-      </w:r>
-      <w:r>
-        <w:rPr>
-          <w:rFonts w:ascii="Consolas" w:eastAsia="Consolas" w:hAnsi="Consolas" w:cs="Consolas"/>
-        </w:rPr>
-        <w:t xml:space="preserve">CurrentUser</w:t>
-      </w:r>
-      <w:r>
-        <w:t xml:space="preserve">, service, PostgreSQL, error handler, Jackson. Chọn thay cho </w:t>
-      </w:r>
-      <w:r>
-        <w:rPr>
-          <w:rFonts w:ascii="Consolas" w:eastAsia="Consolas" w:hAnsi="Consolas" w:cs="Consolas"/>
-        </w:rPr>
-        <w:t xml:space="preserve">@WebMvcTest</w:t>
-      </w:r>
-      <w:r>
-        <w:t xml:space="preserve"> với service giả vì test cô lập dữ liệu phải chạy trên dữ liệu thật; với service giả, test chỉ kiểm tra cái mock.</w:t>
-      </w:r>
-    </w:p>
-    <w:p>
-      <w:pPr>
-        <w:pStyle w:val="ListParagraph"/>
-        <w:numPr>
-          <w:ilvl w:val="0"/>
-          <w:numId w:val="1"/>
-        </w:numPr>
-      </w:pPr>
-      <w:r>
-        <w:rPr>
-          <w:b/>
-          <w:bCs/>
-        </w:rPr>
-        <w:t xml:space="preserve">Ghim thời điểm bằng SQL:</w:t>
-      </w:r>
-      <w:r>
-        <w:t xml:space="preserve"> </w:t>
-      </w:r>
-      <w:r>
-        <w:rPr>
-          <w:rFonts w:ascii="Consolas" w:eastAsia="Consolas" w:hAnsi="Consolas" w:cs="Consolas"/>
-        </w:rPr>
-        <w:t xml:space="preserve">@PrePersist</w:t>
-      </w:r>
-      <w:r>
-        <w:t xml:space="preserve"> điền </w:t>
-      </w:r>
-      <w:r>
-        <w:rPr>
-          <w:rFonts w:ascii="Consolas" w:eastAsia="Consolas" w:hAnsi="Consolas" w:cs="Consolas"/>
-        </w:rPr>
-        <w:t xml:space="preserve">created_at</w:t>
-      </w:r>
-      <w:r>
-        <w:t xml:space="preserve"> bằng giờ thật nên không biết trước. Test ghi đè bằng </w:t>
-      </w:r>
-      <w:r>
-        <w:rPr>
-          <w:rFonts w:ascii="Consolas" w:eastAsia="Consolas" w:hAnsi="Consolas" w:cs="Consolas"/>
-        </w:rPr>
-        <w:t xml:space="preserve">UPDATE connected_account SET created_at = ?</w:t>
-      </w:r>
-      <w:r>
-        <w:t xml:space="preserve"> để biết chắc thứ tự và chuỗi JSON mong đợi (</w:t>
-      </w:r>
-      <w:r>
-        <w:rPr>
-          <w:rFonts w:ascii="Consolas" w:eastAsia="Consolas" w:hAnsi="Consolas" w:cs="Consolas"/>
-        </w:rPr>
-        <w:t xml:space="preserve">2026-10-05T03:15:00Z</w:t>
-      </w:r>
-      <w:r>
-        <w:t xml:space="preserve">). Account "mới hơn" được tạo </w:t>
-      </w:r>
-      <w:r>
-        <w:rPr>
-          <w:b/>
-          <w:bCs/>
-        </w:rPr>
-        <w:t xml:space="preserve">trước</w:t>
-      </w:r>
-      <w:r>
-        <w:t xml:space="preserve">, để test thứ tự không thể xanh chỉ nhờ thứ tự chèn.</w:t>
-      </w:r>
-    </w:p>
-    <w:p>
-      <w:pPr>
-        <w:pStyle w:val="ListParagraph"/>
-        <w:numPr>
-          <w:ilvl w:val="0"/>
-          <w:numId w:val="1"/>
-        </w:numPr>
-      </w:pPr>
-      <w:r>
-        <w:rPr>
-          <w:rFonts w:ascii="Consolas" w:eastAsia="Consolas" w:hAnsi="Consolas" w:cs="Consolas"/>
-          <w:b/>
-          <w:bCs/>
-        </w:rPr>
-        <w:t xml:space="preserve">JsonPath.read(body, "$")</w:t>
-      </w:r>
-      <w:r>
-        <w:rPr>
-          <w:b/>
-          <w:bCs/>
-        </w:rPr>
-        <w:t xml:space="preserve">:</w:t>
-      </w:r>
-      <w:r>
-        <w:t xml:space="preserve"> đọc JSON thành </w:t>
-      </w:r>
-      <w:r>
-        <w:rPr>
-          <w:rFonts w:ascii="Consolas" w:eastAsia="Consolas" w:hAnsi="Consolas" w:cs="Consolas"/>
-        </w:rPr>
-        <w:t xml:space="preserve">Map</w:t>
-      </w:r>
-      <w:r>
-        <w:t xml:space="preserve"> để so tập tên trường.</w:t>
-      </w:r>
-    </w:p>
-    <w:p>
-      <w:pPr>
-        <w:pStyle w:val="ListParagraph"/>
-        <w:numPr>
-          <w:ilvl w:val="0"/>
-          <w:numId w:val="1"/>
-        </w:numPr>
-      </w:pPr>
-      <w:r>
-        <w:rPr>
-          <w:rFonts w:ascii="Consolas" w:eastAsia="Consolas" w:hAnsi="Consolas" w:cs="Consolas"/>
-          <w:b/>
-          <w:bCs/>
-        </w:rPr>
-        <w:t xml:space="preserve">@ApplicationModuleTest(mode = DIRECT_DEPENDENCIES)</w:t>
-      </w:r>
-      <w:r>
-        <w:rPr>
-          <w:b/>
-          <w:bCs/>
-        </w:rPr>
-        <w:t xml:space="preserve"> (Spring Modulith, BE-14):</w:t>
-      </w:r>
-      <w:r>
-        <w:t xml:space="preserve"> chỉ khởi động module </w:t>
-      </w:r>
-      <w:r>
-        <w:rPr>
-          <w:rFonts w:ascii="Consolas" w:eastAsia="Consolas" w:hAnsi="Consolas" w:cs="Consolas"/>
-        </w:rPr>
-        <w:t xml:space="preserve">account</w:t>
-      </w:r>
-      <w:r>
-        <w:t xml:space="preserve"> cộng các module nó dùng trực tiếp, không phải cả ứng dụng. Lúc làm BE-14 đó chỉ là </w:t>
-      </w:r>
-      <w:r>
-        <w:rPr>
-          <w:rFonts w:ascii="Consolas" w:eastAsia="Consolas" w:hAnsi="Consolas" w:cs="Consolas"/>
-        </w:rPr>
-        <w:t xml:space="preserve">provider</w:t>
-      </w:r>
-      <w:r>
-        <w:t xml:space="preserve">; từ BE-15, </w:t>
-      </w:r>
-      <w:r>
-        <w:rPr>
-          <w:rFonts w:ascii="Consolas" w:eastAsia="Consolas" w:hAnsi="Consolas" w:cs="Consolas"/>
-        </w:rPr>
-        <w:t xml:space="preserve">account</w:t>
-      </w:r>
-      <w:r>
-        <w:t xml:space="preserve"> dùng thêm </w:t>
-      </w:r>
-      <w:r>
-        <w:rPr>
-          <w:rFonts w:ascii="Consolas" w:eastAsia="Consolas" w:hAnsi="Consolas" w:cs="Consolas"/>
-        </w:rPr>
-        <w:t xml:space="preserve">CurrentUser</w:t>
-      </w:r>
-      <w:r>
-        <w:t xml:space="preserve"> (module </w:t>
-      </w:r>
-      <w:r>
-        <w:rPr>
-          <w:rFonts w:ascii="Consolas" w:eastAsia="Consolas" w:hAnsi="Consolas" w:cs="Consolas"/>
-        </w:rPr>
-        <w:t xml:space="preserve">identity</w:t>
-      </w:r>
-      <w:r>
-        <w:t xml:space="preserve">) và mã lỗi của </w:t>
-      </w:r>
-      <w:r>
-        <w:rPr>
-          <w:rFonts w:ascii="Consolas" w:eastAsia="Consolas" w:hAnsi="Consolas" w:cs="Consolas"/>
-        </w:rPr>
-        <w:t xml:space="preserve">common</w:t>
-      </w:r>
-      <w:r>
-        <w:t xml:space="preserve">, nên hai module này cũng được nạp. Test vẫn tự dọn bảng và tự chèn owner của nó vào </w:t>
-      </w:r>
-      <w:r>
-        <w:rPr>
-          <w:rFonts w:ascii="Consolas" w:eastAsia="Consolas" w:hAnsi="Consolas" w:cs="Consolas"/>
-        </w:rPr>
-        <w:t xml:space="preserve">app_user</w:t>
-      </w:r>
-      <w:r>
-        <w:t xml:space="preserve"> bằng </w:t>
-      </w:r>
-      <w:r>
-        <w:rPr>
-          <w:rFonts w:ascii="Consolas" w:eastAsia="Consolas" w:hAnsi="Consolas" w:cs="Consolas"/>
-        </w:rPr>
-        <w:t xml:space="preserve">JdbcTemplate</w:t>
-      </w:r>
-      <w:r>
-        <w:t xml:space="preserve">, nên không phụ thuộc owner được tạo lúc khởi động.</w:t>
-      </w:r>
-    </w:p>
-    <w:p>
-      <w:pPr>
-        <w:pStyle w:val="ListParagraph"/>
-        <w:numPr>
-          <w:ilvl w:val="0"/>
-          <w:numId w:val="1"/>
-        </w:numPr>
-      </w:pPr>
-      <w:r>
-        <w:rPr>
-          <w:b/>
-          <w:bCs/>
-        </w:rPr>
-        <w:t xml:space="preserve">Test không có </w:t>
-      </w:r>
-      <w:r>
-        <w:rPr>
-          <w:rFonts w:ascii="Consolas" w:eastAsia="Consolas" w:hAnsi="Consolas" w:cs="Consolas"/>
-          <w:b/>
-          <w:bCs/>
-        </w:rPr>
-        <w:t xml:space="preserve">@Transactional</w:t>
-      </w:r>
-      <w:r>
-        <w:rPr>
-          <w:b/>
-          <w:bCs/>
-        </w:rPr>
-        <w:t xml:space="preserve">:</w:t>
-      </w:r>
-      <w:r>
-        <w:t xml:space="preserve"> để service tự commit hoặc rollback như khi chạy thật. Cái giá là dữ liệu ở lại sau mỗi test, nên </w:t>
-      </w:r>
-      <w:r>
-        <w:rPr>
-          <w:rFonts w:ascii="Consolas" w:eastAsia="Consolas" w:hAnsi="Consolas" w:cs="Consolas"/>
-        </w:rPr>
-        <w:t xml:space="preserve">@BeforeEach</w:t>
-      </w:r>
-      <w:r>
-        <w:t xml:space="preserve"> tự dọn bảng bằng </w:t>
-      </w:r>
-      <w:r>
-        <w:rPr>
-          <w:rFonts w:ascii="Consolas" w:eastAsia="Consolas" w:hAnsi="Consolas" w:cs="Consolas"/>
-        </w:rPr>
-        <w:t xml:space="preserve">JdbcTestUtils.deleteFromTables</w:t>
+        <w:t xml:space="preserve">Store ghi access token dạng chữ xuống DB → </w:t>
+      </w:r>
+      <w:r>
+        <w:rPr>
+          <w:b/>
+          <w:bCs/>
+        </w:rPr>
+        <w:t xml:space="preserve">đỏ</w:t>
+      </w:r>
+      <w:r>
+        <w:t xml:space="preserve"> ở bước psql.</w:t>
+      </w:r>
+    </w:p>
+    <w:p>
+      <w:pPr>
+        <w:pStyle w:val="ListParagraph"/>
+        <w:numPr>
+          <w:ilvl w:val="0"/>
+          <w:numId w:val="1"/>
+        </w:numPr>
+      </w:pPr>
+      <w:r>
+        <w:t xml:space="preserve">Ranh giới module: thêm tạm một module </w:t>
+      </w:r>
+      <w:r>
+        <w:rPr>
+          <w:rFonts w:ascii="Consolas" w:eastAsia="Consolas" w:hAnsi="Consolas" w:cs="Consolas"/>
+        </w:rPr>
+        <w:t xml:space="preserve">dev.sino.probe</w:t>
+      </w:r>
+      <w:r>
+        <w:t xml:space="preserve"> có field kiểu </w:t>
+      </w:r>
+      <w:r>
+        <w:rPr>
+          <w:rFonts w:ascii="Consolas" w:eastAsia="Consolas" w:hAnsi="Consolas" w:cs="Consolas"/>
+        </w:rPr>
+        <w:t xml:space="preserve">CredentialStore</w:t>
+      </w:r>
+      <w:r>
+        <w:t xml:space="preserve"> → </w:t>
+      </w:r>
+      <w:r>
+        <w:rPr>
+          <w:rFonts w:ascii="Consolas" w:eastAsia="Consolas" w:hAnsi="Consolas" w:cs="Consolas"/>
+        </w:rPr>
+        <w:t xml:space="preserve">ModularityTests</w:t>
+      </w:r>
+      <w:r>
+        <w:t xml:space="preserve"> đỏ với </w:t>
+      </w:r>
+      <w:r>
+        <w:rPr>
+          <w:rFonts w:ascii="Consolas" w:eastAsia="Consolas" w:hAnsi="Consolas" w:cs="Consolas"/>
+        </w:rPr>
+        <w:t xml:space="preserve">Module 'probe' depends on non-exposed type dev.sino.account.infrastructure.CredentialStore within module 'account'</w:t>
+      </w:r>
+      <w:r>
+        <w:t xml:space="preserve">, rồi gỡ. Đây là bằng chứng cho câu "không module nào khác truy cập được credential store".</w:t>
+      </w:r>
+    </w:p>
+    <w:p>
+      <w:pPr>
+        <w:pStyle w:val="Heading3"/>
+      </w:pPr>
+      <w:r>
+        <w:t xml:space="preserve">22.4 Definition of Done và archive</w:t>
+      </w:r>
+    </w:p>
+    <w:p>
+      <w:pPr>
+        <w:pStyle w:val="ListParagraph"/>
+        <w:numPr>
+          <w:ilvl w:val="0"/>
+          <w:numId w:val="1"/>
+        </w:numPr>
+      </w:pPr>
+      <w:r>
+        <w:t xml:space="preserve">Mỗi mục trong checklist DoD của design F02 được tick </w:t>
+      </w:r>
+      <w:r>
+        <w:rPr>
+          <w:b/>
+          <w:bCs/>
+        </w:rPr>
+        <w:t xml:space="preserve">kèm bằng chứng</w:t>
+      </w:r>
+      <w:r>
+        <w:t xml:space="preserve"> (tên test, số test, kết quả kiểm tra ngược), không tick chỉ vì code đã viết xong.</w:t>
+      </w:r>
+    </w:p>
+    <w:p>
+      <w:pPr>
+        <w:pStyle w:val="ListParagraph"/>
+        <w:numPr>
+          <w:ilvl w:val="0"/>
+          <w:numId w:val="1"/>
+        </w:numPr>
+      </w:pPr>
+      <w:r>
+        <w:t xml:space="preserve">Trước khi archive, spec được làm sạch: bỏ chữ "đề xuất" ở các quyết định đã chốt, vì spec sau archive mô tả hệ thống </w:t>
+      </w:r>
+      <w:r>
+        <w:rPr>
+          <w:b/>
+          <w:bCs/>
+        </w:rPr>
+        <w:t xml:space="preserve">đang chạy</w:t>
       </w:r>
       <w:r>
         <w:t xml:space="preserve">.</w:t>
@@ -14408,193 +14016,68 @@
       <w:r>
         <w:rPr>
           <w:rFonts w:ascii="Consolas" w:eastAsia="Consolas" w:hAnsi="Consolas" w:cs="Consolas"/>
-          <w:b/>
-          <w:bCs/>
-        </w:rPr>
-        <w:t xml:space="preserve">AssertablePublishedEvents</w:t>
-      </w:r>
-      <w:r>
-        <w:rPr>
-          <w:b/>
-          <w:bCs/>
-        </w:rPr>
-        <w:t xml:space="preserve"> làm tham số của method test:</w:t>
-      </w:r>
-      <w:r>
-        <w:t xml:space="preserve"> Spring Modulith ghi lại mọi event được publish trong test đó; </w:t>
-      </w:r>
-      <w:r>
-        <w:rPr>
-          <w:rFonts w:ascii="Consolas" w:eastAsia="Consolas" w:hAnsi="Consolas" w:cs="Consolas"/>
-        </w:rPr>
-        <w:t xml:space="preserve">events.ofType(AccountConnected.class)</w:t>
-      </w:r>
-      <w:r>
-        <w:t xml:space="preserve"> lấy ra để kiểm tra số lượng và nội dung.</w:t>
-      </w:r>
-    </w:p>
-    <w:p>
-      <w:pPr>
-        <w:pStyle w:val="ListParagraph"/>
-        <w:numPr>
-          <w:ilvl w:val="0"/>
-          <w:numId w:val="1"/>
-        </w:numPr>
-      </w:pPr>
-      <w:r>
-        <w:rPr>
-          <w:rFonts w:ascii="Consolas" w:eastAsia="Consolas" w:hAnsi="Consolas" w:cs="Consolas"/>
-          <w:b/>
-          <w:bCs/>
-        </w:rPr>
-        <w:t xml:space="preserve">@MockitoSpyBean</w:t>
-      </w:r>
-      <w:r>
-        <w:rPr>
-          <w:b/>
-          <w:bCs/>
-        </w:rPr>
-        <w:t xml:space="preserve">:</w:t>
-      </w:r>
-      <w:r>
-        <w:t xml:space="preserve"> bọc bean thật. Bình thường nó chạy code thật; riêng một test bảo nó ném lỗi bằng </w:t>
-      </w:r>
-      <w:r>
-        <w:rPr>
-          <w:rFonts w:ascii="Consolas" w:eastAsia="Consolas" w:hAnsi="Consolas" w:cs="Consolas"/>
-        </w:rPr>
-        <w:t xml:space="preserve">doThrow(...).when(credentials).save(any(), any(), any())</w:t>
-      </w:r>
-      <w:r>
-        <w:t xml:space="preserve">, để giả lập "lưu credential thất bại" mà không sửa code production. Assertion vẫn kiểm tra DB thật, không kiểm tra mock.</w:t>
-      </w:r>
-    </w:p>
-    <w:p>
-      <w:pPr>
-        <w:pStyle w:val="ListParagraph"/>
-        <w:numPr>
-          <w:ilvl w:val="0"/>
-          <w:numId w:val="1"/>
-        </w:numPr>
-      </w:pPr>
-      <w:r>
-        <w:rPr>
-          <w:b/>
-          <w:bCs/>
-        </w:rPr>
-        <w:t xml:space="preserve">Bean riêng cho test:</w:t>
-      </w:r>
-      <w:r>
-        <w:t xml:space="preserve"> một class </w:t>
-      </w:r>
-      <w:r>
-        <w:rPr>
-          <w:rFonts w:ascii="Consolas" w:eastAsia="Consolas" w:hAnsi="Consolas" w:cs="Consolas"/>
-        </w:rPr>
-        <w:t xml:space="preserve">@TestConfiguration</w:t>
-      </w:r>
-      <w:r>
-        <w:t xml:space="preserve"> lồng trong class test tạo </w:t>
-      </w:r>
-      <w:r>
-        <w:rPr>
-          <w:rFonts w:ascii="Consolas" w:eastAsia="Consolas" w:hAnsi="Consolas" w:cs="Consolas"/>
-        </w:rPr>
-        <w:t xml:space="preserve">FakeMessageProvider</w:t>
-      </w:r>
-      <w:r>
-        <w:t xml:space="preserve"> loại </w:t>
-      </w:r>
-      <w:r>
-        <w:rPr>
-          <w:rFonts w:ascii="Consolas" w:eastAsia="Consolas" w:hAnsi="Consolas" w:cs="Consolas"/>
-        </w:rPr>
-        <w:t xml:space="preserve">fake</w:t>
-      </w:r>
-      <w:r>
-        <w:t xml:space="preserve"> làm bean, để </w:t>
-      </w:r>
-      <w:r>
-        <w:rPr>
-          <w:rFonts w:ascii="Consolas" w:eastAsia="Consolas" w:hAnsi="Consolas" w:cs="Consolas"/>
-        </w:rPr>
-        <w:t xml:space="preserve">ProviderRegistry</w:t>
-      </w:r>
-      <w:r>
-        <w:t xml:space="preserve"> thấy provider này.</w:t>
-      </w:r>
-    </w:p>
-    <w:p>
-      <w:pPr>
-        <w:pStyle w:val="ListParagraph"/>
-        <w:numPr>
-          <w:ilvl w:val="0"/>
-          <w:numId w:val="1"/>
-        </w:numPr>
-      </w:pPr>
-      <w:r>
-        <w:rPr>
-          <w:rFonts w:ascii="Consolas" w:eastAsia="Consolas" w:hAnsi="Consolas" w:cs="Consolas"/>
-          <w:b/>
-          <w:bCs/>
-        </w:rPr>
-        <w:t xml:space="preserve">row_to_json(c)::text</w:t>
-      </w:r>
-      <w:r>
-        <w:rPr>
-          <w:b/>
-          <w:bCs/>
-        </w:rPr>
-        <w:t xml:space="preserve"> của PostgreSQL:</w:t>
-      </w:r>
-      <w:r>
-        <w:t xml:space="preserve"> biến cả một dòng thành chuỗi JSON để kiểm tra bằng một lệnh rằng </w:t>
-      </w:r>
-      <w:r>
-        <w:rPr>
-          <w:b/>
-          <w:bCs/>
-        </w:rPr>
-        <w:t xml:space="preserve">không cột nào</w:t>
-      </w:r>
-      <w:r>
-        <w:t xml:space="preserve"> chứa token dạng chữ.</w:t>
-      </w:r>
-    </w:p>
-    <w:p>
-      <w:pPr>
-        <w:pStyle w:val="ListParagraph"/>
-        <w:numPr>
-          <w:ilvl w:val="0"/>
-          <w:numId w:val="1"/>
-        </w:numPr>
-      </w:pPr>
-      <w:r>
-        <w:rPr>
-          <w:rFonts w:ascii="Consolas" w:eastAsia="Consolas" w:hAnsi="Consolas" w:cs="Consolas"/>
-          <w:b/>
-          <w:bCs/>
-        </w:rPr>
-        <w:t xml:space="preserve">entityManager.flush()</w:t>
-      </w:r>
-      <w:r>
-        <w:rPr>
-          <w:b/>
-          <w:bCs/>
-        </w:rPr>
-        <w:t xml:space="preserve"> để lộ lỗi:</w:t>
-      </w:r>
-      <w:r>
-        <w:t xml:space="preserve"> trong </w:t>
-      </w:r>
-      <w:r>
-        <w:rPr>
-          <w:rFonts w:ascii="Consolas" w:eastAsia="Consolas" w:hAnsi="Consolas" w:cs="Consolas"/>
-        </w:rPr>
-        <w:t xml:space="preserve">@DataJpaTest</w:t>
-      </w:r>
-      <w:r>
-        <w:t xml:space="preserve">, lệnh ghi chỉ thật sự xuống DB khi flush. Muốn thấy lỗi khóa ngoại thì phải flush ngay trong đoạn code đang chờ lỗi; test còn kiểm tra cả stack trace của lỗi đó không chứa token.</w:t>
+        </w:rPr>
+        <w:t xml:space="preserve">openspec archive be-f02-connected-accounts -y</w:t>
+      </w:r>
+      <w:r>
+        <w:t xml:space="preserve"> gộp delta spec vào </w:t>
+      </w:r>
+      <w:r>
+        <w:rPr>
+          <w:rFonts w:ascii="Consolas" w:eastAsia="Consolas" w:hAnsi="Consolas" w:cs="Consolas"/>
+        </w:rPr>
+        <w:t xml:space="preserve">openspec/specs/</w:t>
+      </w:r>
+      <w:r>
+        <w:t xml:space="preserve"> (ba spec mới: </w:t>
+      </w:r>
+      <w:r>
+        <w:rPr>
+          <w:rFonts w:ascii="Consolas" w:eastAsia="Consolas" w:hAnsi="Consolas" w:cs="Consolas"/>
+        </w:rPr>
+        <w:t xml:space="preserve">account-owner</w:t>
+      </w:r>
+      <w:r>
+        <w:t xml:space="preserve">, </w:t>
+      </w:r>
+      <w:r>
+        <w:rPr>
+          <w:rFonts w:ascii="Consolas" w:eastAsia="Consolas" w:hAnsi="Consolas" w:cs="Consolas"/>
+        </w:rPr>
+        <w:t xml:space="preserve">account-credentials</w:t>
+      </w:r>
+      <w:r>
+        <w:t xml:space="preserve">, </w:t>
+      </w:r>
+      <w:r>
+        <w:rPr>
+          <w:rFonts w:ascii="Consolas" w:eastAsia="Consolas" w:hAnsi="Consolas" w:cs="Consolas"/>
+        </w:rPr>
+        <w:t xml:space="preserve">connected-accounts</w:t>
+      </w:r>
+      <w:r>
+        <w:t xml:space="preserve">) và chuyển change vào </w:t>
+      </w:r>
+      <w:r>
+        <w:rPr>
+          <w:rFonts w:ascii="Consolas" w:eastAsia="Consolas" w:hAnsi="Consolas" w:cs="Consolas"/>
+        </w:rPr>
+        <w:t xml:space="preserve">openspec/changes/archive/</w:t>
+      </w:r>
+      <w:r>
+        <w:t xml:space="preserve">.</w:t>
+      </w:r>
+    </w:p>
+    <w:p>
+      <w:pPr>
+        <w:pStyle w:val="ListParagraph"/>
+        <w:numPr>
+          <w:ilvl w:val="0"/>
+          <w:numId w:val="1"/>
+        </w:numPr>
+      </w:pPr>
+      <w:r>
+        <w:t xml:space="preserve">Còn mở, là việc của người dùng: bảng 02B trên Notion chưa cập nhật theo D-12, D-13, D-14.</w:t>
       </w:r>
     </w:p>
     <w:p>
@@ -14610,7 +14093,1194 @@
         <w:pStyle w:val="Heading2"/>
       </w:pPr>
       <w:r>
-        <w:t xml:space="preserve">23. Tự kiểm tra F02 (phần đã làm)</w:t>
+        <w:t xml:space="preserve">23. Kỹ thuật test mới trong F02</w:t>
+      </w:r>
+    </w:p>
+    <w:p>
+      <w:pPr>
+        <w:pStyle w:val="ListParagraph"/>
+        <w:numPr>
+          <w:ilvl w:val="0"/>
+          <w:numId w:val="1"/>
+        </w:numPr>
+      </w:pPr>
+      <w:r>
+        <w:rPr>
+          <w:rFonts w:ascii="Consolas" w:eastAsia="Consolas" w:hAnsi="Consolas" w:cs="Consolas"/>
+          <w:b/>
+          <w:bCs/>
+        </w:rPr>
+        <w:t xml:space="preserve">@DataJpaTest</w:t>
+      </w:r>
+      <w:r>
+        <w:rPr>
+          <w:b/>
+          <w:bCs/>
+        </w:rPr>
+        <w:t xml:space="preserve"> + </w:t>
+      </w:r>
+      <w:r>
+        <w:rPr>
+          <w:rFonts w:ascii="Consolas" w:eastAsia="Consolas" w:hAnsi="Consolas" w:cs="Consolas"/>
+          <w:b/>
+          <w:bCs/>
+        </w:rPr>
+        <w:t xml:space="preserve">@AutoConfigureTestDatabase(replace = NONE)</w:t>
+      </w:r>
+      <w:r>
+        <w:rPr>
+          <w:b/>
+          <w:bCs/>
+        </w:rPr>
+        <w:t xml:space="preserve">:</w:t>
+      </w:r>
+      <w:r>
+        <w:t xml:space="preserve"> slice chỉ nạp JPA và Flyway, chạy trên PostgreSQL thật (Testcontainers) để </w:t>
+      </w:r>
+      <w:r>
+        <w:rPr>
+          <w:rFonts w:ascii="Consolas" w:eastAsia="Consolas" w:hAnsi="Consolas" w:cs="Consolas"/>
+        </w:rPr>
+        <w:t xml:space="preserve">CHECK</w:t>
+      </w:r>
+      <w:r>
+        <w:t xml:space="preserve">, </w:t>
+      </w:r>
+      <w:r>
+        <w:rPr>
+          <w:rFonts w:ascii="Consolas" w:eastAsia="Consolas" w:hAnsi="Consolas" w:cs="Consolas"/>
+        </w:rPr>
+        <w:t xml:space="preserve">UNIQUE</w:t>
+      </w:r>
+      <w:r>
+        <w:t xml:space="preserve">, khóa ngoại hoạt động như production. Mỗi test tự rollback.</w:t>
+      </w:r>
+    </w:p>
+    <w:p>
+      <w:pPr>
+        <w:pStyle w:val="ListParagraph"/>
+        <w:numPr>
+          <w:ilvl w:val="0"/>
+          <w:numId w:val="1"/>
+        </w:numPr>
+      </w:pPr>
+      <w:r>
+        <w:rPr>
+          <w:rFonts w:ascii="Consolas" w:eastAsia="Consolas" w:hAnsi="Consolas" w:cs="Consolas"/>
+          <w:b/>
+          <w:bCs/>
+        </w:rPr>
+        <w:t xml:space="preserve">entityManager.clear()</w:t>
+      </w:r>
+      <w:r>
+        <w:rPr>
+          <w:b/>
+          <w:bCs/>
+        </w:rPr>
+        <w:t xml:space="preserve">:</w:t>
+      </w:r>
+      <w:r>
+        <w:t xml:space="preserve"> xóa bộ nhớ đệm của Hibernate để lần đọc sau thật sự đi xuống DB. Không có nó, test chỉ đọc lại object trong bộ nhớ.</w:t>
+      </w:r>
+    </w:p>
+    <w:p>
+      <w:pPr>
+        <w:pStyle w:val="ListParagraph"/>
+        <w:numPr>
+          <w:ilvl w:val="0"/>
+          <w:numId w:val="1"/>
+        </w:numPr>
+      </w:pPr>
+      <w:r>
+        <w:rPr>
+          <w:rFonts w:ascii="Consolas" w:eastAsia="Consolas" w:hAnsi="Consolas" w:cs="Consolas"/>
+          <w:b/>
+          <w:bCs/>
+        </w:rPr>
+        <w:t xml:space="preserve">JdbcTemplate</w:t>
+      </w:r>
+      <w:r>
+        <w:rPr>
+          <w:b/>
+          <w:bCs/>
+        </w:rPr>
+        <w:t xml:space="preserve">:</w:t>
+      </w:r>
+      <w:r>
+        <w:t xml:space="preserve"> chạy SQL thô để nhìn đúng cái nằm trong DB, hoặc để thử ràng buộc mà Java không tạo ra được (ví dụ ghi </w:t>
+      </w:r>
+      <w:r>
+        <w:rPr>
+          <w:rFonts w:ascii="Consolas" w:eastAsia="Consolas" w:hAnsi="Consolas" w:cs="Consolas"/>
+        </w:rPr>
+        <w:t xml:space="preserve">status = 'SYNCING'</w:t>
+      </w:r>
+      <w:r>
+        <w:t xml:space="preserve">).</w:t>
+      </w:r>
+    </w:p>
+    <w:p>
+      <w:pPr>
+        <w:pStyle w:val="ListParagraph"/>
+        <w:numPr>
+          <w:ilvl w:val="0"/>
+          <w:numId w:val="1"/>
+        </w:numPr>
+      </w:pPr>
+      <w:r>
+        <w:rPr>
+          <w:rFonts w:ascii="Consolas" w:eastAsia="Consolas" w:hAnsi="Consolas" w:cs="Consolas"/>
+          <w:b/>
+          <w:bCs/>
+        </w:rPr>
+        <w:t xml:space="preserve">ApplicationContextRunner</w:t>
+      </w:r>
+      <w:r>
+        <w:rPr>
+          <w:b/>
+          <w:bCs/>
+        </w:rPr>
+        <w:t xml:space="preserve"> cho kiểm tra khởi động:</w:t>
+      </w:r>
+      <w:r>
+        <w:t xml:space="preserve"> dựng một context nhỏ với cấu hình sai để chứng minh app </w:t>
+      </w:r>
+      <w:r>
+        <w:rPr>
+          <w:b/>
+          <w:bCs/>
+        </w:rPr>
+        <w:t xml:space="preserve">không</w:t>
+      </w:r>
+      <w:r>
+        <w:t xml:space="preserve"> start và thông báo không lộ secret.</w:t>
+      </w:r>
+    </w:p>
+    <w:p>
+      <w:pPr>
+        <w:pStyle w:val="ListParagraph"/>
+        <w:numPr>
+          <w:ilvl w:val="0"/>
+          <w:numId w:val="1"/>
+        </w:numPr>
+      </w:pPr>
+      <w:r>
+        <w:rPr>
+          <w:b/>
+          <w:bCs/>
+        </w:rPr>
+        <w:t xml:space="preserve">Mockito </w:t>
+      </w:r>
+      <w:r>
+        <w:rPr>
+          <w:rFonts w:ascii="Consolas" w:eastAsia="Consolas" w:hAnsi="Consolas" w:cs="Consolas"/>
+          <w:b/>
+          <w:bCs/>
+        </w:rPr>
+        <w:t xml:space="preserve">mock(...)</w:t>
+      </w:r>
+      <w:r>
+        <w:rPr>
+          <w:b/>
+          <w:bCs/>
+        </w:rPr>
+        <w:t xml:space="preserve"> trong unit test:</w:t>
+      </w:r>
+      <w:r>
+        <w:t xml:space="preserve"> </w:t>
+      </w:r>
+      <w:r>
+        <w:rPr>
+          <w:rFonts w:ascii="Consolas" w:eastAsia="Consolas" w:hAnsi="Consolas" w:cs="Consolas"/>
+        </w:rPr>
+        <w:t xml:space="preserve">OwnerCurrentUserTests</w:t>
+      </w:r>
+      <w:r>
+        <w:t xml:space="preserve"> giả repository để test </w:t>
+      </w:r>
+      <w:r>
+        <w:rPr>
+          <w:rFonts w:ascii="Consolas" w:eastAsia="Consolas" w:hAnsi="Consolas" w:cs="Consolas"/>
+        </w:rPr>
+        <w:t xml:space="preserve">CurrentUser</w:t>
+      </w:r>
+      <w:r>
+        <w:t xml:space="preserve"> mà không cần DB.</w:t>
+      </w:r>
+    </w:p>
+    <w:p>
+      <w:pPr>
+        <w:pStyle w:val="ListParagraph"/>
+        <w:numPr>
+          <w:ilvl w:val="0"/>
+          <w:numId w:val="1"/>
+        </w:numPr>
+      </w:pPr>
+      <w:r>
+        <w:rPr>
+          <w:b/>
+          <w:bCs/>
+        </w:rPr>
+        <w:t xml:space="preserve">Kiểm tra ngược ở mọi task:</w:t>
+      </w:r>
+    </w:p>
+    <w:p>
+      <w:pPr>
+        <w:pStyle w:val="ListParagraph"/>
+        <w:numPr>
+          <w:ilvl w:val="1"/>
+          <w:numId w:val="1"/>
+        </w:numPr>
+      </w:pPr>
+      <w:r>
+        <w:t xml:space="preserve">BE-09: bỏ bước tìm theo email → 2 test idempotent đỏ.</w:t>
+      </w:r>
+    </w:p>
+    <w:p>
+      <w:pPr>
+        <w:pStyle w:val="ListParagraph"/>
+        <w:numPr>
+          <w:ilvl w:val="1"/>
+          <w:numId w:val="1"/>
+        </w:numPr>
+      </w:pPr>
+      <w:r>
+        <w:t xml:space="preserve">BE-10: cho </w:t>
+      </w:r>
+      <w:r>
+        <w:rPr>
+          <w:rFonts w:ascii="Consolas" w:eastAsia="Consolas" w:hAnsi="Consolas" w:cs="Consolas"/>
+        </w:rPr>
+        <w:t xml:space="preserve">markHealthy</w:t>
+      </w:r>
+      <w:r>
+        <w:t xml:space="preserve"> gỡ </w:t>
+      </w:r>
+      <w:r>
+        <w:rPr>
+          <w:rFonts w:ascii="Consolas" w:eastAsia="Consolas" w:hAnsi="Consolas" w:cs="Consolas"/>
+        </w:rPr>
+        <w:t xml:space="preserve">AUTH_EXPIRED</w:t>
+      </w:r>
+      <w:r>
+        <w:t xml:space="preserve"> → đúng ô đó đỏ.</w:t>
+      </w:r>
+    </w:p>
+    <w:p>
+      <w:pPr>
+        <w:pStyle w:val="ListParagraph"/>
+        <w:numPr>
+          <w:ilvl w:val="1"/>
+          <w:numId w:val="1"/>
+        </w:numPr>
+      </w:pPr>
+      <w:r>
+        <w:t xml:space="preserve">BE-12: IV cố định → 1 test đỏ; bỏ AAD → 3 test đỏ; tag 96 bit → 2 test đỏ.</w:t>
+      </w:r>
+    </w:p>
+    <w:p>
+      <w:pPr>
+        <w:pStyle w:val="ListParagraph"/>
+        <w:numPr>
+          <w:ilvl w:val="1"/>
+          <w:numId w:val="1"/>
+        </w:numPr>
+      </w:pPr>
+      <w:r>
+        <w:t xml:space="preserve">BE-13: store "quên" ghi refresh token → test xoay khóa đỏ.</w:t>
+      </w:r>
+    </w:p>
+    <w:p>
+      <w:pPr>
+        <w:pStyle w:val="ListParagraph"/>
+        <w:numPr>
+          <w:ilvl w:val="1"/>
+          <w:numId w:val="1"/>
+        </w:numPr>
+      </w:pPr>
+      <w:r>
+        <w:t xml:space="preserve">BE-14: bỏ </w:t>
+      </w:r>
+      <w:r>
+        <w:rPr>
+          <w:rFonts w:ascii="Consolas" w:eastAsia="Consolas" w:hAnsi="Consolas" w:cs="Consolas"/>
+        </w:rPr>
+        <w:t xml:space="preserve">@Transactional</w:t>
+      </w:r>
+      <w:r>
+        <w:t xml:space="preserve"> → test rollback và test reconnect đỏ; không tìm account cũ → test reconnect đỏ (lỗi </w:t>
+      </w:r>
+      <w:r>
+        <w:rPr>
+          <w:rFonts w:ascii="Consolas" w:eastAsia="Consolas" w:hAnsi="Consolas" w:cs="Consolas"/>
+        </w:rPr>
+        <w:t xml:space="preserve">UNIQUE</w:t>
+      </w:r>
+      <w:r>
+        <w:t xml:space="preserve">); bỏ kiểm tra provider → test provider lạ đỏ; </w:t>
+      </w:r>
+      <w:r>
+        <w:rPr>
+          <w:rFonts w:ascii="Consolas" w:eastAsia="Consolas" w:hAnsi="Consolas" w:cs="Consolas"/>
+        </w:rPr>
+        <w:t xml:space="preserve">reconnected</w:t>
+      </w:r>
+      <w:r>
+        <w:t xml:space="preserve"> luôn </w:t>
+      </w:r>
+      <w:r>
+        <w:rPr>
+          <w:rFonts w:ascii="Consolas" w:eastAsia="Consolas" w:hAnsi="Consolas" w:cs="Consolas"/>
+        </w:rPr>
+        <w:t xml:space="preserve">false</w:t>
+      </w:r>
+      <w:r>
+        <w:t xml:space="preserve"> → test reconnect đỏ; publish trước khi lưu credential → test rollback đỏ; thêm một trường vào event → test payload đỏ.</w:t>
+      </w:r>
+    </w:p>
+    <w:p>
+      <w:pPr>
+        <w:pStyle w:val="ListParagraph"/>
+        <w:numPr>
+          <w:ilvl w:val="1"/>
+          <w:numId w:val="1"/>
+        </w:numPr>
+      </w:pPr>
+      <w:r>
+        <w:t xml:space="preserve">BE-15: danh sách không lọc owner → 2 test đỏ; </w:t>
+      </w:r>
+      <w:r>
+        <w:rPr>
+          <w:rFonts w:ascii="Consolas" w:eastAsia="Consolas" w:hAnsi="Consolas" w:cs="Consolas"/>
+        </w:rPr>
+        <w:t xml:space="preserve">get</w:t>
+      </w:r>
+      <w:r>
+        <w:t xml:space="preserve"> không lọc owner → test cô lập đỏ; mới nhất trước → test thứ tự đỏ; </w:t>
+      </w:r>
+      <w:r>
+        <w:rPr>
+          <w:rFonts w:ascii="Consolas" w:eastAsia="Consolas" w:hAnsi="Consolas" w:cs="Consolas"/>
+        </w:rPr>
+        <w:t xml:space="preserve">ProviderRegistry.get</w:t>
+      </w:r>
+      <w:r>
+        <w:t xml:space="preserve"> thay </w:t>
+      </w:r>
+      <w:r>
+        <w:rPr>
+          <w:rFonts w:ascii="Consolas" w:eastAsia="Consolas" w:hAnsi="Consolas" w:cs="Consolas"/>
+        </w:rPr>
+        <w:t xml:space="preserve">find</w:t>
+      </w:r>
+      <w:r>
+        <w:t xml:space="preserve"> → test connector đã gỡ đỏ; </w:t>
+      </w:r>
+      <w:r>
+        <w:rPr>
+          <w:rFonts w:ascii="Consolas" w:eastAsia="Consolas" w:hAnsi="Consolas" w:cs="Consolas"/>
+        </w:rPr>
+        <w:t xml:space="preserve">ownerId</w:t>
+      </w:r>
+      <w:r>
+        <w:t xml:space="preserve"> lọt vào response → test tập trường đỏ; detail nói "của người khác" → test cô lập đỏ.</w:t>
+      </w:r>
+    </w:p>
+    <w:p>
+      <w:pPr>
+        <w:pStyle w:val="ListParagraph"/>
+        <w:numPr>
+          <w:ilvl w:val="1"/>
+          <w:numId w:val="1"/>
+        </w:numPr>
+      </w:pPr>
+      <w:r>
+        <w:t xml:space="preserve">BE-16 (10 lỗi, chạy bằng một script nhỏ áp từng lỗi rồi khôi phục): </w:t>
+      </w:r>
+      <w:r>
+        <w:rPr>
+          <w:rFonts w:ascii="Consolas" w:eastAsia="Consolas" w:hAnsi="Consolas" w:cs="Consolas"/>
+        </w:rPr>
+        <w:t xml:space="preserve">@Size</w:t>
+      </w:r>
+      <w:r>
+        <w:t xml:space="preserve"> thay luật domain → tên trắng ra 500 và 100 emoji bị từ chối; bỏ "ít nhất một trường" → test </w:t>
+      </w:r>
+      <w:r>
+        <w:rPr>
+          <w:rFonts w:ascii="Consolas" w:eastAsia="Consolas" w:hAnsi="Consolas" w:cs="Consolas"/>
+        </w:rPr>
+        <w:t xml:space="preserve">{}</w:t>
+      </w:r>
+      <w:r>
+        <w:t xml:space="preserve"> đỏ; đảo nghĩa </w:t>
+      </w:r>
+      <w:r>
+        <w:rPr>
+          <w:rFonts w:ascii="Consolas" w:eastAsia="Consolas" w:hAnsi="Consolas" w:cs="Consolas"/>
+        </w:rPr>
+        <w:t xml:space="preserve">enabled</w:t>
+      </w:r>
+      <w:r>
+        <w:t xml:space="preserve"> → 2 test đỏ; không phát event khi tắt → đỏ; phát event cả khi không đổi gì → 2 test đỏ; PATCH không lọc owner → đỏ; bỏ </w:t>
+      </w:r>
+      <w:r>
+        <w:rPr>
+          <w:rFonts w:ascii="Consolas" w:eastAsia="Consolas" w:hAnsi="Consolas" w:cs="Consolas"/>
+        </w:rPr>
+        <w:t xml:space="preserve">@Version</w:t>
+      </w:r>
+      <w:r>
+        <w:t xml:space="preserve"> → test version cũ đỏ; không phát event khi reconnect → đỏ; phát event ở mọi lần reconnect → đỏ; thêm trường vào event → đỏ.</w:t>
+      </w:r>
+    </w:p>
+    <w:p>
+      <w:pPr>
+        <w:pStyle w:val="ListParagraph"/>
+        <w:numPr>
+          <w:ilvl w:val="1"/>
+          <w:numId w:val="1"/>
+        </w:numPr>
+      </w:pPr>
+      <w:r>
+        <w:t xml:space="preserve">BE-17 (12 lỗi, cùng cách bằng script): </w:t>
+      </w:r>
+      <w:r>
+        <w:rPr>
+          <w:rFonts w:ascii="Consolas" w:eastAsia="Consolas" w:hAnsi="Consolas" w:cs="Consolas"/>
+        </w:rPr>
+        <w:t xml:space="preserve">remove</w:t>
+      </w:r>
+      <w:r>
+        <w:t xml:space="preserve"> không ghi gì → 7 test đỏ; cho xóa hai lần → đỏ; </w:t>
+      </w:r>
+      <w:r>
+        <w:rPr>
+          <w:rFonts w:ascii="Consolas" w:eastAsia="Consolas" w:hAnsi="Consolas" w:cs="Consolas"/>
+        </w:rPr>
+        <w:t xml:space="preserve">remove</w:t>
+      </w:r>
+      <w:r>
+        <w:t xml:space="preserve"> đổi </w:t>
+      </w:r>
+      <w:r>
+        <w:rPr>
+          <w:rFonts w:ascii="Consolas" w:eastAsia="Consolas" w:hAnsi="Consolas" w:cs="Consolas"/>
+        </w:rPr>
+        <w:t xml:space="preserve">status</w:t>
+      </w:r>
+      <w:r>
+        <w:t xml:space="preserve"> → đỏ; dùng lại account đã xóa mà không xóa </w:t>
+      </w:r>
+      <w:r>
+        <w:rPr>
+          <w:rFonts w:ascii="Consolas" w:eastAsia="Consolas" w:hAnsi="Consolas" w:cs="Consolas"/>
+        </w:rPr>
+        <w:t xml:space="preserve">removed_at</w:t>
+      </w:r>
+      <w:r>
+        <w:t xml:space="preserve"> → 2 đỏ; dùng lại mà không bật sync → 2 đỏ; mọi reconnect đều bật sync → đỏ; giữ lại credential → đỏ; không phát </w:t>
+      </w:r>
+      <w:r>
+        <w:rPr>
+          <w:rFonts w:ascii="Consolas" w:eastAsia="Consolas" w:hAnsi="Consolas" w:cs="Consolas"/>
+        </w:rPr>
+        <w:t xml:space="preserve">AccountRemoved</w:t>
+      </w:r>
+      <w:r>
+        <w:t xml:space="preserve"> → 2 đỏ; danh sách hiện account đã xóa → đỏ; GET thấy account đã xóa → đỏ; PATCH/DELETE với tới account đã xóa → đỏ; PATCH/DELETE bỏ qua owner → 2 đỏ.</w:t>
+      </w:r>
+    </w:p>
+    <w:p>
+      <w:pPr>
+        <w:pStyle w:val="ListParagraph"/>
+        <w:numPr>
+          <w:ilvl w:val="0"/>
+          <w:numId w:val="1"/>
+        </w:numPr>
+      </w:pPr>
+      <w:r>
+        <w:rPr>
+          <w:rFonts w:ascii="Consolas" w:eastAsia="Consolas" w:hAnsi="Consolas" w:cs="Consolas"/>
+          <w:b/>
+          <w:bCs/>
+        </w:rPr>
+        <w:t xml:space="preserve">@RecordApplicationEvents</w:t>
+      </w:r>
+      <w:r>
+        <w:rPr>
+          <w:b/>
+          <w:bCs/>
+        </w:rPr>
+        <w:t xml:space="preserve"> + </w:t>
+      </w:r>
+      <w:r>
+        <w:rPr>
+          <w:rFonts w:ascii="Consolas" w:eastAsia="Consolas" w:hAnsi="Consolas" w:cs="Consolas"/>
+          <w:b/>
+          <w:bCs/>
+        </w:rPr>
+        <w:t xml:space="preserve">ApplicationEvents</w:t>
+      </w:r>
+      <w:r>
+        <w:rPr>
+          <w:b/>
+          <w:bCs/>
+        </w:rPr>
+        <w:t xml:space="preserve"> (Spring Test, BE-16):</w:t>
+      </w:r>
+      <w:r>
+        <w:t xml:space="preserve"> ghi lại event được publish trong một test </w:t>
+      </w:r>
+      <w:r>
+        <w:rPr>
+          <w:rFonts w:ascii="Consolas" w:eastAsia="Consolas" w:hAnsi="Consolas" w:cs="Consolas"/>
+        </w:rPr>
+        <w:t xml:space="preserve">@SpringBootTest</w:t>
+      </w:r>
+      <w:r>
+        <w:t xml:space="preserve">; </w:t>
+      </w:r>
+      <w:r>
+        <w:rPr>
+          <w:rFonts w:ascii="Consolas" w:eastAsia="Consolas" w:hAnsi="Consolas" w:cs="Consolas"/>
+        </w:rPr>
+        <w:t xml:space="preserve">events.stream(AccountStatusChanged.class)</w:t>
+      </w:r>
+      <w:r>
+        <w:t xml:space="preserve"> lấy ra để kiểm tra. </w:t>
+      </w:r>
+      <w:r>
+        <w:rPr>
+          <w:rFonts w:ascii="Consolas" w:eastAsia="Consolas" w:hAnsi="Consolas" w:cs="Consolas"/>
+        </w:rPr>
+        <w:t xml:space="preserve">AssertablePublishedEvents</w:t>
+      </w:r>
+      <w:r>
+        <w:t xml:space="preserve"> là cách tương tự của Spring Modulith, dùng trong module test.</w:t>
+      </w:r>
+    </w:p>
+    <w:p>
+      <w:pPr>
+        <w:pStyle w:val="ListParagraph"/>
+        <w:numPr>
+          <w:ilvl w:val="0"/>
+          <w:numId w:val="1"/>
+        </w:numPr>
+      </w:pPr>
+      <w:r>
+        <w:rPr>
+          <w:rFonts w:ascii="Consolas" w:eastAsia="Consolas" w:hAnsi="Consolas" w:cs="Consolas"/>
+          <w:b/>
+          <w:bCs/>
+        </w:rPr>
+        <w:t xml:space="preserve">TransactionTemplate</w:t>
+      </w:r>
+      <w:r>
+        <w:rPr>
+          <w:b/>
+          <w:bCs/>
+        </w:rPr>
+        <w:t xml:space="preserve"> trong test (BE-16):</w:t>
+      </w:r>
+      <w:r>
+        <w:t xml:space="preserve"> mở transaction bằng code để chen một bước vào giữa. Test gọi service (đã đọc </w:t>
+      </w:r>
+      <w:r>
+        <w:rPr>
+          <w:rFonts w:ascii="Consolas" w:eastAsia="Consolas" w:hAnsi="Consolas" w:cs="Consolas"/>
+        </w:rPr>
+        <w:t xml:space="preserve">version</w:t>
+      </w:r>
+      <w:r>
+        <w:t xml:space="preserve"> cũ), rồi giả "một request khác" bằng </w:t>
+      </w:r>
+      <w:r>
+        <w:rPr>
+          <w:rFonts w:ascii="Consolas" w:eastAsia="Consolas" w:hAnsi="Consolas" w:cs="Consolas"/>
+        </w:rPr>
+        <w:t xml:space="preserve">UPDATE ... SET version = version + 1</w:t>
+      </w:r>
+      <w:r>
+        <w:t xml:space="preserve"> trong cùng transaction; lúc commit phải ra </w:t>
+      </w:r>
+      <w:r>
+        <w:rPr>
+          <w:rFonts w:ascii="Consolas" w:eastAsia="Consolas" w:hAnsi="Consolas" w:cs="Consolas"/>
+        </w:rPr>
+        <w:t xml:space="preserve">OptimisticLockingFailureException</w:t>
+      </w:r>
+      <w:r>
+        <w:t xml:space="preserve">. Qua MockMvc không canh được hai request chạy chồng nhau, nên phần đổi lỗi thành 409 dựa vào test có sẵn của F01.</w:t>
+      </w:r>
+    </w:p>
+    <w:p>
+      <w:pPr>
+        <w:pStyle w:val="ListParagraph"/>
+        <w:numPr>
+          <w:ilvl w:val="0"/>
+          <w:numId w:val="1"/>
+        </w:numPr>
+      </w:pPr>
+      <w:r>
+        <w:rPr>
+          <w:b/>
+          <w:bCs/>
+        </w:rPr>
+        <w:t xml:space="preserve">Test payload của event gom về một chỗ (BE-17):</w:t>
+      </w:r>
+      <w:r>
+        <w:t xml:space="preserve"> </w:t>
+      </w:r>
+      <w:r>
+        <w:rPr>
+          <w:rFonts w:ascii="Consolas" w:eastAsia="Consolas" w:hAnsi="Consolas" w:cs="Consolas"/>
+        </w:rPr>
+        <w:t xml:space="preserve">AccountEventsTests</w:t>
+      </w:r>
+      <w:r>
+        <w:t xml:space="preserve"> (package </w:t>
+      </w:r>
+      <w:r>
+        <w:rPr>
+          <w:rFonts w:ascii="Consolas" w:eastAsia="Consolas" w:hAnsi="Consolas" w:cs="Consolas"/>
+        </w:rPr>
+        <w:t xml:space="preserve">dev.sino.account</w:t>
+      </w:r>
+      <w:r>
+        <w:t xml:space="preserve">) kiểm tên các trường của cả ba event bằng </w:t>
+      </w:r>
+      <w:r>
+        <w:rPr>
+          <w:rFonts w:ascii="Consolas" w:eastAsia="Consolas" w:hAnsi="Consolas" w:cs="Consolas"/>
+        </w:rPr>
+        <w:t xml:space="preserve">getRecordComponents()</w:t>
+      </w:r>
+      <w:r>
+        <w:t xml:space="preserve">. Đây là unit test thuần, không cần Spring, nên tách khỏi module test của luồng đăng ký.</w:t>
+      </w:r>
+    </w:p>
+    <w:p>
+      <w:pPr>
+        <w:pStyle w:val="ListParagraph"/>
+        <w:numPr>
+          <w:ilvl w:val="0"/>
+          <w:numId w:val="1"/>
+        </w:numPr>
+      </w:pPr>
+      <w:r>
+        <w:rPr>
+          <w:b/>
+          <w:bCs/>
+        </w:rPr>
+        <w:t xml:space="preserve">Chạy cả ứng dụng thay cho web slice (BE-15):</w:t>
+      </w:r>
+      <w:r>
+        <w:t xml:space="preserve"> </w:t>
+      </w:r>
+      <w:r>
+        <w:rPr>
+          <w:rFonts w:ascii="Consolas" w:eastAsia="Consolas" w:hAnsi="Consolas" w:cs="Consolas"/>
+        </w:rPr>
+        <w:t xml:space="preserve">@SpringBootTest</w:t>
+      </w:r>
+      <w:r>
+        <w:t xml:space="preserve"> + </w:t>
+      </w:r>
+      <w:r>
+        <w:rPr>
+          <w:rFonts w:ascii="Consolas" w:eastAsia="Consolas" w:hAnsi="Consolas" w:cs="Consolas"/>
+        </w:rPr>
+        <w:t xml:space="preserve">@AutoConfigureMockMvc</w:t>
+      </w:r>
+      <w:r>
+        <w:t xml:space="preserve"> gửi request HTTP giả qua đúng các lớp thật: security, </w:t>
+      </w:r>
+      <w:r>
+        <w:rPr>
+          <w:rFonts w:ascii="Consolas" w:eastAsia="Consolas" w:hAnsi="Consolas" w:cs="Consolas"/>
+        </w:rPr>
+        <w:t xml:space="preserve">CurrentUser</w:t>
+      </w:r>
+      <w:r>
+        <w:t xml:space="preserve">, service, PostgreSQL, error handler, Jackson. Chọn thay cho </w:t>
+      </w:r>
+      <w:r>
+        <w:rPr>
+          <w:rFonts w:ascii="Consolas" w:eastAsia="Consolas" w:hAnsi="Consolas" w:cs="Consolas"/>
+        </w:rPr>
+        <w:t xml:space="preserve">@WebMvcTest</w:t>
+      </w:r>
+      <w:r>
+        <w:t xml:space="preserve"> với service giả vì test cô lập dữ liệu phải chạy trên dữ liệu thật; với service giả, test chỉ kiểm tra cái mock.</w:t>
+      </w:r>
+    </w:p>
+    <w:p>
+      <w:pPr>
+        <w:pStyle w:val="ListParagraph"/>
+        <w:numPr>
+          <w:ilvl w:val="0"/>
+          <w:numId w:val="1"/>
+        </w:numPr>
+      </w:pPr>
+      <w:r>
+        <w:rPr>
+          <w:b/>
+          <w:bCs/>
+        </w:rPr>
+        <w:t xml:space="preserve">Ghim thời điểm bằng SQL:</w:t>
+      </w:r>
+      <w:r>
+        <w:t xml:space="preserve"> </w:t>
+      </w:r>
+      <w:r>
+        <w:rPr>
+          <w:rFonts w:ascii="Consolas" w:eastAsia="Consolas" w:hAnsi="Consolas" w:cs="Consolas"/>
+        </w:rPr>
+        <w:t xml:space="preserve">@PrePersist</w:t>
+      </w:r>
+      <w:r>
+        <w:t xml:space="preserve"> điền </w:t>
+      </w:r>
+      <w:r>
+        <w:rPr>
+          <w:rFonts w:ascii="Consolas" w:eastAsia="Consolas" w:hAnsi="Consolas" w:cs="Consolas"/>
+        </w:rPr>
+        <w:t xml:space="preserve">created_at</w:t>
+      </w:r>
+      <w:r>
+        <w:t xml:space="preserve"> bằng giờ thật nên không biết trước. Test ghi đè bằng </w:t>
+      </w:r>
+      <w:r>
+        <w:rPr>
+          <w:rFonts w:ascii="Consolas" w:eastAsia="Consolas" w:hAnsi="Consolas" w:cs="Consolas"/>
+        </w:rPr>
+        <w:t xml:space="preserve">UPDATE connected_account SET created_at = ?</w:t>
+      </w:r>
+      <w:r>
+        <w:t xml:space="preserve"> để biết chắc thứ tự và chuỗi JSON mong đợi (</w:t>
+      </w:r>
+      <w:r>
+        <w:rPr>
+          <w:rFonts w:ascii="Consolas" w:eastAsia="Consolas" w:hAnsi="Consolas" w:cs="Consolas"/>
+        </w:rPr>
+        <w:t xml:space="preserve">2026-10-05T03:15:00Z</w:t>
+      </w:r>
+      <w:r>
+        <w:t xml:space="preserve">). Account "mới hơn" được tạo </w:t>
+      </w:r>
+      <w:r>
+        <w:rPr>
+          <w:b/>
+          <w:bCs/>
+        </w:rPr>
+        <w:t xml:space="preserve">trước</w:t>
+      </w:r>
+      <w:r>
+        <w:t xml:space="preserve">, để test thứ tự không thể xanh chỉ nhờ thứ tự chèn.</w:t>
+      </w:r>
+    </w:p>
+    <w:p>
+      <w:pPr>
+        <w:pStyle w:val="ListParagraph"/>
+        <w:numPr>
+          <w:ilvl w:val="0"/>
+          <w:numId w:val="1"/>
+        </w:numPr>
+      </w:pPr>
+      <w:r>
+        <w:rPr>
+          <w:rFonts w:ascii="Consolas" w:eastAsia="Consolas" w:hAnsi="Consolas" w:cs="Consolas"/>
+          <w:b/>
+          <w:bCs/>
+        </w:rPr>
+        <w:t xml:space="preserve">JsonPath.read(body, "$")</w:t>
+      </w:r>
+      <w:r>
+        <w:rPr>
+          <w:b/>
+          <w:bCs/>
+        </w:rPr>
+        <w:t xml:space="preserve">:</w:t>
+      </w:r>
+      <w:r>
+        <w:t xml:space="preserve"> đọc JSON thành </w:t>
+      </w:r>
+      <w:r>
+        <w:rPr>
+          <w:rFonts w:ascii="Consolas" w:eastAsia="Consolas" w:hAnsi="Consolas" w:cs="Consolas"/>
+        </w:rPr>
+        <w:t xml:space="preserve">Map</w:t>
+      </w:r>
+      <w:r>
+        <w:t xml:space="preserve"> để so tập tên trường.</w:t>
+      </w:r>
+    </w:p>
+    <w:p>
+      <w:pPr>
+        <w:pStyle w:val="ListParagraph"/>
+        <w:numPr>
+          <w:ilvl w:val="0"/>
+          <w:numId w:val="1"/>
+        </w:numPr>
+      </w:pPr>
+      <w:r>
+        <w:rPr>
+          <w:rFonts w:ascii="Consolas" w:eastAsia="Consolas" w:hAnsi="Consolas" w:cs="Consolas"/>
+          <w:b/>
+          <w:bCs/>
+        </w:rPr>
+        <w:t xml:space="preserve">@ApplicationModuleTest(mode = DIRECT_DEPENDENCIES)</w:t>
+      </w:r>
+      <w:r>
+        <w:rPr>
+          <w:b/>
+          <w:bCs/>
+        </w:rPr>
+        <w:t xml:space="preserve"> (Spring Modulith, BE-14):</w:t>
+      </w:r>
+      <w:r>
+        <w:t xml:space="preserve"> chỉ khởi động module </w:t>
+      </w:r>
+      <w:r>
+        <w:rPr>
+          <w:rFonts w:ascii="Consolas" w:eastAsia="Consolas" w:hAnsi="Consolas" w:cs="Consolas"/>
+        </w:rPr>
+        <w:t xml:space="preserve">account</w:t>
+      </w:r>
+      <w:r>
+        <w:t xml:space="preserve"> cộng các module nó dùng trực tiếp, không phải cả ứng dụng. Lúc làm BE-14 đó chỉ là </w:t>
+      </w:r>
+      <w:r>
+        <w:rPr>
+          <w:rFonts w:ascii="Consolas" w:eastAsia="Consolas" w:hAnsi="Consolas" w:cs="Consolas"/>
+        </w:rPr>
+        <w:t xml:space="preserve">provider</w:t>
+      </w:r>
+      <w:r>
+        <w:t xml:space="preserve">; từ BE-15, </w:t>
+      </w:r>
+      <w:r>
+        <w:rPr>
+          <w:rFonts w:ascii="Consolas" w:eastAsia="Consolas" w:hAnsi="Consolas" w:cs="Consolas"/>
+        </w:rPr>
+        <w:t xml:space="preserve">account</w:t>
+      </w:r>
+      <w:r>
+        <w:t xml:space="preserve"> dùng thêm </w:t>
+      </w:r>
+      <w:r>
+        <w:rPr>
+          <w:rFonts w:ascii="Consolas" w:eastAsia="Consolas" w:hAnsi="Consolas" w:cs="Consolas"/>
+        </w:rPr>
+        <w:t xml:space="preserve">CurrentUser</w:t>
+      </w:r>
+      <w:r>
+        <w:t xml:space="preserve"> (module </w:t>
+      </w:r>
+      <w:r>
+        <w:rPr>
+          <w:rFonts w:ascii="Consolas" w:eastAsia="Consolas" w:hAnsi="Consolas" w:cs="Consolas"/>
+        </w:rPr>
+        <w:t xml:space="preserve">identity</w:t>
+      </w:r>
+      <w:r>
+        <w:t xml:space="preserve">) và mã lỗi của </w:t>
+      </w:r>
+      <w:r>
+        <w:rPr>
+          <w:rFonts w:ascii="Consolas" w:eastAsia="Consolas" w:hAnsi="Consolas" w:cs="Consolas"/>
+        </w:rPr>
+        <w:t xml:space="preserve">common</w:t>
+      </w:r>
+      <w:r>
+        <w:t xml:space="preserve">, nên hai module này cũng được nạp. Test vẫn tự dọn bảng và tự chèn owner của nó vào </w:t>
+      </w:r>
+      <w:r>
+        <w:rPr>
+          <w:rFonts w:ascii="Consolas" w:eastAsia="Consolas" w:hAnsi="Consolas" w:cs="Consolas"/>
+        </w:rPr>
+        <w:t xml:space="preserve">app_user</w:t>
+      </w:r>
+      <w:r>
+        <w:t xml:space="preserve"> bằng </w:t>
+      </w:r>
+      <w:r>
+        <w:rPr>
+          <w:rFonts w:ascii="Consolas" w:eastAsia="Consolas" w:hAnsi="Consolas" w:cs="Consolas"/>
+        </w:rPr>
+        <w:t xml:space="preserve">JdbcTemplate</w:t>
+      </w:r>
+      <w:r>
+        <w:t xml:space="preserve">, nên không phụ thuộc owner được tạo lúc khởi động.</w:t>
+      </w:r>
+    </w:p>
+    <w:p>
+      <w:pPr>
+        <w:pStyle w:val="ListParagraph"/>
+        <w:numPr>
+          <w:ilvl w:val="0"/>
+          <w:numId w:val="1"/>
+        </w:numPr>
+      </w:pPr>
+      <w:r>
+        <w:rPr>
+          <w:b/>
+          <w:bCs/>
+        </w:rPr>
+        <w:t xml:space="preserve">Test không có </w:t>
+      </w:r>
+      <w:r>
+        <w:rPr>
+          <w:rFonts w:ascii="Consolas" w:eastAsia="Consolas" w:hAnsi="Consolas" w:cs="Consolas"/>
+          <w:b/>
+          <w:bCs/>
+        </w:rPr>
+        <w:t xml:space="preserve">@Transactional</w:t>
+      </w:r>
+      <w:r>
+        <w:rPr>
+          <w:b/>
+          <w:bCs/>
+        </w:rPr>
+        <w:t xml:space="preserve">:</w:t>
+      </w:r>
+      <w:r>
+        <w:t xml:space="preserve"> để service tự commit hoặc rollback như khi chạy thật. Cái giá là dữ liệu ở lại sau mỗi test, nên </w:t>
+      </w:r>
+      <w:r>
+        <w:rPr>
+          <w:rFonts w:ascii="Consolas" w:eastAsia="Consolas" w:hAnsi="Consolas" w:cs="Consolas"/>
+        </w:rPr>
+        <w:t xml:space="preserve">@BeforeEach</w:t>
+      </w:r>
+      <w:r>
+        <w:t xml:space="preserve"> tự dọn bảng bằng </w:t>
+      </w:r>
+      <w:r>
+        <w:rPr>
+          <w:rFonts w:ascii="Consolas" w:eastAsia="Consolas" w:hAnsi="Consolas" w:cs="Consolas"/>
+        </w:rPr>
+        <w:t xml:space="preserve">JdbcTestUtils.deleteFromTables</w:t>
+      </w:r>
+      <w:r>
+        <w:t xml:space="preserve">.</w:t>
+      </w:r>
+    </w:p>
+    <w:p>
+      <w:pPr>
+        <w:pStyle w:val="ListParagraph"/>
+        <w:numPr>
+          <w:ilvl w:val="0"/>
+          <w:numId w:val="1"/>
+        </w:numPr>
+      </w:pPr>
+      <w:r>
+        <w:rPr>
+          <w:rFonts w:ascii="Consolas" w:eastAsia="Consolas" w:hAnsi="Consolas" w:cs="Consolas"/>
+          <w:b/>
+          <w:bCs/>
+        </w:rPr>
+        <w:t xml:space="preserve">AssertablePublishedEvents</w:t>
+      </w:r>
+      <w:r>
+        <w:rPr>
+          <w:b/>
+          <w:bCs/>
+        </w:rPr>
+        <w:t xml:space="preserve"> làm tham số của method test:</w:t>
+      </w:r>
+      <w:r>
+        <w:t xml:space="preserve"> Spring Modulith ghi lại mọi event được publish trong test đó; </w:t>
+      </w:r>
+      <w:r>
+        <w:rPr>
+          <w:rFonts w:ascii="Consolas" w:eastAsia="Consolas" w:hAnsi="Consolas" w:cs="Consolas"/>
+        </w:rPr>
+        <w:t xml:space="preserve">events.ofType(AccountConnected.class)</w:t>
+      </w:r>
+      <w:r>
+        <w:t xml:space="preserve"> lấy ra để kiểm tra số lượng và nội dung.</w:t>
+      </w:r>
+    </w:p>
+    <w:p>
+      <w:pPr>
+        <w:pStyle w:val="ListParagraph"/>
+        <w:numPr>
+          <w:ilvl w:val="0"/>
+          <w:numId w:val="1"/>
+        </w:numPr>
+      </w:pPr>
+      <w:r>
+        <w:rPr>
+          <w:rFonts w:ascii="Consolas" w:eastAsia="Consolas" w:hAnsi="Consolas" w:cs="Consolas"/>
+          <w:b/>
+          <w:bCs/>
+        </w:rPr>
+        <w:t xml:space="preserve">@MockitoSpyBean</w:t>
+      </w:r>
+      <w:r>
+        <w:rPr>
+          <w:b/>
+          <w:bCs/>
+        </w:rPr>
+        <w:t xml:space="preserve">:</w:t>
+      </w:r>
+      <w:r>
+        <w:t xml:space="preserve"> bọc bean thật. Bình thường nó chạy code thật; riêng một test bảo nó ném lỗi bằng </w:t>
+      </w:r>
+      <w:r>
+        <w:rPr>
+          <w:rFonts w:ascii="Consolas" w:eastAsia="Consolas" w:hAnsi="Consolas" w:cs="Consolas"/>
+        </w:rPr>
+        <w:t xml:space="preserve">doThrow(...).when(credentials).save(any(), any(), any())</w:t>
+      </w:r>
+      <w:r>
+        <w:t xml:space="preserve">, để giả lập "lưu credential thất bại" mà không sửa code production. Assertion vẫn kiểm tra DB thật, không kiểm tra mock.</w:t>
+      </w:r>
+    </w:p>
+    <w:p>
+      <w:pPr>
+        <w:pStyle w:val="ListParagraph"/>
+        <w:numPr>
+          <w:ilvl w:val="0"/>
+          <w:numId w:val="1"/>
+        </w:numPr>
+      </w:pPr>
+      <w:r>
+        <w:rPr>
+          <w:b/>
+          <w:bCs/>
+        </w:rPr>
+        <w:t xml:space="preserve">Bean riêng cho test:</w:t>
+      </w:r>
+      <w:r>
+        <w:t xml:space="preserve"> một class </w:t>
+      </w:r>
+      <w:r>
+        <w:rPr>
+          <w:rFonts w:ascii="Consolas" w:eastAsia="Consolas" w:hAnsi="Consolas" w:cs="Consolas"/>
+        </w:rPr>
+        <w:t xml:space="preserve">@TestConfiguration</w:t>
+      </w:r>
+      <w:r>
+        <w:t xml:space="preserve"> lồng trong class test tạo </w:t>
+      </w:r>
+      <w:r>
+        <w:rPr>
+          <w:rFonts w:ascii="Consolas" w:eastAsia="Consolas" w:hAnsi="Consolas" w:cs="Consolas"/>
+        </w:rPr>
+        <w:t xml:space="preserve">FakeMessageProvider</w:t>
+      </w:r>
+      <w:r>
+        <w:t xml:space="preserve"> loại </w:t>
+      </w:r>
+      <w:r>
+        <w:rPr>
+          <w:rFonts w:ascii="Consolas" w:eastAsia="Consolas" w:hAnsi="Consolas" w:cs="Consolas"/>
+        </w:rPr>
+        <w:t xml:space="preserve">fake</w:t>
+      </w:r>
+      <w:r>
+        <w:t xml:space="preserve"> làm bean, để </w:t>
+      </w:r>
+      <w:r>
+        <w:rPr>
+          <w:rFonts w:ascii="Consolas" w:eastAsia="Consolas" w:hAnsi="Consolas" w:cs="Consolas"/>
+        </w:rPr>
+        <w:t xml:space="preserve">ProviderRegistry</w:t>
+      </w:r>
+      <w:r>
+        <w:t xml:space="preserve"> thấy provider này.</w:t>
+      </w:r>
+    </w:p>
+    <w:p>
+      <w:pPr>
+        <w:pStyle w:val="ListParagraph"/>
+        <w:numPr>
+          <w:ilvl w:val="0"/>
+          <w:numId w:val="1"/>
+        </w:numPr>
+      </w:pPr>
+      <w:r>
+        <w:rPr>
+          <w:rFonts w:ascii="Consolas" w:eastAsia="Consolas" w:hAnsi="Consolas" w:cs="Consolas"/>
+          <w:b/>
+          <w:bCs/>
+        </w:rPr>
+        <w:t xml:space="preserve">row_to_json(c)::text</w:t>
+      </w:r>
+      <w:r>
+        <w:rPr>
+          <w:b/>
+          <w:bCs/>
+        </w:rPr>
+        <w:t xml:space="preserve"> của PostgreSQL:</w:t>
+      </w:r>
+      <w:r>
+        <w:t xml:space="preserve"> biến cả một dòng thành chuỗi JSON để kiểm tra bằng một lệnh rằng </w:t>
+      </w:r>
+      <w:r>
+        <w:rPr>
+          <w:b/>
+          <w:bCs/>
+        </w:rPr>
+        <w:t xml:space="preserve">không cột nào</w:t>
+      </w:r>
+      <w:r>
+        <w:t xml:space="preserve"> chứa token dạng chữ.</w:t>
+      </w:r>
+    </w:p>
+    <w:p>
+      <w:pPr>
+        <w:pStyle w:val="ListParagraph"/>
+        <w:numPr>
+          <w:ilvl w:val="0"/>
+          <w:numId w:val="1"/>
+        </w:numPr>
+      </w:pPr>
+      <w:r>
+        <w:rPr>
+          <w:rFonts w:ascii="Consolas" w:eastAsia="Consolas" w:hAnsi="Consolas" w:cs="Consolas"/>
+          <w:b/>
+          <w:bCs/>
+        </w:rPr>
+        <w:t xml:space="preserve">entityManager.flush()</w:t>
+      </w:r>
+      <w:r>
+        <w:rPr>
+          <w:b/>
+          <w:bCs/>
+        </w:rPr>
+        <w:t xml:space="preserve"> để lộ lỗi:</w:t>
+      </w:r>
+      <w:r>
+        <w:t xml:space="preserve"> trong </w:t>
+      </w:r>
+      <w:r>
+        <w:rPr>
+          <w:rFonts w:ascii="Consolas" w:eastAsia="Consolas" w:hAnsi="Consolas" w:cs="Consolas"/>
+        </w:rPr>
+        <w:t xml:space="preserve">@DataJpaTest</w:t>
+      </w:r>
+      <w:r>
+        <w:t xml:space="preserve">, lệnh ghi chỉ thật sự xuống DB khi flush. Muốn thấy lỗi khóa ngoại thì phải flush ngay trong đoạn code đang chờ lỗi; test còn kiểm tra cả stack trace của lỗi đó không chứa token.</w:t>
+      </w:r>
+    </w:p>
+    <w:p>
+      <w:pPr>
+        <w:pBdr>
+          <w:bottom w:val="single" w:sz="4" w:space="0" w:color="auto"/>
+        </w:pBdr>
+        <w:ind w:left="0"/>
+      </w:pPr>
+    </w:p>
+    <w:p>
+      <w:pPr>
+        <w:pStyle w:val="Heading2"/>
+      </w:pPr>
+      <w:r>
+        <w:t xml:space="preserve">24. Tự kiểm tra F02</w:t>
       </w:r>
     </w:p>
     <w:p>
@@ -15214,14 +15884,518 @@
       </w:r>
     </w:p>
     <w:p>
-      <w:r>
-        <w:rPr>
-          <w:i/>
-          <w:iCs/>
-        </w:rPr>
-        <w:t xml:space="preserve">(Phần BE-18 — kiểm tra end-to-end và nghiệm thu F02 — sẽ được bổ sung khi làm.)</w:t>
-      </w:r>
-    </w:p>
+      <w:pPr>
+        <w:pStyle w:val="ListParagraph"/>
+        <w:numPr>
+          <w:ilvl w:val="0"/>
+          <w:numId w:val="101"/>
+        </w:numPr>
+      </w:pPr>
+      <w:r>
+        <w:t xml:space="preserve">Vì sao test end-to-end bật log DEBUG, và vì sao nó còn phải kiểm tra rằng log </w:t>
+      </w:r>
+      <w:r>
+        <w:rPr>
+          <w:b/>
+          <w:bCs/>
+        </w:rPr>
+        <w:t xml:space="preserve">có</w:t>
+      </w:r>
+      <w:r>
+        <w:t xml:space="preserve"> chạy?</w:t>
+      </w:r>
+    </w:p>
+    <w:p>
+      <w:pPr>
+        <w:pStyle w:val="ListParagraph"/>
+        <w:numPr>
+          <w:ilvl w:val="0"/>
+          <w:numId w:val="101"/>
+        </w:numPr>
+      </w:pPr>
+      <w:r>
+        <w:t xml:space="preserve">Test viết sau code thì làm sao biết nó có thể đỏ?</w:t>
+      </w:r>
+    </w:p>
+    <w:p>
+      <w:pPr>
+        <w:pStyle w:val="Heading3"/>
+      </w:pPr>
+      <w:r>
+        <w:t xml:space="preserve">Năm câu hỏi chốt của F02 (có đáp án ngắn)</w:t>
+      </w:r>
+    </w:p>
+    <w:p>
+      <w:r>
+        <w:t xml:space="preserve">Đây là năm câu BE-18 yêu cầu trả lời. Hãy tự trả lời trước, rồi mới đọc đáp án.</w:t>
+      </w:r>
+    </w:p>
+    <w:p>
+      <w:r>
+        <w:rPr>
+          <w:b/>
+          <w:bCs/>
+        </w:rPr>
+        <w:t xml:space="preserve">1. AES-GCM, IV và AAD chống lại những gì?</w:t>
+      </w:r>
+      <w:r>
+        <w:t xml:space="preserve"> (mục 17.2)</w:t>
+      </w:r>
+    </w:p>
+    <w:p>
+      <w:pPr>
+        <w:pStyle w:val="ListParagraph"/>
+        <w:numPr>
+          <w:ilvl w:val="0"/>
+          <w:numId w:val="1"/>
+        </w:numPr>
+      </w:pPr>
+      <w:r>
+        <w:t xml:space="preserve">Khóa nằm ngoài DB, nên một bản backup DB bị lộ vẫn không đọc được token.</w:t>
+      </w:r>
+    </w:p>
+    <w:p>
+      <w:pPr>
+        <w:pStyle w:val="ListParagraph"/>
+        <w:numPr>
+          <w:ilvl w:val="0"/>
+          <w:numId w:val="1"/>
+        </w:numPr>
+      </w:pPr>
+      <w:r>
+        <w:t xml:space="preserve">Con dấu (tag) của GCM: sửa dù một byte của ciphertext thì giải mã báo lỗi, không bao giờ trả dữ liệu sai.</w:t>
+      </w:r>
+    </w:p>
+    <w:p>
+      <w:pPr>
+        <w:pStyle w:val="ListParagraph"/>
+        <w:numPr>
+          <w:ilvl w:val="0"/>
+          <w:numId w:val="1"/>
+        </w:numPr>
+      </w:pPr>
+      <w:r>
+        <w:t xml:space="preserve">IV ngẫu nhiên mới cho mỗi lần: cùng một token mã hóa hai lần ra hai kết quả khác nhau, nên người đọc DB không biết hai dòng có cùng token. Lặp IV với cùng khóa sẽ làm lộ dữ liệu và cho phép giả con dấu.</w:t>
+      </w:r>
+    </w:p>
+    <w:p>
+      <w:pPr>
+        <w:pStyle w:val="ListParagraph"/>
+        <w:numPr>
+          <w:ilvl w:val="0"/>
+          <w:numId w:val="1"/>
+        </w:numPr>
+      </w:pPr>
+      <w:r>
+        <w:t xml:space="preserve">AAD (</w:t>
+      </w:r>
+      <w:r>
+        <w:rPr>
+          <w:rFonts w:ascii="Consolas" w:eastAsia="Consolas" w:hAnsi="Consolas" w:cs="Consolas"/>
+        </w:rPr>
+        <w:t xml:space="preserve">account_credential:v1:&lt;accountId&gt;:&lt;cột&gt;</w:t>
+      </w:r>
+      <w:r>
+        <w:t xml:space="preserve">): chép ciphertext sang account khác hay sang cột khác thì giải mã thất bại.</w:t>
+      </w:r>
+    </w:p>
+    <w:p>
+      <w:r>
+        <w:rPr>
+          <w:b/>
+          <w:bCs/>
+        </w:rPr>
+        <w:t xml:space="preserve">2. Đổi khóa khi đã có dữ liệu thì làm những bước nào?</w:t>
+      </w:r>
+      <w:r>
+        <w:t xml:space="preserve"> (mục 17.3, 17.6, README)</w:t>
+      </w:r>
+    </w:p>
+    <w:p>
+      <w:pPr>
+        <w:pStyle w:val="ListParagraph"/>
+        <w:numPr>
+          <w:ilvl w:val="0"/>
+          <w:numId w:val="102"/>
+        </w:numPr>
+      </w:pPr>
+      <w:r>
+        <w:t xml:space="preserve">Tạo khóa mới: </w:t>
+      </w:r>
+      <w:r>
+        <w:rPr>
+          <w:rFonts w:ascii="Consolas" w:eastAsia="Consolas" w:hAnsi="Consolas" w:cs="Consolas"/>
+        </w:rPr>
+        <w:t xml:space="preserve">openssl rand -base64 32</w:t>
+      </w:r>
+      <w:r>
+        <w:t xml:space="preserve">.</w:t>
+      </w:r>
+    </w:p>
+    <w:p>
+      <w:pPr>
+        <w:pStyle w:val="ListParagraph"/>
+        <w:numPr>
+          <w:ilvl w:val="0"/>
+          <w:numId w:val="102"/>
+        </w:numPr>
+      </w:pPr>
+      <w:r>
+        <w:t xml:space="preserve">Thêm ô </w:t>
+      </w:r>
+      <w:r>
+        <w:rPr>
+          <w:rFonts w:ascii="Consolas" w:eastAsia="Consolas" w:hAnsi="Consolas" w:cs="Consolas"/>
+        </w:rPr>
+        <w:t xml:space="preserve">k2</w:t>
+      </w:r>
+      <w:r>
+        <w:t xml:space="preserve"> trong </w:t>
+      </w:r>
+      <w:r>
+        <w:rPr>
+          <w:rFonts w:ascii="Consolas" w:eastAsia="Consolas" w:hAnsi="Consolas" w:cs="Consolas"/>
+        </w:rPr>
+        <w:t xml:space="preserve">application.yaml</w:t>
+      </w:r>
+      <w:r>
+        <w:t xml:space="preserve"> và biến </w:t>
+      </w:r>
+      <w:r>
+        <w:rPr>
+          <w:rFonts w:ascii="Consolas" w:eastAsia="Consolas" w:hAnsi="Consolas" w:cs="Consolas"/>
+        </w:rPr>
+        <w:t xml:space="preserve">SINO_CREDENTIAL_KEY_K2</w:t>
+      </w:r>
+      <w:r>
+        <w:t xml:space="preserve">; đặt </w:t>
+      </w:r>
+      <w:r>
+        <w:rPr>
+          <w:rFonts w:ascii="Consolas" w:eastAsia="Consolas" w:hAnsi="Consolas" w:cs="Consolas"/>
+        </w:rPr>
+        <w:t xml:space="preserve">SINO_CREDENTIAL_ACTIVE_KEY_ID=k2</w:t>
+      </w:r>
+      <w:r>
+        <w:t xml:space="preserve">; khởi động lại.</w:t>
+      </w:r>
+    </w:p>
+    <w:p>
+      <w:pPr>
+        <w:pStyle w:val="ListParagraph"/>
+        <w:numPr>
+          <w:ilvl w:val="0"/>
+          <w:numId w:val="102"/>
+        </w:numPr>
+      </w:pPr>
+      <w:r>
+        <w:t xml:space="preserve">Dữ liệu cũ vẫn đọc được bằng </w:t>
+      </w:r>
+      <w:r>
+        <w:rPr>
+          <w:rFonts w:ascii="Consolas" w:eastAsia="Consolas" w:hAnsi="Consolas" w:cs="Consolas"/>
+        </w:rPr>
+        <w:t xml:space="preserve">k1</w:t>
+      </w:r>
+      <w:r>
+        <w:t xml:space="preserve">; mỗi credential chuyển sang </w:t>
+      </w:r>
+      <w:r>
+        <w:rPr>
+          <w:rFonts w:ascii="Consolas" w:eastAsia="Consolas" w:hAnsi="Consolas" w:cs="Consolas"/>
+        </w:rPr>
+        <w:t xml:space="preserve">k2</w:t>
+      </w:r>
+      <w:r>
+        <w:t xml:space="preserve"> ở lần được ghi lại, vì store luôn ghi cả credential.</w:t>
+      </w:r>
+    </w:p>
+    <w:p>
+      <w:pPr>
+        <w:pStyle w:val="ListParagraph"/>
+        <w:numPr>
+          <w:ilvl w:val="0"/>
+          <w:numId w:val="102"/>
+        </w:numPr>
+      </w:pPr>
+      <w:r>
+        <w:t xml:space="preserve">Khi </w:t>
+      </w:r>
+      <w:r>
+        <w:rPr>
+          <w:rFonts w:ascii="Consolas" w:eastAsia="Consolas" w:hAnsi="Consolas" w:cs="Consolas"/>
+        </w:rPr>
+        <w:t xml:space="preserve">select count(*) from account_credential where encryption_key_id = 'k1'</w:t>
+      </w:r>
+      <w:r>
+        <w:t xml:space="preserve"> trả 0 thì gỡ </w:t>
+      </w:r>
+      <w:r>
+        <w:rPr>
+          <w:rFonts w:ascii="Consolas" w:eastAsia="Consolas" w:hAnsi="Consolas" w:cs="Consolas"/>
+        </w:rPr>
+        <w:t xml:space="preserve">k1</w:t>
+      </w:r>
+      <w:r>
+        <w:t xml:space="preserve">.</w:t>
+      </w:r>
+    </w:p>
+    <w:p>
+      <w:r>
+        <w:rPr>
+          <w:b/>
+          <w:bCs/>
+        </w:rPr>
+        <w:t xml:space="preserve">3. Vì sao luồng kết nối gọi provider trước rồi mới mở transaction?</w:t>
+      </w:r>
+      <w:r>
+        <w:t xml:space="preserve"> (mục 18.1)</w:t>
+      </w:r>
+    </w:p>
+    <w:p>
+      <w:pPr>
+        <w:pStyle w:val="ListParagraph"/>
+        <w:numPr>
+          <w:ilvl w:val="0"/>
+          <w:numId w:val="1"/>
+        </w:numPr>
+      </w:pPr>
+      <w:r>
+        <w:t xml:space="preserve">Gọi mạng có thể chậm hoặc treo; giữ transaction mở trong lúc đó là giữ kết nối DB và khóa dòng.</w:t>
+      </w:r>
+    </w:p>
+    <w:p>
+      <w:pPr>
+        <w:pStyle w:val="ListParagraph"/>
+        <w:numPr>
+          <w:ilvl w:val="0"/>
+          <w:numId w:val="1"/>
+        </w:numPr>
+      </w:pPr>
+      <w:r>
+        <w:t xml:space="preserve">Provider báo lỗi thì chưa có gì được ghi, nên không cần rollback.</w:t>
+      </w:r>
+    </w:p>
+    <w:p>
+      <w:pPr>
+        <w:pStyle w:val="ListParagraph"/>
+        <w:numPr>
+          <w:ilvl w:val="0"/>
+          <w:numId w:val="1"/>
+        </w:numPr>
+      </w:pPr>
+      <w:r>
+        <w:t xml:space="preserve">Transaction chỉ bọc phần ghi: account, credential, event.</w:t>
+      </w:r>
+    </w:p>
+    <w:p>
+      <w:r>
+        <w:rPr>
+          <w:b/>
+          <w:bCs/>
+        </w:rPr>
+        <w:t xml:space="preserve">4. Bảng chuyển trạng thái</w:t>
+      </w:r>
+      <w:r>
+        <w:t xml:space="preserve"> (mục 16; "-" là không đổi gì)</w:t>
+      </w:r>
+    </w:p>
+    <w:p>
+      <w:pPr>
+        <w:shd w:val="clear" w:color="auto" w:fill="F2F3F5"/>
+        <w:ind w:left="0"/>
+      </w:pPr>
+      <w:r>
+        <w:rPr>
+          <w:rFonts w:ascii="Consolas" w:eastAsia="Consolas" w:hAnsi="Consolas" w:cs="Consolas"/>
+          <w:sz w:val="19"/>
+          <w:szCs w:val="19"/>
+        </w:rPr>
+        <w:t xml:space="preserve">từ \ sự kiện  reconnect  disable   enable    authExp   degraded  error  healthy</w:t>
+        <w:br/>
+        <w:t xml:space="preserve">CONNECTED     CONNECTED  DISABLED  -         AUTH_EXP  DEGRADED  ERROR  -</w:t>
+        <w:br/>
+        <w:t xml:space="preserve">DEGRADED      CONNECTED  DISABLED  -         AUTH_EXP  -         ERROR  CONNECTED</w:t>
+        <w:br/>
+        <w:t xml:space="preserve">AUTH_EXPIRED  CONNECTED  DISABLED  -         -         -         -      -</w:t>
+        <w:br/>
+        <w:t xml:space="preserve">ERROR         CONNECTED  DISABLED  -         AUTH_EXP  DEGRADED  -      CONNECTED</w:t>
+        <w:br/>
+        <w:t xml:space="preserve">DISABLED      CONNECTED  -         CONNECTED -         -         -      -</w:t>
+      </w:r>
+    </w:p>
+    <w:p>
+      <w:pPr>
+        <w:pStyle w:val="ListParagraph"/>
+        <w:numPr>
+          <w:ilvl w:val="0"/>
+          <w:numId w:val="1"/>
+        </w:numPr>
+      </w:pPr>
+      <w:r>
+        <w:t xml:space="preserve">Hai luật dễ nhớ: chỉ người dùng (enable, reconnect) mới đưa account ra khỏi </w:t>
+      </w:r>
+      <w:r>
+        <w:rPr>
+          <w:rFonts w:ascii="Consolas" w:eastAsia="Consolas" w:hAnsi="Consolas" w:cs="Consolas"/>
+        </w:rPr>
+        <w:t xml:space="preserve">DISABLED</w:t>
+      </w:r>
+      <w:r>
+        <w:t xml:space="preserve">; chỉ reconnect (credential mới) mới gỡ </w:t>
+      </w:r>
+      <w:r>
+        <w:rPr>
+          <w:rFonts w:ascii="Consolas" w:eastAsia="Consolas" w:hAnsi="Consolas" w:cs="Consolas"/>
+        </w:rPr>
+        <w:t xml:space="preserve">AUTH_EXPIRED</w:t>
+      </w:r>
+      <w:r>
+        <w:t xml:space="preserve">.</w:t>
+      </w:r>
+    </w:p>
+    <w:p>
+      <w:r>
+        <w:rPr>
+          <w:b/>
+          <w:bCs/>
+        </w:rPr>
+        <w:t xml:space="preserve">5. Xóa rồi kết nối lại thì dữ liệu nào còn, dữ liệu nào mất?</w:t>
+      </w:r>
+      <w:r>
+        <w:t xml:space="preserve"> (mục 21)</w:t>
+      </w:r>
+    </w:p>
+    <w:p>
+      <w:pPr>
+        <w:pStyle w:val="ListParagraph"/>
+        <w:numPr>
+          <w:ilvl w:val="0"/>
+          <w:numId w:val="1"/>
+        </w:numPr>
+      </w:pPr>
+      <w:r>
+        <w:rPr>
+          <w:b/>
+          <w:bCs/>
+        </w:rPr>
+        <w:t xml:space="preserve">Mất ngay khi xóa:</w:t>
+      </w:r>
+      <w:r>
+        <w:t xml:space="preserve"> credential (token) bị xóa hẳn.</w:t>
+      </w:r>
+    </w:p>
+    <w:p>
+      <w:pPr>
+        <w:pStyle w:val="ListParagraph"/>
+        <w:numPr>
+          <w:ilvl w:val="0"/>
+          <w:numId w:val="1"/>
+        </w:numPr>
+      </w:pPr>
+      <w:r>
+        <w:rPr>
+          <w:b/>
+          <w:bCs/>
+        </w:rPr>
+        <w:t xml:space="preserve">Còn:</w:t>
+      </w:r>
+      <w:r>
+        <w:t xml:space="preserve"> dòng </w:t>
+      </w:r>
+      <w:r>
+        <w:rPr>
+          <w:rFonts w:ascii="Consolas" w:eastAsia="Consolas" w:hAnsi="Consolas" w:cs="Consolas"/>
+        </w:rPr>
+        <w:t xml:space="preserve">connected_account</w:t>
+      </w:r>
+      <w:r>
+        <w:t xml:space="preserve"> (cùng ID, ngày tạo), đánh dấu </w:t>
+      </w:r>
+      <w:r>
+        <w:rPr>
+          <w:rFonts w:ascii="Consolas" w:eastAsia="Consolas" w:hAnsi="Consolas" w:cs="Consolas"/>
+        </w:rPr>
+        <w:t xml:space="preserve">removed_at</w:t>
+      </w:r>
+      <w:r>
+        <w:t xml:space="preserve">; tin nhắn sau này (F05 quyết định giữ hay bỏ).</w:t>
+      </w:r>
+    </w:p>
+    <w:p>
+      <w:pPr>
+        <w:pStyle w:val="ListParagraph"/>
+        <w:numPr>
+          <w:ilvl w:val="0"/>
+          <w:numId w:val="1"/>
+        </w:numPr>
+      </w:pPr>
+      <w:r>
+        <w:rPr>
+          <w:b/>
+          <w:bCs/>
+        </w:rPr>
+        <w:t xml:space="preserve">Khi kết nối lại:</w:t>
+      </w:r>
+      <w:r>
+        <w:t xml:space="preserve"> cùng ID quay lại, </w:t>
+      </w:r>
+      <w:r>
+        <w:rPr>
+          <w:rFonts w:ascii="Consolas" w:eastAsia="Consolas" w:hAnsi="Consolas" w:cs="Consolas"/>
+        </w:rPr>
+        <w:t xml:space="preserve">removed_at</w:t>
+      </w:r>
+      <w:r>
+        <w:t xml:space="preserve"> bị xóa, trạng thái </w:t>
+      </w:r>
+      <w:r>
+        <w:rPr>
+          <w:rFonts w:ascii="Consolas" w:eastAsia="Consolas" w:hAnsi="Consolas" w:cs="Consolas"/>
+        </w:rPr>
+        <w:t xml:space="preserve">CONNECTED</w:t>
+      </w:r>
+      <w:r>
+        <w:t xml:space="preserve">, sync bật lại, tên và ảnh lấy mới từ provider (tên người dùng tự đặt trước đó bị thay), credential mới. Event: </w:t>
+      </w:r>
+      <w:r>
+        <w:rPr>
+          <w:rFonts w:ascii="Consolas" w:eastAsia="Consolas" w:hAnsi="Consolas" w:cs="Consolas"/>
+        </w:rPr>
+        <w:t xml:space="preserve">AccountRemoved</w:t>
+      </w:r>
+      <w:r>
+        <w:t xml:space="preserve"> lúc xóa; lúc kết nối lại có </w:t>
+      </w:r>
+      <w:r>
+        <w:rPr>
+          <w:rFonts w:ascii="Consolas" w:eastAsia="Consolas" w:hAnsi="Consolas" w:cs="Consolas"/>
+        </w:rPr>
+        <w:t xml:space="preserve">AccountConnected(reconnected = true)</w:t>
+      </w:r>
+      <w:r>
+        <w:t xml:space="preserve">, cộng </w:t>
+      </w:r>
+      <w:r>
+        <w:rPr>
+          <w:rFonts w:ascii="Consolas" w:eastAsia="Consolas" w:hAnsi="Consolas" w:cs="Consolas"/>
+        </w:rPr>
+        <w:t xml:space="preserve">AccountStatusChanged</w:t>
+      </w:r>
+      <w:r>
+        <w:t xml:space="preserve"> nếu trạng thái cũ không phải </w:t>
+      </w:r>
+      <w:r>
+        <w:rPr>
+          <w:rFonts w:ascii="Consolas" w:eastAsia="Consolas" w:hAnsi="Consolas" w:cs="Consolas"/>
+        </w:rPr>
+        <w:t xml:space="preserve">CONNECTED</w:t>
+      </w:r>
+      <w:r>
+        <w:t xml:space="preserve">.</w:t>
+      </w:r>
+    </w:p>
+    <w:p/>
     <w:sectPr>
       <w:pgSz w:w="11906" w:h="16838"/>
       <w:pgMar w:top="1440" w:right="1440" w:bottom="1440" w:left="1440" w:header="708" w:footer="708" w:gutter="0"/>
@@ -15366,6 +16540,24 @@
     </w:lvlOverride>
   </w:num>
   <w:num w:numId="101">
+    <w:abstractNumId w:val="1"/>
+    <w:lvlOverride w:ilvl="0">
+      <w:startOverride w:val="1"/>
+    </w:lvlOverride>
+    <w:lvlOverride w:ilvl="1">
+      <w:startOverride w:val="1"/>
+    </w:lvlOverride>
+    <w:lvlOverride w:ilvl="2">
+      <w:startOverride w:val="1"/>
+    </w:lvlOverride>
+    <w:lvlOverride w:ilvl="3">
+      <w:startOverride w:val="1"/>
+    </w:lvlOverride>
+    <w:lvlOverride w:ilvl="4">
+      <w:startOverride w:val="1"/>
+    </w:lvlOverride>
+  </w:num>
+  <w:num w:numId="102">
     <w:abstractNumId w:val="1"/>
     <w:lvlOverride w:ilvl="0">
       <w:startOverride w:val="1"/>

</xml_diff>

<commit_message>
feat(be-100): admin sign-in kept apart from the owner
An optional admin from sino.admin.* (role ADMIN, not an app_user) signs
in through the same endpoint, never gets the remember-me cookie, and
reaches /api/admin/** only; every other /api/** path refuses ADMIN.
GET /api/admin/me says who is signed in as admin.

Docs: the login body field is rememberMe (the plan said keepSignedIn);
the remember-me rule moved into the remember-me services instead of
AuthController (reason in tasks.md).

verify: 1475 tests, 0 failures, 4 skipped; mutations 8/8 caught.

Co-Authored-By: Claude Opus 5.5 (1M context) <noreply@anthropic.com>
</commit_message>
<xml_diff>
--- a/docs/knowledge/phase-0-backend-foundation.docx
+++ b/docs/knowledge/phase-0-backend-foundation.docx
@@ -97,7 +97,16 @@
         <w:t xml:space="preserve">Phạm vi:</w:t>
       </w:r>
       <w:r>
-        <w:t xml:space="preserve"> F01 Project Foundation và F03 Provider Contract (mục 0–12); F02 Connected Accounts (mục 13–24, xong BE-09…BE-18, nghiệm thu và archive 2026-10-07).</w:t>
+        <w:t xml:space="preserve"> F01 Project Foundation và F03 Provider Contract (mục 0–12); F02 Connected Accounts (mục 13–24, xong BE-09…BE-18, nghiệm thu và archive 2026-10-07); backend cho admin (mục 25, change </w:t>
+      </w:r>
+      <w:r>
+        <w:rPr>
+          <w:rFonts w:ascii="Consolas" w:eastAsia="Consolas" w:hAnsi="Consolas" w:cs="Consolas"/>
+        </w:rPr>
+        <w:t xml:space="preserve">admin-api</w:t>
+      </w:r>
+      <w:r>
+        <w:t xml:space="preserve">, 2026-10-13).</w:t>
         <w:br/>
       </w:r>
       <w:r>
@@ -108,7 +117,7 @@
         <w:t xml:space="preserve">Cập nhật:</w:t>
       </w:r>
       <w:r>
-        <w:t xml:space="preserve"> 2026-10-07. Đường dẫn code tính từ </w:t>
+        <w:t xml:space="preserve"> 2026-10-13. Đường dẫn code tính từ </w:t>
       </w:r>
       <w:r>
         <w:rPr>
@@ -16395,6 +16404,1586 @@
         <w:t xml:space="preserve">.</w:t>
       </w:r>
     </w:p>
+    <w:p>
+      <w:pPr>
+        <w:pBdr>
+          <w:bottom w:val="single" w:sz="4" w:space="0" w:color="auto"/>
+        </w:pBdr>
+        <w:ind w:left="0"/>
+      </w:pPr>
+    </w:p>
+    <w:p>
+      <w:pPr>
+        <w:pStyle w:val="Heading2"/>
+      </w:pPr>
+      <w:r>
+        <w:t xml:space="preserve">25. Admin: người vận hành tách khỏi owner (change </w:t>
+      </w:r>
+      <w:r>
+        <w:rPr>
+          <w:rFonts w:ascii="Consolas" w:eastAsia="Consolas" w:hAnsi="Consolas" w:cs="Consolas"/>
+        </w:rPr>
+        <w:t xml:space="preserve">admin-api</w:t>
+      </w:r>
+      <w:r>
+        <w:t xml:space="preserve">)</w:t>
+      </w:r>
+    </w:p>
+    <w:p>
+      <w:r>
+        <w:t xml:space="preserve">Bối cảnh: Sino có một owner (người đọc thư). Người dùng muốn có thêm một trang admin để quản lý Sino. Hướng đã chốt (2026-10-13): admin là </w:t>
+      </w:r>
+      <w:r>
+        <w:rPr>
+          <w:b/>
+          <w:bCs/>
+        </w:rPr>
+        <w:t xml:space="preserve">một module trong </w:t>
+      </w:r>
+      <w:r>
+        <w:rPr>
+          <w:rFonts w:ascii="Consolas" w:eastAsia="Consolas" w:hAnsi="Consolas" w:cs="Consolas"/>
+          <w:b/>
+          <w:bCs/>
+        </w:rPr>
+        <w:t xml:space="preserve">sino-api</w:t>
+      </w:r>
+      <w:r>
+        <w:t xml:space="preserve">, có role riêng và quy tắc riêng trong security chain, không dựng backend thứ hai. Các quyết định chi tiết D-260…D-266 nằm trong </w:t>
+      </w:r>
+      <w:r>
+        <w:rPr>
+          <w:rFonts w:ascii="Consolas" w:eastAsia="Consolas" w:hAnsi="Consolas" w:cs="Consolas"/>
+        </w:rPr>
+        <w:t xml:space="preserve">openspec/changes/admin-api/design.md</w:t>
+      </w:r>
+      <w:r>
+        <w:t xml:space="preserve">.</w:t>
+      </w:r>
+    </w:p>
+    <w:p>
+      <w:pPr>
+        <w:shd w:val="clear" w:color="auto" w:fill="F2F3F5"/>
+        <w:ind w:left="0"/>
+      </w:pPr>
+      <w:r>
+        <w:rPr>
+          <w:rFonts w:ascii="Consolas" w:eastAsia="Consolas" w:hAnsi="Consolas" w:cs="Consolas"/>
+          <w:sz w:val="19"/>
+          <w:szCs w:val="19"/>
+        </w:rPr>
+        <w:t xml:space="preserve">                    POST /api/auth/login (chung)</w:t>
+        <w:br/>
+        <w:t xml:space="preserve">                               |</w:t>
+        <w:br/>
+        <w:t xml:space="preserve">              +----------------+----------------+</w:t>
+        <w:br/>
+        <w:t xml:space="preserve">              |                                 |</w:t>
+        <w:br/>
+        <w:t xml:space="preserve">        owner (ROLE_OWNER)               admin (ROLE_ADMIN)</w:t>
+        <w:br/>
+        <w:t xml:space="preserve">              |                                 |</w:t>
+        <w:br/>
+        <w:t xml:space="preserve">   /api/** (trừ /api/admin/**)           /api/admin/** chỉ đọc</w:t>
+        <w:br/>
+        <w:t xml:space="preserve">   thư, tài khoản, ghi chú, việc          người dùng, tài khoản, tình trạng sync</w:t>
+        <w:br/>
+        <w:t xml:space="preserve">              |                                 |</w:t>
+        <w:br/>
+        <w:t xml:space="preserve">   /api/admin/** -&gt; 403                  /api/** khác -&gt; 403</w:t>
+      </w:r>
+    </w:p>
+    <w:p>
+      <w:pPr>
+        <w:pStyle w:val="Heading3"/>
+      </w:pPr>
+      <w:r>
+        <w:t xml:space="preserve">25.1 Tài khoản admin từ cấu hình (BE-100, D-260, D-261)</w:t>
+      </w:r>
+    </w:p>
+    <w:p>
+      <w:pPr>
+        <w:pStyle w:val="ListParagraph"/>
+        <w:numPr>
+          <w:ilvl w:val="0"/>
+          <w:numId w:val="1"/>
+        </w:numPr>
+      </w:pPr>
+      <w:r>
+        <w:rPr>
+          <w:b/>
+          <w:bCs/>
+        </w:rPr>
+        <w:t xml:space="preserve">Ở đâu:</w:t>
+      </w:r>
+      <w:r>
+        <w:t xml:space="preserve"> </w:t>
+      </w:r>
+      <w:r>
+        <w:rPr>
+          <w:rFonts w:ascii="Consolas" w:eastAsia="Consolas" w:hAnsi="Consolas" w:cs="Consolas"/>
+        </w:rPr>
+        <w:t xml:space="preserve">identity/application/AdminProperties.java</w:t>
+      </w:r>
+      <w:r>
+        <w:t xml:space="preserve">, </w:t>
+      </w:r>
+      <w:r>
+        <w:rPr>
+          <w:rFonts w:ascii="Consolas" w:eastAsia="Consolas" w:hAnsi="Consolas" w:cs="Consolas"/>
+        </w:rPr>
+        <w:t xml:space="preserve">LoginSettings.java</w:t>
+      </w:r>
+      <w:r>
+        <w:t xml:space="preserve">; </w:t>
+      </w:r>
+      <w:r>
+        <w:rPr>
+          <w:rFonts w:ascii="Consolas" w:eastAsia="Consolas" w:hAnsi="Consolas" w:cs="Consolas"/>
+        </w:rPr>
+        <w:t xml:space="preserve">application.yaml</w:t>
+      </w:r>
+      <w:r>
+        <w:t xml:space="preserve"> (</w:t>
+      </w:r>
+      <w:r>
+        <w:rPr>
+          <w:rFonts w:ascii="Consolas" w:eastAsia="Consolas" w:hAnsi="Consolas" w:cs="Consolas"/>
+        </w:rPr>
+        <w:t xml:space="preserve">sino.admin.*</w:t>
+      </w:r>
+      <w:r>
+        <w:t xml:space="preserve">); </w:t>
+      </w:r>
+      <w:r>
+        <w:rPr>
+          <w:rFonts w:ascii="Consolas" w:eastAsia="Consolas" w:hAnsi="Consolas" w:cs="Consolas"/>
+        </w:rPr>
+        <w:t xml:space="preserve">.env.example</w:t>
+      </w:r>
+      <w:r>
+        <w:t xml:space="preserve"> (</w:t>
+      </w:r>
+      <w:r>
+        <w:rPr>
+          <w:rFonts w:ascii="Consolas" w:eastAsia="Consolas" w:hAnsi="Consolas" w:cs="Consolas"/>
+        </w:rPr>
+        <w:t xml:space="preserve">SINO_ADMIN_EMAIL</w:t>
+      </w:r>
+      <w:r>
+        <w:t xml:space="preserve">, </w:t>
+      </w:r>
+      <w:r>
+        <w:rPr>
+          <w:rFonts w:ascii="Consolas" w:eastAsia="Consolas" w:hAnsi="Consolas" w:cs="Consolas"/>
+        </w:rPr>
+        <w:t xml:space="preserve">SINO_ADMIN_PASSWORD</w:t>
+      </w:r>
+      <w:r>
+        <w:t xml:space="preserve">).</w:t>
+      </w:r>
+    </w:p>
+    <w:p>
+      <w:pPr>
+        <w:pStyle w:val="ListParagraph"/>
+        <w:numPr>
+          <w:ilvl w:val="0"/>
+          <w:numId w:val="1"/>
+        </w:numPr>
+      </w:pPr>
+      <w:r>
+        <w:rPr>
+          <w:b/>
+          <w:bCs/>
+        </w:rPr>
+        <w:t xml:space="preserve">Là gì:</w:t>
+      </w:r>
+      <w:r>
+        <w:t xml:space="preserve"> một </w:t>
+      </w:r>
+      <w:r>
+        <w:rPr>
+          <w:rFonts w:ascii="Consolas" w:eastAsia="Consolas" w:hAnsi="Consolas" w:cs="Consolas"/>
+        </w:rPr>
+        <w:t xml:space="preserve">record</w:t>
+      </w:r>
+      <w:r>
+        <w:t xml:space="preserve"> gắn với tiền tố </w:t>
+      </w:r>
+      <w:r>
+        <w:rPr>
+          <w:rFonts w:ascii="Consolas" w:eastAsia="Consolas" w:hAnsi="Consolas" w:cs="Consolas"/>
+        </w:rPr>
+        <w:t xml:space="preserve">sino.admin</w:t>
+      </w:r>
+      <w:r>
+        <w:t xml:space="preserve"> bằng </w:t>
+      </w:r>
+      <w:r>
+        <w:rPr>
+          <w:rFonts w:ascii="Consolas" w:eastAsia="Consolas" w:hAnsi="Consolas" w:cs="Consolas"/>
+        </w:rPr>
+        <w:t xml:space="preserve">@ConfigurationProperties</w:t>
+      </w:r>
+      <w:r>
+        <w:t xml:space="preserve">, giống </w:t>
+      </w:r>
+      <w:r>
+        <w:rPr>
+          <w:rFonts w:ascii="Consolas" w:eastAsia="Consolas" w:hAnsi="Consolas" w:cs="Consolas"/>
+        </w:rPr>
+        <w:t xml:space="preserve">OwnerProperties</w:t>
+      </w:r>
+      <w:r>
+        <w:t xml:space="preserve">. Constructor gọn của record (</w:t>
+      </w:r>
+      <w:r>
+        <w:rPr>
+          <w:rFonts w:ascii="Consolas" w:eastAsia="Consolas" w:hAnsi="Consolas" w:cs="Consolas"/>
+        </w:rPr>
+        <w:t xml:space="preserve">AdminProperties { ... }</w:t>
+      </w:r>
+      <w:r>
+        <w:t xml:space="preserve">) chuẩn hóa email: trống thì thành </w:t>
+      </w:r>
+      <w:r>
+        <w:rPr>
+          <w:rFonts w:ascii="Consolas" w:eastAsia="Consolas" w:hAnsi="Consolas" w:cs="Consolas"/>
+        </w:rPr>
+        <w:t xml:space="preserve">null</w:t>
+      </w:r>
+      <w:r>
+        <w:t xml:space="preserve"> (nghĩa là không có admin), có thì bỏ khoảng trắng và viết thường.</w:t>
+      </w:r>
+    </w:p>
+    <w:p>
+      <w:pPr>
+        <w:pStyle w:val="ListParagraph"/>
+        <w:numPr>
+          <w:ilvl w:val="0"/>
+          <w:numId w:val="1"/>
+        </w:numPr>
+      </w:pPr>
+      <w:r>
+        <w:rPr>
+          <w:b/>
+          <w:bCs/>
+        </w:rPr>
+        <w:t xml:space="preserve">Để làm gì:</w:t>
+      </w:r>
+      <w:r>
+        <w:t xml:space="preserve"> cho một người vận hành đăng nhập mà </w:t>
+      </w:r>
+      <w:r>
+        <w:rPr>
+          <w:b/>
+          <w:bCs/>
+        </w:rPr>
+        <w:t xml:space="preserve">không</w:t>
+      </w:r>
+      <w:r>
+        <w:t xml:space="preserve"> phải là một người dùng Sino: admin không có dòng </w:t>
+      </w:r>
+      <w:r>
+        <w:rPr>
+          <w:rFonts w:ascii="Consolas" w:eastAsia="Consolas" w:hAnsi="Consolas" w:cs="Consolas"/>
+        </w:rPr>
+        <w:t xml:space="preserve">app_user</w:t>
+      </w:r>
+      <w:r>
+        <w:t xml:space="preserve">, không sở hữu tài khoản Gmail, thư hay ghi chú nào.</w:t>
+      </w:r>
+    </w:p>
+    <w:p>
+      <w:pPr>
+        <w:pStyle w:val="ListParagraph"/>
+        <w:numPr>
+          <w:ilvl w:val="0"/>
+          <w:numId w:val="1"/>
+        </w:numPr>
+      </w:pPr>
+      <w:r>
+        <w:rPr>
+          <w:b/>
+          <w:bCs/>
+        </w:rPr>
+        <w:t xml:space="preserve">Vì sao chọn:</w:t>
+      </w:r>
+      <w:r>
+        <w:t xml:space="preserve"> người đọc thư và người vận hành là hai vai. Nếu cho owner kiêm luôn admin thì một phiên owner bị lộ (hoặc cookie "ghi nhớ" 30 ngày) cũng mở luôn quyền vận hành. Lưu admin trong database thì cần migration và một màn quản lý admin cho việc chưa có, nên để sau.</w:t>
+      </w:r>
+    </w:p>
+    <w:p>
+      <w:pPr>
+        <w:pStyle w:val="ListParagraph"/>
+        <w:numPr>
+          <w:ilvl w:val="0"/>
+          <w:numId w:val="1"/>
+        </w:numPr>
+      </w:pPr>
+      <w:r>
+        <w:rPr>
+          <w:b/>
+          <w:bCs/>
+        </w:rPr>
+        <w:t xml:space="preserve">Kiểm lúc khởi động (</w:t>
+      </w:r>
+      <w:r>
+        <w:rPr>
+          <w:rFonts w:ascii="Consolas" w:eastAsia="Consolas" w:hAnsi="Consolas" w:cs="Consolas"/>
+          <w:b/>
+          <w:bCs/>
+        </w:rPr>
+        <w:t xml:space="preserve">LoginSettings</w:t>
+      </w:r>
+      <w:r>
+        <w:rPr>
+          <w:b/>
+          <w:bCs/>
+        </w:rPr>
+        <w:t xml:space="preserve">):</w:t>
+      </w:r>
+      <w:r>
+        <w:t xml:space="preserve"> có email mà mật khẩu dưới 12 ký tự, email trùng owner, hoặc có mật khẩu mà thiếu email thì ứng dụng </w:t>
+      </w:r>
+      <w:r>
+        <w:rPr>
+          <w:b/>
+          <w:bCs/>
+        </w:rPr>
+        <w:t xml:space="preserve">dừng ngay</w:t>
+      </w:r>
+      <w:r>
+        <w:t xml:space="preserve">. Lý do của luật cuối: cấu hình dở dang mà im lặng bỏ qua thì người dùng tưởng đã có admin.</w:t>
+      </w:r>
+    </w:p>
+    <w:p>
+      <w:pPr>
+        <w:pStyle w:val="ListParagraph"/>
+        <w:numPr>
+          <w:ilvl w:val="0"/>
+          <w:numId w:val="1"/>
+        </w:numPr>
+      </w:pPr>
+      <w:r>
+        <w:rPr>
+          <w:b/>
+          <w:bCs/>
+        </w:rPr>
+        <w:t xml:space="preserve">Bẫy:</w:t>
+      </w:r>
+      <w:r>
+        <w:t xml:space="preserve"> thông báo lỗi chỉ được nêu </w:t>
+      </w:r>
+      <w:r>
+        <w:rPr>
+          <w:b/>
+          <w:bCs/>
+        </w:rPr>
+        <w:t xml:space="preserve">tên</w:t>
+      </w:r>
+      <w:r>
+        <w:t xml:space="preserve"> cấu hình (</w:t>
+      </w:r>
+      <w:r>
+        <w:rPr>
+          <w:rFonts w:ascii="Consolas" w:eastAsia="Consolas" w:hAnsi="Consolas" w:cs="Consolas"/>
+        </w:rPr>
+        <w:t xml:space="preserve">sino.admin.password (SINO_ADMIN_PASSWORD)</w:t>
+      </w:r>
+      <w:r>
+        <w:t xml:space="preserve">), không bao giờ nêu giá trị. Vì vậy độ dài mật khẩu được kiểm bằng code trong </w:t>
+      </w:r>
+      <w:r>
+        <w:rPr>
+          <w:rFonts w:ascii="Consolas" w:eastAsia="Consolas" w:hAnsi="Consolas" w:cs="Consolas"/>
+        </w:rPr>
+        <w:t xml:space="preserve">LoginSettings</w:t>
+      </w:r>
+      <w:r>
+        <w:t xml:space="preserve">, không bằng </w:t>
+      </w:r>
+      <w:r>
+        <w:rPr>
+          <w:rFonts w:ascii="Consolas" w:eastAsia="Consolas" w:hAnsi="Consolas" w:cs="Consolas"/>
+        </w:rPr>
+        <w:t xml:space="preserve">@Size</w:t>
+      </w:r>
+      <w:r>
+        <w:t xml:space="preserve"> của Bean Validation: lỗi Bean Validation in kèm giá trị bị từ chối. Email thì được kiểm bằng </w:t>
+      </w:r>
+      <w:r>
+        <w:rPr>
+          <w:rFonts w:ascii="Consolas" w:eastAsia="Consolas" w:hAnsi="Consolas" w:cs="Consolas"/>
+        </w:rPr>
+        <w:t xml:space="preserve">@Email</w:t>
+      </w:r>
+      <w:r>
+        <w:t xml:space="preserve">, vì email không phải bí mật. </w:t>
+      </w:r>
+      <w:r>
+        <w:rPr>
+          <w:rFonts w:ascii="Consolas" w:eastAsia="Consolas" w:hAnsi="Consolas" w:cs="Consolas"/>
+        </w:rPr>
+        <w:t xml:space="preserve">toString()</w:t>
+      </w:r>
+      <w:r>
+        <w:t xml:space="preserve"> của record tự viết để che mật khẩu.</w:t>
+      </w:r>
+    </w:p>
+    <w:p>
+      <w:pPr>
+        <w:pStyle w:val="Heading3"/>
+      </w:pPr>
+      <w:r>
+        <w:t xml:space="preserve">25.2 Một </w:t>
+      </w:r>
+      <w:r>
+        <w:rPr>
+          <w:rFonts w:ascii="Consolas" w:eastAsia="Consolas" w:hAnsi="Consolas" w:cs="Consolas"/>
+        </w:rPr>
+        <w:t xml:space="preserve">UserDetailsService</w:t>
+      </w:r>
+      <w:r>
+        <w:t xml:space="preserve">, hai role (BE-100, D-262)</w:t>
+      </w:r>
+    </w:p>
+    <w:p>
+      <w:pPr>
+        <w:pStyle w:val="ListParagraph"/>
+        <w:numPr>
+          <w:ilvl w:val="0"/>
+          <w:numId w:val="1"/>
+        </w:numPr>
+      </w:pPr>
+      <w:r>
+        <w:rPr>
+          <w:b/>
+          <w:bCs/>
+        </w:rPr>
+        <w:t xml:space="preserve">Ở đâu:</w:t>
+      </w:r>
+      <w:r>
+        <w:t xml:space="preserve"> </w:t>
+      </w:r>
+      <w:r>
+        <w:rPr>
+          <w:rFonts w:ascii="Consolas" w:eastAsia="Consolas" w:hAnsi="Consolas" w:cs="Consolas"/>
+        </w:rPr>
+        <w:t xml:space="preserve">identity/application/LoginConfiguration.java</w:t>
+      </w:r>
+      <w:r>
+        <w:t xml:space="preserve">, bean </w:t>
+      </w:r>
+      <w:r>
+        <w:rPr>
+          <w:rFonts w:ascii="Consolas" w:eastAsia="Consolas" w:hAnsi="Consolas" w:cs="Consolas"/>
+        </w:rPr>
+        <w:t xml:space="preserve">userDetailsService</w:t>
+      </w:r>
+      <w:r>
+        <w:t xml:space="preserve">.</w:t>
+      </w:r>
+    </w:p>
+    <w:p>
+      <w:pPr>
+        <w:pStyle w:val="ListParagraph"/>
+        <w:numPr>
+          <w:ilvl w:val="0"/>
+          <w:numId w:val="1"/>
+        </w:numPr>
+      </w:pPr>
+      <w:r>
+        <w:rPr>
+          <w:b/>
+          <w:bCs/>
+        </w:rPr>
+        <w:t xml:space="preserve">Là gì:</w:t>
+      </w:r>
+      <w:r>
+        <w:t xml:space="preserve"> </w:t>
+      </w:r>
+      <w:r>
+        <w:rPr>
+          <w:rFonts w:ascii="Consolas" w:eastAsia="Consolas" w:hAnsi="Consolas" w:cs="Consolas"/>
+        </w:rPr>
+        <w:t xml:space="preserve">UserDetailsService</w:t>
+      </w:r>
+      <w:r>
+        <w:t xml:space="preserve"> là interface Spring Security dùng để hỏi "email này là ai, hash mật khẩu là gì, có role nào". Ở đây nó trả owner với </w:t>
+      </w:r>
+      <w:r>
+        <w:rPr>
+          <w:rFonts w:ascii="Consolas" w:eastAsia="Consolas" w:hAnsi="Consolas" w:cs="Consolas"/>
+        </w:rPr>
+        <w:t xml:space="preserve">roles("OWNER")</w:t>
+      </w:r>
+      <w:r>
+        <w:t xml:space="preserve"> hoặc admin với </w:t>
+      </w:r>
+      <w:r>
+        <w:rPr>
+          <w:rFonts w:ascii="Consolas" w:eastAsia="Consolas" w:hAnsi="Consolas" w:cs="Consolas"/>
+        </w:rPr>
+        <w:t xml:space="preserve">roles("ADMIN")</w:t>
+      </w:r>
+      <w:r>
+        <w:t xml:space="preserve">; email khác thì ném </w:t>
+      </w:r>
+      <w:r>
+        <w:rPr>
+          <w:rFonts w:ascii="Consolas" w:eastAsia="Consolas" w:hAnsi="Consolas" w:cs="Consolas"/>
+        </w:rPr>
+        <w:t xml:space="preserve">UsernameNotFoundException</w:t>
+      </w:r>
+      <w:r>
+        <w:t xml:space="preserve">.</w:t>
+      </w:r>
+    </w:p>
+    <w:p>
+      <w:pPr>
+        <w:pStyle w:val="ListParagraph"/>
+        <w:numPr>
+          <w:ilvl w:val="0"/>
+          <w:numId w:val="1"/>
+        </w:numPr>
+      </w:pPr>
+      <w:r>
+        <w:rPr>
+          <w:b/>
+          <w:bCs/>
+        </w:rPr>
+        <w:t xml:space="preserve">Để làm gì:</w:t>
+      </w:r>
+      <w:r>
+        <w:t xml:space="preserve"> admin dùng chung </w:t>
+      </w:r>
+      <w:r>
+        <w:rPr>
+          <w:rFonts w:ascii="Consolas" w:eastAsia="Consolas" w:hAnsi="Consolas" w:cs="Consolas"/>
+        </w:rPr>
+        <w:t xml:space="preserve">POST /api/auth/login</w:t>
+      </w:r>
+      <w:r>
+        <w:t xml:space="preserve"> với owner, nên dùng chung luôn phiên cookie, CSRF, khóa tạm 15 phút sau 5 lần sai (D-35) và cách so một hash giả khi email lạ (để đoán email không nhanh hơn đoán mật khẩu).</w:t>
+      </w:r>
+    </w:p>
+    <w:p>
+      <w:pPr>
+        <w:pStyle w:val="ListParagraph"/>
+        <w:numPr>
+          <w:ilvl w:val="0"/>
+          <w:numId w:val="1"/>
+        </w:numPr>
+      </w:pPr>
+      <w:r>
+        <w:rPr>
+          <w:b/>
+          <w:bCs/>
+        </w:rPr>
+        <w:t xml:space="preserve">Vì sao chọn:</w:t>
+      </w:r>
+      <w:r>
+        <w:t xml:space="preserve"> viết endpoint và chain đăng nhập riêng cho admin thì phải lặp lại cả bốn thứ trên, mỗi lần sửa phải sửa hai nơi.</w:t>
+      </w:r>
+    </w:p>
+    <w:p>
+      <w:pPr>
+        <w:pStyle w:val="ListParagraph"/>
+        <w:numPr>
+          <w:ilvl w:val="0"/>
+          <w:numId w:val="1"/>
+        </w:numPr>
+      </w:pPr>
+      <w:r>
+        <w:rPr>
+          <w:b/>
+          <w:bCs/>
+        </w:rPr>
+        <w:t xml:space="preserve">Bẫy:</w:t>
+      </w:r>
+      <w:r>
+        <w:t xml:space="preserve"> </w:t>
+      </w:r>
+      <w:r>
+        <w:rPr>
+          <w:rFonts w:ascii="Consolas" w:eastAsia="Consolas" w:hAnsi="Consolas" w:cs="Consolas"/>
+        </w:rPr>
+        <w:t xml:space="preserve">roles("ADMIN")</w:t>
+      </w:r>
+      <w:r>
+        <w:t xml:space="preserve"> lưu thành quyền </w:t>
+      </w:r>
+      <w:r>
+        <w:rPr>
+          <w:rFonts w:ascii="Consolas" w:eastAsia="Consolas" w:hAnsi="Consolas" w:cs="Consolas"/>
+        </w:rPr>
+        <w:t xml:space="preserve">ROLE_ADMIN</w:t>
+      </w:r>
+      <w:r>
+        <w:t xml:space="preserve"> (Spring tự thêm tiền tố </w:t>
+      </w:r>
+      <w:r>
+        <w:rPr>
+          <w:rFonts w:ascii="Consolas" w:eastAsia="Consolas" w:hAnsi="Consolas" w:cs="Consolas"/>
+        </w:rPr>
+        <w:t xml:space="preserve">ROLE_</w:t>
+      </w:r>
+      <w:r>
+        <w:t xml:space="preserve">). Khi so bằng tay phải so với </w:t>
+      </w:r>
+      <w:r>
+        <w:rPr>
+          <w:rFonts w:ascii="Consolas" w:eastAsia="Consolas" w:hAnsi="Consolas" w:cs="Consolas"/>
+        </w:rPr>
+        <w:t xml:space="preserve">"ROLE_ADMIN"</w:t>
+      </w:r>
+      <w:r>
+        <w:t xml:space="preserve">, còn </w:t>
+      </w:r>
+      <w:r>
+        <w:rPr>
+          <w:rFonts w:ascii="Consolas" w:eastAsia="Consolas" w:hAnsi="Consolas" w:cs="Consolas"/>
+        </w:rPr>
+        <w:t xml:space="preserve">hasRole("ADMIN")</w:t>
+      </w:r>
+      <w:r>
+        <w:t xml:space="preserve"> thì tự thêm tiền tố. Nhầm hai cách viết này là lỗi hay gặp.</w:t>
+      </w:r>
+    </w:p>
+    <w:p>
+      <w:pPr>
+        <w:pStyle w:val="Heading3"/>
+      </w:pPr>
+      <w:r>
+        <w:t xml:space="preserve">25.3 "Ghi nhớ đăng nhập" chỉ cho owner (BE-100, D-262)</w:t>
+      </w:r>
+    </w:p>
+    <w:p>
+      <w:pPr>
+        <w:pStyle w:val="ListParagraph"/>
+        <w:numPr>
+          <w:ilvl w:val="0"/>
+          <w:numId w:val="1"/>
+        </w:numPr>
+      </w:pPr>
+      <w:r>
+        <w:rPr>
+          <w:b/>
+          <w:bCs/>
+        </w:rPr>
+        <w:t xml:space="preserve">Ở đâu:</w:t>
+      </w:r>
+      <w:r>
+        <w:t xml:space="preserve"> lớp lồng </w:t>
+      </w:r>
+      <w:r>
+        <w:rPr>
+          <w:rFonts w:ascii="Consolas" w:eastAsia="Consolas" w:hAnsi="Consolas" w:cs="Consolas"/>
+        </w:rPr>
+        <w:t xml:space="preserve">OwnerRememberMeServices</w:t>
+      </w:r>
+      <w:r>
+        <w:t xml:space="preserve"> trong </w:t>
+      </w:r>
+      <w:r>
+        <w:rPr>
+          <w:rFonts w:ascii="Consolas" w:eastAsia="Consolas" w:hAnsi="Consolas" w:cs="Consolas"/>
+        </w:rPr>
+        <w:t xml:space="preserve">LoginConfiguration.java</w:t>
+      </w:r>
+      <w:r>
+        <w:t xml:space="preserve">.</w:t>
+      </w:r>
+    </w:p>
+    <w:p>
+      <w:pPr>
+        <w:pStyle w:val="ListParagraph"/>
+        <w:numPr>
+          <w:ilvl w:val="0"/>
+          <w:numId w:val="1"/>
+        </w:numPr>
+      </w:pPr>
+      <w:r>
+        <w:rPr>
+          <w:b/>
+          <w:bCs/>
+        </w:rPr>
+        <w:t xml:space="preserve">Là gì:</w:t>
+      </w:r>
+      <w:r>
+        <w:t xml:space="preserve"> lớp con của </w:t>
+      </w:r>
+      <w:r>
+        <w:rPr>
+          <w:rFonts w:ascii="Consolas" w:eastAsia="Consolas" w:hAnsi="Consolas" w:cs="Consolas"/>
+        </w:rPr>
+        <w:t xml:space="preserve">TokenBasedRememberMeServices</w:t>
+      </w:r>
+      <w:r>
+        <w:t xml:space="preserve">, ghi đè </w:t>
+      </w:r>
+      <w:r>
+        <w:rPr>
+          <w:rFonts w:ascii="Consolas" w:eastAsia="Consolas" w:hAnsi="Consolas" w:cs="Consolas"/>
+        </w:rPr>
+        <w:t xml:space="preserve">onLoginSuccess</w:t>
+      </w:r>
+      <w:r>
+        <w:t xml:space="preserve">: chỉ gọi lớp cha (tạo cookie </w:t>
+      </w:r>
+      <w:r>
+        <w:rPr>
+          <w:rFonts w:ascii="Consolas" w:eastAsia="Consolas" w:hAnsi="Consolas" w:cs="Consolas"/>
+        </w:rPr>
+        <w:t xml:space="preserve">remember-me</w:t>
+      </w:r>
+      <w:r>
+        <w:t xml:space="preserve">) khi người vừa đăng nhập có quyền </w:t>
+      </w:r>
+      <w:r>
+        <w:rPr>
+          <w:rFonts w:ascii="Consolas" w:eastAsia="Consolas" w:hAnsi="Consolas" w:cs="Consolas"/>
+        </w:rPr>
+        <w:t xml:space="preserve">ROLE_OWNER</w:t>
+      </w:r>
+      <w:r>
+        <w:t xml:space="preserve">.</w:t>
+      </w:r>
+    </w:p>
+    <w:p>
+      <w:pPr>
+        <w:pStyle w:val="ListParagraph"/>
+        <w:numPr>
+          <w:ilvl w:val="0"/>
+          <w:numId w:val="1"/>
+        </w:numPr>
+      </w:pPr>
+      <w:r>
+        <w:rPr>
+          <w:b/>
+          <w:bCs/>
+        </w:rPr>
+        <w:t xml:space="preserve">Để làm gì:</w:t>
+      </w:r>
+      <w:r>
+        <w:t xml:space="preserve"> admin gửi </w:t>
+      </w:r>
+      <w:r>
+        <w:rPr>
+          <w:rFonts w:ascii="Consolas" w:eastAsia="Consolas" w:hAnsi="Consolas" w:cs="Consolas"/>
+        </w:rPr>
+        <w:t xml:space="preserve">rememberMe: true</w:t>
+      </w:r>
+      <w:r>
+        <w:t xml:space="preserve"> cũng không bao giờ nhận cookie 30 ngày. Thêm nữa, dịch vụ remember-me chỉ biết owner, nên một cookie giả mạo mang tên admin không đăng nhập được ai.</w:t>
+      </w:r>
+    </w:p>
+    <w:p>
+      <w:pPr>
+        <w:pStyle w:val="ListParagraph"/>
+        <w:numPr>
+          <w:ilvl w:val="0"/>
+          <w:numId w:val="1"/>
+        </w:numPr>
+      </w:pPr>
+      <w:r>
+        <w:rPr>
+          <w:b/>
+          <w:bCs/>
+        </w:rPr>
+        <w:t xml:space="preserve">Vì sao chọn:</w:t>
+      </w:r>
+      <w:r>
+        <w:t xml:space="preserve"> kế hoạch đầu là để </w:t>
+      </w:r>
+      <w:r>
+        <w:rPr>
+          <w:rFonts w:ascii="Consolas" w:eastAsia="Consolas" w:hAnsi="Consolas" w:cs="Consolas"/>
+        </w:rPr>
+        <w:t xml:space="preserve">AuthController</w:t>
+      </w:r>
+      <w:r>
+        <w:t xml:space="preserve"> hỏi "người này có được ghi nhớ không" trước khi gọi. Đặt luật ngay trong dịch vụ remember-me thì luật nằm cạnh cấu hình D-34 và đúng cho </w:t>
+      </w:r>
+      <w:r>
+        <w:rPr>
+          <w:b/>
+          <w:bCs/>
+        </w:rPr>
+        <w:t xml:space="preserve">mọi</w:t>
+      </w:r>
+      <w:r>
+        <w:t xml:space="preserve"> chỗ gọi </w:t>
+      </w:r>
+      <w:r>
+        <w:rPr>
+          <w:rFonts w:ascii="Consolas" w:eastAsia="Consolas" w:hAnsi="Consolas" w:cs="Consolas"/>
+        </w:rPr>
+        <w:t xml:space="preserve">loginSuccess</w:t>
+      </w:r>
+      <w:r>
+        <w:t xml:space="preserve">, không chỉ endpoint đăng nhập; lại bớt sửa hai file.</w:t>
+      </w:r>
+    </w:p>
+    <w:p>
+      <w:pPr>
+        <w:pStyle w:val="ListParagraph"/>
+        <w:numPr>
+          <w:ilvl w:val="0"/>
+          <w:numId w:val="1"/>
+        </w:numPr>
+      </w:pPr>
+      <w:r>
+        <w:rPr>
+          <w:b/>
+          <w:bCs/>
+        </w:rPr>
+        <w:t xml:space="preserve">Bẫy:</w:t>
+      </w:r>
+      <w:r>
+        <w:t xml:space="preserve"> ghi đè (override) một method của thư viện là dựa vào chi tiết bên trong thư viện. Test </w:t>
+      </w:r>
+      <w:r>
+        <w:rPr>
+          <w:rFonts w:ascii="Consolas" w:eastAsia="Consolas" w:hAnsi="Consolas" w:cs="Consolas"/>
+        </w:rPr>
+        <w:t xml:space="preserve">AdminLoginTests</w:t>
+      </w:r>
+      <w:r>
+        <w:t xml:space="preserve"> gọi thẳng </w:t>
+      </w:r>
+      <w:r>
+        <w:rPr>
+          <w:rFonts w:ascii="Consolas" w:eastAsia="Consolas" w:hAnsi="Consolas" w:cs="Consolas"/>
+        </w:rPr>
+        <w:t xml:space="preserve">loginSuccess</w:t>
+      </w:r>
+      <w:r>
+        <w:t xml:space="preserve"> cho owner và admin, nên khi nâng cấp Spring Security mà cách gọi đổi thì test sẽ báo.</w:t>
+      </w:r>
+    </w:p>
+    <w:p>
+      <w:pPr>
+        <w:pStyle w:val="Heading3"/>
+      </w:pPr>
+      <w:r>
+        <w:t xml:space="preserve">25.4 Tách quyền trong security chain (BE-100, D-263)</w:t>
+      </w:r>
+    </w:p>
+    <w:p>
+      <w:pPr>
+        <w:pStyle w:val="ListParagraph"/>
+        <w:numPr>
+          <w:ilvl w:val="0"/>
+          <w:numId w:val="1"/>
+        </w:numPr>
+      </w:pPr>
+      <w:r>
+        <w:rPr>
+          <w:b/>
+          <w:bCs/>
+        </w:rPr>
+        <w:t xml:space="preserve">Ở đâu:</w:t>
+      </w:r>
+      <w:r>
+        <w:t xml:space="preserve"> </w:t>
+      </w:r>
+      <w:r>
+        <w:rPr>
+          <w:rFonts w:ascii="Consolas" w:eastAsia="Consolas" w:hAnsi="Consolas" w:cs="Consolas"/>
+        </w:rPr>
+        <w:t xml:space="preserve">common/security/SecurityConfig.java</w:t>
+      </w:r>
+      <w:r>
+        <w:t xml:space="preserve">, trong </w:t>
+      </w:r>
+      <w:r>
+        <w:rPr>
+          <w:rFonts w:ascii="Consolas" w:eastAsia="Consolas" w:hAnsi="Consolas" w:cs="Consolas"/>
+        </w:rPr>
+        <w:t xml:space="preserve">authorizeHttpRequests</w:t>
+      </w:r>
+      <w:r>
+        <w:t xml:space="preserve">.</w:t>
+      </w:r>
+    </w:p>
+    <w:p>
+      <w:pPr>
+        <w:pStyle w:val="ListParagraph"/>
+        <w:numPr>
+          <w:ilvl w:val="0"/>
+          <w:numId w:val="1"/>
+        </w:numPr>
+      </w:pPr>
+      <w:r>
+        <w:rPr>
+          <w:b/>
+          <w:bCs/>
+        </w:rPr>
+        <w:t xml:space="preserve">Là gì:</w:t>
+      </w:r>
+      <w:r>
+        <w:t xml:space="preserve"> hai quy tắc, đặt theo thứ tự (Spring dùng quy tắc </w:t>
+      </w:r>
+      <w:r>
+        <w:rPr>
+          <w:b/>
+          <w:bCs/>
+        </w:rPr>
+        <w:t xml:space="preserve">đầu tiên</w:t>
+      </w:r>
+      <w:r>
+        <w:t xml:space="preserve"> khớp):</w:t>
+      </w:r>
+    </w:p>
+    <w:p>
+      <w:pPr>
+        <w:shd w:val="clear" w:color="auto" w:fill="F2F3F5"/>
+        <w:ind w:left="0"/>
+      </w:pPr>
+      <w:r>
+        <w:rPr>
+          <w:rFonts w:ascii="Consolas" w:eastAsia="Consolas" w:hAnsi="Consolas" w:cs="Consolas"/>
+          <w:sz w:val="19"/>
+          <w:szCs w:val="19"/>
+        </w:rPr>
+        <w:t xml:space="preserve">/api/admin/**  -&gt; hasRole("ADMIN")</w:t>
+        <w:br/>
+        <w:t xml:space="preserve">/api/**        -&gt; allOf(authenticated(), not(hasRole("ADMIN")))</w:t>
+      </w:r>
+    </w:p>
+    <w:p>
+      <w:r>
+        <w:t xml:space="preserve">  </w:t>
+      </w:r>
+      <w:r>
+        <w:rPr>
+          <w:rFonts w:ascii="Consolas" w:eastAsia="Consolas" w:hAnsi="Consolas" w:cs="Consolas"/>
+        </w:rPr>
+        <w:t xml:space="preserve">AuthorizationManagers.allOf</w:t>
+      </w:r>
+      <w:r>
+        <w:t xml:space="preserve"> và </w:t>
+      </w:r>
+      <w:r>
+        <w:rPr>
+          <w:rFonts w:ascii="Consolas" w:eastAsia="Consolas" w:hAnsi="Consolas" w:cs="Consolas"/>
+        </w:rPr>
+        <w:t xml:space="preserve">AuthorizationManagers.not</w:t>
+      </w:r>
+      <w:r>
+        <w:t xml:space="preserve"> ghép các điều kiện nhỏ thành một điều kiện: "đã đăng nhập </w:t>
+      </w:r>
+      <w:r>
+        <w:rPr>
+          <w:b/>
+          <w:bCs/>
+        </w:rPr>
+        <w:t xml:space="preserve">và</w:t>
+      </w:r>
+      <w:r>
+        <w:t xml:space="preserve"> không phải admin".</w:t>
+      </w:r>
+    </w:p>
+    <w:p>
+      <w:pPr>
+        <w:pStyle w:val="ListParagraph"/>
+        <w:numPr>
+          <w:ilvl w:val="0"/>
+          <w:numId w:val="1"/>
+        </w:numPr>
+      </w:pPr>
+      <w:r>
+        <w:rPr>
+          <w:b/>
+          <w:bCs/>
+        </w:rPr>
+        <w:t xml:space="preserve">Để làm gì:</w:t>
+      </w:r>
+      <w:r>
+        <w:t xml:space="preserve"> admin gọi </w:t>
+      </w:r>
+      <w:r>
+        <w:rPr>
+          <w:rFonts w:ascii="Consolas" w:eastAsia="Consolas" w:hAnsi="Consolas" w:cs="Consolas"/>
+        </w:rPr>
+        <w:t xml:space="preserve">/api/accounts</w:t>
+      </w:r>
+      <w:r>
+        <w:t xml:space="preserve"> hay </w:t>
+      </w:r>
+      <w:r>
+        <w:rPr>
+          <w:rFonts w:ascii="Consolas" w:eastAsia="Consolas" w:hAnsi="Consolas" w:cs="Consolas"/>
+        </w:rPr>
+        <w:t xml:space="preserve">/api/conversations</w:t>
+      </w:r>
+      <w:r>
+        <w:t xml:space="preserve"> nhận </w:t>
+      </w:r>
+      <w:r>
+        <w:rPr>
+          <w:rFonts w:ascii="Consolas" w:eastAsia="Consolas" w:hAnsi="Consolas" w:cs="Consolas"/>
+        </w:rPr>
+        <w:t xml:space="preserve">403 FORBIDDEN</w:t>
+      </w:r>
+      <w:r>
+        <w:t xml:space="preserve">, không thấy dữ liệu nào của owner; owner gọi </w:t>
+      </w:r>
+      <w:r>
+        <w:rPr>
+          <w:rFonts w:ascii="Consolas" w:eastAsia="Consolas" w:hAnsi="Consolas" w:cs="Consolas"/>
+        </w:rPr>
+        <w:t xml:space="preserve">/api/admin/me</w:t>
+      </w:r>
+      <w:r>
+        <w:t xml:space="preserve"> cũng nhận </w:t>
+      </w:r>
+      <w:r>
+        <w:rPr>
+          <w:rFonts w:ascii="Consolas" w:eastAsia="Consolas" w:hAnsi="Consolas" w:cs="Consolas"/>
+        </w:rPr>
+        <w:t xml:space="preserve">403</w:t>
+      </w:r>
+      <w:r>
+        <w:t xml:space="preserve">.</w:t>
+      </w:r>
+    </w:p>
+    <w:p>
+      <w:pPr>
+        <w:pStyle w:val="ListParagraph"/>
+        <w:numPr>
+          <w:ilvl w:val="0"/>
+          <w:numId w:val="1"/>
+        </w:numPr>
+      </w:pPr>
+      <w:r>
+        <w:rPr>
+          <w:b/>
+          <w:bCs/>
+        </w:rPr>
+        <w:t xml:space="preserve">Vì sao chọn "không phải admin" (danh sách cấm) thay vì "phải là owner" (danh sách cho phép):</w:t>
+      </w:r>
+      <w:r>
+        <w:t xml:space="preserve"> danh sách cho phép an toàn hơn về lâu dài (role mới mặc định bị chặn). Nhưng khoảng 50 test tạo người gọi bằng </w:t>
+      </w:r>
+      <w:r>
+        <w:rPr>
+          <w:rFonts w:ascii="Consolas" w:eastAsia="Consolas" w:hAnsi="Consolas" w:cs="Consolas"/>
+        </w:rPr>
+        <w:t xml:space="preserve">user("owner@sino.test")</w:t>
+      </w:r>
+      <w:r>
+        <w:t xml:space="preserve">, role mặc định là </w:t>
+      </w:r>
+      <w:r>
+        <w:rPr>
+          <w:rFonts w:ascii="Consolas" w:eastAsia="Consolas" w:hAnsi="Consolas" w:cs="Consolas"/>
+        </w:rPr>
+        <w:t xml:space="preserve">USER</w:t>
+      </w:r>
+      <w:r>
+        <w:t xml:space="preserve">, và hai phiên làm việc song song cũng đang viết test kiểu đó. Đổi sang </w:t>
+      </w:r>
+      <w:r>
+        <w:rPr>
+          <w:rFonts w:ascii="Consolas" w:eastAsia="Consolas" w:hAnsi="Consolas" w:cs="Consolas"/>
+        </w:rPr>
+        <w:t xml:space="preserve">hasRole("OWNER")</w:t>
+      </w:r>
+      <w:r>
+        <w:t xml:space="preserve"> thì tất cả cùng đỏ. Ở MVP, ai không phải admin thì là owner, nên danh sách cấm cho kết quả y hệt. Khi có nhiều người dùng và role thật thì đổi sang danh sách cho phép (ghi trong Risks của design).</w:t>
+      </w:r>
+    </w:p>
+    <w:p>
+      <w:pPr>
+        <w:pStyle w:val="ListParagraph"/>
+        <w:numPr>
+          <w:ilvl w:val="0"/>
+          <w:numId w:val="1"/>
+        </w:numPr>
+      </w:pPr>
+      <w:r>
+        <w:rPr>
+          <w:b/>
+          <w:bCs/>
+        </w:rPr>
+        <w:t xml:space="preserve">Bẫy 1, thứ tự:</w:t>
+      </w:r>
+      <w:r>
+        <w:t xml:space="preserve"> đặt </w:t>
+      </w:r>
+      <w:r>
+        <w:rPr>
+          <w:rFonts w:ascii="Consolas" w:eastAsia="Consolas" w:hAnsi="Consolas" w:cs="Consolas"/>
+        </w:rPr>
+        <w:t xml:space="preserve">/api/**</w:t>
+      </w:r>
+      <w:r>
+        <w:t xml:space="preserve"> lên trước </w:t>
+      </w:r>
+      <w:r>
+        <w:rPr>
+          <w:rFonts w:ascii="Consolas" w:eastAsia="Consolas" w:hAnsi="Consolas" w:cs="Consolas"/>
+        </w:rPr>
+        <w:t xml:space="preserve">/api/admin/**</w:t>
+      </w:r>
+      <w:r>
+        <w:t xml:space="preserve"> thì quy tắc admin không bao giờ được dùng, admin bị chặn khỏi chính API của mình.</w:t>
+      </w:r>
+    </w:p>
+    <w:p>
+      <w:pPr>
+        <w:pStyle w:val="ListParagraph"/>
+        <w:numPr>
+          <w:ilvl w:val="0"/>
+          <w:numId w:val="1"/>
+        </w:numPr>
+      </w:pPr>
+      <w:r>
+        <w:rPr>
+          <w:b/>
+          <w:bCs/>
+        </w:rPr>
+        <w:t xml:space="preserve">Bẫy 2, </w:t>
+      </w:r>
+      <w:r>
+        <w:rPr>
+          <w:rFonts w:ascii="Consolas" w:eastAsia="Consolas" w:hAnsi="Consolas" w:cs="Consolas"/>
+          <w:b/>
+          <w:bCs/>
+        </w:rPr>
+        <w:t xml:space="preserve">401</w:t>
+      </w:r>
+      <w:r>
+        <w:rPr>
+          <w:b/>
+          <w:bCs/>
+        </w:rPr>
+        <w:t xml:space="preserve"> hay </w:t>
+      </w:r>
+      <w:r>
+        <w:rPr>
+          <w:rFonts w:ascii="Consolas" w:eastAsia="Consolas" w:hAnsi="Consolas" w:cs="Consolas"/>
+          <w:b/>
+          <w:bCs/>
+        </w:rPr>
+        <w:t xml:space="preserve">403</w:t>
+      </w:r>
+      <w:r>
+        <w:rPr>
+          <w:b/>
+          <w:bCs/>
+        </w:rPr>
+        <w:t xml:space="preserve">:</w:t>
+      </w:r>
+      <w:r>
+        <w:t xml:space="preserve"> chưa đăng nhập thì </w:t>
+      </w:r>
+      <w:r>
+        <w:rPr>
+          <w:rFonts w:ascii="Consolas" w:eastAsia="Consolas" w:hAnsi="Consolas" w:cs="Consolas"/>
+        </w:rPr>
+        <w:t xml:space="preserve">401</w:t>
+      </w:r>
+      <w:r>
+        <w:t xml:space="preserve">; đã đăng nhập mà sai vai thì </w:t>
+      </w:r>
+      <w:r>
+        <w:rPr>
+          <w:rFonts w:ascii="Consolas" w:eastAsia="Consolas" w:hAnsi="Consolas" w:cs="Consolas"/>
+        </w:rPr>
+        <w:t xml:space="preserve">403</w:t>
+      </w:r>
+      <w:r>
+        <w:t xml:space="preserve">. Riêng người chỉ đăng nhập bằng cookie "ghi nhớ" mà bị từ chối thì Spring Security trả </w:t>
+      </w:r>
+      <w:r>
+        <w:rPr>
+          <w:rFonts w:ascii="Consolas" w:eastAsia="Consolas" w:hAnsi="Consolas" w:cs="Consolas"/>
+        </w:rPr>
+        <w:t xml:space="preserve">401</w:t>
+      </w:r>
+      <w:r>
+        <w:t xml:space="preserve"> (</w:t>
+      </w:r>
+      <w:r>
+        <w:rPr>
+          <w:rFonts w:ascii="Consolas" w:eastAsia="Consolas" w:hAnsi="Consolas" w:cs="Consolas"/>
+        </w:rPr>
+        <w:t xml:space="preserve">ExceptionTranslationFilter</w:t>
+      </w:r>
+      <w:r>
+        <w:t xml:space="preserve"> coi đăng nhập bằng remember-me là chưa đầy đủ và mời đăng nhập lại), không phải </w:t>
+      </w:r>
+      <w:r>
+        <w:rPr>
+          <w:rFonts w:ascii="Consolas" w:eastAsia="Consolas" w:hAnsi="Consolas" w:cs="Consolas"/>
+        </w:rPr>
+        <w:t xml:space="preserve">403</w:t>
+      </w:r>
+      <w:r>
+        <w:t xml:space="preserve">. Test </w:t>
+      </w:r>
+      <w:r>
+        <w:rPr>
+          <w:rFonts w:ascii="Consolas" w:eastAsia="Consolas" w:hAnsi="Consolas" w:cs="Consolas"/>
+        </w:rPr>
+        <w:t xml:space="preserve">theOwnersRememberMeCookieDoesNotOpenTheAdminApi</w:t>
+      </w:r>
+      <w:r>
+        <w:t xml:space="preserve"> ghi lại điều này.</w:t>
+      </w:r>
+    </w:p>
+    <w:p>
+      <w:pPr>
+        <w:pStyle w:val="ListParagraph"/>
+        <w:numPr>
+          <w:ilvl w:val="0"/>
+          <w:numId w:val="1"/>
+        </w:numPr>
+      </w:pPr>
+      <w:r>
+        <w:rPr>
+          <w:b/>
+          <w:bCs/>
+        </w:rPr>
+        <w:t xml:space="preserve">Bẫy 3, role viết ở hai nơi:</w:t>
+      </w:r>
+      <w:r>
+        <w:t xml:space="preserve"> </w:t>
+      </w:r>
+      <w:r>
+        <w:rPr>
+          <w:rFonts w:ascii="Consolas" w:eastAsia="Consolas" w:hAnsi="Consolas" w:cs="Consolas"/>
+        </w:rPr>
+        <w:t xml:space="preserve">common</w:t>
+      </w:r>
+      <w:r>
+        <w:t xml:space="preserve"> không được phụ thuộc </w:t>
+      </w:r>
+      <w:r>
+        <w:rPr>
+          <w:rFonts w:ascii="Consolas" w:eastAsia="Consolas" w:hAnsi="Consolas" w:cs="Consolas"/>
+        </w:rPr>
+        <w:t xml:space="preserve">identity</w:t>
+      </w:r>
+      <w:r>
+        <w:t xml:space="preserve"> (luật module), nên chữ </w:t>
+      </w:r>
+      <w:r>
+        <w:rPr>
+          <w:rFonts w:ascii="Consolas" w:eastAsia="Consolas" w:hAnsi="Consolas" w:cs="Consolas"/>
+        </w:rPr>
+        <w:t xml:space="preserve">"ADMIN"</w:t>
+      </w:r>
+      <w:r>
+        <w:t xml:space="preserve"> có ở cả </w:t>
+      </w:r>
+      <w:r>
+        <w:rPr>
+          <w:rFonts w:ascii="Consolas" w:eastAsia="Consolas" w:hAnsi="Consolas" w:cs="Consolas"/>
+        </w:rPr>
+        <w:t xml:space="preserve">LoginConfiguration</w:t>
+      </w:r>
+      <w:r>
+        <w:t xml:space="preserve"> (cấp role) và </w:t>
+      </w:r>
+      <w:r>
+        <w:rPr>
+          <w:rFonts w:ascii="Consolas" w:eastAsia="Consolas" w:hAnsi="Consolas" w:cs="Consolas"/>
+        </w:rPr>
+        <w:t xml:space="preserve">SecurityConfig</w:t>
+      </w:r>
+      <w:r>
+        <w:t xml:space="preserve"> (kiểm role). Test </w:t>
+      </w:r>
+      <w:r>
+        <w:rPr>
+          <w:rFonts w:ascii="Consolas" w:eastAsia="Consolas" w:hAnsi="Consolas" w:cs="Consolas"/>
+        </w:rPr>
+        <w:t xml:space="preserve">AdminSignInTests</w:t>
+      </w:r>
+      <w:r>
+        <w:t xml:space="preserve"> đăng nhập thật và gọi thật, nên hai nơi lệch nhau là test đỏ.</w:t>
+      </w:r>
+    </w:p>
+    <w:p>
+      <w:pPr>
+        <w:pStyle w:val="Heading3"/>
+      </w:pPr>
+      <w:r>
+        <w:t xml:space="preserve">25.5 Module mới </w:t>
+      </w:r>
+      <w:r>
+        <w:rPr>
+          <w:rFonts w:ascii="Consolas" w:eastAsia="Consolas" w:hAnsi="Consolas" w:cs="Consolas"/>
+        </w:rPr>
+        <w:t xml:space="preserve">admin</w:t>
+      </w:r>
+      <w:r>
+        <w:t xml:space="preserve"> và </w:t>
+      </w:r>
+      <w:r>
+        <w:rPr>
+          <w:rFonts w:ascii="Consolas" w:eastAsia="Consolas" w:hAnsi="Consolas" w:cs="Consolas"/>
+        </w:rPr>
+        <w:t xml:space="preserve">GET /api/admin/me</w:t>
+      </w:r>
+      <w:r>
+        <w:t xml:space="preserve"> (BE-100)</w:t>
+      </w:r>
+    </w:p>
+    <w:p>
+      <w:pPr>
+        <w:pStyle w:val="ListParagraph"/>
+        <w:numPr>
+          <w:ilvl w:val="0"/>
+          <w:numId w:val="1"/>
+        </w:numPr>
+      </w:pPr>
+      <w:r>
+        <w:rPr>
+          <w:b/>
+          <w:bCs/>
+        </w:rPr>
+        <w:t xml:space="preserve">Ở đâu:</w:t>
+      </w:r>
+      <w:r>
+        <w:t xml:space="preserve"> </w:t>
+      </w:r>
+      <w:r>
+        <w:rPr>
+          <w:rFonts w:ascii="Consolas" w:eastAsia="Consolas" w:hAnsi="Consolas" w:cs="Consolas"/>
+        </w:rPr>
+        <w:t xml:space="preserve">admin/api/AdminController.java</w:t>
+      </w:r>
+      <w:r>
+        <w:t xml:space="preserve">, </w:t>
+      </w:r>
+      <w:r>
+        <w:rPr>
+          <w:rFonts w:ascii="Consolas" w:eastAsia="Consolas" w:hAnsi="Consolas" w:cs="Consolas"/>
+        </w:rPr>
+        <w:t xml:space="preserve">AdminMeResponse.java</w:t>
+      </w:r>
+      <w:r>
+        <w:t xml:space="preserve">.</w:t>
+      </w:r>
+    </w:p>
+    <w:p>
+      <w:pPr>
+        <w:pStyle w:val="ListParagraph"/>
+        <w:numPr>
+          <w:ilvl w:val="0"/>
+          <w:numId w:val="1"/>
+        </w:numPr>
+      </w:pPr>
+      <w:r>
+        <w:rPr>
+          <w:b/>
+          <w:bCs/>
+        </w:rPr>
+        <w:t xml:space="preserve">Là gì:</w:t>
+      </w:r>
+      <w:r>
+        <w:t xml:space="preserve"> package con trực tiếp của </w:t>
+      </w:r>
+      <w:r>
+        <w:rPr>
+          <w:rFonts w:ascii="Consolas" w:eastAsia="Consolas" w:hAnsi="Consolas" w:cs="Consolas"/>
+        </w:rPr>
+        <w:t xml:space="preserve">dev.sino</w:t>
+      </w:r>
+      <w:r>
+        <w:t xml:space="preserve"> nên Spring Modulith tự coi </w:t>
+      </w:r>
+      <w:r>
+        <w:rPr>
+          <w:rFonts w:ascii="Consolas" w:eastAsia="Consolas" w:hAnsi="Consolas" w:cs="Consolas"/>
+        </w:rPr>
+        <w:t xml:space="preserve">admin</w:t>
+      </w:r>
+      <w:r>
+        <w:t xml:space="preserve"> là một module. </w:t>
+      </w:r>
+      <w:r>
+        <w:rPr>
+          <w:rFonts w:ascii="Consolas" w:eastAsia="Consolas" w:hAnsi="Consolas" w:cs="Consolas"/>
+        </w:rPr>
+        <w:t xml:space="preserve">GET /api/admin/me</w:t>
+      </w:r>
+      <w:r>
+        <w:t xml:space="preserve"> trả </w:t>
+      </w:r>
+      <w:r>
+        <w:rPr>
+          <w:rFonts w:ascii="Consolas" w:eastAsia="Consolas" w:hAnsi="Consolas" w:cs="Consolas"/>
+        </w:rPr>
+        <w:t xml:space="preserve">{ "email": ... }</w:t>
+      </w:r>
+      <w:r>
+        <w:t xml:space="preserve"> lấy từ </w:t>
+      </w:r>
+      <w:r>
+        <w:rPr>
+          <w:rFonts w:ascii="Consolas" w:eastAsia="Consolas" w:hAnsi="Consolas" w:cs="Consolas"/>
+        </w:rPr>
+        <w:t xml:space="preserve">Authentication.getName()</w:t>
+      </w:r>
+      <w:r>
+        <w:t xml:space="preserve">.</w:t>
+      </w:r>
+    </w:p>
+    <w:p>
+      <w:pPr>
+        <w:pStyle w:val="ListParagraph"/>
+        <w:numPr>
+          <w:ilvl w:val="0"/>
+          <w:numId w:val="1"/>
+        </w:numPr>
+      </w:pPr>
+      <w:r>
+        <w:rPr>
+          <w:b/>
+          <w:bCs/>
+        </w:rPr>
+        <w:t xml:space="preserve">Để làm gì:</w:t>
+      </w:r>
+      <w:r>
+        <w:t xml:space="preserve"> giao diện admin sau này hỏi "tôi là ai". </w:t>
+      </w:r>
+      <w:r>
+        <w:rPr>
+          <w:rFonts w:ascii="Consolas" w:eastAsia="Consolas" w:hAnsi="Consolas" w:cs="Consolas"/>
+        </w:rPr>
+        <w:t xml:space="preserve">GET /api/auth/me</w:t>
+      </w:r>
+      <w:r>
+        <w:t xml:space="preserve"> của web owner thì trả </w:t>
+      </w:r>
+      <w:r>
+        <w:rPr>
+          <w:rFonts w:ascii="Consolas" w:eastAsia="Consolas" w:hAnsi="Consolas" w:cs="Consolas"/>
+        </w:rPr>
+        <w:t xml:space="preserve">401</w:t>
+      </w:r>
+      <w:r>
+        <w:t xml:space="preserve"> cho phiên admin, vì nó tìm người dùng trong </w:t>
+      </w:r>
+      <w:r>
+        <w:rPr>
+          <w:rFonts w:ascii="Consolas" w:eastAsia="Consolas" w:hAnsi="Consolas" w:cs="Consolas"/>
+        </w:rPr>
+        <w:t xml:space="preserve">app_user</w:t>
+      </w:r>
+      <w:r>
+        <w:t xml:space="preserve"> mà admin không có ở đó: web owner coi như chưa đăng nhập và không mở giao diện owner cho admin.</w:t>
+      </w:r>
+    </w:p>
+    <w:p>
+      <w:pPr>
+        <w:pStyle w:val="ListParagraph"/>
+        <w:numPr>
+          <w:ilvl w:val="0"/>
+          <w:numId w:val="1"/>
+        </w:numPr>
+      </w:pPr>
+      <w:r>
+        <w:rPr>
+          <w:b/>
+          <w:bCs/>
+        </w:rPr>
+        <w:t xml:space="preserve">Bẫy:</w:t>
+      </w:r>
+      <w:r>
+        <w:t xml:space="preserve"> controller không cần tự kiểm role. Security chain đã chặn trước khi request tới controller; thêm kiểm role trong controller là kiểm hai lần và dễ lệch nhau.</w:t>
+      </w:r>
+    </w:p>
+    <w:p>
+      <w:pPr>
+        <w:pStyle w:val="Heading3"/>
+      </w:pPr>
+      <w:r>
+        <w:t xml:space="preserve">25.6 Kiểm chứng của BE-100</w:t>
+      </w:r>
+    </w:p>
+    <w:p>
+      <w:pPr>
+        <w:pStyle w:val="ListParagraph"/>
+        <w:numPr>
+          <w:ilvl w:val="0"/>
+          <w:numId w:val="1"/>
+        </w:numPr>
+      </w:pPr>
+      <w:r>
+        <w:rPr>
+          <w:rFonts w:ascii="Consolas" w:eastAsia="Consolas" w:hAnsi="Consolas" w:cs="Consolas"/>
+        </w:rPr>
+        <w:t xml:space="preserve">LoginSettingsTests</w:t>
+      </w:r>
+      <w:r>
+        <w:t xml:space="preserve"> (thêm 8 ca admin), </w:t>
+      </w:r>
+      <w:r>
+        <w:rPr>
+          <w:rFonts w:ascii="Consolas" w:eastAsia="Consolas" w:hAnsi="Consolas" w:cs="Consolas"/>
+        </w:rPr>
+        <w:t xml:space="preserve">AdminLoginTests</w:t>
+      </w:r>
+      <w:r>
+        <w:t xml:space="preserve"> (role, cookie ghi nhớ, cookie giả mạo), </w:t>
+      </w:r>
+      <w:r>
+        <w:rPr>
+          <w:rFonts w:ascii="Consolas" w:eastAsia="Consolas" w:hAnsi="Consolas" w:cs="Consolas"/>
+        </w:rPr>
+        <w:t xml:space="preserve">AdminSignInTests</w:t>
+      </w:r>
+      <w:r>
+        <w:t xml:space="preserve"> (server thật cổng ngẫu nhiên, client giữ cookie như trình duyệt).</w:t>
+      </w:r>
+    </w:p>
+    <w:p>
+      <w:pPr>
+        <w:pStyle w:val="ListParagraph"/>
+        <w:numPr>
+          <w:ilvl w:val="0"/>
+          <w:numId w:val="1"/>
+        </w:numPr>
+      </w:pPr>
+      <w:r>
+        <w:t xml:space="preserve">Test viết trước: sau bước "identity" (cấu hình, đăng nhập), </w:t>
+      </w:r>
+      <w:r>
+        <w:rPr>
+          <w:rFonts w:ascii="Consolas" w:eastAsia="Consolas" w:hAnsi="Consolas" w:cs="Consolas"/>
+        </w:rPr>
+        <w:t xml:space="preserve">AdminSignInTests</w:t>
+      </w:r>
+      <w:r>
+        <w:t xml:space="preserve"> đỏ đúng 4 ca (admin vẫn đọc được </w:t>
+      </w:r>
+      <w:r>
+        <w:rPr>
+          <w:rFonts w:ascii="Consolas" w:eastAsia="Consolas" w:hAnsi="Consolas" w:cs="Consolas"/>
+        </w:rPr>
+        <w:t xml:space="preserve">/api/accounts</w:t>
+      </w:r>
+      <w:r>
+        <w:t xml:space="preserve">, chưa có </w:t>
+      </w:r>
+      <w:r>
+        <w:rPr>
+          <w:rFonts w:ascii="Consolas" w:eastAsia="Consolas" w:hAnsi="Consolas" w:cs="Consolas"/>
+        </w:rPr>
+        <w:t xml:space="preserve">/api/admin/me</w:t>
+      </w:r>
+      <w:r>
+        <w:t xml:space="preserve">); sau bước "security chain + controller" thì xanh.</w:t>
+      </w:r>
+    </w:p>
     <w:p/>
     <w:sectPr>
       <w:pgSz w:w="11906" w:h="16838"/>

</xml_diff>

<commit_message>
feat(be-101): read-only admin API over users, accounts and sync state
GET /api/admin/overview, /users and /accounts: numbers and statuses
only, never mail, credentials or provider IDs (D-264). The admin module
reads through three new public APIs (identity UserDirectory, account
AccountRoster, sync SyncStatuses) plus ConversationStats; the push
status is worked out in one place for the owner and the admin.

verify: 1494 tests, 0 failures, 4 skipped (a first run was stopped by
the tool for low memory; re-run on the user's request).

Co-Authored-By: Claude Opus 5.5 (1M context) <noreply@anthropic.com>
</commit_message>
<xml_diff>
--- a/docs/knowledge/phase-0-backend-foundation.docx
+++ b/docs/knowledge/phase-0-backend-foundation.docx
@@ -17984,6 +17984,1128 @@
         <w:t xml:space="preserve">); sau bước "security chain + controller" thì xanh.</w:t>
       </w:r>
     </w:p>
+    <w:p>
+      <w:pPr>
+        <w:pStyle w:val="ListParagraph"/>
+        <w:numPr>
+          <w:ilvl w:val="0"/>
+          <w:numId w:val="1"/>
+        </w:numPr>
+      </w:pPr>
+      <w:r>
+        <w:t xml:space="preserve">Kiểm bằng lỗi gài (mutation): 8 lỗi gài vào </w:t>
+      </w:r>
+      <w:r>
+        <w:rPr>
+          <w:rFonts w:ascii="Consolas" w:eastAsia="Consolas" w:hAnsi="Consolas" w:cs="Consolas"/>
+        </w:rPr>
+        <w:t xml:space="preserve">LoginSettings</w:t>
+      </w:r>
+      <w:r>
+        <w:t xml:space="preserve">, </w:t>
+      </w:r>
+      <w:r>
+        <w:rPr>
+          <w:rFonts w:ascii="Consolas" w:eastAsia="Consolas" w:hAnsi="Consolas" w:cs="Consolas"/>
+        </w:rPr>
+        <w:t xml:space="preserve">LoginConfiguration</w:t>
+      </w:r>
+      <w:r>
+        <w:t xml:space="preserve">, </w:t>
+      </w:r>
+      <w:r>
+        <w:rPr>
+          <w:rFonts w:ascii="Consolas" w:eastAsia="Consolas" w:hAnsi="Consolas" w:cs="Consolas"/>
+        </w:rPr>
+        <w:t xml:space="preserve">SecurityConfig</w:t>
+      </w:r>
+      <w:r>
+        <w:t xml:space="preserve"> (ví dụ bỏ </w:t>
+      </w:r>
+      <w:r>
+        <w:rPr>
+          <w:rFonts w:ascii="Consolas" w:eastAsia="Consolas" w:hAnsi="Consolas" w:cs="Consolas"/>
+        </w:rPr>
+        <w:t xml:space="preserve">not(hasRole("ADMIN"))</w:t>
+      </w:r>
+      <w:r>
+        <w:t xml:space="preserve">, cho admin nhận cookie ghi nhớ), cả 8 đều làm test đỏ. Nghĩa là nếu ai đó vô tình làm hỏng một trong các luật này, build sẽ báo.</w:t>
+      </w:r>
+    </w:p>
+    <w:p>
+      <w:pPr>
+        <w:pStyle w:val="Heading3"/>
+      </w:pPr>
+      <w:r>
+        <w:t xml:space="preserve">25.7 Ba public API mới cho người vận hành (BE-101, D-265)</w:t>
+      </w:r>
+    </w:p>
+    <w:p>
+      <w:pPr>
+        <w:pStyle w:val="ListParagraph"/>
+        <w:numPr>
+          <w:ilvl w:val="0"/>
+          <w:numId w:val="1"/>
+        </w:numPr>
+      </w:pPr>
+      <w:r>
+        <w:rPr>
+          <w:b/>
+          <w:bCs/>
+        </w:rPr>
+        <w:t xml:space="preserve">Ở đâu:</w:t>
+      </w:r>
+      <w:r>
+        <w:t xml:space="preserve"> </w:t>
+      </w:r>
+      <w:r>
+        <w:rPr>
+          <w:rFonts w:ascii="Consolas" w:eastAsia="Consolas" w:hAnsi="Consolas" w:cs="Consolas"/>
+        </w:rPr>
+        <w:t xml:space="preserve">identity/UserDirectory.java</w:t>
+      </w:r>
+      <w:r>
+        <w:t xml:space="preserve"> + </w:t>
+      </w:r>
+      <w:r>
+        <w:rPr>
+          <w:rFonts w:ascii="Consolas" w:eastAsia="Consolas" w:hAnsi="Consolas" w:cs="Consolas"/>
+        </w:rPr>
+        <w:t xml:space="preserve">UserSummary.java</w:t>
+      </w:r>
+      <w:r>
+        <w:t xml:space="preserve">; </w:t>
+      </w:r>
+      <w:r>
+        <w:rPr>
+          <w:rFonts w:ascii="Consolas" w:eastAsia="Consolas" w:hAnsi="Consolas" w:cs="Consolas"/>
+        </w:rPr>
+        <w:t xml:space="preserve">account/AccountRoster.java</w:t>
+      </w:r>
+      <w:r>
+        <w:t xml:space="preserve"> + </w:t>
+      </w:r>
+      <w:r>
+        <w:rPr>
+          <w:rFonts w:ascii="Consolas" w:eastAsia="Consolas" w:hAnsi="Consolas" w:cs="Consolas"/>
+        </w:rPr>
+        <w:t xml:space="preserve">AccountListing.java</w:t>
+      </w:r>
+      <w:r>
+        <w:t xml:space="preserve">; </w:t>
+      </w:r>
+      <w:r>
+        <w:rPr>
+          <w:rFonts w:ascii="Consolas" w:eastAsia="Consolas" w:hAnsi="Consolas" w:cs="Consolas"/>
+        </w:rPr>
+        <w:t xml:space="preserve">sync/SyncStatuses.java</w:t>
+      </w:r>
+      <w:r>
+        <w:t xml:space="preserve"> + </w:t>
+      </w:r>
+      <w:r>
+        <w:rPr>
+          <w:rFonts w:ascii="Consolas" w:eastAsia="Consolas" w:hAnsi="Consolas" w:cs="Consolas"/>
+        </w:rPr>
+        <w:t xml:space="preserve">AccountSyncStatus.java</w:t>
+      </w:r>
+      <w:r>
+        <w:t xml:space="preserve">. Phần cài đặt: </w:t>
+      </w:r>
+      <w:r>
+        <w:rPr>
+          <w:rFonts w:ascii="Consolas" w:eastAsia="Consolas" w:hAnsi="Consolas" w:cs="Consolas"/>
+        </w:rPr>
+        <w:t xml:space="preserve">UserDirectoryService</w:t>
+      </w:r>
+      <w:r>
+        <w:t xml:space="preserve">, </w:t>
+      </w:r>
+      <w:r>
+        <w:rPr>
+          <w:rFonts w:ascii="Consolas" w:eastAsia="Consolas" w:hAnsi="Consolas" w:cs="Consolas"/>
+        </w:rPr>
+        <w:t xml:space="preserve">AccountRosterService</w:t>
+      </w:r>
+      <w:r>
+        <w:t xml:space="preserve">, </w:t>
+      </w:r>
+      <w:r>
+        <w:rPr>
+          <w:rFonts w:ascii="Consolas" w:eastAsia="Consolas" w:hAnsi="Consolas" w:cs="Consolas"/>
+        </w:rPr>
+        <w:t xml:space="preserve">SyncStatusService</w:t>
+      </w:r>
+      <w:r>
+        <w:t xml:space="preserve"> trong package </w:t>
+      </w:r>
+      <w:r>
+        <w:rPr>
+          <w:rFonts w:ascii="Consolas" w:eastAsia="Consolas" w:hAnsi="Consolas" w:cs="Consolas"/>
+        </w:rPr>
+        <w:t xml:space="preserve">application</w:t>
+      </w:r>
+      <w:r>
+        <w:t xml:space="preserve"> của từng module.</w:t>
+      </w:r>
+    </w:p>
+    <w:p>
+      <w:pPr>
+        <w:pStyle w:val="ListParagraph"/>
+        <w:numPr>
+          <w:ilvl w:val="0"/>
+          <w:numId w:val="1"/>
+        </w:numPr>
+      </w:pPr>
+      <w:r>
+        <w:rPr>
+          <w:b/>
+          <w:bCs/>
+        </w:rPr>
+        <w:t xml:space="preserve">Là gì:</w:t>
+      </w:r>
+      <w:r>
+        <w:t xml:space="preserve"> mỗi module mở thêm một "cửa sổ chỉ đọc" ở </w:t>
+      </w:r>
+      <w:r>
+        <w:rPr>
+          <w:b/>
+          <w:bCs/>
+        </w:rPr>
+        <w:t xml:space="preserve">base package</w:t>
+      </w:r>
+      <w:r>
+        <w:t xml:space="preserve"> của nó (package </w:t>
+      </w:r>
+      <w:r>
+        <w:rPr>
+          <w:rFonts w:ascii="Consolas" w:eastAsia="Consolas" w:hAnsi="Consolas" w:cs="Consolas"/>
+        </w:rPr>
+        <w:t xml:space="preserve">dev.sino.&lt;module&gt;</w:t>
+      </w:r>
+      <w:r>
+        <w:t xml:space="preserve">). Spring Modulith chỉ cho module khác dùng type ở base package; mọi thứ trong </w:t>
+      </w:r>
+      <w:r>
+        <w:rPr>
+          <w:rFonts w:ascii="Consolas" w:eastAsia="Consolas" w:hAnsi="Consolas" w:cs="Consolas"/>
+        </w:rPr>
+        <w:t xml:space="preserve">application</w:t>
+      </w:r>
+      <w:r>
+        <w:t xml:space="preserve">, </w:t>
+      </w:r>
+      <w:r>
+        <w:rPr>
+          <w:rFonts w:ascii="Consolas" w:eastAsia="Consolas" w:hAnsi="Consolas" w:cs="Consolas"/>
+        </w:rPr>
+        <w:t xml:space="preserve">domain</w:t>
+      </w:r>
+      <w:r>
+        <w:t xml:space="preserve">, </w:t>
+      </w:r>
+      <w:r>
+        <w:rPr>
+          <w:rFonts w:ascii="Consolas" w:eastAsia="Consolas" w:hAnsi="Consolas" w:cs="Consolas"/>
+        </w:rPr>
+        <w:t xml:space="preserve">infrastructure</w:t>
+      </w:r>
+      <w:r>
+        <w:t xml:space="preserve"> là nội bộ.</w:t>
+      </w:r>
+    </w:p>
+    <w:p>
+      <w:pPr>
+        <w:shd w:val="clear" w:color="auto" w:fill="F2F3F5"/>
+        <w:ind w:left="0"/>
+      </w:pPr>
+      <w:r>
+        <w:rPr>
+          <w:rFonts w:ascii="Consolas" w:eastAsia="Consolas" w:hAnsi="Consolas" w:cs="Consolas"/>
+          <w:sz w:val="19"/>
+          <w:szCs w:val="19"/>
+        </w:rPr>
+        <w:t xml:space="preserve">admin ──&gt; identity.UserDirectory      (người dùng)</w:t>
+        <w:br/>
+        <w:t xml:space="preserve">      ──&gt; account.AccountRoster       (tài khoản của mọi owner, trừ đã gỡ)</w:t>
+        <w:br/>
+        <w:t xml:space="preserve">      ──&gt; sync.SyncStatuses           (tình trạng nhập thư / đồng bộ / thông báo đẩy)</w:t>
+        <w:br/>
+        <w:t xml:space="preserve">      ──&gt; conversation.ConversationStats  (số thư đã lưu, có sẵn từ F05)</w:t>
+      </w:r>
+    </w:p>
+    <w:p>
+      <w:pPr>
+        <w:pStyle w:val="ListParagraph"/>
+        <w:numPr>
+          <w:ilvl w:val="0"/>
+          <w:numId w:val="1"/>
+        </w:numPr>
+      </w:pPr>
+      <w:r>
+        <w:rPr>
+          <w:b/>
+          <w:bCs/>
+        </w:rPr>
+        <w:t xml:space="preserve">Để làm gì:</w:t>
+      </w:r>
+      <w:r>
+        <w:t xml:space="preserve"> module </w:t>
+      </w:r>
+      <w:r>
+        <w:rPr>
+          <w:rFonts w:ascii="Consolas" w:eastAsia="Consolas" w:hAnsi="Consolas" w:cs="Consolas"/>
+        </w:rPr>
+        <w:t xml:space="preserve">admin</w:t>
+      </w:r>
+      <w:r>
+        <w:t xml:space="preserve"> cần dữ liệu của bốn module khác mà không được đọc thẳng bảng của chúng.</w:t>
+      </w:r>
+    </w:p>
+    <w:p>
+      <w:pPr>
+        <w:pStyle w:val="ListParagraph"/>
+        <w:numPr>
+          <w:ilvl w:val="0"/>
+          <w:numId w:val="1"/>
+        </w:numPr>
+      </w:pPr>
+      <w:r>
+        <w:rPr>
+          <w:b/>
+          <w:bCs/>
+        </w:rPr>
+        <w:t xml:space="preserve">Vì sao chọn:</w:t>
+      </w:r>
+      <w:r>
+        <w:t xml:space="preserve"> nếu </w:t>
+      </w:r>
+      <w:r>
+        <w:rPr>
+          <w:rFonts w:ascii="Consolas" w:eastAsia="Consolas" w:hAnsi="Consolas" w:cs="Consolas"/>
+        </w:rPr>
+        <w:t xml:space="preserve">admin</w:t>
+      </w:r>
+      <w:r>
+        <w:t xml:space="preserve"> viết SQL đọc thẳng </w:t>
+      </w:r>
+      <w:r>
+        <w:rPr>
+          <w:rFonts w:ascii="Consolas" w:eastAsia="Consolas" w:hAnsi="Consolas" w:cs="Consolas"/>
+        </w:rPr>
+        <w:t xml:space="preserve">connected_account</w:t>
+      </w:r>
+      <w:r>
+        <w:t xml:space="preserve"> hay </w:t>
+      </w:r>
+      <w:r>
+        <w:rPr>
+          <w:rFonts w:ascii="Consolas" w:eastAsia="Consolas" w:hAnsi="Consolas" w:cs="Consolas"/>
+        </w:rPr>
+        <w:t xml:space="preserve">sync_checkpoint</w:t>
+      </w:r>
+      <w:r>
+        <w:t xml:space="preserve">, thì </w:t>
+      </w:r>
+      <w:r>
+        <w:rPr>
+          <w:rFonts w:ascii="Consolas" w:eastAsia="Consolas" w:hAnsi="Consolas" w:cs="Consolas"/>
+        </w:rPr>
+        <w:t xml:space="preserve">ModularityTests</w:t>
+      </w:r>
+      <w:r>
+        <w:t xml:space="preserve"> </w:t>
+      </w:r>
+      <w:r>
+        <w:rPr>
+          <w:b/>
+          <w:bCs/>
+        </w:rPr>
+        <w:t xml:space="preserve">không bắt được</w:t>
+      </w:r>
+      <w:r>
+        <w:t xml:space="preserve"> (nó chỉ kiểm tham chiếu giữa các class Java, không đọc chuỗi SQL), và khi module </w:t>
+      </w:r>
+      <w:r>
+        <w:rPr>
+          <w:rFonts w:ascii="Consolas" w:eastAsia="Consolas" w:hAnsi="Consolas" w:cs="Consolas"/>
+        </w:rPr>
+        <w:t xml:space="preserve">sync</w:t>
+      </w:r>
+      <w:r>
+        <w:t xml:space="preserve"> đổi bảng thì admin hỏng mà không ai biết. Qua public API, module sở hữu dữ liệu tự quyết cách đọc.</w:t>
+      </w:r>
+    </w:p>
+    <w:p>
+      <w:pPr>
+        <w:pStyle w:val="ListParagraph"/>
+        <w:numPr>
+          <w:ilvl w:val="0"/>
+          <w:numId w:val="1"/>
+        </w:numPr>
+      </w:pPr>
+      <w:r>
+        <w:rPr>
+          <w:b/>
+          <w:bCs/>
+        </w:rPr>
+        <w:t xml:space="preserve">Vì sao </w:t>
+      </w:r>
+      <w:r>
+        <w:rPr>
+          <w:rFonts w:ascii="Consolas" w:eastAsia="Consolas" w:hAnsi="Consolas" w:cs="Consolas"/>
+          <w:b/>
+          <w:bCs/>
+        </w:rPr>
+        <w:t xml:space="preserve">AccountRoster</w:t>
+      </w:r>
+      <w:r>
+        <w:rPr>
+          <w:b/>
+          <w:bCs/>
+        </w:rPr>
+        <w:t xml:space="preserve"> tách khỏi </w:t>
+      </w:r>
+      <w:r>
+        <w:rPr>
+          <w:rFonts w:ascii="Consolas" w:eastAsia="Consolas" w:hAnsi="Consolas" w:cs="Consolas"/>
+          <w:b/>
+          <w:bCs/>
+        </w:rPr>
+        <w:t xml:space="preserve">AccountDirectory</w:t>
+      </w:r>
+      <w:r>
+        <w:rPr>
+          <w:b/>
+          <w:bCs/>
+        </w:rPr>
+        <w:t xml:space="preserve">:</w:t>
+      </w:r>
+      <w:r>
+        <w:t xml:space="preserve"> </w:t>
+      </w:r>
+      <w:r>
+        <w:rPr>
+          <w:rFonts w:ascii="Consolas" w:eastAsia="Consolas" w:hAnsi="Consolas" w:cs="Consolas"/>
+        </w:rPr>
+        <w:t xml:space="preserve">AccountDirectory</w:t>
+      </w:r>
+      <w:r>
+        <w:t xml:space="preserve"> là cách các module đọc tài khoản </w:t>
+      </w:r>
+      <w:r>
+        <w:rPr>
+          <w:b/>
+          <w:bCs/>
+        </w:rPr>
+        <w:t xml:space="preserve">của một owner</w:t>
+      </w:r>
+      <w:r>
+        <w:t xml:space="preserve"> để làm việc cho owner đó. "Mọi tài khoản của mọi người" là việc của người vận hành, một vai khác; trộn vào một interface thì dễ có người dùng nhầm method "mọi tài khoản" trong một request của người dùng.</w:t>
+      </w:r>
+    </w:p>
+    <w:p>
+      <w:pPr>
+        <w:pStyle w:val="ListParagraph"/>
+        <w:numPr>
+          <w:ilvl w:val="0"/>
+          <w:numId w:val="1"/>
+        </w:numPr>
+      </w:pPr>
+      <w:r>
+        <w:rPr>
+          <w:b/>
+          <w:bCs/>
+        </w:rPr>
+        <w:t xml:space="preserve">Bẫy:</w:t>
+      </w:r>
+      <w:r>
+        <w:t xml:space="preserve"> </w:t>
+      </w:r>
+      <w:r>
+        <w:rPr>
+          <w:rFonts w:ascii="Consolas" w:eastAsia="Consolas" w:hAnsi="Consolas" w:cs="Consolas"/>
+        </w:rPr>
+        <w:t xml:space="preserve">UserSummary.status</w:t>
+      </w:r>
+      <w:r>
+        <w:t xml:space="preserve"> là chữ (</w:t>
+      </w:r>
+      <w:r>
+        <w:rPr>
+          <w:rFonts w:ascii="Consolas" w:eastAsia="Consolas" w:hAnsi="Consolas" w:cs="Consolas"/>
+        </w:rPr>
+        <w:t xml:space="preserve">"ACTIVE"</w:t>
+      </w:r>
+      <w:r>
+        <w:t xml:space="preserve">), không phải enum </w:t>
+      </w:r>
+      <w:r>
+        <w:rPr>
+          <w:rFonts w:ascii="Consolas" w:eastAsia="Consolas" w:hAnsi="Consolas" w:cs="Consolas"/>
+        </w:rPr>
+        <w:t xml:space="preserve">UserStatus</w:t>
+      </w:r>
+      <w:r>
+        <w:t xml:space="preserve">. Enum đó nằm trong </w:t>
+      </w:r>
+      <w:r>
+        <w:rPr>
+          <w:rFonts w:ascii="Consolas" w:eastAsia="Consolas" w:hAnsi="Consolas" w:cs="Consolas"/>
+        </w:rPr>
+        <w:t xml:space="preserve">identity.infrastructure</w:t>
+      </w:r>
+      <w:r>
+        <w:t xml:space="preserve"> (nội bộ); đưa nó vào một type công khai thì module khác phải import một type nội bộ và </w:t>
+      </w:r>
+      <w:r>
+        <w:rPr>
+          <w:rFonts w:ascii="Consolas" w:eastAsia="Consolas" w:hAnsi="Consolas" w:cs="Consolas"/>
+        </w:rPr>
+        <w:t xml:space="preserve">ModularityTests</w:t>
+      </w:r>
+      <w:r>
+        <w:t xml:space="preserve"> báo lỗi.</w:t>
+      </w:r>
+    </w:p>
+    <w:p>
+      <w:pPr>
+        <w:pStyle w:val="Heading3"/>
+      </w:pPr>
+      <w:r>
+        <w:t xml:space="preserve">25.8 Một chỗ tính </w:t>
+      </w:r>
+      <w:r>
+        <w:rPr>
+          <w:rFonts w:ascii="Consolas" w:eastAsia="Consolas" w:hAnsi="Consolas" w:cs="Consolas"/>
+        </w:rPr>
+        <w:t xml:space="preserve">push</w:t>
+      </w:r>
+      <w:r>
+        <w:t xml:space="preserve"> cho cả owner và admin (BE-101)</w:t>
+      </w:r>
+    </w:p>
+    <w:p>
+      <w:pPr>
+        <w:pStyle w:val="ListParagraph"/>
+        <w:numPr>
+          <w:ilvl w:val="0"/>
+          <w:numId w:val="1"/>
+        </w:numPr>
+      </w:pPr>
+      <w:r>
+        <w:rPr>
+          <w:b/>
+          <w:bCs/>
+        </w:rPr>
+        <w:t xml:space="preserve">Ở đâu:</w:t>
+      </w:r>
+      <w:r>
+        <w:t xml:space="preserve"> </w:t>
+      </w:r>
+      <w:r>
+        <w:rPr>
+          <w:rFonts w:ascii="Consolas" w:eastAsia="Consolas" w:hAnsi="Consolas" w:cs="Consolas"/>
+        </w:rPr>
+        <w:t xml:space="preserve">sync/application/LiveSyncService.pushOf(Checkpoint)</w:t>
+      </w:r>
+      <w:r>
+        <w:t xml:space="preserve">, được </w:t>
+      </w:r>
+      <w:r>
+        <w:rPr>
+          <w:rFonts w:ascii="Consolas" w:eastAsia="Consolas" w:hAnsi="Consolas" w:cs="Consolas"/>
+        </w:rPr>
+        <w:t xml:space="preserve">LiveSyncService</w:t>
+      </w:r>
+      <w:r>
+        <w:t xml:space="preserve"> (API của owner) và </w:t>
+      </w:r>
+      <w:r>
+        <w:rPr>
+          <w:rFonts w:ascii="Consolas" w:eastAsia="Consolas" w:hAnsi="Consolas" w:cs="Consolas"/>
+        </w:rPr>
+        <w:t xml:space="preserve">SyncStatusService</w:t>
+      </w:r>
+      <w:r>
+        <w:t xml:space="preserve"> (cho admin) cùng gọi.</w:t>
+      </w:r>
+    </w:p>
+    <w:p>
+      <w:pPr>
+        <w:pStyle w:val="ListParagraph"/>
+        <w:numPr>
+          <w:ilvl w:val="0"/>
+          <w:numId w:val="1"/>
+        </w:numPr>
+      </w:pPr>
+      <w:r>
+        <w:rPr>
+          <w:b/>
+          <w:bCs/>
+        </w:rPr>
+        <w:t xml:space="preserve">Là gì:</w:t>
+      </w:r>
+      <w:r>
+        <w:t xml:space="preserve"> </w:t>
+      </w:r>
+      <w:r>
+        <w:rPr>
+          <w:rFonts w:ascii="Consolas" w:eastAsia="Consolas" w:hAnsi="Consolas" w:cs="Consolas"/>
+        </w:rPr>
+        <w:t xml:space="preserve">FAILED</w:t>
+      </w:r>
+      <w:r>
+        <w:t xml:space="preserve"> khi lần đăng ký nhận thông báo cuối bị lỗi, </w:t>
+      </w:r>
+      <w:r>
+        <w:rPr>
+          <w:rFonts w:ascii="Consolas" w:eastAsia="Consolas" w:hAnsi="Consolas" w:cs="Consolas"/>
+        </w:rPr>
+        <w:t xml:space="preserve">ACTIVE</w:t>
+      </w:r>
+      <w:r>
+        <w:t xml:space="preserve"> khi đang nhận, </w:t>
+      </w:r>
+      <w:r>
+        <w:rPr>
+          <w:rFonts w:ascii="Consolas" w:eastAsia="Consolas" w:hAnsi="Consolas" w:cs="Consolas"/>
+        </w:rPr>
+        <w:t xml:space="preserve">OFF</w:t>
+      </w:r>
+      <w:r>
+        <w:t xml:space="preserve"> khi không có.</w:t>
+      </w:r>
+    </w:p>
+    <w:p>
+      <w:pPr>
+        <w:pStyle w:val="ListParagraph"/>
+        <w:numPr>
+          <w:ilvl w:val="0"/>
+          <w:numId w:val="1"/>
+        </w:numPr>
+      </w:pPr>
+      <w:r>
+        <w:rPr>
+          <w:b/>
+          <w:bCs/>
+        </w:rPr>
+        <w:t xml:space="preserve">Vì sao chọn:</w:t>
+      </w:r>
+      <w:r>
+        <w:t xml:space="preserve"> chép quy tắc này sang </w:t>
+      </w:r>
+      <w:r>
+        <w:rPr>
+          <w:rFonts w:ascii="Consolas" w:eastAsia="Consolas" w:hAnsi="Consolas" w:cs="Consolas"/>
+        </w:rPr>
+        <w:t xml:space="preserve">SyncStatusService</w:t>
+      </w:r>
+      <w:r>
+        <w:t xml:space="preserve"> thì sau này sửa một chỗ, quên chỗ kia, owner và admin sẽ thấy hai trạng thái khác nhau cho cùng một tài khoản. </w:t>
+      </w:r>
+      <w:r>
+        <w:rPr>
+          <w:rFonts w:ascii="Consolas" w:eastAsia="Consolas" w:hAnsi="Consolas" w:cs="Consolas"/>
+        </w:rPr>
+        <w:t xml:space="preserve">LiveSyncApiTests</w:t>
+      </w:r>
+      <w:r>
+        <w:t xml:space="preserve"> (test cũ của owner) vẫn xanh, chứng tỏ tách ra không đổi hành vi.</w:t>
+      </w:r>
+    </w:p>
+    <w:p>
+      <w:pPr>
+        <w:pStyle w:val="Heading3"/>
+      </w:pPr>
+      <w:r>
+        <w:t xml:space="preserve">25.9 </w:t>
+      </w:r>
+      <w:r>
+        <w:rPr>
+          <w:rFonts w:ascii="Consolas" w:eastAsia="Consolas" w:hAnsi="Consolas" w:cs="Consolas"/>
+        </w:rPr>
+        <w:t xml:space="preserve">AdminQueries</w:t>
+      </w:r>
+      <w:r>
+        <w:t xml:space="preserve"> và API chỉ đọc (BE-101, D-264)</w:t>
+      </w:r>
+    </w:p>
+    <w:p>
+      <w:pPr>
+        <w:pStyle w:val="ListParagraph"/>
+        <w:numPr>
+          <w:ilvl w:val="0"/>
+          <w:numId w:val="1"/>
+        </w:numPr>
+      </w:pPr>
+      <w:r>
+        <w:rPr>
+          <w:b/>
+          <w:bCs/>
+        </w:rPr>
+        <w:t xml:space="preserve">Ở đâu:</w:t>
+      </w:r>
+      <w:r>
+        <w:t xml:space="preserve"> </w:t>
+      </w:r>
+      <w:r>
+        <w:rPr>
+          <w:rFonts w:ascii="Consolas" w:eastAsia="Consolas" w:hAnsi="Consolas" w:cs="Consolas"/>
+        </w:rPr>
+        <w:t xml:space="preserve">admin/application/AdminQueries.java</w:t>
+      </w:r>
+      <w:r>
+        <w:t xml:space="preserve"> và các record </w:t>
+      </w:r>
+      <w:r>
+        <w:rPr>
+          <w:rFonts w:ascii="Consolas" w:eastAsia="Consolas" w:hAnsi="Consolas" w:cs="Consolas"/>
+        </w:rPr>
+        <w:t xml:space="preserve">UserView</w:t>
+      </w:r>
+      <w:r>
+        <w:t xml:space="preserve">, </w:t>
+      </w:r>
+      <w:r>
+        <w:rPr>
+          <w:rFonts w:ascii="Consolas" w:eastAsia="Consolas" w:hAnsi="Consolas" w:cs="Consolas"/>
+        </w:rPr>
+        <w:t xml:space="preserve">AccountView</w:t>
+      </w:r>
+      <w:r>
+        <w:t xml:space="preserve">, </w:t>
+      </w:r>
+      <w:r>
+        <w:rPr>
+          <w:rFonts w:ascii="Consolas" w:eastAsia="Consolas" w:hAnsi="Consolas" w:cs="Consolas"/>
+        </w:rPr>
+        <w:t xml:space="preserve">SyncView</w:t>
+      </w:r>
+      <w:r>
+        <w:t xml:space="preserve">, </w:t>
+      </w:r>
+      <w:r>
+        <w:rPr>
+          <w:rFonts w:ascii="Consolas" w:eastAsia="Consolas" w:hAnsi="Consolas" w:cs="Consolas"/>
+        </w:rPr>
+        <w:t xml:space="preserve">Overview</w:t>
+      </w:r>
+      <w:r>
+        <w:t xml:space="preserve">; </w:t>
+      </w:r>
+      <w:r>
+        <w:rPr>
+          <w:rFonts w:ascii="Consolas" w:eastAsia="Consolas" w:hAnsi="Consolas" w:cs="Consolas"/>
+        </w:rPr>
+        <w:t xml:space="preserve">admin/api/AdminController.java</w:t>
+      </w:r>
+      <w:r>
+        <w:t xml:space="preserve"> với </w:t>
+      </w:r>
+      <w:r>
+        <w:rPr>
+          <w:rFonts w:ascii="Consolas" w:eastAsia="Consolas" w:hAnsi="Consolas" w:cs="Consolas"/>
+        </w:rPr>
+        <w:t xml:space="preserve">OverviewResponse</w:t>
+      </w:r>
+      <w:r>
+        <w:t xml:space="preserve">, </w:t>
+      </w:r>
+      <w:r>
+        <w:rPr>
+          <w:rFonts w:ascii="Consolas" w:eastAsia="Consolas" w:hAnsi="Consolas" w:cs="Consolas"/>
+        </w:rPr>
+        <w:t xml:space="preserve">UsersResponse</w:t>
+      </w:r>
+      <w:r>
+        <w:t xml:space="preserve">, </w:t>
+      </w:r>
+      <w:r>
+        <w:rPr>
+          <w:rFonts w:ascii="Consolas" w:eastAsia="Consolas" w:hAnsi="Consolas" w:cs="Consolas"/>
+        </w:rPr>
+        <w:t xml:space="preserve">AccountsResponse</w:t>
+      </w:r>
+      <w:r>
+        <w:t xml:space="preserve">.</w:t>
+      </w:r>
+    </w:p>
+    <w:p>
+      <w:pPr>
+        <w:pStyle w:val="ListParagraph"/>
+        <w:numPr>
+          <w:ilvl w:val="0"/>
+          <w:numId w:val="1"/>
+        </w:numPr>
+      </w:pPr>
+      <w:r>
+        <w:rPr>
+          <w:b/>
+          <w:bCs/>
+        </w:rPr>
+        <w:t xml:space="preserve">Là gì:</w:t>
+      </w:r>
+      <w:r>
+        <w:t xml:space="preserve"> </w:t>
+      </w:r>
+      <w:r>
+        <w:rPr>
+          <w:rFonts w:ascii="Consolas" w:eastAsia="Consolas" w:hAnsi="Consolas" w:cs="Consolas"/>
+        </w:rPr>
+        <w:t xml:space="preserve">AdminQueries</w:t>
+      </w:r>
+      <w:r>
+        <w:t xml:space="preserve"> ghép dữ liệu từ bốn public API ở trên thành ba câu trả lời: tổng quan, người dùng, tài khoản. Controller thêm </w:t>
+      </w:r>
+      <w:r>
+        <w:rPr>
+          <w:rFonts w:ascii="Consolas" w:eastAsia="Consolas" w:hAnsi="Consolas" w:cs="Consolas"/>
+        </w:rPr>
+        <w:t xml:space="preserve">generatedAt</w:t>
+      </w:r>
+      <w:r>
+        <w:t xml:space="preserve"> (lấy từ bean </w:t>
+      </w:r>
+      <w:r>
+        <w:rPr>
+          <w:rFonts w:ascii="Consolas" w:eastAsia="Consolas" w:hAnsi="Consolas" w:cs="Consolas"/>
+        </w:rPr>
+        <w:t xml:space="preserve">Clock</w:t>
+      </w:r>
+      <w:r>
+        <w:t xml:space="preserve">, như các API khác của Sino) và trả JSON.</w:t>
+      </w:r>
+    </w:p>
+    <w:p>
+      <w:pPr>
+        <w:pStyle w:val="ListParagraph"/>
+        <w:numPr>
+          <w:ilvl w:val="0"/>
+          <w:numId w:val="1"/>
+        </w:numPr>
+      </w:pPr>
+      <w:r>
+        <w:rPr>
+          <w:b/>
+          <w:bCs/>
+        </w:rPr>
+        <w:t xml:space="preserve">Không lộ nội dung:</w:t>
+      </w:r>
+      <w:r>
+        <w:t xml:space="preserve"> các record chỉ có metadata và con số. Test </w:t>
+      </w:r>
+      <w:r>
+        <w:rPr>
+          <w:rFonts w:ascii="Consolas" w:eastAsia="Consolas" w:hAnsi="Consolas" w:cs="Consolas"/>
+        </w:rPr>
+        <w:t xml:space="preserve">noAnswerCarriesTheMailItself</w:t>
+      </w:r>
+      <w:r>
+        <w:t xml:space="preserve"> lưu một thư thật (có tiêu đề, nội dung, người gửi) rồi kiểm rằng </w:t>
+      </w:r>
+      <w:r>
+        <w:rPr>
+          <w:b/>
+          <w:bCs/>
+        </w:rPr>
+        <w:t xml:space="preserve">không</w:t>
+      </w:r>
+      <w:r>
+        <w:t xml:space="preserve"> câu trả lời nào của admin chứa các chuỗi đó, cũng không chứa ID của nhà cung cấp hay chữ "token". Lý do: chính sách Limited Use của Google không cho người vận hành đọc thư của người dùng.</w:t>
+      </w:r>
+    </w:p>
+    <w:p>
+      <w:pPr>
+        <w:pStyle w:val="ListParagraph"/>
+        <w:numPr>
+          <w:ilvl w:val="0"/>
+          <w:numId w:val="1"/>
+        </w:numPr>
+      </w:pPr>
+      <w:r>
+        <w:rPr>
+          <w:b/>
+          <w:bCs/>
+        </w:rPr>
+        <w:t xml:space="preserve">Vì sao </w:t>
+      </w:r>
+      <w:r>
+        <w:rPr>
+          <w:rFonts w:ascii="Consolas" w:eastAsia="Consolas" w:hAnsi="Consolas" w:cs="Consolas"/>
+          <w:b/>
+          <w:bCs/>
+        </w:rPr>
+        <w:t xml:space="preserve">accountsByStatus</w:t>
+      </w:r>
+      <w:r>
+        <w:rPr>
+          <w:b/>
+          <w:bCs/>
+        </w:rPr>
+        <w:t xml:space="preserve"> luôn đủ năm khóa:</w:t>
+      </w:r>
+      <w:r>
+        <w:t xml:space="preserve"> giao diện không phải đoán khóa nào có mặt; một </w:t>
+      </w:r>
+      <w:r>
+        <w:rPr>
+          <w:rFonts w:ascii="Consolas" w:eastAsia="Consolas" w:hAnsi="Consolas" w:cs="Consolas"/>
+        </w:rPr>
+        <w:t xml:space="preserve">Map</w:t>
+      </w:r>
+      <w:r>
+        <w:t xml:space="preserve"> chỉ có khóa khi có tài khoản ở trạng thái đó buộc mọi giao diện viết thêm </w:t>
+      </w:r>
+      <w:r>
+        <w:rPr>
+          <w:rFonts w:ascii="Consolas" w:eastAsia="Consolas" w:hAnsi="Consolas" w:cs="Consolas"/>
+        </w:rPr>
+        <w:t xml:space="preserve">?? 0</w:t>
+      </w:r>
+      <w:r>
+        <w:t xml:space="preserve">. Dùng </w:t>
+      </w:r>
+      <w:r>
+        <w:rPr>
+          <w:rFonts w:ascii="Consolas" w:eastAsia="Consolas" w:hAnsi="Consolas" w:cs="Consolas"/>
+        </w:rPr>
+        <w:t xml:space="preserve">LinkedHashMap</w:t>
+      </w:r>
+      <w:r>
+        <w:t xml:space="preserve"> để thứ tự theo enum </w:t>
+      </w:r>
+      <w:r>
+        <w:rPr>
+          <w:rFonts w:ascii="Consolas" w:eastAsia="Consolas" w:hAnsi="Consolas" w:cs="Consolas"/>
+        </w:rPr>
+        <w:t xml:space="preserve">AccountStatus</w:t>
+      </w:r>
+      <w:r>
+        <w:t xml:space="preserve">, không ngẫu nhiên.</w:t>
+      </w:r>
+    </w:p>
+    <w:p>
+      <w:pPr>
+        <w:pStyle w:val="ListParagraph"/>
+        <w:numPr>
+          <w:ilvl w:val="0"/>
+          <w:numId w:val="1"/>
+        </w:numPr>
+      </w:pPr>
+      <w:r>
+        <w:rPr>
+          <w:b/>
+          <w:bCs/>
+        </w:rPr>
+        <w:t xml:space="preserve">Bẫy, N+1:</w:t>
+      </w:r>
+      <w:r>
+        <w:t xml:space="preserve"> mỗi tài khoản tốn hai truy vấn (tình trạng sync, số thư). Với vài tài khoản thì không đáng kể; khi có hàng trăm người dùng thì phải thêm cách đọc theo lô. Đây là đánh đổi có ý thức, ghi ở Risks của design.</w:t>
+      </w:r>
+    </w:p>
+    <w:p>
+      <w:pPr>
+        <w:pStyle w:val="ListParagraph"/>
+        <w:numPr>
+          <w:ilvl w:val="0"/>
+          <w:numId w:val="1"/>
+        </w:numPr>
+      </w:pPr>
+      <w:r>
+        <w:rPr>
+          <w:b/>
+          <w:bCs/>
+        </w:rPr>
+        <w:t xml:space="preserve">Bẫy, test dùng chung database:</w:t>
+      </w:r>
+      <w:r>
+        <w:t xml:space="preserve"> các test của Sino chạy trên cùng một PostgreSQL (Testcontainers). Con số tổng quan đếm </w:t>
+      </w:r>
+      <w:r>
+        <w:rPr>
+          <w:b/>
+          <w:bCs/>
+        </w:rPr>
+        <w:t xml:space="preserve">mọi</w:t>
+      </w:r>
+      <w:r>
+        <w:t xml:space="preserve"> người dùng và tài khoản, nên </w:t>
+      </w:r>
+      <w:r>
+        <w:rPr>
+          <w:rFonts w:ascii="Consolas" w:eastAsia="Consolas" w:hAnsi="Consolas" w:cs="Consolas"/>
+        </w:rPr>
+        <w:t xml:space="preserve">AdminApiTests</w:t>
+      </w:r>
+      <w:r>
+        <w:t xml:space="preserve"> xóa dữ liệu trước mỗi test (như </w:t>
+      </w:r>
+      <w:r>
+        <w:rPr>
+          <w:rFonts w:ascii="Consolas" w:eastAsia="Consolas" w:hAnsi="Consolas" w:cs="Consolas"/>
+        </w:rPr>
+        <w:t xml:space="preserve">AccountsApiTests</w:t>
+      </w:r>
+      <w:r>
+        <w:t xml:space="preserve">). Các test của public API thì không xóa, mà chỉ nhìn những dòng chính nó tạo, vì xóa </w:t>
+      </w:r>
+      <w:r>
+        <w:rPr>
+          <w:rFonts w:ascii="Consolas" w:eastAsia="Consolas" w:hAnsi="Consolas" w:cs="Consolas"/>
+        </w:rPr>
+        <w:t xml:space="preserve">app_user</w:t>
+      </w:r>
+      <w:r>
+        <w:t xml:space="preserve"> có thể vướng khóa ngoại của bảng khác (</w:t>
+      </w:r>
+      <w:r>
+        <w:rPr>
+          <w:rFonts w:ascii="Consolas" w:eastAsia="Consolas" w:hAnsi="Consolas" w:cs="Consolas"/>
+        </w:rPr>
+        <w:t xml:space="preserve">task</w:t>
+      </w:r>
+      <w:r>
+        <w:t xml:space="preserve">).</w:t>
+      </w:r>
+    </w:p>
+    <w:p>
+      <w:pPr>
+        <w:pStyle w:val="Heading3"/>
+      </w:pPr>
+      <w:r>
+        <w:t xml:space="preserve">25.10 Kiểm chứng của BE-101</w:t>
+      </w:r>
+    </w:p>
+    <w:p>
+      <w:pPr>
+        <w:pStyle w:val="ListParagraph"/>
+        <w:numPr>
+          <w:ilvl w:val="0"/>
+          <w:numId w:val="1"/>
+        </w:numPr>
+      </w:pPr>
+      <w:r>
+        <w:rPr>
+          <w:rFonts w:ascii="Consolas" w:eastAsia="Consolas" w:hAnsi="Consolas" w:cs="Consolas"/>
+        </w:rPr>
+        <w:t xml:space="preserve">UserDirectoryServiceTests</w:t>
+      </w:r>
+      <w:r>
+        <w:t xml:space="preserve">, </w:t>
+      </w:r>
+      <w:r>
+        <w:rPr>
+          <w:rFonts w:ascii="Consolas" w:eastAsia="Consolas" w:hAnsi="Consolas" w:cs="Consolas"/>
+        </w:rPr>
+        <w:t xml:space="preserve">AccountRosterServiceTests</w:t>
+      </w:r>
+      <w:r>
+        <w:t xml:space="preserve"> (</w:t>
+      </w:r>
+      <w:r>
+        <w:rPr>
+          <w:rFonts w:ascii="Consolas" w:eastAsia="Consolas" w:hAnsi="Consolas" w:cs="Consolas"/>
+        </w:rPr>
+        <w:t xml:space="preserve">@DataJpaTest</w:t>
+      </w:r>
+      <w:r>
+        <w:t xml:space="preserve">), </w:t>
+      </w:r>
+      <w:r>
+        <w:rPr>
+          <w:rFonts w:ascii="Consolas" w:eastAsia="Consolas" w:hAnsi="Consolas" w:cs="Consolas"/>
+        </w:rPr>
+        <w:t xml:space="preserve">SyncStatusServiceTests</w:t>
+      </w:r>
+      <w:r>
+        <w:t xml:space="preserve"> (</w:t>
+      </w:r>
+      <w:r>
+        <w:rPr>
+          <w:rFonts w:ascii="Consolas" w:eastAsia="Consolas" w:hAnsi="Consolas" w:cs="Consolas"/>
+        </w:rPr>
+        <w:t xml:space="preserve">@JdbcTest</w:t>
+      </w:r>
+      <w:r>
+        <w:t xml:space="preserve">, ghi trạng thái bằng chính </w:t>
+      </w:r>
+      <w:r>
+        <w:rPr>
+          <w:rFonts w:ascii="Consolas" w:eastAsia="Consolas" w:hAnsi="Consolas" w:cs="Consolas"/>
+        </w:rPr>
+        <w:t xml:space="preserve">SyncCheckpoints</w:t>
+      </w:r>
+      <w:r>
+        <w:t xml:space="preserve"> của module </w:t>
+      </w:r>
+      <w:r>
+        <w:rPr>
+          <w:rFonts w:ascii="Consolas" w:eastAsia="Consolas" w:hAnsi="Consolas" w:cs="Consolas"/>
+        </w:rPr>
+        <w:t xml:space="preserve">sync</w:t>
+      </w:r>
+      <w:r>
+        <w:t xml:space="preserve">), </w:t>
+      </w:r>
+      <w:r>
+        <w:rPr>
+          <w:rFonts w:ascii="Consolas" w:eastAsia="Consolas" w:hAnsi="Consolas" w:cs="Consolas"/>
+        </w:rPr>
+        <w:t xml:space="preserve">AdminApiTests</w:t>
+      </w:r>
+      <w:r>
+        <w:t xml:space="preserve"> (cả ứng dụng, </w:t>
+      </w:r>
+      <w:r>
+        <w:rPr>
+          <w:rFonts w:ascii="Consolas" w:eastAsia="Consolas" w:hAnsi="Consolas" w:cs="Consolas"/>
+        </w:rPr>
+        <w:t xml:space="preserve">MockMvc</w:t>
+      </w:r>
+      <w:r>
+        <w:t xml:space="preserve">, thư lưu bằng </w:t>
+      </w:r>
+      <w:r>
+        <w:rPr>
+          <w:rFonts w:ascii="Consolas" w:eastAsia="Consolas" w:hAnsi="Consolas" w:cs="Consolas"/>
+        </w:rPr>
+        <w:t xml:space="preserve">ConversationStore</w:t>
+      </w:r>
+      <w:r>
+        <w:t xml:space="preserve"> thật).</w:t>
+      </w:r>
+    </w:p>
+    <w:p>
+      <w:pPr>
+        <w:pStyle w:val="ListParagraph"/>
+        <w:numPr>
+          <w:ilvl w:val="0"/>
+          <w:numId w:val="1"/>
+        </w:numPr>
+      </w:pPr>
+      <w:r>
+        <w:t xml:space="preserve">Test viết trước: sau bước "ba public API", test của chúng xanh còn </w:t>
+      </w:r>
+      <w:r>
+        <w:rPr>
+          <w:rFonts w:ascii="Consolas" w:eastAsia="Consolas" w:hAnsi="Consolas" w:cs="Consolas"/>
+        </w:rPr>
+        <w:t xml:space="preserve">AdminApiTests</w:t>
+      </w:r>
+      <w:r>
+        <w:t xml:space="preserve"> đỏ đúng 4 ca (</w:t>
+      </w:r>
+      <w:r>
+        <w:rPr>
+          <w:rFonts w:ascii="Consolas" w:eastAsia="Consolas" w:hAnsi="Consolas" w:cs="Consolas"/>
+        </w:rPr>
+        <w:t xml:space="preserve">404</w:t>
+      </w:r>
+      <w:r>
+        <w:t xml:space="preserve">, chưa có endpoint); sau bước "module admin" thì xanh.</w:t>
+      </w:r>
+    </w:p>
     <w:p/>
     <w:sectPr>
       <w:pgSz w:w="11906" w:h="16838"/>

</xml_diff>

<commit_message>
docs(be-102): admin in the README, roadmap note, acceptance check
README: how to turn the admin on, its endpoints, the deny-list rule and
when to switch to an allow list. Roadmap: admin outside the phases.
Knowledge: self-check questions for section 25.

Matching every spec scenario against the tests found one without a
test (a user with no account counts 0): aUserWithoutAccountsCountsZero,
shown able to fail by a seeded fault. openspec validate --strict: valid.

Co-Authored-By: Claude Opus 5.5 (1M context) <noreply@anthropic.com>
</commit_message>
<xml_diff>
--- a/docs/knowledge/phase-0-backend-foundation.docx
+++ b/docs/knowledge/phase-0-backend-foundation.docx
@@ -19106,6 +19106,276 @@
         <w:t xml:space="preserve">, chưa có endpoint); sau bước "module admin" thì xanh.</w:t>
       </w:r>
     </w:p>
+    <w:p>
+      <w:pPr>
+        <w:pStyle w:val="ListParagraph"/>
+        <w:numPr>
+          <w:ilvl w:val="0"/>
+          <w:numId w:val="1"/>
+        </w:numPr>
+      </w:pPr>
+      <w:r>
+        <w:t xml:space="preserve">Lúc nghiệm thu (BE-102), đối chiếu từng scenario của spec với test thì thấy thiếu ca "người dùng không có tài khoản nào đếm là 0". Test </w:t>
+      </w:r>
+      <w:r>
+        <w:rPr>
+          <w:rFonts w:ascii="Consolas" w:eastAsia="Consolas" w:hAnsi="Consolas" w:cs="Consolas"/>
+        </w:rPr>
+        <w:t xml:space="preserve">aUserWithoutAccountsCountsZero</w:t>
+      </w:r>
+      <w:r>
+        <w:t xml:space="preserve"> viết </w:t>
+      </w:r>
+      <w:r>
+        <w:rPr>
+          <w:b/>
+          <w:bCs/>
+        </w:rPr>
+        <w:t xml:space="preserve">sau</w:t>
+      </w:r>
+      <w:r>
+        <w:t xml:space="preserve"> code nên xanh ngay; để biết nó có thể đỏ, gài lỗi </w:t>
+      </w:r>
+      <w:r>
+        <w:rPr>
+          <w:rFonts w:ascii="Consolas" w:eastAsia="Consolas" w:hAnsi="Consolas" w:cs="Consolas"/>
+        </w:rPr>
+        <w:t xml:space="preserve">getOrDefault(user.id(), 1L)</w:t>
+      </w:r>
+      <w:r>
+        <w:t xml:space="preserve"> vào </w:t>
+      </w:r>
+      <w:r>
+        <w:rPr>
+          <w:rFonts w:ascii="Consolas" w:eastAsia="Consolas" w:hAnsi="Consolas" w:cs="Consolas"/>
+        </w:rPr>
+        <w:t xml:space="preserve">AdminQueries</w:t>
+      </w:r>
+      <w:r>
+        <w:t xml:space="preserve">: test đỏ, rồi trả code về như cũ.</w:t>
+      </w:r>
+    </w:p>
+    <w:p>
+      <w:pPr>
+        <w:pStyle w:val="Heading3"/>
+      </w:pPr>
+      <w:r>
+        <w:t xml:space="preserve">25.11 Tự kiểm tra phần admin</w:t>
+      </w:r>
+    </w:p>
+    <w:p>
+      <w:pPr>
+        <w:pStyle w:val="ListParagraph"/>
+        <w:numPr>
+          <w:ilvl w:val="0"/>
+          <w:numId w:val="103"/>
+        </w:numPr>
+      </w:pPr>
+      <w:r>
+        <w:t xml:space="preserve">Vì sao admin không phải là một dòng trong </w:t>
+      </w:r>
+      <w:r>
+        <w:rPr>
+          <w:rFonts w:ascii="Consolas" w:eastAsia="Consolas" w:hAnsi="Consolas" w:cs="Consolas"/>
+        </w:rPr>
+        <w:t xml:space="preserve">app_user</w:t>
+      </w:r>
+      <w:r>
+        <w:t xml:space="preserve">, và khi nào điều đó sẽ phải đổi?</w:t>
+      </w:r>
+    </w:p>
+    <w:p>
+      <w:pPr>
+        <w:pStyle w:val="ListParagraph"/>
+        <w:numPr>
+          <w:ilvl w:val="0"/>
+          <w:numId w:val="103"/>
+        </w:numPr>
+      </w:pPr>
+      <w:r>
+        <w:t xml:space="preserve">Admin gửi </w:t>
+      </w:r>
+      <w:r>
+        <w:rPr>
+          <w:rFonts w:ascii="Consolas" w:eastAsia="Consolas" w:hAnsi="Consolas" w:cs="Consolas"/>
+        </w:rPr>
+        <w:t xml:space="preserve">rememberMe: true</w:t>
+      </w:r>
+      <w:r>
+        <w:t xml:space="preserve"> thì điều gì xảy ra, và luật đó nằm ở lớp nào?</w:t>
+      </w:r>
+    </w:p>
+    <w:p>
+      <w:pPr>
+        <w:pStyle w:val="ListParagraph"/>
+        <w:numPr>
+          <w:ilvl w:val="0"/>
+          <w:numId w:val="103"/>
+        </w:numPr>
+      </w:pPr>
+      <w:r>
+        <w:t xml:space="preserve">Đổi thứ tự hai quy tắc </w:t>
+      </w:r>
+      <w:r>
+        <w:rPr>
+          <w:rFonts w:ascii="Consolas" w:eastAsia="Consolas" w:hAnsi="Consolas" w:cs="Consolas"/>
+        </w:rPr>
+        <w:t xml:space="preserve">/api/admin/**</w:t>
+      </w:r>
+      <w:r>
+        <w:t xml:space="preserve"> và </w:t>
+      </w:r>
+      <w:r>
+        <w:rPr>
+          <w:rFonts w:ascii="Consolas" w:eastAsia="Consolas" w:hAnsi="Consolas" w:cs="Consolas"/>
+        </w:rPr>
+        <w:t xml:space="preserve">/api/**</w:t>
+      </w:r>
+      <w:r>
+        <w:t xml:space="preserve"> trong </w:t>
+      </w:r>
+      <w:r>
+        <w:rPr>
+          <w:rFonts w:ascii="Consolas" w:eastAsia="Consolas" w:hAnsi="Consolas" w:cs="Consolas"/>
+        </w:rPr>
+        <w:t xml:space="preserve">SecurityConfig</w:t>
+      </w:r>
+      <w:r>
+        <w:t xml:space="preserve"> thì admin gặp gì?</w:t>
+      </w:r>
+    </w:p>
+    <w:p>
+      <w:pPr>
+        <w:pStyle w:val="ListParagraph"/>
+        <w:numPr>
+          <w:ilvl w:val="0"/>
+          <w:numId w:val="103"/>
+        </w:numPr>
+      </w:pPr>
+      <w:r>
+        <w:t xml:space="preserve">Vì sao Sino chặn admin khỏi API của owner bằng "không phải ADMIN" chứ chưa dùng "phải là OWNER"? Cái giá phải trả là gì?</w:t>
+      </w:r>
+    </w:p>
+    <w:p>
+      <w:pPr>
+        <w:pStyle w:val="ListParagraph"/>
+        <w:numPr>
+          <w:ilvl w:val="0"/>
+          <w:numId w:val="103"/>
+        </w:numPr>
+      </w:pPr>
+      <w:r>
+        <w:t xml:space="preserve">Owner chỉ còn cookie ghi nhớ (phiên đã hết) gọi </w:t>
+      </w:r>
+      <w:r>
+        <w:rPr>
+          <w:rFonts w:ascii="Consolas" w:eastAsia="Consolas" w:hAnsi="Consolas" w:cs="Consolas"/>
+        </w:rPr>
+        <w:t xml:space="preserve">/api/admin/me</w:t>
+      </w:r>
+      <w:r>
+        <w:t xml:space="preserve"> thì nhận </w:t>
+      </w:r>
+      <w:r>
+        <w:rPr>
+          <w:rFonts w:ascii="Consolas" w:eastAsia="Consolas" w:hAnsi="Consolas" w:cs="Consolas"/>
+        </w:rPr>
+        <w:t xml:space="preserve">401</w:t>
+      </w:r>
+      <w:r>
+        <w:t xml:space="preserve"> hay </w:t>
+      </w:r>
+      <w:r>
+        <w:rPr>
+          <w:rFonts w:ascii="Consolas" w:eastAsia="Consolas" w:hAnsi="Consolas" w:cs="Consolas"/>
+        </w:rPr>
+        <w:t xml:space="preserve">403</w:t>
+      </w:r>
+      <w:r>
+        <w:t xml:space="preserve">, và vì sao?</w:t>
+      </w:r>
+    </w:p>
+    <w:p>
+      <w:pPr>
+        <w:pStyle w:val="ListParagraph"/>
+        <w:numPr>
+          <w:ilvl w:val="0"/>
+          <w:numId w:val="103"/>
+        </w:numPr>
+      </w:pPr>
+      <w:r>
+        <w:t xml:space="preserve">Vì sao module </w:t>
+      </w:r>
+      <w:r>
+        <w:rPr>
+          <w:rFonts w:ascii="Consolas" w:eastAsia="Consolas" w:hAnsi="Consolas" w:cs="Consolas"/>
+        </w:rPr>
+        <w:t xml:space="preserve">admin</w:t>
+      </w:r>
+      <w:r>
+        <w:t xml:space="preserve"> không viết SQL đọc thẳng bảng </w:t>
+      </w:r>
+      <w:r>
+        <w:rPr>
+          <w:rFonts w:ascii="Consolas" w:eastAsia="Consolas" w:hAnsi="Consolas" w:cs="Consolas"/>
+        </w:rPr>
+        <w:t xml:space="preserve">sync_checkpoint</w:t>
+      </w:r>
+      <w:r>
+        <w:t xml:space="preserve">, dù như vậy nhanh hơn?</w:t>
+      </w:r>
+    </w:p>
+    <w:p>
+      <w:pPr>
+        <w:pStyle w:val="ListParagraph"/>
+        <w:numPr>
+          <w:ilvl w:val="0"/>
+          <w:numId w:val="103"/>
+        </w:numPr>
+      </w:pPr>
+      <w:r>
+        <w:t xml:space="preserve">Vì sao </w:t>
+      </w:r>
+      <w:r>
+        <w:rPr>
+          <w:rFonts w:ascii="Consolas" w:eastAsia="Consolas" w:hAnsi="Consolas" w:cs="Consolas"/>
+        </w:rPr>
+        <w:t xml:space="preserve">UserSummary.status</w:t>
+      </w:r>
+      <w:r>
+        <w:t xml:space="preserve"> là chữ mà không phải enum </w:t>
+      </w:r>
+      <w:r>
+        <w:rPr>
+          <w:rFonts w:ascii="Consolas" w:eastAsia="Consolas" w:hAnsi="Consolas" w:cs="Consolas"/>
+        </w:rPr>
+        <w:t xml:space="preserve">UserStatus</w:t>
+      </w:r>
+      <w:r>
+        <w:t xml:space="preserve">?</w:t>
+      </w:r>
+    </w:p>
+    <w:p>
+      <w:pPr>
+        <w:pStyle w:val="ListParagraph"/>
+        <w:numPr>
+          <w:ilvl w:val="0"/>
+          <w:numId w:val="103"/>
+        </w:numPr>
+      </w:pPr>
+      <w:r>
+        <w:t xml:space="preserve">Test </w:t>
+      </w:r>
+      <w:r>
+        <w:rPr>
+          <w:rFonts w:ascii="Consolas" w:eastAsia="Consolas" w:hAnsi="Consolas" w:cs="Consolas"/>
+        </w:rPr>
+        <w:t xml:space="preserve">noAnswerCarriesTheMailItself</w:t>
+      </w:r>
+      <w:r>
+        <w:t xml:space="preserve"> bảo vệ điều gì, và vì sao điều đó quan trọng với việc Google thẩm định Sino?</w:t>
+      </w:r>
+    </w:p>
     <w:p/>
     <w:sectPr>
       <w:pgSz w:w="11906" w:h="16838"/>
@@ -19269,6 +19539,24 @@
     </w:lvlOverride>
   </w:num>
   <w:num w:numId="102">
+    <w:abstractNumId w:val="1"/>
+    <w:lvlOverride w:ilvl="0">
+      <w:startOverride w:val="1"/>
+    </w:lvlOverride>
+    <w:lvlOverride w:ilvl="1">
+      <w:startOverride w:val="1"/>
+    </w:lvlOverride>
+    <w:lvlOverride w:ilvl="2">
+      <w:startOverride w:val="1"/>
+    </w:lvlOverride>
+    <w:lvlOverride w:ilvl="3">
+      <w:startOverride w:val="1"/>
+    </w:lvlOverride>
+    <w:lvlOverride w:ilvl="4">
+      <w:startOverride w:val="1"/>
+    </w:lvlOverride>
+  </w:num>
+  <w:num w:numId="103">
     <w:abstractNumId w:val="1"/>
     <w:lvlOverride w:ilvl="0">
       <w:startOverride w:val="1"/>

</xml_diff>